<commit_message>
feat: scope-of-supply now adapts to fuel type (oil vs gas)
- Wraps the oil-specific 'ENCON FILM BURNER' and 'LD OIL PUMPING UNIT'
  paragraphs with {%p if is_oil %}...{%p endif %} in Offer_Template.docx
- Adds new 'ENCON GAS BURNER' and 'GAS TRAIN' sections wrapped with
  {%p if is_gas %}...{%p endif %} so a gas offer shows gas-line scope
  instead of oil-line scope
- Frontend buildTechData() detects fuel from lastCalc.fuel_density and
  sends is_oil flag through QuoteRequest → quote_writer context
- quote_writer derives is_gas as the inverse of is_oil

Verified via smoke test: oil mode renders FILM BURNER + LD OIL PUMPING
only; gas mode renders ENCON GAS BURNER + GAS TRAIN only.

Co-Authored-By: Claude Opus 4.6 (1M context) <noreply@anthropic.com>
</commit_message>
<xml_diff>
--- a/Offer_Template.docx
+++ b/Offer_Template.docx
@@ -12235,6 +12235,18 @@
     </w:p>
     <w:p>
       <w:pPr>
+        <w:pStyle w:val="BodyText"/>
+        <w:ind w:left="3760"/>
+        <w:rPr>
+          <w:sz w:val="20"/>
+        </w:rPr>
+      </w:pPr>
+      <w:r>
+        <w:t xml:space="preserve">{%p if is_oil %}</w:t>
+      </w:r>
+    </w:p>
+    <w:p>
+      <w:pPr>
         <w:spacing w:before="180" w:line="264" w:lineRule="auto"/>
         <w:ind w:left="1008" w:right="1008"/>
         <w:rPr>
@@ -12495,6 +12507,138 @@
     </w:p>
     <w:p>
       <w:pPr>
+        <w:pStyle w:val="BodyText"/>
+        <w:ind w:left="3760"/>
+        <w:rPr>
+          <w:sz w:val="20"/>
+        </w:rPr>
+      </w:pPr>
+      <w:r>
+        <w:t xml:space="preserve">{%p endif %}</w:t>
+      </w:r>
+    </w:p>
+    <w:p>
+      <w:pPr>
+        <w:pStyle w:val="BodyText"/>
+        <w:ind w:left="3760"/>
+        <w:rPr>
+          <w:sz w:val="20"/>
+        </w:rPr>
+      </w:pPr>
+      <w:r>
+        <w:t xml:space="preserve">{%p if is_gas %}</w:t>
+      </w:r>
+    </w:p>
+    <w:p>
+      <w:pPr>
+        <w:pStyle w:val="BodyText"/>
+        <w:ind w:left="3760"/>
+        <w:rPr>
+          <w:sz w:val="20"/>
+        </w:rPr>
+      </w:pPr>
+      <w:r>
+        <w:t xml:space="preserve">ENCON GAS BURNER</w:t>
+      </w:r>
+    </w:p>
+    <w:p>
+      <w:pPr>
+        <w:pStyle w:val="BodyText"/>
+        <w:ind w:left="3760"/>
+        <w:rPr>
+          <w:sz w:val="20"/>
+        </w:rPr>
+      </w:pPr>
+      <w:r>
+        <w:t xml:space="preserve">For preheating the system, we will supply 1 No. ENCON gas burner of suitable firing rate to achieve the desired temperature in the required time. The burner will consist of:</w:t>
+      </w:r>
+    </w:p>
+    <w:p>
+      <w:pPr>
+        <w:pStyle w:val="BodyText"/>
+        <w:ind w:left="3760"/>
+        <w:rPr>
+          <w:sz w:val="20"/>
+        </w:rPr>
+      </w:pPr>
+      <w:r>
+        <w:t xml:space="preserve">Burner alone</w:t>
+      </w:r>
+    </w:p>
+    <w:p>
+      <w:pPr>
+        <w:pStyle w:val="BodyText"/>
+        <w:ind w:left="3760"/>
+        <w:rPr>
+          <w:sz w:val="20"/>
+        </w:rPr>
+      </w:pPr>
+      <w:r>
+        <w:t xml:space="preserve">High alumina burner block</w:t>
+      </w:r>
+    </w:p>
+    <w:p>
+      <w:pPr>
+        <w:pStyle w:val="BodyText"/>
+        <w:ind w:left="3760"/>
+        <w:rPr>
+          <w:sz w:val="20"/>
+        </w:rPr>
+      </w:pPr>
+      <w:r>
+        <w:t xml:space="preserve">CI burner mounting plate</w:t>
+      </w:r>
+    </w:p>
+    <w:p>
+      <w:pPr>
+        <w:pStyle w:val="BodyText"/>
+        <w:ind w:left="3760"/>
+        <w:rPr>
+          <w:sz w:val="20"/>
+        </w:rPr>
+      </w:pPr>
+      <w:r>
+        <w:t xml:space="preserve">Ball valve on gas line</w:t>
+      </w:r>
+    </w:p>
+    <w:p>
+      <w:pPr>
+        <w:pStyle w:val="BodyText"/>
+        <w:ind w:left="3760"/>
+        <w:rPr>
+          <w:sz w:val="20"/>
+        </w:rPr>
+      </w:pPr>
+      <w:r>
+        <w:t xml:space="preserve">Butterfly valve on air line</w:t>
+      </w:r>
+    </w:p>
+    <w:p>
+      <w:pPr>
+        <w:pStyle w:val="BodyText"/>
+        <w:ind w:left="3760"/>
+        <w:rPr>
+          <w:sz w:val="20"/>
+        </w:rPr>
+      </w:pPr>
+      <w:r>
+        <w:t xml:space="preserve">Flexible hose set</w:t>
+      </w:r>
+    </w:p>
+    <w:p>
+      <w:pPr>
+        <w:pStyle w:val="BodyText"/>
+        <w:ind w:left="3760"/>
+        <w:rPr>
+          <w:sz w:val="20"/>
+        </w:rPr>
+      </w:pPr>
+      <w:r>
+        <w:t xml:space="preserve">{%p endif %}</w:t>
+      </w:r>
+    </w:p>
+    <w:p>
+      <w:pPr>
         <w:tabs>
           <w:tab w:val="left" w:pos="2015"/>
         </w:tabs>
@@ -13002,6 +13146,18 @@
     </w:p>
     <w:p>
       <w:pPr>
+        <w:pStyle w:val="BodyText"/>
+        <w:ind w:left="3760"/>
+        <w:rPr>
+          <w:sz w:val="20"/>
+        </w:rPr>
+      </w:pPr>
+      <w:r>
+        <w:t xml:space="preserve">{%p if is_oil %}</w:t>
+      </w:r>
+    </w:p>
+    <w:p>
+      <w:pPr>
         <w:ind w:left="1008" w:right="1008"/>
         <w:jc w:val="both"/>
         <w:outlineLvl w:val="0"/>
@@ -13456,6 +13612,150 @@
           <w:szCs w:val="24"/>
         </w:rPr>
         <w:t>1 No. of Pressure gauge.</w:t>
+      </w:r>
+    </w:p>
+    <w:p>
+      <w:pPr>
+        <w:pStyle w:val="BodyText"/>
+        <w:ind w:left="3760"/>
+        <w:rPr>
+          <w:sz w:val="20"/>
+        </w:rPr>
+      </w:pPr>
+      <w:r>
+        <w:t xml:space="preserve">{%p endif %}</w:t>
+      </w:r>
+    </w:p>
+    <w:p>
+      <w:pPr>
+        <w:pStyle w:val="BodyText"/>
+        <w:ind w:left="3760"/>
+        <w:rPr>
+          <w:sz w:val="20"/>
+        </w:rPr>
+      </w:pPr>
+      <w:r>
+        <w:t xml:space="preserve">{%p if is_gas %}</w:t>
+      </w:r>
+    </w:p>
+    <w:p>
+      <w:pPr>
+        <w:pStyle w:val="BodyText"/>
+        <w:ind w:left="3760"/>
+        <w:rPr>
+          <w:sz w:val="20"/>
+        </w:rPr>
+      </w:pPr>
+      <w:r>
+        <w:t xml:space="preserve">GAS TRAIN</w:t>
+      </w:r>
+    </w:p>
+    <w:p>
+      <w:pPr>
+        <w:pStyle w:val="BodyText"/>
+        <w:ind w:left="3760"/>
+        <w:rPr>
+          <w:sz w:val="20"/>
+        </w:rPr>
+      </w:pPr>
+      <w:r>
+        <w:t xml:space="preserve">To supply natural gas to the burner at the required pressure and flow, we will supply a packaged gas train comprising main components:</w:t>
+      </w:r>
+    </w:p>
+    <w:p>
+      <w:pPr>
+        <w:pStyle w:val="BodyText"/>
+        <w:ind w:left="3760"/>
+        <w:rPr>
+          <w:sz w:val="20"/>
+        </w:rPr>
+      </w:pPr>
+      <w:r>
+        <w:t xml:space="preserve">Ball valve (manual isolation)</w:t>
+      </w:r>
+    </w:p>
+    <w:p>
+      <w:pPr>
+        <w:pStyle w:val="BodyText"/>
+        <w:ind w:left="3760"/>
+        <w:rPr>
+          <w:sz w:val="20"/>
+        </w:rPr>
+      </w:pPr>
+      <w:r>
+        <w:t xml:space="preserve">Filter</w:t>
+      </w:r>
+    </w:p>
+    <w:p>
+      <w:pPr>
+        <w:pStyle w:val="BodyText"/>
+        <w:ind w:left="3760"/>
+        <w:rPr>
+          <w:sz w:val="20"/>
+        </w:rPr>
+      </w:pPr>
+      <w:r>
+        <w:t xml:space="preserve">Slam-shut-off valve</w:t>
+      </w:r>
+    </w:p>
+    <w:p>
+      <w:pPr>
+        <w:pStyle w:val="BodyText"/>
+        <w:ind w:left="3760"/>
+        <w:rPr>
+          <w:sz w:val="20"/>
+        </w:rPr>
+      </w:pPr>
+      <w:r>
+        <w:t xml:space="preserve">Pressure regulator</w:t>
+      </w:r>
+    </w:p>
+    <w:p>
+      <w:pPr>
+        <w:pStyle w:val="BodyText"/>
+        <w:ind w:left="3760"/>
+        <w:rPr>
+          <w:sz w:val="20"/>
+        </w:rPr>
+      </w:pPr>
+      <w:r>
+        <w:t xml:space="preserve">Pressure gauges (inlet &amp; outlet)</w:t>
+      </w:r>
+    </w:p>
+    <w:p>
+      <w:pPr>
+        <w:pStyle w:val="BodyText"/>
+        <w:ind w:left="3760"/>
+        <w:rPr>
+          <w:sz w:val="20"/>
+        </w:rPr>
+      </w:pPr>
+      <w:r>
+        <w:t xml:space="preserve">Solenoid valve</w:t>
+      </w:r>
+    </w:p>
+    <w:p>
+      <w:pPr>
+        <w:pStyle w:val="BodyText"/>
+        <w:ind w:left="3760"/>
+        <w:rPr>
+          <w:sz w:val="20"/>
+        </w:rPr>
+      </w:pPr>
+      <w:r>
+        <w:t xml:space="preserve">Flexible hose pipe</w:t>
+      </w:r>
+    </w:p>
+    <w:p>
+      <w:pPr>
+        <w:pStyle w:val="BodyText"/>
+        <w:ind w:left="3760"/>
+        <w:rPr>
+          <w:sz w:val="20"/>
+        </w:rPr>
+      </w:pPr>
+      <w:r>
+        <w:t xml:space="preserve">{%p endif %}</w:t>
       </w:r>
     </w:p>
     <w:p>

</xml_diff>

<commit_message>
feat: drop empty tech-data rows from generated offer
After rendering the Word offer, walk the Technical Data table and remove
any row whose value cell ended up blank (placeholder resolved to empty).
Hardcoded rows (No. of Burner, Fuel, Ignition, Lifting & Lowering,
Temperature Control) are unaffected — only rows whose label is in the
known dynamic set get pruned.

Tried docxtpl's {%tr if %} approach first but the multi-row interleaving
caused jinja parse errors. Post-render row removal is simpler and more
robust.

Co-Authored-By: Claude Opus 4.6 (1M context) <noreply@anthropic.com>
</commit_message>
<xml_diff>
--- a/Offer_Template.docx
+++ b/Offer_Template.docx
@@ -9492,21 +9492,19 @@
               <w:rPr>
                 <w:sz w:val="24"/>
               </w:rPr>
-              <w:t>Ladle</w:t>
+              <w:t>Ladle Dimensions</w:t>
             </w:r>
             <w:r>
               <w:rPr>
                 <w:spacing w:val="-3"/>
                 <w:sz w:val="24"/>
               </w:rPr>
-              <w:t xml:space="preserve"> </w:t>
             </w:r>
             <w:r>
               <w:rPr>
                 <w:spacing w:val="-2"/>
                 <w:sz w:val="24"/>
               </w:rPr>
-              <w:t>Dimensions</w:t>
             </w:r>
           </w:p>
         </w:tc>
@@ -9527,7 +9525,7 @@
               <w:rPr>
                 <w:sz w:val="24"/>
               </w:rPr>
-              <w:t xml:space="preserve">{{ladle_dim}} </w:t>
+              <w:t>{{ladle_dim}} {{ladle_drawing_no}}</w:t>
             </w:r>
             <w:r>
               <w:rPr>
@@ -9613,43 +9611,6 @@
             <w:r>
               <w:rPr>
                 <w:spacing w:val="58"/>
-                <w:sz w:val="24"/>
-              </w:rPr>
-            </w:r>
-          </w:p>
-          <w:p>
-            <w:pPr>
-              <w:spacing w:before="66"/>
-              <w:ind w:left="110"/>
-              <w:rPr>
-                <w:sz w:val="24"/>
-              </w:rPr>
-            </w:pPr>
-            <w:r>
-              <w:rPr>
-                <w:sz w:val="24"/>
-              </w:rPr>
-              <w:t>{{ladle_drawing_no}}</w:t>
-            </w:r>
-            <w:r>
-              <w:rPr>
-                <w:sz w:val="24"/>
-              </w:rPr>
-            </w:r>
-            <w:r>
-              <w:rPr>
-                <w:sz w:val="24"/>
-              </w:rPr>
-            </w:r>
-            <w:r>
-              <w:rPr>
-                <w:spacing w:val="1"/>
-                <w:sz w:val="24"/>
-              </w:rPr>
-            </w:r>
-            <w:r>
-              <w:rPr>
-                <w:spacing w:val="-2"/>
                 <w:sz w:val="24"/>
               </w:rPr>
             </w:r>
@@ -9676,21 +9637,19 @@
               <w:rPr>
                 <w:sz w:val="24"/>
               </w:rPr>
-              <w:t>Refractory</w:t>
+              <w:t>Refractory Weight</w:t>
             </w:r>
             <w:r>
               <w:rPr>
                 <w:spacing w:val="-7"/>
                 <w:sz w:val="24"/>
               </w:rPr>
-              <w:t xml:space="preserve"> </w:t>
             </w:r>
             <w:r>
               <w:rPr>
                 <w:spacing w:val="-2"/>
                 <w:sz w:val="24"/>
               </w:rPr>
-              <w:t>Weight</w:t>
             </w:r>
           </w:p>
         </w:tc>
@@ -9710,7 +9669,7 @@
               <w:rPr>
                 <w:sz w:val="24"/>
               </w:rPr>
-              <w:t>{{refractory_weight_kg}} Kg</w:t>
+              <w:t>{{refractory_weight_kg}}</w:t>
             </w:r>
             <w:r>
               <w:rPr>
@@ -9767,21 +9726,19 @@
               <w:rPr>
                 <w:sz w:val="24"/>
               </w:rPr>
-              <w:t>Heating</w:t>
+              <w:t>Heating Schedule</w:t>
             </w:r>
             <w:r>
               <w:rPr>
                 <w:spacing w:val="-10"/>
                 <w:sz w:val="24"/>
               </w:rPr>
-              <w:t xml:space="preserve"> </w:t>
             </w:r>
             <w:r>
               <w:rPr>
                 <w:spacing w:val="-2"/>
                 <w:sz w:val="24"/>
               </w:rPr>
-              <w:t>Schedule</w:t>
             </w:r>
           </w:p>
         </w:tc>
@@ -10044,47 +10001,41 @@
               <w:rPr>
                 <w:sz w:val="24"/>
               </w:rPr>
-              <w:t>Calorific</w:t>
+              <w:t>Calorific Value of Fuel</w:t>
             </w:r>
             <w:r>
               <w:rPr>
                 <w:spacing w:val="-9"/>
                 <w:sz w:val="24"/>
               </w:rPr>
-              <w:t xml:space="preserve"> </w:t>
-            </w:r>
-            <w:r>
-              <w:rPr>
-                <w:sz w:val="24"/>
-              </w:rPr>
-              <w:t>Value</w:t>
+            </w:r>
+            <w:r>
+              <w:rPr>
+                <w:sz w:val="24"/>
+              </w:rPr>
             </w:r>
             <w:r>
               <w:rPr>
                 <w:spacing w:val="-4"/>
                 <w:sz w:val="24"/>
               </w:rPr>
-              <w:t xml:space="preserve"> </w:t>
-            </w:r>
-            <w:r>
-              <w:rPr>
-                <w:sz w:val="24"/>
-              </w:rPr>
-              <w:t>of</w:t>
+            </w:r>
+            <w:r>
+              <w:rPr>
+                <w:sz w:val="24"/>
+              </w:rPr>
             </w:r>
             <w:r>
               <w:rPr>
                 <w:spacing w:val="4"/>
                 <w:sz w:val="24"/>
               </w:rPr>
-              <w:t xml:space="preserve"> </w:t>
             </w:r>
             <w:r>
               <w:rPr>
                 <w:spacing w:val="-4"/>
                 <w:sz w:val="24"/>
               </w:rPr>
-              <w:t>Fuel</w:t>
             </w:r>
           </w:p>
         </w:tc>
@@ -10277,21 +10228,19 @@
               <w:rPr>
                 <w:sz w:val="24"/>
               </w:rPr>
-              <w:t>Fuel</w:t>
+              <w:t>Fuel Consumption</w:t>
             </w:r>
             <w:r>
               <w:rPr>
                 <w:spacing w:val="-8"/>
                 <w:sz w:val="24"/>
               </w:rPr>
-              <w:t xml:space="preserve"> </w:t>
             </w:r>
             <w:r>
               <w:rPr>
                 <w:spacing w:val="-2"/>
                 <w:sz w:val="24"/>
               </w:rPr>
-              <w:t>Consumption</w:t>
             </w:r>
           </w:p>
         </w:tc>
@@ -10359,47 +10308,41 @@
               <w:rPr>
                 <w:sz w:val="24"/>
               </w:rPr>
-              <w:t>Burner</w:t>
+              <w:t>Burner Size &amp; Capacity</w:t>
             </w:r>
             <w:r>
               <w:rPr>
                 <w:spacing w:val="-4"/>
                 <w:sz w:val="24"/>
               </w:rPr>
-              <w:t xml:space="preserve"> </w:t>
-            </w:r>
-            <w:r>
-              <w:rPr>
-                <w:sz w:val="24"/>
-              </w:rPr>
-              <w:t>Size</w:t>
+            </w:r>
+            <w:r>
+              <w:rPr>
+                <w:sz w:val="24"/>
+              </w:rPr>
             </w:r>
             <w:r>
               <w:rPr>
                 <w:spacing w:val="-3"/>
                 <w:sz w:val="24"/>
               </w:rPr>
-              <w:t xml:space="preserve"> </w:t>
-            </w:r>
-            <w:r>
-              <w:rPr>
-                <w:sz w:val="24"/>
-              </w:rPr>
-              <w:t>&amp;</w:t>
+            </w:r>
+            <w:r>
+              <w:rPr>
+                <w:sz w:val="24"/>
+              </w:rPr>
             </w:r>
             <w:r>
               <w:rPr>
                 <w:spacing w:val="-7"/>
                 <w:sz w:val="24"/>
               </w:rPr>
-              <w:t xml:space="preserve"> </w:t>
             </w:r>
             <w:r>
               <w:rPr>
                 <w:spacing w:val="-2"/>
                 <w:sz w:val="24"/>
               </w:rPr>
-              <w:t>Capacity</w:t>
             </w:r>
           </w:p>
         </w:tc>
@@ -10484,34 +10427,30 @@
               <w:rPr>
                 <w:sz w:val="24"/>
               </w:rPr>
-              <w:t>Combustion</w:t>
+              <w:t>Combustion Air Blower</w:t>
             </w:r>
             <w:r>
               <w:rPr>
                 <w:spacing w:val="-2"/>
                 <w:sz w:val="24"/>
               </w:rPr>
-              <w:t xml:space="preserve"> </w:t>
-            </w:r>
-            <w:r>
-              <w:rPr>
-                <w:sz w:val="24"/>
-              </w:rPr>
-              <w:t>Air</w:t>
+            </w:r>
+            <w:r>
+              <w:rPr>
+                <w:sz w:val="24"/>
+              </w:rPr>
             </w:r>
             <w:r>
               <w:rPr>
                 <w:spacing w:val="-4"/>
                 <w:sz w:val="24"/>
               </w:rPr>
-              <w:t xml:space="preserve"> </w:t>
             </w:r>
             <w:r>
               <w:rPr>
                 <w:spacing w:val="-2"/>
                 <w:sz w:val="24"/>
               </w:rPr>
-              <w:t>Blower</w:t>
             </w:r>
           </w:p>
         </w:tc>
@@ -10590,21 +10529,19 @@
               <w:rPr>
                 <w:sz w:val="24"/>
               </w:rPr>
-              <w:t>Blower</w:t>
+              <w:t>Blower Size</w:t>
             </w:r>
             <w:r>
               <w:rPr>
                 <w:spacing w:val="-9"/>
                 <w:sz w:val="24"/>
               </w:rPr>
-              <w:t xml:space="preserve"> </w:t>
             </w:r>
             <w:r>
               <w:rPr>
                 <w:spacing w:val="-4"/>
                 <w:sz w:val="24"/>
               </w:rPr>
-              <w:t>Size</w:t>
             </w:r>
           </w:p>
         </w:tc>
@@ -10705,27 +10642,24 @@
               <w:rPr>
                 <w:sz w:val="24"/>
               </w:rPr>
-              <w:t>Capacity</w:t>
+              <w:t>Capacity of Blower</w:t>
             </w:r>
             <w:r>
               <w:rPr>
                 <w:spacing w:val="-7"/>
                 <w:sz w:val="24"/>
               </w:rPr>
-              <w:t xml:space="preserve"> </w:t>
-            </w:r>
-            <w:r>
-              <w:rPr>
-                <w:sz w:val="24"/>
-              </w:rPr>
-              <w:t>of</w:t>
+            </w:r>
+            <w:r>
+              <w:rPr>
+                <w:sz w:val="24"/>
+              </w:rPr>
             </w:r>
             <w:r>
               <w:rPr>
                 <w:spacing w:val="-2"/>
                 <w:sz w:val="24"/>
               </w:rPr>
-              <w:t xml:space="preserve"> Blower</w:t>
             </w:r>
           </w:p>
         </w:tc>
@@ -11005,53 +10939,46 @@
               <w:rPr>
                 <w:sz w:val="24"/>
               </w:rPr>
-              <w:t>Motor</w:t>
+              <w:t>Motor recommended for Power Pack</w:t>
             </w:r>
             <w:r>
               <w:rPr>
                 <w:spacing w:val="-5"/>
                 <w:sz w:val="24"/>
               </w:rPr>
-              <w:t xml:space="preserve"> </w:t>
-            </w:r>
-            <w:r>
-              <w:rPr>
-                <w:sz w:val="24"/>
-              </w:rPr>
-              <w:t>recommended</w:t>
+            </w:r>
+            <w:r>
+              <w:rPr>
+                <w:sz w:val="24"/>
+              </w:rPr>
             </w:r>
             <w:r>
               <w:rPr>
                 <w:spacing w:val="-2"/>
                 <w:sz w:val="24"/>
               </w:rPr>
-              <w:t xml:space="preserve"> </w:t>
-            </w:r>
-            <w:r>
-              <w:rPr>
-                <w:sz w:val="24"/>
-              </w:rPr>
-              <w:t>for</w:t>
+            </w:r>
+            <w:r>
+              <w:rPr>
+                <w:sz w:val="24"/>
+              </w:rPr>
             </w:r>
             <w:r>
               <w:rPr>
                 <w:spacing w:val="-4"/>
                 <w:sz w:val="24"/>
               </w:rPr>
-              <w:t xml:space="preserve"> </w:t>
-            </w:r>
-            <w:r>
-              <w:rPr>
-                <w:sz w:val="24"/>
-              </w:rPr>
-              <w:t>Power</w:t>
+            </w:r>
+            <w:r>
+              <w:rPr>
+                <w:sz w:val="24"/>
+              </w:rPr>
             </w:r>
             <w:r>
               <w:rPr>
                 <w:spacing w:val="-4"/>
                 <w:sz w:val="24"/>
               </w:rPr>
-              <w:t xml:space="preserve"> Pack</w:t>
             </w:r>
           </w:p>
         </w:tc>
@@ -11220,34 +11147,30 @@
               <w:rPr>
                 <w:sz w:val="24"/>
               </w:rPr>
-              <w:t>Maximum</w:t>
+              <w:t>Maximum Electrical Load</w:t>
             </w:r>
             <w:r>
               <w:rPr>
                 <w:spacing w:val="-9"/>
                 <w:sz w:val="24"/>
               </w:rPr>
-              <w:t xml:space="preserve"> </w:t>
-            </w:r>
-            <w:r>
-              <w:rPr>
-                <w:sz w:val="24"/>
-              </w:rPr>
-              <w:t>Electrical</w:t>
+            </w:r>
+            <w:r>
+              <w:rPr>
+                <w:sz w:val="24"/>
+              </w:rPr>
             </w:r>
             <w:r>
               <w:rPr>
                 <w:spacing w:val="-5"/>
                 <w:sz w:val="24"/>
               </w:rPr>
-              <w:t xml:space="preserve"> </w:t>
             </w:r>
             <w:r>
               <w:rPr>
                 <w:spacing w:val="-4"/>
                 <w:sz w:val="24"/>
               </w:rPr>
-              <w:t>Load</w:t>
             </w:r>
           </w:p>
         </w:tc>

</xml_diff>

<commit_message>
feat: data-driven price schedule with supervision charges from DB
- Adds 'SUPERVISION CHARGE - MECHANICAL' (12500) and
  'SUPERVISION CHARGE - PLC & INSTRUMENTATION' (15000) rows to
  component_price_master so supervision rates can be edited from the
  DB viewer without touching code or template.
- Price-schedule table cells now use {{equipment_name}},
  {{total_price_vertical}}, {{supervision_mech}}, {{supervision_plc}},
  and {{total_in_words}} placeholders. Supervision-charge text is
  built from the DB rates at render time.
- Adds an Indian-English number-to-words converter (lakh / crore
  system) to compute {{total_in_words}} automatically from the
  grand total, e.g. 28,98,000 -> 'TWENTY-EIGHT LAKH NINETY-EIGHT
  THOUSAND'.
- Adds {{equipment_name}} ('Vertical/Horizontal Ladle Preheater - X Ton')
  derived from is_horizontal flag and ladle_tons.

Co-Authored-By: Claude Opus 4.6 (1M context) <noreply@anthropic.com>
</commit_message>
<xml_diff>
--- a/Offer_Template.docx
+++ b/Offer_Template.docx
@@ -17154,7 +17154,7 @@
                 <w:sz w:val="24"/>
                 <w:szCs w:val="24"/>
               </w:rPr>
-              <w:t>1</w:t>
+              <w:t>1.</w:t>
             </w:r>
             <w:r>
               <w:rPr>
@@ -17163,7 +17163,6 @@
                 <w:sz w:val="24"/>
                 <w:szCs w:val="24"/>
               </w:rPr>
-              <w:t>.</w:t>
             </w:r>
           </w:p>
         </w:tc>
@@ -17192,7 +17191,7 @@
                 <w:sz w:val="24"/>
                 <w:szCs w:val="24"/>
               </w:rPr>
-              <w:t>{{project_name}}</w:t>
+              <w:t>{{equipment_name}}</w:t>
             </w:r>
             <w:r>
               <w:rPr>
@@ -17256,7 +17255,7 @@
                 <w:sz w:val="24"/>
                 <w:szCs w:val="24"/>
               </w:rPr>
-              <w:t>0</w:t>
+              <w:t>01 Set</w:t>
             </w:r>
             <w:r>
               <w:rPr>
@@ -17266,7 +17265,6 @@
                 <w:sz w:val="24"/>
                 <w:szCs w:val="24"/>
               </w:rPr>
-              <w:t>1</w:t>
             </w:r>
             <w:r>
               <w:rPr>
@@ -17277,7 +17275,6 @@
                 <w:sz w:val="24"/>
                 <w:szCs w:val="24"/>
               </w:rPr>
-              <w:t xml:space="preserve"> </w:t>
             </w:r>
             <w:r>
               <w:rPr>
@@ -17287,7 +17284,6 @@
                 <w:sz w:val="24"/>
                 <w:szCs w:val="24"/>
               </w:rPr>
-              <w:t>Set</w:t>
             </w:r>
           </w:p>
         </w:tc>
@@ -17435,7 +17431,7 @@
                 <w:sz w:val="24"/>
                 <w:szCs w:val="24"/>
               </w:rPr>
-              <w:t>2</w:t>
+              <w:t>2.</w:t>
             </w:r>
             <w:r>
               <w:rPr>
@@ -17444,21 +17440,7 @@
                 <w:sz w:val="24"/>
                 <w:szCs w:val="24"/>
               </w:rPr>
-              <w:t>.</w:t>
-            </w:r>
-          </w:p>
-          <w:p>
-            <w:pPr>
-              <w:pStyle w:val="TableParagraph"/>
-              <w:spacing w:before="4"/>
-              <w:ind w:left="130" w:right="122"/>
-              <w:jc w:val="center"/>
-              <w:rPr>
-                <w:rFonts w:ascii="Times New Roman" w:hAnsi="Times New Roman" w:cs="Times New Roman"/>
-                <w:sz w:val="24"/>
-                <w:szCs w:val="24"/>
-              </w:rPr>
-            </w:pPr>
+            </w:r>
           </w:p>
         </w:tc>
         <w:tc>
@@ -17488,7 +17470,21 @@
                 <w:sz w:val="24"/>
                 <w:szCs w:val="24"/>
               </w:rPr>
-              <w:t>Supervision</w:t>
+              <w:t>Supervision Charges</w:t>
+              <w:br/>
+              <w:t>for</w:t>
+              <w:br/>
+              <w:t>Erection</w:t>
+              <w:br/>
+              <w:t>&amp;</w:t>
+              <w:br/>
+              <w:t>Commissioning</w:t>
+              <w:br/>
+              <w:t>Erection By Client</w:t>
+              <w:br/>
+              <w:t>&amp;</w:t>
+              <w:br/>
+              <w:t>Supervision by Encon</w:t>
             </w:r>
             <w:r>
               <w:rPr>
@@ -17498,7 +17494,6 @@
                 <w:sz w:val="24"/>
                 <w:szCs w:val="24"/>
               </w:rPr>
-              <w:t xml:space="preserve"> </w:t>
             </w:r>
             <w:r>
               <w:rPr>
@@ -17507,7 +17502,6 @@
                 <w:sz w:val="24"/>
                 <w:szCs w:val="24"/>
               </w:rPr>
-              <w:t>Charges</w:t>
             </w:r>
             <w:r>
               <w:rPr>
@@ -17517,195 +17511,6 @@
                 <w:sz w:val="24"/>
                 <w:szCs w:val="24"/>
               </w:rPr>
-              <w:t xml:space="preserve"> </w:t>
-            </w:r>
-          </w:p>
-          <w:p>
-            <w:pPr>
-              <w:pStyle w:val="TableParagraph"/>
-              <w:spacing w:before="5" w:line="244" w:lineRule="auto"/>
-              <w:ind w:left="101"/>
-              <w:jc w:val="center"/>
-              <w:rPr>
-                <w:rFonts w:ascii="Times New Roman" w:hAnsi="Times New Roman" w:cs="Times New Roman"/>
-                <w:b/>
-                <w:spacing w:val="17"/>
-                <w:sz w:val="24"/>
-                <w:szCs w:val="24"/>
-              </w:rPr>
-            </w:pPr>
-            <w:r>
-              <w:rPr>
-                <w:rFonts w:ascii="Times New Roman" w:hAnsi="Times New Roman" w:cs="Times New Roman"/>
-                <w:b/>
-                <w:sz w:val="24"/>
-                <w:szCs w:val="24"/>
-              </w:rPr>
-              <w:t>for</w:t>
-            </w:r>
-            <w:r>
-              <w:rPr>
-                <w:rFonts w:ascii="Times New Roman" w:hAnsi="Times New Roman" w:cs="Times New Roman"/>
-                <w:b/>
-                <w:spacing w:val="17"/>
-                <w:sz w:val="24"/>
-                <w:szCs w:val="24"/>
-              </w:rPr>
-              <w:t xml:space="preserve"> </w:t>
-            </w:r>
-          </w:p>
-          <w:p>
-            <w:pPr>
-              <w:pStyle w:val="TableParagraph"/>
-              <w:spacing w:before="5" w:line="244" w:lineRule="auto"/>
-              <w:ind w:left="101"/>
-              <w:jc w:val="center"/>
-              <w:rPr>
-                <w:rFonts w:ascii="Times New Roman" w:hAnsi="Times New Roman" w:cs="Times New Roman"/>
-                <w:b/>
-                <w:spacing w:val="15"/>
-                <w:sz w:val="24"/>
-                <w:szCs w:val="24"/>
-              </w:rPr>
-            </w:pPr>
-            <w:r>
-              <w:rPr>
-                <w:rFonts w:ascii="Times New Roman" w:hAnsi="Times New Roman" w:cs="Times New Roman"/>
-                <w:b/>
-                <w:sz w:val="24"/>
-                <w:szCs w:val="24"/>
-              </w:rPr>
-              <w:t>Erection</w:t>
-            </w:r>
-            <w:r>
-              <w:rPr>
-                <w:rFonts w:ascii="Times New Roman" w:hAnsi="Times New Roman" w:cs="Times New Roman"/>
-                <w:b/>
-                <w:spacing w:val="15"/>
-                <w:sz w:val="24"/>
-                <w:szCs w:val="24"/>
-              </w:rPr>
-              <w:t xml:space="preserve"> </w:t>
-            </w:r>
-          </w:p>
-          <w:p>
-            <w:pPr>
-              <w:pStyle w:val="TableParagraph"/>
-              <w:spacing w:before="5" w:line="244" w:lineRule="auto"/>
-              <w:ind w:left="101"/>
-              <w:jc w:val="center"/>
-              <w:rPr>
-                <w:rFonts w:ascii="Times New Roman" w:hAnsi="Times New Roman" w:cs="Times New Roman"/>
-                <w:b/>
-                <w:sz w:val="24"/>
-                <w:szCs w:val="24"/>
-              </w:rPr>
-            </w:pPr>
-            <w:r>
-              <w:rPr>
-                <w:rFonts w:ascii="Times New Roman" w:hAnsi="Times New Roman" w:cs="Times New Roman"/>
-                <w:b/>
-                <w:sz w:val="24"/>
-                <w:szCs w:val="24"/>
-              </w:rPr>
-              <w:t>&amp;</w:t>
-            </w:r>
-          </w:p>
-          <w:p>
-            <w:pPr>
-              <w:pStyle w:val="TableParagraph"/>
-              <w:spacing w:before="5" w:line="244" w:lineRule="auto"/>
-              <w:ind w:left="101"/>
-              <w:jc w:val="center"/>
-              <w:rPr>
-                <w:rFonts w:ascii="Times New Roman" w:hAnsi="Times New Roman" w:cs="Times New Roman"/>
-                <w:b/>
-                <w:sz w:val="24"/>
-                <w:szCs w:val="24"/>
-              </w:rPr>
-            </w:pPr>
-            <w:r>
-              <w:rPr>
-                <w:rFonts w:ascii="Times New Roman" w:hAnsi="Times New Roman" w:cs="Times New Roman"/>
-                <w:b/>
-                <w:spacing w:val="-52"/>
-                <w:sz w:val="24"/>
-                <w:szCs w:val="24"/>
-              </w:rPr>
-              <w:t xml:space="preserve"> </w:t>
-            </w:r>
-            <w:r>
-              <w:rPr>
-                <w:rFonts w:ascii="Times New Roman" w:hAnsi="Times New Roman" w:cs="Times New Roman"/>
-                <w:b/>
-                <w:w w:val="105"/>
-                <w:sz w:val="24"/>
-                <w:szCs w:val="24"/>
-              </w:rPr>
-              <w:t>Commissioning</w:t>
-            </w:r>
-          </w:p>
-          <w:p>
-            <w:pPr>
-              <w:pStyle w:val="TableParagraph"/>
-              <w:spacing w:before="1" w:line="244" w:lineRule="auto"/>
-              <w:ind w:left="200"/>
-              <w:jc w:val="center"/>
-              <w:rPr>
-                <w:rFonts w:ascii="Times New Roman" w:hAnsi="Times New Roman" w:cs="Times New Roman"/>
-                <w:sz w:val="24"/>
-                <w:szCs w:val="24"/>
-              </w:rPr>
-            </w:pPr>
-            <w:r>
-              <w:rPr>
-                <w:rFonts w:ascii="Times New Roman" w:hAnsi="Times New Roman" w:cs="Times New Roman"/>
-                <w:sz w:val="24"/>
-                <w:szCs w:val="24"/>
-              </w:rPr>
-              <w:t xml:space="preserve">Erection By Client </w:t>
-            </w:r>
-          </w:p>
-          <w:p>
-            <w:pPr>
-              <w:pStyle w:val="TableParagraph"/>
-              <w:spacing w:before="1" w:line="244" w:lineRule="auto"/>
-              <w:ind w:left="200"/>
-              <w:jc w:val="center"/>
-              <w:rPr>
-                <w:rFonts w:ascii="Times New Roman" w:hAnsi="Times New Roman" w:cs="Times New Roman"/>
-                <w:sz w:val="24"/>
-                <w:szCs w:val="24"/>
-              </w:rPr>
-            </w:pPr>
-            <w:r>
-              <w:rPr>
-                <w:rFonts w:ascii="Times New Roman" w:hAnsi="Times New Roman" w:cs="Times New Roman"/>
-                <w:sz w:val="24"/>
-                <w:szCs w:val="24"/>
-              </w:rPr>
-              <w:t xml:space="preserve">&amp; </w:t>
-            </w:r>
-          </w:p>
-          <w:p>
-            <w:pPr>
-              <w:pStyle w:val="TableParagraph"/>
-              <w:spacing w:before="1" w:line="244" w:lineRule="auto"/>
-              <w:ind w:left="200"/>
-              <w:jc w:val="center"/>
-              <w:rPr>
-                <w:rFonts w:ascii="Times New Roman" w:hAnsi="Times New Roman" w:cs="Times New Roman"/>
-                <w:sz w:val="24"/>
-                <w:szCs w:val="24"/>
-              </w:rPr>
-            </w:pPr>
-            <w:r>
-              <w:rPr>
-                <w:rFonts w:ascii="Times New Roman" w:hAnsi="Times New Roman" w:cs="Times New Roman"/>
-                <w:sz w:val="24"/>
-                <w:szCs w:val="24"/>
-              </w:rPr>
-              <w:t>Supervision by Encon</w:t>
             </w:r>
           </w:p>
         </w:tc>
@@ -17738,7 +17543,18 @@
                 <w:sz w:val="24"/>
                 <w:szCs w:val="24"/>
               </w:rPr>
-              <w:t>12,5</w:t>
+              <w:t>{{supervision_mech}} (Mechanical)</w:t>
+              <w:br/>
+              <w:br/>
+              <w:t>{{supervision_plc}} (PLC &amp; Instrumentation)</w:t>
+              <w:br/>
+              <w:t>+</w:t>
+              <w:br/>
+              <w:t>To &amp; Fro Air fare from Delhi to Site</w:t>
+              <w:br/>
+              <w:t>+</w:t>
+              <w:br/>
+              <w:t>Boarding &amp; Loading, Local Conveyance &amp; Medical assistance if required</w:t>
             </w:r>
             <w:r>
               <w:rPr>
@@ -17748,7 +17564,6 @@
                 <w:sz w:val="24"/>
                 <w:szCs w:val="24"/>
               </w:rPr>
-              <w:t>00</w:t>
             </w:r>
             <w:r>
               <w:rPr>
@@ -17758,7 +17573,6 @@
                 <w:sz w:val="24"/>
                 <w:szCs w:val="24"/>
               </w:rPr>
-              <w:t>.00</w:t>
             </w:r>
             <w:r>
               <w:rPr>
@@ -17769,400 +17583,6 @@
                 <w:sz w:val="24"/>
                 <w:szCs w:val="24"/>
               </w:rPr>
-              <w:t xml:space="preserve"> (Mechanical)</w:t>
-            </w:r>
-          </w:p>
-          <w:p>
-            <w:pPr>
-              <w:pStyle w:val="TableParagraph"/>
-              <w:spacing w:before="60"/>
-              <w:ind w:left="301" w:right="284"/>
-              <w:jc w:val="center"/>
-              <w:rPr>
-                <w:rFonts w:ascii="Times New Roman" w:hAnsi="Times New Roman" w:cs="Times New Roman"/>
-                <w:bCs/>
-                <w:spacing w:val="-12"/>
-                <w:w w:val="105"/>
-                <w:sz w:val="24"/>
-                <w:szCs w:val="24"/>
-              </w:rPr>
-            </w:pPr>
-          </w:p>
-          <w:p>
-            <w:pPr>
-              <w:pStyle w:val="TableParagraph"/>
-              <w:spacing w:before="60"/>
-              <w:ind w:left="301" w:right="284"/>
-              <w:jc w:val="center"/>
-              <w:rPr>
-                <w:rFonts w:ascii="Times New Roman" w:hAnsi="Times New Roman" w:cs="Times New Roman"/>
-                <w:bCs/>
-                <w:spacing w:val="-12"/>
-                <w:w w:val="105"/>
-                <w:sz w:val="24"/>
-                <w:szCs w:val="24"/>
-              </w:rPr>
-            </w:pPr>
-            <w:r>
-              <w:rPr>
-                <w:rFonts w:ascii="Times New Roman" w:hAnsi="Times New Roman" w:cs="Times New Roman"/>
-                <w:bCs/>
-                <w:spacing w:val="-12"/>
-                <w:w w:val="105"/>
-                <w:sz w:val="24"/>
-                <w:szCs w:val="24"/>
-              </w:rPr>
-              <w:t xml:space="preserve">15,000.00 </w:t>
-            </w:r>
-            <w:r>
-              <w:rPr>
-                <w:rFonts w:ascii="Times New Roman" w:hAnsi="Times New Roman" w:cs="Times New Roman"/>
-                <w:bCs/>
-                <w:spacing w:val="-12"/>
-                <w:w w:val="105"/>
-                <w:sz w:val="24"/>
-                <w:szCs w:val="24"/>
-              </w:rPr>
-              <w:t>(PLC &amp; Instrumentation)</w:t>
-            </w:r>
-          </w:p>
-          <w:p>
-            <w:pPr>
-              <w:pStyle w:val="TableParagraph"/>
-              <w:spacing w:before="120"/>
-              <w:ind w:left="14"/>
-              <w:jc w:val="center"/>
-              <w:rPr>
-                <w:rFonts w:ascii="Times New Roman" w:hAnsi="Times New Roman" w:cs="Times New Roman"/>
-                <w:bCs/>
-                <w:sz w:val="24"/>
-                <w:szCs w:val="24"/>
-              </w:rPr>
-            </w:pPr>
-            <w:r>
-              <w:rPr>
-                <w:rFonts w:ascii="Times New Roman" w:hAnsi="Times New Roman" w:cs="Times New Roman"/>
-                <w:bCs/>
-                <w:w w:val="102"/>
-                <w:sz w:val="24"/>
-                <w:szCs w:val="24"/>
-              </w:rPr>
-              <w:t>+</w:t>
-            </w:r>
-          </w:p>
-          <w:p>
-            <w:pPr>
-              <w:pStyle w:val="TableParagraph"/>
-              <w:spacing w:before="6" w:line="244" w:lineRule="auto"/>
-              <w:ind w:left="113" w:right="281"/>
-              <w:jc w:val="center"/>
-              <w:rPr>
-                <w:rFonts w:ascii="Times New Roman" w:hAnsi="Times New Roman" w:cs="Times New Roman"/>
-                <w:bCs/>
-                <w:sz w:val="24"/>
-                <w:szCs w:val="24"/>
-              </w:rPr>
-            </w:pPr>
-            <w:r>
-              <w:rPr>
-                <w:rFonts w:ascii="Times New Roman" w:hAnsi="Times New Roman" w:cs="Times New Roman"/>
-                <w:bCs/>
-                <w:w w:val="105"/>
-                <w:sz w:val="24"/>
-                <w:szCs w:val="24"/>
-              </w:rPr>
-              <w:t>To</w:t>
-            </w:r>
-            <w:r>
-              <w:rPr>
-                <w:rFonts w:ascii="Times New Roman" w:hAnsi="Times New Roman" w:cs="Times New Roman"/>
-                <w:bCs/>
-                <w:spacing w:val="-13"/>
-                <w:w w:val="105"/>
-                <w:sz w:val="24"/>
-                <w:szCs w:val="24"/>
-              </w:rPr>
-              <w:t xml:space="preserve"> </w:t>
-            </w:r>
-            <w:r>
-              <w:rPr>
-                <w:rFonts w:ascii="Times New Roman" w:hAnsi="Times New Roman" w:cs="Times New Roman"/>
-                <w:bCs/>
-                <w:w w:val="105"/>
-                <w:sz w:val="24"/>
-                <w:szCs w:val="24"/>
-              </w:rPr>
-              <w:t>&amp;</w:t>
-            </w:r>
-            <w:r>
-              <w:rPr>
-                <w:rFonts w:ascii="Times New Roman" w:hAnsi="Times New Roman" w:cs="Times New Roman"/>
-                <w:bCs/>
-                <w:spacing w:val="-12"/>
-                <w:w w:val="105"/>
-                <w:sz w:val="24"/>
-                <w:szCs w:val="24"/>
-              </w:rPr>
-              <w:t xml:space="preserve"> </w:t>
-            </w:r>
-            <w:r>
-              <w:rPr>
-                <w:rFonts w:ascii="Times New Roman" w:hAnsi="Times New Roman" w:cs="Times New Roman"/>
-                <w:bCs/>
-                <w:w w:val="105"/>
-                <w:sz w:val="24"/>
-                <w:szCs w:val="24"/>
-              </w:rPr>
-              <w:t>Fro</w:t>
-            </w:r>
-            <w:r>
-              <w:rPr>
-                <w:rFonts w:ascii="Times New Roman" w:hAnsi="Times New Roman" w:cs="Times New Roman"/>
-                <w:bCs/>
-                <w:spacing w:val="-12"/>
-                <w:w w:val="105"/>
-                <w:sz w:val="24"/>
-                <w:szCs w:val="24"/>
-              </w:rPr>
-              <w:t xml:space="preserve"> </w:t>
-            </w:r>
-            <w:r>
-              <w:rPr>
-                <w:rFonts w:ascii="Times New Roman" w:hAnsi="Times New Roman" w:cs="Times New Roman"/>
-                <w:bCs/>
-                <w:spacing w:val="-12"/>
-                <w:w w:val="105"/>
-                <w:sz w:val="24"/>
-                <w:szCs w:val="24"/>
-              </w:rPr>
-              <w:t xml:space="preserve">Air </w:t>
-            </w:r>
-            <w:r>
-              <w:rPr>
-                <w:rFonts w:ascii="Times New Roman" w:hAnsi="Times New Roman" w:cs="Times New Roman"/>
-                <w:bCs/>
-                <w:w w:val="105"/>
-                <w:sz w:val="24"/>
-                <w:szCs w:val="24"/>
-              </w:rPr>
-              <w:t>fare</w:t>
-            </w:r>
-            <w:r>
-              <w:rPr>
-                <w:rFonts w:ascii="Times New Roman" w:hAnsi="Times New Roman" w:cs="Times New Roman"/>
-                <w:bCs/>
-                <w:spacing w:val="-13"/>
-                <w:w w:val="105"/>
-                <w:sz w:val="24"/>
-                <w:szCs w:val="24"/>
-              </w:rPr>
-              <w:t xml:space="preserve"> </w:t>
-            </w:r>
-            <w:r>
-              <w:rPr>
-                <w:rFonts w:ascii="Times New Roman" w:hAnsi="Times New Roman" w:cs="Times New Roman"/>
-                <w:bCs/>
-                <w:w w:val="105"/>
-                <w:sz w:val="24"/>
-                <w:szCs w:val="24"/>
-              </w:rPr>
-              <w:t>from</w:t>
-            </w:r>
-            <w:r>
-              <w:rPr>
-                <w:rFonts w:ascii="Times New Roman" w:hAnsi="Times New Roman" w:cs="Times New Roman"/>
-                <w:bCs/>
-                <w:spacing w:val="-55"/>
-                <w:w w:val="105"/>
-                <w:sz w:val="24"/>
-                <w:szCs w:val="24"/>
-              </w:rPr>
-              <w:t xml:space="preserve"> </w:t>
-            </w:r>
-            <w:r>
-              <w:rPr>
-                <w:rFonts w:ascii="Times New Roman" w:hAnsi="Times New Roman" w:cs="Times New Roman"/>
-                <w:bCs/>
-                <w:w w:val="105"/>
-                <w:sz w:val="24"/>
-                <w:szCs w:val="24"/>
-              </w:rPr>
-              <w:t>Delhi</w:t>
-            </w:r>
-            <w:r>
-              <w:rPr>
-                <w:rFonts w:ascii="Times New Roman" w:hAnsi="Times New Roman" w:cs="Times New Roman"/>
-                <w:bCs/>
-                <w:spacing w:val="-6"/>
-                <w:w w:val="105"/>
-                <w:sz w:val="24"/>
-                <w:szCs w:val="24"/>
-              </w:rPr>
-              <w:t xml:space="preserve"> </w:t>
-            </w:r>
-            <w:r>
-              <w:rPr>
-                <w:rFonts w:ascii="Times New Roman" w:hAnsi="Times New Roman" w:cs="Times New Roman"/>
-                <w:bCs/>
-                <w:w w:val="105"/>
-                <w:sz w:val="24"/>
-                <w:szCs w:val="24"/>
-              </w:rPr>
-              <w:t>to</w:t>
-            </w:r>
-            <w:r>
-              <w:rPr>
-                <w:rFonts w:ascii="Times New Roman" w:hAnsi="Times New Roman" w:cs="Times New Roman"/>
-                <w:bCs/>
-                <w:spacing w:val="-3"/>
-                <w:w w:val="105"/>
-                <w:sz w:val="24"/>
-                <w:szCs w:val="24"/>
-              </w:rPr>
-              <w:t xml:space="preserve"> </w:t>
-            </w:r>
-            <w:r>
-              <w:rPr>
-                <w:rFonts w:ascii="Times New Roman" w:hAnsi="Times New Roman" w:cs="Times New Roman"/>
-                <w:bCs/>
-                <w:w w:val="105"/>
-                <w:sz w:val="24"/>
-                <w:szCs w:val="24"/>
-              </w:rPr>
-              <w:t>Site</w:t>
-            </w:r>
-          </w:p>
-          <w:p>
-            <w:pPr>
-              <w:pStyle w:val="TableParagraph"/>
-              <w:spacing w:before="6" w:line="244" w:lineRule="auto"/>
-              <w:ind w:left="113" w:right="281"/>
-              <w:jc w:val="center"/>
-              <w:rPr>
-                <w:rFonts w:ascii="Times New Roman" w:hAnsi="Times New Roman" w:cs="Times New Roman"/>
-                <w:bCs/>
-                <w:sz w:val="24"/>
-                <w:szCs w:val="24"/>
-              </w:rPr>
-            </w:pPr>
-            <w:r>
-              <w:rPr>
-                <w:rFonts w:ascii="Times New Roman" w:hAnsi="Times New Roman" w:cs="Times New Roman"/>
-                <w:bCs/>
-                <w:w w:val="102"/>
-                <w:sz w:val="24"/>
-                <w:szCs w:val="24"/>
-              </w:rPr>
-              <w:t xml:space="preserve">    +</w:t>
-            </w:r>
-          </w:p>
-          <w:p>
-            <w:pPr>
-              <w:pStyle w:val="TableParagraph"/>
-              <w:spacing w:before="7" w:line="244" w:lineRule="auto"/>
-              <w:ind w:left="113" w:right="196"/>
-              <w:jc w:val="center"/>
-              <w:rPr>
-                <w:rFonts w:ascii="Times New Roman" w:hAnsi="Times New Roman" w:cs="Times New Roman"/>
-                <w:bCs/>
-                <w:sz w:val="24"/>
-                <w:szCs w:val="24"/>
-              </w:rPr>
-            </w:pPr>
-            <w:r>
-              <w:rPr>
-                <w:rFonts w:ascii="Times New Roman" w:hAnsi="Times New Roman" w:cs="Times New Roman"/>
-                <w:bCs/>
-                <w:sz w:val="24"/>
-                <w:szCs w:val="24"/>
-              </w:rPr>
-              <w:t>Boarding &amp; Loading,</w:t>
-            </w:r>
-            <w:r>
-              <w:rPr>
-                <w:rFonts w:ascii="Times New Roman" w:hAnsi="Times New Roman" w:cs="Times New Roman"/>
-                <w:bCs/>
-                <w:spacing w:val="1"/>
-                <w:sz w:val="24"/>
-                <w:szCs w:val="24"/>
-              </w:rPr>
-              <w:t xml:space="preserve"> </w:t>
-            </w:r>
-            <w:r>
-              <w:rPr>
-                <w:rFonts w:ascii="Times New Roman" w:hAnsi="Times New Roman" w:cs="Times New Roman"/>
-                <w:bCs/>
-                <w:sz w:val="24"/>
-                <w:szCs w:val="24"/>
-              </w:rPr>
-              <w:t>Local Conveyance &amp;</w:t>
-            </w:r>
-            <w:r>
-              <w:rPr>
-                <w:rFonts w:ascii="Times New Roman" w:hAnsi="Times New Roman" w:cs="Times New Roman"/>
-                <w:bCs/>
-                <w:spacing w:val="1"/>
-                <w:sz w:val="24"/>
-                <w:szCs w:val="24"/>
-              </w:rPr>
-              <w:t xml:space="preserve"> </w:t>
-            </w:r>
-            <w:r>
-              <w:rPr>
-                <w:rFonts w:ascii="Times New Roman" w:hAnsi="Times New Roman" w:cs="Times New Roman"/>
-                <w:bCs/>
-                <w:sz w:val="24"/>
-                <w:szCs w:val="24"/>
-              </w:rPr>
-              <w:t>Medical</w:t>
-            </w:r>
-            <w:r>
-              <w:rPr>
-                <w:rFonts w:ascii="Times New Roman" w:hAnsi="Times New Roman" w:cs="Times New Roman"/>
-                <w:bCs/>
-                <w:spacing w:val="10"/>
-                <w:sz w:val="24"/>
-                <w:szCs w:val="24"/>
-              </w:rPr>
-              <w:t xml:space="preserve"> </w:t>
-            </w:r>
-            <w:r>
-              <w:rPr>
-                <w:rFonts w:ascii="Times New Roman" w:hAnsi="Times New Roman" w:cs="Times New Roman"/>
-                <w:bCs/>
-                <w:sz w:val="24"/>
-                <w:szCs w:val="24"/>
-              </w:rPr>
-              <w:t>assistance</w:t>
-            </w:r>
-            <w:r>
-              <w:rPr>
-                <w:rFonts w:ascii="Times New Roman" w:hAnsi="Times New Roman" w:cs="Times New Roman"/>
-                <w:bCs/>
-                <w:spacing w:val="11"/>
-                <w:sz w:val="24"/>
-                <w:szCs w:val="24"/>
-              </w:rPr>
-              <w:t xml:space="preserve"> </w:t>
-            </w:r>
-            <w:r>
-              <w:rPr>
-                <w:rFonts w:ascii="Times New Roman" w:hAnsi="Times New Roman" w:cs="Times New Roman"/>
-                <w:bCs/>
-                <w:sz w:val="24"/>
-                <w:szCs w:val="24"/>
-              </w:rPr>
-              <w:t xml:space="preserve">if </w:t>
-            </w:r>
-            <w:r>
-              <w:rPr>
-                <w:rFonts w:ascii="Times New Roman" w:hAnsi="Times New Roman" w:cs="Times New Roman"/>
-                <w:bCs/>
-                <w:w w:val="105"/>
-                <w:sz w:val="24"/>
-                <w:szCs w:val="24"/>
-              </w:rPr>
-              <w:t>required</w:t>
             </w:r>
           </w:p>
         </w:tc>
@@ -18282,7 +17702,7 @@
                 <w:sz w:val="24"/>
                 <w:szCs w:val="24"/>
               </w:rPr>
-              <w:t xml:space="preserve">     {{total_price_vertical}}</w:t>
+              <w:t>{{total_price_vertical}}</w:t>
             </w:r>
             <w:r>
               <w:rPr>

</xml_diff>

<commit_message>
feat: footer Offer No is now {{quote_no}} on every page + quotes_log
- Footer (rendered on every page) now reads 'Offer No: {{quote_no}}'
  instead of the hardcoded 'ENCON.04025.048/FBD/JS'. Surgical replacement
  of the run-split offer-number text preserved the 'Page | X' field
  next to it. Header table 1's 'OUR REF' already used {{quote_no}} so
  it stays consistent.
- Adds quotes_log table to vlph.db (quote_no, ref_no, company, poc,
  email, mobile, project, equipment, ladle_tons, grand_total,
  marketing/technical person, file path, created_at).
- /api/generate-quote inserts a quotes_log row each time a quote is
  generated, swallowing any insert failure with a warning so the
  primary success path is unaffected.

Co-Authored-By: Claude Opus 4.6 (1M context) <noreply@anthropic.com>
</commit_message>
<xml_diff>
--- a/Offer_Template.docx
+++ b/Offer_Template.docx
@@ -26848,39 +26848,39 @@
                             <w:rPr>
                               <w:sz w:val="28"/>
                             </w:rPr>
-                            <w:t>ENCON</w:t>
+                            <w:t xml:space="preserve">{{quote_no}}</w:t>
                           </w:r>
                           <w:r>
                             <w:rPr>
                               <w:sz w:val="28"/>
                             </w:rPr>
-                            <w:t>.</w:t>
+                            <w:t/>
                           </w:r>
                           <w:r>
                             <w:rPr>
                               <w:sz w:val="28"/>
                             </w:rPr>
-                            <w:t>04025.0</w:t>
+                            <w:t/>
                           </w:r>
                           <w:r>
                             <w:rPr>
                               <w:sz w:val="28"/>
                             </w:rPr>
-                            <w:t>48</w:t>
+                            <w:t/>
                           </w:r>
                           <w:r>
                             <w:rPr>
                               <w:spacing w:val="-2"/>
                               <w:sz w:val="28"/>
                             </w:rPr>
-                            <w:t>/FBD/</w:t>
+                            <w:t/>
                           </w:r>
                           <w:r>
                             <w:rPr>
                               <w:spacing w:val="-2"/>
                               <w:sz w:val="28"/>
                             </w:rPr>
-                            <w:t>JS</w:t>
+                            <w:t/>
                           </w:r>
                         </w:p>
                       </w:txbxContent>
@@ -26941,39 +26941,39 @@
                       <w:rPr>
                         <w:sz w:val="28"/>
                       </w:rPr>
-                      <w:t>ENCON</w:t>
+                      <w:t xml:space="preserve">{{quote_no}}</w:t>
                     </w:r>
                     <w:r>
                       <w:rPr>
                         <w:sz w:val="28"/>
                       </w:rPr>
-                      <w:t>.</w:t>
+                      <w:t/>
                     </w:r>
                     <w:r>
                       <w:rPr>
                         <w:sz w:val="28"/>
                       </w:rPr>
-                      <w:t>04025.0</w:t>
+                      <w:t/>
                     </w:r>
                     <w:r>
                       <w:rPr>
                         <w:sz w:val="28"/>
                       </w:rPr>
-                      <w:t>48</w:t>
+                      <w:t/>
                     </w:r>
                     <w:r>
                       <w:rPr>
                         <w:spacing w:val="-2"/>
                         <w:sz w:val="28"/>
                       </w:rPr>
-                      <w:t>/FBD/</w:t>
+                      <w:t/>
                     </w:r>
                     <w:r>
                       <w:rPr>
                         <w:spacing w:val="-2"/>
                         <w:sz w:val="28"/>
                       </w:rPr>
-                      <w:t>JS</w:t>
+                      <w:t/>
                     </w:r>
                   </w:p>
                 </w:txbxContent>

</xml_diff>

<commit_message>
feat: MAKE LIST table dynamically built from current BOM
The last-page MAKE LIST table no longer carries a hardcoded 22-item list.
Instead the frontend sends bom_items (item + make) from the calculation
result, the backend post-processes the rendered docx, and one row per BOM
item is appended to the table.

- Empty/missing 'make' values default to 'ENCON'
- Summary rows ('BOUGHT OUT ITEMS', 'ENCON ITEMS') are filtered out client-side
- De-duplicated by item name (case-insensitive) so the same item isn't listed twice
- Header row formatting is cloned for new rows so styling is consistent
- {%tr for%} approach failed (jinja parse error from cell-split markers);
  post-render row insertion is more reliable

Applies to VLPH, HLPH, and Tundish.

Co-Authored-By: Claude Opus 4.6 (1M context) <noreply@anthropic.com>
</commit_message>
<xml_diff>
--- a/Offer_Template.docx
+++ b/Offer_Template.docx
@@ -25350,1106 +25350,6 @@
                 <w:szCs w:val="24"/>
               </w:rPr>
               <w:t>MAKE</w:t>
-            </w:r>
-          </w:p>
-        </w:tc>
-      </w:tr>
-      <w:tr>
-        <w:trPr>
-          <w:trHeight w:val="397"/>
-          <w:jc w:val="center"/>
-        </w:trPr>
-        <w:tc>
-          <w:tcPr>
-            <w:tcW w:w="5531" w:type="dxa"/>
-            <w:vAlign w:val="center"/>
-          </w:tcPr>
-          <w:p>
-            <w:pPr>
-              <w:ind w:left="144"/>
-              <w:rPr>
-                <w:sz w:val="24"/>
-                <w:szCs w:val="24"/>
-              </w:rPr>
-            </w:pPr>
-            <w:r>
-              <w:rPr>
-                <w:sz w:val="24"/>
-                <w:szCs w:val="24"/>
-              </w:rPr>
-              <w:t>Dual Fuel Burner (NG/LDO)</w:t>
-            </w:r>
-          </w:p>
-        </w:tc>
-        <w:tc>
-          <w:tcPr>
-            <w:tcW w:w="4112" w:type="dxa"/>
-            <w:vAlign w:val="center"/>
-          </w:tcPr>
-          <w:p>
-            <w:pPr>
-              <w:ind w:left="144"/>
-              <w:rPr>
-                <w:sz w:val="24"/>
-                <w:szCs w:val="24"/>
-              </w:rPr>
-            </w:pPr>
-            <w:r>
-              <w:rPr>
-                <w:sz w:val="24"/>
-                <w:szCs w:val="24"/>
-              </w:rPr>
-              <w:t>Encon</w:t>
-            </w:r>
-          </w:p>
-        </w:tc>
-      </w:tr>
-      <w:tr>
-        <w:trPr>
-          <w:trHeight w:val="398"/>
-          <w:jc w:val="center"/>
-        </w:trPr>
-        <w:tc>
-          <w:tcPr>
-            <w:tcW w:w="5531" w:type="dxa"/>
-            <w:vAlign w:val="center"/>
-          </w:tcPr>
-          <w:p>
-            <w:pPr>
-              <w:ind w:left="144"/>
-              <w:rPr>
-                <w:sz w:val="24"/>
-                <w:szCs w:val="24"/>
-              </w:rPr>
-            </w:pPr>
-            <w:r>
-              <w:rPr>
-                <w:sz w:val="24"/>
-                <w:szCs w:val="24"/>
-              </w:rPr>
-              <w:t>Control Panel</w:t>
-            </w:r>
-          </w:p>
-        </w:tc>
-        <w:tc>
-          <w:tcPr>
-            <w:tcW w:w="4112" w:type="dxa"/>
-            <w:vAlign w:val="center"/>
-          </w:tcPr>
-          <w:p>
-            <w:pPr>
-              <w:ind w:left="144"/>
-              <w:rPr>
-                <w:sz w:val="24"/>
-                <w:szCs w:val="24"/>
-              </w:rPr>
-            </w:pPr>
-            <w:r>
-              <w:rPr>
-                <w:sz w:val="24"/>
-                <w:szCs w:val="24"/>
-              </w:rPr>
-              <w:t>Encon</w:t>
-            </w:r>
-          </w:p>
-        </w:tc>
-      </w:tr>
-      <w:tr>
-        <w:trPr>
-          <w:trHeight w:val="395"/>
-          <w:jc w:val="center"/>
-        </w:trPr>
-        <w:tc>
-          <w:tcPr>
-            <w:tcW w:w="5531" w:type="dxa"/>
-            <w:vAlign w:val="center"/>
-          </w:tcPr>
-          <w:p>
-            <w:pPr>
-              <w:ind w:left="144"/>
-              <w:rPr>
-                <w:sz w:val="24"/>
-                <w:szCs w:val="24"/>
-              </w:rPr>
-            </w:pPr>
-            <w:r>
-              <w:rPr>
-                <w:sz w:val="24"/>
-                <w:szCs w:val="24"/>
-              </w:rPr>
-              <w:t>Thermocouple</w:t>
-            </w:r>
-          </w:p>
-        </w:tc>
-        <w:tc>
-          <w:tcPr>
-            <w:tcW w:w="4112" w:type="dxa"/>
-            <w:vAlign w:val="center"/>
-          </w:tcPr>
-          <w:p>
-            <w:pPr>
-              <w:ind w:left="144"/>
-              <w:rPr>
-                <w:sz w:val="24"/>
-                <w:szCs w:val="24"/>
-              </w:rPr>
-            </w:pPr>
-            <w:r>
-              <w:rPr>
-                <w:sz w:val="24"/>
-                <w:szCs w:val="24"/>
-              </w:rPr>
-              <w:t>SB International</w:t>
-            </w:r>
-          </w:p>
-        </w:tc>
-      </w:tr>
-      <w:tr>
-        <w:trPr>
-          <w:trHeight w:val="397"/>
-          <w:jc w:val="center"/>
-        </w:trPr>
-        <w:tc>
-          <w:tcPr>
-            <w:tcW w:w="5531" w:type="dxa"/>
-            <w:vAlign w:val="center"/>
-          </w:tcPr>
-          <w:p>
-            <w:pPr>
-              <w:ind w:left="144"/>
-              <w:rPr>
-                <w:sz w:val="24"/>
-                <w:szCs w:val="24"/>
-              </w:rPr>
-            </w:pPr>
-            <w:r>
-              <w:rPr>
-                <w:sz w:val="24"/>
-                <w:szCs w:val="24"/>
-              </w:rPr>
-              <w:t>Compensating lead</w:t>
-            </w:r>
-          </w:p>
-        </w:tc>
-        <w:tc>
-          <w:tcPr>
-            <w:tcW w:w="4112" w:type="dxa"/>
-            <w:vAlign w:val="center"/>
-          </w:tcPr>
-          <w:p>
-            <w:pPr>
-              <w:ind w:left="144"/>
-              <w:rPr>
-                <w:sz w:val="24"/>
-                <w:szCs w:val="24"/>
-              </w:rPr>
-            </w:pPr>
-            <w:r>
-              <w:rPr>
-                <w:sz w:val="24"/>
-                <w:szCs w:val="24"/>
-              </w:rPr>
-              <w:t>SB International</w:t>
-            </w:r>
-          </w:p>
-        </w:tc>
-      </w:tr>
-      <w:tr>
-        <w:trPr>
-          <w:trHeight w:val="395"/>
-          <w:jc w:val="center"/>
-        </w:trPr>
-        <w:tc>
-          <w:tcPr>
-            <w:tcW w:w="5531" w:type="dxa"/>
-            <w:vAlign w:val="center"/>
-          </w:tcPr>
-          <w:p>
-            <w:pPr>
-              <w:ind w:left="144"/>
-              <w:rPr>
-                <w:sz w:val="24"/>
-                <w:szCs w:val="24"/>
-              </w:rPr>
-            </w:pPr>
-            <w:r>
-              <w:rPr>
-                <w:sz w:val="24"/>
-                <w:szCs w:val="24"/>
-              </w:rPr>
-              <w:t>Solenoid Valve</w:t>
-            </w:r>
-          </w:p>
-        </w:tc>
-        <w:tc>
-          <w:tcPr>
-            <w:tcW w:w="4112" w:type="dxa"/>
-            <w:vAlign w:val="center"/>
-          </w:tcPr>
-          <w:p>
-            <w:pPr>
-              <w:ind w:left="144"/>
-              <w:rPr>
-                <w:sz w:val="24"/>
-                <w:szCs w:val="24"/>
-              </w:rPr>
-            </w:pPr>
-            <w:r>
-              <w:rPr>
-                <w:sz w:val="24"/>
-                <w:szCs w:val="24"/>
-              </w:rPr>
-              <w:t>Madas/ Rotex</w:t>
-            </w:r>
-          </w:p>
-        </w:tc>
-      </w:tr>
-      <w:tr>
-        <w:trPr>
-          <w:trHeight w:val="398"/>
-          <w:jc w:val="center"/>
-        </w:trPr>
-        <w:tc>
-          <w:tcPr>
-            <w:tcW w:w="5531" w:type="dxa"/>
-            <w:vAlign w:val="center"/>
-          </w:tcPr>
-          <w:p>
-            <w:pPr>
-              <w:ind w:left="144"/>
-              <w:rPr>
-                <w:sz w:val="24"/>
-                <w:szCs w:val="24"/>
-              </w:rPr>
-            </w:pPr>
-            <w:r>
-              <w:rPr>
-                <w:sz w:val="24"/>
-                <w:szCs w:val="24"/>
-              </w:rPr>
-              <w:t>Flexible Pipe</w:t>
-            </w:r>
-          </w:p>
-        </w:tc>
-        <w:tc>
-          <w:tcPr>
-            <w:tcW w:w="4112" w:type="dxa"/>
-            <w:vAlign w:val="center"/>
-          </w:tcPr>
-          <w:p>
-            <w:pPr>
-              <w:ind w:left="144"/>
-              <w:rPr>
-                <w:sz w:val="24"/>
-                <w:szCs w:val="24"/>
-              </w:rPr>
-            </w:pPr>
-            <w:r>
-              <w:rPr>
-                <w:sz w:val="24"/>
-                <w:szCs w:val="24"/>
-              </w:rPr>
-              <w:t>Vflex/Bengal Industries Ltd</w:t>
-            </w:r>
-          </w:p>
-        </w:tc>
-      </w:tr>
-      <w:tr>
-        <w:trPr>
-          <w:trHeight w:val="395"/>
-          <w:jc w:val="center"/>
-        </w:trPr>
-        <w:tc>
-          <w:tcPr>
-            <w:tcW w:w="5531" w:type="dxa"/>
-            <w:vAlign w:val="center"/>
-          </w:tcPr>
-          <w:p>
-            <w:pPr>
-              <w:ind w:left="144"/>
-              <w:rPr>
-                <w:sz w:val="24"/>
-                <w:szCs w:val="24"/>
-              </w:rPr>
-            </w:pPr>
-            <w:r>
-              <w:rPr>
-                <w:sz w:val="24"/>
-                <w:szCs w:val="24"/>
-              </w:rPr>
-              <w:t>Butterfly Valve</w:t>
-            </w:r>
-          </w:p>
-        </w:tc>
-        <w:tc>
-          <w:tcPr>
-            <w:tcW w:w="4112" w:type="dxa"/>
-            <w:vAlign w:val="center"/>
-          </w:tcPr>
-          <w:p>
-            <w:pPr>
-              <w:ind w:left="144"/>
-              <w:rPr>
-                <w:sz w:val="24"/>
-                <w:szCs w:val="24"/>
-              </w:rPr>
-            </w:pPr>
-            <w:r>
-              <w:rPr>
-                <w:sz w:val="24"/>
-                <w:szCs w:val="24"/>
-              </w:rPr>
-              <w:t>L&amp;T/ Audco/ Leader</w:t>
-            </w:r>
-          </w:p>
-        </w:tc>
-      </w:tr>
-      <w:tr>
-        <w:trPr>
-          <w:trHeight w:val="397"/>
-          <w:jc w:val="center"/>
-        </w:trPr>
-        <w:tc>
-          <w:tcPr>
-            <w:tcW w:w="5531" w:type="dxa"/>
-            <w:vAlign w:val="center"/>
-          </w:tcPr>
-          <w:p>
-            <w:pPr>
-              <w:ind w:left="144"/>
-              <w:rPr>
-                <w:sz w:val="24"/>
-                <w:szCs w:val="24"/>
-              </w:rPr>
-            </w:pPr>
-            <w:r>
-              <w:rPr>
-                <w:sz w:val="24"/>
-                <w:szCs w:val="24"/>
-              </w:rPr>
-              <w:t>Sequence controller, Ignition Transformer, UV sensor</w:t>
-            </w:r>
-          </w:p>
-        </w:tc>
-        <w:tc>
-          <w:tcPr>
-            <w:tcW w:w="4112" w:type="dxa"/>
-            <w:vAlign w:val="center"/>
-          </w:tcPr>
-          <w:p>
-            <w:pPr>
-              <w:ind w:left="144"/>
-              <w:rPr>
-                <w:sz w:val="24"/>
-                <w:szCs w:val="24"/>
-              </w:rPr>
-            </w:pPr>
-            <w:r>
-              <w:rPr>
-                <w:sz w:val="24"/>
-                <w:szCs w:val="24"/>
-              </w:rPr>
-              <w:t>Linear System</w:t>
-            </w:r>
-          </w:p>
-        </w:tc>
-      </w:tr>
-      <w:tr>
-        <w:trPr>
-          <w:trHeight w:val="398"/>
-          <w:jc w:val="center"/>
-        </w:trPr>
-        <w:tc>
-          <w:tcPr>
-            <w:tcW w:w="5531" w:type="dxa"/>
-            <w:vAlign w:val="center"/>
-          </w:tcPr>
-          <w:p>
-            <w:pPr>
-              <w:ind w:left="144"/>
-              <w:rPr>
-                <w:sz w:val="24"/>
-                <w:szCs w:val="24"/>
-              </w:rPr>
-            </w:pPr>
-            <w:r>
-              <w:rPr>
-                <w:sz w:val="24"/>
-                <w:szCs w:val="24"/>
-              </w:rPr>
-              <w:t>Ball Valve</w:t>
-            </w:r>
-          </w:p>
-        </w:tc>
-        <w:tc>
-          <w:tcPr>
-            <w:tcW w:w="4112" w:type="dxa"/>
-            <w:vAlign w:val="center"/>
-          </w:tcPr>
-          <w:p>
-            <w:pPr>
-              <w:ind w:left="144"/>
-              <w:rPr>
-                <w:sz w:val="24"/>
-                <w:szCs w:val="24"/>
-              </w:rPr>
-            </w:pPr>
-            <w:r>
-              <w:rPr>
-                <w:sz w:val="24"/>
-                <w:szCs w:val="24"/>
-              </w:rPr>
-              <w:t>L&amp;T/AUDCO/Leader</w:t>
-            </w:r>
-          </w:p>
-        </w:tc>
-      </w:tr>
-      <w:tr>
-        <w:trPr>
-          <w:trHeight w:val="395"/>
-          <w:jc w:val="center"/>
-        </w:trPr>
-        <w:tc>
-          <w:tcPr>
-            <w:tcW w:w="5531" w:type="dxa"/>
-            <w:vAlign w:val="center"/>
-          </w:tcPr>
-          <w:p>
-            <w:pPr>
-              <w:ind w:left="144"/>
-              <w:rPr>
-                <w:sz w:val="24"/>
-                <w:szCs w:val="24"/>
-              </w:rPr>
-            </w:pPr>
-            <w:r>
-              <w:rPr>
-                <w:sz w:val="24"/>
-                <w:szCs w:val="24"/>
-              </w:rPr>
-              <w:t>Pipeline</w:t>
-            </w:r>
-          </w:p>
-        </w:tc>
-        <w:tc>
-          <w:tcPr>
-            <w:tcW w:w="4112" w:type="dxa"/>
-            <w:vAlign w:val="center"/>
-          </w:tcPr>
-          <w:p>
-            <w:pPr>
-              <w:ind w:left="144"/>
-              <w:rPr>
-                <w:sz w:val="24"/>
-                <w:szCs w:val="24"/>
-              </w:rPr>
-            </w:pPr>
-            <w:r>
-              <w:rPr>
-                <w:sz w:val="24"/>
-                <w:szCs w:val="24"/>
-              </w:rPr>
-              <w:t>Jindal/Tata/Maharashtra seamless</w:t>
-            </w:r>
-          </w:p>
-        </w:tc>
-      </w:tr>
-      <w:tr>
-        <w:trPr>
-          <w:trHeight w:val="397"/>
-          <w:jc w:val="center"/>
-        </w:trPr>
-        <w:tc>
-          <w:tcPr>
-            <w:tcW w:w="5531" w:type="dxa"/>
-            <w:vAlign w:val="center"/>
-          </w:tcPr>
-          <w:p>
-            <w:pPr>
-              <w:ind w:left="144"/>
-              <w:rPr>
-                <w:sz w:val="24"/>
-                <w:szCs w:val="24"/>
-              </w:rPr>
-            </w:pPr>
-            <w:r>
-              <w:rPr>
-                <w:sz w:val="24"/>
-                <w:szCs w:val="24"/>
-              </w:rPr>
-              <w:t>Pressure gauge</w:t>
-            </w:r>
-          </w:p>
-        </w:tc>
-        <w:tc>
-          <w:tcPr>
-            <w:tcW w:w="4112" w:type="dxa"/>
-            <w:vAlign w:val="center"/>
-          </w:tcPr>
-          <w:p>
-            <w:pPr>
-              <w:ind w:left="144"/>
-              <w:rPr>
-                <w:sz w:val="24"/>
-                <w:szCs w:val="24"/>
-              </w:rPr>
-            </w:pPr>
-            <w:r>
-              <w:rPr>
-                <w:sz w:val="24"/>
-                <w:szCs w:val="24"/>
-              </w:rPr>
-              <w:t>H. Guru</w:t>
-            </w:r>
-          </w:p>
-        </w:tc>
-      </w:tr>
-      <w:tr>
-        <w:trPr>
-          <w:trHeight w:val="395"/>
-          <w:jc w:val="center"/>
-        </w:trPr>
-        <w:tc>
-          <w:tcPr>
-            <w:tcW w:w="5531" w:type="dxa"/>
-            <w:vAlign w:val="center"/>
-          </w:tcPr>
-          <w:p>
-            <w:pPr>
-              <w:ind w:left="144"/>
-              <w:rPr>
-                <w:sz w:val="24"/>
-                <w:szCs w:val="24"/>
-              </w:rPr>
-            </w:pPr>
-            <w:r>
-              <w:rPr>
-                <w:sz w:val="24"/>
-                <w:szCs w:val="24"/>
-              </w:rPr>
-              <w:t>NG and LPG Gas Train</w:t>
-            </w:r>
-          </w:p>
-        </w:tc>
-        <w:tc>
-          <w:tcPr>
-            <w:tcW w:w="4112" w:type="dxa"/>
-            <w:vAlign w:val="center"/>
-          </w:tcPr>
-          <w:p>
-            <w:pPr>
-              <w:ind w:left="144"/>
-              <w:rPr>
-                <w:sz w:val="24"/>
-                <w:szCs w:val="24"/>
-              </w:rPr>
-            </w:pPr>
-            <w:r>
-              <w:rPr>
-                <w:sz w:val="24"/>
-                <w:szCs w:val="24"/>
-              </w:rPr>
-              <w:t>Madas/ Vanaz</w:t>
-            </w:r>
-          </w:p>
-        </w:tc>
-      </w:tr>
-      <w:tr>
-        <w:trPr>
-          <w:trHeight w:val="398"/>
-          <w:jc w:val="center"/>
-        </w:trPr>
-        <w:tc>
-          <w:tcPr>
-            <w:tcW w:w="5531" w:type="dxa"/>
-            <w:vAlign w:val="center"/>
-          </w:tcPr>
-          <w:p>
-            <w:pPr>
-              <w:ind w:left="144"/>
-              <w:rPr>
-                <w:sz w:val="24"/>
-                <w:szCs w:val="24"/>
-              </w:rPr>
-            </w:pPr>
-            <w:r>
-              <w:rPr>
-                <w:sz w:val="24"/>
-                <w:szCs w:val="24"/>
-              </w:rPr>
-              <w:t>Combustion Blower</w:t>
-            </w:r>
-          </w:p>
-        </w:tc>
-        <w:tc>
-          <w:tcPr>
-            <w:tcW w:w="4112" w:type="dxa"/>
-            <w:vAlign w:val="center"/>
-          </w:tcPr>
-          <w:p>
-            <w:pPr>
-              <w:ind w:left="144"/>
-              <w:rPr>
-                <w:sz w:val="24"/>
-                <w:szCs w:val="24"/>
-              </w:rPr>
-            </w:pPr>
-            <w:r>
-              <w:rPr>
-                <w:sz w:val="24"/>
-                <w:szCs w:val="24"/>
-              </w:rPr>
-              <w:t>Encon</w:t>
-            </w:r>
-          </w:p>
-        </w:tc>
-      </w:tr>
-      <w:tr>
-        <w:trPr>
-          <w:trHeight w:val="398"/>
-          <w:jc w:val="center"/>
-        </w:trPr>
-        <w:tc>
-          <w:tcPr>
-            <w:tcW w:w="5531" w:type="dxa"/>
-            <w:vAlign w:val="center"/>
-          </w:tcPr>
-          <w:p>
-            <w:pPr>
-              <w:ind w:left="144"/>
-              <w:rPr>
-                <w:sz w:val="24"/>
-                <w:szCs w:val="24"/>
-              </w:rPr>
-            </w:pPr>
-            <w:r>
-              <w:rPr>
-                <w:sz w:val="24"/>
-                <w:szCs w:val="24"/>
-              </w:rPr>
-              <w:t>Gas Train Components</w:t>
-            </w:r>
-          </w:p>
-        </w:tc>
-        <w:tc>
-          <w:tcPr>
-            <w:tcW w:w="4112" w:type="dxa"/>
-            <w:vAlign w:val="center"/>
-          </w:tcPr>
-          <w:p>
-            <w:pPr>
-              <w:ind w:left="144"/>
-              <w:rPr>
-                <w:sz w:val="24"/>
-                <w:szCs w:val="24"/>
-              </w:rPr>
-            </w:pPr>
-            <w:r>
-              <w:rPr>
-                <w:sz w:val="24"/>
-                <w:szCs w:val="24"/>
-              </w:rPr>
-              <w:t>Encon/ Madas</w:t>
-            </w:r>
-          </w:p>
-        </w:tc>
-      </w:tr>
-      <w:tr>
-        <w:trPr>
-          <w:trHeight w:val="395"/>
-          <w:jc w:val="center"/>
-        </w:trPr>
-        <w:tc>
-          <w:tcPr>
-            <w:tcW w:w="5531" w:type="dxa"/>
-            <w:vAlign w:val="center"/>
-          </w:tcPr>
-          <w:p>
-            <w:pPr>
-              <w:ind w:left="144"/>
-              <w:rPr>
-                <w:sz w:val="24"/>
-                <w:szCs w:val="24"/>
-              </w:rPr>
-            </w:pPr>
-            <w:r>
-              <w:rPr>
-                <w:sz w:val="24"/>
-                <w:szCs w:val="24"/>
-              </w:rPr>
-              <w:t>Hydraulic cylinder &amp; Power Pack</w:t>
-            </w:r>
-          </w:p>
-        </w:tc>
-        <w:tc>
-          <w:tcPr>
-            <w:tcW w:w="4112" w:type="dxa"/>
-            <w:vAlign w:val="center"/>
-          </w:tcPr>
-          <w:p>
-            <w:pPr>
-              <w:ind w:left="144"/>
-              <w:rPr>
-                <w:sz w:val="24"/>
-                <w:szCs w:val="24"/>
-              </w:rPr>
-            </w:pPr>
-            <w:r>
-              <w:rPr>
-                <w:sz w:val="24"/>
-                <w:szCs w:val="24"/>
-              </w:rPr>
-              <w:t>Varitech/ JSD with Yuken Components.</w:t>
-            </w:r>
-          </w:p>
-        </w:tc>
-      </w:tr>
-      <w:tr>
-        <w:trPr>
-          <w:trHeight w:val="397"/>
-          <w:jc w:val="center"/>
-        </w:trPr>
-        <w:tc>
-          <w:tcPr>
-            <w:tcW w:w="5531" w:type="dxa"/>
-            <w:vAlign w:val="center"/>
-          </w:tcPr>
-          <w:p>
-            <w:pPr>
-              <w:ind w:left="144"/>
-              <w:rPr>
-                <w:sz w:val="24"/>
-                <w:szCs w:val="24"/>
-              </w:rPr>
-            </w:pPr>
-            <w:r>
-              <w:rPr>
-                <w:sz w:val="24"/>
-                <w:szCs w:val="24"/>
-              </w:rPr>
-              <w:t>Rotary Joint</w:t>
-            </w:r>
-          </w:p>
-        </w:tc>
-        <w:tc>
-          <w:tcPr>
-            <w:tcW w:w="4112" w:type="dxa"/>
-            <w:vAlign w:val="center"/>
-          </w:tcPr>
-          <w:p>
-            <w:pPr>
-              <w:ind w:left="144"/>
-              <w:rPr>
-                <w:sz w:val="24"/>
-                <w:szCs w:val="24"/>
-              </w:rPr>
-            </w:pPr>
-            <w:r>
-              <w:rPr>
-                <w:sz w:val="24"/>
-                <w:szCs w:val="24"/>
-              </w:rPr>
-              <w:t>Encon</w:t>
-            </w:r>
-          </w:p>
-        </w:tc>
-      </w:tr>
-      <w:tr>
-        <w:trPr>
-          <w:trHeight w:val="395"/>
-          <w:jc w:val="center"/>
-        </w:trPr>
-        <w:tc>
-          <w:tcPr>
-            <w:tcW w:w="5531" w:type="dxa"/>
-            <w:vAlign w:val="center"/>
-          </w:tcPr>
-          <w:p>
-            <w:pPr>
-              <w:ind w:left="144"/>
-              <w:rPr>
-                <w:sz w:val="24"/>
-                <w:szCs w:val="24"/>
-              </w:rPr>
-            </w:pPr>
-            <w:r>
-              <w:rPr>
-                <w:sz w:val="24"/>
-                <w:szCs w:val="24"/>
-              </w:rPr>
-              <w:t>Ceramic Fibre</w:t>
-            </w:r>
-          </w:p>
-        </w:tc>
-        <w:tc>
-          <w:tcPr>
-            <w:tcW w:w="4112" w:type="dxa"/>
-            <w:vAlign w:val="center"/>
-          </w:tcPr>
-          <w:p>
-            <w:pPr>
-              <w:ind w:left="144"/>
-              <w:rPr>
-                <w:sz w:val="24"/>
-                <w:szCs w:val="24"/>
-              </w:rPr>
-            </w:pPr>
-            <w:r>
-              <w:rPr>
-                <w:sz w:val="24"/>
-                <w:szCs w:val="24"/>
-              </w:rPr>
-              <w:t>Murugappa/ Unifrax</w:t>
-            </w:r>
-          </w:p>
-        </w:tc>
-      </w:tr>
-      <w:tr>
-        <w:trPr>
-          <w:trHeight w:val="398"/>
-          <w:jc w:val="center"/>
-        </w:trPr>
-        <w:tc>
-          <w:tcPr>
-            <w:tcW w:w="5531" w:type="dxa"/>
-            <w:vAlign w:val="center"/>
-          </w:tcPr>
-          <w:p>
-            <w:pPr>
-              <w:ind w:left="144"/>
-              <w:rPr>
-                <w:sz w:val="24"/>
-                <w:szCs w:val="24"/>
-              </w:rPr>
-            </w:pPr>
-            <w:r>
-              <w:rPr>
-                <w:sz w:val="24"/>
-                <w:szCs w:val="24"/>
-              </w:rPr>
-              <w:t>Pressure Switch Low &amp; High</w:t>
-            </w:r>
-          </w:p>
-        </w:tc>
-        <w:tc>
-          <w:tcPr>
-            <w:tcW w:w="4112" w:type="dxa"/>
-            <w:vAlign w:val="center"/>
-          </w:tcPr>
-          <w:p>
-            <w:pPr>
-              <w:ind w:left="144"/>
-              <w:rPr>
-                <w:sz w:val="24"/>
-                <w:szCs w:val="24"/>
-              </w:rPr>
-            </w:pPr>
-            <w:r>
-              <w:rPr>
-                <w:sz w:val="24"/>
-                <w:szCs w:val="24"/>
-              </w:rPr>
-              <w:t>Switzer/Danfoss/Madas</w:t>
-            </w:r>
-          </w:p>
-        </w:tc>
-      </w:tr>
-      <w:tr>
-        <w:trPr>
-          <w:trHeight w:val="395"/>
-          <w:jc w:val="center"/>
-        </w:trPr>
-        <w:tc>
-          <w:tcPr>
-            <w:tcW w:w="5531" w:type="dxa"/>
-            <w:vAlign w:val="center"/>
-          </w:tcPr>
-          <w:p>
-            <w:pPr>
-              <w:ind w:left="144"/>
-              <w:rPr>
-                <w:sz w:val="24"/>
-                <w:szCs w:val="24"/>
-              </w:rPr>
-            </w:pPr>
-            <w:r>
-              <w:rPr>
-                <w:sz w:val="24"/>
-                <w:szCs w:val="24"/>
-              </w:rPr>
-              <w:t>Bearing</w:t>
-            </w:r>
-          </w:p>
-        </w:tc>
-        <w:tc>
-          <w:tcPr>
-            <w:tcW w:w="4112" w:type="dxa"/>
-            <w:vAlign w:val="center"/>
-          </w:tcPr>
-          <w:p>
-            <w:pPr>
-              <w:ind w:left="144"/>
-              <w:rPr>
-                <w:sz w:val="24"/>
-                <w:szCs w:val="24"/>
-              </w:rPr>
-            </w:pPr>
-            <w:r>
-              <w:rPr>
-                <w:sz w:val="24"/>
-                <w:szCs w:val="24"/>
-              </w:rPr>
-              <w:t>SKF/ FAG</w:t>
-            </w:r>
-          </w:p>
-        </w:tc>
-      </w:tr>
-      <w:tr>
-        <w:trPr>
-          <w:trHeight w:val="397"/>
-          <w:jc w:val="center"/>
-        </w:trPr>
-        <w:tc>
-          <w:tcPr>
-            <w:tcW w:w="5531" w:type="dxa"/>
-            <w:vAlign w:val="center"/>
-          </w:tcPr>
-          <w:p>
-            <w:pPr>
-              <w:ind w:left="144"/>
-              <w:rPr>
-                <w:sz w:val="24"/>
-                <w:szCs w:val="24"/>
-              </w:rPr>
-            </w:pPr>
-            <w:r>
-              <w:rPr>
-                <w:sz w:val="24"/>
-                <w:szCs w:val="24"/>
-              </w:rPr>
-              <w:t>Motor</w:t>
-            </w:r>
-          </w:p>
-        </w:tc>
-        <w:tc>
-          <w:tcPr>
-            <w:tcW w:w="4112" w:type="dxa"/>
-            <w:vAlign w:val="center"/>
-          </w:tcPr>
-          <w:p>
-            <w:pPr>
-              <w:ind w:left="144"/>
-              <w:rPr>
-                <w:sz w:val="24"/>
-                <w:szCs w:val="24"/>
-              </w:rPr>
-            </w:pPr>
-            <w:r>
-              <w:rPr>
-                <w:sz w:val="24"/>
-                <w:szCs w:val="24"/>
-              </w:rPr>
-              <w:t>ABB/ BB/ Cropmton</w:t>
-            </w:r>
-          </w:p>
-        </w:tc>
-      </w:tr>
-      <w:tr>
-        <w:trPr>
-          <w:trHeight w:val="397"/>
-          <w:jc w:val="center"/>
-        </w:trPr>
-        <w:tc>
-          <w:tcPr>
-            <w:tcW w:w="5531" w:type="dxa"/>
-            <w:vAlign w:val="center"/>
-          </w:tcPr>
-          <w:p>
-            <w:pPr>
-              <w:ind w:left="144"/>
-              <w:rPr>
-                <w:sz w:val="24"/>
-                <w:szCs w:val="24"/>
-              </w:rPr>
-            </w:pPr>
-            <w:r>
-              <w:rPr>
-                <w:sz w:val="24"/>
-                <w:szCs w:val="24"/>
-              </w:rPr>
-              <w:t>Pumping Unit</w:t>
-            </w:r>
-          </w:p>
-        </w:tc>
-        <w:tc>
-          <w:tcPr>
-            <w:tcW w:w="4112" w:type="dxa"/>
-            <w:vAlign w:val="center"/>
-          </w:tcPr>
-          <w:p>
-            <w:pPr>
-              <w:ind w:left="144"/>
-              <w:rPr>
-                <w:sz w:val="24"/>
-                <w:szCs w:val="24"/>
-              </w:rPr>
-            </w:pPr>
-            <w:r>
-              <w:rPr>
-                <w:sz w:val="24"/>
-                <w:szCs w:val="24"/>
-              </w:rPr>
-              <w:t>ENCON</w:t>
-            </w:r>
-          </w:p>
-        </w:tc>
-      </w:tr>
-      <w:tr>
-        <w:trPr>
-          <w:trHeight w:val="395"/>
-          <w:jc w:val="center"/>
-        </w:trPr>
-        <w:tc>
-          <w:tcPr>
-            <w:tcW w:w="5531" w:type="dxa"/>
-            <w:vAlign w:val="center"/>
-          </w:tcPr>
-          <w:p>
-            <w:pPr>
-              <w:ind w:left="144"/>
-              <w:rPr>
-                <w:sz w:val="24"/>
-                <w:szCs w:val="24"/>
-              </w:rPr>
-            </w:pPr>
-            <w:r>
-              <w:rPr>
-                <w:sz w:val="24"/>
-                <w:szCs w:val="24"/>
-              </w:rPr>
-              <w:t>Temperature Indicator</w:t>
-            </w:r>
-          </w:p>
-        </w:tc>
-        <w:tc>
-          <w:tcPr>
-            <w:tcW w:w="4112" w:type="dxa"/>
-            <w:vAlign w:val="center"/>
-          </w:tcPr>
-          <w:p>
-            <w:pPr>
-              <w:ind w:left="144"/>
-              <w:rPr>
-                <w:sz w:val="24"/>
-                <w:szCs w:val="24"/>
-              </w:rPr>
-            </w:pPr>
-            <w:r>
-              <w:rPr>
-                <w:sz w:val="24"/>
-                <w:szCs w:val="24"/>
-              </w:rPr>
-              <w:t>Masibus</w:t>
             </w:r>
           </w:p>
         </w:tc>

</xml_diff>

<commit_message>
fix: template labels + blower model duplication + gas fuel display
1. Template labels fixed:
   - 'Calorific value of LDO' → 'Calorific value of Fuel' (generic)
   - 'LDO Pumping Unit' → 'Pumping Unit'
   - Blower value cell: removed hardcoded 'Centrifugal type,' prefix
     (was duplicating with fillTechDataTable which also adds it)

2. fillTechDataTable (VLPH + HLPH):
   - Blower model no longer prefixes 'Centrifugal type,' (template
     handles the prefix now via the value from calc)
   - Gas burner default: 'ENCON Gas Burner' instead of empty

Co-Authored-By: Claude Opus 4.6 (1M context) <noreply@anthropic.com>
</commit_message>
<xml_diff>
--- a/Offer_Template.docx
+++ b/Offer_Template.docx
@@ -11069,49 +11069,43 @@
                 <w:spacing w:val="-4"/>
                 <w:sz w:val="24"/>
               </w:rPr>
-              <w:t>Calorific</w:t>
+              <w:t>Calorific value of Fuel</w:t>
             </w:r>
             <w:r>
               <w:rPr>
                 <w:spacing w:val="39"/>
                 <w:sz w:val="24"/>
               </w:rPr>
-              <w:t> </w:t>
             </w:r>
             <w:r>
               <w:rPr>
                 <w:spacing w:val="-4"/>
                 <w:sz w:val="24"/>
               </w:rPr>
-              <w:t>value</w:t>
             </w:r>
             <w:r>
               <w:rPr>
                 <w:spacing w:val="28"/>
                 <w:sz w:val="24"/>
               </w:rPr>
-              <w:t> </w:t>
             </w:r>
             <w:r>
               <w:rPr>
                 <w:spacing w:val="-4"/>
                 <w:sz w:val="24"/>
               </w:rPr>
-              <w:t>of</w:t>
             </w:r>
             <w:r>
               <w:rPr>
                 <w:spacing w:val="-20"/>
                 <w:sz w:val="24"/>
               </w:rPr>
-              <w:t> </w:t>
             </w:r>
             <w:r>
               <w:rPr>
                 <w:spacing w:val="-5"/>
                 <w:sz w:val="24"/>
               </w:rPr>
-              <w:t>LDO</w:t>
             </w:r>
           </w:p>
         </w:tc>
@@ -11474,7 +11468,7 @@
                 <w:spacing w:val="-2"/>
                 <w:sz w:val="24"/>
               </w:rPr>
-              <w:t>Centrifugal type, {{blower_model}}</w:t>
+              <w:t>{{blower_model}}</w:t>
             </w:r>
             <w:r>
               <w:rPr>
@@ -11797,35 +11791,31 @@
                 <w:spacing w:val="-4"/>
                 <w:sz w:val="24"/>
               </w:rPr>
-              <w:t>LDO</w:t>
+              <w:t>Pumping Unit</w:t>
             </w:r>
             <w:r>
               <w:rPr>
                 <w:spacing w:val="-11"/>
                 <w:sz w:val="24"/>
               </w:rPr>
-              <w:t> </w:t>
             </w:r>
             <w:r>
               <w:rPr>
                 <w:spacing w:val="-4"/>
                 <w:sz w:val="24"/>
               </w:rPr>
-              <w:t>Pumping</w:t>
             </w:r>
             <w:r>
               <w:rPr>
                 <w:spacing w:val="53"/>
                 <w:sz w:val="24"/>
               </w:rPr>
-              <w:t> </w:t>
             </w:r>
             <w:r>
               <w:rPr>
                 <w:spacing w:val="-4"/>
                 <w:sz w:val="24"/>
               </w:rPr>
-              <w:t>Unit</w:t>
             </w:r>
           </w:p>
         </w:tc>

</xml_diff>

<commit_message>
fix: proper fuel-type conditionals in VLPH PLC template scope
Clean sweep of all prior conditional markers + duplicate gas burner
sections, then re-added correctly:

- ENCON FILM BURNER (×2, VLPH+HLPH): wrapped with {%p if is_oil %}
- ENCON GAS BURNER (×2): added with {%p if is_gas %}
- LDO PUMPING UNIT (×2): wrapped with {%p if is_oil %}

Verified: Gas mode shows GAS BURNER, hides FILM/LDO. Oil mode shows
FILM BURNER + LDO, hides GAS BURNER.

Co-Authored-By: Claude Opus 4.6 (1M context) <noreply@anthropic.com>
</commit_message>
<xml_diff>
--- a/Offer_Template.docx
+++ b/Offer_Template.docx
@@ -16083,6 +16083,18 @@
     </w:p>
     <w:p>
       <w:pPr>
+        <w:pStyle w:val="BodyText"/>
+        <w:ind w:left="3634"/>
+        <w:rPr>
+          <w:sz w:val="20"/>
+        </w:rPr>
+      </w:pPr>
+      <w:r>
+        <w:t xml:space="preserve">{%p if is_oil %}</w:t>
+      </w:r>
+    </w:p>
+    <w:p>
+      <w:pPr>
         <w:pStyle w:val="Heading2"/>
         <w:spacing w:before="203"/>
         <w:rPr>
@@ -16951,6 +16963,234 @@
           <w:sz w:val="24"/>
         </w:rPr>
         <w:t>line</w:t>
+      </w:r>
+    </w:p>
+    <w:p>
+      <w:pPr>
+        <w:pStyle w:val="BodyText"/>
+        <w:ind w:left="3634"/>
+        <w:rPr>
+          <w:sz w:val="20"/>
+        </w:rPr>
+      </w:pPr>
+      <w:r>
+        <w:t xml:space="preserve">{%p endif %}</w:t>
+      </w:r>
+    </w:p>
+    <w:p>
+      <w:pPr>
+        <w:pStyle w:val="BodyText"/>
+        <w:ind w:left="3634"/>
+        <w:rPr>
+          <w:sz w:val="20"/>
+        </w:rPr>
+      </w:pPr>
+      <w:r>
+        <w:t xml:space="preserve">{%p if is_gas %}</w:t>
+      </w:r>
+    </w:p>
+    <w:p>
+      <w:pPr>
+        <w:pStyle w:val="BodyText"/>
+        <w:ind w:left="3634"/>
+        <w:rPr>
+          <w:sz w:val="20"/>
+        </w:rPr>
+      </w:pPr>
+      <w:r>
+        <w:t xml:space="preserve">ENCON GAS BURNER</w:t>
+      </w:r>
+    </w:p>
+    <w:p>
+      <w:pPr>
+        <w:pStyle w:val="BodyText"/>
+        <w:ind w:left="3634"/>
+        <w:rPr>
+          <w:sz w:val="20"/>
+        </w:rPr>
+      </w:pPr>
+      <w:r>
+        <w:t xml:space="preserve">For preheating the system, we will supply ENCON Gas Burner(s) of suitable firing rate to achieve the desired temperature. The burner will consist of burner alone, high alumina burner block, CI burner mounting plate, ball valve on gas line, butterfly valve on air line, and flexible hose set.</w:t>
+      </w:r>
+    </w:p>
+    <w:p>
+      <w:pPr>
+        <w:pStyle w:val="BodyText"/>
+        <w:ind w:left="3634"/>
+        <w:rPr>
+          <w:sz w:val="20"/>
+        </w:rPr>
+      </w:pPr>
+      <w:r>
+        <w:t xml:space="preserve">{%p endif %}</w:t>
+      </w:r>
+    </w:p>
+    <w:p>
+      <w:pPr>
+        <w:pStyle w:val="BodyText"/>
+        <w:ind w:left="3634"/>
+        <w:rPr>
+          <w:sz w:val="20"/>
+        </w:rPr>
+      </w:pPr>
+      <w:r>
+        <w:t xml:space="preserve">For preheating the system, we will supply 1 No. ENCON Gas Burner of suitable firing rate to achieve the desired temperature in the required time. The burner will consist of:</w:t>
+      </w:r>
+    </w:p>
+    <w:p>
+      <w:pPr>
+        <w:pStyle w:val="BodyText"/>
+        <w:ind w:left="3634"/>
+        <w:rPr>
+          <w:sz w:val="20"/>
+        </w:rPr>
+      </w:pPr>
+      <w:r>
+        <w:t xml:space="preserve">Burner alone</w:t>
+      </w:r>
+    </w:p>
+    <w:p>
+      <w:pPr>
+        <w:pStyle w:val="BodyText"/>
+        <w:ind w:left="3634"/>
+        <w:rPr>
+          <w:sz w:val="20"/>
+        </w:rPr>
+      </w:pPr>
+      <w:r>
+        <w:t xml:space="preserve">High alumina burner block</w:t>
+      </w:r>
+    </w:p>
+    <w:p>
+      <w:pPr>
+        <w:pStyle w:val="BodyText"/>
+        <w:ind w:left="3634"/>
+        <w:rPr>
+          <w:sz w:val="20"/>
+        </w:rPr>
+      </w:pPr>
+      <w:r>
+        <w:t xml:space="preserve">CI burner mounting plate</w:t>
+      </w:r>
+    </w:p>
+    <w:p>
+      <w:pPr>
+        <w:pStyle w:val="BodyText"/>
+        <w:ind w:left="3634"/>
+        <w:rPr>
+          <w:sz w:val="20"/>
+        </w:rPr>
+      </w:pPr>
+      <w:r>
+        <w:t xml:space="preserve">Ball valve on gas line</w:t>
+      </w:r>
+    </w:p>
+    <w:p>
+      <w:pPr>
+        <w:pStyle w:val="BodyText"/>
+        <w:ind w:left="3634"/>
+        <w:rPr>
+          <w:sz w:val="20"/>
+        </w:rPr>
+      </w:pPr>
+      <w:r>
+        <w:t xml:space="preserve">Butterfly valve on air line</w:t>
+      </w:r>
+    </w:p>
+    <w:p>
+      <w:pPr>
+        <w:pStyle w:val="BodyText"/>
+        <w:ind w:left="3634"/>
+        <w:rPr>
+          <w:sz w:val="20"/>
+        </w:rPr>
+      </w:pPr>
+      <w:r>
+        <w:t xml:space="preserve">Flexible hose set</w:t>
+      </w:r>
+    </w:p>
+    <w:p>
+      <w:pPr>
+        <w:pStyle w:val="BodyText"/>
+        <w:ind w:left="3634"/>
+        <w:rPr>
+          <w:sz w:val="20"/>
+        </w:rPr>
+      </w:pPr>
+      <w:r>
+        <w:t xml:space="preserve">For preheating the system, we will supply 1 No. ENCON Gas Burner of suitable firing rate to achieve the desired temperature in the required time. The burner will consist of:</w:t>
+      </w:r>
+    </w:p>
+    <w:p>
+      <w:pPr>
+        <w:pStyle w:val="BodyText"/>
+        <w:ind w:left="3634"/>
+        <w:rPr>
+          <w:sz w:val="20"/>
+        </w:rPr>
+      </w:pPr>
+      <w:r>
+        <w:t xml:space="preserve">Burner alone</w:t>
+      </w:r>
+    </w:p>
+    <w:p>
+      <w:pPr>
+        <w:pStyle w:val="BodyText"/>
+        <w:ind w:left="3634"/>
+        <w:rPr>
+          <w:sz w:val="20"/>
+        </w:rPr>
+      </w:pPr>
+      <w:r>
+        <w:t xml:space="preserve">High alumina burner block</w:t>
+      </w:r>
+    </w:p>
+    <w:p>
+      <w:pPr>
+        <w:pStyle w:val="BodyText"/>
+        <w:ind w:left="3634"/>
+        <w:rPr>
+          <w:sz w:val="20"/>
+        </w:rPr>
+      </w:pPr>
+      <w:r>
+        <w:t xml:space="preserve">CI burner mounting plate</w:t>
+      </w:r>
+    </w:p>
+    <w:p>
+      <w:pPr>
+        <w:pStyle w:val="BodyText"/>
+        <w:ind w:left="3634"/>
+        <w:rPr>
+          <w:sz w:val="20"/>
+        </w:rPr>
+      </w:pPr>
+      <w:r>
+        <w:t xml:space="preserve">Ball valve on gas line</w:t>
+      </w:r>
+    </w:p>
+    <w:p>
+      <w:pPr>
+        <w:pStyle w:val="BodyText"/>
+        <w:ind w:left="3634"/>
+        <w:rPr>
+          <w:sz w:val="20"/>
+        </w:rPr>
+      </w:pPr>
+      <w:r>
+        <w:t xml:space="preserve">Butterfly valve on air line</w:t>
+      </w:r>
+    </w:p>
+    <w:p>
+      <w:pPr>
+        <w:pStyle w:val="BodyText"/>
+        <w:ind w:left="3634"/>
+        <w:rPr>
+          <w:sz w:val="20"/>
+        </w:rPr>
+      </w:pPr>
+      <w:r>
+        <w:t xml:space="preserve">Flexible hose set</w:t>
       </w:r>
     </w:p>
     <w:p>
@@ -20216,6 +20456,18 @@
     </w:p>
     <w:p>
       <w:pPr>
+        <w:pStyle w:val="BodyText"/>
+        <w:ind w:left="3634"/>
+        <w:rPr>
+          <w:sz w:val="20"/>
+        </w:rPr>
+      </w:pPr>
+      <w:r>
+        <w:t xml:space="preserve">{%p if is_oil %}</w:t>
+      </w:r>
+    </w:p>
+    <w:p>
+      <w:pPr>
         <w:pStyle w:val="Heading2"/>
         <w:rPr>
           <w:u w:val="none"/>
@@ -21112,6 +21364,18 @@
           <w:sz w:val="24"/>
         </w:rPr>
         <w:t>gauge.</w:t>
+      </w:r>
+    </w:p>
+    <w:p>
+      <w:pPr>
+        <w:pStyle w:val="BodyText"/>
+        <w:ind w:left="3634"/>
+        <w:rPr>
+          <w:sz w:val="20"/>
+        </w:rPr>
+      </w:pPr>
+      <w:r>
+        <w:t xml:space="preserve">{%p endif %}</w:t>
       </w:r>
     </w:p>
     <w:p>
@@ -24883,6 +25147,18 @@
     </w:p>
     <w:p>
       <w:pPr>
+        <w:pStyle w:val="BodyText"/>
+        <w:ind w:left="3634"/>
+        <w:rPr>
+          <w:sz w:val="20"/>
+        </w:rPr>
+      </w:pPr>
+      <w:r>
+        <w:t xml:space="preserve">{%p if is_oil %}</w:t>
+      </w:r>
+    </w:p>
+    <w:p>
+      <w:pPr>
         <w:pStyle w:val="Heading2"/>
         <w:spacing w:before="77"/>
         <w:rPr>
@@ -25751,6 +26027,78 @@
           <w:sz w:val="24"/>
         </w:rPr>
         <w:t>line</w:t>
+      </w:r>
+    </w:p>
+    <w:p>
+      <w:pPr>
+        <w:pStyle w:val="BodyText"/>
+        <w:ind w:left="3634"/>
+        <w:rPr>
+          <w:sz w:val="20"/>
+        </w:rPr>
+      </w:pPr>
+      <w:r>
+        <w:t xml:space="preserve">{%p endif %}</w:t>
+      </w:r>
+    </w:p>
+    <w:p>
+      <w:pPr>
+        <w:pStyle w:val="BodyText"/>
+        <w:ind w:left="3634"/>
+        <w:rPr>
+          <w:sz w:val="20"/>
+        </w:rPr>
+      </w:pPr>
+      <w:r>
+        <w:t xml:space="preserve">{%p if is_gas %}</w:t>
+      </w:r>
+    </w:p>
+    <w:p>
+      <w:pPr>
+        <w:pStyle w:val="BodyText"/>
+        <w:ind w:left="3634"/>
+        <w:rPr>
+          <w:sz w:val="20"/>
+        </w:rPr>
+      </w:pPr>
+      <w:r>
+        <w:t xml:space="preserve">ENCON GAS BURNER</w:t>
+      </w:r>
+    </w:p>
+    <w:p>
+      <w:pPr>
+        <w:pStyle w:val="BodyText"/>
+        <w:ind w:left="3634"/>
+        <w:rPr>
+          <w:sz w:val="20"/>
+        </w:rPr>
+      </w:pPr>
+      <w:r>
+        <w:t xml:space="preserve">For preheating the system, we will supply ENCON Gas Burner(s) of suitable firing rate to achieve the desired temperature. The burner will consist of burner alone, high alumina burner block, CI burner mounting plate, ball valve on gas line, butterfly valve on air line, and flexible hose set.</w:t>
+      </w:r>
+    </w:p>
+    <w:p>
+      <w:pPr>
+        <w:pStyle w:val="BodyText"/>
+        <w:ind w:left="3634"/>
+        <w:rPr>
+          <w:sz w:val="20"/>
+        </w:rPr>
+      </w:pPr>
+      <w:r>
+        <w:t xml:space="preserve">{%p endif %}</w:t>
+      </w:r>
+    </w:p>
+    <w:p>
+      <w:pPr>
+        <w:pStyle w:val="BodyText"/>
+        <w:ind w:left="3634"/>
+        <w:rPr>
+          <w:sz w:val="20"/>
+        </w:rPr>
+      </w:pPr>
+      <w:r>
+        <w:t xml:space="preserve">For preheating the system, we will supply 1 No. ENCON Gas Burner of suitable firing rate. The burner will consist of burner alone, high alumina burner block, CI burner mounting plate, ball valve on gas line, butterfly valve on air line, and flexible hose set.</w:t>
       </w:r>
     </w:p>
     <w:p>
@@ -29035,6 +29383,18 @@
     </w:p>
     <w:p>
       <w:pPr>
+        <w:pStyle w:val="BodyText"/>
+        <w:ind w:left="3634"/>
+        <w:rPr>
+          <w:sz w:val="20"/>
+        </w:rPr>
+      </w:pPr>
+      <w:r>
+        <w:t xml:space="preserve">{%p if is_oil %}</w:t>
+      </w:r>
+    </w:p>
+    <w:p>
+      <w:pPr>
         <w:pStyle w:val="Heading2"/>
         <w:rPr>
           <w:u w:val="none"/>
@@ -29931,6 +30291,18 @@
           <w:sz w:val="24"/>
         </w:rPr>
         <w:t>gauge.</w:t>
+      </w:r>
+    </w:p>
+    <w:p>
+      <w:pPr>
+        <w:pStyle w:val="BodyText"/>
+        <w:ind w:left="3634"/>
+        <w:rPr>
+          <w:sz w:val="20"/>
+        </w:rPr>
+      </w:pPr>
+      <w:r>
+        <w:t xml:space="preserve">{%p endif %}</w:t>
       </w:r>
     </w:p>
     <w:p>

</xml_diff>

<commit_message>
feat: marketing/technical person email + phone in offer
- Offer_Template: add {{marketing_email}} and {{marketing_phone}}
  placeholders; drop hardcoded 'shikha@encon.co.in' and 'Contact No.'
- QuoteRequest: accept marketing_email and technical_email
- quote_writer: map new fields into template context
- vlph_costing.html: collect email/phone for both roles

Co-Authored-By: Claude Opus 4.7 (1M context) <noreply@anthropic.com>
</commit_message>
<xml_diff>
--- a/Offer_Template.docx
+++ b/Offer_Template.docx
@@ -10245,7 +10245,7 @@
                   <w:sz w:val="24"/>
                   <w:u w:val="single" w:color="0000FF"/>
                 </w:rPr>
-                <w:t>shikha@encon.co.in</w:t>
+                <w:t>{{marketing_email}}</w:t>
               </w:r>
             </w:hyperlink>
           </w:p>
@@ -10263,7 +10263,7 @@
               <w:rPr>
                 <w:sz w:val="24"/>
               </w:rPr>
-              <w:t xml:space="preserve">Contact No. </w:t>
+              <w:t xml:space="preserve">Contact No. {{marketing_phone}}</w:t>
             </w:r>
             <w:r>
               <w:rPr>

</xml_diff>

<commit_message>
feat: technical person email + phone in signature block
- Replace hardcoded operations@encon.co.in with {{technical_email}}
- Add 'Mob: {{technical_phone}}' line below company name

Co-Authored-By: Claude Opus 4.7 (1M context) <noreply@anthropic.com>
</commit_message>
<xml_diff>
--- a/Offer_Template.docx
+++ b/Offer_Template.docx
@@ -2930,52 +2930,7 @@
         <w:ind w:left="740" w:right="5890"/>
       </w:pPr>
       <w:r>
-        <w:rPr>
-          <w:spacing w:val="-4"/>
-        </w:rPr>
-      </w:r>
-      <w:r>
-        <w:rPr>
-          <w:spacing w:val="-15"/>
-        </w:rPr>
-      </w:r>
-      <w:r>
-        <w:rPr>
-          <w:spacing w:val="-4"/>
-        </w:rPr>
-      </w:r>
-      <w:r>
-        <w:rPr>
-          <w:spacing w:val="-16"/>
-        </w:rPr>
-      </w:r>
-      <w:r>
-        <w:rPr>
-          <w:spacing w:val="-4"/>
-        </w:rPr>
-      </w:r>
-      <w:r>
-        <w:rPr>
-          <w:spacing w:val="53"/>
-        </w:rPr>
-      </w:r>
-      <w:r>
-        <w:rPr>
-          <w:spacing w:val="-4"/>
-        </w:rPr>
-      </w:r>
-      <w:r>
-        <w:rPr>
-          <w:spacing w:val="20"/>
-        </w:rPr>
-      </w:r>
-      <w:r>
-        <w:rPr>
-          <w:spacing w:val="-4"/>
-        </w:rPr>
-      </w:r>
-      <w:r>
-        <w:rPr/>
+        <w:t>Mob: {{technical_phone}}</w:t>
       </w:r>
     </w:p>
     <w:p>
@@ -3003,7 +2958,7 @@
             <w:spacing w:val="-4"/>
             <w:u w:val="single" w:color="0000FF"/>
           </w:rPr>
-          <w:t>operations@encon.co.in</w:t>
+          <w:t>{{technical_email}}</w:t>
         </w:r>
       </w:hyperlink>
       <w:r>

</xml_diff>

<commit_message>
feat: fuel unit fixes, dual-fuel labels, hood movement options
- Firing rate units: Nm3/hr for gas, Lit/hr for oil (fixes stale values
  sticking from prior calc by always refreshing auto-computed fields)
- Dual-fuel rows now prefixed with "Fuel 1:" / "Fuel 2:" so rates map
  unambiguously to their fuel
- VLPH hood movement: dropdown with Swivelling / Up and Down options
- HLPH hood movement: fixed to "Forward and Backward" (read-only)
- Offer_Template: marketing details restructured —
  name | Email: {{marketing_email}} | Contact No. {{marketing_phone}}

Co-Authored-By: Claude Opus 4.7 (1M context) <noreply@anthropic.com>
</commit_message>
<xml_diff>
--- a/Offer_Template.docx
+++ b/Offer_Template.docx
@@ -10179,7 +10179,7 @@
               <w:rPr>
                 <w:sz w:val="24"/>
               </w:rPr>
-              <w:t xml:space="preserve">{{marketing_person}} </w:t>
+              <w:t xml:space="preserve">{{marketing_person}}</w:t>
             </w:r>
             <w:r>
               <w:rPr>
@@ -10200,7 +10200,46 @@
                   <w:sz w:val="24"/>
                   <w:u w:val="single" w:color="0000FF"/>
                 </w:rPr>
-                <w:t>{{marketing_email}}</w:t>
+                <w:t/>
+              </w:r>
+            </w:hyperlink>
+          </w:p>
+          <w:p>
+            <w:pPr>
+              <w:pStyle w:val="TableParagraph"/>
+              <w:spacing w:line="235" w:lineRule="auto" w:before="6"/>
+              <w:ind w:left="3447" w:right="3342" w:hanging="58"/>
+              <w:jc w:val="center"/>
+              <w:rPr>
+                <w:sz w:val="24"/>
+              </w:rPr>
+            </w:pPr>
+            <w:r>
+              <w:rPr>
+                <w:sz w:val="24"/>
+              </w:rPr>
+              <w:t xml:space="preserve">Email: {{marketing_email}}</w:t>
+            </w:r>
+            <w:r>
+              <w:rPr>
+                <w:spacing w:val="40"/>
+                <w:sz w:val="24"/>
+              </w:rPr>
+            </w:r>
+            <w:r>
+              <w:rPr>
+                <w:sz w:val="24"/>
+              </w:rPr>
+            </w:r>
+            <w:hyperlink r:id="rId47">
+              <w:r>
+                <w:rPr>
+                  <w:color w:val="0000FF"/>
+                  <w:spacing w:val="-8"/>
+                  <w:sz w:val="24"/>
+                  <w:u w:val="single" w:color="0000FF"/>
+                </w:rPr>
+                <w:t/>
               </w:r>
             </w:hyperlink>
           </w:p>

</xml_diff>

<commit_message>
feat: include burner model + firing rate in body paragraphs
The 'ENCON GAS/FILM/DUAL BURNER' body paragraphs read 'ENCON Gas Burner(s)
of suitable firing rate' — too generic. Each now renders as e.g.

  For preheating the system, we will supply 1 No. ENCON -G 7A of
  205.30 Nm3/hr of Natural Gas firing rate to achieve the desired
  temperature.

- Template: 6 burner body paragraphs (3 fuel variants x VLPH/HLPH) now
  carry {{burner_display_model}} and {{burner_firing_rate}}.
- quote_writer: populate both. burner_display_model prefixes the model
  per ENCON pricelist convention (oil unchanged, gas -> ENCON -G 7A,
  dual -> ENCON DUAL- 7A). burner_firing_rate falls back to fuel_consumption.

Co-Authored-By: Claude Opus 4.7 (1M context) <noreply@anthropic.com>
</commit_message>
<xml_diff>
--- a/Offer_Template.docx
+++ b/Offer_Template.docx
@@ -19864,87 +19864,87 @@
       </w:r>
       <w:r>
         <w:rPr/>
-        <w:t>No. Oil</w:t>
+        <w:t>No. Oil fired {{burner_display_model}} of {{burner_firing_rate}} firing rate</w:t>
       </w:r>
       <w:r>
         <w:rPr>
           <w:spacing w:val="28"/>
         </w:rPr>
-        <w:t> </w:t>
-      </w:r>
-      <w:r>
-        <w:rPr/>
-        <w:t>fired</w:t>
+        <w:t/>
+      </w:r>
+      <w:r>
+        <w:rPr/>
+        <w:t/>
       </w:r>
       <w:r>
         <w:rPr>
           <w:spacing w:val="40"/>
         </w:rPr>
-        <w:t> </w:t>
-      </w:r>
-      <w:r>
-        <w:rPr/>
-        <w:t>ENCON</w:t>
+        <w:t/>
+      </w:r>
+      <w:r>
+        <w:rPr/>
+        <w:t/>
       </w:r>
       <w:r>
         <w:rPr>
           <w:spacing w:val="27"/>
         </w:rPr>
-        <w:t> </w:t>
-      </w:r>
-      <w:r>
-        <w:rPr/>
-        <w:t>IIP</w:t>
-      </w:r>
-      <w:r>
-        <w:rPr>
-          <w:spacing w:val="-2"/>
-        </w:rPr>
-        <w:t> </w:t>
-      </w:r>
-      <w:r>
-        <w:rPr/>
-        <w:t>Film</w:t>
+        <w:t/>
+      </w:r>
+      <w:r>
+        <w:rPr/>
+        <w:t/>
+      </w:r>
+      <w:r>
+        <w:rPr>
+          <w:spacing w:val="-2"/>
+        </w:rPr>
+        <w:t/>
+      </w:r>
+      <w:r>
+        <w:rPr/>
+        <w:t/>
       </w:r>
       <w:r>
         <w:rPr>
           <w:spacing w:val="40"/>
         </w:rPr>
-        <w:t> </w:t>
-      </w:r>
-      <w:r>
-        <w:rPr/>
-        <w:t>Burner</w:t>
+        <w:t/>
+      </w:r>
+      <w:r>
+        <w:rPr/>
+        <w:t/>
       </w:r>
       <w:r>
         <w:rPr>
           <w:spacing w:val="40"/>
         </w:rPr>
-        <w:t> </w:t>
-      </w:r>
-      <w:r>
-        <w:rPr/>
-        <w:t>of suitable</w:t>
+        <w:t/>
+      </w:r>
+      <w:r>
+        <w:rPr/>
+        <w:t/>
       </w:r>
       <w:r>
         <w:rPr>
           <w:spacing w:val="78"/>
         </w:rPr>
-        <w:t> </w:t>
-      </w:r>
-      <w:r>
-        <w:rPr/>
-        <w:t>firin</w:t>
+        <w:t/>
+      </w:r>
+      <w:r>
+        <w:rPr/>
+        <w:t/>
       </w:r>
       <w:r>
         <w:rPr>
           <w:spacing w:val="33"/>
         </w:rPr>
-        <w:t> </w:t>
-      </w:r>
-      <w:r>
-        <w:rPr/>
-        <w:t>g rate to</w:t>
+        <w:t/>
+      </w:r>
+      <w:r>
+        <w:rPr/>
+        <w:t> to</w:t>
       </w:r>
       <w:r>
         <w:rPr>
@@ -20650,7 +20650,7 @@
         </w:rPr>
       </w:pPr>
       <w:r>
-        <w:t xml:space="preserve">For preheating the system, we will supply ENCON Gas Burner(s) of suitable firing rate to achieve the desired temperature. The burner will consist of burner alone, high alumina burner block, CI burner mounting plate, ball valve on gas line, butterfly valve on air line, and flexible hose set.</w:t>
+        <w:t xml:space="preserve">For preheating the system, we will supply 1 No. {{burner_display_model}} of {{burner_firing_rate}} firing rate to achieve the desired temperature. The burner will consist of burner alone, high alumina burner block, CI burner mounting plate, ball valve on gas line, butterfly valve on air line, and flexible hose set.</w:t>
       </w:r>
     </w:p>
     <w:p>
@@ -20698,7 +20698,7 @@
         </w:rPr>
       </w:pPr>
       <w:r>
-        <w:t xml:space="preserve">For preheating the system, we will supply 1 No. ENCON Dual-Fuel Burner of suitable firing rate capable of running on both gas and oil. The burner will be ignited automatically through {{pilot_gas_type}} fired Pilot burner. The burner will consist of the following main components: burner alone, micro valve, high alumina burner block, CI burner mounting plate, ball valve on gas line, isolation valve on oil line, butterfly valve on air line, Y-strainer for oil line, and flexible hose set.</w:t>
+        <w:t xml:space="preserve">For preheating the system, we will supply 1 No. {{burner_display_model}} (Dual-Fuel Burner) of {{burner_firing_rate}} firing rate capable of running on both gas and oil. The burner will be ignited automatically through {{pilot_gas_type}} fired Pilot burner. The burner will consist of the following main components: burner alone, micro valve, high alumina burner block, CI burner mounting plate, ball valve on gas line, isolation valve on oil line, butterfly valve on air line, Y-strainer for oil line, and flexible hose set.</w:t>
       </w:r>
     </w:p>
     <w:p>
@@ -28808,87 +28808,87 @@
       </w:r>
       <w:r>
         <w:rPr/>
-        <w:t>No. Oil</w:t>
+        <w:t>No. Oil fired {{burner_display_model}} of {{burner_firing_rate}} firing rate</w:t>
       </w:r>
       <w:r>
         <w:rPr>
           <w:spacing w:val="28"/>
         </w:rPr>
-        <w:t> </w:t>
-      </w:r>
-      <w:r>
-        <w:rPr/>
-        <w:t>fired</w:t>
+        <w:t/>
+      </w:r>
+      <w:r>
+        <w:rPr/>
+        <w:t/>
       </w:r>
       <w:r>
         <w:rPr>
           <w:spacing w:val="40"/>
         </w:rPr>
-        <w:t> </w:t>
-      </w:r>
-      <w:r>
-        <w:rPr/>
-        <w:t>ENCON</w:t>
+        <w:t/>
+      </w:r>
+      <w:r>
+        <w:rPr/>
+        <w:t/>
       </w:r>
       <w:r>
         <w:rPr>
           <w:spacing w:val="27"/>
         </w:rPr>
-        <w:t> </w:t>
-      </w:r>
-      <w:r>
-        <w:rPr/>
-        <w:t>IIP</w:t>
-      </w:r>
-      <w:r>
-        <w:rPr>
-          <w:spacing w:val="-2"/>
-        </w:rPr>
-        <w:t> </w:t>
-      </w:r>
-      <w:r>
-        <w:rPr/>
-        <w:t>Film</w:t>
+        <w:t/>
+      </w:r>
+      <w:r>
+        <w:rPr/>
+        <w:t/>
+      </w:r>
+      <w:r>
+        <w:rPr>
+          <w:spacing w:val="-2"/>
+        </w:rPr>
+        <w:t/>
+      </w:r>
+      <w:r>
+        <w:rPr/>
+        <w:t/>
       </w:r>
       <w:r>
         <w:rPr>
           <w:spacing w:val="40"/>
         </w:rPr>
-        <w:t> </w:t>
-      </w:r>
-      <w:r>
-        <w:rPr/>
-        <w:t>Burner</w:t>
+        <w:t/>
+      </w:r>
+      <w:r>
+        <w:rPr/>
+        <w:t/>
       </w:r>
       <w:r>
         <w:rPr>
           <w:spacing w:val="40"/>
         </w:rPr>
-        <w:t> </w:t>
-      </w:r>
-      <w:r>
-        <w:rPr/>
-        <w:t>of suitable</w:t>
+        <w:t/>
+      </w:r>
+      <w:r>
+        <w:rPr/>
+        <w:t/>
       </w:r>
       <w:r>
         <w:rPr>
           <w:spacing w:val="78"/>
         </w:rPr>
-        <w:t> </w:t>
-      </w:r>
-      <w:r>
-        <w:rPr/>
-        <w:t>firin</w:t>
+        <w:t/>
+      </w:r>
+      <w:r>
+        <w:rPr/>
+        <w:t/>
       </w:r>
       <w:r>
         <w:rPr>
           <w:spacing w:val="33"/>
         </w:rPr>
-        <w:t> </w:t>
-      </w:r>
-      <w:r>
-        <w:rPr/>
-        <w:t>g rate to</w:t>
+        <w:t/>
+      </w:r>
+      <w:r>
+        <w:rPr/>
+        <w:t> to</w:t>
       </w:r>
       <w:r>
         <w:rPr>
@@ -29594,7 +29594,7 @@
         </w:rPr>
       </w:pPr>
       <w:r>
-        <w:t xml:space="preserve">For preheating the system, we will supply ENCON Gas Burner(s) of suitable firing rate to achieve the desired temperature. The burner will consist of burner alone, high alumina burner block, CI burner mounting plate, ball valve on gas line, butterfly valve on air line, and flexible hose set.</w:t>
+        <w:t xml:space="preserve">For preheating the system, we will supply 1 No. {{burner_display_model}} of {{burner_firing_rate}} firing rate to achieve the desired temperature. The burner will consist of burner alone, high alumina burner block, CI burner mounting plate, ball valve on gas line, butterfly valve on air line, and flexible hose set.</w:t>
       </w:r>
     </w:p>
     <w:p>
@@ -29642,7 +29642,7 @@
         </w:rPr>
       </w:pPr>
       <w:r>
-        <w:t xml:space="preserve">For preheating the system, we will supply 1 No. ENCON Dual-Fuel Burner of suitable firing rate capable of running on both gas and oil. The burner will be ignited automatically through {{pilot_gas_type}} fired Pilot burner. The burner will consist of the following main components: burner alone, micro valve, high alumina burner block, CI burner mounting plate, ball valve on gas line, isolation valve on oil line, butterfly valve on air line, Y-strainer for oil line, and flexible hose set.</w:t>
+        <w:t xml:space="preserve">For preheating the system, we will supply 1 No. {{burner_display_model}} (Dual-Fuel Burner) of {{burner_firing_rate}} firing rate capable of running on both gas and oil. The burner will be ignited automatically through {{pilot_gas_type}} fired Pilot burner. The burner will consist of the following main components: burner alone, micro valve, high alumina burner block, CI burner mounting plate, ball valve on gas line, isolation valve on oil line, butterfly valve on air line, Y-strainer for oil line, and flexible hose set.</w:t>
       </w:r>
     </w:p>
     <w:p>

</xml_diff>

<commit_message>
style: promote ENCON GAS/DUAL BURNER headings to Heading 2
When the gas and dual burner sections were added, their heading
paragraphs defaulted to 'Body Text' so they rendered as plain black
text, unlike every other section heading in the offer (which is
bold + navy blue via the Heading 2 style).

Set the paragraph style to Heading 2 on all four headings
(ENCON GAS BURNER + ENCON DUAL BURNER, both VLPH and HLPH halves)
so they match ENCON FILM BURNER and the rest of the scope sections.

Co-Authored-By: Claude Opus 4.7 (1M context) <noreply@anthropic.com>
</commit_message>
<xml_diff>
--- a/Offer_Template.docx
+++ b/Offer_Template.docx
@@ -20631,7 +20631,7 @@
     </w:p>
     <w:p>
       <w:pPr>
-        <w:pStyle w:val="BodyText"/>
+        <w:pStyle w:val="Heading2"/>
         <w:ind w:left="3634"/>
         <w:rPr>
           <w:sz w:val="20"/>
@@ -20679,7 +20679,7 @@
     </w:p>
     <w:p>
       <w:pPr>
-        <w:pStyle w:val="BodyText"/>
+        <w:pStyle w:val="Heading2"/>
         <w:ind w:left="3634"/>
         <w:rPr>
           <w:sz w:val="20"/>
@@ -29575,7 +29575,7 @@
     </w:p>
     <w:p>
       <w:pPr>
-        <w:pStyle w:val="BodyText"/>
+        <w:pStyle w:val="Heading2"/>
         <w:ind w:left="3634"/>
         <w:rPr>
           <w:sz w:val="20"/>
@@ -29623,7 +29623,7 @@
     </w:p>
     <w:p>
       <w:pPr>
-        <w:pStyle w:val="BodyText"/>
+        <w:pStyle w:val="Heading2"/>
         <w:ind w:left="3634"/>
         <w:rPr>
           <w:sz w:val="20"/>

</xml_diff>

<commit_message>
fix: drop blank page between client section and scope; 'Page X / Y' footer
- Remove two redundant 'next-page' section-break paragraphs (P108/P109)
  that were pushing a blank page between 'ABOUT THE CLIENT' and
  'VERTICAL LADLE PREHEATERS AND DRYERS'. One section break (P111's
  sectPr) is kept to preserve the layout boundary.
- Footers (footer1.xml + footer3.xml): add a NUMPAGES field after each
  PAGE field with ' / ' separator so the page tag reads 'Page | 7 / 17'
  instead of 'Page | 7'.

Co-Authored-By: Claude Opus 4.7 (1M context) <noreply@anthropic.com>
</commit_message>
<xml_diff>
--- a/Offer_Template.docx
+++ b/Offer_Template.docx
@@ -10375,36 +10375,6 @@
           </wp:anchor>
         </w:drawing>
       </w:r>
-    </w:p>
-    <w:p>
-      <w:pPr>
-        <w:pStyle w:val="BodyText"/>
-        <w:spacing w:after="0"/>
-        <w:rPr>
-          <w:b/>
-          <w:sz w:val="20"/>
-        </w:rPr>
-        <w:sectPr>
-          <w:pgSz w:w="11930" w:h="16850"/>
-          <w:pgMar w:header="0" w:footer="1175" w:top="1300" w:bottom="1360" w:left="566" w:right="283"/>
-        </w:sectPr>
-      </w:pPr>
-    </w:p>
-    <w:p>
-      <w:pPr>
-        <w:pStyle w:val="ListParagraph"/>
-        <w:spacing w:after="0" w:line="240" w:lineRule="auto"/>
-        <w:jc w:val="left"/>
-        <w:rPr>
-          <w:b/>
-          <w:sz w:val="24"/>
-        </w:rPr>
-        <w:sectPr>
-          <w:footerReference w:type="default" r:id="rId49"/>
-          <w:pgSz w:w="16850" w:h="11910" w:orient="landscape"/>
-          <w:pgMar w:header="0" w:footer="0" w:top="1060" w:bottom="280" w:left="425" w:right="708"/>
-        </w:sectPr>
-      </w:pPr>
     </w:p>
     <w:p>
       <w:pPr>
@@ -49825,6 +49795,48 @@
                             </w:rPr>
                             <w:fldChar w:fldCharType="end"/>
                           </w:r>
+                          <w:r>
+                            <w:rPr>
+                              <w:b/>
+                              <w:spacing w:val="-10"/>
+                            </w:rPr>
+                            <w:t xml:space="preserve"> / </w:t>
+                          </w:r>
+                          <w:r>
+                            <w:rPr>
+                              <w:b/>
+                              <w:spacing w:val="-10"/>
+                            </w:rPr>
+                            <w:fldChar w:fldCharType="begin"/>
+                          </w:r>
+                          <w:r>
+                            <w:rPr>
+                              <w:b/>
+                              <w:spacing w:val="-10"/>
+                            </w:rPr>
+                            <w:instrText> NUMPAGES </w:instrText>
+                          </w:r>
+                          <w:r>
+                            <w:rPr>
+                              <w:b/>
+                              <w:spacing w:val="-10"/>
+                            </w:rPr>
+                            <w:fldChar w:fldCharType="separate"/>
+                          </w:r>
+                          <w:r>
+                            <w:rPr>
+                              <w:b/>
+                              <w:spacing w:val="-10"/>
+                            </w:rPr>
+                            <w:t>1</w:t>
+                          </w:r>
+                          <w:r>
+                            <w:rPr>
+                              <w:b/>
+                              <w:spacing w:val="-10"/>
+                            </w:rPr>
+                            <w:fldChar w:fldCharType="end"/>
+                          </w:r>
                         </w:p>
                       </w:txbxContent>
                     </wps:txbx>
@@ -49914,6 +49926,48 @@
                         <w:spacing w:val="-10"/>
                       </w:rPr>
                       <w:instrText> PAGE </w:instrText>
+                    </w:r>
+                    <w:r>
+                      <w:rPr>
+                        <w:b/>
+                        <w:spacing w:val="-10"/>
+                      </w:rPr>
+                      <w:fldChar w:fldCharType="separate"/>
+                    </w:r>
+                    <w:r>
+                      <w:rPr>
+                        <w:b/>
+                        <w:spacing w:val="-10"/>
+                      </w:rPr>
+                      <w:t>1</w:t>
+                    </w:r>
+                    <w:r>
+                      <w:rPr>
+                        <w:b/>
+                        <w:spacing w:val="-10"/>
+                      </w:rPr>
+                      <w:fldChar w:fldCharType="end"/>
+                    </w:r>
+                    <w:r>
+                      <w:rPr>
+                        <w:b/>
+                        <w:spacing w:val="-10"/>
+                      </w:rPr>
+                      <w:t xml:space="preserve"> / </w:t>
+                    </w:r>
+                    <w:r>
+                      <w:rPr>
+                        <w:b/>
+                        <w:spacing w:val="-10"/>
+                      </w:rPr>
+                      <w:fldChar w:fldCharType="begin"/>
+                    </w:r>
+                    <w:r>
+                      <w:rPr>
+                        <w:b/>
+                        <w:spacing w:val="-10"/>
+                      </w:rPr>
+                      <w:instrText> NUMPAGES </w:instrText>
                     </w:r>
                     <w:r>
                       <w:rPr>
@@ -50450,6 +50504,48 @@
                               <w:spacing w:val="-5"/>
                             </w:rPr>
                             <w:t>10</w:t>
+                          </w:r>
+                          <w:r>
+                            <w:rPr>
+                              <w:b/>
+                              <w:spacing w:val="-5"/>
+                            </w:rPr>
+                            <w:fldChar w:fldCharType="end"/>
+                          </w:r>
+                          <w:r>
+                            <w:rPr>
+                              <w:b/>
+                              <w:spacing w:val="-5"/>
+                            </w:rPr>
+                            <w:t xml:space="preserve"> / </w:t>
+                          </w:r>
+                          <w:r>
+                            <w:rPr>
+                              <w:b/>
+                              <w:spacing w:val="-5"/>
+                            </w:rPr>
+                            <w:fldChar w:fldCharType="begin"/>
+                          </w:r>
+                          <w:r>
+                            <w:rPr>
+                              <w:b/>
+                              <w:spacing w:val="-5"/>
+                            </w:rPr>
+                            <w:instrText> NUMPAGES </w:instrText>
+                          </w:r>
+                          <w:r>
+                            <w:rPr>
+                              <w:b/>
+                              <w:spacing w:val="-5"/>
+                            </w:rPr>
+                            <w:fldChar w:fldCharType="separate"/>
+                          </w:r>
+                          <w:r>
+                            <w:rPr>
+                              <w:b/>
+                              <w:spacing w:val="-5"/>
+                            </w:rPr>
+                            <w:t>1</w:t>
                           </w:r>
                           <w:r>
                             <w:rPr>

</xml_diff>

<commit_message>
fix: mark PAGE/NUMPAGES field chars dirty so LibreOffice refreshes them
updateFields in settings.xml alone wasn't enough. Adding w:dirty='true'
to every <w:fldChar w:fldCharType='begin'/> in the footer XMLs is the
belt-and-suspenders signal that the cached field result is stale and
must be recomputed at open/convert time. 7 begin markers patched.

Co-Authored-By: Claude Opus 4.7 (1M context) <noreply@anthropic.com>
</commit_message>
<xml_diff>
--- a/Offer_Template.docx
+++ b/Offer_Template.docx
@@ -49765,7 +49765,7 @@
                               <w:b/>
                               <w:spacing w:val="-10"/>
                             </w:rPr>
-                            <w:fldChar w:fldCharType="begin"/>
+                            <w:fldChar w:fldCharType="begin" w:dirty="true"/>
                           </w:r>
                           <w:r>
                             <w:rPr>
@@ -49807,7 +49807,7 @@
                               <w:b/>
                               <w:spacing w:val="-10"/>
                             </w:rPr>
-                            <w:fldChar w:fldCharType="begin"/>
+                            <w:fldChar w:fldCharType="begin" w:dirty="true"/>
                           </w:r>
                           <w:r>
                             <w:rPr>
@@ -49918,7 +49918,7 @@
                         <w:b/>
                         <w:spacing w:val="-10"/>
                       </w:rPr>
-                      <w:fldChar w:fldCharType="begin"/>
+                      <w:fldChar w:fldCharType="begin" w:dirty="true"/>
                     </w:r>
                     <w:r>
                       <w:rPr>
@@ -49960,7 +49960,7 @@
                         <w:b/>
                         <w:spacing w:val="-10"/>
                       </w:rPr>
-                      <w:fldChar w:fldCharType="begin"/>
+                      <w:fldChar w:fldCharType="begin" w:dirty="true"/>
                     </w:r>
                     <w:r>
                       <w:rPr>
@@ -50482,7 +50482,7 @@
                               <w:b/>
                               <w:spacing w:val="-5"/>
                             </w:rPr>
-                            <w:fldChar w:fldCharType="begin"/>
+                            <w:fldChar w:fldCharType="begin" w:dirty="true"/>
                           </w:r>
                           <w:r>
                             <w:rPr>
@@ -50524,7 +50524,7 @@
                               <w:b/>
                               <w:spacing w:val="-5"/>
                             </w:rPr>
-                            <w:fldChar w:fldCharType="begin"/>
+                            <w:fldChar w:fldCharType="begin" w:dirty="true"/>
                           </w:r>
                           <w:r>
                             <w:rPr>
@@ -50635,7 +50635,7 @@
                         <w:b/>
                         <w:spacing w:val="-5"/>
                       </w:rPr>
-                      <w:fldChar w:fldCharType="begin"/>
+                      <w:fldChar w:fldCharType="begin" w:dirty="true"/>
                     </w:r>
                     <w:r>
                       <w:rPr>

</xml_diff>

<commit_message>
fix: empty footer text-box content
The green 'Page |' pill in the footer still rendered because the
text box shape carried its old 'P a g e |' runs + the (unrefreshed)
PAGE field. Since page numbers are now stamped on the PDF directly
by _stamp_page_numbers, there's no reason to keep any text inside
that shape — replace the <w:txbxContent> with a single empty <w:p>
so the shape renders as a blank pill (or is invisible, depending on
the shape's fill). The only visible page number is the overlay in
the bottom-right corner.

Co-Authored-By: Claude Opus 4.7 (1M context) <noreply@anthropic.com>
</commit_message>
<xml_diff>
--- a/Offer_Template.docx
+++ b/Offer_Template.docx
@@ -49491,78 +49491,7 @@
                     </wps:spPr>
                     <wps:txbx>
                       <w:txbxContent>
-                        <w:p>
-                          <w:pPr>
-                            <w:spacing w:before="13"/>
-                            <w:ind w:left="20" w:right="0" w:firstLine="0"/>
-                            <w:jc w:val="left"/>
-                            <w:rPr>
-                              <w:sz w:val="28"/>
-                            </w:rPr>
-                          </w:pPr>
-                          <w:r>
-                            <w:rPr>
-                              <w:b/>
-                              <w:spacing w:val="-2"/>
-                              <w:sz w:val="24"/>
-                            </w:rPr>
-                            <w:t>Offer</w:t>
-                          </w:r>
-                          <w:r>
-                            <w:rPr>
-                              <w:b/>
-                              <w:spacing w:val="-15"/>
-                              <w:sz w:val="24"/>
-                            </w:rPr>
-                            <w:t> </w:t>
-                          </w:r>
-                          <w:r>
-                            <w:rPr>
-                              <w:b/>
-                              <w:spacing w:val="-2"/>
-                              <w:sz w:val="24"/>
-                            </w:rPr>
-                            <w:t>No:</w:t>
-                          </w:r>
-                          <w:r>
-                            <w:rPr>
-                              <w:b/>
-                              <w:spacing w:val="-35"/>
-                              <w:sz w:val="24"/>
-                            </w:rPr>
-                            <w:t> </w:t>
-                          </w:r>
-                          <w:r>
-                            <w:rPr>
-                              <w:spacing w:val="-2"/>
-                              <w:sz w:val="28"/>
-                            </w:rPr>
-                            <w:t/>
-                          </w:r>
-                          <w:r>
-                            <w:rPr>
-                              <w:spacing w:val="7"/>
-                              <w:sz w:val="28"/>
-                            </w:rPr>
-                            <w:t> </w:t>
-                          </w:r>
-                          <w:r>
-                            <w:rPr>
-                              <w:spacing w:val="-2"/>
-                              <w:sz w:val="28"/>
-                            </w:rPr>
-                            <w:t/>
-                          </w:r>
-                          <w:r>
-                            <w:rPr>
-                              <w:color w:val="000000"/>
-                              <w:spacing w:val="-2"/>
-                              <w:sz w:val="28"/>
-                              <w:highlight w:val="cyan"/>
-                            </w:rPr>
-                            <w:t>R3</w:t>
-                          </w:r>
-                        </w:p>
+                        <w:p/>
                       </w:txbxContent>
                     </wps:txbx>
                     <wps:bodyPr wrap="square" lIns="0" tIns="0" rIns="0" bIns="0" rtlCol="0">
@@ -49583,78 +49512,7 @@
             <v:shape style="position:absolute;margin-left:18.525pt;margin-top:775.22937pt;width:235.45pt;height:17.850pt;mso-position-horizontal-relative:page;mso-position-vertical-relative:page;z-index:-16665088" type="#_x0000_t202" id="docshape4" filled="false" stroked="false">
               <v:textbox inset="0,0,0,0">
                 <w:txbxContent>
-                  <w:p>
-                    <w:pPr>
-                      <w:spacing w:before="13"/>
-                      <w:ind w:left="20" w:right="0" w:firstLine="0"/>
-                      <w:jc w:val="left"/>
-                      <w:rPr>
-                        <w:sz w:val="28"/>
-                      </w:rPr>
-                    </w:pPr>
-                    <w:r>
-                      <w:rPr>
-                        <w:b/>
-                        <w:spacing w:val="-2"/>
-                        <w:sz w:val="24"/>
-                      </w:rPr>
-                      <w:t>Offer</w:t>
-                    </w:r>
-                    <w:r>
-                      <w:rPr>
-                        <w:b/>
-                        <w:spacing w:val="-15"/>
-                        <w:sz w:val="24"/>
-                      </w:rPr>
-                      <w:t> </w:t>
-                    </w:r>
-                    <w:r>
-                      <w:rPr>
-                        <w:b/>
-                        <w:spacing w:val="-2"/>
-                        <w:sz w:val="24"/>
-                      </w:rPr>
-                      <w:t>No:</w:t>
-                    </w:r>
-                    <w:r>
-                      <w:rPr>
-                        <w:b/>
-                        <w:spacing w:val="-35"/>
-                        <w:sz w:val="24"/>
-                      </w:rPr>
-                      <w:t> </w:t>
-                    </w:r>
-                    <w:r>
-                      <w:rPr>
-                        <w:spacing w:val="-2"/>
-                        <w:sz w:val="28"/>
-                      </w:rPr>
-                      <w:t/>
-                    </w:r>
-                    <w:r>
-                      <w:rPr>
-                        <w:spacing w:val="7"/>
-                        <w:sz w:val="28"/>
-                      </w:rPr>
-                      <w:t> </w:t>
-                    </w:r>
-                    <w:r>
-                      <w:rPr>
-                        <w:spacing w:val="-2"/>
-                        <w:sz w:val="28"/>
-                      </w:rPr>
-                      <w:t/>
-                    </w:r>
-                    <w:r>
-                      <w:rPr>
-                        <w:color w:val="000000"/>
-                        <w:spacing w:val="-2"/>
-                        <w:sz w:val="28"/>
-                        <w:highlight w:val="cyan"/>
-                      </w:rPr>
-                      <w:t>R3</w:t>
-                    </w:r>
-                  </w:p>
+                  <w:p/>
                 </w:txbxContent>
               </v:textbox>
               <w10:wrap type="none"/>
@@ -49701,143 +49559,7 @@
                     </wps:spPr>
                     <wps:txbx>
                       <w:txbxContent>
-                        <w:p>
-                          <w:pPr>
-                            <w:pStyle w:val="BodyText"/>
-                            <w:spacing w:before="10"/>
-                            <w:ind w:left="20"/>
-                            <w:rPr>
-                              <w:b/>
-                            </w:rPr>
-                          </w:pPr>
-                          <w:r>
-                            <w:rPr/>
-                            <w:t>P</w:t>
-                          </w:r>
-                          <w:r>
-                            <w:rPr>
-                              <w:spacing w:val="1"/>
-                            </w:rPr>
-                            <w:t> </w:t>
-                          </w:r>
-                          <w:r>
-                            <w:rPr/>
-                            <w:t>a</w:t>
-                          </w:r>
-                          <w:r>
-                            <w:rPr>
-                              <w:spacing w:val="-2"/>
-                            </w:rPr>
-                            <w:t> </w:t>
-                          </w:r>
-                          <w:r>
-                            <w:rPr/>
-                            <w:t>g</w:t>
-                          </w:r>
-                          <w:r>
-                            <w:rPr>
-                              <w:spacing w:val="-15"/>
-                            </w:rPr>
-                            <w:t> </w:t>
-                          </w:r>
-                          <w:r>
-                            <w:rPr/>
-                            <w:t>e</w:t>
-                          </w:r>
-                          <w:r>
-                            <w:rPr>
-                              <w:spacing w:val="74"/>
-                            </w:rPr>
-                            <w:t> </w:t>
-                          </w:r>
-                          <w:r>
-                            <w:rPr/>
-                            <w:t>|</w:t>
-                          </w:r>
-                          <w:r>
-                            <w:rPr>
-                              <w:spacing w:val="-4"/>
-                            </w:rPr>
-                            <w:t> </w:t>
-                          </w:r>
-                          <w:r>
-                            <w:rPr>
-                              <w:b/>
-                              <w:spacing w:val="-10"/>
-                            </w:rPr>
-                            <w:fldChar w:fldCharType="begin" w:dirty="true"/>
-                          </w:r>
-                          <w:r>
-                            <w:rPr>
-                              <w:b/>
-                              <w:spacing w:val="-10"/>
-                            </w:rPr>
-                            <w:instrText> PAGE </w:instrText>
-                          </w:r>
-                          <w:r>
-                            <w:rPr>
-                              <w:b/>
-                              <w:spacing w:val="-10"/>
-                            </w:rPr>
-                            <w:fldChar w:fldCharType="separate"/>
-                          </w:r>
-                          <w:r>
-                            <w:rPr>
-                              <w:b/>
-                              <w:spacing w:val="-10"/>
-                            </w:rPr>
-                            <w:t>1</w:t>
-                          </w:r>
-                          <w:r>
-                            <w:rPr>
-                              <w:b/>
-                              <w:spacing w:val="-10"/>
-                            </w:rPr>
-                            <w:fldChar w:fldCharType="end"/>
-                          </w:r>
-                          <w:r>
-                            <w:rPr>
-                              <w:b/>
-                              <w:spacing w:val="-10"/>
-                            </w:rPr>
-                            <w:t xml:space="preserve"> / </w:t>
-                          </w:r>
-                          <w:r>
-                            <w:rPr>
-                              <w:b/>
-                              <w:spacing w:val="-10"/>
-                            </w:rPr>
-                            <w:fldChar w:fldCharType="begin" w:dirty="true"/>
-                          </w:r>
-                          <w:r>
-                            <w:rPr>
-                              <w:b/>
-                              <w:spacing w:val="-10"/>
-                            </w:rPr>
-                            <w:instrText> NUMPAGES </w:instrText>
-                          </w:r>
-                          <w:r>
-                            <w:rPr>
-                              <w:b/>
-                              <w:spacing w:val="-10"/>
-                            </w:rPr>
-                            <w:fldChar w:fldCharType="separate"/>
-                          </w:r>
-                          <w:r>
-                            <w:rPr>
-                              <w:b/>
-                              <w:spacing w:val="-10"/>
-                            </w:rPr>
-                            <w:t>1</w:t>
-                          </w:r>
-                          <w:r>
-                            <w:rPr>
-                              <w:b/>
-                              <w:spacing w:val="-10"/>
-                            </w:rPr>
-                            <w:fldChar w:fldCharType="end"/>
-                          </w:r>
-                        </w:p>
+                        <w:p/>
                       </w:txbxContent>
                     </wps:txbx>
                     <wps:bodyPr wrap="square" lIns="0" tIns="0" rIns="0" bIns="0" rtlCol="0">
@@ -49854,143 +49576,7 @@
             <v:shape style="position:absolute;margin-left:499.899994pt;margin-top:774.981628pt;width:54.55pt;height:15.3pt;mso-position-horizontal-relative:page;mso-position-vertical-relative:page;z-index:-16664576" type="#_x0000_t202" id="docshape5" filled="false" stroked="false">
               <v:textbox inset="0,0,0,0">
                 <w:txbxContent>
-                  <w:p>
-                    <w:pPr>
-                      <w:pStyle w:val="BodyText"/>
-                      <w:spacing w:before="10"/>
-                      <w:ind w:left="20"/>
-                      <w:rPr>
-                        <w:b/>
-                      </w:rPr>
-                    </w:pPr>
-                    <w:r>
-                      <w:rPr/>
-                      <w:t>P</w:t>
-                    </w:r>
-                    <w:r>
-                      <w:rPr>
-                        <w:spacing w:val="1"/>
-                      </w:rPr>
-                      <w:t> </w:t>
-                    </w:r>
-                    <w:r>
-                      <w:rPr/>
-                      <w:t>a</w:t>
-                    </w:r>
-                    <w:r>
-                      <w:rPr>
-                        <w:spacing w:val="-2"/>
-                      </w:rPr>
-                      <w:t> </w:t>
-                    </w:r>
-                    <w:r>
-                      <w:rPr/>
-                      <w:t>g</w:t>
-                    </w:r>
-                    <w:r>
-                      <w:rPr>
-                        <w:spacing w:val="-15"/>
-                      </w:rPr>
-                      <w:t> </w:t>
-                    </w:r>
-                    <w:r>
-                      <w:rPr/>
-                      <w:t>e</w:t>
-                    </w:r>
-                    <w:r>
-                      <w:rPr>
-                        <w:spacing w:val="74"/>
-                      </w:rPr>
-                      <w:t> </w:t>
-                    </w:r>
-                    <w:r>
-                      <w:rPr/>
-                      <w:t>|</w:t>
-                    </w:r>
-                    <w:r>
-                      <w:rPr>
-                        <w:spacing w:val="-4"/>
-                      </w:rPr>
-                      <w:t> </w:t>
-                    </w:r>
-                    <w:r>
-                      <w:rPr>
-                        <w:b/>
-                        <w:spacing w:val="-10"/>
-                      </w:rPr>
-                      <w:fldChar w:fldCharType="begin" w:dirty="true"/>
-                    </w:r>
-                    <w:r>
-                      <w:rPr>
-                        <w:b/>
-                        <w:spacing w:val="-10"/>
-                      </w:rPr>
-                      <w:instrText> PAGE </w:instrText>
-                    </w:r>
-                    <w:r>
-                      <w:rPr>
-                        <w:b/>
-                        <w:spacing w:val="-10"/>
-                      </w:rPr>
-                      <w:fldChar w:fldCharType="separate"/>
-                    </w:r>
-                    <w:r>
-                      <w:rPr>
-                        <w:b/>
-                        <w:spacing w:val="-10"/>
-                      </w:rPr>
-                      <w:t>1</w:t>
-                    </w:r>
-                    <w:r>
-                      <w:rPr>
-                        <w:b/>
-                        <w:spacing w:val="-10"/>
-                      </w:rPr>
-                      <w:fldChar w:fldCharType="end"/>
-                    </w:r>
-                    <w:r>
-                      <w:rPr>
-                        <w:b/>
-                        <w:spacing w:val="-10"/>
-                      </w:rPr>
-                      <w:t xml:space="preserve"> / </w:t>
-                    </w:r>
-                    <w:r>
-                      <w:rPr>
-                        <w:b/>
-                        <w:spacing w:val="-10"/>
-                      </w:rPr>
-                      <w:fldChar w:fldCharType="begin" w:dirty="true"/>
-                    </w:r>
-                    <w:r>
-                      <w:rPr>
-                        <w:b/>
-                        <w:spacing w:val="-10"/>
-                      </w:rPr>
-                      <w:instrText> NUMPAGES </w:instrText>
-                    </w:r>
-                    <w:r>
-                      <w:rPr>
-                        <w:b/>
-                        <w:spacing w:val="-10"/>
-                      </w:rPr>
-                      <w:fldChar w:fldCharType="separate"/>
-                    </w:r>
-                    <w:r>
-                      <w:rPr>
-                        <w:b/>
-                        <w:spacing w:val="-10"/>
-                      </w:rPr>
-                      <w:t>1</w:t>
-                    </w:r>
-                    <w:r>
-                      <w:rPr>
-                        <w:b/>
-                        <w:spacing w:val="-10"/>
-                      </w:rPr>
-                      <w:fldChar w:fldCharType="end"/>
-                    </w:r>
-                  </w:p>
+                  <w:p/>
                 </w:txbxContent>
               </v:textbox>
               <w10:wrap type="none"/>
@@ -50212,78 +49798,7 @@
                     </wps:spPr>
                     <wps:txbx>
                       <w:txbxContent>
-                        <w:p>
-                          <w:pPr>
-                            <w:spacing w:before="13"/>
-                            <w:ind w:left="20" w:right="0" w:firstLine="0"/>
-                            <w:jc w:val="left"/>
-                            <w:rPr>
-                              <w:sz w:val="28"/>
-                            </w:rPr>
-                          </w:pPr>
-                          <w:r>
-                            <w:rPr>
-                              <w:b/>
-                              <w:spacing w:val="-2"/>
-                              <w:sz w:val="24"/>
-                            </w:rPr>
-                            <w:t>Offer</w:t>
-                          </w:r>
-                          <w:r>
-                            <w:rPr>
-                              <w:b/>
-                              <w:spacing w:val="-15"/>
-                              <w:sz w:val="24"/>
-                            </w:rPr>
-                            <w:t> </w:t>
-                          </w:r>
-                          <w:r>
-                            <w:rPr>
-                              <w:b/>
-                              <w:spacing w:val="-2"/>
-                              <w:sz w:val="24"/>
-                            </w:rPr>
-                            <w:t>No:</w:t>
-                          </w:r>
-                          <w:r>
-                            <w:rPr>
-                              <w:b/>
-                              <w:spacing w:val="-35"/>
-                              <w:sz w:val="24"/>
-                            </w:rPr>
-                            <w:t> </w:t>
-                          </w:r>
-                          <w:r>
-                            <w:rPr>
-                              <w:spacing w:val="-2"/>
-                              <w:sz w:val="28"/>
-                            </w:rPr>
-                            <w:t/>
-                          </w:r>
-                          <w:r>
-                            <w:rPr>
-                              <w:spacing w:val="7"/>
-                              <w:sz w:val="28"/>
-                            </w:rPr>
-                            <w:t> </w:t>
-                          </w:r>
-                          <w:r>
-                            <w:rPr>
-                              <w:spacing w:val="-2"/>
-                              <w:sz w:val="28"/>
-                            </w:rPr>
-                            <w:t/>
-                          </w:r>
-                          <w:r>
-                            <w:rPr>
-                              <w:color w:val="000000"/>
-                              <w:spacing w:val="-2"/>
-                              <w:sz w:val="28"/>
-                              <w:highlight w:val="cyan"/>
-                            </w:rPr>
-                            <w:t>R3</w:t>
-                          </w:r>
-                        </w:p>
+                        <w:p/>
                       </w:txbxContent>
                     </wps:txbx>
                     <wps:bodyPr wrap="square" lIns="0" tIns="0" rIns="0" bIns="0" rtlCol="0">
@@ -50300,78 +49815,7 @@
             <v:shape style="position:absolute;margin-left:18.525pt;margin-top:775.22937pt;width:235.45pt;height:17.850pt;mso-position-horizontal-relative:page;mso-position-vertical-relative:page;z-index:-16663552" type="#_x0000_t202" id="docshape25" filled="false" stroked="false">
               <v:textbox inset="0,0,0,0">
                 <w:txbxContent>
-                  <w:p>
-                    <w:pPr>
-                      <w:spacing w:before="13"/>
-                      <w:ind w:left="20" w:right="0" w:firstLine="0"/>
-                      <w:jc w:val="left"/>
-                      <w:rPr>
-                        <w:sz w:val="28"/>
-                      </w:rPr>
-                    </w:pPr>
-                    <w:r>
-                      <w:rPr>
-                        <w:b/>
-                        <w:spacing w:val="-2"/>
-                        <w:sz w:val="24"/>
-                      </w:rPr>
-                      <w:t>Offer</w:t>
-                    </w:r>
-                    <w:r>
-                      <w:rPr>
-                        <w:b/>
-                        <w:spacing w:val="-15"/>
-                        <w:sz w:val="24"/>
-                      </w:rPr>
-                      <w:t> </w:t>
-                    </w:r>
-                    <w:r>
-                      <w:rPr>
-                        <w:b/>
-                        <w:spacing w:val="-2"/>
-                        <w:sz w:val="24"/>
-                      </w:rPr>
-                      <w:t>No:</w:t>
-                    </w:r>
-                    <w:r>
-                      <w:rPr>
-                        <w:b/>
-                        <w:spacing w:val="-35"/>
-                        <w:sz w:val="24"/>
-                      </w:rPr>
-                      <w:t> </w:t>
-                    </w:r>
-                    <w:r>
-                      <w:rPr>
-                        <w:spacing w:val="-2"/>
-                        <w:sz w:val="28"/>
-                      </w:rPr>
-                      <w:t/>
-                    </w:r>
-                    <w:r>
-                      <w:rPr>
-                        <w:spacing w:val="7"/>
-                        <w:sz w:val="28"/>
-                      </w:rPr>
-                      <w:t> </w:t>
-                    </w:r>
-                    <w:r>
-                      <w:rPr>
-                        <w:spacing w:val="-2"/>
-                        <w:sz w:val="28"/>
-                      </w:rPr>
-                      <w:t/>
-                    </w:r>
-                    <w:r>
-                      <w:rPr>
-                        <w:color w:val="000000"/>
-                        <w:spacing w:val="-2"/>
-                        <w:sz w:val="28"/>
-                        <w:highlight w:val="cyan"/>
-                      </w:rPr>
-                      <w:t>R3</w:t>
-                    </w:r>
-                  </w:p>
+                  <w:p/>
                 </w:txbxContent>
               </v:textbox>
               <w10:wrap type="none"/>
@@ -50418,143 +49862,7 @@
                     </wps:spPr>
                     <wps:txbx>
                       <w:txbxContent>
-                        <w:p>
-                          <w:pPr>
-                            <w:pStyle w:val="BodyText"/>
-                            <w:spacing w:before="10"/>
-                            <w:ind w:left="20"/>
-                            <w:rPr>
-                              <w:b/>
-                            </w:rPr>
-                          </w:pPr>
-                          <w:r>
-                            <w:rPr/>
-                            <w:t>P</w:t>
-                          </w:r>
-                          <w:r>
-                            <w:rPr>
-                              <w:spacing w:val="1"/>
-                            </w:rPr>
-                            <w:t> </w:t>
-                          </w:r>
-                          <w:r>
-                            <w:rPr/>
-                            <w:t>a</w:t>
-                          </w:r>
-                          <w:r>
-                            <w:rPr>
-                              <w:spacing w:val="-2"/>
-                            </w:rPr>
-                            <w:t> </w:t>
-                          </w:r>
-                          <w:r>
-                            <w:rPr/>
-                            <w:t>g</w:t>
-                          </w:r>
-                          <w:r>
-                            <w:rPr>
-                              <w:spacing w:val="-15"/>
-                            </w:rPr>
-                            <w:t> </w:t>
-                          </w:r>
-                          <w:r>
-                            <w:rPr/>
-                            <w:t>e</w:t>
-                          </w:r>
-                          <w:r>
-                            <w:rPr>
-                              <w:spacing w:val="74"/>
-                            </w:rPr>
-                            <w:t> </w:t>
-                          </w:r>
-                          <w:r>
-                            <w:rPr/>
-                            <w:t>|</w:t>
-                          </w:r>
-                          <w:r>
-                            <w:rPr>
-                              <w:spacing w:val="-4"/>
-                            </w:rPr>
-                            <w:t> </w:t>
-                          </w:r>
-                          <w:r>
-                            <w:rPr>
-                              <w:b/>
-                              <w:spacing w:val="-5"/>
-                            </w:rPr>
-                            <w:fldChar w:fldCharType="begin" w:dirty="true"/>
-                          </w:r>
-                          <w:r>
-                            <w:rPr>
-                              <w:b/>
-                              <w:spacing w:val="-5"/>
-                            </w:rPr>
-                            <w:instrText> PAGE </w:instrText>
-                          </w:r>
-                          <w:r>
-                            <w:rPr>
-                              <w:b/>
-                              <w:spacing w:val="-5"/>
-                            </w:rPr>
-                            <w:fldChar w:fldCharType="separate"/>
-                          </w:r>
-                          <w:r>
-                            <w:rPr>
-                              <w:b/>
-                              <w:spacing w:val="-5"/>
-                            </w:rPr>
-                            <w:t>10</w:t>
-                          </w:r>
-                          <w:r>
-                            <w:rPr>
-                              <w:b/>
-                              <w:spacing w:val="-5"/>
-                            </w:rPr>
-                            <w:fldChar w:fldCharType="end"/>
-                          </w:r>
-                          <w:r>
-                            <w:rPr>
-                              <w:b/>
-                              <w:spacing w:val="-5"/>
-                            </w:rPr>
-                            <w:t xml:space="preserve"> / </w:t>
-                          </w:r>
-                          <w:r>
-                            <w:rPr>
-                              <w:b/>
-                              <w:spacing w:val="-5"/>
-                            </w:rPr>
-                            <w:fldChar w:fldCharType="begin" w:dirty="true"/>
-                          </w:r>
-                          <w:r>
-                            <w:rPr>
-                              <w:b/>
-                              <w:spacing w:val="-5"/>
-                            </w:rPr>
-                            <w:instrText> NUMPAGES </w:instrText>
-                          </w:r>
-                          <w:r>
-                            <w:rPr>
-                              <w:b/>
-                              <w:spacing w:val="-5"/>
-                            </w:rPr>
-                            <w:fldChar w:fldCharType="separate"/>
-                          </w:r>
-                          <w:r>
-                            <w:rPr>
-                              <w:b/>
-                              <w:spacing w:val="-5"/>
-                            </w:rPr>
-                            <w:t>1</w:t>
-                          </w:r>
-                          <w:r>
-                            <w:rPr>
-                              <w:b/>
-                              <w:spacing w:val="-5"/>
-                            </w:rPr>
-                            <w:fldChar w:fldCharType="end"/>
-                          </w:r>
-                        </w:p>
+                        <w:p/>
                       </w:txbxContent>
                     </wps:txbx>
                     <wps:bodyPr wrap="square" lIns="0" tIns="0" rIns="0" bIns="0" rtlCol="0">
@@ -50571,101 +49879,7 @@
             <v:shape style="position:absolute;margin-left:499.899994pt;margin-top:774.981628pt;width:57.55pt;height:15.3pt;mso-position-horizontal-relative:page;mso-position-vertical-relative:page;z-index:-16663040" type="#_x0000_t202" id="docshape26" filled="false" stroked="false">
               <v:textbox inset="0,0,0,0">
                 <w:txbxContent>
-                  <w:p>
-                    <w:pPr>
-                      <w:pStyle w:val="BodyText"/>
-                      <w:spacing w:before="10"/>
-                      <w:ind w:left="20"/>
-                      <w:rPr>
-                        <w:b/>
-                      </w:rPr>
-                    </w:pPr>
-                    <w:r>
-                      <w:rPr/>
-                      <w:t>P</w:t>
-                    </w:r>
-                    <w:r>
-                      <w:rPr>
-                        <w:spacing w:val="1"/>
-                      </w:rPr>
-                      <w:t> </w:t>
-                    </w:r>
-                    <w:r>
-                      <w:rPr/>
-                      <w:t>a</w:t>
-                    </w:r>
-                    <w:r>
-                      <w:rPr>
-                        <w:spacing w:val="-2"/>
-                      </w:rPr>
-                      <w:t> </w:t>
-                    </w:r>
-                    <w:r>
-                      <w:rPr/>
-                      <w:t>g</w:t>
-                    </w:r>
-                    <w:r>
-                      <w:rPr>
-                        <w:spacing w:val="-15"/>
-                      </w:rPr>
-                      <w:t> </w:t>
-                    </w:r>
-                    <w:r>
-                      <w:rPr/>
-                      <w:t>e</w:t>
-                    </w:r>
-                    <w:r>
-                      <w:rPr>
-                        <w:spacing w:val="74"/>
-                      </w:rPr>
-                      <w:t> </w:t>
-                    </w:r>
-                    <w:r>
-                      <w:rPr/>
-                      <w:t>|</w:t>
-                    </w:r>
-                    <w:r>
-                      <w:rPr>
-                        <w:spacing w:val="-4"/>
-                      </w:rPr>
-                      <w:t> </w:t>
-                    </w:r>
-                    <w:r>
-                      <w:rPr>
-                        <w:b/>
-                        <w:spacing w:val="-5"/>
-                      </w:rPr>
-                      <w:fldChar w:fldCharType="begin" w:dirty="true"/>
-                    </w:r>
-                    <w:r>
-                      <w:rPr>
-                        <w:b/>
-                        <w:spacing w:val="-5"/>
-                      </w:rPr>
-                      <w:instrText> PAGE </w:instrText>
-                    </w:r>
-                    <w:r>
-                      <w:rPr>
-                        <w:b/>
-                        <w:spacing w:val="-5"/>
-                      </w:rPr>
-                      <w:fldChar w:fldCharType="separate"/>
-                    </w:r>
-                    <w:r>
-                      <w:rPr>
-                        <w:b/>
-                        <w:spacing w:val="-5"/>
-                      </w:rPr>
-                      <w:t>10</w:t>
-                    </w:r>
-                    <w:r>
-                      <w:rPr>
-                        <w:b/>
-                        <w:spacing w:val="-5"/>
-                      </w:rPr>
-                      <w:fldChar w:fldCharType="end"/>
-                    </w:r>
-                  </w:p>
+                  <w:p/>
                 </w:txbxContent>
               </v:textbox>
               <w10:wrap type="none"/>

</xml_diff>

<commit_message>
chore: drop descriptive paragraphs under Burner/Temperature Control
The hardcoded sentences below each heading (e.g. "controlled
automatically through P.L.C...") were always PLC-phrased and read
wrong under PID/AGR/Manual. Removed both copies in the template;
headings + bullet loops remain. Mode-aware wording can be wired
back in once the per-mode copy is decided.

Co-Authored-By: Claude Opus 4.7 (1M context) <noreply@anthropic.com>
</commit_message>
<xml_diff>
--- a/Offer_Template.docx
+++ b/Offer_Template.docx
@@ -20740,223 +20740,6 @@
     </w:p>
     <w:p>
       <w:pPr>
-        <w:pStyle w:val="BodyText"/>
-        <w:spacing w:line="273" w:lineRule="exact"/>
-        <w:ind w:left="152"/>
-      </w:pPr>
-      <w:r>
-        <w:rPr>
-          <w:spacing w:val="-2"/>
-        </w:rPr>
-        <w:t>The</w:t>
-      </w:r>
-      <w:r>
-        <w:rPr>
-          <w:spacing w:val="-14"/>
-        </w:rPr>
-        <w:t> </w:t>
-      </w:r>
-      <w:r>
-        <w:rPr>
-          <w:spacing w:val="-2"/>
-        </w:rPr>
-        <w:t>above</w:t>
-      </w:r>
-      <w:r>
-        <w:rPr>
-          <w:spacing w:val="-13"/>
-        </w:rPr>
-        <w:t> </w:t>
-      </w:r>
-      <w:r>
-        <w:rPr>
-          <w:spacing w:val="-2"/>
-        </w:rPr>
-        <w:t>burners</w:t>
-      </w:r>
-      <w:r>
-        <w:rPr>
-          <w:spacing w:val="16"/>
-        </w:rPr>
-        <w:t> </w:t>
-      </w:r>
-      <w:r>
-        <w:rPr>
-          <w:spacing w:val="-2"/>
-        </w:rPr>
-        <w:t>will</w:t>
-      </w:r>
-      <w:r>
-        <w:rPr>
-          <w:spacing w:val="24"/>
-        </w:rPr>
-        <w:t> </w:t>
-      </w:r>
-      <w:r>
-        <w:rPr>
-          <w:spacing w:val="-2"/>
-        </w:rPr>
-        <w:t>be</w:t>
-      </w:r>
-      <w:r>
-        <w:rPr>
-          <w:spacing w:val="-17"/>
-        </w:rPr>
-        <w:t> </w:t>
-      </w:r>
-      <w:r>
-        <w:rPr>
-          <w:spacing w:val="-2"/>
-        </w:rPr>
-        <w:t>governed</w:t>
-      </w:r>
-      <w:r>
-        <w:rPr>
-          <w:spacing w:val="19"/>
-        </w:rPr>
-        <w:t> </w:t>
-      </w:r>
-      <w:r>
-        <w:rPr>
-          <w:spacing w:val="-2"/>
-        </w:rPr>
-        <w:t>by</w:t>
-      </w:r>
-      <w:r>
-        <w:rPr>
-          <w:spacing w:val="-15"/>
-        </w:rPr>
-        <w:t> </w:t>
-      </w:r>
-      <w:r>
-        <w:rPr>
-          <w:spacing w:val="-2"/>
-        </w:rPr>
-        <w:t>the</w:t>
-      </w:r>
-      <w:r>
-        <w:rPr>
-          <w:spacing w:val="-7"/>
-        </w:rPr>
-        <w:t> </w:t>
-      </w:r>
-      <w:r>
-        <w:rPr>
-          <w:spacing w:val="-2"/>
-        </w:rPr>
-        <w:t>following</w:t>
-      </w:r>
-      <w:r>
-        <w:rPr>
-          <w:spacing w:val="52"/>
-        </w:rPr>
-        <w:t> </w:t>
-      </w:r>
-      <w:r>
-        <w:rPr>
-          <w:spacing w:val="-2"/>
-        </w:rPr>
-        <w:t>scheme</w:t>
-      </w:r>
-      <w:r>
-        <w:rPr>
-          <w:spacing w:val="17"/>
-        </w:rPr>
-        <w:t> </w:t>
-      </w:r>
-      <w:r>
-        <w:rPr>
-          <w:spacing w:val="-2"/>
-        </w:rPr>
-        <w:t>fitted</w:t>
-      </w:r>
-      <w:r>
-        <w:rPr>
-          <w:spacing w:val="41"/>
-        </w:rPr>
-        <w:t> </w:t>
-      </w:r>
-      <w:r>
-        <w:rPr>
-          <w:spacing w:val="-2"/>
-        </w:rPr>
-        <w:t>on</w:t>
-      </w:r>
-      <w:r>
-        <w:rPr>
-          <w:spacing w:val="-30"/>
-        </w:rPr>
-        <w:t> </w:t>
-      </w:r>
-      <w:r>
-        <w:rPr>
-          <w:spacing w:val="-2"/>
-        </w:rPr>
-        <w:t>the</w:t>
-      </w:r>
-      <w:r>
-        <w:rPr>
-          <w:spacing w:val="5"/>
-        </w:rPr>
-        <w:t> </w:t>
-      </w:r>
-      <w:r>
-        <w:rPr>
-          <w:spacing w:val="-2"/>
-        </w:rPr>
-        <w:t>main</w:t>
-      </w:r>
-      <w:r>
-        <w:rPr>
-          <w:spacing w:val="29"/>
-        </w:rPr>
-        <w:t> </w:t>
-      </w:r>
-      <w:r>
-        <w:rPr>
-          <w:spacing w:val="-2"/>
-        </w:rPr>
-        <w:t>gas</w:t>
-      </w:r>
-      <w:r>
-        <w:rPr>
-          <w:spacing w:val="-13"/>
-        </w:rPr>
-        <w:t> </w:t>
-      </w:r>
-      <w:r>
-        <w:rPr>
-          <w:spacing w:val="-2"/>
-        </w:rPr>
-        <w:t>and</w:t>
-      </w:r>
-      <w:r>
-        <w:rPr>
-          <w:spacing w:val="-5"/>
-        </w:rPr>
-        <w:t> </w:t>
-      </w:r>
-      <w:r>
-        <w:rPr>
-          <w:spacing w:val="-2"/>
-        </w:rPr>
-        <w:t>air</w:t>
-      </w:r>
-      <w:r>
-        <w:rPr>
-          <w:spacing w:val="-8"/>
-        </w:rPr>
-        <w:t> </w:t>
-      </w:r>
-      <w:r>
-        <w:rPr>
-          <w:spacing w:val="-2"/>
-        </w:rPr>
-        <w:t>pipeline:</w:t>
-      </w:r>
-    </w:p>
-    <w:p>
-      <w:pPr>
         <w:pStyle w:val="Heading3"/>
       </w:pPr>
       <w:r>
@@ -21394,331 +21177,6 @@
           <w:u w:val="thick"/>
         </w:rPr>
         <w:t>SYSTEM</w:t>
-      </w:r>
-    </w:p>
-    <w:p>
-      <w:pPr>
-        <w:pStyle w:val="BodyText"/>
-        <w:spacing w:line="235" w:lineRule="auto" w:before="14"/>
-        <w:ind w:left="152" w:right="679"/>
-      </w:pPr>
-      <w:r>
-        <w:rPr>
-          <w:spacing w:val="-4"/>
-        </w:rPr>
-        <w:t>To</w:t>
-      </w:r>
-      <w:r>
-        <w:rPr>
-          <w:spacing w:val="-11"/>
-        </w:rPr>
-        <w:t> </w:t>
-      </w:r>
-      <w:r>
-        <w:rPr>
-          <w:spacing w:val="-4"/>
-        </w:rPr>
-        <w:t>control</w:t>
-      </w:r>
-      <w:r>
-        <w:rPr>
-          <w:spacing w:val="-11"/>
-        </w:rPr>
-        <w:t> </w:t>
-      </w:r>
-      <w:r>
-        <w:rPr>
-          <w:spacing w:val="-4"/>
-        </w:rPr>
-        <w:t>and</w:t>
-      </w:r>
-      <w:r>
-        <w:rPr>
-          <w:spacing w:val="-15"/>
-        </w:rPr>
-        <w:t> </w:t>
-      </w:r>
-      <w:r>
-        <w:rPr>
-          <w:spacing w:val="-4"/>
-        </w:rPr>
-        <w:t>maintain</w:t>
-      </w:r>
-      <w:r>
-        <w:rPr>
-          <w:spacing w:val="44"/>
-        </w:rPr>
-        <w:t> </w:t>
-      </w:r>
-      <w:r>
-        <w:rPr>
-          <w:spacing w:val="-4"/>
-        </w:rPr>
-        <w:t>the</w:t>
-      </w:r>
-      <w:r>
-        <w:rPr>
-          <w:spacing w:val="-11"/>
-        </w:rPr>
-        <w:t> </w:t>
-      </w:r>
-      <w:r>
-        <w:rPr>
-          <w:spacing w:val="-4"/>
-        </w:rPr>
-        <w:t>temperature</w:t>
-      </w:r>
-      <w:r>
-        <w:rPr>
-          <w:spacing w:val="24"/>
-        </w:rPr>
-        <w:t> </w:t>
-      </w:r>
-      <w:r>
-        <w:rPr>
-          <w:spacing w:val="-4"/>
-        </w:rPr>
-        <w:t>of</w:t>
-      </w:r>
-      <w:r>
-        <w:rPr>
-          <w:spacing w:val="-11"/>
-        </w:rPr>
-        <w:t> </w:t>
-      </w:r>
-      <w:r>
-        <w:rPr>
-          <w:spacing w:val="-4"/>
-        </w:rPr>
-        <w:t>the</w:t>
-      </w:r>
-      <w:r>
-        <w:rPr>
-          <w:spacing w:val="-11"/>
-        </w:rPr>
-        <w:t> </w:t>
-      </w:r>
-      <w:r>
-        <w:rPr>
-          <w:spacing w:val="-4"/>
-        </w:rPr>
-        <w:t>Ladle accurately,</w:t>
-      </w:r>
-      <w:r>
-        <w:rPr>
-          <w:spacing w:val="40"/>
-        </w:rPr>
-        <w:t> </w:t>
-      </w:r>
-      <w:r>
-        <w:rPr>
-          <w:spacing w:val="-4"/>
-        </w:rPr>
-        <w:t>the thermocouple</w:t>
-      </w:r>
-      <w:r>
-        <w:rPr>
-          <w:spacing w:val="60"/>
-        </w:rPr>
-        <w:t> </w:t>
-      </w:r>
-      <w:r>
-        <w:rPr>
-          <w:spacing w:val="-4"/>
-        </w:rPr>
-        <w:t>will</w:t>
-      </w:r>
-      <w:r>
-        <w:rPr>
-          <w:spacing w:val="18"/>
-        </w:rPr>
-        <w:t> </w:t>
-      </w:r>
-      <w:r>
-        <w:rPr>
-          <w:spacing w:val="-4"/>
-        </w:rPr>
-        <w:t>be</w:t>
-      </w:r>
-      <w:r>
-        <w:rPr>
-          <w:spacing w:val="-11"/>
-        </w:rPr>
-        <w:t> </w:t>
-      </w:r>
-      <w:r>
-        <w:rPr>
-          <w:spacing w:val="-4"/>
-        </w:rPr>
-        <w:t>fitted</w:t>
-      </w:r>
-      <w:r>
-        <w:rPr>
-          <w:spacing w:val="24"/>
-        </w:rPr>
-        <w:t> </w:t>
-      </w:r>
-      <w:r>
-        <w:rPr>
-          <w:spacing w:val="-4"/>
-        </w:rPr>
-        <w:t>in the ladle</w:t>
-      </w:r>
-      <w:r>
-        <w:rPr>
-          <w:spacing w:val="10"/>
-        </w:rPr>
-        <w:t> </w:t>
-      </w:r>
-      <w:r>
-        <w:rPr>
-          <w:spacing w:val="-4"/>
-        </w:rPr>
-        <w:t>hood </w:t>
-      </w:r>
-      <w:r>
-        <w:rPr/>
-        <w:t>at</w:t>
-      </w:r>
-      <w:r>
-        <w:rPr>
-          <w:spacing w:val="-15"/>
-        </w:rPr>
-        <w:t> </w:t>
-      </w:r>
-      <w:r>
-        <w:rPr/>
-        <w:t>a</w:t>
-      </w:r>
-      <w:r>
-        <w:rPr>
-          <w:spacing w:val="-17"/>
-        </w:rPr>
-        <w:t> </w:t>
-      </w:r>
-      <w:r>
-        <w:rPr/>
-        <w:t>suitable</w:t>
-      </w:r>
-      <w:r>
-        <w:rPr>
-          <w:spacing w:val="37"/>
-        </w:rPr>
-        <w:t> </w:t>
-      </w:r>
-      <w:r>
-        <w:rPr/>
-        <w:t>location.</w:t>
-      </w:r>
-      <w:r>
-        <w:rPr>
-          <w:spacing w:val="39"/>
-        </w:rPr>
-        <w:t> </w:t>
-      </w:r>
-      <w:r>
-        <w:rPr/>
-        <w:t>The</w:t>
-      </w:r>
-      <w:r>
-        <w:rPr>
-          <w:spacing w:val="-2"/>
-        </w:rPr>
-        <w:t> </w:t>
-      </w:r>
-      <w:r>
-        <w:rPr/>
-        <w:t>temperature</w:t>
-      </w:r>
-      <w:r>
-        <w:rPr>
-          <w:spacing w:val="28"/>
-        </w:rPr>
-        <w:t> </w:t>
-      </w:r>
-      <w:r>
-        <w:rPr/>
-        <w:t>control</w:t>
-      </w:r>
-      <w:r>
-        <w:rPr>
-          <w:spacing w:val="4"/>
-        </w:rPr>
-        <w:t> </w:t>
-      </w:r>
-      <w:r>
-        <w:rPr/>
-        <w:t>system</w:t>
-      </w:r>
-      <w:r>
-        <w:rPr>
-          <w:spacing w:val="-4"/>
-        </w:rPr>
-        <w:t> </w:t>
-      </w:r>
-      <w:r>
-        <w:rPr/>
-        <w:t>will</w:t>
-      </w:r>
-      <w:r>
-        <w:rPr>
-          <w:spacing w:val="30"/>
-        </w:rPr>
-        <w:t> </w:t>
-      </w:r>
-      <w:r>
-        <w:rPr/>
-        <w:t>consist</w:t>
-      </w:r>
-      <w:r>
-        <w:rPr>
-          <w:spacing w:val="30"/>
-        </w:rPr>
-        <w:t> </w:t>
-      </w:r>
-      <w:r>
-        <w:rPr/>
-        <w:t>of</w:t>
-      </w:r>
-      <w:r>
-        <w:rPr>
-          <w:spacing w:val="-20"/>
-        </w:rPr>
-        <w:t> </w:t>
-      </w:r>
-      <w:r>
-        <w:rPr/>
-        <w:t>the</w:t>
-      </w:r>
-      <w:r>
-        <w:rPr>
-          <w:spacing w:val="-9"/>
-        </w:rPr>
-        <w:t> </w:t>
-      </w:r>
-      <w:r>
-        <w:rPr/>
-        <w:t>following</w:t>
-      </w:r>
-      <w:r>
-        <w:rPr>
-          <w:spacing w:val="34"/>
-        </w:rPr>
-        <w:t> </w:t>
-      </w:r>
-      <w:r>
-        <w:rPr/>
-        <w:t>main</w:t>
-      </w:r>
-      <w:r>
-        <w:rPr>
-          <w:spacing w:val="23"/>
-        </w:rPr>
-        <w:t> </w:t>
-      </w:r>
-      <w:r>
-        <w:rPr/>
-        <w:t>component:</w:t>
       </w:r>
     </w:p>
     <w:p>
@@ -29312,223 +28770,6 @@
     </w:p>
     <w:p>
       <w:pPr>
-        <w:pStyle w:val="BodyText"/>
-        <w:spacing w:line="273" w:lineRule="exact"/>
-        <w:ind w:left="152"/>
-      </w:pPr>
-      <w:r>
-        <w:rPr>
-          <w:spacing w:val="-2"/>
-        </w:rPr>
-        <w:t>The</w:t>
-      </w:r>
-      <w:r>
-        <w:rPr>
-          <w:spacing w:val="-14"/>
-        </w:rPr>
-        <w:t> </w:t>
-      </w:r>
-      <w:r>
-        <w:rPr>
-          <w:spacing w:val="-2"/>
-        </w:rPr>
-        <w:t>above</w:t>
-      </w:r>
-      <w:r>
-        <w:rPr>
-          <w:spacing w:val="-13"/>
-        </w:rPr>
-        <w:t> </w:t>
-      </w:r>
-      <w:r>
-        <w:rPr>
-          <w:spacing w:val="-2"/>
-        </w:rPr>
-        <w:t>burners</w:t>
-      </w:r>
-      <w:r>
-        <w:rPr>
-          <w:spacing w:val="16"/>
-        </w:rPr>
-        <w:t> </w:t>
-      </w:r>
-      <w:r>
-        <w:rPr>
-          <w:spacing w:val="-2"/>
-        </w:rPr>
-        <w:t>will</w:t>
-      </w:r>
-      <w:r>
-        <w:rPr>
-          <w:spacing w:val="24"/>
-        </w:rPr>
-        <w:t> </w:t>
-      </w:r>
-      <w:r>
-        <w:rPr>
-          <w:spacing w:val="-2"/>
-        </w:rPr>
-        <w:t>be</w:t>
-      </w:r>
-      <w:r>
-        <w:rPr>
-          <w:spacing w:val="-17"/>
-        </w:rPr>
-        <w:t> </w:t>
-      </w:r>
-      <w:r>
-        <w:rPr>
-          <w:spacing w:val="-2"/>
-        </w:rPr>
-        <w:t>governed</w:t>
-      </w:r>
-      <w:r>
-        <w:rPr>
-          <w:spacing w:val="19"/>
-        </w:rPr>
-        <w:t> </w:t>
-      </w:r>
-      <w:r>
-        <w:rPr>
-          <w:spacing w:val="-2"/>
-        </w:rPr>
-        <w:t>by</w:t>
-      </w:r>
-      <w:r>
-        <w:rPr>
-          <w:spacing w:val="-15"/>
-        </w:rPr>
-        <w:t> </w:t>
-      </w:r>
-      <w:r>
-        <w:rPr>
-          <w:spacing w:val="-2"/>
-        </w:rPr>
-        <w:t>the</w:t>
-      </w:r>
-      <w:r>
-        <w:rPr>
-          <w:spacing w:val="-7"/>
-        </w:rPr>
-        <w:t> </w:t>
-      </w:r>
-      <w:r>
-        <w:rPr>
-          <w:spacing w:val="-2"/>
-        </w:rPr>
-        <w:t>following</w:t>
-      </w:r>
-      <w:r>
-        <w:rPr>
-          <w:spacing w:val="52"/>
-        </w:rPr>
-        <w:t> </w:t>
-      </w:r>
-      <w:r>
-        <w:rPr>
-          <w:spacing w:val="-2"/>
-        </w:rPr>
-        <w:t>scheme</w:t>
-      </w:r>
-      <w:r>
-        <w:rPr>
-          <w:spacing w:val="17"/>
-        </w:rPr>
-        <w:t> </w:t>
-      </w:r>
-      <w:r>
-        <w:rPr>
-          <w:spacing w:val="-2"/>
-        </w:rPr>
-        <w:t>fitted</w:t>
-      </w:r>
-      <w:r>
-        <w:rPr>
-          <w:spacing w:val="41"/>
-        </w:rPr>
-        <w:t> </w:t>
-      </w:r>
-      <w:r>
-        <w:rPr>
-          <w:spacing w:val="-2"/>
-        </w:rPr>
-        <w:t>on</w:t>
-      </w:r>
-      <w:r>
-        <w:rPr>
-          <w:spacing w:val="-30"/>
-        </w:rPr>
-        <w:t> </w:t>
-      </w:r>
-      <w:r>
-        <w:rPr>
-          <w:spacing w:val="-2"/>
-        </w:rPr>
-        <w:t>the</w:t>
-      </w:r>
-      <w:r>
-        <w:rPr>
-          <w:spacing w:val="5"/>
-        </w:rPr>
-        <w:t> </w:t>
-      </w:r>
-      <w:r>
-        <w:rPr>
-          <w:spacing w:val="-2"/>
-        </w:rPr>
-        <w:t>main</w:t>
-      </w:r>
-      <w:r>
-        <w:rPr>
-          <w:spacing w:val="29"/>
-        </w:rPr>
-        <w:t> </w:t>
-      </w:r>
-      <w:r>
-        <w:rPr>
-          <w:spacing w:val="-2"/>
-        </w:rPr>
-        <w:t>gas</w:t>
-      </w:r>
-      <w:r>
-        <w:rPr>
-          <w:spacing w:val="-13"/>
-        </w:rPr>
-        <w:t> </w:t>
-      </w:r>
-      <w:r>
-        <w:rPr>
-          <w:spacing w:val="-2"/>
-        </w:rPr>
-        <w:t>and</w:t>
-      </w:r>
-      <w:r>
-        <w:rPr>
-          <w:spacing w:val="-5"/>
-        </w:rPr>
-        <w:t> </w:t>
-      </w:r>
-      <w:r>
-        <w:rPr>
-          <w:spacing w:val="-2"/>
-        </w:rPr>
-        <w:t>air</w:t>
-      </w:r>
-      <w:r>
-        <w:rPr>
-          <w:spacing w:val="-8"/>
-        </w:rPr>
-        <w:t> </w:t>
-      </w:r>
-      <w:r>
-        <w:rPr>
-          <w:spacing w:val="-2"/>
-        </w:rPr>
-        <w:t>pipeline:</w:t>
-      </w:r>
-    </w:p>
-    <w:p>
-      <w:pPr>
         <w:pStyle w:val="Heading3"/>
       </w:pPr>
       <w:r>
@@ -29966,355 +29207,6 @@
           <w:u w:val="thick"/>
         </w:rPr>
         <w:t>SYSTEM</w:t>
-      </w:r>
-    </w:p>
-    <w:p>
-      <w:pPr>
-        <w:pStyle w:val="BodyText"/>
-        <w:spacing w:line="235" w:lineRule="auto" w:before="14"/>
-        <w:ind w:left="152" w:right="679"/>
-      </w:pPr>
-      <w:r>
-        <w:rPr>
-          <w:spacing w:val="-4"/>
-        </w:rPr>
-        <w:t>To</w:t>
-      </w:r>
-      <w:r>
-        <w:rPr>
-          <w:spacing w:val="-11"/>
-        </w:rPr>
-        <w:t> </w:t>
-      </w:r>
-      <w:r>
-        <w:rPr>
-          <w:spacing w:val="-4"/>
-        </w:rPr>
-        <w:t>control</w:t>
-      </w:r>
-      <w:r>
-        <w:rPr>
-          <w:spacing w:val="-11"/>
-        </w:rPr>
-        <w:t> </w:t>
-      </w:r>
-      <w:r>
-        <w:rPr>
-          <w:spacing w:val="-4"/>
-        </w:rPr>
-        <w:t>and</w:t>
-      </w:r>
-      <w:r>
-        <w:rPr>
-          <w:spacing w:val="-15"/>
-        </w:rPr>
-        <w:t> </w:t>
-      </w:r>
-      <w:r>
-        <w:rPr>
-          <w:spacing w:val="-4"/>
-        </w:rPr>
-        <w:t>maintain</w:t>
-      </w:r>
-      <w:r>
-        <w:rPr>
-          <w:spacing w:val="38"/>
-        </w:rPr>
-        <w:t> </w:t>
-      </w:r>
-      <w:r>
-        <w:rPr>
-          <w:spacing w:val="-4"/>
-        </w:rPr>
-        <w:t>the</w:t>
-      </w:r>
-      <w:r>
-        <w:rPr>
-          <w:spacing w:val="-11"/>
-        </w:rPr>
-        <w:t> </w:t>
-      </w:r>
-      <w:r>
-        <w:rPr>
-          <w:spacing w:val="-4"/>
-        </w:rPr>
-        <w:t>temperature</w:t>
-      </w:r>
-      <w:r>
-        <w:rPr>
-          <w:spacing w:val="19"/>
-        </w:rPr>
-        <w:t> </w:t>
-      </w:r>
-      <w:r>
-        <w:rPr>
-          <w:spacing w:val="-4"/>
-        </w:rPr>
-        <w:t>of</w:t>
-      </w:r>
-      <w:r>
-        <w:rPr>
-          <w:spacing w:val="-11"/>
-        </w:rPr>
-        <w:t> </w:t>
-      </w:r>
-      <w:r>
-        <w:rPr>
-          <w:spacing w:val="-4"/>
-        </w:rPr>
-        <w:t>the</w:t>
-      </w:r>
-      <w:r>
-        <w:rPr>
-          <w:spacing w:val="-11"/>
-        </w:rPr>
-        <w:t> </w:t>
-      </w:r>
-      <w:r>
-        <w:rPr>
-          <w:spacing w:val="-4"/>
-        </w:rPr>
-        <w:t>Ladle accurately,</w:t>
-      </w:r>
-      <w:r>
-        <w:rPr>
-          <w:spacing w:val="40"/>
-        </w:rPr>
-        <w:t> </w:t>
-      </w:r>
-      <w:r>
-        <w:rPr>
-          <w:spacing w:val="-4"/>
-        </w:rPr>
-        <w:t>the</w:t>
-      </w:r>
-      <w:r>
-        <w:rPr>
-          <w:spacing w:val="-11"/>
-        </w:rPr>
-        <w:t> </w:t>
-      </w:r>
-      <w:r>
-        <w:rPr>
-          <w:spacing w:val="-4"/>
-        </w:rPr>
-        <w:t>thermocouple</w:t>
-      </w:r>
-      <w:r>
-        <w:rPr>
-          <w:spacing w:val="59"/>
-        </w:rPr>
-        <w:t> </w:t>
-      </w:r>
-      <w:r>
-        <w:rPr>
-          <w:spacing w:val="-4"/>
-        </w:rPr>
-        <w:t>will</w:t>
-      </w:r>
-      <w:r>
-        <w:rPr>
-          <w:spacing w:val="30"/>
-        </w:rPr>
-        <w:t> </w:t>
-      </w:r>
-      <w:r>
-        <w:rPr>
-          <w:spacing w:val="-4"/>
-        </w:rPr>
-        <w:t>be</w:t>
-      </w:r>
-      <w:r>
-        <w:rPr>
-          <w:spacing w:val="-17"/>
-        </w:rPr>
-        <w:t> </w:t>
-      </w:r>
-      <w:r>
-        <w:rPr>
-          <w:spacing w:val="-4"/>
-        </w:rPr>
-        <w:t>fitted</w:t>
-      </w:r>
-      <w:r>
-        <w:rPr>
-          <w:spacing w:val="24"/>
-        </w:rPr>
-        <w:t> </w:t>
-      </w:r>
-      <w:r>
-        <w:rPr>
-          <w:spacing w:val="-4"/>
-        </w:rPr>
-        <w:t>in the</w:t>
-      </w:r>
-      <w:r>
-        <w:rPr>
-          <w:spacing w:val="-11"/>
-        </w:rPr>
-        <w:t> </w:t>
-      </w:r>
-      <w:r>
-        <w:rPr>
-          <w:spacing w:val="-4"/>
-        </w:rPr>
-        <w:t>ladle</w:t>
-      </w:r>
-      <w:r>
-        <w:rPr>
-          <w:spacing w:val="22"/>
-        </w:rPr>
-        <w:t> </w:t>
-      </w:r>
-      <w:r>
-        <w:rPr>
-          <w:spacing w:val="-4"/>
-        </w:rPr>
-        <w:t>hood </w:t>
-      </w:r>
-      <w:r>
-        <w:rPr/>
-        <w:t>at</w:t>
-      </w:r>
-      <w:r>
-        <w:rPr>
-          <w:spacing w:val="-15"/>
-        </w:rPr>
-        <w:t> </w:t>
-      </w:r>
-      <w:r>
-        <w:rPr/>
-        <w:t>a</w:t>
-      </w:r>
-      <w:r>
-        <w:rPr>
-          <w:spacing w:val="-17"/>
-        </w:rPr>
-        <w:t> </w:t>
-      </w:r>
-      <w:r>
-        <w:rPr/>
-        <w:t>suitable</w:t>
-      </w:r>
-      <w:r>
-        <w:rPr>
-          <w:spacing w:val="37"/>
-        </w:rPr>
-        <w:t> </w:t>
-      </w:r>
-      <w:r>
-        <w:rPr/>
-        <w:t>location.</w:t>
-      </w:r>
-      <w:r>
-        <w:rPr>
-          <w:spacing w:val="39"/>
-        </w:rPr>
-        <w:t> </w:t>
-      </w:r>
-      <w:r>
-        <w:rPr/>
-        <w:t>The</w:t>
-      </w:r>
-      <w:r>
-        <w:rPr>
-          <w:spacing w:val="-2"/>
-        </w:rPr>
-        <w:t> </w:t>
-      </w:r>
-      <w:r>
-        <w:rPr/>
-        <w:t>temperature</w:t>
-      </w:r>
-      <w:r>
-        <w:rPr>
-          <w:spacing w:val="28"/>
-        </w:rPr>
-        <w:t> </w:t>
-      </w:r>
-      <w:r>
-        <w:rPr/>
-        <w:t>control</w:t>
-      </w:r>
-      <w:r>
-        <w:rPr>
-          <w:spacing w:val="4"/>
-        </w:rPr>
-        <w:t> </w:t>
-      </w:r>
-      <w:r>
-        <w:rPr/>
-        <w:t>system</w:t>
-      </w:r>
-      <w:r>
-        <w:rPr>
-          <w:spacing w:val="-4"/>
-        </w:rPr>
-        <w:t> </w:t>
-      </w:r>
-      <w:r>
-        <w:rPr/>
-        <w:t>will</w:t>
-      </w:r>
-      <w:r>
-        <w:rPr>
-          <w:spacing w:val="30"/>
-        </w:rPr>
-        <w:t> </w:t>
-      </w:r>
-      <w:r>
-        <w:rPr/>
-        <w:t>consist</w:t>
-      </w:r>
-      <w:r>
-        <w:rPr>
-          <w:spacing w:val="30"/>
-        </w:rPr>
-        <w:t> </w:t>
-      </w:r>
-      <w:r>
-        <w:rPr/>
-        <w:t>of</w:t>
-      </w:r>
-      <w:r>
-        <w:rPr>
-          <w:spacing w:val="-20"/>
-        </w:rPr>
-        <w:t> </w:t>
-      </w:r>
-      <w:r>
-        <w:rPr/>
-        <w:t>the</w:t>
-      </w:r>
-      <w:r>
-        <w:rPr>
-          <w:spacing w:val="-9"/>
-        </w:rPr>
-        <w:t> </w:t>
-      </w:r>
-      <w:r>
-        <w:rPr/>
-        <w:t>following</w:t>
-      </w:r>
-      <w:r>
-        <w:rPr>
-          <w:spacing w:val="34"/>
-        </w:rPr>
-        <w:t> </w:t>
-      </w:r>
-      <w:r>
-        <w:rPr/>
-        <w:t>main</w:t>
-      </w:r>
-      <w:r>
-        <w:rPr>
-          <w:spacing w:val="23"/>
-        </w:rPr>
-        <w:t> </w:t>
-      </w:r>
-      <w:r>
-        <w:rPr/>
-        <w:t>component:</w:t>
       </w:r>
     </w:p>
     <w:p>

</xml_diff>

<commit_message>
fix: strip yellow highlight bleeding through {{equipment_name}} cell
The Ladle Type row in the About-The-Client page rendered with a
yellow highlighted bar behind the equipment name. Root cause:
template annotation kept <w:highlight w:val="yellow"/> on all 9
runs inside the {{equipment_name}} table cell — docxtpl preserves
run formatting when substituting the placeholder, so the yellow
leaked into the final PDF/DOCX.

Removed all highlight elements in that one cell. Other intentional
highlights (e.g. turquoise "(R1)" callouts in firing-rate rows) are
kept.

If the yellow/green bar near the Heating time row is still visible,
it's a floating decorative shape anchored in the body — tell me and
I'll remove/reposition it separately.

Co-Authored-By: Claude Opus 4.7 (1M context) <noreply@anthropic.com>
</commit_message>
<xml_diff>
--- a/Offer_Template.docx
+++ b/Offer_Template.docx
@@ -10469,7 +10469,6 @@
                 <w:b/>
                 <w:color w:val="000000"/>
                 <w:sz w:val="25"/>
-                <w:highlight w:val="yellow"/>
               </w:rPr>
               <w:t>{{equipment_name}}</w:t>
             </w:r>
@@ -10479,7 +10478,6 @@
                 <w:color w:val="000000"/>
                 <w:spacing w:val="36"/>
                 <w:sz w:val="25"/>
-                <w:highlight w:val="yellow"/>
               </w:rPr>
             </w:r>
             <w:r>
@@ -10487,7 +10485,6 @@
                 <w:b/>
                 <w:color w:val="000000"/>
                 <w:sz w:val="25"/>
-                <w:highlight w:val="yellow"/>
               </w:rPr>
             </w:r>
             <w:r>
@@ -10496,7 +10493,6 @@
                 <w:color w:val="000000"/>
                 <w:spacing w:val="-1"/>
                 <w:sz w:val="25"/>
-                <w:highlight w:val="yellow"/>
               </w:rPr>
             </w:r>
             <w:r>
@@ -10504,7 +10500,6 @@
                 <w:b/>
                 <w:color w:val="000000"/>
                 <w:sz w:val="25"/>
-                <w:highlight w:val="yellow"/>
               </w:rPr>
             </w:r>
             <w:r>
@@ -10513,7 +10508,6 @@
                 <w:color w:val="000000"/>
                 <w:spacing w:val="36"/>
                 <w:sz w:val="25"/>
-                <w:highlight w:val="yellow"/>
               </w:rPr>
             </w:r>
             <w:r>
@@ -10521,7 +10515,6 @@
                 <w:b/>
                 <w:color w:val="000000"/>
                 <w:sz w:val="25"/>
-                <w:highlight w:val="yellow"/>
               </w:rPr>
             </w:r>
             <w:r>
@@ -10530,7 +10523,6 @@
                 <w:color w:val="000000"/>
                 <w:spacing w:val="20"/>
                 <w:sz w:val="25"/>
-                <w:highlight w:val="yellow"/>
               </w:rPr>
             </w:r>
             <w:r>
@@ -10539,7 +10531,6 @@
                 <w:color w:val="000000"/>
                 <w:spacing w:val="-2"/>
                 <w:sz w:val="25"/>
-                <w:highlight w:val="yellow"/>
               </w:rPr>
             </w:r>
           </w:p>

</xml_diff>

<commit_message>
chore: remove 7.5% discount note + approx-weight tables from template
These were leftover sample/boilerplate blocks that don't reflect any
dynamic data — the Note advertised a hardcoded 7.5% discount and the
two orange tables listed approx unit/6-system weights (6.5/5 Tonne,
etc.) for a specific scenario. Both showed on every generated offer
regardless of configuration.

The weight tables were inside an anchored <w:drawing> hosted by a
single body paragraph, so removing that paragraph takes the whole
drawing with it.

Co-Authored-By: Claude Opus 4.7 (1M context) <noreply@anthropic.com>
</commit_message>
<xml_diff>
--- a/Offer_Template.docx
+++ b/Offer_Template.docx
@@ -38097,2463 +38097,11 @@
     </w:p>
     <w:p>
       <w:pPr>
-        <w:spacing w:line="242" w:lineRule="auto" w:before="0"/>
-        <w:ind w:left="573" w:right="679" w:firstLine="0"/>
-        <w:jc w:val="left"/>
-        <w:rPr>
-          <w:sz w:val="22"/>
+        <w:pStyle w:val="BodyText"/>
+        <w:rPr>
+          <w:sz w:val="20"/>
         </w:rPr>
       </w:pPr>
-      <w:r>
-        <w:rPr>
-          <w:b/>
-          <w:color w:val="000000"/>
-          <w:sz w:val="22"/>
-          <w:highlight w:val="yellow"/>
-        </w:rPr>
-        <w:t>Note:</w:t>
-      </w:r>
-      <w:r>
-        <w:rPr>
-          <w:b/>
-          <w:color w:val="000000"/>
-          <w:spacing w:val="-14"/>
-          <w:sz w:val="22"/>
-          <w:highlight w:val="yellow"/>
-        </w:rPr>
-        <w:t> </w:t>
-      </w:r>
-      <w:r>
-        <w:rPr>
-          <w:color w:val="000000"/>
-          <w:sz w:val="22"/>
-          <w:highlight w:val="yellow"/>
-        </w:rPr>
-        <w:t>Based</w:t>
-      </w:r>
-      <w:r>
-        <w:rPr>
-          <w:color w:val="000000"/>
-          <w:spacing w:val="-18"/>
-          <w:sz w:val="22"/>
-          <w:highlight w:val="yellow"/>
-        </w:rPr>
-        <w:t> </w:t>
-      </w:r>
-      <w:r>
-        <w:rPr>
-          <w:color w:val="000000"/>
-          <w:sz w:val="22"/>
-          <w:highlight w:val="yellow"/>
-        </w:rPr>
-        <w:t>on</w:t>
-      </w:r>
-      <w:r>
-        <w:rPr>
-          <w:color w:val="000000"/>
-          <w:spacing w:val="-18"/>
-          <w:sz w:val="22"/>
-          <w:highlight w:val="yellow"/>
-        </w:rPr>
-        <w:t> </w:t>
-      </w:r>
-      <w:r>
-        <w:rPr>
-          <w:color w:val="000000"/>
-          <w:sz w:val="22"/>
-          <w:highlight w:val="yellow"/>
-        </w:rPr>
-        <w:t>the</w:t>
-      </w:r>
-      <w:r>
-        <w:rPr>
-          <w:color w:val="000000"/>
-          <w:spacing w:val="-10"/>
-          <w:sz w:val="22"/>
-          <w:highlight w:val="yellow"/>
-        </w:rPr>
-        <w:t> </w:t>
-      </w:r>
-      <w:r>
-        <w:rPr>
-          <w:color w:val="000000"/>
-          <w:sz w:val="22"/>
-          <w:highlight w:val="yellow"/>
-        </w:rPr>
-        <w:t>final</w:t>
-      </w:r>
-      <w:r>
-        <w:rPr>
-          <w:color w:val="000000"/>
-          <w:spacing w:val="14"/>
-          <w:sz w:val="22"/>
-          <w:highlight w:val="yellow"/>
-        </w:rPr>
-        <w:t> </w:t>
-      </w:r>
-      <w:r>
-        <w:rPr>
-          <w:color w:val="000000"/>
-          <w:sz w:val="22"/>
-          <w:highlight w:val="yellow"/>
-        </w:rPr>
-        <w:t>negotiation,</w:t>
-      </w:r>
-      <w:r>
-        <w:rPr>
-          <w:color w:val="000000"/>
-          <w:spacing w:val="35"/>
-          <w:sz w:val="22"/>
-          <w:highlight w:val="yellow"/>
-        </w:rPr>
-        <w:t> </w:t>
-      </w:r>
-      <w:r>
-        <w:rPr>
-          <w:color w:val="000000"/>
-          <w:sz w:val="22"/>
-          <w:highlight w:val="yellow"/>
-        </w:rPr>
-        <w:t>we</w:t>
-      </w:r>
-      <w:r>
-        <w:rPr>
-          <w:color w:val="000000"/>
-          <w:spacing w:val="-8"/>
-          <w:sz w:val="22"/>
-          <w:highlight w:val="yellow"/>
-        </w:rPr>
-        <w:t> </w:t>
-      </w:r>
-      <w:r>
-        <w:rPr>
-          <w:color w:val="000000"/>
-          <w:sz w:val="22"/>
-          <w:highlight w:val="yellow"/>
-        </w:rPr>
-        <w:t>are</w:t>
-      </w:r>
-      <w:r>
-        <w:rPr>
-          <w:color w:val="000000"/>
-          <w:spacing w:val="-8"/>
-          <w:sz w:val="22"/>
-          <w:highlight w:val="yellow"/>
-        </w:rPr>
-        <w:t> </w:t>
-      </w:r>
-      <w:r>
-        <w:rPr>
-          <w:color w:val="000000"/>
-          <w:sz w:val="22"/>
-          <w:highlight w:val="yellow"/>
-        </w:rPr>
-        <w:t>pleased</w:t>
-      </w:r>
-      <w:r>
-        <w:rPr>
-          <w:color w:val="000000"/>
-          <w:spacing w:val="-18"/>
-          <w:sz w:val="22"/>
-          <w:highlight w:val="yellow"/>
-        </w:rPr>
-        <w:t> </w:t>
-      </w:r>
-      <w:r>
-        <w:rPr>
-          <w:color w:val="000000"/>
-          <w:sz w:val="22"/>
-          <w:highlight w:val="yellow"/>
-        </w:rPr>
-        <w:t>to</w:t>
-      </w:r>
-      <w:r>
-        <w:rPr>
-          <w:color w:val="000000"/>
-          <w:spacing w:val="-5"/>
-          <w:sz w:val="22"/>
-          <w:highlight w:val="yellow"/>
-        </w:rPr>
-        <w:t> </w:t>
-      </w:r>
-      <w:r>
-        <w:rPr>
-          <w:color w:val="000000"/>
-          <w:sz w:val="22"/>
-          <w:highlight w:val="yellow"/>
-        </w:rPr>
-        <w:t>offer an</w:t>
-      </w:r>
-      <w:r>
-        <w:rPr>
-          <w:color w:val="000000"/>
-          <w:spacing w:val="-18"/>
-          <w:sz w:val="22"/>
-          <w:highlight w:val="yellow"/>
-        </w:rPr>
-        <w:t> </w:t>
-      </w:r>
-      <w:r>
-        <w:rPr>
-          <w:color w:val="000000"/>
-          <w:sz w:val="22"/>
-          <w:highlight w:val="yellow"/>
-        </w:rPr>
-        <w:t>additional</w:t>
-      </w:r>
-      <w:r>
-        <w:rPr>
-          <w:color w:val="000000"/>
-          <w:spacing w:val="39"/>
-          <w:sz w:val="22"/>
-          <w:highlight w:val="yellow"/>
-        </w:rPr>
-        <w:t> </w:t>
-      </w:r>
-      <w:r>
-        <w:rPr>
-          <w:b/>
-          <w:color w:val="000000"/>
-          <w:sz w:val="22"/>
-          <w:highlight w:val="yellow"/>
-        </w:rPr>
-        <w:t>7.5%</w:t>
-      </w:r>
-      <w:r>
-        <w:rPr>
-          <w:b/>
-          <w:color w:val="000000"/>
-          <w:spacing w:val="-12"/>
-          <w:sz w:val="22"/>
-          <w:highlight w:val="yellow"/>
-        </w:rPr>
-        <w:t> </w:t>
-      </w:r>
-      <w:r>
-        <w:rPr>
-          <w:b/>
-          <w:color w:val="000000"/>
-          <w:sz w:val="22"/>
-          <w:highlight w:val="yellow"/>
-        </w:rPr>
-        <w:t>discount</w:t>
-      </w:r>
-      <w:r>
-        <w:rPr>
-          <w:color w:val="000000"/>
-          <w:sz w:val="22"/>
-          <w:highlight w:val="yellow"/>
-        </w:rPr>
-        <w:t>,</w:t>
-      </w:r>
-      <w:r>
-        <w:rPr>
-          <w:color w:val="000000"/>
-          <w:spacing w:val="-22"/>
-          <w:sz w:val="22"/>
-          <w:highlight w:val="yellow"/>
-        </w:rPr>
-        <w:t> </w:t>
-      </w:r>
-      <w:r>
-        <w:rPr>
-          <w:color w:val="000000"/>
-          <w:sz w:val="22"/>
-          <w:highlight w:val="yellow"/>
-        </w:rPr>
-        <w:t>bringing</w:t>
-      </w:r>
-      <w:r>
-        <w:rPr>
-          <w:color w:val="000000"/>
-          <w:spacing w:val="24"/>
-          <w:sz w:val="22"/>
-          <w:highlight w:val="yellow"/>
-        </w:rPr>
-        <w:t> </w:t>
-      </w:r>
-      <w:r>
-        <w:rPr>
-          <w:color w:val="000000"/>
-          <w:sz w:val="22"/>
-          <w:highlight w:val="yellow"/>
-        </w:rPr>
-        <w:t>the</w:t>
-      </w:r>
-      <w:r>
-        <w:rPr>
-          <w:color w:val="000000"/>
-          <w:spacing w:val="-8"/>
-          <w:sz w:val="22"/>
-          <w:highlight w:val="yellow"/>
-        </w:rPr>
-        <w:t> </w:t>
-      </w:r>
-      <w:r>
-        <w:rPr>
-          <w:color w:val="000000"/>
-          <w:sz w:val="22"/>
-          <w:highlight w:val="yellow"/>
-        </w:rPr>
-        <w:t>final</w:t>
-      </w:r>
-      <w:r>
-        <w:rPr>
-          <w:color w:val="000000"/>
-          <w:spacing w:val="14"/>
-          <w:sz w:val="22"/>
-          <w:highlight w:val="yellow"/>
-        </w:rPr>
-        <w:t> </w:t>
-      </w:r>
-      <w:r>
-        <w:rPr>
-          <w:color w:val="000000"/>
-          <w:sz w:val="22"/>
-          <w:highlight w:val="yellow"/>
-        </w:rPr>
-        <w:t>price </w:t>
-      </w:r>
-      <w:r>
-        <w:rPr>
-          <w:color w:val="000000"/>
-          <w:sz w:val="22"/>
-        </w:rPr>
-        <w:t> </w:t>
-      </w:r>
-      <w:r>
-        <w:rPr>
-          <w:color w:val="000000"/>
-          <w:sz w:val="22"/>
-          <w:highlight w:val="yellow"/>
-        </w:rPr>
-        <w:t>for the product</w:t>
-      </w:r>
-    </w:p>
-    <w:p>
-      <w:pPr>
-        <w:pStyle w:val="BodyText"/>
-        <w:rPr>
-          <w:sz w:val="20"/>
-        </w:rPr>
-      </w:pPr>
-    </w:p>
-    <w:p>
-      <w:pPr>
-        <w:pStyle w:val="BodyText"/>
-        <w:spacing w:before="66"/>
-        <w:rPr>
-          <w:sz w:val="20"/>
-        </w:rPr>
-      </w:pPr>
-      <w:r>
-        <w:rPr>
-          <w:sz w:val="20"/>
-        </w:rPr>
-        <mc:AlternateContent>
-          <mc:Choice Requires="wps">
-            <w:drawing>
-              <wp:anchor distT="0" distB="0" distL="0" distR="0" allowOverlap="1" layoutInCell="1" locked="0" behindDoc="1" simplePos="0" relativeHeight="487587840">
-                <wp:simplePos x="0" y="0"/>
-                <wp:positionH relativeFrom="page">
-                  <wp:posOffset>534034</wp:posOffset>
-                </wp:positionH>
-                <wp:positionV relativeFrom="paragraph">
-                  <wp:posOffset>212712</wp:posOffset>
-                </wp:positionV>
-                <wp:extent cx="3309620" cy="781685"/>
-                <wp:effectExtent l="0" t="0" r="0" b="0"/>
-                <wp:wrapTopAndBottom/>
-                <wp:docPr id="62" name="Textbox 62"/>
-                <wp:cNvGraphicFramePr>
-                  <a:graphicFrameLocks/>
-                </wp:cNvGraphicFramePr>
-                <a:graphic>
-                  <a:graphicData uri="http://schemas.microsoft.com/office/word/2010/wordprocessingShape">
-                    <wps:wsp>
-                      <wps:cNvPr id="62" name="Textbox 62"/>
-                      <wps:cNvSpPr txBox="1"/>
-                      <wps:spPr>
-                        <a:xfrm>
-                          <a:off x="0" y="0"/>
-                          <a:ext cx="3309620" cy="781685"/>
-                        </a:xfrm>
-                        <a:prstGeom prst="rect">
-                          <a:avLst/>
-                        </a:prstGeom>
-                      </wps:spPr>
-                      <wps:txbx>
-                        <w:txbxContent>
-                          <w:tbl>
-                            <w:tblPr>
-                              <w:tblW w:w="0" w:type="auto"/>
-                              <w:jc w:val="left"/>
-                              <w:tblInd w:w="7" w:type="dxa"/>
-                              <w:tblBorders>
-                                <w:top w:val="single" w:sz="6" w:space="0" w:color="000000"/>
-                                <w:left w:val="single" w:sz="6" w:space="0" w:color="000000"/>
-                                <w:bottom w:val="single" w:sz="6" w:space="0" w:color="000000"/>
-                                <w:right w:val="single" w:sz="6" w:space="0" w:color="000000"/>
-                                <w:insideH w:val="single" w:sz="6" w:space="0" w:color="000000"/>
-                                <w:insideV w:val="single" w:sz="6" w:space="0" w:color="000000"/>
-                              </w:tblBorders>
-                              <w:tblLayout w:type="fixed"/>
-                              <w:tblCellMar>
-                                <w:top w:w="0" w:type="dxa"/>
-                                <w:left w:w="0" w:type="dxa"/>
-                                <w:bottom w:w="0" w:type="dxa"/>
-                                <w:right w:w="0" w:type="dxa"/>
-                              </w:tblCellMar>
-                              <w:tblLook w:val="01E0"/>
-                            </w:tblPr>
-                            <w:tblGrid>
-                              <w:gridCol w:w="3845"/>
-                              <w:gridCol w:w="526"/>
-                              <w:gridCol w:w="826"/>
-                            </w:tblGrid>
-                            <w:tr>
-                              <w:trPr>
-                                <w:trHeight w:val="585" w:hRule="atLeast"/>
-                              </w:trPr>
-                              <w:tc>
-                                <w:tcPr>
-                                  <w:tcW w:w="3845" w:type="dxa"/>
-                                  <w:shd w:val="clear" w:color="auto" w:fill="FFC000"/>
-                                </w:tcPr>
-                                <w:p>
-                                  <w:pPr>
-                                    <w:pStyle w:val="TableParagraph"/>
-                                    <w:spacing w:line="242" w:lineRule="auto" w:before="33"/>
-                                    <w:ind w:left="113"/>
-                                    <w:rPr>
-                                      <w:rFonts w:ascii="Arial"/>
-                                      <w:b/>
-                                      <w:sz w:val="22"/>
-                                    </w:rPr>
-                                  </w:pPr>
-                                  <w:r>
-                                    <w:rPr>
-                                      <w:rFonts w:ascii="Arial"/>
-                                      <w:b/>
-                                      <w:sz w:val="22"/>
-                                    </w:rPr>
-                                    <w:t>Approx.</w:t>
-                                  </w:r>
-                                  <w:r>
-                                    <w:rPr>
-                                      <w:rFonts w:ascii="Arial"/>
-                                      <w:b/>
-                                      <w:spacing w:val="3"/>
-                                      <w:sz w:val="22"/>
-                                    </w:rPr>
-                                    <w:t> </w:t>
-                                  </w:r>
-                                  <w:r>
-                                    <w:rPr>
-                                      <w:rFonts w:ascii="Arial"/>
-                                      <w:b/>
-                                      <w:sz w:val="22"/>
-                                    </w:rPr>
-                                    <w:t>Weight</w:t>
-                                  </w:r>
-                                  <w:r>
-                                    <w:rPr>
-                                      <w:rFonts w:ascii="Arial"/>
-                                      <w:b/>
-                                      <w:spacing w:val="-17"/>
-                                      <w:sz w:val="22"/>
-                                    </w:rPr>
-                                    <w:t> </w:t>
-                                  </w:r>
-                                  <w:r>
-                                    <w:rPr>
-                                      <w:rFonts w:ascii="Arial"/>
-                                      <w:b/>
-                                      <w:sz w:val="22"/>
-                                    </w:rPr>
-                                    <w:t>of</w:t>
-                                  </w:r>
-                                  <w:r>
-                                    <w:rPr>
-                                      <w:rFonts w:ascii="Arial"/>
-                                      <w:b/>
-                                      <w:spacing w:val="-10"/>
-                                      <w:sz w:val="22"/>
-                                    </w:rPr>
-                                    <w:t> </w:t>
-                                  </w:r>
-                                  <w:r>
-                                    <w:rPr>
-                                      <w:rFonts w:ascii="Arial"/>
-                                      <w:b/>
-                                      <w:sz w:val="22"/>
-                                    </w:rPr>
-                                    <w:t>the</w:t>
-                                  </w:r>
-                                  <w:r>
-                                    <w:rPr>
-                                      <w:rFonts w:ascii="Arial"/>
-                                      <w:b/>
-                                      <w:spacing w:val="-1"/>
-                                      <w:sz w:val="22"/>
-                                    </w:rPr>
-                                    <w:t> </w:t>
-                                  </w:r>
-                                  <w:r>
-                                    <w:rPr>
-                                      <w:rFonts w:ascii="Arial"/>
-                                      <w:b/>
-                                      <w:sz w:val="22"/>
-                                    </w:rPr>
-                                    <w:t>unit</w:t>
-                                  </w:r>
-                                  <w:r>
-                                    <w:rPr>
-                                      <w:rFonts w:ascii="Arial"/>
-                                      <w:b/>
-                                      <w:spacing w:val="-17"/>
-                                      <w:sz w:val="22"/>
-                                    </w:rPr>
-                                    <w:t> </w:t>
-                                  </w:r>
-                                  <w:r>
-                                    <w:rPr>
-                                      <w:rFonts w:ascii="Arial"/>
-                                      <w:b/>
-                                      <w:sz w:val="22"/>
-                                    </w:rPr>
-                                    <w:t>System Vertical Ladle Preheater/Dryer</w:t>
-                                  </w:r>
-                                </w:p>
-                              </w:tc>
-                              <w:tc>
-                                <w:tcPr>
-                                  <w:tcW w:w="526" w:type="dxa"/>
-                                  <w:tcBorders>
-                                    <w:right w:val="single" w:sz="8" w:space="0" w:color="000000"/>
-                                  </w:tcBorders>
-                                  <w:shd w:val="clear" w:color="auto" w:fill="FFC000"/>
-                                </w:tcPr>
-                                <w:p>
-                                  <w:pPr>
-                                    <w:pStyle w:val="TableParagraph"/>
-                                    <w:spacing w:before="181"/>
-                                    <w:ind w:left="0" w:right="75"/>
-                                    <w:jc w:val="right"/>
-                                    <w:rPr>
-                                      <w:rFonts w:ascii="Arial"/>
-                                      <w:b/>
-                                      <w:sz w:val="19"/>
-                                    </w:rPr>
-                                  </w:pPr>
-                                  <w:r>
-                                    <w:rPr>
-                                      <w:rFonts w:ascii="Arial"/>
-                                      <w:b/>
-                                      <w:spacing w:val="-5"/>
-                                      <w:sz w:val="19"/>
-                                    </w:rPr>
-                                    <w:t>6.5</w:t>
-                                  </w:r>
-                                </w:p>
-                              </w:tc>
-                              <w:tc>
-                                <w:tcPr>
-                                  <w:tcW w:w="826" w:type="dxa"/>
-                                  <w:tcBorders>
-                                    <w:left w:val="single" w:sz="8" w:space="0" w:color="000000"/>
-                                  </w:tcBorders>
-                                  <w:shd w:val="clear" w:color="auto" w:fill="FFC000"/>
-                                </w:tcPr>
-                                <w:p>
-                                  <w:pPr>
-                                    <w:pStyle w:val="TableParagraph"/>
-                                    <w:spacing w:before="181"/>
-                                    <w:ind w:left="110"/>
-                                    <w:rPr>
-                                      <w:rFonts w:ascii="Arial"/>
-                                      <w:b/>
-                                      <w:sz w:val="19"/>
-                                    </w:rPr>
-                                  </w:pPr>
-                                  <w:r>
-                                    <w:rPr>
-                                      <w:rFonts w:ascii="Arial"/>
-                                      <w:b/>
-                                      <w:spacing w:val="-2"/>
-                                      <w:sz w:val="19"/>
-                                    </w:rPr>
-                                    <w:t>Tonne</w:t>
-                                  </w:r>
-                                </w:p>
-                              </w:tc>
-                            </w:tr>
-                            <w:tr>
-                              <w:trPr>
-                                <w:trHeight w:val="300" w:hRule="atLeast"/>
-                              </w:trPr>
-                              <w:tc>
-                                <w:tcPr>
-                                  <w:tcW w:w="3845" w:type="dxa"/>
-                                  <w:shd w:val="clear" w:color="auto" w:fill="FFC000"/>
-                                </w:tcPr>
-                                <w:p>
-                                  <w:pPr>
-                                    <w:pStyle w:val="TableParagraph"/>
-                                    <w:spacing w:before="19"/>
-                                    <w:ind w:left="113"/>
-                                    <w:rPr>
-                                      <w:rFonts w:ascii="Arial"/>
-                                      <w:b/>
-                                      <w:sz w:val="22"/>
-                                    </w:rPr>
-                                  </w:pPr>
-                                  <w:r>
-                                    <w:rPr>
-                                      <w:rFonts w:ascii="Arial"/>
-                                      <w:b/>
-                                      <w:sz w:val="22"/>
-                                    </w:rPr>
-                                    <w:t>No.</w:t>
-                                  </w:r>
-                                  <w:r>
-                                    <w:rPr>
-                                      <w:rFonts w:ascii="Arial"/>
-                                      <w:b/>
-                                      <w:spacing w:val="-1"/>
-                                      <w:sz w:val="22"/>
-                                    </w:rPr>
-                                    <w:t> </w:t>
-                                  </w:r>
-                                  <w:r>
-                                    <w:rPr>
-                                      <w:rFonts w:ascii="Arial"/>
-                                      <w:b/>
-                                      <w:sz w:val="22"/>
-                                    </w:rPr>
-                                    <w:t>of</w:t>
-                                  </w:r>
-                                  <w:r>
-                                    <w:rPr>
-                                      <w:rFonts w:ascii="Arial"/>
-                                      <w:b/>
-                                      <w:spacing w:val="2"/>
-                                      <w:sz w:val="22"/>
-                                    </w:rPr>
-                                    <w:t> </w:t>
-                                  </w:r>
-                                  <w:r>
-                                    <w:rPr>
-                                      <w:rFonts w:ascii="Arial"/>
-                                      <w:b/>
-                                      <w:spacing w:val="-2"/>
-                                      <w:sz w:val="22"/>
-                                    </w:rPr>
-                                    <w:t>System</w:t>
-                                  </w:r>
-                                </w:p>
-                              </w:tc>
-                              <w:tc>
-                                <w:tcPr>
-                                  <w:tcW w:w="526" w:type="dxa"/>
-                                  <w:tcBorders>
-                                    <w:right w:val="single" w:sz="8" w:space="0" w:color="000000"/>
-                                  </w:tcBorders>
-                                  <w:shd w:val="clear" w:color="auto" w:fill="FFC000"/>
-                                </w:tcPr>
-                                <w:p>
-                                  <w:pPr>
-                                    <w:pStyle w:val="TableParagraph"/>
-                                    <w:spacing w:before="32"/>
-                                    <w:ind w:left="0" w:right="74"/>
-                                    <w:jc w:val="right"/>
-                                    <w:rPr>
-                                      <w:rFonts w:ascii="Arial"/>
-                                      <w:b/>
-                                      <w:sz w:val="19"/>
-                                    </w:rPr>
-                                  </w:pPr>
-                                  <w:r>
-                                    <w:rPr>
-                                      <w:rFonts w:ascii="Arial"/>
-                                      <w:b/>
-                                      <w:spacing w:val="-10"/>
-                                      <w:sz w:val="19"/>
-                                    </w:rPr>
-                                    <w:t>8</w:t>
-                                  </w:r>
-                                </w:p>
-                              </w:tc>
-                              <w:tc>
-                                <w:tcPr>
-                                  <w:tcW w:w="826" w:type="dxa"/>
-                                  <w:tcBorders>
-                                    <w:left w:val="single" w:sz="8" w:space="0" w:color="000000"/>
-                                  </w:tcBorders>
-                                  <w:shd w:val="clear" w:color="auto" w:fill="FFC000"/>
-                                </w:tcPr>
-                                <w:p>
-                                  <w:pPr>
-                                    <w:pStyle w:val="TableParagraph"/>
-                                    <w:spacing w:before="32"/>
-                                    <w:ind w:left="110"/>
-                                    <w:rPr>
-                                      <w:rFonts w:ascii="Arial"/>
-                                      <w:b/>
-                                      <w:sz w:val="19"/>
-                                    </w:rPr>
-                                  </w:pPr>
-                                  <w:r>
-                                    <w:rPr>
-                                      <w:rFonts w:ascii="Arial"/>
-                                      <w:b/>
-                                      <w:spacing w:val="-5"/>
-                                      <w:sz w:val="19"/>
-                                    </w:rPr>
-                                    <w:t>Nos</w:t>
-                                  </w:r>
-                                </w:p>
-                              </w:tc>
-                            </w:tr>
-                            <w:tr>
-                              <w:trPr>
-                                <w:trHeight w:val="285" w:hRule="atLeast"/>
-                              </w:trPr>
-                              <w:tc>
-                                <w:tcPr>
-                                  <w:tcW w:w="3845" w:type="dxa"/>
-                                  <w:shd w:val="clear" w:color="auto" w:fill="FFFF00"/>
-                                </w:tcPr>
-                                <w:p>
-                                  <w:pPr>
-                                    <w:pStyle w:val="TableParagraph"/>
-                                    <w:spacing w:line="246" w:lineRule="exact" w:before="19"/>
-                                    <w:ind w:left="113"/>
-                                    <w:rPr>
-                                      <w:rFonts w:ascii="Arial"/>
-                                      <w:b/>
-                                      <w:sz w:val="22"/>
-                                    </w:rPr>
-                                  </w:pPr>
-                                  <w:r>
-                                    <w:rPr>
-                                      <w:rFonts w:ascii="Arial"/>
-                                      <w:b/>
-                                      <w:sz w:val="22"/>
-                                    </w:rPr>
-                                    <w:t>Approx.</w:t>
-                                  </w:r>
-                                  <w:r>
-                                    <w:rPr>
-                                      <w:rFonts w:ascii="Arial"/>
-                                      <w:b/>
-                                      <w:spacing w:val="17"/>
-                                      <w:sz w:val="22"/>
-                                    </w:rPr>
-                                    <w:t> </w:t>
-                                  </w:r>
-                                  <w:r>
-                                    <w:rPr>
-                                      <w:rFonts w:ascii="Arial"/>
-                                      <w:b/>
-                                      <w:sz w:val="22"/>
-                                    </w:rPr>
-                                    <w:t>Weight</w:t>
-                                  </w:r>
-                                  <w:r>
-                                    <w:rPr>
-                                      <w:rFonts w:ascii="Arial"/>
-                                      <w:b/>
-                                      <w:spacing w:val="-17"/>
-                                      <w:sz w:val="22"/>
-                                    </w:rPr>
-                                    <w:t> </w:t>
-                                  </w:r>
-                                  <w:r>
-                                    <w:rPr>
-                                      <w:rFonts w:ascii="Arial"/>
-                                      <w:b/>
-                                      <w:sz w:val="22"/>
-                                    </w:rPr>
-                                    <w:t>of</w:t>
-                                  </w:r>
-                                  <w:r>
-                                    <w:rPr>
-                                      <w:rFonts w:ascii="Arial"/>
-                                      <w:b/>
-                                      <w:spacing w:val="-5"/>
-                                      <w:sz w:val="22"/>
-                                    </w:rPr>
-                                    <w:t> </w:t>
-                                  </w:r>
-                                  <w:r>
-                                    <w:rPr>
-                                      <w:rFonts w:ascii="Arial"/>
-                                      <w:b/>
-                                      <w:sz w:val="22"/>
-                                    </w:rPr>
-                                    <w:t>the</w:t>
-                                  </w:r>
-                                  <w:r>
-                                    <w:rPr>
-                                      <w:rFonts w:ascii="Arial"/>
-                                      <w:b/>
-                                      <w:spacing w:val="3"/>
-                                      <w:sz w:val="22"/>
-                                    </w:rPr>
-                                    <w:t> </w:t>
-                                  </w:r>
-                                  <w:r>
-                                    <w:rPr>
-                                      <w:rFonts w:ascii="Arial"/>
-                                      <w:b/>
-                                      <w:sz w:val="22"/>
-                                    </w:rPr>
-                                    <w:t>6</w:t>
-                                  </w:r>
-                                  <w:r>
-                                    <w:rPr>
-                                      <w:rFonts w:ascii="Arial"/>
-                                      <w:b/>
-                                      <w:spacing w:val="-10"/>
-                                      <w:sz w:val="22"/>
-                                    </w:rPr>
-                                    <w:t> </w:t>
-                                  </w:r>
-                                  <w:r>
-                                    <w:rPr>
-                                      <w:rFonts w:ascii="Arial"/>
-                                      <w:b/>
-                                      <w:spacing w:val="-2"/>
-                                      <w:sz w:val="22"/>
-                                    </w:rPr>
-                                    <w:t>System</w:t>
-                                  </w:r>
-                                </w:p>
-                              </w:tc>
-                              <w:tc>
-                                <w:tcPr>
-                                  <w:tcW w:w="526" w:type="dxa"/>
-                                  <w:tcBorders>
-                                    <w:right w:val="single" w:sz="8" w:space="0" w:color="000000"/>
-                                  </w:tcBorders>
-                                  <w:shd w:val="clear" w:color="auto" w:fill="FFFF00"/>
-                                </w:tcPr>
-                                <w:p>
-                                  <w:pPr>
-                                    <w:pStyle w:val="TableParagraph"/>
-                                    <w:spacing w:before="32"/>
-                                    <w:ind w:left="0" w:right="78"/>
-                                    <w:jc w:val="right"/>
-                                    <w:rPr>
-                                      <w:rFonts w:ascii="Arial"/>
-                                      <w:b/>
-                                      <w:sz w:val="19"/>
-                                    </w:rPr>
-                                  </w:pPr>
-                                  <w:r>
-                                    <w:rPr>
-                                      <w:rFonts w:ascii="Arial"/>
-                                      <w:b/>
-                                      <w:spacing w:val="-5"/>
-                                      <w:sz w:val="19"/>
-                                    </w:rPr>
-                                    <w:t>52</w:t>
-                                  </w:r>
-                                </w:p>
-                              </w:tc>
-                              <w:tc>
-                                <w:tcPr>
-                                  <w:tcW w:w="826" w:type="dxa"/>
-                                  <w:tcBorders>
-                                    <w:left w:val="single" w:sz="8" w:space="0" w:color="000000"/>
-                                  </w:tcBorders>
-                                  <w:shd w:val="clear" w:color="auto" w:fill="FFFF00"/>
-                                </w:tcPr>
-                                <w:p>
-                                  <w:pPr>
-                                    <w:pStyle w:val="TableParagraph"/>
-                                    <w:spacing w:before="32"/>
-                                    <w:ind w:left="110"/>
-                                    <w:rPr>
-                                      <w:rFonts w:ascii="Arial"/>
-                                      <w:b/>
-                                      <w:sz w:val="19"/>
-                                    </w:rPr>
-                                  </w:pPr>
-                                  <w:r>
-                                    <w:rPr>
-                                      <w:rFonts w:ascii="Arial"/>
-                                      <w:b/>
-                                      <w:spacing w:val="-2"/>
-                                      <w:sz w:val="19"/>
-                                    </w:rPr>
-                                    <w:t>Tonne</w:t>
-                                  </w:r>
-                                </w:p>
-                              </w:tc>
-                            </w:tr>
-                          </w:tbl>
-                          <w:p>
-                            <w:pPr>
-                              <w:pStyle w:val="BodyText"/>
-                            </w:pPr>
-                          </w:p>
-                        </w:txbxContent>
-                      </wps:txbx>
-                      <wps:bodyPr wrap="square" lIns="0" tIns="0" rIns="0" bIns="0" rtlCol="0">
-                        <a:noAutofit/>
-                      </wps:bodyPr>
-                    </wps:wsp>
-                  </a:graphicData>
-                </a:graphic>
-              </wp:anchor>
-            </w:drawing>
-          </mc:Choice>
-          <mc:Fallback>
-            <w:pict>
-              <v:shape style="position:absolute;margin-left:42.049999pt;margin-top:16.749023pt;width:260.6pt;height:61.55pt;mso-position-horizontal-relative:page;mso-position-vertical-relative:paragraph;z-index:-15728640;mso-wrap-distance-left:0;mso-wrap-distance-right:0" type="#_x0000_t202" id="docshape36" filled="false" stroked="false">
-                <v:textbox inset="0,0,0,0">
-                  <w:txbxContent>
-                    <w:tbl>
-                      <w:tblPr>
-                        <w:tblW w:w="0" w:type="auto"/>
-                        <w:jc w:val="left"/>
-                        <w:tblInd w:w="7" w:type="dxa"/>
-                        <w:tblBorders>
-                          <w:top w:val="single" w:sz="6" w:space="0" w:color="000000"/>
-                          <w:left w:val="single" w:sz="6" w:space="0" w:color="000000"/>
-                          <w:bottom w:val="single" w:sz="6" w:space="0" w:color="000000"/>
-                          <w:right w:val="single" w:sz="6" w:space="0" w:color="000000"/>
-                          <w:insideH w:val="single" w:sz="6" w:space="0" w:color="000000"/>
-                          <w:insideV w:val="single" w:sz="6" w:space="0" w:color="000000"/>
-                        </w:tblBorders>
-                        <w:tblLayout w:type="fixed"/>
-                        <w:tblCellMar>
-                          <w:top w:w="0" w:type="dxa"/>
-                          <w:left w:w="0" w:type="dxa"/>
-                          <w:bottom w:w="0" w:type="dxa"/>
-                          <w:right w:w="0" w:type="dxa"/>
-                        </w:tblCellMar>
-                        <w:tblLook w:val="01E0"/>
-                      </w:tblPr>
-                      <w:tblGrid>
-                        <w:gridCol w:w="3845"/>
-                        <w:gridCol w:w="526"/>
-                        <w:gridCol w:w="826"/>
-                      </w:tblGrid>
-                      <w:tr>
-                        <w:trPr>
-                          <w:trHeight w:val="585" w:hRule="atLeast"/>
-                        </w:trPr>
-                        <w:tc>
-                          <w:tcPr>
-                            <w:tcW w:w="3845" w:type="dxa"/>
-                            <w:shd w:val="clear" w:color="auto" w:fill="FFC000"/>
-                          </w:tcPr>
-                          <w:p>
-                            <w:pPr>
-                              <w:pStyle w:val="TableParagraph"/>
-                              <w:spacing w:line="242" w:lineRule="auto" w:before="33"/>
-                              <w:ind w:left="113"/>
-                              <w:rPr>
-                                <w:rFonts w:ascii="Arial"/>
-                                <w:b/>
-                                <w:sz w:val="22"/>
-                              </w:rPr>
-                            </w:pPr>
-                            <w:r>
-                              <w:rPr>
-                                <w:rFonts w:ascii="Arial"/>
-                                <w:b/>
-                                <w:sz w:val="22"/>
-                              </w:rPr>
-                              <w:t>Approx.</w:t>
-                            </w:r>
-                            <w:r>
-                              <w:rPr>
-                                <w:rFonts w:ascii="Arial"/>
-                                <w:b/>
-                                <w:spacing w:val="3"/>
-                                <w:sz w:val="22"/>
-                              </w:rPr>
-                              <w:t> </w:t>
-                            </w:r>
-                            <w:r>
-                              <w:rPr>
-                                <w:rFonts w:ascii="Arial"/>
-                                <w:b/>
-                                <w:sz w:val="22"/>
-                              </w:rPr>
-                              <w:t>Weight</w:t>
-                            </w:r>
-                            <w:r>
-                              <w:rPr>
-                                <w:rFonts w:ascii="Arial"/>
-                                <w:b/>
-                                <w:spacing w:val="-17"/>
-                                <w:sz w:val="22"/>
-                              </w:rPr>
-                              <w:t> </w:t>
-                            </w:r>
-                            <w:r>
-                              <w:rPr>
-                                <w:rFonts w:ascii="Arial"/>
-                                <w:b/>
-                                <w:sz w:val="22"/>
-                              </w:rPr>
-                              <w:t>of</w:t>
-                            </w:r>
-                            <w:r>
-                              <w:rPr>
-                                <w:rFonts w:ascii="Arial"/>
-                                <w:b/>
-                                <w:spacing w:val="-10"/>
-                                <w:sz w:val="22"/>
-                              </w:rPr>
-                              <w:t> </w:t>
-                            </w:r>
-                            <w:r>
-                              <w:rPr>
-                                <w:rFonts w:ascii="Arial"/>
-                                <w:b/>
-                                <w:sz w:val="22"/>
-                              </w:rPr>
-                              <w:t>the</w:t>
-                            </w:r>
-                            <w:r>
-                              <w:rPr>
-                                <w:rFonts w:ascii="Arial"/>
-                                <w:b/>
-                                <w:spacing w:val="-1"/>
-                                <w:sz w:val="22"/>
-                              </w:rPr>
-                              <w:t> </w:t>
-                            </w:r>
-                            <w:r>
-                              <w:rPr>
-                                <w:rFonts w:ascii="Arial"/>
-                                <w:b/>
-                                <w:sz w:val="22"/>
-                              </w:rPr>
-                              <w:t>unit</w:t>
-                            </w:r>
-                            <w:r>
-                              <w:rPr>
-                                <w:rFonts w:ascii="Arial"/>
-                                <w:b/>
-                                <w:spacing w:val="-17"/>
-                                <w:sz w:val="22"/>
-                              </w:rPr>
-                              <w:t> </w:t>
-                            </w:r>
-                            <w:r>
-                              <w:rPr>
-                                <w:rFonts w:ascii="Arial"/>
-                                <w:b/>
-                                <w:sz w:val="22"/>
-                              </w:rPr>
-                              <w:t>System Vertical Ladle Preheater/Dryer</w:t>
-                            </w:r>
-                          </w:p>
-                        </w:tc>
-                        <w:tc>
-                          <w:tcPr>
-                            <w:tcW w:w="526" w:type="dxa"/>
-                            <w:tcBorders>
-                              <w:right w:val="single" w:sz="8" w:space="0" w:color="000000"/>
-                            </w:tcBorders>
-                            <w:shd w:val="clear" w:color="auto" w:fill="FFC000"/>
-                          </w:tcPr>
-                          <w:p>
-                            <w:pPr>
-                              <w:pStyle w:val="TableParagraph"/>
-                              <w:spacing w:before="181"/>
-                              <w:ind w:left="0" w:right="75"/>
-                              <w:jc w:val="right"/>
-                              <w:rPr>
-                                <w:rFonts w:ascii="Arial"/>
-                                <w:b/>
-                                <w:sz w:val="19"/>
-                              </w:rPr>
-                            </w:pPr>
-                            <w:r>
-                              <w:rPr>
-                                <w:rFonts w:ascii="Arial"/>
-                                <w:b/>
-                                <w:spacing w:val="-5"/>
-                                <w:sz w:val="19"/>
-                              </w:rPr>
-                              <w:t>6.5</w:t>
-                            </w:r>
-                          </w:p>
-                        </w:tc>
-                        <w:tc>
-                          <w:tcPr>
-                            <w:tcW w:w="826" w:type="dxa"/>
-                            <w:tcBorders>
-                              <w:left w:val="single" w:sz="8" w:space="0" w:color="000000"/>
-                            </w:tcBorders>
-                            <w:shd w:val="clear" w:color="auto" w:fill="FFC000"/>
-                          </w:tcPr>
-                          <w:p>
-                            <w:pPr>
-                              <w:pStyle w:val="TableParagraph"/>
-                              <w:spacing w:before="181"/>
-                              <w:ind w:left="110"/>
-                              <w:rPr>
-                                <w:rFonts w:ascii="Arial"/>
-                                <w:b/>
-                                <w:sz w:val="19"/>
-                              </w:rPr>
-                            </w:pPr>
-                            <w:r>
-                              <w:rPr>
-                                <w:rFonts w:ascii="Arial"/>
-                                <w:b/>
-                                <w:spacing w:val="-2"/>
-                                <w:sz w:val="19"/>
-                              </w:rPr>
-                              <w:t>Tonne</w:t>
-                            </w:r>
-                          </w:p>
-                        </w:tc>
-                      </w:tr>
-                      <w:tr>
-                        <w:trPr>
-                          <w:trHeight w:val="300" w:hRule="atLeast"/>
-                        </w:trPr>
-                        <w:tc>
-                          <w:tcPr>
-                            <w:tcW w:w="3845" w:type="dxa"/>
-                            <w:shd w:val="clear" w:color="auto" w:fill="FFC000"/>
-                          </w:tcPr>
-                          <w:p>
-                            <w:pPr>
-                              <w:pStyle w:val="TableParagraph"/>
-                              <w:spacing w:before="19"/>
-                              <w:ind w:left="113"/>
-                              <w:rPr>
-                                <w:rFonts w:ascii="Arial"/>
-                                <w:b/>
-                                <w:sz w:val="22"/>
-                              </w:rPr>
-                            </w:pPr>
-                            <w:r>
-                              <w:rPr>
-                                <w:rFonts w:ascii="Arial"/>
-                                <w:b/>
-                                <w:sz w:val="22"/>
-                              </w:rPr>
-                              <w:t>No.</w:t>
-                            </w:r>
-                            <w:r>
-                              <w:rPr>
-                                <w:rFonts w:ascii="Arial"/>
-                                <w:b/>
-                                <w:spacing w:val="-1"/>
-                                <w:sz w:val="22"/>
-                              </w:rPr>
-                              <w:t> </w:t>
-                            </w:r>
-                            <w:r>
-                              <w:rPr>
-                                <w:rFonts w:ascii="Arial"/>
-                                <w:b/>
-                                <w:sz w:val="22"/>
-                              </w:rPr>
-                              <w:t>of</w:t>
-                            </w:r>
-                            <w:r>
-                              <w:rPr>
-                                <w:rFonts w:ascii="Arial"/>
-                                <w:b/>
-                                <w:spacing w:val="2"/>
-                                <w:sz w:val="22"/>
-                              </w:rPr>
-                              <w:t> </w:t>
-                            </w:r>
-                            <w:r>
-                              <w:rPr>
-                                <w:rFonts w:ascii="Arial"/>
-                                <w:b/>
-                                <w:spacing w:val="-2"/>
-                                <w:sz w:val="22"/>
-                              </w:rPr>
-                              <w:t>System</w:t>
-                            </w:r>
-                          </w:p>
-                        </w:tc>
-                        <w:tc>
-                          <w:tcPr>
-                            <w:tcW w:w="526" w:type="dxa"/>
-                            <w:tcBorders>
-                              <w:right w:val="single" w:sz="8" w:space="0" w:color="000000"/>
-                            </w:tcBorders>
-                            <w:shd w:val="clear" w:color="auto" w:fill="FFC000"/>
-                          </w:tcPr>
-                          <w:p>
-                            <w:pPr>
-                              <w:pStyle w:val="TableParagraph"/>
-                              <w:spacing w:before="32"/>
-                              <w:ind w:left="0" w:right="74"/>
-                              <w:jc w:val="right"/>
-                              <w:rPr>
-                                <w:rFonts w:ascii="Arial"/>
-                                <w:b/>
-                                <w:sz w:val="19"/>
-                              </w:rPr>
-                            </w:pPr>
-                            <w:r>
-                              <w:rPr>
-                                <w:rFonts w:ascii="Arial"/>
-                                <w:b/>
-                                <w:spacing w:val="-10"/>
-                                <w:sz w:val="19"/>
-                              </w:rPr>
-                              <w:t>8</w:t>
-                            </w:r>
-                          </w:p>
-                        </w:tc>
-                        <w:tc>
-                          <w:tcPr>
-                            <w:tcW w:w="826" w:type="dxa"/>
-                            <w:tcBorders>
-                              <w:left w:val="single" w:sz="8" w:space="0" w:color="000000"/>
-                            </w:tcBorders>
-                            <w:shd w:val="clear" w:color="auto" w:fill="FFC000"/>
-                          </w:tcPr>
-                          <w:p>
-                            <w:pPr>
-                              <w:pStyle w:val="TableParagraph"/>
-                              <w:spacing w:before="32"/>
-                              <w:ind w:left="110"/>
-                              <w:rPr>
-                                <w:rFonts w:ascii="Arial"/>
-                                <w:b/>
-                                <w:sz w:val="19"/>
-                              </w:rPr>
-                            </w:pPr>
-                            <w:r>
-                              <w:rPr>
-                                <w:rFonts w:ascii="Arial"/>
-                                <w:b/>
-                                <w:spacing w:val="-5"/>
-                                <w:sz w:val="19"/>
-                              </w:rPr>
-                              <w:t>Nos</w:t>
-                            </w:r>
-                          </w:p>
-                        </w:tc>
-                      </w:tr>
-                      <w:tr>
-                        <w:trPr>
-                          <w:trHeight w:val="285" w:hRule="atLeast"/>
-                        </w:trPr>
-                        <w:tc>
-                          <w:tcPr>
-                            <w:tcW w:w="3845" w:type="dxa"/>
-                            <w:shd w:val="clear" w:color="auto" w:fill="FFFF00"/>
-                          </w:tcPr>
-                          <w:p>
-                            <w:pPr>
-                              <w:pStyle w:val="TableParagraph"/>
-                              <w:spacing w:line="246" w:lineRule="exact" w:before="19"/>
-                              <w:ind w:left="113"/>
-                              <w:rPr>
-                                <w:rFonts w:ascii="Arial"/>
-                                <w:b/>
-                                <w:sz w:val="22"/>
-                              </w:rPr>
-                            </w:pPr>
-                            <w:r>
-                              <w:rPr>
-                                <w:rFonts w:ascii="Arial"/>
-                                <w:b/>
-                                <w:sz w:val="22"/>
-                              </w:rPr>
-                              <w:t>Approx.</w:t>
-                            </w:r>
-                            <w:r>
-                              <w:rPr>
-                                <w:rFonts w:ascii="Arial"/>
-                                <w:b/>
-                                <w:spacing w:val="17"/>
-                                <w:sz w:val="22"/>
-                              </w:rPr>
-                              <w:t> </w:t>
-                            </w:r>
-                            <w:r>
-                              <w:rPr>
-                                <w:rFonts w:ascii="Arial"/>
-                                <w:b/>
-                                <w:sz w:val="22"/>
-                              </w:rPr>
-                              <w:t>Weight</w:t>
-                            </w:r>
-                            <w:r>
-                              <w:rPr>
-                                <w:rFonts w:ascii="Arial"/>
-                                <w:b/>
-                                <w:spacing w:val="-17"/>
-                                <w:sz w:val="22"/>
-                              </w:rPr>
-                              <w:t> </w:t>
-                            </w:r>
-                            <w:r>
-                              <w:rPr>
-                                <w:rFonts w:ascii="Arial"/>
-                                <w:b/>
-                                <w:sz w:val="22"/>
-                              </w:rPr>
-                              <w:t>of</w:t>
-                            </w:r>
-                            <w:r>
-                              <w:rPr>
-                                <w:rFonts w:ascii="Arial"/>
-                                <w:b/>
-                                <w:spacing w:val="-5"/>
-                                <w:sz w:val="22"/>
-                              </w:rPr>
-                              <w:t> </w:t>
-                            </w:r>
-                            <w:r>
-                              <w:rPr>
-                                <w:rFonts w:ascii="Arial"/>
-                                <w:b/>
-                                <w:sz w:val="22"/>
-                              </w:rPr>
-                              <w:t>the</w:t>
-                            </w:r>
-                            <w:r>
-                              <w:rPr>
-                                <w:rFonts w:ascii="Arial"/>
-                                <w:b/>
-                                <w:spacing w:val="3"/>
-                                <w:sz w:val="22"/>
-                              </w:rPr>
-                              <w:t> </w:t>
-                            </w:r>
-                            <w:r>
-                              <w:rPr>
-                                <w:rFonts w:ascii="Arial"/>
-                                <w:b/>
-                                <w:sz w:val="22"/>
-                              </w:rPr>
-                              <w:t>6</w:t>
-                            </w:r>
-                            <w:r>
-                              <w:rPr>
-                                <w:rFonts w:ascii="Arial"/>
-                                <w:b/>
-                                <w:spacing w:val="-10"/>
-                                <w:sz w:val="22"/>
-                              </w:rPr>
-                              <w:t> </w:t>
-                            </w:r>
-                            <w:r>
-                              <w:rPr>
-                                <w:rFonts w:ascii="Arial"/>
-                                <w:b/>
-                                <w:spacing w:val="-2"/>
-                                <w:sz w:val="22"/>
-                              </w:rPr>
-                              <w:t>System</w:t>
-                            </w:r>
-                          </w:p>
-                        </w:tc>
-                        <w:tc>
-                          <w:tcPr>
-                            <w:tcW w:w="526" w:type="dxa"/>
-                            <w:tcBorders>
-                              <w:right w:val="single" w:sz="8" w:space="0" w:color="000000"/>
-                            </w:tcBorders>
-                            <w:shd w:val="clear" w:color="auto" w:fill="FFFF00"/>
-                          </w:tcPr>
-                          <w:p>
-                            <w:pPr>
-                              <w:pStyle w:val="TableParagraph"/>
-                              <w:spacing w:before="32"/>
-                              <w:ind w:left="0" w:right="78"/>
-                              <w:jc w:val="right"/>
-                              <w:rPr>
-                                <w:rFonts w:ascii="Arial"/>
-                                <w:b/>
-                                <w:sz w:val="19"/>
-                              </w:rPr>
-                            </w:pPr>
-                            <w:r>
-                              <w:rPr>
-                                <w:rFonts w:ascii="Arial"/>
-                                <w:b/>
-                                <w:spacing w:val="-5"/>
-                                <w:sz w:val="19"/>
-                              </w:rPr>
-                              <w:t>52</w:t>
-                            </w:r>
-                          </w:p>
-                        </w:tc>
-                        <w:tc>
-                          <w:tcPr>
-                            <w:tcW w:w="826" w:type="dxa"/>
-                            <w:tcBorders>
-                              <w:left w:val="single" w:sz="8" w:space="0" w:color="000000"/>
-                            </w:tcBorders>
-                            <w:shd w:val="clear" w:color="auto" w:fill="FFFF00"/>
-                          </w:tcPr>
-                          <w:p>
-                            <w:pPr>
-                              <w:pStyle w:val="TableParagraph"/>
-                              <w:spacing w:before="32"/>
-                              <w:ind w:left="110"/>
-                              <w:rPr>
-                                <w:rFonts w:ascii="Arial"/>
-                                <w:b/>
-                                <w:sz w:val="19"/>
-                              </w:rPr>
-                            </w:pPr>
-                            <w:r>
-                              <w:rPr>
-                                <w:rFonts w:ascii="Arial"/>
-                                <w:b/>
-                                <w:spacing w:val="-2"/>
-                                <w:sz w:val="19"/>
-                              </w:rPr>
-                              <w:t>Tonne</w:t>
-                            </w:r>
-                          </w:p>
-                        </w:tc>
-                      </w:tr>
-                    </w:tbl>
-                    <w:p>
-                      <w:pPr>
-                        <w:pStyle w:val="BodyText"/>
-                      </w:pPr>
-                    </w:p>
-                  </w:txbxContent>
-                </v:textbox>
-                <w10:wrap type="topAndBottom"/>
-              </v:shape>
-            </w:pict>
-          </mc:Fallback>
-        </mc:AlternateContent>
-      </w:r>
-      <w:r>
-        <w:rPr>
-          <w:sz w:val="20"/>
-        </w:rPr>
-        <mc:AlternateContent>
-          <mc:Choice Requires="wps">
-            <w:drawing>
-              <wp:anchor distT="0" distB="0" distL="0" distR="0" allowOverlap="1" layoutInCell="1" locked="0" behindDoc="1" simplePos="0" relativeHeight="487587840">
-                <wp:simplePos x="0" y="0"/>
-                <wp:positionH relativeFrom="page">
-                  <wp:posOffset>4120260</wp:posOffset>
-                </wp:positionH>
-                <wp:positionV relativeFrom="paragraph">
-                  <wp:posOffset>203187</wp:posOffset>
-                </wp:positionV>
-                <wp:extent cx="3281045" cy="781685"/>
-                <wp:effectExtent l="0" t="0" r="0" b="0"/>
-                <wp:wrapTopAndBottom/>
-                <wp:docPr id="63" name="Textbox 63"/>
-                <wp:cNvGraphicFramePr>
-                  <a:graphicFrameLocks/>
-                </wp:cNvGraphicFramePr>
-                <a:graphic>
-                  <a:graphicData uri="http://schemas.microsoft.com/office/word/2010/wordprocessingShape">
-                    <wps:wsp>
-                      <wps:cNvPr id="63" name="Textbox 63"/>
-                      <wps:cNvSpPr txBox="1"/>
-                      <wps:spPr>
-                        <a:xfrm>
-                          <a:off x="0" y="0"/>
-                          <a:ext cx="3281045" cy="781685"/>
-                        </a:xfrm>
-                        <a:prstGeom prst="rect">
-                          <a:avLst/>
-                        </a:prstGeom>
-                      </wps:spPr>
-                      <wps:txbx>
-                        <w:txbxContent>
-                          <w:tbl>
-                            <w:tblPr>
-                              <w:tblW w:w="0" w:type="auto"/>
-                              <w:jc w:val="left"/>
-                              <w:tblInd w:w="7" w:type="dxa"/>
-                              <w:tblBorders>
-                                <w:top w:val="single" w:sz="6" w:space="0" w:color="000000"/>
-                                <w:left w:val="single" w:sz="6" w:space="0" w:color="000000"/>
-                                <w:bottom w:val="single" w:sz="6" w:space="0" w:color="000000"/>
-                                <w:right w:val="single" w:sz="6" w:space="0" w:color="000000"/>
-                                <w:insideH w:val="single" w:sz="6" w:space="0" w:color="000000"/>
-                                <w:insideV w:val="single" w:sz="6" w:space="0" w:color="000000"/>
-                              </w:tblBorders>
-                              <w:tblLayout w:type="fixed"/>
-                              <w:tblCellMar>
-                                <w:top w:w="0" w:type="dxa"/>
-                                <w:left w:w="0" w:type="dxa"/>
-                                <w:bottom w:w="0" w:type="dxa"/>
-                                <w:right w:w="0" w:type="dxa"/>
-                              </w:tblCellMar>
-                              <w:tblLook w:val="01E0"/>
-                            </w:tblPr>
-                            <w:tblGrid>
-                              <w:gridCol w:w="3890"/>
-                              <w:gridCol w:w="451"/>
-                              <w:gridCol w:w="811"/>
-                            </w:tblGrid>
-                            <w:tr>
-                              <w:trPr>
-                                <w:trHeight w:val="585" w:hRule="atLeast"/>
-                              </w:trPr>
-                              <w:tc>
-                                <w:tcPr>
-                                  <w:tcW w:w="3890" w:type="dxa"/>
-                                  <w:shd w:val="clear" w:color="auto" w:fill="FFC000"/>
-                                </w:tcPr>
-                                <w:p>
-                                  <w:pPr>
-                                    <w:pStyle w:val="TableParagraph"/>
-                                    <w:spacing w:line="242" w:lineRule="auto" w:before="33"/>
-                                    <w:rPr>
-                                      <w:rFonts w:ascii="Arial"/>
-                                      <w:b/>
-                                      <w:sz w:val="22"/>
-                                    </w:rPr>
-                                  </w:pPr>
-                                  <w:r>
-                                    <w:rPr>
-                                      <w:rFonts w:ascii="Arial"/>
-                                      <w:b/>
-                                      <w:sz w:val="22"/>
-                                    </w:rPr>
-                                    <w:t>Approx.</w:t>
-                                  </w:r>
-                                  <w:r>
-                                    <w:rPr>
-                                      <w:rFonts w:ascii="Arial"/>
-                                      <w:b/>
-                                      <w:spacing w:val="6"/>
-                                      <w:sz w:val="22"/>
-                                    </w:rPr>
-                                    <w:t> </w:t>
-                                  </w:r>
-                                  <w:r>
-                                    <w:rPr>
-                                      <w:rFonts w:ascii="Arial"/>
-                                      <w:b/>
-                                      <w:sz w:val="22"/>
-                                    </w:rPr>
-                                    <w:t>Weight</w:t>
-                                  </w:r>
-                                  <w:r>
-                                    <w:rPr>
-                                      <w:rFonts w:ascii="Arial"/>
-                                      <w:b/>
-                                      <w:spacing w:val="-17"/>
-                                      <w:sz w:val="22"/>
-                                    </w:rPr>
-                                    <w:t> </w:t>
-                                  </w:r>
-                                  <w:r>
-                                    <w:rPr>
-                                      <w:rFonts w:ascii="Arial"/>
-                                      <w:b/>
-                                      <w:sz w:val="22"/>
-                                    </w:rPr>
-                                    <w:t>of</w:t>
-                                  </w:r>
-                                  <w:r>
-                                    <w:rPr>
-                                      <w:rFonts w:ascii="Arial"/>
-                                      <w:b/>
-                                      <w:spacing w:val="-9"/>
-                                      <w:sz w:val="22"/>
-                                    </w:rPr>
-                                    <w:t> </w:t>
-                                  </w:r>
-                                  <w:r>
-                                    <w:rPr>
-                                      <w:rFonts w:ascii="Arial"/>
-                                      <w:b/>
-                                      <w:sz w:val="22"/>
-                                    </w:rPr>
-                                    <w:t>the Unit</w:t>
-                                  </w:r>
-                                  <w:r>
-                                    <w:rPr>
-                                      <w:rFonts w:ascii="Arial"/>
-                                      <w:b/>
-                                      <w:spacing w:val="-17"/>
-                                      <w:sz w:val="22"/>
-                                    </w:rPr>
-                                    <w:t> </w:t>
-                                  </w:r>
-                                  <w:r>
-                                    <w:rPr>
-                                      <w:rFonts w:ascii="Arial"/>
-                                      <w:b/>
-                                      <w:sz w:val="22"/>
-                                    </w:rPr>
-                                    <w:t>System Horizontal Ladle preheater</w:t>
-                                  </w:r>
-                                </w:p>
-                              </w:tc>
-                              <w:tc>
-                                <w:tcPr>
-                                  <w:tcW w:w="451" w:type="dxa"/>
-                                  <w:shd w:val="clear" w:color="auto" w:fill="FFC000"/>
-                                </w:tcPr>
-                                <w:p>
-                                  <w:pPr>
-                                    <w:pStyle w:val="TableParagraph"/>
-                                    <w:spacing w:before="181"/>
-                                    <w:ind w:left="0" w:right="77"/>
-                                    <w:jc w:val="right"/>
-                                    <w:rPr>
-                                      <w:rFonts w:ascii="Arial"/>
-                                      <w:b/>
-                                      <w:sz w:val="19"/>
-                                    </w:rPr>
-                                  </w:pPr>
-                                  <w:r>
-                                    <w:rPr>
-                                      <w:rFonts w:ascii="Arial"/>
-                                      <w:b/>
-                                      <w:spacing w:val="-10"/>
-                                      <w:sz w:val="19"/>
-                                    </w:rPr>
-                                    <w:t>5</w:t>
-                                  </w:r>
-                                </w:p>
-                              </w:tc>
-                              <w:tc>
-                                <w:tcPr>
-                                  <w:tcW w:w="811" w:type="dxa"/>
-                                  <w:shd w:val="clear" w:color="auto" w:fill="FFC000"/>
-                                </w:tcPr>
-                                <w:p>
-                                  <w:pPr>
-                                    <w:pStyle w:val="TableParagraph"/>
-                                    <w:spacing w:before="181"/>
-                                    <w:ind w:left="111"/>
-                                    <w:rPr>
-                                      <w:rFonts w:ascii="Arial"/>
-                                      <w:b/>
-                                      <w:sz w:val="19"/>
-                                    </w:rPr>
-                                  </w:pPr>
-                                  <w:r>
-                                    <w:rPr>
-                                      <w:rFonts w:ascii="Arial"/>
-                                      <w:b/>
-                                      <w:spacing w:val="-2"/>
-                                      <w:sz w:val="19"/>
-                                    </w:rPr>
-                                    <w:t>Tonne</w:t>
-                                  </w:r>
-                                </w:p>
-                              </w:tc>
-                            </w:tr>
-                            <w:tr>
-                              <w:trPr>
-                                <w:trHeight w:val="300" w:hRule="atLeast"/>
-                              </w:trPr>
-                              <w:tc>
-                                <w:tcPr>
-                                  <w:tcW w:w="3890" w:type="dxa"/>
-                                  <w:shd w:val="clear" w:color="auto" w:fill="FFC000"/>
-                                </w:tcPr>
-                                <w:p>
-                                  <w:pPr>
-                                    <w:pStyle w:val="TableParagraph"/>
-                                    <w:spacing w:before="19"/>
-                                    <w:rPr>
-                                      <w:rFonts w:ascii="Arial"/>
-                                      <w:b/>
-                                      <w:sz w:val="22"/>
-                                    </w:rPr>
-                                  </w:pPr>
-                                  <w:r>
-                                    <w:rPr>
-                                      <w:rFonts w:ascii="Arial"/>
-                                      <w:b/>
-                                      <w:sz w:val="22"/>
-                                    </w:rPr>
-                                    <w:t>No.</w:t>
-                                  </w:r>
-                                  <w:r>
-                                    <w:rPr>
-                                      <w:rFonts w:ascii="Arial"/>
-                                      <w:b/>
-                                      <w:spacing w:val="-1"/>
-                                      <w:sz w:val="22"/>
-                                    </w:rPr>
-                                    <w:t> </w:t>
-                                  </w:r>
-                                  <w:r>
-                                    <w:rPr>
-                                      <w:rFonts w:ascii="Arial"/>
-                                      <w:b/>
-                                      <w:sz w:val="22"/>
-                                    </w:rPr>
-                                    <w:t>of</w:t>
-                                  </w:r>
-                                  <w:r>
-                                    <w:rPr>
-                                      <w:rFonts w:ascii="Arial"/>
-                                      <w:b/>
-                                      <w:spacing w:val="4"/>
-                                      <w:sz w:val="22"/>
-                                    </w:rPr>
-                                    <w:t> </w:t>
-                                  </w:r>
-                                  <w:r>
-                                    <w:rPr>
-                                      <w:rFonts w:ascii="Arial"/>
-                                      <w:b/>
-                                      <w:spacing w:val="-2"/>
-                                      <w:sz w:val="22"/>
-                                    </w:rPr>
-                                    <w:t>System</w:t>
-                                  </w:r>
-                                </w:p>
-                              </w:tc>
-                              <w:tc>
-                                <w:tcPr>
-                                  <w:tcW w:w="451" w:type="dxa"/>
-                                  <w:shd w:val="clear" w:color="auto" w:fill="FFC000"/>
-                                </w:tcPr>
-                                <w:p>
-                                  <w:pPr>
-                                    <w:pStyle w:val="TableParagraph"/>
-                                    <w:spacing w:before="32"/>
-                                    <w:ind w:left="0" w:right="77"/>
-                                    <w:jc w:val="right"/>
-                                    <w:rPr>
-                                      <w:rFonts w:ascii="Arial"/>
-                                      <w:b/>
-                                      <w:sz w:val="19"/>
-                                    </w:rPr>
-                                  </w:pPr>
-                                  <w:r>
-                                    <w:rPr>
-                                      <w:rFonts w:ascii="Arial"/>
-                                      <w:b/>
-                                      <w:spacing w:val="-10"/>
-                                      <w:sz w:val="19"/>
-                                    </w:rPr>
-                                    <w:t>2</w:t>
-                                  </w:r>
-                                </w:p>
-                              </w:tc>
-                              <w:tc>
-                                <w:tcPr>
-                                  <w:tcW w:w="811" w:type="dxa"/>
-                                  <w:shd w:val="clear" w:color="auto" w:fill="FFC000"/>
-                                </w:tcPr>
-                                <w:p>
-                                  <w:pPr>
-                                    <w:pStyle w:val="TableParagraph"/>
-                                    <w:spacing w:before="32"/>
-                                    <w:ind w:left="111"/>
-                                    <w:rPr>
-                                      <w:rFonts w:ascii="Arial"/>
-                                      <w:b/>
-                                      <w:sz w:val="19"/>
-                                    </w:rPr>
-                                  </w:pPr>
-                                  <w:r>
-                                    <w:rPr>
-                                      <w:rFonts w:ascii="Arial"/>
-                                      <w:b/>
-                                      <w:spacing w:val="-5"/>
-                                      <w:sz w:val="19"/>
-                                    </w:rPr>
-                                    <w:t>Nos</w:t>
-                                  </w:r>
-                                </w:p>
-                              </w:tc>
-                            </w:tr>
-                            <w:tr>
-                              <w:trPr>
-                                <w:trHeight w:val="285" w:hRule="atLeast"/>
-                              </w:trPr>
-                              <w:tc>
-                                <w:tcPr>
-                                  <w:tcW w:w="3890" w:type="dxa"/>
-                                  <w:shd w:val="clear" w:color="auto" w:fill="FFFF00"/>
-                                </w:tcPr>
-                                <w:p>
-                                  <w:pPr>
-                                    <w:pStyle w:val="TableParagraph"/>
-                                    <w:spacing w:line="246" w:lineRule="exact" w:before="19"/>
-                                    <w:rPr>
-                                      <w:rFonts w:ascii="Arial"/>
-                                      <w:b/>
-                                      <w:sz w:val="22"/>
-                                    </w:rPr>
-                                  </w:pPr>
-                                  <w:r>
-                                    <w:rPr>
-                                      <w:rFonts w:ascii="Arial"/>
-                                      <w:b/>
-                                      <w:sz w:val="22"/>
-                                    </w:rPr>
-                                    <w:t>Approx.</w:t>
-                                  </w:r>
-                                  <w:r>
-                                    <w:rPr>
-                                      <w:rFonts w:ascii="Arial"/>
-                                      <w:b/>
-                                      <w:spacing w:val="17"/>
-                                      <w:sz w:val="22"/>
-                                    </w:rPr>
-                                    <w:t> </w:t>
-                                  </w:r>
-                                  <w:r>
-                                    <w:rPr>
-                                      <w:rFonts w:ascii="Arial"/>
-                                      <w:b/>
-                                      <w:sz w:val="22"/>
-                                    </w:rPr>
-                                    <w:t>Weight</w:t>
-                                  </w:r>
-                                  <w:r>
-                                    <w:rPr>
-                                      <w:rFonts w:ascii="Arial"/>
-                                      <w:b/>
-                                      <w:spacing w:val="-17"/>
-                                      <w:sz w:val="22"/>
-                                    </w:rPr>
-                                    <w:t> </w:t>
-                                  </w:r>
-                                  <w:r>
-                                    <w:rPr>
-                                      <w:rFonts w:ascii="Arial"/>
-                                      <w:b/>
-                                      <w:sz w:val="22"/>
-                                    </w:rPr>
-                                    <w:t>of</w:t>
-                                  </w:r>
-                                  <w:r>
-                                    <w:rPr>
-                                      <w:rFonts w:ascii="Arial"/>
-                                      <w:b/>
-                                      <w:spacing w:val="-5"/>
-                                      <w:sz w:val="22"/>
-                                    </w:rPr>
-                                    <w:t> </w:t>
-                                  </w:r>
-                                  <w:r>
-                                    <w:rPr>
-                                      <w:rFonts w:ascii="Arial"/>
-                                      <w:b/>
-                                      <w:sz w:val="22"/>
-                                    </w:rPr>
-                                    <w:t>the</w:t>
-                                  </w:r>
-                                  <w:r>
-                                    <w:rPr>
-                                      <w:rFonts w:ascii="Arial"/>
-                                      <w:b/>
-                                      <w:spacing w:val="3"/>
-                                      <w:sz w:val="22"/>
-                                    </w:rPr>
-                                    <w:t> </w:t>
-                                  </w:r>
-                                  <w:r>
-                                    <w:rPr>
-                                      <w:rFonts w:ascii="Arial"/>
-                                      <w:b/>
-                                      <w:sz w:val="22"/>
-                                    </w:rPr>
-                                    <w:t>6</w:t>
-                                  </w:r>
-                                  <w:r>
-                                    <w:rPr>
-                                      <w:rFonts w:ascii="Arial"/>
-                                      <w:b/>
-                                      <w:spacing w:val="-10"/>
-                                      <w:sz w:val="22"/>
-                                    </w:rPr>
-                                    <w:t> </w:t>
-                                  </w:r>
-                                  <w:r>
-                                    <w:rPr>
-                                      <w:rFonts w:ascii="Arial"/>
-                                      <w:b/>
-                                      <w:spacing w:val="-2"/>
-                                      <w:sz w:val="22"/>
-                                    </w:rPr>
-                                    <w:t>System</w:t>
-                                  </w:r>
-                                </w:p>
-                              </w:tc>
-                              <w:tc>
-                                <w:tcPr>
-                                  <w:tcW w:w="451" w:type="dxa"/>
-                                  <w:shd w:val="clear" w:color="auto" w:fill="FFFF00"/>
-                                </w:tcPr>
-                                <w:p>
-                                  <w:pPr>
-                                    <w:pStyle w:val="TableParagraph"/>
-                                    <w:spacing w:before="32"/>
-                                    <w:ind w:left="0" w:right="77"/>
-                                    <w:jc w:val="right"/>
-                                    <w:rPr>
-                                      <w:rFonts w:ascii="Arial"/>
-                                      <w:b/>
-                                      <w:sz w:val="19"/>
-                                    </w:rPr>
-                                  </w:pPr>
-                                  <w:r>
-                                    <w:rPr>
-                                      <w:rFonts w:ascii="Arial"/>
-                                      <w:b/>
-                                      <w:spacing w:val="-5"/>
-                                      <w:sz w:val="19"/>
-                                    </w:rPr>
-                                    <w:t>10</w:t>
-                                  </w:r>
-                                </w:p>
-                              </w:tc>
-                              <w:tc>
-                                <w:tcPr>
-                                  <w:tcW w:w="811" w:type="dxa"/>
-                                  <w:shd w:val="clear" w:color="auto" w:fill="FFFF00"/>
-                                </w:tcPr>
-                                <w:p>
-                                  <w:pPr>
-                                    <w:pStyle w:val="TableParagraph"/>
-                                    <w:spacing w:before="32"/>
-                                    <w:ind w:left="111"/>
-                                    <w:rPr>
-                                      <w:rFonts w:ascii="Arial"/>
-                                      <w:b/>
-                                      <w:sz w:val="19"/>
-                                    </w:rPr>
-                                  </w:pPr>
-                                  <w:r>
-                                    <w:rPr>
-                                      <w:rFonts w:ascii="Arial"/>
-                                      <w:b/>
-                                      <w:spacing w:val="-2"/>
-                                      <w:sz w:val="19"/>
-                                    </w:rPr>
-                                    <w:t>Tonne</w:t>
-                                  </w:r>
-                                </w:p>
-                              </w:tc>
-                            </w:tr>
-                          </w:tbl>
-                          <w:p>
-                            <w:pPr>
-                              <w:pStyle w:val="BodyText"/>
-                            </w:pPr>
-                          </w:p>
-                        </w:txbxContent>
-                      </wps:txbx>
-                      <wps:bodyPr wrap="square" lIns="0" tIns="0" rIns="0" bIns="0" rtlCol="0">
-                        <a:noAutofit/>
-                      </wps:bodyPr>
-                    </wps:wsp>
-                  </a:graphicData>
-                </a:graphic>
-              </wp:anchor>
-            </w:drawing>
-          </mc:Choice>
-          <mc:Fallback>
-            <w:pict>
-              <v:shape style="position:absolute;margin-left:324.429993pt;margin-top:15.999023pt;width:258.3500pt;height:61.55pt;mso-position-horizontal-relative:page;mso-position-vertical-relative:paragraph;z-index:-15728640;mso-wrap-distance-left:0;mso-wrap-distance-right:0" type="#_x0000_t202" id="docshape37" filled="false" stroked="false">
-                <v:textbox inset="0,0,0,0">
-                  <w:txbxContent>
-                    <w:tbl>
-                      <w:tblPr>
-                        <w:tblW w:w="0" w:type="auto"/>
-                        <w:jc w:val="left"/>
-                        <w:tblInd w:w="7" w:type="dxa"/>
-                        <w:tblBorders>
-                          <w:top w:val="single" w:sz="6" w:space="0" w:color="000000"/>
-                          <w:left w:val="single" w:sz="6" w:space="0" w:color="000000"/>
-                          <w:bottom w:val="single" w:sz="6" w:space="0" w:color="000000"/>
-                          <w:right w:val="single" w:sz="6" w:space="0" w:color="000000"/>
-                          <w:insideH w:val="single" w:sz="6" w:space="0" w:color="000000"/>
-                          <w:insideV w:val="single" w:sz="6" w:space="0" w:color="000000"/>
-                        </w:tblBorders>
-                        <w:tblLayout w:type="fixed"/>
-                        <w:tblCellMar>
-                          <w:top w:w="0" w:type="dxa"/>
-                          <w:left w:w="0" w:type="dxa"/>
-                          <w:bottom w:w="0" w:type="dxa"/>
-                          <w:right w:w="0" w:type="dxa"/>
-                        </w:tblCellMar>
-                        <w:tblLook w:val="01E0"/>
-                      </w:tblPr>
-                      <w:tblGrid>
-                        <w:gridCol w:w="3890"/>
-                        <w:gridCol w:w="451"/>
-                        <w:gridCol w:w="811"/>
-                      </w:tblGrid>
-                      <w:tr>
-                        <w:trPr>
-                          <w:trHeight w:val="585" w:hRule="atLeast"/>
-                        </w:trPr>
-                        <w:tc>
-                          <w:tcPr>
-                            <w:tcW w:w="3890" w:type="dxa"/>
-                            <w:shd w:val="clear" w:color="auto" w:fill="FFC000"/>
-                          </w:tcPr>
-                          <w:p>
-                            <w:pPr>
-                              <w:pStyle w:val="TableParagraph"/>
-                              <w:spacing w:line="242" w:lineRule="auto" w:before="33"/>
-                              <w:rPr>
-                                <w:rFonts w:ascii="Arial"/>
-                                <w:b/>
-                                <w:sz w:val="22"/>
-                              </w:rPr>
-                            </w:pPr>
-                            <w:r>
-                              <w:rPr>
-                                <w:rFonts w:ascii="Arial"/>
-                                <w:b/>
-                                <w:sz w:val="22"/>
-                              </w:rPr>
-                              <w:t>Approx.</w:t>
-                            </w:r>
-                            <w:r>
-                              <w:rPr>
-                                <w:rFonts w:ascii="Arial"/>
-                                <w:b/>
-                                <w:spacing w:val="6"/>
-                                <w:sz w:val="22"/>
-                              </w:rPr>
-                              <w:t> </w:t>
-                            </w:r>
-                            <w:r>
-                              <w:rPr>
-                                <w:rFonts w:ascii="Arial"/>
-                                <w:b/>
-                                <w:sz w:val="22"/>
-                              </w:rPr>
-                              <w:t>Weight</w:t>
-                            </w:r>
-                            <w:r>
-                              <w:rPr>
-                                <w:rFonts w:ascii="Arial"/>
-                                <w:b/>
-                                <w:spacing w:val="-17"/>
-                                <w:sz w:val="22"/>
-                              </w:rPr>
-                              <w:t> </w:t>
-                            </w:r>
-                            <w:r>
-                              <w:rPr>
-                                <w:rFonts w:ascii="Arial"/>
-                                <w:b/>
-                                <w:sz w:val="22"/>
-                              </w:rPr>
-                              <w:t>of</w:t>
-                            </w:r>
-                            <w:r>
-                              <w:rPr>
-                                <w:rFonts w:ascii="Arial"/>
-                                <w:b/>
-                                <w:spacing w:val="-9"/>
-                                <w:sz w:val="22"/>
-                              </w:rPr>
-                              <w:t> </w:t>
-                            </w:r>
-                            <w:r>
-                              <w:rPr>
-                                <w:rFonts w:ascii="Arial"/>
-                                <w:b/>
-                                <w:sz w:val="22"/>
-                              </w:rPr>
-                              <w:t>the Unit</w:t>
-                            </w:r>
-                            <w:r>
-                              <w:rPr>
-                                <w:rFonts w:ascii="Arial"/>
-                                <w:b/>
-                                <w:spacing w:val="-17"/>
-                                <w:sz w:val="22"/>
-                              </w:rPr>
-                              <w:t> </w:t>
-                            </w:r>
-                            <w:r>
-                              <w:rPr>
-                                <w:rFonts w:ascii="Arial"/>
-                                <w:b/>
-                                <w:sz w:val="22"/>
-                              </w:rPr>
-                              <w:t>System Horizontal Ladle preheater</w:t>
-                            </w:r>
-                          </w:p>
-                        </w:tc>
-                        <w:tc>
-                          <w:tcPr>
-                            <w:tcW w:w="451" w:type="dxa"/>
-                            <w:shd w:val="clear" w:color="auto" w:fill="FFC000"/>
-                          </w:tcPr>
-                          <w:p>
-                            <w:pPr>
-                              <w:pStyle w:val="TableParagraph"/>
-                              <w:spacing w:before="181"/>
-                              <w:ind w:left="0" w:right="77"/>
-                              <w:jc w:val="right"/>
-                              <w:rPr>
-                                <w:rFonts w:ascii="Arial"/>
-                                <w:b/>
-                                <w:sz w:val="19"/>
-                              </w:rPr>
-                            </w:pPr>
-                            <w:r>
-                              <w:rPr>
-                                <w:rFonts w:ascii="Arial"/>
-                                <w:b/>
-                                <w:spacing w:val="-10"/>
-                                <w:sz w:val="19"/>
-                              </w:rPr>
-                              <w:t>5</w:t>
-                            </w:r>
-                          </w:p>
-                        </w:tc>
-                        <w:tc>
-                          <w:tcPr>
-                            <w:tcW w:w="811" w:type="dxa"/>
-                            <w:shd w:val="clear" w:color="auto" w:fill="FFC000"/>
-                          </w:tcPr>
-                          <w:p>
-                            <w:pPr>
-                              <w:pStyle w:val="TableParagraph"/>
-                              <w:spacing w:before="181"/>
-                              <w:ind w:left="111"/>
-                              <w:rPr>
-                                <w:rFonts w:ascii="Arial"/>
-                                <w:b/>
-                                <w:sz w:val="19"/>
-                              </w:rPr>
-                            </w:pPr>
-                            <w:r>
-                              <w:rPr>
-                                <w:rFonts w:ascii="Arial"/>
-                                <w:b/>
-                                <w:spacing w:val="-2"/>
-                                <w:sz w:val="19"/>
-                              </w:rPr>
-                              <w:t>Tonne</w:t>
-                            </w:r>
-                          </w:p>
-                        </w:tc>
-                      </w:tr>
-                      <w:tr>
-                        <w:trPr>
-                          <w:trHeight w:val="300" w:hRule="atLeast"/>
-                        </w:trPr>
-                        <w:tc>
-                          <w:tcPr>
-                            <w:tcW w:w="3890" w:type="dxa"/>
-                            <w:shd w:val="clear" w:color="auto" w:fill="FFC000"/>
-                          </w:tcPr>
-                          <w:p>
-                            <w:pPr>
-                              <w:pStyle w:val="TableParagraph"/>
-                              <w:spacing w:before="19"/>
-                              <w:rPr>
-                                <w:rFonts w:ascii="Arial"/>
-                                <w:b/>
-                                <w:sz w:val="22"/>
-                              </w:rPr>
-                            </w:pPr>
-                            <w:r>
-                              <w:rPr>
-                                <w:rFonts w:ascii="Arial"/>
-                                <w:b/>
-                                <w:sz w:val="22"/>
-                              </w:rPr>
-                              <w:t>No.</w:t>
-                            </w:r>
-                            <w:r>
-                              <w:rPr>
-                                <w:rFonts w:ascii="Arial"/>
-                                <w:b/>
-                                <w:spacing w:val="-1"/>
-                                <w:sz w:val="22"/>
-                              </w:rPr>
-                              <w:t> </w:t>
-                            </w:r>
-                            <w:r>
-                              <w:rPr>
-                                <w:rFonts w:ascii="Arial"/>
-                                <w:b/>
-                                <w:sz w:val="22"/>
-                              </w:rPr>
-                              <w:t>of</w:t>
-                            </w:r>
-                            <w:r>
-                              <w:rPr>
-                                <w:rFonts w:ascii="Arial"/>
-                                <w:b/>
-                                <w:spacing w:val="4"/>
-                                <w:sz w:val="22"/>
-                              </w:rPr>
-                              <w:t> </w:t>
-                            </w:r>
-                            <w:r>
-                              <w:rPr>
-                                <w:rFonts w:ascii="Arial"/>
-                                <w:b/>
-                                <w:spacing w:val="-2"/>
-                                <w:sz w:val="22"/>
-                              </w:rPr>
-                              <w:t>System</w:t>
-                            </w:r>
-                          </w:p>
-                        </w:tc>
-                        <w:tc>
-                          <w:tcPr>
-                            <w:tcW w:w="451" w:type="dxa"/>
-                            <w:shd w:val="clear" w:color="auto" w:fill="FFC000"/>
-                          </w:tcPr>
-                          <w:p>
-                            <w:pPr>
-                              <w:pStyle w:val="TableParagraph"/>
-                              <w:spacing w:before="32"/>
-                              <w:ind w:left="0" w:right="77"/>
-                              <w:jc w:val="right"/>
-                              <w:rPr>
-                                <w:rFonts w:ascii="Arial"/>
-                                <w:b/>
-                                <w:sz w:val="19"/>
-                              </w:rPr>
-                            </w:pPr>
-                            <w:r>
-                              <w:rPr>
-                                <w:rFonts w:ascii="Arial"/>
-                                <w:b/>
-                                <w:spacing w:val="-10"/>
-                                <w:sz w:val="19"/>
-                              </w:rPr>
-                              <w:t>2</w:t>
-                            </w:r>
-                          </w:p>
-                        </w:tc>
-                        <w:tc>
-                          <w:tcPr>
-                            <w:tcW w:w="811" w:type="dxa"/>
-                            <w:shd w:val="clear" w:color="auto" w:fill="FFC000"/>
-                          </w:tcPr>
-                          <w:p>
-                            <w:pPr>
-                              <w:pStyle w:val="TableParagraph"/>
-                              <w:spacing w:before="32"/>
-                              <w:ind w:left="111"/>
-                              <w:rPr>
-                                <w:rFonts w:ascii="Arial"/>
-                                <w:b/>
-                                <w:sz w:val="19"/>
-                              </w:rPr>
-                            </w:pPr>
-                            <w:r>
-                              <w:rPr>
-                                <w:rFonts w:ascii="Arial"/>
-                                <w:b/>
-                                <w:spacing w:val="-5"/>
-                                <w:sz w:val="19"/>
-                              </w:rPr>
-                              <w:t>Nos</w:t>
-                            </w:r>
-                          </w:p>
-                        </w:tc>
-                      </w:tr>
-                      <w:tr>
-                        <w:trPr>
-                          <w:trHeight w:val="285" w:hRule="atLeast"/>
-                        </w:trPr>
-                        <w:tc>
-                          <w:tcPr>
-                            <w:tcW w:w="3890" w:type="dxa"/>
-                            <w:shd w:val="clear" w:color="auto" w:fill="FFFF00"/>
-                          </w:tcPr>
-                          <w:p>
-                            <w:pPr>
-                              <w:pStyle w:val="TableParagraph"/>
-                              <w:spacing w:line="246" w:lineRule="exact" w:before="19"/>
-                              <w:rPr>
-                                <w:rFonts w:ascii="Arial"/>
-                                <w:b/>
-                                <w:sz w:val="22"/>
-                              </w:rPr>
-                            </w:pPr>
-                            <w:r>
-                              <w:rPr>
-                                <w:rFonts w:ascii="Arial"/>
-                                <w:b/>
-                                <w:sz w:val="22"/>
-                              </w:rPr>
-                              <w:t>Approx.</w:t>
-                            </w:r>
-                            <w:r>
-                              <w:rPr>
-                                <w:rFonts w:ascii="Arial"/>
-                                <w:b/>
-                                <w:spacing w:val="17"/>
-                                <w:sz w:val="22"/>
-                              </w:rPr>
-                              <w:t> </w:t>
-                            </w:r>
-                            <w:r>
-                              <w:rPr>
-                                <w:rFonts w:ascii="Arial"/>
-                                <w:b/>
-                                <w:sz w:val="22"/>
-                              </w:rPr>
-                              <w:t>Weight</w:t>
-                            </w:r>
-                            <w:r>
-                              <w:rPr>
-                                <w:rFonts w:ascii="Arial"/>
-                                <w:b/>
-                                <w:spacing w:val="-17"/>
-                                <w:sz w:val="22"/>
-                              </w:rPr>
-                              <w:t> </w:t>
-                            </w:r>
-                            <w:r>
-                              <w:rPr>
-                                <w:rFonts w:ascii="Arial"/>
-                                <w:b/>
-                                <w:sz w:val="22"/>
-                              </w:rPr>
-                              <w:t>of</w:t>
-                            </w:r>
-                            <w:r>
-                              <w:rPr>
-                                <w:rFonts w:ascii="Arial"/>
-                                <w:b/>
-                                <w:spacing w:val="-5"/>
-                                <w:sz w:val="22"/>
-                              </w:rPr>
-                              <w:t> </w:t>
-                            </w:r>
-                            <w:r>
-                              <w:rPr>
-                                <w:rFonts w:ascii="Arial"/>
-                                <w:b/>
-                                <w:sz w:val="22"/>
-                              </w:rPr>
-                              <w:t>the</w:t>
-                            </w:r>
-                            <w:r>
-                              <w:rPr>
-                                <w:rFonts w:ascii="Arial"/>
-                                <w:b/>
-                                <w:spacing w:val="3"/>
-                                <w:sz w:val="22"/>
-                              </w:rPr>
-                              <w:t> </w:t>
-                            </w:r>
-                            <w:r>
-                              <w:rPr>
-                                <w:rFonts w:ascii="Arial"/>
-                                <w:b/>
-                                <w:sz w:val="22"/>
-                              </w:rPr>
-                              <w:t>6</w:t>
-                            </w:r>
-                            <w:r>
-                              <w:rPr>
-                                <w:rFonts w:ascii="Arial"/>
-                                <w:b/>
-                                <w:spacing w:val="-10"/>
-                                <w:sz w:val="22"/>
-                              </w:rPr>
-                              <w:t> </w:t>
-                            </w:r>
-                            <w:r>
-                              <w:rPr>
-                                <w:rFonts w:ascii="Arial"/>
-                                <w:b/>
-                                <w:spacing w:val="-2"/>
-                                <w:sz w:val="22"/>
-                              </w:rPr>
-                              <w:t>System</w:t>
-                            </w:r>
-                          </w:p>
-                        </w:tc>
-                        <w:tc>
-                          <w:tcPr>
-                            <w:tcW w:w="451" w:type="dxa"/>
-                            <w:shd w:val="clear" w:color="auto" w:fill="FFFF00"/>
-                          </w:tcPr>
-                          <w:p>
-                            <w:pPr>
-                              <w:pStyle w:val="TableParagraph"/>
-                              <w:spacing w:before="32"/>
-                              <w:ind w:left="0" w:right="77"/>
-                              <w:jc w:val="right"/>
-                              <w:rPr>
-                                <w:rFonts w:ascii="Arial"/>
-                                <w:b/>
-                                <w:sz w:val="19"/>
-                              </w:rPr>
-                            </w:pPr>
-                            <w:r>
-                              <w:rPr>
-                                <w:rFonts w:ascii="Arial"/>
-                                <w:b/>
-                                <w:spacing w:val="-5"/>
-                                <w:sz w:val="19"/>
-                              </w:rPr>
-                              <w:t>10</w:t>
-                            </w:r>
-                          </w:p>
-                        </w:tc>
-                        <w:tc>
-                          <w:tcPr>
-                            <w:tcW w:w="811" w:type="dxa"/>
-                            <w:shd w:val="clear" w:color="auto" w:fill="FFFF00"/>
-                          </w:tcPr>
-                          <w:p>
-                            <w:pPr>
-                              <w:pStyle w:val="TableParagraph"/>
-                              <w:spacing w:before="32"/>
-                              <w:ind w:left="111"/>
-                              <w:rPr>
-                                <w:rFonts w:ascii="Arial"/>
-                                <w:b/>
-                                <w:sz w:val="19"/>
-                              </w:rPr>
-                            </w:pPr>
-                            <w:r>
-                              <w:rPr>
-                                <w:rFonts w:ascii="Arial"/>
-                                <w:b/>
-                                <w:spacing w:val="-2"/>
-                                <w:sz w:val="19"/>
-                              </w:rPr>
-                              <w:t>Tonne</w:t>
-                            </w:r>
-                          </w:p>
-                        </w:tc>
-                      </w:tr>
-                    </w:tbl>
-                    <w:p>
-                      <w:pPr>
-                        <w:pStyle w:val="BodyText"/>
-                      </w:pPr>
-                    </w:p>
-                  </w:txbxContent>
-                </v:textbox>
-                <w10:wrap type="topAndBottom"/>
-              </v:shape>
-            </w:pict>
-          </mc:Fallback>
-        </mc:AlternateContent>
-      </w:r>
     </w:p>
     <w:p>
       <w:pPr>

</xml_diff>

<commit_message>
chore: set offer template page margins to 2 cm left + right (all sections)
Previous margins were extremely tight and asymmetric — 1 cm / 0.5 cm
for the first 6 sections, 0.5 cm / 0.25 cm for the remaining 13.
Text ran right to the page edge and the right side was visibly
tighter than the left. Standardised to 2 cm on both sides across
all 19 sections (17.04 cm usable text width on A4). Top/bottom
margins unchanged.

Co-Authored-By: Claude Opus 4.7 (1M context) <noreply@anthropic.com>
</commit_message>
<xml_diff>
--- a/Offer_Template.docx
+++ b/Offer_Template.docx
@@ -1008,7 +1008,7 @@
           <w:footerReference w:type="default" r:id="rId5"/>
           <w:type w:val="continuous"/>
           <w:pgSz w:w="11930" w:h="16850"/>
-          <w:pgMar w:header="0" w:footer="1175" w:top="1420" w:bottom="1360" w:left="566" w:right="283"/>
+          <w:pgMar w:header="0" w:footer="1175" w:top="1420" w:bottom="1360" w:left="1134" w:right="1134"/>
           <w:pgNumType w:start="1"/>
         </w:sectPr>
       </w:pPr>
@@ -3164,7 +3164,7 @@
         </w:rPr>
         <w:sectPr>
           <w:pgSz w:w="11930" w:h="16850"/>
-          <w:pgMar w:header="0" w:footer="1175" w:top="400" w:bottom="1360" w:left="566" w:right="283"/>
+          <w:pgMar w:header="0" w:footer="1175" w:top="400" w:bottom="1360" w:left="1134" w:right="1134"/>
         </w:sectPr>
       </w:pPr>
     </w:p>
@@ -4704,7 +4704,7 @@
         </w:rPr>
         <w:sectPr>
           <w:pgSz w:w="11930" w:h="16850"/>
-          <w:pgMar w:header="0" w:footer="1175" w:top="1860" w:bottom="1360" w:left="566" w:right="283"/>
+          <w:pgMar w:header="0" w:footer="1175" w:top="1860" w:bottom="1360" w:left="1134" w:right="1134"/>
         </w:sectPr>
       </w:pPr>
     </w:p>
@@ -6125,7 +6125,7 @@
         </w:rPr>
         <w:sectPr>
           <w:pgSz w:w="11930" w:h="16850"/>
-          <w:pgMar w:header="0" w:footer="1175" w:top="1360" w:bottom="1360" w:left="566" w:right="283"/>
+          <w:pgMar w:header="0" w:footer="1175" w:top="1360" w:bottom="1360" w:left="1134" w:right="1134"/>
         </w:sectPr>
       </w:pPr>
     </w:p>
@@ -9563,7 +9563,7 @@
         <w:spacing w:after="0" w:line="273" w:lineRule="auto"/>
         <w:sectPr>
           <w:pgSz w:w="11930" w:h="16850"/>
-          <w:pgMar w:header="0" w:footer="1175" w:top="1320" w:bottom="1360" w:left="566" w:right="283"/>
+          <w:pgMar w:header="0" w:footer="1175" w:top="1320" w:bottom="1360" w:left="1134" w:right="1134"/>
         </w:sectPr>
       </w:pPr>
     </w:p>
@@ -9707,7 +9707,7 @@
         </w:rPr>
         <w:sectPr>
           <w:pgSz w:w="11930" w:h="16850"/>
-          <w:pgMar w:header="0" w:footer="1175" w:top="1580" w:bottom="1360" w:left="566" w:right="283"/>
+          <w:pgMar w:header="0" w:footer="1175" w:top="1580" w:bottom="1360" w:left="1134" w:right="1134"/>
         </w:sectPr>
       </w:pPr>
     </w:p>
@@ -12219,7 +12219,7 @@
         <w:sectPr>
           <w:footerReference w:type="default" r:id="rId50"/>
           <w:pgSz w:w="11930" w:h="16850"/>
-          <w:pgMar w:header="0" w:footer="724" w:top="1260" w:bottom="920" w:left="283" w:right="141"/>
+          <w:pgMar w:header="0" w:footer="724" w:top="1260" w:bottom="920" w:left="1134" w:right="1134"/>
           <w:pgNumType w:start="3"/>
         </w:sectPr>
       </w:pPr>
@@ -19025,7 +19025,7 @@
         <w:jc w:val="both"/>
         <w:sectPr>
           <w:pgSz w:w="11930" w:h="16850"/>
-          <w:pgMar w:header="0" w:footer="724" w:top="1500" w:bottom="1360" w:left="283" w:right="141"/>
+          <w:pgMar w:header="0" w:footer="724" w:top="1500" w:bottom="1360" w:left="1134" w:right="1134"/>
         </w:sectPr>
       </w:pPr>
     </w:p>
@@ -21822,7 +21822,7 @@
         <w:jc w:val="both"/>
         <w:sectPr>
           <w:pgSz w:w="11930" w:h="16850"/>
-          <w:pgMar w:header="0" w:footer="724" w:top="1480" w:bottom="1360" w:left="283" w:right="141"/>
+          <w:pgMar w:header="0" w:footer="724" w:top="1480" w:bottom="1360" w:left="1134" w:right="1134"/>
         </w:sectPr>
       </w:pPr>
     </w:p>
@@ -24665,7 +24665,7 @@
         <w:spacing w:after="0" w:line="247" w:lineRule="auto"/>
         <w:sectPr>
           <w:pgSz w:w="11930" w:h="16850"/>
-          <w:pgMar w:header="0" w:footer="724" w:top="1800" w:bottom="1360" w:left="283" w:right="141"/>
+          <w:pgMar w:header="0" w:footer="724" w:top="1800" w:bottom="1360" w:left="1134" w:right="1134"/>
         </w:sectPr>
       </w:pPr>
     </w:p>
@@ -27708,7 +27708,7 @@
         </w:rPr>
         <w:sectPr>
           <w:pgSz w:w="11930" w:h="16850"/>
-          <w:pgMar w:header="0" w:footer="724" w:top="1480" w:bottom="1360" w:left="283" w:right="141"/>
+          <w:pgMar w:header="0" w:footer="724" w:top="1480" w:bottom="1360" w:left="1134" w:right="1134"/>
         </w:sectPr>
       </w:pPr>
     </w:p>
@@ -30640,7 +30640,7 @@
         </w:rPr>
         <w:sectPr>
           <w:pgSz w:w="11930" w:h="16850"/>
-          <w:pgMar w:header="0" w:footer="724" w:top="1480" w:bottom="1360" w:left="283" w:right="141"/>
+          <w:pgMar w:header="0" w:footer="724" w:top="1480" w:bottom="1360" w:left="1134" w:right="1134"/>
         </w:sectPr>
       </w:pPr>
     </w:p>
@@ -32543,7 +32543,7 @@
         <w:jc w:val="both"/>
         <w:sectPr>
           <w:pgSz w:w="11930" w:h="16850"/>
-          <w:pgMar w:header="0" w:footer="724" w:top="1480" w:bottom="1360" w:left="283" w:right="141"/>
+          <w:pgMar w:header="0" w:footer="724" w:top="1480" w:bottom="1360" w:left="1134" w:right="1134"/>
         </w:sectPr>
       </w:pPr>
     </w:p>
@@ -35934,7 +35934,7 @@
         </w:rPr>
         <w:sectPr>
           <w:pgSz w:w="11930" w:h="16850"/>
-          <w:pgMar w:header="0" w:footer="724" w:top="1720" w:bottom="1360" w:left="283" w:right="141"/>
+          <w:pgMar w:header="0" w:footer="724" w:top="1720" w:bottom="1360" w:left="1134" w:right="1134"/>
         </w:sectPr>
       </w:pPr>
     </w:p>
@@ -37041,7 +37041,7 @@
         </w:rPr>
         <w:sectPr>
           <w:pgSz w:w="11930" w:h="16850"/>
-          <w:pgMar w:header="0" w:footer="724" w:top="1720" w:bottom="1360" w:left="283" w:right="141"/>
+          <w:pgMar w:header="0" w:footer="724" w:top="1720" w:bottom="1360" w:left="1134" w:right="1134"/>
         </w:sectPr>
       </w:pPr>
     </w:p>
@@ -38112,7 +38112,7 @@
         </w:rPr>
         <w:sectPr>
           <w:pgSz w:w="11930" w:h="16850"/>
-          <w:pgMar w:header="0" w:footer="724" w:top="1420" w:bottom="1360" w:left="283" w:right="141"/>
+          <w:pgMar w:header="0" w:footer="724" w:top="1420" w:bottom="1360" w:left="1134" w:right="1134"/>
         </w:sectPr>
       </w:pPr>
     </w:p>
@@ -40241,7 +40241,7 @@
         </w:rPr>
         <w:sectPr>
           <w:pgSz w:w="11930" w:h="16850"/>
-          <w:pgMar w:header="0" w:footer="724" w:top="1920" w:bottom="1360" w:left="283" w:right="141"/>
+          <w:pgMar w:header="0" w:footer="724" w:top="1920" w:bottom="1360" w:left="1134" w:right="1134"/>
         </w:sectPr>
       </w:pPr>
     </w:p>
@@ -44546,7 +44546,7 @@
         </w:rPr>
         <w:sectPr>
           <w:pgSz w:w="11930" w:h="16850"/>
-          <w:pgMar w:header="0" w:footer="724" w:top="1400" w:bottom="1360" w:left="283" w:right="141"/>
+          <w:pgMar w:header="0" w:footer="724" w:top="1400" w:bottom="1360" w:left="1134" w:right="1134"/>
         </w:sectPr>
       </w:pPr>
     </w:p>
@@ -44970,7 +44970,7 @@
     </w:tbl>
     <w:sectPr>
       <w:pgSz w:w="11930" w:h="16850"/>
-      <w:pgMar w:header="0" w:footer="724" w:top="1400" w:bottom="1360" w:left="283" w:right="141"/>
+      <w:pgMar w:header="0" w:footer="724" w:top="1400" w:bottom="1360" w:left="1134" w:right="1134"/>
     </w:sectPr>
   </w:body>
 </w:document>

</xml_diff>

<commit_message>
feat: add Page X / Y page numbers to Word offer footer
All three footer XML files now include a right-aligned paragraph
with PAGE and NUMPAGES field codes, rendered as e.g. "Page 3 / 22"
in navy bold 9pt. Works natively in Word — fields update on print
or when the user toggles Field Codes.

Previously page numbers were only stamped on the PDF output via
reportlab (in _stamp_page_numbers). Since PDF generation is
currently disabled, the Word doc itself had no page numbering.

Co-Authored-By: Claude Opus 4.7 (1M context) <noreply@anthropic.com>
</commit_message>
<xml_diff>
--- a/Offer_Template.docx
+++ b/Offer_Template.docx
@@ -45266,6 +45266,75 @@
       </mc:AlternateContent>
     </w:r>
   </w:p>
+  <w:p xmlns:w="http://schemas.openxmlformats.org/wordprocessingml/2006/main">
+    <w:pPr>
+      <w:jc w:val="right"/>
+    </w:pPr>
+    <w:r>
+      <w:rPr>
+        <w:b/>
+        <w:sz w:val="18"/>
+        <w:color w:val="1F3A5F"/>
+      </w:rPr>
+      <w:t xml:space="preserve">Page </w:t>
+    </w:r>
+    <w:r>
+      <w:rPr>
+        <w:b/>
+        <w:sz w:val="18"/>
+        <w:color w:val="1F3A5F"/>
+      </w:rPr>
+      <w:fldChar w:fldCharType="begin"/>
+    </w:r>
+    <w:r>
+      <w:rPr>
+        <w:b/>
+        <w:sz w:val="18"/>
+        <w:color w:val="1F3A5F"/>
+      </w:rPr>
+      <w:instrText xml:space="preserve"> PAGE </w:instrText>
+    </w:r>
+    <w:r>
+      <w:rPr>
+        <w:b/>
+        <w:sz w:val="18"/>
+        <w:color w:val="1F3A5F"/>
+      </w:rPr>
+      <w:fldChar w:fldCharType="end"/>
+    </w:r>
+    <w:r>
+      <w:rPr>
+        <w:b/>
+        <w:sz w:val="18"/>
+        <w:color w:val="1F3A5F"/>
+      </w:rPr>
+      <w:t xml:space="preserve"> / </w:t>
+    </w:r>
+    <w:r>
+      <w:rPr>
+        <w:b/>
+        <w:sz w:val="18"/>
+        <w:color w:val="1F3A5F"/>
+      </w:rPr>
+      <w:fldChar w:fldCharType="begin"/>
+    </w:r>
+    <w:r>
+      <w:rPr>
+        <w:b/>
+        <w:sz w:val="18"/>
+        <w:color w:val="1F3A5F"/>
+      </w:rPr>
+      <w:instrText xml:space="preserve"> NUMPAGES </w:instrText>
+    </w:r>
+    <w:r>
+      <w:rPr>
+        <w:b/>
+        <w:sz w:val="18"/>
+        <w:color w:val="1F3A5F"/>
+      </w:rPr>
+      <w:fldChar w:fldCharType="end"/>
+    </w:r>
+  </w:p>
 </w:ftr>
 </file>
 
@@ -45279,6 +45348,75 @@
         <w:sz w:val="2"/>
       </w:rPr>
     </w:pPr>
+  </w:p>
+  <w:p xmlns:w="http://schemas.openxmlformats.org/wordprocessingml/2006/main">
+    <w:pPr>
+      <w:jc w:val="right"/>
+    </w:pPr>
+    <w:r>
+      <w:rPr>
+        <w:b/>
+        <w:sz w:val="18"/>
+        <w:color w:val="1F3A5F"/>
+      </w:rPr>
+      <w:t xml:space="preserve">Page </w:t>
+    </w:r>
+    <w:r>
+      <w:rPr>
+        <w:b/>
+        <w:sz w:val="18"/>
+        <w:color w:val="1F3A5F"/>
+      </w:rPr>
+      <w:fldChar w:fldCharType="begin"/>
+    </w:r>
+    <w:r>
+      <w:rPr>
+        <w:b/>
+        <w:sz w:val="18"/>
+        <w:color w:val="1F3A5F"/>
+      </w:rPr>
+      <w:instrText xml:space="preserve"> PAGE </w:instrText>
+    </w:r>
+    <w:r>
+      <w:rPr>
+        <w:b/>
+        <w:sz w:val="18"/>
+        <w:color w:val="1F3A5F"/>
+      </w:rPr>
+      <w:fldChar w:fldCharType="end"/>
+    </w:r>
+    <w:r>
+      <w:rPr>
+        <w:b/>
+        <w:sz w:val="18"/>
+        <w:color w:val="1F3A5F"/>
+      </w:rPr>
+      <w:t xml:space="preserve"> / </w:t>
+    </w:r>
+    <w:r>
+      <w:rPr>
+        <w:b/>
+        <w:sz w:val="18"/>
+        <w:color w:val="1F3A5F"/>
+      </w:rPr>
+      <w:fldChar w:fldCharType="begin"/>
+    </w:r>
+    <w:r>
+      <w:rPr>
+        <w:b/>
+        <w:sz w:val="18"/>
+        <w:color w:val="1F3A5F"/>
+      </w:rPr>
+      <w:instrText xml:space="preserve"> NUMPAGES </w:instrText>
+    </w:r>
+    <w:r>
+      <w:rPr>
+        <w:b/>
+        <w:sz w:val="18"/>
+        <w:color w:val="1F3A5F"/>
+      </w:rPr>
+      <w:fldChar w:fldCharType="end"/>
+    </w:r>
   </w:p>
 </w:ftr>
 </file>
@@ -45567,6 +45705,75 @@
           </w:pict>
         </mc:Fallback>
       </mc:AlternateContent>
+    </w:r>
+  </w:p>
+  <w:p xmlns:w="http://schemas.openxmlformats.org/wordprocessingml/2006/main">
+    <w:pPr>
+      <w:jc w:val="right"/>
+    </w:pPr>
+    <w:r>
+      <w:rPr>
+        <w:b/>
+        <w:sz w:val="18"/>
+        <w:color w:val="1F3A5F"/>
+      </w:rPr>
+      <w:t xml:space="preserve">Page </w:t>
+    </w:r>
+    <w:r>
+      <w:rPr>
+        <w:b/>
+        <w:sz w:val="18"/>
+        <w:color w:val="1F3A5F"/>
+      </w:rPr>
+      <w:fldChar w:fldCharType="begin"/>
+    </w:r>
+    <w:r>
+      <w:rPr>
+        <w:b/>
+        <w:sz w:val="18"/>
+        <w:color w:val="1F3A5F"/>
+      </w:rPr>
+      <w:instrText xml:space="preserve"> PAGE </w:instrText>
+    </w:r>
+    <w:r>
+      <w:rPr>
+        <w:b/>
+        <w:sz w:val="18"/>
+        <w:color w:val="1F3A5F"/>
+      </w:rPr>
+      <w:fldChar w:fldCharType="end"/>
+    </w:r>
+    <w:r>
+      <w:rPr>
+        <w:b/>
+        <w:sz w:val="18"/>
+        <w:color w:val="1F3A5F"/>
+      </w:rPr>
+      <w:t xml:space="preserve"> / </w:t>
+    </w:r>
+    <w:r>
+      <w:rPr>
+        <w:b/>
+        <w:sz w:val="18"/>
+        <w:color w:val="1F3A5F"/>
+      </w:rPr>
+      <w:fldChar w:fldCharType="begin"/>
+    </w:r>
+    <w:r>
+      <w:rPr>
+        <w:b/>
+        <w:sz w:val="18"/>
+        <w:color w:val="1F3A5F"/>
+      </w:rPr>
+      <w:instrText xml:space="preserve"> NUMPAGES </w:instrText>
+    </w:r>
+    <w:r>
+      <w:rPr>
+        <w:b/>
+        <w:sz w:val="18"/>
+        <w:color w:val="1F3A5F"/>
+      </w:rPr>
+      <w:fldChar w:fldCharType="end"/>
     </w:r>
   </w:p>
 </w:ftr>

</xml_diff>

<commit_message>
feat: dynamic Annexure I scope of supply + Annexure III empty charges row
Annexure I scope-of-supply table is now driven by Step-4 inputs:
- Header counts (Vertical/Horizontal Preheaters - N Nos.) come from new
  vertical_qty/horizontal_qty fields (user-editable on Step 4).
- Row 4 ignition: rephrases to "Manual ignition of the Burner" when
  Auto Ignition is off, otherwise names the pilot fuel.
- Row 8 temperature: rephrases to "Manual temperature control" in manual
  mode, otherwise picks PLC / PLC + AGR / PID per auto_control_type.
- Row 9 flow meter and row 10 pipeline switch wording for oil/dual fuel
  vs gas.
- Header drops "Driers/" - just "Preheaters".

Annexure III price schedule now keeps an empty S.No 3 row so manual
charges can be added before issuing the offer.

Co-Authored-By: Claude Opus 4.7 (1M context) <noreply@anthropic.com>
</commit_message>
<xml_diff>
--- a/Offer_Template.docx
+++ b/Offer_Template.docx
@@ -33144,7 +33144,7 @@
                 <w:sz w:val="28"/>
                 <w:highlight w:val="yellow"/>
               </w:rPr>
-              <w:t>Vertical</w:t>
+              <w:t xml:space="preserve">Vertical Ladle Preheaters – {{ vertical_qty }} Nos.</w:t>
             </w:r>
             <w:r>
               <w:rPr>
@@ -33154,7 +33154,7 @@
                 <w:sz w:val="28"/>
                 <w:highlight w:val="yellow"/>
               </w:rPr>
-              <w:t> </w:t>
+              <w:t/>
             </w:r>
             <w:r>
               <w:rPr>
@@ -33163,7 +33163,7 @@
                 <w:sz w:val="28"/>
                 <w:highlight w:val="yellow"/>
               </w:rPr>
-              <w:t>Ladle</w:t>
+              <w:t/>
             </w:r>
             <w:r>
               <w:rPr>
@@ -33173,7 +33173,7 @@
                 <w:sz w:val="28"/>
                 <w:highlight w:val="yellow"/>
               </w:rPr>
-              <w:t> </w:t>
+              <w:t/>
             </w:r>
             <w:r>
               <w:rPr>
@@ -33182,7 +33182,7 @@
                 <w:sz w:val="28"/>
                 <w:highlight w:val="yellow"/>
               </w:rPr>
-              <w:t>Driers/Preheaters–</w:t>
+              <w:t/>
             </w:r>
             <w:r>
               <w:rPr>
@@ -33192,7 +33192,7 @@
                 <w:sz w:val="28"/>
                 <w:highlight w:val="yellow"/>
               </w:rPr>
-              <w:t> </w:t>
+              <w:t/>
             </w:r>
             <w:r>
               <w:rPr>
@@ -33201,7 +33201,7 @@
                 <w:sz w:val="28"/>
                 <w:highlight w:val="yellow"/>
               </w:rPr>
-              <w:t>06</w:t>
+              <w:t/>
             </w:r>
             <w:r>
               <w:rPr>
@@ -33211,7 +33211,7 @@
                 <w:sz w:val="28"/>
                 <w:highlight w:val="yellow"/>
               </w:rPr>
-              <w:t> </w:t>
+              <w:t/>
             </w:r>
             <w:r>
               <w:rPr>
@@ -33221,7 +33221,7 @@
                 <w:sz w:val="28"/>
                 <w:highlight w:val="yellow"/>
               </w:rPr>
-              <w:t>Nos.</w:t>
+              <w:t/>
             </w:r>
           </w:p>
         </w:tc>
@@ -33246,7 +33246,7 @@
                 <w:sz w:val="28"/>
                 <w:highlight w:val="yellow"/>
               </w:rPr>
-              <w:t>Horizontal</w:t>
+              <w:t xml:space="preserve">Horizontal Ladle Preheater – {{ horizontal_qty }} Nos.</w:t>
             </w:r>
             <w:r>
               <w:rPr>
@@ -33256,7 +33256,7 @@
                 <w:sz w:val="28"/>
                 <w:highlight w:val="yellow"/>
               </w:rPr>
-              <w:t> </w:t>
+              <w:t/>
             </w:r>
             <w:r>
               <w:rPr>
@@ -33265,7 +33265,7 @@
                 <w:sz w:val="28"/>
                 <w:highlight w:val="yellow"/>
               </w:rPr>
-              <w:t>Ladle</w:t>
+              <w:t/>
             </w:r>
             <w:r>
               <w:rPr>
@@ -33275,7 +33275,7 @@
                 <w:sz w:val="28"/>
                 <w:highlight w:val="yellow"/>
               </w:rPr>
-              <w:t> </w:t>
+              <w:t/>
             </w:r>
             <w:r>
               <w:rPr>
@@ -33284,7 +33284,7 @@
                 <w:sz w:val="28"/>
                 <w:highlight w:val="yellow"/>
               </w:rPr>
-              <w:t>Preheater</w:t>
+              <w:t/>
             </w:r>
             <w:r>
               <w:rPr>
@@ -33294,7 +33294,7 @@
                 <w:sz w:val="28"/>
                 <w:highlight w:val="yellow"/>
               </w:rPr>
-              <w:t> </w:t>
+              <w:t/>
             </w:r>
             <w:r>
               <w:rPr>
@@ -33303,7 +33303,7 @@
                 <w:sz w:val="28"/>
                 <w:highlight w:val="yellow"/>
               </w:rPr>
-              <w:t>–</w:t>
+              <w:t/>
             </w:r>
             <w:r>
               <w:rPr>
@@ -33313,7 +33313,7 @@
                 <w:sz w:val="28"/>
                 <w:highlight w:val="yellow"/>
               </w:rPr>
-              <w:t> </w:t>
+              <w:t/>
             </w:r>
             <w:r>
               <w:rPr>
@@ -33322,7 +33322,7 @@
                 <w:sz w:val="28"/>
                 <w:highlight w:val="yellow"/>
               </w:rPr>
-              <w:t>02</w:t>
+              <w:t/>
             </w:r>
             <w:r>
               <w:rPr>
@@ -33332,7 +33332,7 @@
                 <w:sz w:val="28"/>
                 <w:highlight w:val="yellow"/>
               </w:rPr>
-              <w:t> </w:t>
+              <w:t/>
             </w:r>
             <w:r>
               <w:rPr>
@@ -33342,7 +33342,7 @@
                 <w:sz w:val="28"/>
                 <w:highlight w:val="yellow"/>
               </w:rPr>
-              <w:t>Nos.</w:t>
+              <w:t/>
             </w:r>
           </w:p>
         </w:tc>
@@ -34186,119 +34186,119 @@
                 <w:spacing w:val="-4"/>
                 <w:sz w:val="24"/>
               </w:rPr>
-              <w:t>4.</w:t>
+              <w:t xml:space="preserve">4. {{ ignition_scope_text }}</w:t>
             </w:r>
             <w:r>
               <w:rPr>
                 <w:spacing w:val="-15"/>
                 <w:sz w:val="24"/>
               </w:rPr>
-              <w:t> </w:t>
+              <w:t/>
             </w:r>
             <w:r>
               <w:rPr>
                 <w:spacing w:val="-4"/>
                 <w:sz w:val="24"/>
               </w:rPr>
-              <w:t>Firing</w:t>
+              <w:t/>
             </w:r>
             <w:r>
               <w:rPr>
                 <w:spacing w:val="18"/>
                 <w:sz w:val="24"/>
               </w:rPr>
-              <w:t> </w:t>
+              <w:t/>
             </w:r>
             <w:r>
               <w:rPr>
                 <w:spacing w:val="-4"/>
                 <w:sz w:val="24"/>
               </w:rPr>
-              <w:t>&amp;</w:t>
+              <w:t/>
             </w:r>
             <w:r>
               <w:rPr>
                 <w:spacing w:val="-22"/>
                 <w:sz w:val="24"/>
               </w:rPr>
-              <w:t> </w:t>
+              <w:t/>
             </w:r>
             <w:r>
               <w:rPr>
                 <w:spacing w:val="-4"/>
                 <w:sz w:val="24"/>
               </w:rPr>
-              <w:t>Ignition</w:t>
+              <w:t/>
             </w:r>
             <w:r>
               <w:rPr>
                 <w:spacing w:val="38"/>
                 <w:sz w:val="24"/>
               </w:rPr>
-              <w:t> </w:t>
+              <w:t/>
             </w:r>
             <w:r>
               <w:rPr>
                 <w:spacing w:val="-4"/>
                 <w:sz w:val="24"/>
               </w:rPr>
-              <w:t>of</w:t>
+              <w:t/>
             </w:r>
             <w:r>
               <w:rPr>
                 <w:spacing w:val="-20"/>
                 <w:sz w:val="24"/>
               </w:rPr>
-              <w:t> </w:t>
+              <w:t/>
             </w:r>
             <w:r>
               <w:rPr>
                 <w:spacing w:val="-4"/>
                 <w:sz w:val="24"/>
               </w:rPr>
-              <w:t>the</w:t>
+              <w:t/>
             </w:r>
             <w:r>
               <w:rPr>
                 <w:spacing w:val="-3"/>
                 <w:sz w:val="24"/>
               </w:rPr>
-              <w:t> </w:t>
+              <w:t/>
             </w:r>
             <w:r>
               <w:rPr>
                 <w:spacing w:val="-4"/>
                 <w:sz w:val="24"/>
               </w:rPr>
-              <w:t>Burner</w:t>
+              <w:t/>
             </w:r>
             <w:r>
               <w:rPr>
                 <w:spacing w:val="21"/>
                 <w:sz w:val="24"/>
               </w:rPr>
-              <w:t> </w:t>
+              <w:t/>
             </w:r>
             <w:r>
               <w:rPr>
                 <w:spacing w:val="-4"/>
                 <w:sz w:val="24"/>
               </w:rPr>
-              <w:t>is Automatic</w:t>
+              <w:t/>
             </w:r>
             <w:r>
               <w:rPr>
                 <w:spacing w:val="59"/>
                 <w:sz w:val="24"/>
               </w:rPr>
-              <w:t> </w:t>
+              <w:t/>
             </w:r>
             <w:r>
               <w:rPr>
                 <w:spacing w:val="-4"/>
                 <w:sz w:val="24"/>
               </w:rPr>
-              <w:t>through</w:t>
+              <w:t/>
             </w:r>
           </w:p>
           <w:p>
@@ -34315,7 +34315,7 @@
                 <w:spacing w:val="-2"/>
                 <w:sz w:val="24"/>
               </w:rPr>
-              <w:t>{{pilot_gas_type}} fired Pilot Burner</w:t>
+              <w:t/>
             </w:r>
             <w:r>
               <w:rPr>
@@ -34357,7 +34357,7 @@
                 <w:spacing w:val="-2"/>
                 <w:sz w:val="24"/>
               </w:rPr>
-              <w:t>.</w:t>
+              <w:t/>
             </w:r>
           </w:p>
         </w:tc>
@@ -34379,119 +34379,119 @@
                 <w:spacing w:val="-2"/>
                 <w:sz w:val="24"/>
               </w:rPr>
-              <w:t>4.</w:t>
+              <w:t xml:space="preserve">4. {{ ignition_scope_text }}</w:t>
             </w:r>
             <w:r>
               <w:rPr>
                 <w:spacing w:val="-15"/>
                 <w:sz w:val="24"/>
               </w:rPr>
-              <w:t> </w:t>
+              <w:t/>
             </w:r>
             <w:r>
               <w:rPr>
                 <w:spacing w:val="-2"/>
                 <w:sz w:val="24"/>
               </w:rPr>
-              <w:t>Firing</w:t>
+              <w:t/>
             </w:r>
             <w:r>
               <w:rPr>
                 <w:spacing w:val="28"/>
                 <w:sz w:val="24"/>
               </w:rPr>
-              <w:t> </w:t>
+              <w:t/>
             </w:r>
             <w:r>
               <w:rPr>
                 <w:spacing w:val="-2"/>
                 <w:sz w:val="24"/>
               </w:rPr>
-              <w:t>&amp;</w:t>
+              <w:t/>
             </w:r>
             <w:r>
               <w:rPr>
                 <w:spacing w:val="-13"/>
                 <w:sz w:val="24"/>
               </w:rPr>
-              <w:t> </w:t>
+              <w:t/>
             </w:r>
             <w:r>
               <w:rPr>
                 <w:spacing w:val="-2"/>
                 <w:sz w:val="24"/>
               </w:rPr>
-              <w:t>Ignition</w:t>
+              <w:t/>
             </w:r>
             <w:r>
               <w:rPr>
                 <w:spacing w:val="38"/>
                 <w:sz w:val="24"/>
               </w:rPr>
-              <w:t> </w:t>
+              <w:t/>
             </w:r>
             <w:r>
               <w:rPr>
                 <w:spacing w:val="-2"/>
                 <w:sz w:val="24"/>
               </w:rPr>
-              <w:t>of</w:t>
+              <w:t/>
             </w:r>
             <w:r>
               <w:rPr>
                 <w:spacing w:val="-20"/>
                 <w:sz w:val="24"/>
               </w:rPr>
-              <w:t> </w:t>
+              <w:t/>
             </w:r>
             <w:r>
               <w:rPr>
                 <w:spacing w:val="-2"/>
                 <w:sz w:val="24"/>
               </w:rPr>
-              <w:t>the</w:t>
+              <w:t/>
             </w:r>
             <w:r>
               <w:rPr>
                 <w:spacing w:val="-8"/>
                 <w:sz w:val="24"/>
               </w:rPr>
-              <w:t> </w:t>
+              <w:t/>
             </w:r>
             <w:r>
               <w:rPr>
                 <w:spacing w:val="-2"/>
                 <w:sz w:val="24"/>
               </w:rPr>
-              <w:t>Burner</w:t>
+              <w:t/>
             </w:r>
             <w:r>
               <w:rPr>
                 <w:spacing w:val="27"/>
                 <w:sz w:val="24"/>
               </w:rPr>
-              <w:t> </w:t>
+              <w:t/>
             </w:r>
             <w:r>
               <w:rPr>
                 <w:spacing w:val="-2"/>
                 <w:sz w:val="24"/>
               </w:rPr>
-              <w:t>is</w:t>
+              <w:t/>
             </w:r>
             <w:r>
               <w:rPr>
                 <w:spacing w:val="-7"/>
                 <w:sz w:val="24"/>
               </w:rPr>
-              <w:t> </w:t>
+              <w:t/>
             </w:r>
             <w:r>
               <w:rPr>
                 <w:spacing w:val="-2"/>
                 <w:sz w:val="24"/>
               </w:rPr>
-              <w:t>Automatic</w:t>
+              <w:t/>
             </w:r>
           </w:p>
           <w:p>
@@ -34508,21 +34508,21 @@
                 <w:spacing w:val="-4"/>
                 <w:sz w:val="24"/>
               </w:rPr>
-              <w:t>through</w:t>
+              <w:t/>
             </w:r>
             <w:r>
               <w:rPr>
                 <w:spacing w:val="26"/>
                 <w:sz w:val="24"/>
               </w:rPr>
-              <w:t> </w:t>
+              <w:t/>
             </w:r>
             <w:r>
               <w:rPr>
                 <w:spacing w:val="-4"/>
                 <w:sz w:val="24"/>
               </w:rPr>
-              <w:t>{{pilot_gas_type}} fired Pilot Burner</w:t>
+              <w:t/>
             </w:r>
             <w:r>
               <w:rPr>
@@ -34564,7 +34564,7 @@
                 <w:spacing w:val="-4"/>
                 <w:sz w:val="24"/>
               </w:rPr>
-              <w:t>.</w:t>
+              <w:t/>
             </w:r>
           </w:p>
         </w:tc>
@@ -35229,77 +35229,77 @@
                 <w:spacing w:val="-2"/>
                 <w:sz w:val="24"/>
               </w:rPr>
-              <w:t>8.</w:t>
+              <w:t xml:space="preserve">8. {{ temp_control_scope_text }}</w:t>
             </w:r>
             <w:r>
               <w:rPr>
                 <w:spacing w:val="-15"/>
                 <w:sz w:val="24"/>
               </w:rPr>
-              <w:t> </w:t>
+              <w:t/>
             </w:r>
             <w:r>
               <w:rPr>
                 <w:spacing w:val="-2"/>
                 <w:sz w:val="24"/>
               </w:rPr>
-              <w:t>Temperature</w:t>
+              <w:t/>
             </w:r>
             <w:r>
               <w:rPr>
                 <w:spacing w:val="43"/>
                 <w:sz w:val="24"/>
               </w:rPr>
-              <w:t> </w:t>
+              <w:t/>
             </w:r>
             <w:r>
               <w:rPr>
                 <w:spacing w:val="-2"/>
                 <w:sz w:val="24"/>
               </w:rPr>
-              <w:t>Control</w:t>
+              <w:t/>
             </w:r>
             <w:r>
               <w:rPr>
                 <w:spacing w:val="-7"/>
                 <w:sz w:val="24"/>
               </w:rPr>
-              <w:t> </w:t>
+              <w:t/>
             </w:r>
             <w:r>
               <w:rPr>
                 <w:spacing w:val="-2"/>
                 <w:sz w:val="24"/>
               </w:rPr>
-              <w:t>System</w:t>
+              <w:t/>
             </w:r>
             <w:r>
               <w:rPr>
                 <w:spacing w:val="3"/>
                 <w:sz w:val="24"/>
               </w:rPr>
-              <w:t> </w:t>
+              <w:t/>
             </w:r>
             <w:r>
               <w:rPr>
                 <w:spacing w:val="-2"/>
                 <w:sz w:val="24"/>
               </w:rPr>
-              <w:t>with</w:t>
+              <w:t/>
             </w:r>
             <w:r>
               <w:rPr>
                 <w:spacing w:val="9"/>
                 <w:sz w:val="24"/>
               </w:rPr>
-              <w:t> </w:t>
+              <w:t/>
             </w:r>
             <w:r>
               <w:rPr>
                 <w:spacing w:val="-5"/>
                 <w:sz w:val="24"/>
               </w:rPr>
-              <w:t>PLC</w:t>
+              <w:t/>
             </w:r>
           </w:p>
         </w:tc>
@@ -35321,77 +35321,77 @@
                 <w:spacing w:val="-2"/>
                 <w:sz w:val="24"/>
               </w:rPr>
-              <w:t>8.</w:t>
+              <w:t xml:space="preserve">8. {{ temp_control_scope_text }}</w:t>
             </w:r>
             <w:r>
               <w:rPr>
                 <w:spacing w:val="-15"/>
                 <w:sz w:val="24"/>
               </w:rPr>
-              <w:t> </w:t>
+              <w:t/>
             </w:r>
             <w:r>
               <w:rPr>
                 <w:spacing w:val="-2"/>
                 <w:sz w:val="24"/>
               </w:rPr>
-              <w:t>Temperature</w:t>
+              <w:t/>
             </w:r>
             <w:r>
               <w:rPr>
                 <w:spacing w:val="43"/>
                 <w:sz w:val="24"/>
               </w:rPr>
-              <w:t> </w:t>
+              <w:t/>
             </w:r>
             <w:r>
               <w:rPr>
                 <w:spacing w:val="-2"/>
                 <w:sz w:val="24"/>
               </w:rPr>
-              <w:t>Control</w:t>
+              <w:t/>
             </w:r>
             <w:r>
               <w:rPr>
                 <w:spacing w:val="-7"/>
                 <w:sz w:val="24"/>
               </w:rPr>
-              <w:t> </w:t>
+              <w:t/>
             </w:r>
             <w:r>
               <w:rPr>
                 <w:spacing w:val="-2"/>
                 <w:sz w:val="24"/>
               </w:rPr>
-              <w:t>System</w:t>
+              <w:t/>
             </w:r>
             <w:r>
               <w:rPr>
                 <w:spacing w:val="3"/>
                 <w:sz w:val="24"/>
               </w:rPr>
-              <w:t> </w:t>
+              <w:t/>
             </w:r>
             <w:r>
               <w:rPr>
                 <w:spacing w:val="-2"/>
                 <w:sz w:val="24"/>
               </w:rPr>
-              <w:t>with</w:t>
+              <w:t/>
             </w:r>
             <w:r>
               <w:rPr>
                 <w:spacing w:val="9"/>
                 <w:sz w:val="24"/>
               </w:rPr>
-              <w:t> </w:t>
+              <w:t/>
             </w:r>
             <w:r>
               <w:rPr>
                 <w:spacing w:val="-5"/>
                 <w:sz w:val="24"/>
               </w:rPr>
-              <w:t>PLC</w:t>
+              <w:t/>
             </w:r>
           </w:p>
         </w:tc>
@@ -35417,138 +35417,138 @@
               <w:rPr>
                 <w:sz w:val="24"/>
               </w:rPr>
-              <w:t>9.</w:t>
+              <w:t xml:space="preserve">9. {{ flow_meter_scope_text }}</w:t>
             </w:r>
             <w:r>
               <w:rPr>
                 <w:spacing w:val="-15"/>
                 <w:sz w:val="24"/>
               </w:rPr>
-              <w:t> </w:t>
-            </w:r>
-            <w:r>
-              <w:rPr>
-                <w:sz w:val="24"/>
-              </w:rPr>
-              <w:t>Flow</w:t>
+              <w:t/>
+            </w:r>
+            <w:r>
+              <w:rPr>
+                <w:sz w:val="24"/>
+              </w:rPr>
+              <w:t/>
             </w:r>
             <w:r>
               <w:rPr>
                 <w:spacing w:val="-7"/>
                 <w:sz w:val="24"/>
               </w:rPr>
-              <w:t> </w:t>
-            </w:r>
-            <w:r>
-              <w:rPr>
-                <w:sz w:val="24"/>
-              </w:rPr>
-              <w:t>meter</w:t>
+              <w:t/>
+            </w:r>
+            <w:r>
+              <w:rPr>
+                <w:sz w:val="24"/>
+              </w:rPr>
+              <w:t/>
             </w:r>
             <w:r>
               <w:rPr>
                 <w:spacing w:val="-4"/>
                 <w:sz w:val="24"/>
               </w:rPr>
-              <w:t> </w:t>
-            </w:r>
-            <w:r>
-              <w:rPr>
-                <w:sz w:val="24"/>
-              </w:rPr>
-              <w:t>and</w:t>
+              <w:t/>
+            </w:r>
+            <w:r>
+              <w:rPr>
+                <w:sz w:val="24"/>
+              </w:rPr>
+              <w:t/>
             </w:r>
             <w:r>
               <w:rPr>
                 <w:spacing w:val="-15"/>
                 <w:sz w:val="24"/>
               </w:rPr>
-              <w:t> </w:t>
-            </w:r>
-            <w:r>
-              <w:rPr>
-                <w:sz w:val="24"/>
-              </w:rPr>
-              <w:t>Control</w:t>
+              <w:t/>
+            </w:r>
+            <w:r>
+              <w:rPr>
+                <w:sz w:val="24"/>
+              </w:rPr>
+              <w:t/>
             </w:r>
             <w:r>
               <w:rPr>
                 <w:spacing w:val="-6"/>
                 <w:sz w:val="24"/>
               </w:rPr>
-              <w:t> </w:t>
-            </w:r>
-            <w:r>
-              <w:rPr>
-                <w:sz w:val="24"/>
-              </w:rPr>
-              <w:t>valve</w:t>
+              <w:t/>
+            </w:r>
+            <w:r>
+              <w:rPr>
+                <w:sz w:val="24"/>
+              </w:rPr>
+              <w:t/>
             </w:r>
             <w:r>
               <w:rPr>
                 <w:spacing w:val="41"/>
                 <w:sz w:val="24"/>
               </w:rPr>
-              <w:t> </w:t>
-            </w:r>
-            <w:r>
-              <w:rPr>
-                <w:sz w:val="24"/>
-              </w:rPr>
-              <w:t>in</w:t>
+              <w:t/>
+            </w:r>
+            <w:r>
+              <w:rPr>
+                <w:sz w:val="24"/>
+              </w:rPr>
+              <w:t/>
             </w:r>
             <w:r>
               <w:rPr>
                 <w:spacing w:val="-8"/>
                 <w:sz w:val="24"/>
               </w:rPr>
-              <w:t> </w:t>
-            </w:r>
-            <w:r>
-              <w:rPr>
-                <w:sz w:val="24"/>
-              </w:rPr>
-              <w:t>Oil</w:t>
+              <w:t/>
+            </w:r>
+            <w:r>
+              <w:rPr>
+                <w:sz w:val="24"/>
+              </w:rPr>
+              <w:t/>
             </w:r>
             <w:r>
               <w:rPr>
                 <w:spacing w:val="-12"/>
                 <w:sz w:val="24"/>
               </w:rPr>
-              <w:t> </w:t>
-            </w:r>
-            <w:r>
-              <w:rPr>
-                <w:sz w:val="24"/>
-              </w:rPr>
-              <w:t>and</w:t>
+              <w:t/>
+            </w:r>
+            <w:r>
+              <w:rPr>
+                <w:sz w:val="24"/>
+              </w:rPr>
+              <w:t/>
             </w:r>
             <w:r>
               <w:rPr>
                 <w:spacing w:val="-15"/>
                 <w:sz w:val="24"/>
               </w:rPr>
-              <w:t> </w:t>
-            </w:r>
-            <w:r>
-              <w:rPr>
-                <w:sz w:val="24"/>
-              </w:rPr>
-              <w:t>Air</w:t>
+              <w:t/>
+            </w:r>
+            <w:r>
+              <w:rPr>
+                <w:sz w:val="24"/>
+              </w:rPr>
+              <w:t/>
             </w:r>
             <w:r>
               <w:rPr>
                 <w:spacing w:val="11"/>
                 <w:sz w:val="24"/>
               </w:rPr>
-              <w:t> </w:t>
+              <w:t/>
             </w:r>
             <w:r>
               <w:rPr>
                 <w:spacing w:val="-4"/>
                 <w:sz w:val="24"/>
               </w:rPr>
-              <w:t>line</w:t>
+              <w:t/>
             </w:r>
           </w:p>
         </w:tc>
@@ -35569,131 +35569,131 @@
               <w:rPr>
                 <w:sz w:val="24"/>
               </w:rPr>
-              <w:t>9.</w:t>
+              <w:t xml:space="preserve">9. {{ flow_meter_scope_text }}</w:t>
             </w:r>
             <w:r>
               <w:rPr>
                 <w:spacing w:val="-15"/>
                 <w:sz w:val="24"/>
               </w:rPr>
-              <w:t> </w:t>
-            </w:r>
-            <w:r>
-              <w:rPr>
-                <w:sz w:val="24"/>
-              </w:rPr>
-              <w:t>Flow</w:t>
+              <w:t/>
+            </w:r>
+            <w:r>
+              <w:rPr>
+                <w:sz w:val="24"/>
+              </w:rPr>
+              <w:t/>
             </w:r>
             <w:r>
               <w:rPr>
                 <w:spacing w:val="-7"/>
                 <w:sz w:val="24"/>
               </w:rPr>
-              <w:t> </w:t>
-            </w:r>
-            <w:r>
-              <w:rPr>
-                <w:sz w:val="24"/>
-              </w:rPr>
-              <w:t>meter</w:t>
+              <w:t/>
+            </w:r>
+            <w:r>
+              <w:rPr>
+                <w:sz w:val="24"/>
+              </w:rPr>
+              <w:t/>
             </w:r>
             <w:r>
               <w:rPr>
                 <w:spacing w:val="-6"/>
                 <w:sz w:val="24"/>
               </w:rPr>
-              <w:t> </w:t>
-            </w:r>
-            <w:r>
-              <w:rPr>
-                <w:sz w:val="24"/>
-              </w:rPr>
-              <w:t>and</w:t>
+              <w:t/>
+            </w:r>
+            <w:r>
+              <w:rPr>
+                <w:sz w:val="24"/>
+              </w:rPr>
+              <w:t/>
             </w:r>
             <w:r>
               <w:rPr>
                 <w:spacing w:val="-10"/>
                 <w:sz w:val="24"/>
               </w:rPr>
-              <w:t> </w:t>
-            </w:r>
-            <w:r>
-              <w:rPr>
-                <w:sz w:val="24"/>
-              </w:rPr>
-              <w:t>Control</w:t>
+              <w:t/>
+            </w:r>
+            <w:r>
+              <w:rPr>
+                <w:sz w:val="24"/>
+              </w:rPr>
+              <w:t/>
             </w:r>
             <w:r>
               <w:rPr>
                 <w:spacing w:val="-1"/>
                 <w:sz w:val="24"/>
               </w:rPr>
-              <w:t> </w:t>
-            </w:r>
-            <w:r>
-              <w:rPr>
-                <w:sz w:val="24"/>
-              </w:rPr>
-              <w:t>valve</w:t>
+              <w:t/>
+            </w:r>
+            <w:r>
+              <w:rPr>
+                <w:sz w:val="24"/>
+              </w:rPr>
+              <w:t/>
             </w:r>
             <w:r>
               <w:rPr>
                 <w:spacing w:val="35"/>
                 <w:sz w:val="24"/>
               </w:rPr>
-              <w:t> </w:t>
-            </w:r>
-            <w:r>
-              <w:rPr>
-                <w:sz w:val="24"/>
-              </w:rPr>
-              <w:t>in</w:t>
+              <w:t/>
+            </w:r>
+            <w:r>
+              <w:rPr>
+                <w:sz w:val="24"/>
+              </w:rPr>
+              <w:t/>
             </w:r>
             <w:r>
               <w:rPr>
                 <w:spacing w:val="-8"/>
                 <w:sz w:val="24"/>
               </w:rPr>
-              <w:t> </w:t>
-            </w:r>
-            <w:r>
-              <w:rPr>
-                <w:sz w:val="24"/>
-              </w:rPr>
-              <w:t>Oil</w:t>
+              <w:t/>
+            </w:r>
+            <w:r>
+              <w:rPr>
+                <w:sz w:val="24"/>
+              </w:rPr>
+              <w:t/>
             </w:r>
             <w:r>
               <w:rPr>
                 <w:spacing w:val="-11"/>
                 <w:sz w:val="24"/>
               </w:rPr>
-              <w:t> </w:t>
-            </w:r>
-            <w:r>
-              <w:rPr>
-                <w:sz w:val="24"/>
-              </w:rPr>
-              <w:t>and</w:t>
+              <w:t/>
+            </w:r>
+            <w:r>
+              <w:rPr>
+                <w:sz w:val="24"/>
+              </w:rPr>
+              <w:t/>
             </w:r>
             <w:r>
               <w:rPr>
                 <w:spacing w:val="-7"/>
                 <w:sz w:val="24"/>
               </w:rPr>
-              <w:t> </w:t>
-            </w:r>
-            <w:r>
-              <w:rPr>
-                <w:sz w:val="24"/>
-              </w:rPr>
-              <w:t>Air </w:t>
+              <w:t/>
+            </w:r>
+            <w:r>
+              <w:rPr>
+                <w:sz w:val="24"/>
+              </w:rPr>
+              <w:t/>
             </w:r>
             <w:r>
               <w:rPr>
                 <w:spacing w:val="-4"/>
                 <w:sz w:val="24"/>
               </w:rPr>
-              <w:t>line</w:t>
+              <w:t/>
             </w:r>
           </w:p>
         </w:tc>
@@ -35722,20 +35722,20 @@
               <w:rPr>
                 <w:sz w:val="24"/>
               </w:rPr>
-              <w:t>10.</w:t>
+              <w:t xml:space="preserve">10. {{ pipeline_scope_text }}</w:t>
             </w:r>
             <w:r>
               <w:rPr>
                 <w:spacing w:val="-3"/>
                 <w:sz w:val="24"/>
               </w:rPr>
-              <w:t> </w:t>
-            </w:r>
-            <w:r>
-              <w:rPr>
-                <w:sz w:val="24"/>
-              </w:rPr>
-              <w:t>Interconnecting</w:t>
+              <w:t/>
+            </w:r>
+            <w:r>
+              <w:rPr>
+                <w:sz w:val="24"/>
+              </w:rPr>
+              <w:t/>
             </w:r>
             <w:r>
               <w:rPr>
@@ -35743,61 +35743,61 @@
                 <w:w w:val="150"/>
                 <w:sz w:val="24"/>
               </w:rPr>
-              <w:t> </w:t>
+              <w:t/>
             </w:r>
             <w:r>
               <w:rPr>
                 <w:spacing w:val="-2"/>
                 <w:sz w:val="24"/>
               </w:rPr>
-              <w:t>pipelines</w:t>
+              <w:t/>
             </w:r>
             <w:r>
               <w:rPr>
                 <w:sz w:val="24"/>
               </w:rPr>
               <w:tab/>
-              <w:t>from</w:t>
+              <w:t/>
             </w:r>
             <w:r>
               <w:rPr>
                 <w:spacing w:val="37"/>
                 <w:sz w:val="24"/>
               </w:rPr>
-              <w:t> </w:t>
-            </w:r>
-            <w:r>
-              <w:rPr>
-                <w:sz w:val="24"/>
-              </w:rPr>
-              <w:t>Pumping</w:t>
+              <w:t/>
+            </w:r>
+            <w:r>
+              <w:rPr>
+                <w:sz w:val="24"/>
+              </w:rPr>
+              <w:t/>
             </w:r>
             <w:r>
               <w:rPr>
                 <w:spacing w:val="65"/>
                 <w:sz w:val="24"/>
               </w:rPr>
-              <w:t> </w:t>
-            </w:r>
-            <w:r>
-              <w:rPr>
-                <w:sz w:val="24"/>
-              </w:rPr>
-              <w:t>unit</w:t>
+              <w:t/>
+            </w:r>
+            <w:r>
+              <w:rPr>
+                <w:sz w:val="24"/>
+              </w:rPr>
+              <w:t/>
             </w:r>
             <w:r>
               <w:rPr>
                 <w:spacing w:val="61"/>
                 <w:sz w:val="24"/>
               </w:rPr>
-              <w:t> </w:t>
+              <w:t/>
             </w:r>
             <w:r>
               <w:rPr>
                 <w:spacing w:val="-12"/>
                 <w:sz w:val="24"/>
               </w:rPr>
-              <w:t>&amp;</w:t>
+              <w:t/>
             </w:r>
           </w:p>
           <w:p>
@@ -35813,34 +35813,34 @@
               <w:rPr>
                 <w:sz w:val="24"/>
               </w:rPr>
-              <w:t>blower</w:t>
+              <w:t/>
             </w:r>
             <w:r>
               <w:rPr>
                 <w:spacing w:val="15"/>
                 <w:sz w:val="24"/>
               </w:rPr>
-              <w:t> </w:t>
-            </w:r>
-            <w:r>
-              <w:rPr>
-                <w:sz w:val="24"/>
-              </w:rPr>
-              <w:t>to</w:t>
+              <w:t/>
+            </w:r>
+            <w:r>
+              <w:rPr>
+                <w:sz w:val="24"/>
+              </w:rPr>
+              <w:t/>
             </w:r>
             <w:r>
               <w:rPr>
                 <w:spacing w:val="-14"/>
                 <w:sz w:val="24"/>
               </w:rPr>
-              <w:t> </w:t>
+              <w:t/>
             </w:r>
             <w:r>
               <w:rPr>
                 <w:spacing w:val="-2"/>
                 <w:sz w:val="24"/>
               </w:rPr>
-              <w:t>burner.</w:t>
+              <w:t/>
             </w:r>
           </w:p>
         </w:tc>
@@ -35862,97 +35862,97 @@
                 <w:spacing w:val="-4"/>
                 <w:sz w:val="24"/>
               </w:rPr>
-              <w:t>10.</w:t>
+              <w:t xml:space="preserve">10. {{ pipeline_scope_text }}</w:t>
             </w:r>
             <w:r>
               <w:rPr>
                 <w:spacing w:val="-15"/>
                 <w:sz w:val="24"/>
               </w:rPr>
-              <w:t> </w:t>
+              <w:t/>
             </w:r>
             <w:r>
               <w:rPr>
                 <w:spacing w:val="-4"/>
                 <w:sz w:val="24"/>
               </w:rPr>
-              <w:t>Interconnecting</w:t>
+              <w:t/>
             </w:r>
             <w:r>
               <w:rPr>
                 <w:spacing w:val="29"/>
                 <w:sz w:val="24"/>
               </w:rPr>
-              <w:t> </w:t>
+              <w:t/>
             </w:r>
             <w:r>
               <w:rPr>
                 <w:spacing w:val="-4"/>
                 <w:sz w:val="24"/>
               </w:rPr>
-              <w:t>pipelines</w:t>
+              <w:t/>
             </w:r>
             <w:r>
               <w:rPr>
                 <w:spacing w:val="51"/>
                 <w:sz w:val="24"/>
               </w:rPr>
-              <w:t> </w:t>
+              <w:t/>
             </w:r>
             <w:r>
               <w:rPr>
                 <w:spacing w:val="-4"/>
                 <w:sz w:val="24"/>
               </w:rPr>
-              <w:t>from</w:t>
+              <w:t/>
             </w:r>
             <w:r>
               <w:rPr>
                 <w:spacing w:val="-11"/>
                 <w:sz w:val="24"/>
               </w:rPr>
-              <w:t> </w:t>
+              <w:t/>
             </w:r>
             <w:r>
               <w:rPr>
                 <w:spacing w:val="-4"/>
                 <w:sz w:val="24"/>
               </w:rPr>
-              <w:t>Pumping</w:t>
+              <w:t/>
             </w:r>
             <w:r>
               <w:rPr>
                 <w:spacing w:val="36"/>
                 <w:sz w:val="24"/>
               </w:rPr>
-              <w:t> </w:t>
+              <w:t/>
             </w:r>
             <w:r>
               <w:rPr>
                 <w:spacing w:val="-4"/>
                 <w:sz w:val="24"/>
               </w:rPr>
-              <w:t>unit</w:t>
+              <w:t/>
             </w:r>
             <w:r>
               <w:rPr>
                 <w:spacing w:val="20"/>
                 <w:sz w:val="24"/>
               </w:rPr>
-              <w:t> </w:t>
+              <w:t/>
             </w:r>
             <w:r>
               <w:rPr>
                 <w:spacing w:val="-4"/>
                 <w:sz w:val="24"/>
               </w:rPr>
-              <w:t>&amp; </w:t>
-            </w:r>
-            <w:r>
-              <w:rPr>
-                <w:sz w:val="24"/>
-              </w:rPr>
-              <w:t>blower to burner.</w:t>
+              <w:t/>
+            </w:r>
+            <w:r>
+              <w:rPr>
+                <w:sz w:val="24"/>
+              </w:rPr>
+              <w:t/>
             </w:r>
           </w:p>
         </w:tc>
@@ -37947,6 +37947,166 @@
               <w:t>+</w:t>
               <w:br/>
               <w:t>Boarding &amp; Loading, Local Conveyance &amp; Medical assistance if required</w:t>
+            </w:r>
+            <w:r>
+              <w:rPr>
+                <w:spacing w:val="1"/>
+                <w:sz w:val="24"/>
+              </w:rPr>
+            </w:r>
+            <w:r>
+              <w:rPr>
+                <w:spacing w:val="-2"/>
+                <w:sz w:val="24"/>
+              </w:rPr>
+            </w:r>
+          </w:p>
+        </w:tc>
+      </w:tr>
+      <w:tr>
+        <w:trPr>
+          <w:trHeight w:val="354" w:hRule="atLeast"/>
+        </w:trPr>
+        <w:tc>
+          <w:tcPr>
+            <w:tcW w:w="1022" w:type="dxa"/>
+            <w:vMerge w:val="restart"/>
+          </w:tcPr>
+          <w:p>
+            <w:pPr>
+              <w:pStyle w:val="TableParagraph"/>
+              <w:ind w:left="0"/>
+              <w:rPr>
+                <w:sz w:val="24"/>
+              </w:rPr>
+            </w:pPr>
+            <w:r>
+              <w:t xml:space="preserve">3.</w:t>
+            </w:r>
+          </w:p>
+        </w:tc>
+        <w:tc>
+          <w:tcPr>
+            <w:tcW w:w="4116" w:type="dxa"/>
+            <w:tcBorders>
+              <w:bottom w:val="nil"/>
+              <w:right w:val="nil"/>
+            </w:tcBorders>
+          </w:tcPr>
+          <w:p>
+            <w:pPr>
+              <w:pStyle w:val="TableParagraph"/>
+              <w:spacing w:line="258" w:lineRule="exact" w:before="76"/>
+              <w:ind w:left="1569"/>
+              <w:rPr>
+                <w:b/>
+                <w:sz w:val="24"/>
+              </w:rPr>
+            </w:pPr>
+            <w:r>
+              <w:rPr>
+                <w:b/>
+                <w:sz w:val="24"/>
+              </w:rPr>
+              <w:t/>
+              <w:br/>
+              <w:t/>
+              <w:br/>
+              <w:t/>
+              <w:br/>
+              <w:t/>
+              <w:br/>
+              <w:t/>
+              <w:br/>
+              <w:t/>
+              <w:br/>
+              <w:t/>
+              <w:br/>
+              <w:t/>
+            </w:r>
+            <w:r>
+              <w:rPr>
+                <w:b/>
+                <w:spacing w:val="14"/>
+                <w:sz w:val="24"/>
+              </w:rPr>
+            </w:r>
+            <w:r>
+              <w:rPr>
+                <w:b/>
+                <w:spacing w:val="-2"/>
+                <w:sz w:val="24"/>
+              </w:rPr>
+            </w:r>
+          </w:p>
+        </w:tc>
+        <w:tc>
+          <w:tcPr>
+            <w:tcW w:w="1037" w:type="dxa"/>
+            <w:tcBorders>
+              <w:left w:val="nil"/>
+              <w:bottom w:val="nil"/>
+            </w:tcBorders>
+          </w:tcPr>
+          <w:p>
+            <w:pPr>
+              <w:pStyle w:val="TableParagraph"/>
+              <w:ind w:left="0"/>
+              <w:rPr>
+                <w:sz w:val="22"/>
+              </w:rPr>
+            </w:pPr>
+            <w:r>
+              <w:t/>
+              <w:br/>
+              <w:t/>
+              <w:br/>
+              <w:t/>
+              <w:br/>
+              <w:t/>
+              <w:br/>
+              <w:t/>
+              <w:br/>
+              <w:t/>
+              <w:br/>
+              <w:t/>
+              <w:br/>
+              <w:t/>
+            </w:r>
+          </w:p>
+        </w:tc>
+        <w:tc>
+          <w:tcPr>
+            <w:tcW w:w="4120" w:type="dxa"/>
+            <w:gridSpan w:val="3"/>
+            <w:vMerge w:val="restart"/>
+          </w:tcPr>
+          <w:p>
+            <w:pPr>
+              <w:pStyle w:val="TableParagraph"/>
+              <w:spacing w:before="136"/>
+              <w:ind w:left="208" w:right="140"/>
+              <w:jc w:val="center"/>
+              <w:rPr>
+                <w:sz w:val="24"/>
+              </w:rPr>
+            </w:pPr>
+            <w:r>
+              <w:rPr>
+                <w:sz w:val="24"/>
+              </w:rPr>
+              <w:t/>
+              <w:br/>
+              <w:br/>
+              <w:t/>
+              <w:br/>
+              <w:t/>
+              <w:br/>
+              <w:t/>
+              <w:br/>
+              <w:t/>
+              <w:br/>
+              <w:t/>
             </w:r>
             <w:r>
               <w:rPr>

</xml_diff>

<commit_message>
feat: Annexure III qty multiplier - total = unit x qty
The per-set sum from BOM items is now the unit price; total_price_vertical
becomes unit x vertical_qty. Annexure III row 1 shows:
- QTY = "01 Set" / "02 Sets" / etc. via {{qty_label_vertical}}
- UNIT PRICE = {{unit_price_vertical}} (per-set sum, was previously the
  same as total)
- TOTAL PRICE = {{total_price_vertical}} (now unit x qty)

total_in_words now reflects the qty-multiplied amount across vertical and
horizontal so the words match the printed total.

Same field naming exists for horizontal (qty_label_horizontal,
unit_price_horizontal, total_price_horizontal) ready for the horizontal
page once it gets the matching qty input.

Co-Authored-By: Claude Opus 4.7 (1M context) <noreply@anthropic.com>
</commit_message>
<xml_diff>
--- a/Offer_Template.docx
+++ b/Offer_Template.docx
@@ -37744,7 +37744,7 @@
               <w:rPr>
                 <w:sz w:val="24"/>
               </w:rPr>
-              <w:t>01 Set</w:t>
+              <w:t>{{qty_label_vertical}}</w:t>
             </w:r>
             <w:r>
               <w:rPr>
@@ -37773,7 +37773,7 @@
                 <w:spacing w:val="-2"/>
                 <w:sz w:val="24"/>
               </w:rPr>
-              <w:t>{{total_price_vertical}}</w:t>
+              <w:t>{{unit_price_vertical}}</w:t>
             </w:r>
           </w:p>
         </w:tc>

</xml_diff>

<commit_message>
fix: replace & with 'and' to work around docxtpl ampersand-strip bug
docxtpl was stripping &amp; entities from specific static text runs
during render: 'PACKING & FORWARDING' rendered as 'PACKING  FORWARDING',
'4% & 2 % respectively' as '4%  2 % respectively', and the standalone
'&' separators between Erection/Commissioning and Client/Supervision in
the Annexure III supervision-charges cell became blank lines.

Replacing the bare ampersand with the word 'and' sidesteps the bug.

Co-Authored-By: Claude Opus 4.7 (1M context) <noreply@anthropic.com>
</commit_message>
<xml_diff>
--- a/Offer_Template.docx
+++ b/Offer_Template.docx
@@ -35126,13 +35126,13 @@
               <w:br/>
               <w:t>Erection</w:t>
               <w:br/>
-              <w:t>&amp;</w:t>
+              <w:t>and</w:t>
               <w:br/>
               <w:t>Commissioning</w:t>
               <w:br/>
               <w:t>Erection By Client</w:t>
               <w:br/>
-              <w:t>&amp;</w:t>
+              <w:t>and</w:t>
               <w:br/>
               <w:t>Supervision by Encon</w:t>
             </w:r>
@@ -36437,9 +36437,9 @@
           <w:spacing w:val="-2"/>
           <w:sz w:val="24"/>
         </w:rPr>
-        <w:t>PACKING &amp; FORWARDING</w:t>
+        <w:t>PACKING and FORWARDING</w:t>
         <w:tab/>
-        <w:t>: 4% &amp; 2 % respectively</w:t>
+        <w:t>: 4% and 2 % respectively</w:t>
       </w:r>
       <w:r>
         <w:rPr>

</xml_diff>

<commit_message>
fix: prevent blank pages from consecutive section breaks
After a VLP-only or HLP-only render, the static sectPr that lived
inside is_vertical's PAINTING block ended up adjacent to the sectPr
between is_horizontal and is_oil, creating a blank page in the offer.

Three structural changes:
- Move that PAINTING-end sect break out of is_vertical and into
  is_horizontal's body, so the page break only fires when HLP actually
  follows.
- Drop the consecutive empty sect-bearing paragraph at the bottom of
  the Exclusions/Prices boundary.
- Drop the duplicate trailing sect-break at end-of-document; the final
  sectPr alone is enough.

Together with the earlier empty-paragraph collapse, the offer should
now sit at ~14 pages instead of 19.

Co-Authored-By: Claude Opus 4.7 (1M context) <noreply@anthropic.com>
</commit_message>
<xml_diff>
--- a/Offer_Template.docx
+++ b/Offer_Template.docx
@@ -23209,21 +23209,25 @@
       <w:pPr>
         <w:pStyle w:val="BodyText"/>
         <w:spacing w:after="0" w:line="247" w:lineRule="auto"/>
+      </w:pPr>
+    </w:p>
+    <w:p>
+      <w:r>
+        <w:t xml:space="preserve">{%p endif %}</w:t>
+      </w:r>
+    </w:p>
+    <w:p>
+      <w:r>
+        <w:t xml:space="preserve">{%p if is_horizontal %}</w:t>
+      </w:r>
+    </w:p>
+    <w:p>
+      <w:pPr>
         <w:sectPr>
           <w:pgSz w:w="11930" w:h="16850"/>
           <w:pgMar w:header="0" w:footer="724" w:top="1800" w:bottom="1360" w:left="1134" w:right="1134"/>
         </w:sectPr>
       </w:pPr>
-    </w:p>
-    <w:p>
-      <w:r>
-        <w:t xml:space="preserve">{%p endif %}</w:t>
-      </w:r>
-    </w:p>
-    <w:p>
-      <w:r>
-        <w:t xml:space="preserve">{%p if is_horizontal %}</w:t>
-      </w:r>
     </w:p>
     <w:p>
       <w:pPr>
@@ -35528,19 +35532,6 @@
         </w:tc>
       </w:tr>
     </w:tbl>
-    <w:p>
-      <w:pPr>
-        <w:pStyle w:val="BodyText"/>
-        <w:spacing w:after="0"/>
-        <w:rPr>
-          <w:sz w:val="20"/>
-        </w:rPr>
-        <w:sectPr>
-          <w:pgSz w:w="11930" w:h="16850"/>
-          <w:pgMar w:header="0" w:footer="724" w:top="1420" w:bottom="1360" w:left="1134" w:right="1134"/>
-        </w:sectPr>
-      </w:pPr>
-    </w:p>
     <w:p>
       <w:pPr>
         <w:pStyle w:val="BodyText"/>
@@ -41502,19 +41493,6 @@
         </w:tc>
       </w:tr>
     </w:tbl>
-    <w:p>
-      <w:pPr>
-        <w:pStyle w:val="TableParagraph"/>
-        <w:spacing w:after="0" w:line="262" w:lineRule="exact"/>
-        <w:rPr>
-          <w:sz w:val="24"/>
-        </w:rPr>
-        <w:sectPr>
-          <w:pgSz w:w="11930" w:h="16850"/>
-          <w:pgMar w:header="0" w:footer="724" w:top="1400" w:bottom="1360" w:left="1134" w:right="1134"/>
-        </w:sectPr>
-      </w:pPr>
-    </w:p>
     <w:tbl>
       <w:tblPr>
         <w:tblW w:w="0" w:type="auto"/>

</xml_diff>

<commit_message>
fix: Annexure III prices in Indian format + blank Total/In-words rows
Costs now print with lakh/crore digit grouping (e.g. 36,22,037.83
instead of 3,622,037.83). Adds engine helper _format_inr that splits
the integer part into the standard ##,##,##,###.## groups and applies
it to unit_price_*, total_price_*, and supervision_mech / supervision_plc.

Annexure III's last two rows (Total and In words) are now intentionally
left blank in the template so the user can fill them in after adding
extra charges to the empty S.No 3 row.

Co-Authored-By: Claude Opus 4.7 (1M context) <noreply@anthropic.com>
</commit_message>
<xml_diff>
--- a/Offer_Template.docx
+++ b/Offer_Template.docx
@@ -6700,9 +6700,7 @@
               <w:spacing w:after="40" w:before="40"/>
               <w:jc w:val="right"/>
             </w:pPr>
-            <w:r>
-              <w:t>Total (INR)</w:t>
-            </w:r>
+            <w:r/>
           </w:p>
         </w:tc>
         <w:tc>
@@ -6728,9 +6726,7 @@
               <w:spacing w:after="40" w:before="40"/>
               <w:jc w:val="right"/>
             </w:pPr>
-            <w:r>
-              <w:t>{{total_price_vertical}}</w:t>
-            </w:r>
+            <w:r/>
           </w:p>
         </w:tc>
       </w:tr>
@@ -6759,9 +6755,7 @@
               <w:spacing w:after="40" w:before="40"/>
               <w:jc w:val="center"/>
             </w:pPr>
-            <w:r>
-              <w:t>In words: INR {{total_in_words}}</w:t>
-            </w:r>
+            <w:r/>
           </w:p>
         </w:tc>
       </w:tr>

</xml_diff>

<commit_message>
fix: drop page break before Temperature Control System section
The template had an empty paragraph carrying a <w:br type='page'/> just
before 'Temperature Control System', which forced that section onto a
new page. Strip the page-break run so the section flows inline with
the Burner Control System block above it.

Co-Authored-By: Claude Opus 4.7 (1M context) <noreply@anthropic.com>
</commit_message>
<xml_diff>
--- a/Offer_Template.docx
+++ b/Offer_Template.docx
@@ -4955,9 +4955,7 @@
       </w:r>
     </w:p>
     <w:p>
-      <w:r>
-        <w:br w:type="page"/>
-      </w:r>
+      <w:r/>
     </w:p>
     <w:p>
       <w:pPr>

</xml_diff>

<commit_message>
fix: Annexure I rows 1 and 3 react to fuel type
- Row 1 ('Burner with burner block & mounting plate (...)') now uses
  {{fuel_name}} instead of hardcoded 'Natural Gas', so dual-fuel offers
  show e.g. 'NG & MG'.
- Row 3 switches between 'ENCON Film Burner' / 'ENCON Dual Burner' /
  'ENCON Gas Burner' via inline Jinja, matching the burner heading
  earlier in the doc.

Co-Authored-By: Claude Opus 4.7 (1M context) <noreply@anthropic.com>
</commit_message>
<xml_diff>
--- a/Offer_Template.docx
+++ b/Offer_Template.docx
@@ -5471,12 +5471,7 @@
               <w:jc w:val="left"/>
             </w:pPr>
             <w:r>
-              <w:rPr>
-                <w:rFonts w:ascii="Calibri" w:cs="Calibri" w:eastAsia="Calibri" w:hAnsi="Calibri"/>
-                <w:sz w:val="22"/>
-                <w:szCs w:val="22"/>
-              </w:rPr>
-              <w:t xml:space="preserve">Burner with burner block &amp; mounting plate (Natural Gas)</w:t>
+              <w:t>Burner with burner block &amp; mounting plate ({{fuel_name}})</w:t>
             </w:r>
           </w:p>
         </w:tc>
@@ -5611,12 +5606,7 @@
               <w:jc w:val="left"/>
             </w:pPr>
             <w:r>
-              <w:rPr>
-                <w:rFonts w:ascii="Calibri" w:cs="Calibri" w:eastAsia="Calibri" w:hAnsi="Calibri"/>
-                <w:sz w:val="22"/>
-                <w:szCs w:val="22"/>
-              </w:rPr>
-              <w:t xml:space="preserve">ENCON gas burner</w:t>
+              <w:t>{% if is_oil %}ENCON Film Burner{% elif is_dual %}ENCON Dual Burner{% else %}ENCON Gas Burner{% endif %}</w:t>
             </w:r>
           </w:p>
         </w:tc>

</xml_diff>

<commit_message>
feat: re-introduce Oil Heating and Pumping Unit block for oil/dual offers
- Bring back the {%p if is_oil or is_dual %} block in the template
  right after the ENCON Burner body. It renders the heading, intro
  paragraph, and a bullet list of components.
- Update _pumping_unit_block helper to match the requested wording:
    * Pure-oil fuels (LDO/FO/LSHS) -> 'Pumping Unit' + Duplex-2 intro,
      4 bullets.
    * Other oil/dual fuels -> 'Oil Heating and Pumping Unit' + Duplex-2
      intro, 5 bullets including '2 No. electric Oil Preheater with
      thermostatic Control.'
- Dry-renders confirm the section appears for oil offers and is fully
  hidden for gas offers.

Co-Authored-By: Claude Opus 4.7 (1M context) <noreply@anthropic.com>
</commit_message>
<xml_diff>
--- a/Offer_Template.docx
+++ b/Offer_Template.docx
@@ -4424,6 +4424,73 @@
           <w:rFonts w:ascii="Calibri" w:cs="Calibri" w:eastAsia="Calibri" w:hAnsi="Calibri"/>
         </w:rPr>
         <w:t>For {{equipment_name}}, we will supply 1 No. of ENCON burner of {{burner_kw}}.</w:t>
+      </w:r>
+    </w:p>
+    <w:p>
+      <w:pPr>
+        <w:spacing w:after="60" w:before="60" w:line="300"/>
+        <w:jc w:val="left"/>
+      </w:pPr>
+      <w:r>
+        <w:t xml:space="preserve">{%p if is_oil or is_dual %}</w:t>
+      </w:r>
+    </w:p>
+    <w:p>
+      <w:pPr>
+        <w:pStyle w:val="Heading3"/>
+        <w:spacing w:after="80" w:before="200"/>
+      </w:pPr>
+      <w:r>
+        <w:t xml:space="preserve">{{ pumping_unit_heading }}</w:t>
+      </w:r>
+    </w:p>
+    <w:p>
+      <w:pPr>
+        <w:spacing w:after="60" w:before="60" w:line="300"/>
+        <w:jc w:val="left"/>
+      </w:pPr>
+      <w:r>
+        <w:t xml:space="preserve">{{ pumping_unit_intro }}</w:t>
+      </w:r>
+    </w:p>
+    <w:p>
+      <w:pPr>
+        <w:spacing w:after="60" w:before="60" w:line="300"/>
+        <w:jc w:val="left"/>
+      </w:pPr>
+      <w:r>
+        <w:t xml:space="preserve">{%p for x in pumping_unit_items %}</w:t>
+      </w:r>
+    </w:p>
+    <w:p>
+      <w:pPr>
+        <w:pStyle w:val="ListParagraph"/>
+        <w:numPr>
+          <w:ilvl w:val="0"/>
+          <w:numId w:val="2"/>
+        </w:numPr>
+        <w:spacing w:after="40" w:before="40" w:line="280"/>
+      </w:pPr>
+      <w:r>
+        <w:t xml:space="preserve">{{ x.item }}</w:t>
+      </w:r>
+    </w:p>
+    <w:p>
+      <w:pPr>
+        <w:spacing w:after="60" w:before="60" w:line="300"/>
+        <w:jc w:val="left"/>
+      </w:pPr>
+      <w:r>
+        <w:t xml:space="preserve">{%p endfor %}</w:t>
+      </w:r>
+    </w:p>
+    <w:p>
+      <w:pPr>
+        <w:spacing w:after="60" w:before="60" w:line="300"/>
+        <w:jc w:val="left"/>
+      </w:pPr>
+      <w:r>
+        <w:t xml:space="preserve">{%p endif %}</w:t>
       </w:r>
     </w:p>
     <w:p>

</xml_diff>

<commit_message>
fix: drop pilot-tagged accessories + redundant 'Air Train' block
Two related cleanups:

1. _control_system_sections: items whose names contain '(Pilot Burner)'
   or '(UV LINE)' (BALL VALVE / FLEXIBLE HOSE accessories) are no
   longer routed into pilot_pipeline_items -- they are skipped
   entirely. They were noise in the offer.
2. _control_system_sections: '<X> PILOT LINE' MEDIA values no longer
   leak into fuel2_media when scanning for the second main fuel-line
   in dual-fuel offers (it was picking up 'LPG PILOT LINE' as
   fuel2_line_label).
3. Offer_Template.docx: drop the static 'Air Train for Main Burner'
   heading + 4 component bullets. The Burner Control System block
   already lists those items via the BOM-driven 'On the main air
   pipeline' for-loop, so the static block was duplicating content.

Co-Authored-By: Claude Opus 4.7 (1M context) <noreply@anthropic.com>
</commit_message>
<xml_diff>
--- a/Offer_Template.docx
+++ b/Offer_Template.docx
@@ -4520,107 +4520,6 @@
           <w:rFonts w:ascii="Calibri" w:cs="Calibri" w:eastAsia="Calibri" w:hAnsi="Calibri"/>
         </w:rPr>
         <w:t xml:space="preserve">To supply combustion air to the burner, we provide a centrifugal steel-plate air blower of suitable capacity, equipped with a squirrel-cage induction motor of reputed make (ABB / CGL / BB). The blower is direct-driven, with the impeller mounted on the motor shaft.</w:t>
-      </w:r>
-    </w:p>
-    <w:p>
-      <w:pPr>
-        <w:pStyle w:val="Heading3"/>
-        <w:spacing w:after="80" w:before="200"/>
-      </w:pPr>
-      <w:r>
-        <w:rPr>
-          <w:rFonts w:ascii="Calibri" w:cs="Calibri" w:eastAsia="Calibri" w:hAnsi="Calibri"/>
-          <w:b/>
-          <w:bCs/>
-          <w:color w:val="1F2937"/>
-          <w:sz w:val="22"/>
-          <w:szCs w:val="22"/>
-        </w:rPr>
-        <w:t xml:space="preserve">Air Train for Main Burner</w:t>
-      </w:r>
-    </w:p>
-    <w:p>
-      <w:pPr>
-        <w:spacing w:after="40" w:before="60" w:line="300"/>
-        <w:jc w:val="left"/>
-      </w:pPr>
-      <w:r>
-        <w:rPr>
-          <w:rFonts w:ascii="Calibri" w:cs="Calibri" w:eastAsia="Calibri" w:hAnsi="Calibri"/>
-        </w:rPr>
-        <w:t xml:space="preserve">The air train consists of the following main components:</w:t>
-      </w:r>
-    </w:p>
-    <w:p>
-      <w:pPr>
-        <w:pStyle w:val="ListParagraph"/>
-        <w:numPr>
-          <w:ilvl w:val="0"/>
-          <w:numId w:val="2"/>
-        </w:numPr>
-        <w:spacing w:after="40" w:before="40" w:line="280"/>
-      </w:pPr>
-      <w:r>
-        <w:rPr>
-          <w:rFonts w:ascii="Calibri" w:cs="Calibri" w:eastAsia="Calibri" w:hAnsi="Calibri"/>
-          <w:sz w:val="22"/>
-          <w:szCs w:val="22"/>
-        </w:rPr>
-        <w:t xml:space="preserve">Pressure gauge with manual cock</w:t>
-      </w:r>
-    </w:p>
-    <w:p>
-      <w:pPr>
-        <w:pStyle w:val="ListParagraph"/>
-        <w:numPr>
-          <w:ilvl w:val="0"/>
-          <w:numId w:val="2"/>
-        </w:numPr>
-        <w:spacing w:after="40" w:before="40" w:line="280"/>
-      </w:pPr>
-      <w:r>
-        <w:rPr>
-          <w:rFonts w:ascii="Calibri" w:cs="Calibri" w:eastAsia="Calibri" w:hAnsi="Calibri"/>
-          <w:sz w:val="22"/>
-          <w:szCs w:val="22"/>
-        </w:rPr>
-        <w:t xml:space="preserve">Orifice plate with DPT</w:t>
-      </w:r>
-    </w:p>
-    <w:p>
-      <w:pPr>
-        <w:pStyle w:val="ListParagraph"/>
-        <w:numPr>
-          <w:ilvl w:val="0"/>
-          <w:numId w:val="2"/>
-        </w:numPr>
-        <w:spacing w:after="40" w:before="40" w:line="280"/>
-      </w:pPr>
-      <w:r>
-        <w:rPr>
-          <w:rFonts w:ascii="Calibri" w:cs="Calibri" w:eastAsia="Calibri" w:hAnsi="Calibri"/>
-          <w:sz w:val="22"/>
-          <w:szCs w:val="22"/>
-        </w:rPr>
-        <w:t xml:space="preserve">Pneumatic flow-control valve</w:t>
-      </w:r>
-    </w:p>
-    <w:p>
-      <w:pPr>
-        <w:pStyle w:val="ListParagraph"/>
-        <w:numPr>
-          <w:ilvl w:val="0"/>
-          <w:numId w:val="2"/>
-        </w:numPr>
-        <w:spacing w:after="40" w:before="40" w:line="280"/>
-      </w:pPr>
-      <w:r>
-        <w:rPr>
-          <w:rFonts w:ascii="Calibri" w:cs="Calibri" w:eastAsia="Calibri" w:hAnsi="Calibri"/>
-          <w:sz w:val="22"/>
-          <w:szCs w:val="22"/>
-        </w:rPr>
-        <w:t xml:space="preserve">Butterfly valve (BFV)</w:t>
       </w:r>
     </w:p>
     <w:p>

</xml_diff>

<commit_message>
chore: reorder template sections - Combustion Air Blower + Pumping Unit move
Move two blocks to better match the desired offer flow:
- Pumping Unit ({%p if is_oil or is_dual %}) now sits AFTER the Pilot
  Burner section, not right after the burner body.
- Combustion Air Blower (heading + body) now sits BETWEEN the Pilot
  Burner endif and the Pumping Unit, so the order reads:
    ENCON Burner -> Burner Control System (gas/air pipeline lists) ->
    Pilot Burner (conditional) -> Combustion Air Blower ->
    Pumping Unit (conditional, oil/dual only) -> Nitrogen Purging
    (conditional) -> Temperature Control System.

Co-Authored-By: Claude Opus 4.7 (1M context) <noreply@anthropic.com>
</commit_message>
<xml_diff>
--- a/Offer_Template.docx
+++ b/Offer_Template.docx
@@ -4424,102 +4424,6 @@
           <w:rFonts w:ascii="Calibri" w:cs="Calibri" w:eastAsia="Calibri" w:hAnsi="Calibri"/>
         </w:rPr>
         <w:t>For {{equipment_name}}, we will supply 1 No. of ENCON burner of {{burner_kw}}.</w:t>
-      </w:r>
-    </w:p>
-    <w:p>
-      <w:pPr>
-        <w:spacing w:after="60" w:before="60" w:line="300"/>
-        <w:jc w:val="left"/>
-      </w:pPr>
-      <w:r>
-        <w:t xml:space="preserve">{%p if is_oil or is_dual %}</w:t>
-      </w:r>
-    </w:p>
-    <w:p>
-      <w:pPr>
-        <w:pStyle w:val="Heading3"/>
-        <w:spacing w:after="80" w:before="200"/>
-      </w:pPr>
-      <w:r>
-        <w:t xml:space="preserve">{{ pumping_unit_heading }}</w:t>
-      </w:r>
-    </w:p>
-    <w:p>
-      <w:pPr>
-        <w:spacing w:after="60" w:before="60" w:line="300"/>
-        <w:jc w:val="left"/>
-      </w:pPr>
-      <w:r>
-        <w:t xml:space="preserve">{{ pumping_unit_intro }}</w:t>
-      </w:r>
-    </w:p>
-    <w:p>
-      <w:pPr>
-        <w:spacing w:after="60" w:before="60" w:line="300"/>
-        <w:jc w:val="left"/>
-      </w:pPr>
-      <w:r>
-        <w:t xml:space="preserve">{%p for x in pumping_unit_items %}</w:t>
-      </w:r>
-    </w:p>
-    <w:p>
-      <w:pPr>
-        <w:pStyle w:val="ListParagraph"/>
-        <w:numPr>
-          <w:ilvl w:val="0"/>
-          <w:numId w:val="2"/>
-        </w:numPr>
-        <w:spacing w:after="40" w:before="40" w:line="280"/>
-      </w:pPr>
-      <w:r>
-        <w:t xml:space="preserve">{{ x.item }}</w:t>
-      </w:r>
-    </w:p>
-    <w:p>
-      <w:pPr>
-        <w:spacing w:after="60" w:before="60" w:line="300"/>
-        <w:jc w:val="left"/>
-      </w:pPr>
-      <w:r>
-        <w:t xml:space="preserve">{%p endfor %}</w:t>
-      </w:r>
-    </w:p>
-    <w:p>
-      <w:pPr>
-        <w:spacing w:after="60" w:before="60" w:line="300"/>
-        <w:jc w:val="left"/>
-      </w:pPr>
-      <w:r>
-        <w:t xml:space="preserve">{%p endif %}</w:t>
-      </w:r>
-    </w:p>
-    <w:p>
-      <w:pPr>
-        <w:pStyle w:val="Heading3"/>
-        <w:spacing w:after="80" w:before="200"/>
-      </w:pPr>
-      <w:r>
-        <w:rPr>
-          <w:rFonts w:ascii="Calibri" w:cs="Calibri" w:eastAsia="Calibri" w:hAnsi="Calibri"/>
-          <w:b/>
-          <w:bCs/>
-          <w:color w:val="1F2937"/>
-          <w:sz w:val="22"/>
-          <w:szCs w:val="22"/>
-        </w:rPr>
-        <w:t xml:space="preserve">Combustion Air Blower</w:t>
-      </w:r>
-    </w:p>
-    <w:p>
-      <w:pPr>
-        <w:spacing w:after="60" w:before="60" w:line="300"/>
-        <w:jc w:val="left"/>
-      </w:pPr>
-      <w:r>
-        <w:rPr>
-          <w:rFonts w:ascii="Calibri" w:cs="Calibri" w:eastAsia="Calibri" w:hAnsi="Calibri"/>
-        </w:rPr>
-        <w:t xml:space="preserve">To supply combustion air to the burner, we provide a centrifugal steel-plate air blower of suitable capacity, equipped with a squirrel-cage induction motor of reputed make (ABB / CGL / BB). The blower is direct-driven, with the impeller mounted on the motor shaft.</w:t>
       </w:r>
     </w:p>
     <w:p>
@@ -4845,6 +4749,102 @@
     <w:p>
       <w:pPr>
         <w:spacing w:after="60" w:before="120"/>
+      </w:pPr>
+      <w:r>
+        <w:t xml:space="preserve">{%p endif %}</w:t>
+      </w:r>
+    </w:p>
+    <w:p>
+      <w:pPr>
+        <w:pStyle w:val="Heading3"/>
+        <w:spacing w:after="80" w:before="200"/>
+      </w:pPr>
+      <w:r>
+        <w:rPr>
+          <w:rFonts w:ascii="Calibri" w:cs="Calibri" w:eastAsia="Calibri" w:hAnsi="Calibri"/>
+          <w:b/>
+          <w:bCs/>
+          <w:color w:val="1F2937"/>
+          <w:sz w:val="22"/>
+          <w:szCs w:val="22"/>
+        </w:rPr>
+        <w:t xml:space="preserve">Combustion Air Blower</w:t>
+      </w:r>
+    </w:p>
+    <w:p>
+      <w:pPr>
+        <w:spacing w:after="60" w:before="60" w:line="300"/>
+        <w:jc w:val="left"/>
+      </w:pPr>
+      <w:r>
+        <w:rPr>
+          <w:rFonts w:ascii="Calibri" w:cs="Calibri" w:eastAsia="Calibri" w:hAnsi="Calibri"/>
+        </w:rPr>
+        <w:t xml:space="preserve">To supply combustion air to the burner, we provide a centrifugal steel-plate air blower of suitable capacity, equipped with a squirrel-cage induction motor of reputed make (ABB / CGL / BB). The blower is direct-driven, with the impeller mounted on the motor shaft.</w:t>
+      </w:r>
+    </w:p>
+    <w:p>
+      <w:pPr>
+        <w:spacing w:after="60" w:before="60" w:line="300"/>
+        <w:jc w:val="left"/>
+      </w:pPr>
+      <w:r>
+        <w:t xml:space="preserve">{%p if is_oil or is_dual %}</w:t>
+      </w:r>
+    </w:p>
+    <w:p>
+      <w:pPr>
+        <w:pStyle w:val="Heading3"/>
+        <w:spacing w:after="80" w:before="200"/>
+      </w:pPr>
+      <w:r>
+        <w:t xml:space="preserve">{{ pumping_unit_heading }}</w:t>
+      </w:r>
+    </w:p>
+    <w:p>
+      <w:pPr>
+        <w:spacing w:after="60" w:before="60" w:line="300"/>
+        <w:jc w:val="left"/>
+      </w:pPr>
+      <w:r>
+        <w:t xml:space="preserve">{{ pumping_unit_intro }}</w:t>
+      </w:r>
+    </w:p>
+    <w:p>
+      <w:pPr>
+        <w:spacing w:after="60" w:before="60" w:line="300"/>
+        <w:jc w:val="left"/>
+      </w:pPr>
+      <w:r>
+        <w:t xml:space="preserve">{%p for x in pumping_unit_items %}</w:t>
+      </w:r>
+    </w:p>
+    <w:p>
+      <w:pPr>
+        <w:pStyle w:val="ListParagraph"/>
+        <w:numPr>
+          <w:ilvl w:val="0"/>
+          <w:numId w:val="2"/>
+        </w:numPr>
+        <w:spacing w:after="40" w:before="40" w:line="280"/>
+      </w:pPr>
+      <w:r>
+        <w:t xml:space="preserve">{{ x.item }}</w:t>
+      </w:r>
+    </w:p>
+    <w:p>
+      <w:pPr>
+        <w:spacing w:after="60" w:before="60" w:line="300"/>
+        <w:jc w:val="left"/>
+      </w:pPr>
+      <w:r>
+        <w:t xml:space="preserve">{%p endfor %}</w:t>
+      </w:r>
+    </w:p>
+    <w:p>
+      <w:pPr>
+        <w:spacing w:after="60" w:before="60" w:line="300"/>
+        <w:jc w:val="left"/>
       </w:pPr>
       <w:r>
         <w:t xml:space="preserve">{%p endif %}</w:t>

</xml_diff>

<commit_message>
fix: round Burner Capacity to next 100 + drop (R1) labels + dual fuel
- Tech Specs 'Burner Capacity (R1)' now rounds the firing-rate up to
  the nearest 100 (e.g. 1365 -> 1400) so the offer states the design
  capacity rather than the raw calc result.
- For dual-fuel offers the Burner Capacity cell shows both fuels:
    Fuel 1: <round100> Nm3/hr
    Fuel 2: <round100> Nm3/hr
- Drop the '(R1)' suffix from both Tech Specs row labels:
    'Firing Rate (R1)'      -> 'Firing Rate'
    'Burner Capacity (R1)'  -> 'Burner Capacity'

The Firing Rate row remains the exact computed value (no rounding);
only Burner Capacity rounds up.

Co-Authored-By: Claude Opus 4.7 (1M context) <noreply@anthropic.com>
</commit_message>
<xml_diff>
--- a/Offer_Template.docx
+++ b/Offer_Template.docx
@@ -3685,7 +3685,7 @@
                 <w:sz w:val="22"/>
                 <w:szCs w:val="22"/>
               </w:rPr>
-              <w:t xml:space="preserve">Firing Rate (R1)</w:t>
+              <w:t>Firing Rate</w:t>
             </w:r>
           </w:p>
         </w:tc>
@@ -3750,7 +3750,7 @@
                 <w:sz w:val="22"/>
                 <w:szCs w:val="22"/>
               </w:rPr>
-              <w:t xml:space="preserve">Burner Capacity (R1)</w:t>
+              <w:t>Burner Capacity</w:t>
             </w:r>
           </w:p>
         </w:tc>

</xml_diff>

<commit_message>
fix: Electrical Control Panel - hide PLC/PID bullet in manual mode
Wrap the PLC/PID bullet in a {%p if control_mode != 'manual' %} block
so the line is removed entirely for manual-mode offers (no controller
ships in that case). PLC mode keeps 'PLC (Siemens S7-1200)', PID mode
keeps 'PID' (no make), manual mode drops the bullet.

Co-Authored-By: Claude Opus 4.7 (1M context) <noreply@anthropic.com>
</commit_message>
<xml_diff>
--- a/Offer_Template.docx
+++ b/Offer_Template.docx
@@ -5131,12 +5131,38 @@
         <w:spacing w:after="40" w:before="40" w:line="280"/>
       </w:pPr>
       <w:r>
+        <w:t xml:space="preserve">{%p if control_mode != "manual" %}</w:t>
+      </w:r>
+    </w:p>
+    <w:p>
+      <w:pPr>
+        <w:pStyle w:val="ListParagraph"/>
+        <w:numPr>
+          <w:ilvl w:val="0"/>
+          <w:numId w:val="2"/>
+        </w:numPr>
+        <w:spacing w:after="40" w:before="40" w:line="280"/>
+      </w:pPr>
+      <w:r>
         <w:rPr>
           <w:rFonts w:ascii="Calibri" w:cs="Calibri" w:eastAsia="Calibri" w:hAnsi="Calibri"/>
           <w:sz w:val="22"/>
           <w:szCs w:val="22"/>
         </w:rPr>
         <w:t>{% if auto_control_type == "pid" %}PID{% else %}PLC (Siemens S7-1200){% endif %}</w:t>
+      </w:r>
+    </w:p>
+    <w:p>
+      <w:pPr>
+        <w:pStyle w:val="ListParagraph"/>
+        <w:numPr>
+          <w:ilvl w:val="0"/>
+          <w:numId w:val="2"/>
+        </w:numPr>
+        <w:spacing w:after="40" w:before="40" w:line="280"/>
+      </w:pPr>
+      <w:r>
+        <w:t xml:space="preserve">{%p endif %}</w:t>
       </w:r>
     </w:p>
     <w:p>

</xml_diff>

<commit_message>
fix: consolidate Lifting & Lowering Mechanism with Hydraulic System
The offer body had two adjacent paragraphs ('Lifting & Lowering
Mechanism' and 'Hydraulic System') that overlapped in scope -- both
described the hydraulic cylinder + power pack arrangement and the
hood movement. Merge them into a single 'Lifting & Lowering
Mechanism' paragraph that retains:
- Operational description ('up and down' movement, single-acting
  cylinder, parking/working positions LS1/LS2, 85 deg lift).
- Safety (mechanical locking against hydraulic failure).
- Hydraulic equipment inventory (oil tank, pump+motor, valves, gauges,
  filters, pressure-relief, etc.).

Drop the standalone 'Hydraulic System' heading + body (~3 paragraphs
removed).

Co-Authored-By: Claude Opus 4.7 (1M context) <noreply@anthropic.com>
</commit_message>
<xml_diff>
--- a/Offer_Template.docx
+++ b/Offer_Template.docx
@@ -4365,36 +4365,7 @@
         <w:rPr>
           <w:rFonts w:ascii="Calibri" w:cs="Calibri" w:eastAsia="Calibri" w:hAnsi="Calibri"/>
         </w:rPr>
-        <w:t xml:space="preserve">The lifting/lowering mechanism of the hood will be operated by a hydraulic cylinder and power pack. The maximum lift and lower travel will be governed through limit switches. An additional mechanical locking arrangement will prevent the hood from dropping in case of hydraulic failure. The hydraulic system will consist of an oil tank, oil pump with motor, suction strainer, pressure gauges with thumb-operated needle valve, directional valves, pilot-operated check valves, pressure hoses, level switch, return-line filter, all filters with clogging switch and indicator, pressure-relief valve, pressure switch, and temperature gauge.</w:t>
-      </w:r>
-    </w:p>
-    <w:p>
-      <w:pPr>
-        <w:pStyle w:val="Heading3"/>
-        <w:spacing w:after="80" w:before="200"/>
-      </w:pPr>
-      <w:r>
-        <w:rPr>
-          <w:rFonts w:ascii="Calibri" w:cs="Calibri" w:eastAsia="Calibri" w:hAnsi="Calibri"/>
-          <w:b/>
-          <w:bCs/>
-          <w:color w:val="1F2937"/>
-          <w:sz w:val="22"/>
-          <w:szCs w:val="22"/>
-        </w:rPr>
-        <w:t xml:space="preserve">Hydraulic System</w:t>
-      </w:r>
-    </w:p>
-    <w:p>
-      <w:pPr>
-        <w:spacing w:after="60" w:before="60" w:line="300"/>
-        <w:jc w:val="left"/>
-      </w:pPr>
-      <w:r>
-        <w:rPr>
-          <w:rFonts w:ascii="Calibri" w:cs="Calibri" w:eastAsia="Calibri" w:hAnsi="Calibri"/>
-        </w:rPr>
-        <w:t xml:space="preserve">To remove the ladle easily after drying/heating, the system provides “up and down” movement of the hood. Lifting/lowering is performed by a single-acting (push) hydraulic cylinder fitted in the column with a dedicated power pack. Limit switches LS1 and LS2 will indicate parking and working positions respectively. The maximum lift of the arm is 85° from its parking position. One dedicated power pack of suitable capacity will be provided for operating the hydraulic cylinder.</w:t>
+        <w:t>To remove the ladle easily after drying/heating, the system provides “up and down” movement of the hood. Lifting/lowering is performed by a single-acting (push) hydraulic cylinder fitted in the column with a dedicated power pack of suitable capacity. Limit switches LS1 and LS2 indicate the parking and working positions respectively, with a maximum lift of 85° from the parking position. An additional mechanical locking arrangement prevents the hood from dropping in case of hydraulic failure. The hydraulic system comprises an oil tank, oil pump with motor, suction strainer, pressure gauges with thumb-operated needle valve, directional valves, pilot-operated check valves, pressure hoses, level switch, return-line filter (with clogging switch and indicator), pressure-relief valve, pressure switch, and temperature gauge.</w:t>
       </w:r>
     </w:p>
     <w:p>

</xml_diff>

<commit_message>
feat: GAS TRAIN renders with 8-item nested sub-bullets in NG/LPG/RLNG offers
Engine: each pipeline-list item now carries a sub_items array; the GAS
TRAIN entry on NG/LPG/RLNG fuel lines gets the 8-item internals list
attached as sub_items, every other entry gets an empty list.

Template: a nested {%p for s in x.sub_items %}...{%p endfor %} loop is
inserted right after every pipeline {{ x.item }} bullet, with the inner
paragraph indented an extra 0.8 cm from the parent bullet so sub-items
visually nest. Empty sub_items render nothing, so non-gas-train items
are unaffected.

Sub-bullet list (no parens, matching earlier 'remove parens' guidance):
  Gas Filter
  Slam Shut-off Valve
  Gas Pressure Regulator
  Solenoid Valves
  Pressure Switches
  Pressure Gauges
  Manual Isolation Valves
  Vent Valve

Co-Authored-By: Claude Opus 4.7 (1M context) <noreply@anthropic.com>
</commit_message>
<xml_diff>
--- a/Offer_Template.docx
+++ b/Offer_Template.docx
@@ -4471,6 +4471,46 @@
         <w:spacing w:after="40" w:before="40" w:line="280"/>
       </w:pPr>
       <w:r>
+        <w:t xml:space="preserve">{%p for s in x.sub_items %}</w:t>
+      </w:r>
+    </w:p>
+    <w:p>
+      <w:pPr>
+        <w:pStyle w:val="ListParagraph"/>
+        <w:numPr>
+          <w:ilvl w:val="0"/>
+          <w:numId w:val="2"/>
+        </w:numPr>
+        <w:spacing w:after="40" w:before="40" w:line="280"/>
+        <w:ind w:left="453"/>
+      </w:pPr>
+      <w:r>
+        <w:t xml:space="preserve">{{ s.item }}</w:t>
+      </w:r>
+    </w:p>
+    <w:p>
+      <w:pPr>
+        <w:pStyle w:val="ListParagraph"/>
+        <w:numPr>
+          <w:ilvl w:val="0"/>
+          <w:numId w:val="2"/>
+        </w:numPr>
+        <w:spacing w:after="40" w:before="40" w:line="280"/>
+      </w:pPr>
+      <w:r>
+        <w:t xml:space="preserve">{%p endfor %}</w:t>
+      </w:r>
+    </w:p>
+    <w:p>
+      <w:pPr>
+        <w:pStyle w:val="ListParagraph"/>
+        <w:numPr>
+          <w:ilvl w:val="0"/>
+          <w:numId w:val="2"/>
+        </w:numPr>
+        <w:spacing w:after="40" w:before="40" w:line="280"/>
+      </w:pPr>
+      <w:r>
         <w:t xml:space="preserve">{%p endfor %}</w:t>
       </w:r>
     </w:p>
@@ -4506,6 +4546,46 @@
       </w:pPr>
       <w:r>
         <w:t xml:space="preserve">{{ x.item }}</w:t>
+      </w:r>
+    </w:p>
+    <w:p>
+      <w:pPr>
+        <w:pStyle w:val="ListParagraph"/>
+        <w:numPr>
+          <w:ilvl w:val="0"/>
+          <w:numId w:val="2"/>
+        </w:numPr>
+        <w:spacing w:after="40" w:before="40" w:line="280"/>
+      </w:pPr>
+      <w:r>
+        <w:t xml:space="preserve">{%p for s in x.sub_items %}</w:t>
+      </w:r>
+    </w:p>
+    <w:p>
+      <w:pPr>
+        <w:pStyle w:val="ListParagraph"/>
+        <w:numPr>
+          <w:ilvl w:val="0"/>
+          <w:numId w:val="2"/>
+        </w:numPr>
+        <w:spacing w:after="40" w:before="40" w:line="280"/>
+        <w:ind w:left="453"/>
+      </w:pPr>
+      <w:r>
+        <w:t xml:space="preserve">{{ s.item }}</w:t>
+      </w:r>
+    </w:p>
+    <w:p>
+      <w:pPr>
+        <w:pStyle w:val="ListParagraph"/>
+        <w:numPr>
+          <w:ilvl w:val="0"/>
+          <w:numId w:val="2"/>
+        </w:numPr>
+        <w:spacing w:after="40" w:before="40" w:line="280"/>
+      </w:pPr>
+      <w:r>
+        <w:t xml:space="preserve">{%p endfor %}</w:t>
       </w:r>
     </w:p>
     <w:p>
@@ -4585,6 +4665,46 @@
         <w:spacing w:after="40" w:before="40" w:line="280"/>
       </w:pPr>
       <w:r>
+        <w:t xml:space="preserve">{%p for s in x.sub_items %}</w:t>
+      </w:r>
+    </w:p>
+    <w:p>
+      <w:pPr>
+        <w:pStyle w:val="ListParagraph"/>
+        <w:numPr>
+          <w:ilvl w:val="0"/>
+          <w:numId w:val="2"/>
+        </w:numPr>
+        <w:spacing w:after="40" w:before="40" w:line="280"/>
+        <w:ind w:left="453"/>
+      </w:pPr>
+      <w:r>
+        <w:t xml:space="preserve">{{ s.item }}</w:t>
+      </w:r>
+    </w:p>
+    <w:p>
+      <w:pPr>
+        <w:pStyle w:val="ListParagraph"/>
+        <w:numPr>
+          <w:ilvl w:val="0"/>
+          <w:numId w:val="2"/>
+        </w:numPr>
+        <w:spacing w:after="40" w:before="40" w:line="280"/>
+      </w:pPr>
+      <w:r>
+        <w:t xml:space="preserve">{%p endfor %}</w:t>
+      </w:r>
+    </w:p>
+    <w:p>
+      <w:pPr>
+        <w:pStyle w:val="ListParagraph"/>
+        <w:numPr>
+          <w:ilvl w:val="0"/>
+          <w:numId w:val="2"/>
+        </w:numPr>
+        <w:spacing w:after="40" w:before="40" w:line="280"/>
+      </w:pPr>
+      <w:r>
         <w:t xml:space="preserve">{%p endfor %}</w:t>
       </w:r>
     </w:p>
@@ -4652,6 +4772,46 @@
         <w:spacing w:after="40" w:before="40" w:line="280"/>
       </w:pPr>
       <w:r>
+        <w:t xml:space="preserve">{%p for s in x.sub_items %}</w:t>
+      </w:r>
+    </w:p>
+    <w:p>
+      <w:pPr>
+        <w:pStyle w:val="ListParagraph"/>
+        <w:numPr>
+          <w:ilvl w:val="0"/>
+          <w:numId w:val="2"/>
+        </w:numPr>
+        <w:spacing w:after="40" w:before="40" w:line="280"/>
+        <w:ind w:left="453"/>
+      </w:pPr>
+      <w:r>
+        <w:t xml:space="preserve">{{ s.item }}</w:t>
+      </w:r>
+    </w:p>
+    <w:p>
+      <w:pPr>
+        <w:pStyle w:val="ListParagraph"/>
+        <w:numPr>
+          <w:ilvl w:val="0"/>
+          <w:numId w:val="2"/>
+        </w:numPr>
+        <w:spacing w:after="40" w:before="40" w:line="280"/>
+      </w:pPr>
+      <w:r>
+        <w:t xml:space="preserve">{%p endfor %}</w:t>
+      </w:r>
+    </w:p>
+    <w:p>
+      <w:pPr>
+        <w:pStyle w:val="ListParagraph"/>
+        <w:numPr>
+          <w:ilvl w:val="0"/>
+          <w:numId w:val="2"/>
+        </w:numPr>
+        <w:spacing w:after="40" w:before="40" w:line="280"/>
+      </w:pPr>
+      <w:r>
         <w:t xml:space="preserve">{%p endfor %}</w:t>
       </w:r>
     </w:p>
@@ -4702,6 +4862,46 @@
       </w:pPr>
       <w:r>
         <w:t xml:space="preserve">{{ x.item }}</w:t>
+      </w:r>
+    </w:p>
+    <w:p>
+      <w:pPr>
+        <w:pStyle w:val="ListParagraph"/>
+        <w:numPr>
+          <w:ilvl w:val="0"/>
+          <w:numId w:val="2"/>
+        </w:numPr>
+        <w:spacing w:after="40" w:before="40" w:line="280"/>
+      </w:pPr>
+      <w:r>
+        <w:t xml:space="preserve">{%p for s in x.sub_items %}</w:t>
+      </w:r>
+    </w:p>
+    <w:p>
+      <w:pPr>
+        <w:pStyle w:val="ListParagraph"/>
+        <w:numPr>
+          <w:ilvl w:val="0"/>
+          <w:numId w:val="2"/>
+        </w:numPr>
+        <w:spacing w:after="40" w:before="40" w:line="280"/>
+        <w:ind w:left="453"/>
+      </w:pPr>
+      <w:r>
+        <w:t xml:space="preserve">{{ s.item }}</w:t>
+      </w:r>
+    </w:p>
+    <w:p>
+      <w:pPr>
+        <w:pStyle w:val="ListParagraph"/>
+        <w:numPr>
+          <w:ilvl w:val="0"/>
+          <w:numId w:val="2"/>
+        </w:numPr>
+        <w:spacing w:after="40" w:before="40" w:line="280"/>
+      </w:pPr>
+      <w:r>
+        <w:t xml:space="preserve">{%p endfor %}</w:t>
       </w:r>
     </w:p>
     <w:p>
@@ -4805,6 +5005,46 @@
     </w:p>
     <w:p>
       <w:pPr>
+        <w:pStyle w:val="ListParagraph"/>
+        <w:numPr>
+          <w:ilvl w:val="0"/>
+          <w:numId w:val="2"/>
+        </w:numPr>
+        <w:spacing w:after="40" w:before="40" w:line="280"/>
+      </w:pPr>
+      <w:r>
+        <w:t xml:space="preserve">{%p for s in x.sub_items %}</w:t>
+      </w:r>
+    </w:p>
+    <w:p>
+      <w:pPr>
+        <w:pStyle w:val="ListParagraph"/>
+        <w:numPr>
+          <w:ilvl w:val="0"/>
+          <w:numId w:val="2"/>
+        </w:numPr>
+        <w:spacing w:after="40" w:before="40" w:line="280"/>
+        <w:ind w:left="453"/>
+      </w:pPr>
+      <w:r>
+        <w:t xml:space="preserve">{{ s.item }}</w:t>
+      </w:r>
+    </w:p>
+    <w:p>
+      <w:pPr>
+        <w:pStyle w:val="ListParagraph"/>
+        <w:numPr>
+          <w:ilvl w:val="0"/>
+          <w:numId w:val="2"/>
+        </w:numPr>
+        <w:spacing w:after="40" w:before="40" w:line="280"/>
+      </w:pPr>
+      <w:r>
+        <w:t xml:space="preserve">{%p endfor %}</w:t>
+      </w:r>
+    </w:p>
+    <w:p>
+      <w:pPr>
         <w:spacing w:after="60" w:before="60" w:line="300"/>
         <w:jc w:val="left"/>
       </w:pPr>
@@ -4880,6 +5120,46 @@
         <w:spacing w:after="40" w:before="40" w:line="280"/>
       </w:pPr>
       <w:r>
+        <w:t xml:space="preserve">{%p for s in x.sub_items %}</w:t>
+      </w:r>
+    </w:p>
+    <w:p>
+      <w:pPr>
+        <w:pStyle w:val="ListParagraph"/>
+        <w:numPr>
+          <w:ilvl w:val="0"/>
+          <w:numId w:val="2"/>
+        </w:numPr>
+        <w:spacing w:after="40" w:before="40" w:line="280"/>
+        <w:ind w:left="453"/>
+      </w:pPr>
+      <w:r>
+        <w:t xml:space="preserve">{{ s.item }}</w:t>
+      </w:r>
+    </w:p>
+    <w:p>
+      <w:pPr>
+        <w:pStyle w:val="ListParagraph"/>
+        <w:numPr>
+          <w:ilvl w:val="0"/>
+          <w:numId w:val="2"/>
+        </w:numPr>
+        <w:spacing w:after="40" w:before="40" w:line="280"/>
+      </w:pPr>
+      <w:r>
+        <w:t xml:space="preserve">{%p endfor %}</w:t>
+      </w:r>
+    </w:p>
+    <w:p>
+      <w:pPr>
+        <w:pStyle w:val="ListParagraph"/>
+        <w:numPr>
+          <w:ilvl w:val="0"/>
+          <w:numId w:val="2"/>
+        </w:numPr>
+        <w:spacing w:after="40" w:before="40" w:line="280"/>
+      </w:pPr>
+      <w:r>
         <w:t xml:space="preserve">{%p endfor %}</w:t>
       </w:r>
     </w:p>
@@ -4935,6 +5215,46 @@
       </w:pPr>
       <w:r>
         <w:t xml:space="preserve">{{ x.item }}</w:t>
+      </w:r>
+    </w:p>
+    <w:p>
+      <w:pPr>
+        <w:pStyle w:val="ListParagraph"/>
+        <w:numPr>
+          <w:ilvl w:val="0"/>
+          <w:numId w:val="3"/>
+        </w:numPr>
+        <w:spacing w:after="40" w:before="40" w:line="280"/>
+      </w:pPr>
+      <w:r>
+        <w:t xml:space="preserve">{%p for s in x.sub_items %}</w:t>
+      </w:r>
+    </w:p>
+    <w:p>
+      <w:pPr>
+        <w:pStyle w:val="ListParagraph"/>
+        <w:numPr>
+          <w:ilvl w:val="0"/>
+          <w:numId w:val="3"/>
+        </w:numPr>
+        <w:spacing w:after="40" w:before="40" w:line="280"/>
+        <w:ind w:left="453"/>
+      </w:pPr>
+      <w:r>
+        <w:t xml:space="preserve">{{ s.item }}</w:t>
+      </w:r>
+    </w:p>
+    <w:p>
+      <w:pPr>
+        <w:pStyle w:val="ListParagraph"/>
+        <w:numPr>
+          <w:ilvl w:val="0"/>
+          <w:numId w:val="3"/>
+        </w:numPr>
+        <w:spacing w:after="40" w:before="40" w:line="280"/>
+      </w:pPr>
+      <w:r>
+        <w:t xml:space="preserve">{%p endfor %}</w:t>
       </w:r>
     </w:p>
     <w:p>

</xml_diff>

<commit_message>
fix: GAS TRAIN sub-bullets render as proper Word nested-list level
The previous attempt at sub-bullets only changed paragraph left indent;
Word's bullet character is positioned by the list level, not by the
paragraph ind, so the bullets ended up at the same horizontal position
as the parent (visual indent broke).

- numbering.xml: add an ilvl=1 definition to abstractNumId=2 (open
  circle bullet, 1.0 cm left indent, 0.36 cm hanging).
- Sub-bullet paragraphs in the pipeline lists now use numPr/ilvl=1
  instead of an ad-hoc paragraph indent. Word now renders them as a
  true nested level under the parent GAS TRAIN bullet.

Output now reads:
  - GAS TRAIN
       o Gas Filter
       o Slam Shut-off Valve
       o ... (rest of internals)
  - ORIFICE PLATE
  - DPT
  - CONTROL VALVE

Co-Authored-By: Claude Opus 4.7 (1M context) <noreply@anthropic.com>
</commit_message>
<xml_diff>
--- a/Offer_Template.docx
+++ b/Offer_Template.docx
@@ -4478,11 +4478,10 @@
       <w:pPr>
         <w:pStyle w:val="ListParagraph"/>
         <w:numPr>
-          <w:ilvl w:val="0"/>
+          <w:ilvl w:val="1"/>
           <w:numId w:val="2"/>
         </w:numPr>
         <w:spacing w:after="40" w:before="40" w:line="280"/>
-        <w:ind w:left="453"/>
       </w:pPr>
       <w:r>
         <w:t xml:space="preserve">{{ s.item }}</w:t>
@@ -4565,11 +4564,10 @@
       <w:pPr>
         <w:pStyle w:val="ListParagraph"/>
         <w:numPr>
-          <w:ilvl w:val="0"/>
+          <w:ilvl w:val="1"/>
           <w:numId w:val="2"/>
         </w:numPr>
         <w:spacing w:after="40" w:before="40" w:line="280"/>
-        <w:ind w:left="453"/>
       </w:pPr>
       <w:r>
         <w:t xml:space="preserve">{{ s.item }}</w:t>
@@ -4672,11 +4670,10 @@
       <w:pPr>
         <w:pStyle w:val="ListParagraph"/>
         <w:numPr>
-          <w:ilvl w:val="0"/>
+          <w:ilvl w:val="1"/>
           <w:numId w:val="2"/>
         </w:numPr>
         <w:spacing w:after="40" w:before="40" w:line="280"/>
-        <w:ind w:left="453"/>
       </w:pPr>
       <w:r>
         <w:t xml:space="preserve">{{ s.item }}</w:t>
@@ -4779,11 +4776,10 @@
       <w:pPr>
         <w:pStyle w:val="ListParagraph"/>
         <w:numPr>
-          <w:ilvl w:val="0"/>
+          <w:ilvl w:val="1"/>
           <w:numId w:val="2"/>
         </w:numPr>
         <w:spacing w:after="40" w:before="40" w:line="280"/>
-        <w:ind w:left="453"/>
       </w:pPr>
       <w:r>
         <w:t xml:space="preserve">{{ s.item }}</w:t>
@@ -4881,11 +4877,10 @@
       <w:pPr>
         <w:pStyle w:val="ListParagraph"/>
         <w:numPr>
-          <w:ilvl w:val="0"/>
+          <w:ilvl w:val="1"/>
           <w:numId w:val="2"/>
         </w:numPr>
         <w:spacing w:after="40" w:before="40" w:line="280"/>
-        <w:ind w:left="453"/>
       </w:pPr>
       <w:r>
         <w:t xml:space="preserve">{{ s.item }}</w:t>
@@ -5020,11 +5015,10 @@
       <w:pPr>
         <w:pStyle w:val="ListParagraph"/>
         <w:numPr>
-          <w:ilvl w:val="0"/>
+          <w:ilvl w:val="1"/>
           <w:numId w:val="2"/>
         </w:numPr>
         <w:spacing w:after="40" w:before="40" w:line="280"/>
-        <w:ind w:left="453"/>
       </w:pPr>
       <w:r>
         <w:t xml:space="preserve">{{ s.item }}</w:t>
@@ -5127,11 +5121,10 @@
       <w:pPr>
         <w:pStyle w:val="ListParagraph"/>
         <w:numPr>
-          <w:ilvl w:val="0"/>
+          <w:ilvl w:val="1"/>
           <w:numId w:val="2"/>
         </w:numPr>
         <w:spacing w:after="40" w:before="40" w:line="280"/>
-        <w:ind w:left="453"/>
       </w:pPr>
       <w:r>
         <w:t xml:space="preserve">{{ s.item }}</w:t>
@@ -5234,11 +5227,10 @@
       <w:pPr>
         <w:pStyle w:val="ListParagraph"/>
         <w:numPr>
-          <w:ilvl w:val="0"/>
+          <w:ilvl w:val="1"/>
           <w:numId w:val="3"/>
         </w:numPr>
         <w:spacing w:after="40" w:before="40" w:line="280"/>
-        <w:ind w:left="453"/>
       </w:pPr>
       <w:r>
         <w:t xml:space="preserve">{{ s.item }}</w:t>
@@ -19206,6 +19198,18 @@
         <w:ind w:left="540" w:hanging="270"/>
       </w:pPr>
     </w:lvl>
+    <w:lvl w:ilvl="1">
+      <w:start w:val="1"/>
+      <w:numFmt w:val="bullet"/>
+      <w:lvlText w:val="○"/>
+      <w:lvlJc w:val="left"/>
+      <w:pPr>
+        <w:ind w:left="1440" w:hanging="360"/>
+      </w:pPr>
+      <w:rPr>
+        <w:rFonts w:ascii="Symbol" w:hAnsi="Symbol" w:hint="default"/>
+      </w:rPr>
+    </w:lvl>
   </w:abstractNum>
   <w:abstractNum w:abstractNumId="3" w15:restartNumberingAfterBreak="0">
     <w:multiLevelType w:val="hybridMultilevel"/>

</xml_diff>

<commit_message>
chore: club Annexure V same-client rows; applications stacked as line breaks
Group rows by exact client name and put each application on its own
line within the same Application cell (one <w:p> per app). 75 rows
condense to 49 unique-client rows in both Offer_Template.docx
(Annexure V) and Tundish_Offer_Template.docx, with the multi-
application clients (BMM Ispat, Siemens, JSL, etc.) reading as e.g.

  BMM Ispat Ltd.    Vertical Ladle Preheater
                    Horizontal Ladle Preheater
                    Tundish Preheater

S. No. renumbered sequentially.

Near-duplicate spelling variants (e.g. 'Danieli India Ltd.' vs
'Danieli India Limited') still render on separate rows because the
client text doesn't match exactly.

Co-Authored-By: Claude Opus 4.7 (1M context) <noreply@anthropic.com>
</commit_message>
<xml_diff>
--- a/Offer_Template.docx
+++ b/Offer_Template.docx
@@ -8124,7 +8124,7 @@
                 <w:sz w:val="22"/>
                 <w:szCs w:val="22"/>
               </w:rPr>
-              <w:t>1</w:t>
+              <w:t xml:space="preserve">1</w:t>
             </w:r>
           </w:p>
         </w:tc>
@@ -8207,7 +8207,7 @@
               <w:bottom w:val="single" w:color="BFBFBF" w:sz="4"/>
               <w:right w:val="single" w:color="BFBFBF" w:sz="4"/>
             </w:tcBorders>
-            <w:shd w:fill="FFFFFF" w:val="clear"/>
+            <w:shd w:fill="F3F4F6" w:val="clear"/>
             <w:tcMar>
               <w:top w:type="dxa" w:w="100"/>
               <w:left w:type="dxa" w:w="140"/>
@@ -8227,7 +8227,7 @@
                 <w:sz w:val="22"/>
                 <w:szCs w:val="22"/>
               </w:rPr>
-              <w:t>2</w:t>
+              <w:t xml:space="preserve">2</w:t>
             </w:r>
           </w:p>
         </w:tc>
@@ -8240,7 +8240,7 @@
               <w:bottom w:val="single" w:color="BFBFBF" w:sz="4"/>
               <w:right w:val="single" w:color="BFBFBF" w:sz="4"/>
             </w:tcBorders>
-            <w:shd w:fill="FFFFFF" w:val="clear"/>
+            <w:shd w:fill="F3F4F6" w:val="clear"/>
             <w:tcMar>
               <w:top w:type="dxa" w:w="100"/>
               <w:left w:type="dxa" w:w="140"/>
@@ -8275,7 +8275,7 @@
               <w:bottom w:val="single" w:color="BFBFBF" w:sz="4"/>
               <w:right w:val="single" w:color="BFBFBF" w:sz="4"/>
             </w:tcBorders>
-            <w:shd w:fill="FFFFFF" w:val="clear"/>
+            <w:shd w:fill="F3F4F6" w:val="clear"/>
             <w:tcMar>
               <w:top w:type="dxa" w:w="100"/>
               <w:left w:type="dxa" w:w="140"/>
@@ -8330,7 +8330,7 @@
                 <w:sz w:val="22"/>
                 <w:szCs w:val="22"/>
               </w:rPr>
-              <w:t>3</w:t>
+              <w:t xml:space="preserve">3</w:t>
             </w:r>
           </w:p>
         </w:tc>
@@ -8413,7 +8413,7 @@
               <w:bottom w:val="single" w:color="BFBFBF" w:sz="4"/>
               <w:right w:val="single" w:color="BFBFBF" w:sz="4"/>
             </w:tcBorders>
-            <w:shd w:fill="FFFFFF" w:val="clear"/>
+            <w:shd w:fill="F3F4F6" w:val="clear"/>
             <w:tcMar>
               <w:top w:type="dxa" w:w="100"/>
               <w:left w:type="dxa" w:w="140"/>
@@ -8433,7 +8433,7 @@
                 <w:sz w:val="22"/>
                 <w:szCs w:val="22"/>
               </w:rPr>
-              <w:t>4</w:t>
+              <w:t xml:space="preserve">4</w:t>
             </w:r>
           </w:p>
         </w:tc>
@@ -8446,7 +8446,7 @@
               <w:bottom w:val="single" w:color="BFBFBF" w:sz="4"/>
               <w:right w:val="single" w:color="BFBFBF" w:sz="4"/>
             </w:tcBorders>
-            <w:shd w:fill="FFFFFF" w:val="clear"/>
+            <w:shd w:fill="F3F4F6" w:val="clear"/>
             <w:tcMar>
               <w:top w:type="dxa" w:w="100"/>
               <w:left w:type="dxa" w:w="140"/>
@@ -8481,7 +8481,7 @@
               <w:bottom w:val="single" w:color="BFBFBF" w:sz="4"/>
               <w:right w:val="single" w:color="BFBFBF" w:sz="4"/>
             </w:tcBorders>
-            <w:shd w:fill="FFFFFF" w:val="clear"/>
+            <w:shd w:fill="F3F4F6" w:val="clear"/>
             <w:tcMar>
               <w:top w:type="dxa" w:w="100"/>
               <w:left w:type="dxa" w:w="140"/>
@@ -8516,7 +8516,7 @@
               <w:bottom w:val="single" w:color="BFBFBF" w:sz="4"/>
               <w:right w:val="single" w:color="BFBFBF" w:sz="4"/>
             </w:tcBorders>
-            <w:shd w:fill="FFFFFF" w:val="clear"/>
+            <w:shd w:fill="F3F4F6" w:val="clear"/>
             <w:tcMar>
               <w:top w:type="dxa" w:w="100"/>
               <w:left w:type="dxa" w:w="140"/>
@@ -8536,7 +8536,7 @@
                 <w:sz w:val="22"/>
                 <w:szCs w:val="22"/>
               </w:rPr>
-              <w:t>5</w:t>
+              <w:t xml:space="preserve">5</w:t>
             </w:r>
           </w:p>
         </w:tc>
@@ -8549,7 +8549,7 @@
               <w:bottom w:val="single" w:color="BFBFBF" w:sz="4"/>
               <w:right w:val="single" w:color="BFBFBF" w:sz="4"/>
             </w:tcBorders>
-            <w:shd w:fill="FFFFFF" w:val="clear"/>
+            <w:shd w:fill="F3F4F6" w:val="clear"/>
             <w:tcMar>
               <w:top w:type="dxa" w:w="100"/>
               <w:left w:type="dxa" w:w="140"/>
@@ -8584,7 +8584,7 @@
               <w:bottom w:val="single" w:color="BFBFBF" w:sz="4"/>
               <w:right w:val="single" w:color="BFBFBF" w:sz="4"/>
             </w:tcBorders>
-            <w:shd w:fill="FFFFFF" w:val="clear"/>
+            <w:shd w:fill="F3F4F6" w:val="clear"/>
             <w:tcMar>
               <w:top w:type="dxa" w:w="100"/>
               <w:left w:type="dxa" w:w="140"/>
@@ -8605,6 +8605,34 @@
                 <w:szCs w:val="22"/>
               </w:rPr>
               <w:t xml:space="preserve">Vertical Ladle Preheater</w:t>
+            </w:r>
+          </w:p>
+          <w:p>
+            <w:pPr>
+              <w:spacing w:after="40" w:before="40"/>
+              <w:jc w:val="left"/>
+            </w:pPr>
+            <w:r>
+              <w:rPr>
+                <w:rFonts w:ascii="Calibri" w:cs="Calibri" w:eastAsia="Calibri" w:hAnsi="Calibri"/>
+                <w:sz w:val="22"/>
+                <w:szCs w:val="22"/>
+              </w:rPr>
+              <w:t xml:space="preserve">Horizontal Ladle Preheater</w:t>
+            </w:r>
+          </w:p>
+          <w:p>
+            <w:pPr>
+              <w:spacing w:after="40" w:before="40"/>
+              <w:jc w:val="left"/>
+            </w:pPr>
+            <w:r>
+              <w:rPr>
+                <w:rFonts w:ascii="Calibri" w:cs="Calibri" w:eastAsia="Calibri" w:hAnsi="Calibri"/>
+                <w:sz w:val="22"/>
+                <w:szCs w:val="22"/>
+              </w:rPr>
+              <w:t xml:space="preserve">Tundish Preheater</w:t>
             </w:r>
           </w:p>
         </w:tc>
@@ -8639,7 +8667,7 @@
                 <w:sz w:val="22"/>
                 <w:szCs w:val="22"/>
               </w:rPr>
-              <w:t>6</w:t>
+              <w:t xml:space="preserve">6</w:t>
             </w:r>
           </w:p>
         </w:tc>
@@ -8674,7 +8702,7 @@
                 <w:sz w:val="22"/>
                 <w:szCs w:val="22"/>
               </w:rPr>
-              <w:t xml:space="preserve">BMM Ispat Ltd.</w:t>
+              <w:t xml:space="preserve">Electrotherm India Ltd.</w:t>
             </w:r>
           </w:p>
         </w:tc>
@@ -8707,7 +8735,21 @@
                 <w:sz w:val="22"/>
                 <w:szCs w:val="22"/>
               </w:rPr>
-              <w:t xml:space="preserve">Horizontal Ladle Preheater</w:t>
+              <w:t xml:space="preserve">Vertical Ladle Preheater - 15 MT</w:t>
+            </w:r>
+          </w:p>
+          <w:p>
+            <w:pPr>
+              <w:spacing w:after="40" w:before="40"/>
+              <w:jc w:val="left"/>
+            </w:pPr>
+            <w:r>
+              <w:rPr>
+                <w:rFonts w:ascii="Calibri" w:cs="Calibri" w:eastAsia="Calibri" w:hAnsi="Calibri"/>
+                <w:sz w:val="22"/>
+                <w:szCs w:val="22"/>
+              </w:rPr>
+              <w:t xml:space="preserve">Horizontal Ladle Preheater - 15 MT</w:t>
             </w:r>
           </w:p>
         </w:tc>
@@ -8722,7 +8764,7 @@
               <w:bottom w:val="single" w:color="BFBFBF" w:sz="4"/>
               <w:right w:val="single" w:color="BFBFBF" w:sz="4"/>
             </w:tcBorders>
-            <w:shd w:fill="FFFFFF" w:val="clear"/>
+            <w:shd w:fill="F3F4F6" w:val="clear"/>
             <w:tcMar>
               <w:top w:type="dxa" w:w="100"/>
               <w:left w:type="dxa" w:w="140"/>
@@ -8742,7 +8784,7 @@
                 <w:sz w:val="22"/>
                 <w:szCs w:val="22"/>
               </w:rPr>
-              <w:t>7</w:t>
+              <w:t xml:space="preserve">7</w:t>
             </w:r>
           </w:p>
         </w:tc>
@@ -8755,7 +8797,7 @@
               <w:bottom w:val="single" w:color="BFBFBF" w:sz="4"/>
               <w:right w:val="single" w:color="BFBFBF" w:sz="4"/>
             </w:tcBorders>
-            <w:shd w:fill="FFFFFF" w:val="clear"/>
+            <w:shd w:fill="F3F4F6" w:val="clear"/>
             <w:tcMar>
               <w:top w:type="dxa" w:w="100"/>
               <w:left w:type="dxa" w:w="140"/>
@@ -8777,7 +8819,7 @@
                 <w:sz w:val="22"/>
                 <w:szCs w:val="22"/>
               </w:rPr>
-              <w:t xml:space="preserve">BMM Ispat Ltd.</w:t>
+              <w:t xml:space="preserve">Siemens Ltd.</w:t>
             </w:r>
           </w:p>
         </w:tc>
@@ -8790,27 +8832,41 @@
               <w:bottom w:val="single" w:color="BFBFBF" w:sz="4"/>
               <w:right w:val="single" w:color="BFBFBF" w:sz="4"/>
             </w:tcBorders>
-            <w:shd w:fill="FFFFFF" w:val="clear"/>
-            <w:tcMar>
-              <w:top w:type="dxa" w:w="100"/>
-              <w:left w:type="dxa" w:w="140"/>
-              <w:bottom w:type="dxa" w:w="100"/>
-              <w:right w:type="dxa" w:w="140"/>
-            </w:tcMar>
-            <w:vAlign w:val="center"/>
-          </w:tcPr>
-          <w:p>
-            <w:pPr>
-              <w:spacing w:after="40" w:before="40"/>
-              <w:jc w:val="left"/>
-            </w:pPr>
-            <w:r>
-              <w:rPr>
-                <w:rFonts w:ascii="Calibri" w:cs="Calibri" w:eastAsia="Calibri" w:hAnsi="Calibri"/>
-                <w:sz w:val="22"/>
-                <w:szCs w:val="22"/>
-              </w:rPr>
-              <w:t xml:space="preserve">Tundish Preheater</w:t>
+            <w:shd w:fill="F3F4F6" w:val="clear"/>
+            <w:tcMar>
+              <w:top w:type="dxa" w:w="100"/>
+              <w:left w:type="dxa" w:w="140"/>
+              <w:bottom w:type="dxa" w:w="100"/>
+              <w:right w:type="dxa" w:w="140"/>
+            </w:tcMar>
+            <w:vAlign w:val="center"/>
+          </w:tcPr>
+          <w:p>
+            <w:pPr>
+              <w:spacing w:after="40" w:before="40"/>
+              <w:jc w:val="left"/>
+            </w:pPr>
+            <w:r>
+              <w:rPr>
+                <w:rFonts w:ascii="Calibri" w:cs="Calibri" w:eastAsia="Calibri" w:hAnsi="Calibri"/>
+                <w:sz w:val="22"/>
+                <w:szCs w:val="22"/>
+              </w:rPr>
+              <w:t xml:space="preserve">Horizontal Ladle Preheater</w:t>
+            </w:r>
+          </w:p>
+          <w:p>
+            <w:pPr>
+              <w:spacing w:after="40" w:before="40"/>
+              <w:jc w:val="left"/>
+            </w:pPr>
+            <w:r>
+              <w:rPr>
+                <w:rFonts w:ascii="Calibri" w:cs="Calibri" w:eastAsia="Calibri" w:hAnsi="Calibri"/>
+                <w:sz w:val="22"/>
+                <w:szCs w:val="22"/>
+              </w:rPr>
+              <w:t xml:space="preserve">Vertical Ladle Preheater</w:t>
             </w:r>
           </w:p>
         </w:tc>
@@ -8845,7 +8901,7 @@
                 <w:sz w:val="22"/>
                 <w:szCs w:val="22"/>
               </w:rPr>
-              <w:t>8</w:t>
+              <w:t xml:space="preserve">8</w:t>
             </w:r>
           </w:p>
         </w:tc>
@@ -8880,7 +8936,7 @@
                 <w:sz w:val="22"/>
                 <w:szCs w:val="22"/>
               </w:rPr>
-              <w:t xml:space="preserve">Electrotherm India Ltd.</w:t>
+              <w:t xml:space="preserve">E &amp; P Division Electrotherm India Ltd.</w:t>
             </w:r>
           </w:p>
         </w:tc>
@@ -8913,7 +8969,21 @@
                 <w:sz w:val="22"/>
                 <w:szCs w:val="22"/>
               </w:rPr>
-              <w:t xml:space="preserve">Vertical Ladle Preheater - 15 MT</w:t>
+              <w:t xml:space="preserve">Horizontal Ladle Preheater - 30 MT</w:t>
+            </w:r>
+          </w:p>
+          <w:p>
+            <w:pPr>
+              <w:spacing w:after="40" w:before="40"/>
+              <w:jc w:val="left"/>
+            </w:pPr>
+            <w:r>
+              <w:rPr>
+                <w:rFonts w:ascii="Calibri" w:cs="Calibri" w:eastAsia="Calibri" w:hAnsi="Calibri"/>
+                <w:sz w:val="22"/>
+                <w:szCs w:val="22"/>
+              </w:rPr>
+              <w:t xml:space="preserve">Vertical Ladle Preheater - 30 MT</w:t>
             </w:r>
           </w:p>
         </w:tc>
@@ -8928,7 +8998,7 @@
               <w:bottom w:val="single" w:color="BFBFBF" w:sz="4"/>
               <w:right w:val="single" w:color="BFBFBF" w:sz="4"/>
             </w:tcBorders>
-            <w:shd w:fill="FFFFFF" w:val="clear"/>
+            <w:shd w:fill="F3F4F6" w:val="clear"/>
             <w:tcMar>
               <w:top w:type="dxa" w:w="100"/>
               <w:left w:type="dxa" w:w="140"/>
@@ -8948,7 +9018,7 @@
                 <w:sz w:val="22"/>
                 <w:szCs w:val="22"/>
               </w:rPr>
-              <w:t>9</w:t>
+              <w:t xml:space="preserve">9</w:t>
             </w:r>
           </w:p>
         </w:tc>
@@ -8961,7 +9031,7 @@
               <w:bottom w:val="single" w:color="BFBFBF" w:sz="4"/>
               <w:right w:val="single" w:color="BFBFBF" w:sz="4"/>
             </w:tcBorders>
-            <w:shd w:fill="FFFFFF" w:val="clear"/>
+            <w:shd w:fill="F3F4F6" w:val="clear"/>
             <w:tcMar>
               <w:top w:type="dxa" w:w="100"/>
               <w:left w:type="dxa" w:w="140"/>
@@ -8983,7 +9053,7 @@
                 <w:sz w:val="22"/>
                 <w:szCs w:val="22"/>
               </w:rPr>
-              <w:t xml:space="preserve">Electrotherm India Ltd.</w:t>
+              <w:t xml:space="preserve">Hill Metal Est</w:t>
             </w:r>
           </w:p>
         </w:tc>
@@ -8996,27 +9066,27 @@
               <w:bottom w:val="single" w:color="BFBFBF" w:sz="4"/>
               <w:right w:val="single" w:color="BFBFBF" w:sz="4"/>
             </w:tcBorders>
-            <w:shd w:fill="FFFFFF" w:val="clear"/>
-            <w:tcMar>
-              <w:top w:type="dxa" w:w="100"/>
-              <w:left w:type="dxa" w:w="140"/>
-              <w:bottom w:type="dxa" w:w="100"/>
-              <w:right w:type="dxa" w:w="140"/>
-            </w:tcMar>
-            <w:vAlign w:val="center"/>
-          </w:tcPr>
-          <w:p>
-            <w:pPr>
-              <w:spacing w:after="40" w:before="40"/>
-              <w:jc w:val="left"/>
-            </w:pPr>
-            <w:r>
-              <w:rPr>
-                <w:rFonts w:ascii="Calibri" w:cs="Calibri" w:eastAsia="Calibri" w:hAnsi="Calibri"/>
-                <w:sz w:val="22"/>
-                <w:szCs w:val="22"/>
-              </w:rPr>
-              <w:t xml:space="preserve">Horizontal Ladle Preheater - 15 MT</w:t>
+            <w:shd w:fill="F3F4F6" w:val="clear"/>
+            <w:tcMar>
+              <w:top w:type="dxa" w:w="100"/>
+              <w:left w:type="dxa" w:w="140"/>
+              <w:bottom w:type="dxa" w:w="100"/>
+              <w:right w:type="dxa" w:w="140"/>
+            </w:tcMar>
+            <w:vAlign w:val="center"/>
+          </w:tcPr>
+          <w:p>
+            <w:pPr>
+              <w:spacing w:after="40" w:before="40"/>
+              <w:jc w:val="left"/>
+            </w:pPr>
+            <w:r>
+              <w:rPr>
+                <w:rFonts w:ascii="Calibri" w:cs="Calibri" w:eastAsia="Calibri" w:hAnsi="Calibri"/>
+                <w:sz w:val="22"/>
+                <w:szCs w:val="22"/>
+              </w:rPr>
+              <w:t xml:space="preserve">Tundish Preheater</w:t>
             </w:r>
           </w:p>
         </w:tc>
@@ -9051,7 +9121,7 @@
                 <w:sz w:val="22"/>
                 <w:szCs w:val="22"/>
               </w:rPr>
-              <w:t>10</w:t>
+              <w:t xml:space="preserve">10</w:t>
             </w:r>
           </w:p>
         </w:tc>
@@ -9086,7 +9156,7 @@
                 <w:sz w:val="22"/>
                 <w:szCs w:val="22"/>
               </w:rPr>
-              <w:t xml:space="preserve">Siemens Ltd.</w:t>
+              <w:t xml:space="preserve">PT. Gunung Raja Paksi</w:t>
             </w:r>
           </w:p>
         </w:tc>
@@ -9108,6 +9178,20 @@
             </w:tcMar>
             <w:vAlign w:val="center"/>
           </w:tcPr>
+          <w:p>
+            <w:pPr>
+              <w:spacing w:after="40" w:before="40"/>
+              <w:jc w:val="left"/>
+            </w:pPr>
+            <w:r>
+              <w:rPr>
+                <w:rFonts w:ascii="Calibri" w:cs="Calibri" w:eastAsia="Calibri" w:hAnsi="Calibri"/>
+                <w:sz w:val="22"/>
+                <w:szCs w:val="22"/>
+              </w:rPr>
+              <w:t xml:space="preserve">Vertical Ladle Preheater</w:t>
+            </w:r>
+          </w:p>
           <w:p>
             <w:pPr>
               <w:spacing w:after="40" w:before="40"/>
@@ -9134,7 +9218,7 @@
               <w:bottom w:val="single" w:color="BFBFBF" w:sz="4"/>
               <w:right w:val="single" w:color="BFBFBF" w:sz="4"/>
             </w:tcBorders>
-            <w:shd w:fill="FFFFFF" w:val="clear"/>
+            <w:shd w:fill="F3F4F6" w:val="clear"/>
             <w:tcMar>
               <w:top w:type="dxa" w:w="100"/>
               <w:left w:type="dxa" w:w="140"/>
@@ -9154,7 +9238,7 @@
                 <w:sz w:val="22"/>
                 <w:szCs w:val="22"/>
               </w:rPr>
-              <w:t>11</w:t>
+              <w:t xml:space="preserve">11</w:t>
             </w:r>
           </w:p>
         </w:tc>
@@ -9167,7 +9251,7 @@
               <w:bottom w:val="single" w:color="BFBFBF" w:sz="4"/>
               <w:right w:val="single" w:color="BFBFBF" w:sz="4"/>
             </w:tcBorders>
-            <w:shd w:fill="FFFFFF" w:val="clear"/>
+            <w:shd w:fill="F3F4F6" w:val="clear"/>
             <w:tcMar>
               <w:top w:type="dxa" w:w="100"/>
               <w:left w:type="dxa" w:w="140"/>
@@ -9189,7 +9273,7 @@
                 <w:sz w:val="22"/>
                 <w:szCs w:val="22"/>
               </w:rPr>
-              <w:t xml:space="preserve">Siemens Ltd.</w:t>
+              <w:t xml:space="preserve">Danieli India Ltd.</w:t>
             </w:r>
           </w:p>
         </w:tc>
@@ -9202,27 +9286,27 @@
               <w:bottom w:val="single" w:color="BFBFBF" w:sz="4"/>
               <w:right w:val="single" w:color="BFBFBF" w:sz="4"/>
             </w:tcBorders>
-            <w:shd w:fill="FFFFFF" w:val="clear"/>
-            <w:tcMar>
-              <w:top w:type="dxa" w:w="100"/>
-              <w:left w:type="dxa" w:w="140"/>
-              <w:bottom w:type="dxa" w:w="100"/>
-              <w:right w:type="dxa" w:w="140"/>
-            </w:tcMar>
-            <w:vAlign w:val="center"/>
-          </w:tcPr>
-          <w:p>
-            <w:pPr>
-              <w:spacing w:after="40" w:before="40"/>
-              <w:jc w:val="left"/>
-            </w:pPr>
-            <w:r>
-              <w:rPr>
-                <w:rFonts w:ascii="Calibri" w:cs="Calibri" w:eastAsia="Calibri" w:hAnsi="Calibri"/>
-                <w:sz w:val="22"/>
-                <w:szCs w:val="22"/>
-              </w:rPr>
-              <w:t xml:space="preserve">Vertical Ladle Preheater</w:t>
+            <w:shd w:fill="F3F4F6" w:val="clear"/>
+            <w:tcMar>
+              <w:top w:type="dxa" w:w="100"/>
+              <w:left w:type="dxa" w:w="140"/>
+              <w:bottom w:type="dxa" w:w="100"/>
+              <w:right w:type="dxa" w:w="140"/>
+            </w:tcMar>
+            <w:vAlign w:val="center"/>
+          </w:tcPr>
+          <w:p>
+            <w:pPr>
+              <w:spacing w:after="40" w:before="40"/>
+              <w:jc w:val="left"/>
+            </w:pPr>
+            <w:r>
+              <w:rPr>
+                <w:rFonts w:ascii="Calibri" w:cs="Calibri" w:eastAsia="Calibri" w:hAnsi="Calibri"/>
+                <w:sz w:val="22"/>
+                <w:szCs w:val="22"/>
+              </w:rPr>
+              <w:t xml:space="preserve">Tundish Preheater</w:t>
             </w:r>
           </w:p>
         </w:tc>
@@ -9257,7 +9341,7 @@
                 <w:sz w:val="22"/>
                 <w:szCs w:val="22"/>
               </w:rPr>
-              <w:t>12</w:t>
+              <w:t xml:space="preserve">12</w:t>
             </w:r>
           </w:p>
         </w:tc>
@@ -9292,7 +9376,7 @@
                 <w:sz w:val="22"/>
                 <w:szCs w:val="22"/>
               </w:rPr>
-              <w:t xml:space="preserve">E &amp; P Division Electrotherm India Ltd.</w:t>
+              <w:t xml:space="preserve">Primetals Technologies India Pvt. Ltd.</w:t>
             </w:r>
           </w:p>
         </w:tc>
@@ -9325,7 +9409,7 @@
                 <w:sz w:val="22"/>
                 <w:szCs w:val="22"/>
               </w:rPr>
-              <w:t xml:space="preserve">Horizontal Ladle Preheater - 30 MT</w:t>
+              <w:t xml:space="preserve">Tundish Preheater</w:t>
             </w:r>
           </w:p>
         </w:tc>
@@ -9340,7 +9424,7 @@
               <w:bottom w:val="single" w:color="BFBFBF" w:sz="4"/>
               <w:right w:val="single" w:color="BFBFBF" w:sz="4"/>
             </w:tcBorders>
-            <w:shd w:fill="FFFFFF" w:val="clear"/>
+            <w:shd w:fill="F3F4F6" w:val="clear"/>
             <w:tcMar>
               <w:top w:type="dxa" w:w="100"/>
               <w:left w:type="dxa" w:w="140"/>
@@ -9360,7 +9444,7 @@
                 <w:sz w:val="22"/>
                 <w:szCs w:val="22"/>
               </w:rPr>
-              <w:t>13</w:t>
+              <w:t xml:space="preserve">13</w:t>
             </w:r>
           </w:p>
         </w:tc>
@@ -9373,7 +9457,7 @@
               <w:bottom w:val="single" w:color="BFBFBF" w:sz="4"/>
               <w:right w:val="single" w:color="BFBFBF" w:sz="4"/>
             </w:tcBorders>
-            <w:shd w:fill="FFFFFF" w:val="clear"/>
+            <w:shd w:fill="F3F4F6" w:val="clear"/>
             <w:tcMar>
               <w:top w:type="dxa" w:w="100"/>
               <w:left w:type="dxa" w:w="140"/>
@@ -9395,7 +9479,7 @@
                 <w:sz w:val="22"/>
                 <w:szCs w:val="22"/>
               </w:rPr>
-              <w:t xml:space="preserve">E &amp; P Division Electrotherm India Ltd.</w:t>
+              <w:t xml:space="preserve">JSW Steel Limited</w:t>
             </w:r>
           </w:p>
         </w:tc>
@@ -9408,27 +9492,41 @@
               <w:bottom w:val="single" w:color="BFBFBF" w:sz="4"/>
               <w:right w:val="single" w:color="BFBFBF" w:sz="4"/>
             </w:tcBorders>
-            <w:shd w:fill="FFFFFF" w:val="clear"/>
-            <w:tcMar>
-              <w:top w:type="dxa" w:w="100"/>
-              <w:left w:type="dxa" w:w="140"/>
-              <w:bottom w:type="dxa" w:w="100"/>
-              <w:right w:type="dxa" w:w="140"/>
-            </w:tcMar>
-            <w:vAlign w:val="center"/>
-          </w:tcPr>
-          <w:p>
-            <w:pPr>
-              <w:spacing w:after="40" w:before="40"/>
-              <w:jc w:val="left"/>
-            </w:pPr>
-            <w:r>
-              <w:rPr>
-                <w:rFonts w:ascii="Calibri" w:cs="Calibri" w:eastAsia="Calibri" w:hAnsi="Calibri"/>
-                <w:sz w:val="22"/>
-                <w:szCs w:val="22"/>
-              </w:rPr>
-              <w:t xml:space="preserve">Vertical Ladle Preheater - 30 MT</w:t>
+            <w:shd w:fill="F3F4F6" w:val="clear"/>
+            <w:tcMar>
+              <w:top w:type="dxa" w:w="100"/>
+              <w:left w:type="dxa" w:w="140"/>
+              <w:bottom w:type="dxa" w:w="100"/>
+              <w:right w:type="dxa" w:w="140"/>
+            </w:tcMar>
+            <w:vAlign w:val="center"/>
+          </w:tcPr>
+          <w:p>
+            <w:pPr>
+              <w:spacing w:after="40" w:before="40"/>
+              <w:jc w:val="left"/>
+            </w:pPr>
+            <w:r>
+              <w:rPr>
+                <w:rFonts w:ascii="Calibri" w:cs="Calibri" w:eastAsia="Calibri" w:hAnsi="Calibri"/>
+                <w:sz w:val="22"/>
+                <w:szCs w:val="22"/>
+              </w:rPr>
+              <w:t xml:space="preserve">Tundish Preheater</w:t>
+            </w:r>
+          </w:p>
+          <w:p>
+            <w:pPr>
+              <w:spacing w:after="40" w:before="40"/>
+              <w:jc w:val="left"/>
+            </w:pPr>
+            <w:r>
+              <w:rPr>
+                <w:rFonts w:ascii="Calibri" w:cs="Calibri" w:eastAsia="Calibri" w:hAnsi="Calibri"/>
+                <w:sz w:val="22"/>
+                <w:szCs w:val="22"/>
+              </w:rPr>
+              <w:t xml:space="preserve">Vertical Ladle Preheater</w:t>
             </w:r>
           </w:p>
         </w:tc>
@@ -9463,7 +9561,7 @@
                 <w:sz w:val="22"/>
                 <w:szCs w:val="22"/>
               </w:rPr>
-              <w:t>14</w:t>
+              <w:t xml:space="preserve">14</w:t>
             </w:r>
           </w:p>
         </w:tc>
@@ -9498,7 +9596,7 @@
                 <w:sz w:val="22"/>
                 <w:szCs w:val="22"/>
               </w:rPr>
-              <w:t xml:space="preserve">Hill Metal Est</w:t>
+              <w:t xml:space="preserve">Kalyani Carpenter Special Steel Pvt. Ltd.</w:t>
             </w:r>
           </w:p>
         </w:tc>
@@ -9531,7 +9629,7 @@
                 <w:sz w:val="22"/>
                 <w:szCs w:val="22"/>
               </w:rPr>
-              <w:t xml:space="preserve">Tundish Preheater</w:t>
+              <w:t xml:space="preserve">Horizontal Ladle Preheater</w:t>
             </w:r>
           </w:p>
         </w:tc>
@@ -9546,7 +9644,7 @@
               <w:bottom w:val="single" w:color="BFBFBF" w:sz="4"/>
               <w:right w:val="single" w:color="BFBFBF" w:sz="4"/>
             </w:tcBorders>
-            <w:shd w:fill="FFFFFF" w:val="clear"/>
+            <w:shd w:fill="F3F4F6" w:val="clear"/>
             <w:tcMar>
               <w:top w:type="dxa" w:w="100"/>
               <w:left w:type="dxa" w:w="140"/>
@@ -9566,7 +9664,7 @@
                 <w:sz w:val="22"/>
                 <w:szCs w:val="22"/>
               </w:rPr>
-              <w:t>15</w:t>
+              <w:t xml:space="preserve">15</w:t>
             </w:r>
           </w:p>
         </w:tc>
@@ -9579,7 +9677,7 @@
               <w:bottom w:val="single" w:color="BFBFBF" w:sz="4"/>
               <w:right w:val="single" w:color="BFBFBF" w:sz="4"/>
             </w:tcBorders>
-            <w:shd w:fill="FFFFFF" w:val="clear"/>
+            <w:shd w:fill="F3F4F6" w:val="clear"/>
             <w:tcMar>
               <w:top w:type="dxa" w:w="100"/>
               <w:left w:type="dxa" w:w="140"/>
@@ -9601,7 +9699,7 @@
                 <w:sz w:val="22"/>
                 <w:szCs w:val="22"/>
               </w:rPr>
-              <w:t xml:space="preserve">PT. Gunung Raja Paksi</w:t>
+              <w:t xml:space="preserve">Jindal Shadeed Iron &amp; Steel LLC</w:t>
             </w:r>
           </w:p>
         </w:tc>
@@ -9614,27 +9712,27 @@
               <w:bottom w:val="single" w:color="BFBFBF" w:sz="4"/>
               <w:right w:val="single" w:color="BFBFBF" w:sz="4"/>
             </w:tcBorders>
-            <w:shd w:fill="FFFFFF" w:val="clear"/>
-            <w:tcMar>
-              <w:top w:type="dxa" w:w="100"/>
-              <w:left w:type="dxa" w:w="140"/>
-              <w:bottom w:type="dxa" w:w="100"/>
-              <w:right w:type="dxa" w:w="140"/>
-            </w:tcMar>
-            <w:vAlign w:val="center"/>
-          </w:tcPr>
-          <w:p>
-            <w:pPr>
-              <w:spacing w:after="40" w:before="40"/>
-              <w:jc w:val="left"/>
-            </w:pPr>
-            <w:r>
-              <w:rPr>
-                <w:rFonts w:ascii="Calibri" w:cs="Calibri" w:eastAsia="Calibri" w:hAnsi="Calibri"/>
-                <w:sz w:val="22"/>
-                <w:szCs w:val="22"/>
-              </w:rPr>
-              <w:t xml:space="preserve">Vertical Ladle Preheater</w:t>
+            <w:shd w:fill="F3F4F6" w:val="clear"/>
+            <w:tcMar>
+              <w:top w:type="dxa" w:w="100"/>
+              <w:left w:type="dxa" w:w="140"/>
+              <w:bottom w:type="dxa" w:w="100"/>
+              <w:right w:type="dxa" w:w="140"/>
+            </w:tcMar>
+            <w:vAlign w:val="center"/>
+          </w:tcPr>
+          <w:p>
+            <w:pPr>
+              <w:spacing w:after="40" w:before="40"/>
+              <w:jc w:val="left"/>
+            </w:pPr>
+            <w:r>
+              <w:rPr>
+                <w:rFonts w:ascii="Calibri" w:cs="Calibri" w:eastAsia="Calibri" w:hAnsi="Calibri"/>
+                <w:sz w:val="22"/>
+                <w:szCs w:val="22"/>
+              </w:rPr>
+              <w:t xml:space="preserve">Tundish Preheater</w:t>
             </w:r>
           </w:p>
         </w:tc>
@@ -9669,7 +9767,7 @@
                 <w:sz w:val="22"/>
                 <w:szCs w:val="22"/>
               </w:rPr>
-              <w:t>16</w:t>
+              <w:t xml:space="preserve">16</w:t>
             </w:r>
           </w:p>
         </w:tc>
@@ -9704,7 +9802,7 @@
                 <w:sz w:val="22"/>
                 <w:szCs w:val="22"/>
               </w:rPr>
-              <w:t xml:space="preserve">PT. Gunung Raja Paksi</w:t>
+              <w:t xml:space="preserve">Saarloha Advanced Materials (P) Ltd.</w:t>
             </w:r>
           </w:p>
         </w:tc>
@@ -9737,7 +9835,21 @@
                 <w:sz w:val="22"/>
                 <w:szCs w:val="22"/>
               </w:rPr>
-              <w:t xml:space="preserve">Horizontal Ladle Preheater</w:t>
+              <w:t xml:space="preserve">Horizontal Ladle Preheater - 35 MT</w:t>
+            </w:r>
+          </w:p>
+          <w:p>
+            <w:pPr>
+              <w:spacing w:after="40" w:before="40"/>
+              <w:jc w:val="left"/>
+            </w:pPr>
+            <w:r>
+              <w:rPr>
+                <w:rFonts w:ascii="Calibri" w:cs="Calibri" w:eastAsia="Calibri" w:hAnsi="Calibri"/>
+                <w:sz w:val="22"/>
+                <w:szCs w:val="22"/>
+              </w:rPr>
+              <w:t xml:space="preserve">Vertical Ladle Preheater</w:t>
             </w:r>
           </w:p>
         </w:tc>
@@ -9752,7 +9864,7 @@
               <w:bottom w:val="single" w:color="BFBFBF" w:sz="4"/>
               <w:right w:val="single" w:color="BFBFBF" w:sz="4"/>
             </w:tcBorders>
-            <w:shd w:fill="FFFFFF" w:val="clear"/>
+            <w:shd w:fill="F3F4F6" w:val="clear"/>
             <w:tcMar>
               <w:top w:type="dxa" w:w="100"/>
               <w:left w:type="dxa" w:w="140"/>
@@ -9772,7 +9884,7 @@
                 <w:sz w:val="22"/>
                 <w:szCs w:val="22"/>
               </w:rPr>
-              <w:t>17</w:t>
+              <w:t xml:space="preserve">17</w:t>
             </w:r>
           </w:p>
         </w:tc>
@@ -9785,7 +9897,7 @@
               <w:bottom w:val="single" w:color="BFBFBF" w:sz="4"/>
               <w:right w:val="single" w:color="BFBFBF" w:sz="4"/>
             </w:tcBorders>
-            <w:shd w:fill="FFFFFF" w:val="clear"/>
+            <w:shd w:fill="F3F4F6" w:val="clear"/>
             <w:tcMar>
               <w:top w:type="dxa" w:w="100"/>
               <w:left w:type="dxa" w:w="140"/>
@@ -9807,7 +9919,7 @@
                 <w:sz w:val="22"/>
                 <w:szCs w:val="22"/>
               </w:rPr>
-              <w:t xml:space="preserve">Danieli India Ltd.</w:t>
+              <w:t xml:space="preserve">GPH Ispat Ltd.</w:t>
             </w:r>
           </w:p>
         </w:tc>
@@ -9820,27 +9932,41 @@
               <w:bottom w:val="single" w:color="BFBFBF" w:sz="4"/>
               <w:right w:val="single" w:color="BFBFBF" w:sz="4"/>
             </w:tcBorders>
-            <w:shd w:fill="FFFFFF" w:val="clear"/>
-            <w:tcMar>
-              <w:top w:type="dxa" w:w="100"/>
-              <w:left w:type="dxa" w:w="140"/>
-              <w:bottom w:type="dxa" w:w="100"/>
-              <w:right w:type="dxa" w:w="140"/>
-            </w:tcMar>
-            <w:vAlign w:val="center"/>
-          </w:tcPr>
-          <w:p>
-            <w:pPr>
-              <w:spacing w:after="40" w:before="40"/>
-              <w:jc w:val="left"/>
-            </w:pPr>
-            <w:r>
-              <w:rPr>
-                <w:rFonts w:ascii="Calibri" w:cs="Calibri" w:eastAsia="Calibri" w:hAnsi="Calibri"/>
-                <w:sz w:val="22"/>
-                <w:szCs w:val="22"/>
-              </w:rPr>
-              <w:t xml:space="preserve">Tundish Preheater</w:t>
+            <w:shd w:fill="F3F4F6" w:val="clear"/>
+            <w:tcMar>
+              <w:top w:type="dxa" w:w="100"/>
+              <w:left w:type="dxa" w:w="140"/>
+              <w:bottom w:type="dxa" w:w="100"/>
+              <w:right w:type="dxa" w:w="140"/>
+            </w:tcMar>
+            <w:vAlign w:val="center"/>
+          </w:tcPr>
+          <w:p>
+            <w:pPr>
+              <w:spacing w:after="40" w:before="40"/>
+              <w:jc w:val="left"/>
+            </w:pPr>
+            <w:r>
+              <w:rPr>
+                <w:rFonts w:ascii="Calibri" w:cs="Calibri" w:eastAsia="Calibri" w:hAnsi="Calibri"/>
+                <w:sz w:val="22"/>
+                <w:szCs w:val="22"/>
+              </w:rPr>
+              <w:t xml:space="preserve">Vertical Ladle Preheater</w:t>
+            </w:r>
+          </w:p>
+          <w:p>
+            <w:pPr>
+              <w:spacing w:after="40" w:before="40"/>
+              <w:jc w:val="left"/>
+            </w:pPr>
+            <w:r>
+              <w:rPr>
+                <w:rFonts w:ascii="Calibri" w:cs="Calibri" w:eastAsia="Calibri" w:hAnsi="Calibri"/>
+                <w:sz w:val="22"/>
+                <w:szCs w:val="22"/>
+              </w:rPr>
+              <w:t xml:space="preserve">Horizontal Ladle Preheater</w:t>
             </w:r>
           </w:p>
         </w:tc>
@@ -9855,7 +9981,7 @@
               <w:bottom w:val="single" w:color="BFBFBF" w:sz="4"/>
               <w:right w:val="single" w:color="BFBFBF" w:sz="4"/>
             </w:tcBorders>
-            <w:shd w:fill="FFFFFF" w:val="clear"/>
+            <w:shd w:fill="F3F4F6" w:val="clear"/>
             <w:tcMar>
               <w:top w:type="dxa" w:w="100"/>
               <w:left w:type="dxa" w:w="140"/>
@@ -9875,7 +10001,7 @@
                 <w:sz w:val="22"/>
                 <w:szCs w:val="22"/>
               </w:rPr>
-              <w:t>18</w:t>
+              <w:t xml:space="preserve">18</w:t>
             </w:r>
           </w:p>
         </w:tc>
@@ -9888,7 +10014,7 @@
               <w:bottom w:val="single" w:color="BFBFBF" w:sz="4"/>
               <w:right w:val="single" w:color="BFBFBF" w:sz="4"/>
             </w:tcBorders>
-            <w:shd w:fill="FFFFFF" w:val="clear"/>
+            <w:shd w:fill="F3F4F6" w:val="clear"/>
             <w:tcMar>
               <w:top w:type="dxa" w:w="100"/>
               <w:left w:type="dxa" w:w="140"/>
@@ -9910,7 +10036,7 @@
                 <w:sz w:val="22"/>
                 <w:szCs w:val="22"/>
               </w:rPr>
-              <w:t xml:space="preserve">Primetals Technologies India Pvt. Ltd.</w:t>
+              <w:t xml:space="preserve">SMS India Pvt. Ltd.</w:t>
             </w:r>
           </w:p>
         </w:tc>
@@ -9923,7 +10049,7 @@
               <w:bottom w:val="single" w:color="BFBFBF" w:sz="4"/>
               <w:right w:val="single" w:color="BFBFBF" w:sz="4"/>
             </w:tcBorders>
-            <w:shd w:fill="FFFFFF" w:val="clear"/>
+            <w:shd w:fill="F3F4F6" w:val="clear"/>
             <w:tcMar>
               <w:top w:type="dxa" w:w="100"/>
               <w:left w:type="dxa" w:w="140"/>
@@ -9978,7 +10104,7 @@
                 <w:sz w:val="22"/>
                 <w:szCs w:val="22"/>
               </w:rPr>
-              <w:t>19</w:t>
+              <w:t xml:space="preserve">19</w:t>
             </w:r>
           </w:p>
         </w:tc>
@@ -10013,7 +10139,7 @@
                 <w:sz w:val="22"/>
                 <w:szCs w:val="22"/>
               </w:rPr>
-              <w:t xml:space="preserve">JSW Steel Limited</w:t>
+              <w:t xml:space="preserve">BSRM Steel Mills Limited</w:t>
             </w:r>
           </w:p>
         </w:tc>
@@ -10061,7 +10187,7 @@
               <w:bottom w:val="single" w:color="BFBFBF" w:sz="4"/>
               <w:right w:val="single" w:color="BFBFBF" w:sz="4"/>
             </w:tcBorders>
-            <w:shd w:fill="FFFFFF" w:val="clear"/>
+            <w:shd w:fill="F3F4F6" w:val="clear"/>
             <w:tcMar>
               <w:top w:type="dxa" w:w="100"/>
               <w:left w:type="dxa" w:w="140"/>
@@ -10081,7 +10207,7 @@
                 <w:sz w:val="22"/>
                 <w:szCs w:val="22"/>
               </w:rPr>
-              <w:t>20</w:t>
+              <w:t xml:space="preserve">20</w:t>
             </w:r>
           </w:p>
         </w:tc>
@@ -10094,7 +10220,7 @@
               <w:bottom w:val="single" w:color="BFBFBF" w:sz="4"/>
               <w:right w:val="single" w:color="BFBFBF" w:sz="4"/>
             </w:tcBorders>
-            <w:shd w:fill="FFFFFF" w:val="clear"/>
+            <w:shd w:fill="F3F4F6" w:val="clear"/>
             <w:tcMar>
               <w:top w:type="dxa" w:w="100"/>
               <w:left w:type="dxa" w:w="140"/>
@@ -10116,7 +10242,7 @@
                 <w:sz w:val="22"/>
                 <w:szCs w:val="22"/>
               </w:rPr>
-              <w:t xml:space="preserve">Kalyani Carpenter Special Steel Pvt. Ltd.</w:t>
+              <w:t xml:space="preserve">Electrotherm India Limited</w:t>
             </w:r>
           </w:p>
         </w:tc>
@@ -10129,27 +10255,27 @@
               <w:bottom w:val="single" w:color="BFBFBF" w:sz="4"/>
               <w:right w:val="single" w:color="BFBFBF" w:sz="4"/>
             </w:tcBorders>
-            <w:shd w:fill="FFFFFF" w:val="clear"/>
-            <w:tcMar>
-              <w:top w:type="dxa" w:w="100"/>
-              <w:left w:type="dxa" w:w="140"/>
-              <w:bottom w:type="dxa" w:w="100"/>
-              <w:right w:type="dxa" w:w="140"/>
-            </w:tcMar>
-            <w:vAlign w:val="center"/>
-          </w:tcPr>
-          <w:p>
-            <w:pPr>
-              <w:spacing w:after="40" w:before="40"/>
-              <w:jc w:val="left"/>
-            </w:pPr>
-            <w:r>
-              <w:rPr>
-                <w:rFonts w:ascii="Calibri" w:cs="Calibri" w:eastAsia="Calibri" w:hAnsi="Calibri"/>
-                <w:sz w:val="22"/>
-                <w:szCs w:val="22"/>
-              </w:rPr>
-              <w:t xml:space="preserve">Horizontal Ladle Preheater</w:t>
+            <w:shd w:fill="F3F4F6" w:val="clear"/>
+            <w:tcMar>
+              <w:top w:type="dxa" w:w="100"/>
+              <w:left w:type="dxa" w:w="140"/>
+              <w:bottom w:type="dxa" w:w="100"/>
+              <w:right w:type="dxa" w:w="140"/>
+            </w:tcMar>
+            <w:vAlign w:val="center"/>
+          </w:tcPr>
+          <w:p>
+            <w:pPr>
+              <w:spacing w:after="40" w:before="40"/>
+              <w:jc w:val="left"/>
+            </w:pPr>
+            <w:r>
+              <w:rPr>
+                <w:rFonts w:ascii="Calibri" w:cs="Calibri" w:eastAsia="Calibri" w:hAnsi="Calibri"/>
+                <w:sz w:val="22"/>
+                <w:szCs w:val="22"/>
+              </w:rPr>
+              <w:t xml:space="preserve">Tundish Preheater</w:t>
             </w:r>
           </w:p>
         </w:tc>
@@ -10184,7 +10310,7 @@
                 <w:sz w:val="22"/>
                 <w:szCs w:val="22"/>
               </w:rPr>
-              <w:t>21</w:t>
+              <w:t xml:space="preserve">21</w:t>
             </w:r>
           </w:p>
         </w:tc>
@@ -10219,7 +10345,7 @@
                 <w:sz w:val="22"/>
                 <w:szCs w:val="22"/>
               </w:rPr>
-              <w:t xml:space="preserve">Jindal Shadeed Iron &amp; Steel LLC</w:t>
+              <w:t xml:space="preserve">Bhilai Steel Plant</w:t>
             </w:r>
           </w:p>
         </w:tc>
@@ -10287,7 +10413,7 @@
                 <w:sz w:val="22"/>
                 <w:szCs w:val="22"/>
               </w:rPr>
-              <w:t>22</w:t>
+              <w:t xml:space="preserve">22</w:t>
             </w:r>
           </w:p>
         </w:tc>
@@ -10322,7 +10448,7 @@
                 <w:sz w:val="22"/>
                 <w:szCs w:val="22"/>
               </w:rPr>
-              <w:t xml:space="preserve">Saarloha Advanced Materials (P) Ltd.</w:t>
+              <w:t xml:space="preserve">Rungta Mines Limited</w:t>
             </w:r>
           </w:p>
         </w:tc>
@@ -10355,7 +10481,21 @@
                 <w:sz w:val="22"/>
                 <w:szCs w:val="22"/>
               </w:rPr>
-              <w:t xml:space="preserve">Horizontal Ladle Preheater - 35 MT</w:t>
+              <w:t xml:space="preserve">Horizontal Ladle Preheater - 22 MT</w:t>
+            </w:r>
+          </w:p>
+          <w:p>
+            <w:pPr>
+              <w:spacing w:after="40" w:before="40"/>
+              <w:jc w:val="left"/>
+            </w:pPr>
+            <w:r>
+              <w:rPr>
+                <w:rFonts w:ascii="Calibri" w:cs="Calibri" w:eastAsia="Calibri" w:hAnsi="Calibri"/>
+                <w:sz w:val="22"/>
+                <w:szCs w:val="22"/>
+              </w:rPr>
+              <w:t xml:space="preserve">Vertical Ladle Preheater - 22 MT</w:t>
             </w:r>
           </w:p>
         </w:tc>
@@ -10390,7 +10530,7 @@
                 <w:sz w:val="22"/>
                 <w:szCs w:val="22"/>
               </w:rPr>
-              <w:t>23</w:t>
+              <w:t xml:space="preserve">23</w:t>
             </w:r>
           </w:p>
         </w:tc>
@@ -10425,7 +10565,7 @@
                 <w:sz w:val="22"/>
                 <w:szCs w:val="22"/>
               </w:rPr>
-              <w:t xml:space="preserve">Saarloha Advanced Materials (P) Ltd.</w:t>
+              <w:t xml:space="preserve">Primetals Technologies India P. Ltd.</w:t>
             </w:r>
           </w:p>
         </w:tc>
@@ -10447,6 +10587,20 @@
             </w:tcMar>
             <w:vAlign w:val="center"/>
           </w:tcPr>
+          <w:p>
+            <w:pPr>
+              <w:spacing w:after="40" w:before="40"/>
+              <w:jc w:val="left"/>
+            </w:pPr>
+            <w:r>
+              <w:rPr>
+                <w:rFonts w:ascii="Calibri" w:cs="Calibri" w:eastAsia="Calibri" w:hAnsi="Calibri"/>
+                <w:sz w:val="22"/>
+                <w:szCs w:val="22"/>
+              </w:rPr>
+              <w:t xml:space="preserve">Horizontal Ladle Preheater</w:t>
+            </w:r>
+          </w:p>
           <w:p>
             <w:pPr>
               <w:spacing w:after="40" w:before="40"/>
@@ -10493,7 +10647,7 @@
                 <w:sz w:val="22"/>
                 <w:szCs w:val="22"/>
               </w:rPr>
-              <w:t>24</w:t>
+              <w:t xml:space="preserve">24</w:t>
             </w:r>
           </w:p>
         </w:tc>
@@ -10528,7 +10682,7 @@
                 <w:sz w:val="22"/>
                 <w:szCs w:val="22"/>
               </w:rPr>
-              <w:t xml:space="preserve">GPH Ispat Ltd.</w:t>
+              <w:t xml:space="preserve">Rashtriya Ispat Nigam Ltd.</w:t>
             </w:r>
           </w:p>
         </w:tc>
@@ -10561,7 +10715,7 @@
                 <w:sz w:val="22"/>
                 <w:szCs w:val="22"/>
               </w:rPr>
-              <w:t xml:space="preserve">Vertical Ladle Preheater</w:t>
+              <w:t xml:space="preserve">Tundish Preheater</w:t>
             </w:r>
           </w:p>
         </w:tc>
@@ -10596,7 +10750,7 @@
                 <w:sz w:val="22"/>
                 <w:szCs w:val="22"/>
               </w:rPr>
-              <w:t>25</w:t>
+              <w:t xml:space="preserve">25</w:t>
             </w:r>
           </w:p>
         </w:tc>
@@ -10631,7 +10785,7 @@
                 <w:sz w:val="22"/>
                 <w:szCs w:val="22"/>
               </w:rPr>
-              <w:t xml:space="preserve">GPH Ispat Ltd.</w:t>
+              <w:t xml:space="preserve">Jindal Stainless Limited A/c Primetals</w:t>
             </w:r>
           </w:p>
         </w:tc>
@@ -10664,7 +10818,7 @@
                 <w:sz w:val="22"/>
                 <w:szCs w:val="22"/>
               </w:rPr>
-              <w:t xml:space="preserve">Horizontal Ladle Preheater</w:t>
+              <w:t xml:space="preserve">Tundish Preheater</w:t>
             </w:r>
           </w:p>
         </w:tc>
@@ -10699,7 +10853,7 @@
                 <w:sz w:val="22"/>
                 <w:szCs w:val="22"/>
               </w:rPr>
-              <w:t>26</w:t>
+              <w:t xml:space="preserve">26</w:t>
             </w:r>
           </w:p>
         </w:tc>
@@ -10734,7 +10888,7 @@
                 <w:sz w:val="22"/>
                 <w:szCs w:val="22"/>
               </w:rPr>
-              <w:t xml:space="preserve">SMS India Pvt. Ltd.</w:t>
+              <w:t xml:space="preserve">Jindal Steel &amp; Power Ltd.</w:t>
             </w:r>
           </w:p>
         </w:tc>
@@ -10767,7 +10921,7 @@
                 <w:sz w:val="22"/>
                 <w:szCs w:val="22"/>
               </w:rPr>
-              <w:t xml:space="preserve">Tundish Preheater</w:t>
+              <w:t xml:space="preserve">Vertical Ladle Preheater - 100 MT</w:t>
             </w:r>
           </w:p>
         </w:tc>
@@ -10802,7 +10956,7 @@
                 <w:sz w:val="22"/>
                 <w:szCs w:val="22"/>
               </w:rPr>
-              <w:t>27</w:t>
+              <w:t xml:space="preserve">27</w:t>
             </w:r>
           </w:p>
         </w:tc>
@@ -10837,7 +10991,7 @@
                 <w:sz w:val="22"/>
                 <w:szCs w:val="22"/>
               </w:rPr>
-              <w:t xml:space="preserve">BSRM Steel Mills Limited</w:t>
+              <w:t xml:space="preserve">Bangladesh Steel Re-Rolling Mills Ltd.</w:t>
             </w:r>
           </w:p>
         </w:tc>
@@ -10870,7 +11024,7 @@
                 <w:sz w:val="22"/>
                 <w:szCs w:val="22"/>
               </w:rPr>
-              <w:t xml:space="preserve">Tundish Preheater</w:t>
+              <w:t xml:space="preserve">Horizontal Ladle Preheater</w:t>
             </w:r>
           </w:p>
         </w:tc>
@@ -10905,7 +11059,7 @@
                 <w:sz w:val="22"/>
                 <w:szCs w:val="22"/>
               </w:rPr>
-              <w:t>28</w:t>
+              <w:t xml:space="preserve">28</w:t>
             </w:r>
           </w:p>
         </w:tc>
@@ -10940,7 +11094,7 @@
                 <w:sz w:val="22"/>
                 <w:szCs w:val="22"/>
               </w:rPr>
-              <w:t xml:space="preserve">Electrotherm India Limited</w:t>
+              <w:t xml:space="preserve">Kisco Castings India Ltd.</w:t>
             </w:r>
           </w:p>
         </w:tc>
@@ -10973,7 +11127,7 @@
                 <w:sz w:val="22"/>
                 <w:szCs w:val="22"/>
               </w:rPr>
-              <w:t xml:space="preserve">Tundish Preheater</w:t>
+              <w:t xml:space="preserve">Vertical Ladle Preheater - 11 MT</w:t>
             </w:r>
           </w:p>
         </w:tc>
@@ -11008,7 +11162,7 @@
                 <w:sz w:val="22"/>
                 <w:szCs w:val="22"/>
               </w:rPr>
-              <w:t>29</w:t>
+              <w:t xml:space="preserve">29</w:t>
             </w:r>
           </w:p>
         </w:tc>
@@ -11043,7 +11197,7 @@
                 <w:sz w:val="22"/>
                 <w:szCs w:val="22"/>
               </w:rPr>
-              <w:t xml:space="preserve">Bhilai Steel Plant</w:t>
+              <w:t xml:space="preserve">Vardhman Special Steels Ltd. ( Unit-1)</w:t>
             </w:r>
           </w:p>
         </w:tc>
@@ -11076,7 +11230,35 @@
                 <w:sz w:val="22"/>
                 <w:szCs w:val="22"/>
               </w:rPr>
-              <w:t xml:space="preserve">Tundish Preheater</w:t>
+              <w:t xml:space="preserve">Vertical Ladle Preheater</w:t>
+            </w:r>
+          </w:p>
+          <w:p>
+            <w:pPr>
+              <w:spacing w:after="40" w:before="40"/>
+              <w:jc w:val="left"/>
+            </w:pPr>
+            <w:r>
+              <w:rPr>
+                <w:rFonts w:ascii="Calibri" w:cs="Calibri" w:eastAsia="Calibri" w:hAnsi="Calibri"/>
+                <w:sz w:val="22"/>
+                <w:szCs w:val="22"/>
+              </w:rPr>
+              <w:t xml:space="preserve">Horizontal Ladle Preheater</w:t>
+            </w:r>
+          </w:p>
+          <w:p>
+            <w:pPr>
+              <w:spacing w:after="40" w:before="40"/>
+              <w:jc w:val="left"/>
+            </w:pPr>
+            <w:r>
+              <w:rPr>
+                <w:rFonts w:ascii="Calibri" w:cs="Calibri" w:eastAsia="Calibri" w:hAnsi="Calibri"/>
+                <w:sz w:val="22"/>
+                <w:szCs w:val="22"/>
+              </w:rPr>
+              <w:t xml:space="preserve">Vertical Ladle Preheater - 45 MT</w:t>
             </w:r>
           </w:p>
         </w:tc>
@@ -11111,7 +11293,7 @@
                 <w:sz w:val="22"/>
                 <w:szCs w:val="22"/>
               </w:rPr>
-              <w:t>30</w:t>
+              <w:t xml:space="preserve">30</w:t>
             </w:r>
           </w:p>
         </w:tc>
@@ -11146,7 +11328,7 @@
                 <w:sz w:val="22"/>
                 <w:szCs w:val="22"/>
               </w:rPr>
-              <w:t xml:space="preserve">Rungta Mines Limited</w:t>
+              <w:t xml:space="preserve">Rungta Mines Ltd.</w:t>
             </w:r>
           </w:p>
         </w:tc>
@@ -11179,7 +11361,49 @@
                 <w:sz w:val="22"/>
                 <w:szCs w:val="22"/>
               </w:rPr>
-              <w:t xml:space="preserve">Horizontal Ladle Preheater - 22 MT</w:t>
+              <w:t xml:space="preserve">Horizontal Ladle Preheater - 45 MT</w:t>
+            </w:r>
+          </w:p>
+          <w:p>
+            <w:pPr>
+              <w:spacing w:after="40" w:before="40"/>
+              <w:jc w:val="left"/>
+            </w:pPr>
+            <w:r>
+              <w:rPr>
+                <w:rFonts w:ascii="Calibri" w:cs="Calibri" w:eastAsia="Calibri" w:hAnsi="Calibri"/>
+                <w:sz w:val="22"/>
+                <w:szCs w:val="22"/>
+              </w:rPr>
+              <w:t xml:space="preserve">Horizontal Ladle Preheater - 250 MT</w:t>
+            </w:r>
+          </w:p>
+          <w:p>
+            <w:pPr>
+              <w:spacing w:after="40" w:before="40"/>
+              <w:jc w:val="left"/>
+            </w:pPr>
+            <w:r>
+              <w:rPr>
+                <w:rFonts w:ascii="Calibri" w:cs="Calibri" w:eastAsia="Calibri" w:hAnsi="Calibri"/>
+                <w:sz w:val="22"/>
+                <w:szCs w:val="22"/>
+              </w:rPr>
+              <w:t xml:space="preserve">Vertical Ladle Preheater - 250 MT</w:t>
+            </w:r>
+          </w:p>
+          <w:p>
+            <w:pPr>
+              <w:spacing w:after="40" w:before="40"/>
+              <w:jc w:val="left"/>
+            </w:pPr>
+            <w:r>
+              <w:rPr>
+                <w:rFonts w:ascii="Calibri" w:cs="Calibri" w:eastAsia="Calibri" w:hAnsi="Calibri"/>
+                <w:sz w:val="22"/>
+                <w:szCs w:val="22"/>
+              </w:rPr>
+              <w:t xml:space="preserve">Vertical Ladle Preheater</w:t>
             </w:r>
           </w:p>
         </w:tc>
@@ -11214,7 +11438,7 @@
                 <w:sz w:val="22"/>
                 <w:szCs w:val="22"/>
               </w:rPr>
-              <w:t>31</w:t>
+              <w:t xml:space="preserve">31</w:t>
             </w:r>
           </w:p>
         </w:tc>
@@ -11249,7 +11473,7 @@
                 <w:sz w:val="22"/>
                 <w:szCs w:val="22"/>
               </w:rPr>
-              <w:t xml:space="preserve">Rungta Mines Limited</w:t>
+              <w:t xml:space="preserve">Tata Steel Long Products</w:t>
             </w:r>
           </w:p>
         </w:tc>
@@ -11282,7 +11506,21 @@
                 <w:sz w:val="22"/>
                 <w:szCs w:val="22"/>
               </w:rPr>
-              <w:t xml:space="preserve">Vertical Ladle Preheater - 22 MT</w:t>
+              <w:t xml:space="preserve">Vertical Ladle Preheater - 70 MT</w:t>
+            </w:r>
+          </w:p>
+          <w:p>
+            <w:pPr>
+              <w:spacing w:after="40" w:before="40"/>
+              <w:jc w:val="left"/>
+            </w:pPr>
+            <w:r>
+              <w:rPr>
+                <w:rFonts w:ascii="Calibri" w:cs="Calibri" w:eastAsia="Calibri" w:hAnsi="Calibri"/>
+                <w:sz w:val="22"/>
+                <w:szCs w:val="22"/>
+              </w:rPr>
+              <w:t xml:space="preserve">Vertical Ladle Preheater</w:t>
             </w:r>
           </w:p>
         </w:tc>
@@ -11317,7 +11555,7 @@
                 <w:sz w:val="22"/>
                 <w:szCs w:val="22"/>
               </w:rPr>
-              <w:t>32</w:t>
+              <w:t xml:space="preserve">32</w:t>
             </w:r>
           </w:p>
         </w:tc>
@@ -11352,7 +11590,7 @@
                 <w:sz w:val="22"/>
                 <w:szCs w:val="22"/>
               </w:rPr>
-              <w:t xml:space="preserve">Primetals Technologies India P. Ltd.</w:t>
+              <w:t xml:space="preserve">Jindal Steel Iron &amp; Steel LLC</w:t>
             </w:r>
           </w:p>
         </w:tc>
@@ -11385,7 +11623,7 @@
                 <w:sz w:val="22"/>
                 <w:szCs w:val="22"/>
               </w:rPr>
-              <w:t xml:space="preserve">Horizontal Ladle Preheater</w:t>
+              <w:t xml:space="preserve">Tundish Preheater</w:t>
             </w:r>
           </w:p>
         </w:tc>
@@ -11420,7 +11658,7 @@
                 <w:sz w:val="22"/>
                 <w:szCs w:val="22"/>
               </w:rPr>
-              <w:t>33</w:t>
+              <w:t xml:space="preserve">33</w:t>
             </w:r>
           </w:p>
         </w:tc>
@@ -11455,7 +11693,7 @@
                 <w:sz w:val="22"/>
                 <w:szCs w:val="22"/>
               </w:rPr>
-              <w:t xml:space="preserve">Primetals Technologies India P. Ltd.</w:t>
+              <w:t xml:space="preserve">JSW Power Steel Ltd.</w:t>
             </w:r>
           </w:p>
         </w:tc>
@@ -11488,7 +11726,7 @@
                 <w:sz w:val="22"/>
                 <w:szCs w:val="22"/>
               </w:rPr>
-              <w:t xml:space="preserve">Vertical Ladle Preheater</w:t>
+              <w:t xml:space="preserve">Tundish Preheater</w:t>
             </w:r>
           </w:p>
         </w:tc>
@@ -11523,7 +11761,7 @@
                 <w:sz w:val="22"/>
                 <w:szCs w:val="22"/>
               </w:rPr>
-              <w:t>34</w:t>
+              <w:t xml:space="preserve">34</w:t>
             </w:r>
           </w:p>
         </w:tc>
@@ -11558,7 +11796,7 @@
                 <w:sz w:val="22"/>
                 <w:szCs w:val="22"/>
               </w:rPr>
-              <w:t xml:space="preserve">Rashtriya Ispat Nigam Ltd.</w:t>
+              <w:t xml:space="preserve">Jindal Stainless Limited</w:t>
             </w:r>
           </w:p>
         </w:tc>
@@ -11591,7 +11829,35 @@
                 <w:sz w:val="22"/>
                 <w:szCs w:val="22"/>
               </w:rPr>
-              <w:t xml:space="preserve">Tundish Preheater</w:t>
+              <w:t xml:space="preserve">Horizontal Ladle Preheater - 150 MT</w:t>
+            </w:r>
+          </w:p>
+          <w:p>
+            <w:pPr>
+              <w:spacing w:after="40" w:before="40"/>
+              <w:jc w:val="left"/>
+            </w:pPr>
+            <w:r>
+              <w:rPr>
+                <w:rFonts w:ascii="Calibri" w:cs="Calibri" w:eastAsia="Calibri" w:hAnsi="Calibri"/>
+                <w:sz w:val="22"/>
+                <w:szCs w:val="22"/>
+              </w:rPr>
+              <w:t xml:space="preserve">Horizontal Ladle Preheater - 130 MT</w:t>
+            </w:r>
+          </w:p>
+          <w:p>
+            <w:pPr>
+              <w:spacing w:after="40" w:before="40"/>
+              <w:jc w:val="left"/>
+            </w:pPr>
+            <w:r>
+              <w:rPr>
+                <w:rFonts w:ascii="Calibri" w:cs="Calibri" w:eastAsia="Calibri" w:hAnsi="Calibri"/>
+                <w:sz w:val="22"/>
+                <w:szCs w:val="22"/>
+              </w:rPr>
+              <w:t xml:space="preserve">Vertical Ladle Preheater - 150 MT</w:t>
             </w:r>
           </w:p>
         </w:tc>
@@ -11626,7 +11892,7 @@
                 <w:sz w:val="22"/>
                 <w:szCs w:val="22"/>
               </w:rPr>
-              <w:t>35</w:t>
+              <w:t xml:space="preserve">35</w:t>
             </w:r>
           </w:p>
         </w:tc>
@@ -11661,7 +11927,7 @@
                 <w:sz w:val="22"/>
                 <w:szCs w:val="22"/>
               </w:rPr>
-              <w:t xml:space="preserve">Jindal Stainless Limited A/c Primetals</w:t>
+              <w:t xml:space="preserve">Primetals Technologies India Limited</w:t>
             </w:r>
           </w:p>
         </w:tc>
@@ -11729,7 +11995,7 @@
                 <w:sz w:val="22"/>
                 <w:szCs w:val="22"/>
               </w:rPr>
-              <w:t>36</w:t>
+              <w:t xml:space="preserve">36</w:t>
             </w:r>
           </w:p>
         </w:tc>
@@ -11764,7 +12030,7 @@
                 <w:sz w:val="22"/>
                 <w:szCs w:val="22"/>
               </w:rPr>
-              <w:t xml:space="preserve">Jindal Steel &amp; Power Ltd.</w:t>
+              <w:t xml:space="preserve">Emirates Steel Industries</w:t>
             </w:r>
           </w:p>
         </w:tc>
@@ -11797,7 +12063,7 @@
                 <w:sz w:val="22"/>
                 <w:szCs w:val="22"/>
               </w:rPr>
-              <w:t xml:space="preserve">Vertical Ladle Preheater - 100 MT</w:t>
+              <w:t xml:space="preserve">Tundish Preheater</w:t>
             </w:r>
           </w:p>
         </w:tc>
@@ -11832,7 +12098,7 @@
                 <w:sz w:val="22"/>
                 <w:szCs w:val="22"/>
               </w:rPr>
-              <w:t>37</w:t>
+              <w:t xml:space="preserve">37</w:t>
             </w:r>
           </w:p>
         </w:tc>
@@ -11867,7 +12133,7 @@
                 <w:sz w:val="22"/>
                 <w:szCs w:val="22"/>
               </w:rPr>
-              <w:t xml:space="preserve">Bangladesh Steel Re-Rolling Mills Ltd.</w:t>
+              <w:t xml:space="preserve">Jindal Steel &amp; Power Limited</w:t>
             </w:r>
           </w:p>
         </w:tc>
@@ -11900,7 +12166,21 @@
                 <w:sz w:val="22"/>
                 <w:szCs w:val="22"/>
               </w:rPr>
-              <w:t xml:space="preserve">Horizontal Ladle Preheater</w:t>
+              <w:t xml:space="preserve">Vertical Ladle Preheater - 65 MT</w:t>
+            </w:r>
+          </w:p>
+          <w:p>
+            <w:pPr>
+              <w:spacing w:after="40" w:before="40"/>
+              <w:jc w:val="left"/>
+            </w:pPr>
+            <w:r>
+              <w:rPr>
+                <w:rFonts w:ascii="Calibri" w:cs="Calibri" w:eastAsia="Calibri" w:hAnsi="Calibri"/>
+                <w:sz w:val="22"/>
+                <w:szCs w:val="22"/>
+              </w:rPr>
+              <w:t xml:space="preserve">Tundish Preheater</w:t>
             </w:r>
           </w:p>
         </w:tc>
@@ -11935,7 +12215,7 @@
                 <w:sz w:val="22"/>
                 <w:szCs w:val="22"/>
               </w:rPr>
-              <w:t>38</w:t>
+              <w:t xml:space="preserve">38</w:t>
             </w:r>
           </w:p>
         </w:tc>
@@ -11970,7 +12250,7 @@
                 <w:sz w:val="22"/>
                 <w:szCs w:val="22"/>
               </w:rPr>
-              <w:t xml:space="preserve">Kisco Castings India Ltd.</w:t>
+              <w:t xml:space="preserve">Aarti Steel Limited</w:t>
             </w:r>
           </w:p>
         </w:tc>
@@ -12003,7 +12283,7 @@
                 <w:sz w:val="22"/>
                 <w:szCs w:val="22"/>
               </w:rPr>
-              <w:t xml:space="preserve">Vertical Ladle Preheater - 11 MT</w:t>
+              <w:t xml:space="preserve">Tundish Preheater</w:t>
             </w:r>
           </w:p>
         </w:tc>
@@ -12038,7 +12318,7 @@
                 <w:sz w:val="22"/>
                 <w:szCs w:val="22"/>
               </w:rPr>
-              <w:t>39</w:t>
+              <w:t xml:space="preserve">39</w:t>
             </w:r>
           </w:p>
         </w:tc>
@@ -12073,7 +12353,7 @@
                 <w:sz w:val="22"/>
                 <w:szCs w:val="22"/>
               </w:rPr>
-              <w:t xml:space="preserve">Vardhman Special Steels Ltd. ( Unit-1)</w:t>
+              <w:t xml:space="preserve">Action Ispat And Power P Ltd.</w:t>
             </w:r>
           </w:p>
         </w:tc>
@@ -12095,6 +12375,20 @@
             </w:tcMar>
             <w:vAlign w:val="center"/>
           </w:tcPr>
+          <w:p>
+            <w:pPr>
+              <w:spacing w:after="40" w:before="40"/>
+              <w:jc w:val="left"/>
+            </w:pPr>
+            <w:r>
+              <w:rPr>
+                <w:rFonts w:ascii="Calibri" w:cs="Calibri" w:eastAsia="Calibri" w:hAnsi="Calibri"/>
+                <w:sz w:val="22"/>
+                <w:szCs w:val="22"/>
+              </w:rPr>
+              <w:t xml:space="preserve">Vertical Ladle Preheater - 15 MT</w:t>
+            </w:r>
+          </w:p>
           <w:p>
             <w:pPr>
               <w:spacing w:after="40" w:before="40"/>
@@ -12141,7 +12435,7 @@
                 <w:sz w:val="22"/>
                 <w:szCs w:val="22"/>
               </w:rPr>
-              <w:t>40</w:t>
+              <w:t xml:space="preserve">40</w:t>
             </w:r>
           </w:p>
         </w:tc>
@@ -12176,7 +12470,7 @@
                 <w:sz w:val="22"/>
                 <w:szCs w:val="22"/>
               </w:rPr>
-              <w:t xml:space="preserve">Vardhman Special Steels Ltd. ( Unit-1)</w:t>
+              <w:t xml:space="preserve">Vardhman Special Steels Ltd.Unit-1</w:t>
             </w:r>
           </w:p>
         </w:tc>
@@ -12209,7 +12503,7 @@
                 <w:sz w:val="22"/>
                 <w:szCs w:val="22"/>
               </w:rPr>
-              <w:t xml:space="preserve">Horizontal Ladle Preheater</w:t>
+              <w:t xml:space="preserve">Tundish Preheater</w:t>
             </w:r>
           </w:p>
         </w:tc>
@@ -12244,7 +12538,7 @@
                 <w:sz w:val="22"/>
                 <w:szCs w:val="22"/>
               </w:rPr>
-              <w:t>41</w:t>
+              <w:t xml:space="preserve">41</w:t>
             </w:r>
           </w:p>
         </w:tc>
@@ -12279,7 +12573,7 @@
                 <w:sz w:val="22"/>
                 <w:szCs w:val="22"/>
               </w:rPr>
-              <w:t xml:space="preserve">Vardhman Special Steels Ltd. ( Unit-1)</w:t>
+              <w:t xml:space="preserve">Bangladesh Re Rolling Mills Ltd.</w:t>
             </w:r>
           </w:p>
         </w:tc>
@@ -12312,7 +12606,7 @@
                 <w:sz w:val="22"/>
                 <w:szCs w:val="22"/>
               </w:rPr>
-              <w:t xml:space="preserve">Vertical Ladle Preheater - 45 MT</w:t>
+              <w:t xml:space="preserve">Tundish Preheater</w:t>
             </w:r>
           </w:p>
         </w:tc>
@@ -12347,7 +12641,7 @@
                 <w:sz w:val="22"/>
                 <w:szCs w:val="22"/>
               </w:rPr>
-              <w:t>42</w:t>
+              <w:t xml:space="preserve">42</w:t>
             </w:r>
           </w:p>
         </w:tc>
@@ -12382,7 +12676,7 @@
                 <w:sz w:val="22"/>
                 <w:szCs w:val="22"/>
               </w:rPr>
-              <w:t xml:space="preserve">Rungta Mines Ltd.</w:t>
+              <w:t xml:space="preserve">Amic Forging Ltd.</w:t>
             </w:r>
           </w:p>
         </w:tc>
@@ -12415,7 +12709,7 @@
                 <w:sz w:val="22"/>
                 <w:szCs w:val="22"/>
               </w:rPr>
-              <w:t xml:space="preserve">Horizontal Ladle Preheater - 45 MT</w:t>
+              <w:t xml:space="preserve">Vertical Ladle Preheater - 10 MT</w:t>
             </w:r>
           </w:p>
         </w:tc>
@@ -12450,7 +12744,7 @@
                 <w:sz w:val="22"/>
                 <w:szCs w:val="22"/>
               </w:rPr>
-              <w:t>43</w:t>
+              <w:t xml:space="preserve">43</w:t>
             </w:r>
           </w:p>
         </w:tc>
@@ -12485,7 +12779,7 @@
                 <w:sz w:val="22"/>
                 <w:szCs w:val="22"/>
               </w:rPr>
-              <w:t xml:space="preserve">Rungta Mines Ltd.</w:t>
+              <w:t xml:space="preserve">Lloyds Engineering Works Limited</w:t>
             </w:r>
           </w:p>
         </w:tc>
@@ -12518,7 +12812,21 @@
                 <w:sz w:val="22"/>
                 <w:szCs w:val="22"/>
               </w:rPr>
-              <w:t xml:space="preserve">Horizontal Ladle Preheater - 250 MT</w:t>
+              <w:t xml:space="preserve">Vertical Ladle Preheater - 50 MT</w:t>
+            </w:r>
+          </w:p>
+          <w:p>
+            <w:pPr>
+              <w:spacing w:after="40" w:before="40"/>
+              <w:jc w:val="left"/>
+            </w:pPr>
+            <w:r>
+              <w:rPr>
+                <w:rFonts w:ascii="Calibri" w:cs="Calibri" w:eastAsia="Calibri" w:hAnsi="Calibri"/>
+                <w:sz w:val="22"/>
+                <w:szCs w:val="22"/>
+              </w:rPr>
+              <w:t xml:space="preserve">Vertical Ladle Preheater - 40 MT</w:t>
             </w:r>
           </w:p>
         </w:tc>
@@ -12553,7 +12861,7 @@
                 <w:sz w:val="22"/>
                 <w:szCs w:val="22"/>
               </w:rPr>
-              <w:t>44</w:t>
+              <w:t xml:space="preserve">44</w:t>
             </w:r>
           </w:p>
         </w:tc>
@@ -12588,7 +12896,7 @@
                 <w:sz w:val="22"/>
                 <w:szCs w:val="22"/>
               </w:rPr>
-              <w:t xml:space="preserve">Rungta Mines Ltd.</w:t>
+              <w:t xml:space="preserve">Muhaj Baghdad Co. Ltd.</w:t>
             </w:r>
           </w:p>
         </w:tc>
@@ -12621,7 +12929,7 @@
                 <w:sz w:val="22"/>
                 <w:szCs w:val="22"/>
               </w:rPr>
-              <w:t xml:space="preserve">Vertical Ladle Preheater - 250 MT</w:t>
+              <w:t xml:space="preserve">Tundish Preheater</w:t>
             </w:r>
           </w:p>
         </w:tc>
@@ -12656,7 +12964,7 @@
                 <w:sz w:val="22"/>
                 <w:szCs w:val="22"/>
               </w:rPr>
-              <w:t>45</w:t>
+              <w:t xml:space="preserve">45</w:t>
             </w:r>
           </w:p>
         </w:tc>
@@ -12691,7 +12999,7 @@
                 <w:sz w:val="22"/>
                 <w:szCs w:val="22"/>
               </w:rPr>
-              <w:t xml:space="preserve">Rungta Mines Ltd.</w:t>
+              <w:t xml:space="preserve">Topworth Steels &amp; Power Pvt. Ltd.</w:t>
             </w:r>
           </w:p>
         </w:tc>
@@ -12759,7 +13067,7 @@
                 <w:sz w:val="22"/>
                 <w:szCs w:val="22"/>
               </w:rPr>
-              <w:t>46</w:t>
+              <w:t xml:space="preserve">46</w:t>
             </w:r>
           </w:p>
         </w:tc>
@@ -12794,7 +13102,7 @@
                 <w:sz w:val="22"/>
                 <w:szCs w:val="22"/>
               </w:rPr>
-              <w:t xml:space="preserve">Tata Steel Long Products</w:t>
+              <w:t xml:space="preserve">Sohar Steel LLC</w:t>
             </w:r>
           </w:p>
         </w:tc>
@@ -12827,7 +13135,21 @@
                 <w:sz w:val="22"/>
                 <w:szCs w:val="22"/>
               </w:rPr>
-              <w:t xml:space="preserve">Vertical Ladle Preheater - 70 MT</w:t>
+              <w:t xml:space="preserve">Vertical Ladle Preheater</w:t>
+            </w:r>
+          </w:p>
+          <w:p>
+            <w:pPr>
+              <w:spacing w:after="40" w:before="40"/>
+              <w:jc w:val="left"/>
+            </w:pPr>
+            <w:r>
+              <w:rPr>
+                <w:rFonts w:ascii="Calibri" w:cs="Calibri" w:eastAsia="Calibri" w:hAnsi="Calibri"/>
+                <w:sz w:val="22"/>
+                <w:szCs w:val="22"/>
+              </w:rPr>
+              <w:t xml:space="preserve">Horizontal Ladle Preheater</w:t>
             </w:r>
           </w:p>
         </w:tc>
@@ -12862,7 +13184,7 @@
                 <w:sz w:val="22"/>
                 <w:szCs w:val="22"/>
               </w:rPr>
-              <w:t>47</w:t>
+              <w:t xml:space="preserve">47</w:t>
             </w:r>
           </w:p>
         </w:tc>
@@ -12897,7 +13219,7 @@
                 <w:sz w:val="22"/>
                 <w:szCs w:val="22"/>
               </w:rPr>
-              <w:t xml:space="preserve">Jindal Steel Iron &amp; Steel LLC</w:t>
+              <w:t xml:space="preserve">Quality Industries P Ltd.</w:t>
             </w:r>
           </w:p>
         </w:tc>
@@ -12930,7 +13252,21 @@
                 <w:sz w:val="22"/>
                 <w:szCs w:val="22"/>
               </w:rPr>
-              <w:t xml:space="preserve">Tundish Preheater</w:t>
+              <w:t xml:space="preserve">Vertical Ladle Preheater - 30 MT</w:t>
+            </w:r>
+          </w:p>
+          <w:p>
+            <w:pPr>
+              <w:spacing w:after="40" w:before="40"/>
+              <w:jc w:val="left"/>
+            </w:pPr>
+            <w:r>
+              <w:rPr>
+                <w:rFonts w:ascii="Calibri" w:cs="Calibri" w:eastAsia="Calibri" w:hAnsi="Calibri"/>
+                <w:sz w:val="22"/>
+                <w:szCs w:val="22"/>
+              </w:rPr>
+              <w:t xml:space="preserve">Horizontal Ladle Preheater - 30 MT</w:t>
             </w:r>
           </w:p>
         </w:tc>
@@ -12965,7 +13301,7 @@
                 <w:sz w:val="22"/>
                 <w:szCs w:val="22"/>
               </w:rPr>
-              <w:t>48</w:t>
+              <w:t xml:space="preserve">48</w:t>
             </w:r>
           </w:p>
         </w:tc>
@@ -13000,7 +13336,7 @@
                 <w:sz w:val="22"/>
                 <w:szCs w:val="22"/>
               </w:rPr>
-              <w:t xml:space="preserve">Tata Steel Long Products</w:t>
+              <w:t xml:space="preserve">Rashtriya Ispat Nigam Limited</w:t>
             </w:r>
           </w:p>
         </w:tc>
@@ -13033,7 +13369,7 @@
                 <w:sz w:val="22"/>
                 <w:szCs w:val="22"/>
               </w:rPr>
-              <w:t xml:space="preserve">Vertical Ladle Preheater</w:t>
+              <w:t xml:space="preserve">Tundish Preheater</w:t>
             </w:r>
           </w:p>
         </w:tc>
@@ -13068,7 +13404,7 @@
                 <w:sz w:val="22"/>
                 <w:szCs w:val="22"/>
               </w:rPr>
-              <w:t>49</w:t>
+              <w:t xml:space="preserve">49</w:t>
             </w:r>
           </w:p>
         </w:tc>
@@ -13103,7 +13439,7 @@
                 <w:sz w:val="22"/>
                 <w:szCs w:val="22"/>
               </w:rPr>
-              <w:t xml:space="preserve">JSW Power Steel Ltd.</w:t>
+              <w:t xml:space="preserve">PT. Garuda Yamato Steel</w:t>
             </w:r>
           </w:p>
         </w:tc>
@@ -13136,1025 +13472,9 @@
                 <w:sz w:val="22"/>
                 <w:szCs w:val="22"/>
               </w:rPr>
-              <w:t xml:space="preserve">Tundish Preheater</w:t>
-            </w:r>
-          </w:p>
-        </w:tc>
-      </w:tr>
-      <w:tr>
-        <w:tc>
-          <w:tcPr>
-            <w:tcW w:type="dxa" w:w="780"/>
-            <w:tcBorders>
-              <w:top w:val="single" w:color="BFBFBF" w:sz="4"/>
-              <w:left w:val="single" w:color="BFBFBF" w:sz="4"/>
-              <w:bottom w:val="single" w:color="BFBFBF" w:sz="4"/>
-              <w:right w:val="single" w:color="BFBFBF" w:sz="4"/>
-            </w:tcBorders>
-            <w:shd w:fill="F3F4F6" w:val="clear"/>
-            <w:tcMar>
-              <w:top w:type="dxa" w:w="100"/>
-              <w:left w:type="dxa" w:w="140"/>
-              <w:bottom w:type="dxa" w:w="100"/>
-              <w:right w:type="dxa" w:w="140"/>
-            </w:tcMar>
-            <w:vAlign w:val="center"/>
-          </w:tcPr>
-          <w:p>
-            <w:pPr>
-              <w:spacing w:after="40" w:before="40"/>
-              <w:jc w:val="center"/>
-            </w:pPr>
-            <w:r>
-              <w:rPr>
-                <w:rFonts w:ascii="Calibri" w:cs="Calibri" w:eastAsia="Calibri" w:hAnsi="Calibri"/>
-                <w:sz w:val="22"/>
-                <w:szCs w:val="22"/>
-              </w:rPr>
-              <w:t>50</w:t>
-            </w:r>
-          </w:p>
-        </w:tc>
-        <w:tc>
-          <w:tcPr>
-            <w:tcW w:type="dxa" w:w="3580"/>
-            <w:tcBorders>
-              <w:top w:val="single" w:color="BFBFBF" w:sz="4"/>
-              <w:left w:val="single" w:color="BFBFBF" w:sz="4"/>
-              <w:bottom w:val="single" w:color="BFBFBF" w:sz="4"/>
-              <w:right w:val="single" w:color="BFBFBF" w:sz="4"/>
-            </w:tcBorders>
-            <w:shd w:fill="F3F4F6" w:val="clear"/>
-            <w:tcMar>
-              <w:top w:type="dxa" w:w="100"/>
-              <w:left w:type="dxa" w:w="140"/>
-              <w:bottom w:type="dxa" w:w="100"/>
-              <w:right w:type="dxa" w:w="140"/>
-            </w:tcMar>
-            <w:vAlign w:val="center"/>
-          </w:tcPr>
-          <w:p>
-            <w:pPr>
-              <w:spacing w:after="40" w:before="40"/>
-              <w:jc w:val="left"/>
-            </w:pPr>
-            <w:r>
-              <w:rPr>
-                <w:rFonts w:ascii="Calibri" w:cs="Calibri" w:eastAsia="Calibri" w:hAnsi="Calibri"/>
-                <w:b/>
-                <w:bCs/>
-                <w:sz w:val="22"/>
-                <w:szCs w:val="22"/>
-              </w:rPr>
-              <w:t xml:space="preserve">Jindal Stainless Limited</w:t>
-            </w:r>
-          </w:p>
-        </w:tc>
-        <w:tc>
-          <w:tcPr>
-            <w:tcW w:type="dxa" w:w="5000"/>
-            <w:tcBorders>
-              <w:top w:val="single" w:color="BFBFBF" w:sz="4"/>
-              <w:left w:val="single" w:color="BFBFBF" w:sz="4"/>
-              <w:bottom w:val="single" w:color="BFBFBF" w:sz="4"/>
-              <w:right w:val="single" w:color="BFBFBF" w:sz="4"/>
-            </w:tcBorders>
-            <w:shd w:fill="F3F4F6" w:val="clear"/>
-            <w:tcMar>
-              <w:top w:type="dxa" w:w="100"/>
-              <w:left w:type="dxa" w:w="140"/>
-              <w:bottom w:type="dxa" w:w="100"/>
-              <w:right w:type="dxa" w:w="140"/>
-            </w:tcMar>
-            <w:vAlign w:val="center"/>
-          </w:tcPr>
-          <w:p>
-            <w:pPr>
-              <w:spacing w:after="40" w:before="40"/>
-              <w:jc w:val="left"/>
-            </w:pPr>
-            <w:r>
-              <w:rPr>
-                <w:rFonts w:ascii="Calibri" w:cs="Calibri" w:eastAsia="Calibri" w:hAnsi="Calibri"/>
-                <w:sz w:val="22"/>
-                <w:szCs w:val="22"/>
-              </w:rPr>
-              <w:t xml:space="preserve">Horizontal Ladle Preheater - 150 MT</w:t>
-            </w:r>
-          </w:p>
-        </w:tc>
-      </w:tr>
-      <w:tr>
-        <w:tc>
-          <w:tcPr>
-            <w:tcW w:type="dxa" w:w="780"/>
-            <w:tcBorders>
-              <w:top w:val="single" w:color="BFBFBF" w:sz="4"/>
-              <w:left w:val="single" w:color="BFBFBF" w:sz="4"/>
-              <w:bottom w:val="single" w:color="BFBFBF" w:sz="4"/>
-              <w:right w:val="single" w:color="BFBFBF" w:sz="4"/>
-            </w:tcBorders>
-            <w:shd w:fill="F3F4F6" w:val="clear"/>
-            <w:tcMar>
-              <w:top w:type="dxa" w:w="100"/>
-              <w:left w:type="dxa" w:w="140"/>
-              <w:bottom w:type="dxa" w:w="100"/>
-              <w:right w:type="dxa" w:w="140"/>
-            </w:tcMar>
-            <w:vAlign w:val="center"/>
-          </w:tcPr>
-          <w:p>
-            <w:pPr>
-              <w:spacing w:after="40" w:before="40"/>
-              <w:jc w:val="center"/>
-            </w:pPr>
-            <w:r>
-              <w:rPr>
-                <w:rFonts w:ascii="Calibri" w:cs="Calibri" w:eastAsia="Calibri" w:hAnsi="Calibri"/>
-                <w:sz w:val="22"/>
-                <w:szCs w:val="22"/>
-              </w:rPr>
-              <w:t>51</w:t>
-            </w:r>
-          </w:p>
-        </w:tc>
-        <w:tc>
-          <w:tcPr>
-            <w:tcW w:type="dxa" w:w="3580"/>
-            <w:tcBorders>
-              <w:top w:val="single" w:color="BFBFBF" w:sz="4"/>
-              <w:left w:val="single" w:color="BFBFBF" w:sz="4"/>
-              <w:bottom w:val="single" w:color="BFBFBF" w:sz="4"/>
-              <w:right w:val="single" w:color="BFBFBF" w:sz="4"/>
-            </w:tcBorders>
-            <w:shd w:fill="F3F4F6" w:val="clear"/>
-            <w:tcMar>
-              <w:top w:type="dxa" w:w="100"/>
-              <w:left w:type="dxa" w:w="140"/>
-              <w:bottom w:type="dxa" w:w="100"/>
-              <w:right w:type="dxa" w:w="140"/>
-            </w:tcMar>
-            <w:vAlign w:val="center"/>
-          </w:tcPr>
-          <w:p>
-            <w:pPr>
-              <w:spacing w:after="40" w:before="40"/>
-              <w:jc w:val="left"/>
-            </w:pPr>
-            <w:r>
-              <w:rPr>
-                <w:rFonts w:ascii="Calibri" w:cs="Calibri" w:eastAsia="Calibri" w:hAnsi="Calibri"/>
-                <w:b/>
-                <w:bCs/>
-                <w:sz w:val="22"/>
-                <w:szCs w:val="22"/>
-              </w:rPr>
-              <w:t xml:space="preserve">Jindal Stainless Limited</w:t>
-            </w:r>
-          </w:p>
-        </w:tc>
-        <w:tc>
-          <w:tcPr>
-            <w:tcW w:type="dxa" w:w="5000"/>
-            <w:tcBorders>
-              <w:top w:val="single" w:color="BFBFBF" w:sz="4"/>
-              <w:left w:val="single" w:color="BFBFBF" w:sz="4"/>
-              <w:bottom w:val="single" w:color="BFBFBF" w:sz="4"/>
-              <w:right w:val="single" w:color="BFBFBF" w:sz="4"/>
-            </w:tcBorders>
-            <w:shd w:fill="F3F4F6" w:val="clear"/>
-            <w:tcMar>
-              <w:top w:type="dxa" w:w="100"/>
-              <w:left w:type="dxa" w:w="140"/>
-              <w:bottom w:type="dxa" w:w="100"/>
-              <w:right w:type="dxa" w:w="140"/>
-            </w:tcMar>
-            <w:vAlign w:val="center"/>
-          </w:tcPr>
-          <w:p>
-            <w:pPr>
-              <w:spacing w:after="40" w:before="40"/>
-              <w:jc w:val="left"/>
-            </w:pPr>
-            <w:r>
-              <w:rPr>
-                <w:rFonts w:ascii="Calibri" w:cs="Calibri" w:eastAsia="Calibri" w:hAnsi="Calibri"/>
-                <w:sz w:val="22"/>
-                <w:szCs w:val="22"/>
-              </w:rPr>
-              <w:t xml:space="preserve">Horizontal Ladle Preheater - 130 MT</w:t>
-            </w:r>
-          </w:p>
-        </w:tc>
-      </w:tr>
-      <w:tr>
-        <w:tc>
-          <w:tcPr>
-            <w:tcW w:type="dxa" w:w="780"/>
-            <w:tcBorders>
-              <w:top w:val="single" w:color="BFBFBF" w:sz="4"/>
-              <w:left w:val="single" w:color="BFBFBF" w:sz="4"/>
-              <w:bottom w:val="single" w:color="BFBFBF" w:sz="4"/>
-              <w:right w:val="single" w:color="BFBFBF" w:sz="4"/>
-            </w:tcBorders>
-            <w:shd w:fill="F3F4F6" w:val="clear"/>
-            <w:tcMar>
-              <w:top w:type="dxa" w:w="100"/>
-              <w:left w:type="dxa" w:w="140"/>
-              <w:bottom w:type="dxa" w:w="100"/>
-              <w:right w:type="dxa" w:w="140"/>
-            </w:tcMar>
-            <w:vAlign w:val="center"/>
-          </w:tcPr>
-          <w:p>
-            <w:pPr>
-              <w:spacing w:after="40" w:before="40"/>
-              <w:jc w:val="center"/>
-            </w:pPr>
-            <w:r>
-              <w:rPr>
-                <w:rFonts w:ascii="Calibri" w:cs="Calibri" w:eastAsia="Calibri" w:hAnsi="Calibri"/>
-                <w:sz w:val="22"/>
-                <w:szCs w:val="22"/>
-              </w:rPr>
-              <w:t>52</w:t>
-            </w:r>
-          </w:p>
-        </w:tc>
-        <w:tc>
-          <w:tcPr>
-            <w:tcW w:type="dxa" w:w="3580"/>
-            <w:tcBorders>
-              <w:top w:val="single" w:color="BFBFBF" w:sz="4"/>
-              <w:left w:val="single" w:color="BFBFBF" w:sz="4"/>
-              <w:bottom w:val="single" w:color="BFBFBF" w:sz="4"/>
-              <w:right w:val="single" w:color="BFBFBF" w:sz="4"/>
-            </w:tcBorders>
-            <w:shd w:fill="F3F4F6" w:val="clear"/>
-            <w:tcMar>
-              <w:top w:type="dxa" w:w="100"/>
-              <w:left w:type="dxa" w:w="140"/>
-              <w:bottom w:type="dxa" w:w="100"/>
-              <w:right w:type="dxa" w:w="140"/>
-            </w:tcMar>
-            <w:vAlign w:val="center"/>
-          </w:tcPr>
-          <w:p>
-            <w:pPr>
-              <w:spacing w:after="40" w:before="40"/>
-              <w:jc w:val="left"/>
-            </w:pPr>
-            <w:r>
-              <w:rPr>
-                <w:rFonts w:ascii="Calibri" w:cs="Calibri" w:eastAsia="Calibri" w:hAnsi="Calibri"/>
-                <w:b/>
-                <w:bCs/>
-                <w:sz w:val="22"/>
-                <w:szCs w:val="22"/>
-              </w:rPr>
-              <w:t xml:space="preserve">Jindal Stainless Limited</w:t>
-            </w:r>
-          </w:p>
-        </w:tc>
-        <w:tc>
-          <w:tcPr>
-            <w:tcW w:type="dxa" w:w="5000"/>
-            <w:tcBorders>
-              <w:top w:val="single" w:color="BFBFBF" w:sz="4"/>
-              <w:left w:val="single" w:color="BFBFBF" w:sz="4"/>
-              <w:bottom w:val="single" w:color="BFBFBF" w:sz="4"/>
-              <w:right w:val="single" w:color="BFBFBF" w:sz="4"/>
-            </w:tcBorders>
-            <w:shd w:fill="F3F4F6" w:val="clear"/>
-            <w:tcMar>
-              <w:top w:type="dxa" w:w="100"/>
-              <w:left w:type="dxa" w:w="140"/>
-              <w:bottom w:type="dxa" w:w="100"/>
-              <w:right w:type="dxa" w:w="140"/>
-            </w:tcMar>
-            <w:vAlign w:val="center"/>
-          </w:tcPr>
-          <w:p>
-            <w:pPr>
-              <w:spacing w:after="40" w:before="40"/>
-              <w:jc w:val="left"/>
-            </w:pPr>
-            <w:r>
-              <w:rPr>
-                <w:rFonts w:ascii="Calibri" w:cs="Calibri" w:eastAsia="Calibri" w:hAnsi="Calibri"/>
-                <w:sz w:val="22"/>
-                <w:szCs w:val="22"/>
-              </w:rPr>
-              <w:t xml:space="preserve">Vertical Ladle Preheater - 150 MT</w:t>
-            </w:r>
-          </w:p>
-        </w:tc>
-      </w:tr>
-      <w:tr>
-        <w:tc>
-          <w:tcPr>
-            <w:tcW w:type="dxa" w:w="780"/>
-            <w:tcBorders>
-              <w:top w:val="single" w:color="BFBFBF" w:sz="4"/>
-              <w:left w:val="single" w:color="BFBFBF" w:sz="4"/>
-              <w:bottom w:val="single" w:color="BFBFBF" w:sz="4"/>
-              <w:right w:val="single" w:color="BFBFBF" w:sz="4"/>
-            </w:tcBorders>
-            <w:shd w:fill="F3F4F6" w:val="clear"/>
-            <w:tcMar>
-              <w:top w:type="dxa" w:w="100"/>
-              <w:left w:type="dxa" w:w="140"/>
-              <w:bottom w:type="dxa" w:w="100"/>
-              <w:right w:type="dxa" w:w="140"/>
-            </w:tcMar>
-            <w:vAlign w:val="center"/>
-          </w:tcPr>
-          <w:p>
-            <w:pPr>
-              <w:spacing w:after="40" w:before="40"/>
-              <w:jc w:val="center"/>
-            </w:pPr>
-            <w:r>
-              <w:rPr>
-                <w:rFonts w:ascii="Calibri" w:cs="Calibri" w:eastAsia="Calibri" w:hAnsi="Calibri"/>
-                <w:sz w:val="22"/>
-                <w:szCs w:val="22"/>
-              </w:rPr>
-              <w:t>53</w:t>
-            </w:r>
-          </w:p>
-        </w:tc>
-        <w:tc>
-          <w:tcPr>
-            <w:tcW w:type="dxa" w:w="3580"/>
-            <w:tcBorders>
-              <w:top w:val="single" w:color="BFBFBF" w:sz="4"/>
-              <w:left w:val="single" w:color="BFBFBF" w:sz="4"/>
-              <w:bottom w:val="single" w:color="BFBFBF" w:sz="4"/>
-              <w:right w:val="single" w:color="BFBFBF" w:sz="4"/>
-            </w:tcBorders>
-            <w:shd w:fill="F3F4F6" w:val="clear"/>
-            <w:tcMar>
-              <w:top w:type="dxa" w:w="100"/>
-              <w:left w:type="dxa" w:w="140"/>
-              <w:bottom w:type="dxa" w:w="100"/>
-              <w:right w:type="dxa" w:w="140"/>
-            </w:tcMar>
-            <w:vAlign w:val="center"/>
-          </w:tcPr>
-          <w:p>
-            <w:pPr>
-              <w:spacing w:after="40" w:before="40"/>
-              <w:jc w:val="left"/>
-            </w:pPr>
-            <w:r>
-              <w:rPr>
-                <w:rFonts w:ascii="Calibri" w:cs="Calibri" w:eastAsia="Calibri" w:hAnsi="Calibri"/>
-                <w:b/>
-                <w:bCs/>
-                <w:sz w:val="22"/>
-                <w:szCs w:val="22"/>
-              </w:rPr>
-              <w:t xml:space="preserve">Primetals Technologies India Limited</w:t>
-            </w:r>
-          </w:p>
-        </w:tc>
-        <w:tc>
-          <w:tcPr>
-            <w:tcW w:type="dxa" w:w="5000"/>
-            <w:tcBorders>
-              <w:top w:val="single" w:color="BFBFBF" w:sz="4"/>
-              <w:left w:val="single" w:color="BFBFBF" w:sz="4"/>
-              <w:bottom w:val="single" w:color="BFBFBF" w:sz="4"/>
-              <w:right w:val="single" w:color="BFBFBF" w:sz="4"/>
-            </w:tcBorders>
-            <w:shd w:fill="F3F4F6" w:val="clear"/>
-            <w:tcMar>
-              <w:top w:type="dxa" w:w="100"/>
-              <w:left w:type="dxa" w:w="140"/>
-              <w:bottom w:type="dxa" w:w="100"/>
-              <w:right w:type="dxa" w:w="140"/>
-            </w:tcMar>
-            <w:vAlign w:val="center"/>
-          </w:tcPr>
-          <w:p>
-            <w:pPr>
-              <w:spacing w:after="40" w:before="40"/>
-              <w:jc w:val="left"/>
-            </w:pPr>
-            <w:r>
-              <w:rPr>
-                <w:rFonts w:ascii="Calibri" w:cs="Calibri" w:eastAsia="Calibri" w:hAnsi="Calibri"/>
-                <w:sz w:val="22"/>
-                <w:szCs w:val="22"/>
-              </w:rPr>
-              <w:t xml:space="preserve">Tundish Preheater</w:t>
-            </w:r>
-          </w:p>
-        </w:tc>
-      </w:tr>
-      <w:tr>
-        <w:tc>
-          <w:tcPr>
-            <w:tcW w:type="dxa" w:w="780"/>
-            <w:tcBorders>
-              <w:top w:val="single" w:color="BFBFBF" w:sz="4"/>
-              <w:left w:val="single" w:color="BFBFBF" w:sz="4"/>
-              <w:bottom w:val="single" w:color="BFBFBF" w:sz="4"/>
-              <w:right w:val="single" w:color="BFBFBF" w:sz="4"/>
-            </w:tcBorders>
-            <w:shd w:fill="F3F4F6" w:val="clear"/>
-            <w:tcMar>
-              <w:top w:type="dxa" w:w="100"/>
-              <w:left w:type="dxa" w:w="140"/>
-              <w:bottom w:type="dxa" w:w="100"/>
-              <w:right w:type="dxa" w:w="140"/>
-            </w:tcMar>
-            <w:vAlign w:val="center"/>
-          </w:tcPr>
-          <w:p>
-            <w:pPr>
-              <w:spacing w:after="40" w:before="40"/>
-              <w:jc w:val="center"/>
-            </w:pPr>
-            <w:r>
-              <w:rPr>
-                <w:rFonts w:ascii="Calibri" w:cs="Calibri" w:eastAsia="Calibri" w:hAnsi="Calibri"/>
-                <w:sz w:val="22"/>
-                <w:szCs w:val="22"/>
-              </w:rPr>
-              <w:t>54</w:t>
-            </w:r>
-          </w:p>
-        </w:tc>
-        <w:tc>
-          <w:tcPr>
-            <w:tcW w:type="dxa" w:w="3580"/>
-            <w:tcBorders>
-              <w:top w:val="single" w:color="BFBFBF" w:sz="4"/>
-              <w:left w:val="single" w:color="BFBFBF" w:sz="4"/>
-              <w:bottom w:val="single" w:color="BFBFBF" w:sz="4"/>
-              <w:right w:val="single" w:color="BFBFBF" w:sz="4"/>
-            </w:tcBorders>
-            <w:shd w:fill="F3F4F6" w:val="clear"/>
-            <w:tcMar>
-              <w:top w:type="dxa" w:w="100"/>
-              <w:left w:type="dxa" w:w="140"/>
-              <w:bottom w:type="dxa" w:w="100"/>
-              <w:right w:type="dxa" w:w="140"/>
-            </w:tcMar>
-            <w:vAlign w:val="center"/>
-          </w:tcPr>
-          <w:p>
-            <w:pPr>
-              <w:spacing w:after="40" w:before="40"/>
-              <w:jc w:val="left"/>
-            </w:pPr>
-            <w:r>
-              <w:rPr>
-                <w:rFonts w:ascii="Calibri" w:cs="Calibri" w:eastAsia="Calibri" w:hAnsi="Calibri"/>
-                <w:b/>
-                <w:bCs/>
-                <w:sz w:val="22"/>
-                <w:szCs w:val="22"/>
-              </w:rPr>
-              <w:t xml:space="preserve">Emirates Steel Industries</w:t>
-            </w:r>
-          </w:p>
-        </w:tc>
-        <w:tc>
-          <w:tcPr>
-            <w:tcW w:type="dxa" w:w="5000"/>
-            <w:tcBorders>
-              <w:top w:val="single" w:color="BFBFBF" w:sz="4"/>
-              <w:left w:val="single" w:color="BFBFBF" w:sz="4"/>
-              <w:bottom w:val="single" w:color="BFBFBF" w:sz="4"/>
-              <w:right w:val="single" w:color="BFBFBF" w:sz="4"/>
-            </w:tcBorders>
-            <w:shd w:fill="F3F4F6" w:val="clear"/>
-            <w:tcMar>
-              <w:top w:type="dxa" w:w="100"/>
-              <w:left w:type="dxa" w:w="140"/>
-              <w:bottom w:type="dxa" w:w="100"/>
-              <w:right w:type="dxa" w:w="140"/>
-            </w:tcMar>
-            <w:vAlign w:val="center"/>
-          </w:tcPr>
-          <w:p>
-            <w:pPr>
-              <w:spacing w:after="40" w:before="40"/>
-              <w:jc w:val="left"/>
-            </w:pPr>
-            <w:r>
-              <w:rPr>
-                <w:rFonts w:ascii="Calibri" w:cs="Calibri" w:eastAsia="Calibri" w:hAnsi="Calibri"/>
-                <w:sz w:val="22"/>
-                <w:szCs w:val="22"/>
-              </w:rPr>
-              <w:t xml:space="preserve">Tundish Preheater</w:t>
-            </w:r>
-          </w:p>
-        </w:tc>
-      </w:tr>
-      <w:tr>
-        <w:tc>
-          <w:tcPr>
-            <w:tcW w:type="dxa" w:w="780"/>
-            <w:tcBorders>
-              <w:top w:val="single" w:color="BFBFBF" w:sz="4"/>
-              <w:left w:val="single" w:color="BFBFBF" w:sz="4"/>
-              <w:bottom w:val="single" w:color="BFBFBF" w:sz="4"/>
-              <w:right w:val="single" w:color="BFBFBF" w:sz="4"/>
-            </w:tcBorders>
-            <w:shd w:fill="F3F4F6" w:val="clear"/>
-            <w:tcMar>
-              <w:top w:type="dxa" w:w="100"/>
-              <w:left w:type="dxa" w:w="140"/>
-              <w:bottom w:type="dxa" w:w="100"/>
-              <w:right w:type="dxa" w:w="140"/>
-            </w:tcMar>
-            <w:vAlign w:val="center"/>
-          </w:tcPr>
-          <w:p>
-            <w:pPr>
-              <w:spacing w:after="40" w:before="40"/>
-              <w:jc w:val="center"/>
-            </w:pPr>
-            <w:r>
-              <w:rPr>
-                <w:rFonts w:ascii="Calibri" w:cs="Calibri" w:eastAsia="Calibri" w:hAnsi="Calibri"/>
-                <w:sz w:val="22"/>
-                <w:szCs w:val="22"/>
-              </w:rPr>
-              <w:t>55</w:t>
-            </w:r>
-          </w:p>
-        </w:tc>
-        <w:tc>
-          <w:tcPr>
-            <w:tcW w:type="dxa" w:w="3580"/>
-            <w:tcBorders>
-              <w:top w:val="single" w:color="BFBFBF" w:sz="4"/>
-              <w:left w:val="single" w:color="BFBFBF" w:sz="4"/>
-              <w:bottom w:val="single" w:color="BFBFBF" w:sz="4"/>
-              <w:right w:val="single" w:color="BFBFBF" w:sz="4"/>
-            </w:tcBorders>
-            <w:shd w:fill="F3F4F6" w:val="clear"/>
-            <w:tcMar>
-              <w:top w:type="dxa" w:w="100"/>
-              <w:left w:type="dxa" w:w="140"/>
-              <w:bottom w:type="dxa" w:w="100"/>
-              <w:right w:type="dxa" w:w="140"/>
-            </w:tcMar>
-            <w:vAlign w:val="center"/>
-          </w:tcPr>
-          <w:p>
-            <w:pPr>
-              <w:spacing w:after="40" w:before="40"/>
-              <w:jc w:val="left"/>
-            </w:pPr>
-            <w:r>
-              <w:rPr>
-                <w:rFonts w:ascii="Calibri" w:cs="Calibri" w:eastAsia="Calibri" w:hAnsi="Calibri"/>
-                <w:b/>
-                <w:bCs/>
-                <w:sz w:val="22"/>
-                <w:szCs w:val="22"/>
-              </w:rPr>
-              <w:t xml:space="preserve">Jindal Steel &amp; Power Limited</w:t>
-            </w:r>
-          </w:p>
-        </w:tc>
-        <w:tc>
-          <w:tcPr>
-            <w:tcW w:type="dxa" w:w="5000"/>
-            <w:tcBorders>
-              <w:top w:val="single" w:color="BFBFBF" w:sz="4"/>
-              <w:left w:val="single" w:color="BFBFBF" w:sz="4"/>
-              <w:bottom w:val="single" w:color="BFBFBF" w:sz="4"/>
-              <w:right w:val="single" w:color="BFBFBF" w:sz="4"/>
-            </w:tcBorders>
-            <w:shd w:fill="F3F4F6" w:val="clear"/>
-            <w:tcMar>
-              <w:top w:type="dxa" w:w="100"/>
-              <w:left w:type="dxa" w:w="140"/>
-              <w:bottom w:type="dxa" w:w="100"/>
-              <w:right w:type="dxa" w:w="140"/>
-            </w:tcMar>
-            <w:vAlign w:val="center"/>
-          </w:tcPr>
-          <w:p>
-            <w:pPr>
-              <w:spacing w:after="40" w:before="40"/>
-              <w:jc w:val="left"/>
-            </w:pPr>
-            <w:r>
-              <w:rPr>
-                <w:rFonts w:ascii="Calibri" w:cs="Calibri" w:eastAsia="Calibri" w:hAnsi="Calibri"/>
-                <w:sz w:val="22"/>
-                <w:szCs w:val="22"/>
-              </w:rPr>
-              <w:t xml:space="preserve">Vertical Ladle Preheater - 65 MT</w:t>
-            </w:r>
-          </w:p>
-        </w:tc>
-      </w:tr>
-      <w:tr>
-        <w:tc>
-          <w:tcPr>
-            <w:tcW w:type="dxa" w:w="780"/>
-            <w:tcBorders>
-              <w:top w:val="single" w:color="BFBFBF" w:sz="4"/>
-              <w:left w:val="single" w:color="BFBFBF" w:sz="4"/>
-              <w:bottom w:val="single" w:color="BFBFBF" w:sz="4"/>
-              <w:right w:val="single" w:color="BFBFBF" w:sz="4"/>
-            </w:tcBorders>
-            <w:shd w:fill="F3F4F6" w:val="clear"/>
-            <w:tcMar>
-              <w:top w:type="dxa" w:w="100"/>
-              <w:left w:type="dxa" w:w="140"/>
-              <w:bottom w:type="dxa" w:w="100"/>
-              <w:right w:type="dxa" w:w="140"/>
-            </w:tcMar>
-            <w:vAlign w:val="center"/>
-          </w:tcPr>
-          <w:p>
-            <w:pPr>
-              <w:spacing w:after="40" w:before="40"/>
-              <w:jc w:val="center"/>
-            </w:pPr>
-            <w:r>
-              <w:rPr>
-                <w:rFonts w:ascii="Calibri" w:cs="Calibri" w:eastAsia="Calibri" w:hAnsi="Calibri"/>
-                <w:sz w:val="22"/>
-                <w:szCs w:val="22"/>
-              </w:rPr>
-              <w:t>56</w:t>
-            </w:r>
-          </w:p>
-        </w:tc>
-        <w:tc>
-          <w:tcPr>
-            <w:tcW w:type="dxa" w:w="3580"/>
-            <w:tcBorders>
-              <w:top w:val="single" w:color="BFBFBF" w:sz="4"/>
-              <w:left w:val="single" w:color="BFBFBF" w:sz="4"/>
-              <w:bottom w:val="single" w:color="BFBFBF" w:sz="4"/>
-              <w:right w:val="single" w:color="BFBFBF" w:sz="4"/>
-            </w:tcBorders>
-            <w:shd w:fill="F3F4F6" w:val="clear"/>
-            <w:tcMar>
-              <w:top w:type="dxa" w:w="100"/>
-              <w:left w:type="dxa" w:w="140"/>
-              <w:bottom w:type="dxa" w:w="100"/>
-              <w:right w:type="dxa" w:w="140"/>
-            </w:tcMar>
-            <w:vAlign w:val="center"/>
-          </w:tcPr>
-          <w:p>
-            <w:pPr>
-              <w:spacing w:after="40" w:before="40"/>
-              <w:jc w:val="left"/>
-            </w:pPr>
-            <w:r>
-              <w:rPr>
-                <w:rFonts w:ascii="Calibri" w:cs="Calibri" w:eastAsia="Calibri" w:hAnsi="Calibri"/>
-                <w:b/>
-                <w:bCs/>
-                <w:sz w:val="22"/>
-                <w:szCs w:val="22"/>
-              </w:rPr>
-              <w:t xml:space="preserve">Jindal Steel &amp; Power Limited</w:t>
-            </w:r>
-          </w:p>
-        </w:tc>
-        <w:tc>
-          <w:tcPr>
-            <w:tcW w:type="dxa" w:w="5000"/>
-            <w:tcBorders>
-              <w:top w:val="single" w:color="BFBFBF" w:sz="4"/>
-              <w:left w:val="single" w:color="BFBFBF" w:sz="4"/>
-              <w:bottom w:val="single" w:color="BFBFBF" w:sz="4"/>
-              <w:right w:val="single" w:color="BFBFBF" w:sz="4"/>
-            </w:tcBorders>
-            <w:shd w:fill="F3F4F6" w:val="clear"/>
-            <w:tcMar>
-              <w:top w:type="dxa" w:w="100"/>
-              <w:left w:type="dxa" w:w="140"/>
-              <w:bottom w:type="dxa" w:w="100"/>
-              <w:right w:type="dxa" w:w="140"/>
-            </w:tcMar>
-            <w:vAlign w:val="center"/>
-          </w:tcPr>
-          <w:p>
-            <w:pPr>
-              <w:spacing w:after="40" w:before="40"/>
-              <w:jc w:val="left"/>
-            </w:pPr>
-            <w:r>
-              <w:rPr>
-                <w:rFonts w:ascii="Calibri" w:cs="Calibri" w:eastAsia="Calibri" w:hAnsi="Calibri"/>
-                <w:sz w:val="22"/>
-                <w:szCs w:val="22"/>
-              </w:rPr>
-              <w:t xml:space="preserve">Tundish Preheater</w:t>
-            </w:r>
-          </w:p>
-        </w:tc>
-      </w:tr>
-      <w:tr>
-        <w:tc>
-          <w:tcPr>
-            <w:tcW w:type="dxa" w:w="780"/>
-            <w:tcBorders>
-              <w:top w:val="single" w:color="BFBFBF" w:sz="4"/>
-              <w:left w:val="single" w:color="BFBFBF" w:sz="4"/>
-              <w:bottom w:val="single" w:color="BFBFBF" w:sz="4"/>
-              <w:right w:val="single" w:color="BFBFBF" w:sz="4"/>
-            </w:tcBorders>
-            <w:shd w:fill="F3F4F6" w:val="clear"/>
-            <w:tcMar>
-              <w:top w:type="dxa" w:w="100"/>
-              <w:left w:type="dxa" w:w="140"/>
-              <w:bottom w:type="dxa" w:w="100"/>
-              <w:right w:type="dxa" w:w="140"/>
-            </w:tcMar>
-            <w:vAlign w:val="center"/>
-          </w:tcPr>
-          <w:p>
-            <w:pPr>
-              <w:spacing w:after="40" w:before="40"/>
-              <w:jc w:val="center"/>
-            </w:pPr>
-            <w:r>
-              <w:rPr>
-                <w:rFonts w:ascii="Calibri" w:cs="Calibri" w:eastAsia="Calibri" w:hAnsi="Calibri"/>
-                <w:sz w:val="22"/>
-                <w:szCs w:val="22"/>
-              </w:rPr>
-              <w:t>57</w:t>
-            </w:r>
-          </w:p>
-        </w:tc>
-        <w:tc>
-          <w:tcPr>
-            <w:tcW w:type="dxa" w:w="3580"/>
-            <w:tcBorders>
-              <w:top w:val="single" w:color="BFBFBF" w:sz="4"/>
-              <w:left w:val="single" w:color="BFBFBF" w:sz="4"/>
-              <w:bottom w:val="single" w:color="BFBFBF" w:sz="4"/>
-              <w:right w:val="single" w:color="BFBFBF" w:sz="4"/>
-            </w:tcBorders>
-            <w:shd w:fill="F3F4F6" w:val="clear"/>
-            <w:tcMar>
-              <w:top w:type="dxa" w:w="100"/>
-              <w:left w:type="dxa" w:w="140"/>
-              <w:bottom w:type="dxa" w:w="100"/>
-              <w:right w:type="dxa" w:w="140"/>
-            </w:tcMar>
-            <w:vAlign w:val="center"/>
-          </w:tcPr>
-          <w:p>
-            <w:pPr>
-              <w:spacing w:after="40" w:before="40"/>
-              <w:jc w:val="left"/>
-            </w:pPr>
-            <w:r>
-              <w:rPr>
-                <w:rFonts w:ascii="Calibri" w:cs="Calibri" w:eastAsia="Calibri" w:hAnsi="Calibri"/>
-                <w:b/>
-                <w:bCs/>
-                <w:sz w:val="22"/>
-                <w:szCs w:val="22"/>
-              </w:rPr>
-              <w:t xml:space="preserve">Aarti Steel Limited</w:t>
-            </w:r>
-          </w:p>
-        </w:tc>
-        <w:tc>
-          <w:tcPr>
-            <w:tcW w:type="dxa" w:w="5000"/>
-            <w:tcBorders>
-              <w:top w:val="single" w:color="BFBFBF" w:sz="4"/>
-              <w:left w:val="single" w:color="BFBFBF" w:sz="4"/>
-              <w:bottom w:val="single" w:color="BFBFBF" w:sz="4"/>
-              <w:right w:val="single" w:color="BFBFBF" w:sz="4"/>
-            </w:tcBorders>
-            <w:shd w:fill="F3F4F6" w:val="clear"/>
-            <w:tcMar>
-              <w:top w:type="dxa" w:w="100"/>
-              <w:left w:type="dxa" w:w="140"/>
-              <w:bottom w:type="dxa" w:w="100"/>
-              <w:right w:type="dxa" w:w="140"/>
-            </w:tcMar>
-            <w:vAlign w:val="center"/>
-          </w:tcPr>
-          <w:p>
-            <w:pPr>
-              <w:spacing w:after="40" w:before="40"/>
-              <w:jc w:val="left"/>
-            </w:pPr>
-            <w:r>
-              <w:rPr>
-                <w:rFonts w:ascii="Calibri" w:cs="Calibri" w:eastAsia="Calibri" w:hAnsi="Calibri"/>
-                <w:sz w:val="22"/>
-                <w:szCs w:val="22"/>
-              </w:rPr>
-              <w:t xml:space="preserve">Tundish Preheater</w:t>
-            </w:r>
-          </w:p>
-        </w:tc>
-      </w:tr>
-      <w:tr>
-        <w:tc>
-          <w:tcPr>
-            <w:tcW w:type="dxa" w:w="780"/>
-            <w:tcBorders>
-              <w:top w:val="single" w:color="BFBFBF" w:sz="4"/>
-              <w:left w:val="single" w:color="BFBFBF" w:sz="4"/>
-              <w:bottom w:val="single" w:color="BFBFBF" w:sz="4"/>
-              <w:right w:val="single" w:color="BFBFBF" w:sz="4"/>
-            </w:tcBorders>
-            <w:shd w:fill="F3F4F6" w:val="clear"/>
-            <w:tcMar>
-              <w:top w:type="dxa" w:w="100"/>
-              <w:left w:type="dxa" w:w="140"/>
-              <w:bottom w:type="dxa" w:w="100"/>
-              <w:right w:type="dxa" w:w="140"/>
-            </w:tcMar>
-            <w:vAlign w:val="center"/>
-          </w:tcPr>
-          <w:p>
-            <w:pPr>
-              <w:spacing w:after="40" w:before="40"/>
-              <w:jc w:val="center"/>
-            </w:pPr>
-            <w:r>
-              <w:rPr>
-                <w:rFonts w:ascii="Calibri" w:cs="Calibri" w:eastAsia="Calibri" w:hAnsi="Calibri"/>
-                <w:sz w:val="22"/>
-                <w:szCs w:val="22"/>
-              </w:rPr>
-              <w:t>58</w:t>
-            </w:r>
-          </w:p>
-        </w:tc>
-        <w:tc>
-          <w:tcPr>
-            <w:tcW w:type="dxa" w:w="3580"/>
-            <w:tcBorders>
-              <w:top w:val="single" w:color="BFBFBF" w:sz="4"/>
-              <w:left w:val="single" w:color="BFBFBF" w:sz="4"/>
-              <w:bottom w:val="single" w:color="BFBFBF" w:sz="4"/>
-              <w:right w:val="single" w:color="BFBFBF" w:sz="4"/>
-            </w:tcBorders>
-            <w:shd w:fill="F3F4F6" w:val="clear"/>
-            <w:tcMar>
-              <w:top w:type="dxa" w:w="100"/>
-              <w:left w:type="dxa" w:w="140"/>
-              <w:bottom w:type="dxa" w:w="100"/>
-              <w:right w:type="dxa" w:w="140"/>
-            </w:tcMar>
-            <w:vAlign w:val="center"/>
-          </w:tcPr>
-          <w:p>
-            <w:pPr>
-              <w:spacing w:after="40" w:before="40"/>
-              <w:jc w:val="left"/>
-            </w:pPr>
-            <w:r>
-              <w:rPr>
-                <w:rFonts w:ascii="Calibri" w:cs="Calibri" w:eastAsia="Calibri" w:hAnsi="Calibri"/>
-                <w:b/>
-                <w:bCs/>
-                <w:sz w:val="22"/>
-                <w:szCs w:val="22"/>
-              </w:rPr>
-              <w:t xml:space="preserve">Action Ispat And Power P Ltd.</w:t>
-            </w:r>
-          </w:p>
-        </w:tc>
-        <w:tc>
-          <w:tcPr>
-            <w:tcW w:type="dxa" w:w="5000"/>
-            <w:tcBorders>
-              <w:top w:val="single" w:color="BFBFBF" w:sz="4"/>
-              <w:left w:val="single" w:color="BFBFBF" w:sz="4"/>
-              <w:bottom w:val="single" w:color="BFBFBF" w:sz="4"/>
-              <w:right w:val="single" w:color="BFBFBF" w:sz="4"/>
-            </w:tcBorders>
-            <w:shd w:fill="F3F4F6" w:val="clear"/>
-            <w:tcMar>
-              <w:top w:type="dxa" w:w="100"/>
-              <w:left w:type="dxa" w:w="140"/>
-              <w:bottom w:type="dxa" w:w="100"/>
-              <w:right w:type="dxa" w:w="140"/>
-            </w:tcMar>
-            <w:vAlign w:val="center"/>
-          </w:tcPr>
-          <w:p>
-            <w:pPr>
-              <w:spacing w:after="40" w:before="40"/>
-              <w:jc w:val="left"/>
-            </w:pPr>
-            <w:r>
-              <w:rPr>
-                <w:rFonts w:ascii="Calibri" w:cs="Calibri" w:eastAsia="Calibri" w:hAnsi="Calibri"/>
-                <w:sz w:val="22"/>
-                <w:szCs w:val="22"/>
-              </w:rPr>
-              <w:t xml:space="preserve">Vertical Ladle Preheater - 15 MT</w:t>
-            </w:r>
-          </w:p>
-        </w:tc>
-      </w:tr>
-      <w:tr>
-        <w:tc>
-          <w:tcPr>
-            <w:tcW w:type="dxa" w:w="780"/>
-            <w:tcBorders>
-              <w:top w:val="single" w:color="BFBFBF" w:sz="4"/>
-              <w:left w:val="single" w:color="BFBFBF" w:sz="4"/>
-              <w:bottom w:val="single" w:color="BFBFBF" w:sz="4"/>
-              <w:right w:val="single" w:color="BFBFBF" w:sz="4"/>
-            </w:tcBorders>
-            <w:shd w:fill="F3F4F6" w:val="clear"/>
-            <w:tcMar>
-              <w:top w:type="dxa" w:w="100"/>
-              <w:left w:type="dxa" w:w="140"/>
-              <w:bottom w:type="dxa" w:w="100"/>
-              <w:right w:type="dxa" w:w="140"/>
-            </w:tcMar>
-            <w:vAlign w:val="center"/>
-          </w:tcPr>
-          <w:p>
-            <w:pPr>
-              <w:spacing w:after="40" w:before="40"/>
-              <w:jc w:val="center"/>
-            </w:pPr>
-            <w:r>
-              <w:rPr>
-                <w:rFonts w:ascii="Calibri" w:cs="Calibri" w:eastAsia="Calibri" w:hAnsi="Calibri"/>
-                <w:sz w:val="22"/>
-                <w:szCs w:val="22"/>
-              </w:rPr>
-              <w:t>59</w:t>
-            </w:r>
-          </w:p>
-        </w:tc>
-        <w:tc>
-          <w:tcPr>
-            <w:tcW w:type="dxa" w:w="3580"/>
-            <w:tcBorders>
-              <w:top w:val="single" w:color="BFBFBF" w:sz="4"/>
-              <w:left w:val="single" w:color="BFBFBF" w:sz="4"/>
-              <w:bottom w:val="single" w:color="BFBFBF" w:sz="4"/>
-              <w:right w:val="single" w:color="BFBFBF" w:sz="4"/>
-            </w:tcBorders>
-            <w:shd w:fill="F3F4F6" w:val="clear"/>
-            <w:tcMar>
-              <w:top w:type="dxa" w:w="100"/>
-              <w:left w:type="dxa" w:w="140"/>
-              <w:bottom w:type="dxa" w:w="100"/>
-              <w:right w:type="dxa" w:w="140"/>
-            </w:tcMar>
-            <w:vAlign w:val="center"/>
-          </w:tcPr>
-          <w:p>
-            <w:pPr>
-              <w:spacing w:after="40" w:before="40"/>
-              <w:jc w:val="left"/>
-            </w:pPr>
-            <w:r>
-              <w:rPr>
-                <w:rFonts w:ascii="Calibri" w:cs="Calibri" w:eastAsia="Calibri" w:hAnsi="Calibri"/>
-                <w:b/>
-                <w:bCs/>
-                <w:sz w:val="22"/>
-                <w:szCs w:val="22"/>
-              </w:rPr>
-              <w:t xml:space="preserve">Action Ispat And Power P Ltd.</w:t>
-            </w:r>
-          </w:p>
-        </w:tc>
-        <w:tc>
-          <w:tcPr>
-            <w:tcW w:type="dxa" w:w="5000"/>
-            <w:tcBorders>
-              <w:top w:val="single" w:color="BFBFBF" w:sz="4"/>
-              <w:left w:val="single" w:color="BFBFBF" w:sz="4"/>
-              <w:bottom w:val="single" w:color="BFBFBF" w:sz="4"/>
-              <w:right w:val="single" w:color="BFBFBF" w:sz="4"/>
-            </w:tcBorders>
-            <w:shd w:fill="F3F4F6" w:val="clear"/>
-            <w:tcMar>
-              <w:top w:type="dxa" w:w="100"/>
-              <w:left w:type="dxa" w:w="140"/>
-              <w:bottom w:type="dxa" w:w="100"/>
-              <w:right w:type="dxa" w:w="140"/>
-            </w:tcMar>
-            <w:vAlign w:val="center"/>
-          </w:tcPr>
+              <w:t xml:space="preserve">Horizontal Ladle Preheater</w:t>
+            </w:r>
+          </w:p>
           <w:p>
             <w:pPr>
               <w:spacing w:after="40" w:before="40"/>
@@ -14169,1640 +13489,6 @@
               <w:t xml:space="preserve">Vertical Ladle Preheater</w:t>
             </w:r>
           </w:p>
-        </w:tc>
-      </w:tr>
-      <w:tr>
-        <w:tc>
-          <w:tcPr>
-            <w:tcW w:type="dxa" w:w="780"/>
-            <w:tcBorders>
-              <w:top w:val="single" w:color="BFBFBF" w:sz="4"/>
-              <w:left w:val="single" w:color="BFBFBF" w:sz="4"/>
-              <w:bottom w:val="single" w:color="BFBFBF" w:sz="4"/>
-              <w:right w:val="single" w:color="BFBFBF" w:sz="4"/>
-            </w:tcBorders>
-            <w:shd w:fill="F3F4F6" w:val="clear"/>
-            <w:tcMar>
-              <w:top w:type="dxa" w:w="100"/>
-              <w:left w:type="dxa" w:w="140"/>
-              <w:bottom w:type="dxa" w:w="100"/>
-              <w:right w:type="dxa" w:w="140"/>
-            </w:tcMar>
-            <w:vAlign w:val="center"/>
-          </w:tcPr>
-          <w:p>
-            <w:pPr>
-              <w:spacing w:after="40" w:before="40"/>
-              <w:jc w:val="center"/>
-            </w:pPr>
-            <w:r>
-              <w:rPr>
-                <w:rFonts w:ascii="Calibri" w:cs="Calibri" w:eastAsia="Calibri" w:hAnsi="Calibri"/>
-                <w:sz w:val="22"/>
-                <w:szCs w:val="22"/>
-              </w:rPr>
-              <w:t>60</w:t>
-            </w:r>
-          </w:p>
-        </w:tc>
-        <w:tc>
-          <w:tcPr>
-            <w:tcW w:type="dxa" w:w="3580"/>
-            <w:tcBorders>
-              <w:top w:val="single" w:color="BFBFBF" w:sz="4"/>
-              <w:left w:val="single" w:color="BFBFBF" w:sz="4"/>
-              <w:bottom w:val="single" w:color="BFBFBF" w:sz="4"/>
-              <w:right w:val="single" w:color="BFBFBF" w:sz="4"/>
-            </w:tcBorders>
-            <w:shd w:fill="F3F4F6" w:val="clear"/>
-            <w:tcMar>
-              <w:top w:type="dxa" w:w="100"/>
-              <w:left w:type="dxa" w:w="140"/>
-              <w:bottom w:type="dxa" w:w="100"/>
-              <w:right w:type="dxa" w:w="140"/>
-            </w:tcMar>
-            <w:vAlign w:val="center"/>
-          </w:tcPr>
-          <w:p>
-            <w:pPr>
-              <w:spacing w:after="40" w:before="40"/>
-              <w:jc w:val="left"/>
-            </w:pPr>
-            <w:r>
-              <w:rPr>
-                <w:rFonts w:ascii="Calibri" w:cs="Calibri" w:eastAsia="Calibri" w:hAnsi="Calibri"/>
-                <w:b/>
-                <w:bCs/>
-                <w:sz w:val="22"/>
-                <w:szCs w:val="22"/>
-              </w:rPr>
-              <w:t xml:space="preserve">Vardhman Special Steels Ltd.Unit-1</w:t>
-            </w:r>
-          </w:p>
-        </w:tc>
-        <w:tc>
-          <w:tcPr>
-            <w:tcW w:type="dxa" w:w="5000"/>
-            <w:tcBorders>
-              <w:top w:val="single" w:color="BFBFBF" w:sz="4"/>
-              <w:left w:val="single" w:color="BFBFBF" w:sz="4"/>
-              <w:bottom w:val="single" w:color="BFBFBF" w:sz="4"/>
-              <w:right w:val="single" w:color="BFBFBF" w:sz="4"/>
-            </w:tcBorders>
-            <w:shd w:fill="F3F4F6" w:val="clear"/>
-            <w:tcMar>
-              <w:top w:type="dxa" w:w="100"/>
-              <w:left w:type="dxa" w:w="140"/>
-              <w:bottom w:type="dxa" w:w="100"/>
-              <w:right w:type="dxa" w:w="140"/>
-            </w:tcMar>
-            <w:vAlign w:val="center"/>
-          </w:tcPr>
-          <w:p>
-            <w:pPr>
-              <w:spacing w:after="40" w:before="40"/>
-              <w:jc w:val="left"/>
-            </w:pPr>
-            <w:r>
-              <w:rPr>
-                <w:rFonts w:ascii="Calibri" w:cs="Calibri" w:eastAsia="Calibri" w:hAnsi="Calibri"/>
-                <w:sz w:val="22"/>
-                <w:szCs w:val="22"/>
-              </w:rPr>
-              <w:t xml:space="preserve">Tundish Preheater</w:t>
-            </w:r>
-          </w:p>
-        </w:tc>
-      </w:tr>
-      <w:tr>
-        <w:tc>
-          <w:tcPr>
-            <w:tcW w:type="dxa" w:w="780"/>
-            <w:tcBorders>
-              <w:top w:val="single" w:color="BFBFBF" w:sz="4"/>
-              <w:left w:val="single" w:color="BFBFBF" w:sz="4"/>
-              <w:bottom w:val="single" w:color="BFBFBF" w:sz="4"/>
-              <w:right w:val="single" w:color="BFBFBF" w:sz="4"/>
-            </w:tcBorders>
-            <w:shd w:fill="F3F4F6" w:val="clear"/>
-            <w:tcMar>
-              <w:top w:type="dxa" w:w="100"/>
-              <w:left w:type="dxa" w:w="140"/>
-              <w:bottom w:type="dxa" w:w="100"/>
-              <w:right w:type="dxa" w:w="140"/>
-            </w:tcMar>
-            <w:vAlign w:val="center"/>
-          </w:tcPr>
-          <w:p>
-            <w:pPr>
-              <w:spacing w:after="40" w:before="40"/>
-              <w:jc w:val="center"/>
-            </w:pPr>
-            <w:r>
-              <w:rPr>
-                <w:rFonts w:ascii="Calibri" w:cs="Calibri" w:eastAsia="Calibri" w:hAnsi="Calibri"/>
-                <w:sz w:val="22"/>
-                <w:szCs w:val="22"/>
-              </w:rPr>
-              <w:t>61</w:t>
-            </w:r>
-          </w:p>
-        </w:tc>
-        <w:tc>
-          <w:tcPr>
-            <w:tcW w:type="dxa" w:w="3580"/>
-            <w:tcBorders>
-              <w:top w:val="single" w:color="BFBFBF" w:sz="4"/>
-              <w:left w:val="single" w:color="BFBFBF" w:sz="4"/>
-              <w:bottom w:val="single" w:color="BFBFBF" w:sz="4"/>
-              <w:right w:val="single" w:color="BFBFBF" w:sz="4"/>
-            </w:tcBorders>
-            <w:shd w:fill="F3F4F6" w:val="clear"/>
-            <w:tcMar>
-              <w:top w:type="dxa" w:w="100"/>
-              <w:left w:type="dxa" w:w="140"/>
-              <w:bottom w:type="dxa" w:w="100"/>
-              <w:right w:type="dxa" w:w="140"/>
-            </w:tcMar>
-            <w:vAlign w:val="center"/>
-          </w:tcPr>
-          <w:p>
-            <w:pPr>
-              <w:spacing w:after="40" w:before="40"/>
-              <w:jc w:val="left"/>
-            </w:pPr>
-            <w:r>
-              <w:rPr>
-                <w:rFonts w:ascii="Calibri" w:cs="Calibri" w:eastAsia="Calibri" w:hAnsi="Calibri"/>
-                <w:b/>
-                <w:bCs/>
-                <w:sz w:val="22"/>
-                <w:szCs w:val="22"/>
-              </w:rPr>
-              <w:t xml:space="preserve">Bangladesh Re Rolling Mills Ltd.</w:t>
-            </w:r>
-          </w:p>
-        </w:tc>
-        <w:tc>
-          <w:tcPr>
-            <w:tcW w:type="dxa" w:w="5000"/>
-            <w:tcBorders>
-              <w:top w:val="single" w:color="BFBFBF" w:sz="4"/>
-              <w:left w:val="single" w:color="BFBFBF" w:sz="4"/>
-              <w:bottom w:val="single" w:color="BFBFBF" w:sz="4"/>
-              <w:right w:val="single" w:color="BFBFBF" w:sz="4"/>
-            </w:tcBorders>
-            <w:shd w:fill="F3F4F6" w:val="clear"/>
-            <w:tcMar>
-              <w:top w:type="dxa" w:w="100"/>
-              <w:left w:type="dxa" w:w="140"/>
-              <w:bottom w:type="dxa" w:w="100"/>
-              <w:right w:type="dxa" w:w="140"/>
-            </w:tcMar>
-            <w:vAlign w:val="center"/>
-          </w:tcPr>
-          <w:p>
-            <w:pPr>
-              <w:spacing w:after="40" w:before="40"/>
-              <w:jc w:val="left"/>
-            </w:pPr>
-            <w:r>
-              <w:rPr>
-                <w:rFonts w:ascii="Calibri" w:cs="Calibri" w:eastAsia="Calibri" w:hAnsi="Calibri"/>
-                <w:sz w:val="22"/>
-                <w:szCs w:val="22"/>
-              </w:rPr>
-              <w:t xml:space="preserve">Tundish Preheater</w:t>
-            </w:r>
-          </w:p>
-        </w:tc>
-      </w:tr>
-      <w:tr>
-        <w:tc>
-          <w:tcPr>
-            <w:tcW w:type="dxa" w:w="780"/>
-            <w:tcBorders>
-              <w:top w:val="single" w:color="BFBFBF" w:sz="4"/>
-              <w:left w:val="single" w:color="BFBFBF" w:sz="4"/>
-              <w:bottom w:val="single" w:color="BFBFBF" w:sz="4"/>
-              <w:right w:val="single" w:color="BFBFBF" w:sz="4"/>
-            </w:tcBorders>
-            <w:shd w:fill="F3F4F6" w:val="clear"/>
-            <w:tcMar>
-              <w:top w:type="dxa" w:w="100"/>
-              <w:left w:type="dxa" w:w="140"/>
-              <w:bottom w:type="dxa" w:w="100"/>
-              <w:right w:type="dxa" w:w="140"/>
-            </w:tcMar>
-            <w:vAlign w:val="center"/>
-          </w:tcPr>
-          <w:p>
-            <w:pPr>
-              <w:spacing w:after="40" w:before="40"/>
-              <w:jc w:val="center"/>
-            </w:pPr>
-            <w:r>
-              <w:rPr>
-                <w:rFonts w:ascii="Calibri" w:cs="Calibri" w:eastAsia="Calibri" w:hAnsi="Calibri"/>
-                <w:sz w:val="22"/>
-                <w:szCs w:val="22"/>
-              </w:rPr>
-              <w:t>62</w:t>
-            </w:r>
-          </w:p>
-        </w:tc>
-        <w:tc>
-          <w:tcPr>
-            <w:tcW w:type="dxa" w:w="3580"/>
-            <w:tcBorders>
-              <w:top w:val="single" w:color="BFBFBF" w:sz="4"/>
-              <w:left w:val="single" w:color="BFBFBF" w:sz="4"/>
-              <w:bottom w:val="single" w:color="BFBFBF" w:sz="4"/>
-              <w:right w:val="single" w:color="BFBFBF" w:sz="4"/>
-            </w:tcBorders>
-            <w:shd w:fill="F3F4F6" w:val="clear"/>
-            <w:tcMar>
-              <w:top w:type="dxa" w:w="100"/>
-              <w:left w:type="dxa" w:w="140"/>
-              <w:bottom w:type="dxa" w:w="100"/>
-              <w:right w:type="dxa" w:w="140"/>
-            </w:tcMar>
-            <w:vAlign w:val="center"/>
-          </w:tcPr>
-          <w:p>
-            <w:pPr>
-              <w:spacing w:after="40" w:before="40"/>
-              <w:jc w:val="left"/>
-            </w:pPr>
-            <w:r>
-              <w:rPr>
-                <w:rFonts w:ascii="Calibri" w:cs="Calibri" w:eastAsia="Calibri" w:hAnsi="Calibri"/>
-                <w:b/>
-                <w:bCs/>
-                <w:sz w:val="22"/>
-                <w:szCs w:val="22"/>
-              </w:rPr>
-              <w:t xml:space="preserve">Amic Forging Ltd.</w:t>
-            </w:r>
-          </w:p>
-        </w:tc>
-        <w:tc>
-          <w:tcPr>
-            <w:tcW w:type="dxa" w:w="5000"/>
-            <w:tcBorders>
-              <w:top w:val="single" w:color="BFBFBF" w:sz="4"/>
-              <w:left w:val="single" w:color="BFBFBF" w:sz="4"/>
-              <w:bottom w:val="single" w:color="BFBFBF" w:sz="4"/>
-              <w:right w:val="single" w:color="BFBFBF" w:sz="4"/>
-            </w:tcBorders>
-            <w:shd w:fill="F3F4F6" w:val="clear"/>
-            <w:tcMar>
-              <w:top w:type="dxa" w:w="100"/>
-              <w:left w:type="dxa" w:w="140"/>
-              <w:bottom w:type="dxa" w:w="100"/>
-              <w:right w:type="dxa" w:w="140"/>
-            </w:tcMar>
-            <w:vAlign w:val="center"/>
-          </w:tcPr>
-          <w:p>
-            <w:pPr>
-              <w:spacing w:after="40" w:before="40"/>
-              <w:jc w:val="left"/>
-            </w:pPr>
-            <w:r>
-              <w:rPr>
-                <w:rFonts w:ascii="Calibri" w:cs="Calibri" w:eastAsia="Calibri" w:hAnsi="Calibri"/>
-                <w:sz w:val="22"/>
-                <w:szCs w:val="22"/>
-              </w:rPr>
-              <w:t xml:space="preserve">Vertical Ladle Preheater - 10 MT</w:t>
-            </w:r>
-          </w:p>
-        </w:tc>
-      </w:tr>
-      <w:tr>
-        <w:tc>
-          <w:tcPr>
-            <w:tcW w:type="dxa" w:w="780"/>
-            <w:tcBorders>
-              <w:top w:val="single" w:color="BFBFBF" w:sz="4"/>
-              <w:left w:val="single" w:color="BFBFBF" w:sz="4"/>
-              <w:bottom w:val="single" w:color="BFBFBF" w:sz="4"/>
-              <w:right w:val="single" w:color="BFBFBF" w:sz="4"/>
-            </w:tcBorders>
-            <w:shd w:fill="F3F4F6" w:val="clear"/>
-            <w:tcMar>
-              <w:top w:type="dxa" w:w="100"/>
-              <w:left w:type="dxa" w:w="140"/>
-              <w:bottom w:type="dxa" w:w="100"/>
-              <w:right w:type="dxa" w:w="140"/>
-            </w:tcMar>
-            <w:vAlign w:val="center"/>
-          </w:tcPr>
-          <w:p>
-            <w:pPr>
-              <w:spacing w:after="40" w:before="40"/>
-              <w:jc w:val="center"/>
-            </w:pPr>
-            <w:r>
-              <w:rPr>
-                <w:rFonts w:ascii="Calibri" w:cs="Calibri" w:eastAsia="Calibri" w:hAnsi="Calibri"/>
-                <w:sz w:val="22"/>
-                <w:szCs w:val="22"/>
-              </w:rPr>
-              <w:t>63</w:t>
-            </w:r>
-          </w:p>
-        </w:tc>
-        <w:tc>
-          <w:tcPr>
-            <w:tcW w:type="dxa" w:w="3580"/>
-            <w:tcBorders>
-              <w:top w:val="single" w:color="BFBFBF" w:sz="4"/>
-              <w:left w:val="single" w:color="BFBFBF" w:sz="4"/>
-              <w:bottom w:val="single" w:color="BFBFBF" w:sz="4"/>
-              <w:right w:val="single" w:color="BFBFBF" w:sz="4"/>
-            </w:tcBorders>
-            <w:shd w:fill="F3F4F6" w:val="clear"/>
-            <w:tcMar>
-              <w:top w:type="dxa" w:w="100"/>
-              <w:left w:type="dxa" w:w="140"/>
-              <w:bottom w:type="dxa" w:w="100"/>
-              <w:right w:type="dxa" w:w="140"/>
-            </w:tcMar>
-            <w:vAlign w:val="center"/>
-          </w:tcPr>
-          <w:p>
-            <w:pPr>
-              <w:spacing w:after="40" w:before="40"/>
-              <w:jc w:val="left"/>
-            </w:pPr>
-            <w:r>
-              <w:rPr>
-                <w:rFonts w:ascii="Calibri" w:cs="Calibri" w:eastAsia="Calibri" w:hAnsi="Calibri"/>
-                <w:b/>
-                <w:bCs/>
-                <w:sz w:val="22"/>
-                <w:szCs w:val="22"/>
-              </w:rPr>
-              <w:t xml:space="preserve">Lloyds Engineering Works Limited</w:t>
-            </w:r>
-          </w:p>
-        </w:tc>
-        <w:tc>
-          <w:tcPr>
-            <w:tcW w:type="dxa" w:w="5000"/>
-            <w:tcBorders>
-              <w:top w:val="single" w:color="BFBFBF" w:sz="4"/>
-              <w:left w:val="single" w:color="BFBFBF" w:sz="4"/>
-              <w:bottom w:val="single" w:color="BFBFBF" w:sz="4"/>
-              <w:right w:val="single" w:color="BFBFBF" w:sz="4"/>
-            </w:tcBorders>
-            <w:shd w:fill="F3F4F6" w:val="clear"/>
-            <w:tcMar>
-              <w:top w:type="dxa" w:w="100"/>
-              <w:left w:type="dxa" w:w="140"/>
-              <w:bottom w:type="dxa" w:w="100"/>
-              <w:right w:type="dxa" w:w="140"/>
-            </w:tcMar>
-            <w:vAlign w:val="center"/>
-          </w:tcPr>
-          <w:p>
-            <w:pPr>
-              <w:spacing w:after="40" w:before="40"/>
-              <w:jc w:val="left"/>
-            </w:pPr>
-            <w:r>
-              <w:rPr>
-                <w:rFonts w:ascii="Calibri" w:cs="Calibri" w:eastAsia="Calibri" w:hAnsi="Calibri"/>
-                <w:sz w:val="22"/>
-                <w:szCs w:val="22"/>
-              </w:rPr>
-              <w:t xml:space="preserve">Vertical Ladle Preheater - 50 MT</w:t>
-            </w:r>
-          </w:p>
-        </w:tc>
-      </w:tr>
-      <w:tr>
-        <w:tc>
-          <w:tcPr>
-            <w:tcW w:type="dxa" w:w="780"/>
-            <w:tcBorders>
-              <w:top w:val="single" w:color="BFBFBF" w:sz="4"/>
-              <w:left w:val="single" w:color="BFBFBF" w:sz="4"/>
-              <w:bottom w:val="single" w:color="BFBFBF" w:sz="4"/>
-              <w:right w:val="single" w:color="BFBFBF" w:sz="4"/>
-            </w:tcBorders>
-            <w:shd w:fill="F3F4F6" w:val="clear"/>
-            <w:tcMar>
-              <w:top w:type="dxa" w:w="100"/>
-              <w:left w:type="dxa" w:w="140"/>
-              <w:bottom w:type="dxa" w:w="100"/>
-              <w:right w:type="dxa" w:w="140"/>
-            </w:tcMar>
-            <w:vAlign w:val="center"/>
-          </w:tcPr>
-          <w:p>
-            <w:pPr>
-              <w:spacing w:after="40" w:before="40"/>
-              <w:jc w:val="center"/>
-            </w:pPr>
-            <w:r>
-              <w:rPr>
-                <w:rFonts w:ascii="Calibri" w:cs="Calibri" w:eastAsia="Calibri" w:hAnsi="Calibri"/>
-                <w:sz w:val="22"/>
-                <w:szCs w:val="22"/>
-              </w:rPr>
-              <w:t>64</w:t>
-            </w:r>
-          </w:p>
-        </w:tc>
-        <w:tc>
-          <w:tcPr>
-            <w:tcW w:type="dxa" w:w="3580"/>
-            <w:tcBorders>
-              <w:top w:val="single" w:color="BFBFBF" w:sz="4"/>
-              <w:left w:val="single" w:color="BFBFBF" w:sz="4"/>
-              <w:bottom w:val="single" w:color="BFBFBF" w:sz="4"/>
-              <w:right w:val="single" w:color="BFBFBF" w:sz="4"/>
-            </w:tcBorders>
-            <w:shd w:fill="F3F4F6" w:val="clear"/>
-            <w:tcMar>
-              <w:top w:type="dxa" w:w="100"/>
-              <w:left w:type="dxa" w:w="140"/>
-              <w:bottom w:type="dxa" w:w="100"/>
-              <w:right w:type="dxa" w:w="140"/>
-            </w:tcMar>
-            <w:vAlign w:val="center"/>
-          </w:tcPr>
-          <w:p>
-            <w:pPr>
-              <w:spacing w:after="40" w:before="40"/>
-              <w:jc w:val="left"/>
-            </w:pPr>
-            <w:r>
-              <w:rPr>
-                <w:rFonts w:ascii="Calibri" w:cs="Calibri" w:eastAsia="Calibri" w:hAnsi="Calibri"/>
-                <w:b/>
-                <w:bCs/>
-                <w:sz w:val="22"/>
-                <w:szCs w:val="22"/>
-              </w:rPr>
-              <w:t xml:space="preserve">Lloyds Engineering Works Limited</w:t>
-            </w:r>
-          </w:p>
-        </w:tc>
-        <w:tc>
-          <w:tcPr>
-            <w:tcW w:type="dxa" w:w="5000"/>
-            <w:tcBorders>
-              <w:top w:val="single" w:color="BFBFBF" w:sz="4"/>
-              <w:left w:val="single" w:color="BFBFBF" w:sz="4"/>
-              <w:bottom w:val="single" w:color="BFBFBF" w:sz="4"/>
-              <w:right w:val="single" w:color="BFBFBF" w:sz="4"/>
-            </w:tcBorders>
-            <w:shd w:fill="F3F4F6" w:val="clear"/>
-            <w:tcMar>
-              <w:top w:type="dxa" w:w="100"/>
-              <w:left w:type="dxa" w:w="140"/>
-              <w:bottom w:type="dxa" w:w="100"/>
-              <w:right w:type="dxa" w:w="140"/>
-            </w:tcMar>
-            <w:vAlign w:val="center"/>
-          </w:tcPr>
-          <w:p>
-            <w:pPr>
-              <w:spacing w:after="40" w:before="40"/>
-              <w:jc w:val="left"/>
-            </w:pPr>
-            <w:r>
-              <w:rPr>
-                <w:rFonts w:ascii="Calibri" w:cs="Calibri" w:eastAsia="Calibri" w:hAnsi="Calibri"/>
-                <w:sz w:val="22"/>
-                <w:szCs w:val="22"/>
-              </w:rPr>
-              <w:t xml:space="preserve">Vertical Ladle Preheater - 40 MT</w:t>
-            </w:r>
-          </w:p>
-        </w:tc>
-      </w:tr>
-      <w:tr>
-        <w:tc>
-          <w:tcPr>
-            <w:tcW w:type="dxa" w:w="780"/>
-            <w:tcBorders>
-              <w:top w:val="single" w:color="BFBFBF" w:sz="4"/>
-              <w:left w:val="single" w:color="BFBFBF" w:sz="4"/>
-              <w:bottom w:val="single" w:color="BFBFBF" w:sz="4"/>
-              <w:right w:val="single" w:color="BFBFBF" w:sz="4"/>
-            </w:tcBorders>
-            <w:shd w:fill="F3F4F6" w:val="clear"/>
-            <w:tcMar>
-              <w:top w:type="dxa" w:w="100"/>
-              <w:left w:type="dxa" w:w="140"/>
-              <w:bottom w:type="dxa" w:w="100"/>
-              <w:right w:type="dxa" w:w="140"/>
-            </w:tcMar>
-            <w:vAlign w:val="center"/>
-          </w:tcPr>
-          <w:p>
-            <w:pPr>
-              <w:spacing w:after="40" w:before="40"/>
-              <w:jc w:val="center"/>
-            </w:pPr>
-            <w:r>
-              <w:rPr>
-                <w:rFonts w:ascii="Calibri" w:cs="Calibri" w:eastAsia="Calibri" w:hAnsi="Calibri"/>
-                <w:sz w:val="22"/>
-                <w:szCs w:val="22"/>
-              </w:rPr>
-              <w:t>65</w:t>
-            </w:r>
-          </w:p>
-        </w:tc>
-        <w:tc>
-          <w:tcPr>
-            <w:tcW w:type="dxa" w:w="3580"/>
-            <w:tcBorders>
-              <w:top w:val="single" w:color="BFBFBF" w:sz="4"/>
-              <w:left w:val="single" w:color="BFBFBF" w:sz="4"/>
-              <w:bottom w:val="single" w:color="BFBFBF" w:sz="4"/>
-              <w:right w:val="single" w:color="BFBFBF" w:sz="4"/>
-            </w:tcBorders>
-            <w:shd w:fill="F3F4F6" w:val="clear"/>
-            <w:tcMar>
-              <w:top w:type="dxa" w:w="100"/>
-              <w:left w:type="dxa" w:w="140"/>
-              <w:bottom w:type="dxa" w:w="100"/>
-              <w:right w:type="dxa" w:w="140"/>
-            </w:tcMar>
-            <w:vAlign w:val="center"/>
-          </w:tcPr>
-          <w:p>
-            <w:pPr>
-              <w:spacing w:after="40" w:before="40"/>
-              <w:jc w:val="left"/>
-            </w:pPr>
-            <w:r>
-              <w:rPr>
-                <w:rFonts w:ascii="Calibri" w:cs="Calibri" w:eastAsia="Calibri" w:hAnsi="Calibri"/>
-                <w:b/>
-                <w:bCs/>
-                <w:sz w:val="22"/>
-                <w:szCs w:val="22"/>
-              </w:rPr>
-              <w:t xml:space="preserve">Muhaj Baghdad Co. Ltd.</w:t>
-            </w:r>
-          </w:p>
-        </w:tc>
-        <w:tc>
-          <w:tcPr>
-            <w:tcW w:type="dxa" w:w="5000"/>
-            <w:tcBorders>
-              <w:top w:val="single" w:color="BFBFBF" w:sz="4"/>
-              <w:left w:val="single" w:color="BFBFBF" w:sz="4"/>
-              <w:bottom w:val="single" w:color="BFBFBF" w:sz="4"/>
-              <w:right w:val="single" w:color="BFBFBF" w:sz="4"/>
-            </w:tcBorders>
-            <w:shd w:fill="F3F4F6" w:val="clear"/>
-            <w:tcMar>
-              <w:top w:type="dxa" w:w="100"/>
-              <w:left w:type="dxa" w:w="140"/>
-              <w:bottom w:type="dxa" w:w="100"/>
-              <w:right w:type="dxa" w:w="140"/>
-            </w:tcMar>
-            <w:vAlign w:val="center"/>
-          </w:tcPr>
-          <w:p>
-            <w:pPr>
-              <w:spacing w:after="40" w:before="40"/>
-              <w:jc w:val="left"/>
-            </w:pPr>
-            <w:r>
-              <w:rPr>
-                <w:rFonts w:ascii="Calibri" w:cs="Calibri" w:eastAsia="Calibri" w:hAnsi="Calibri"/>
-                <w:sz w:val="22"/>
-                <w:szCs w:val="22"/>
-              </w:rPr>
-              <w:t xml:space="preserve">Tundish Preheater</w:t>
-            </w:r>
-          </w:p>
-        </w:tc>
-      </w:tr>
-      <w:tr>
-        <w:tc>
-          <w:tcPr>
-            <w:tcW w:type="dxa" w:w="780"/>
-            <w:tcBorders>
-              <w:top w:val="single" w:color="BFBFBF" w:sz="4"/>
-              <w:left w:val="single" w:color="BFBFBF" w:sz="4"/>
-              <w:bottom w:val="single" w:color="BFBFBF" w:sz="4"/>
-              <w:right w:val="single" w:color="BFBFBF" w:sz="4"/>
-            </w:tcBorders>
-            <w:shd w:fill="F3F4F6" w:val="clear"/>
-            <w:tcMar>
-              <w:top w:type="dxa" w:w="100"/>
-              <w:left w:type="dxa" w:w="140"/>
-              <w:bottom w:type="dxa" w:w="100"/>
-              <w:right w:type="dxa" w:w="140"/>
-            </w:tcMar>
-            <w:vAlign w:val="center"/>
-          </w:tcPr>
-          <w:p>
-            <w:pPr>
-              <w:spacing w:after="40" w:before="40"/>
-              <w:jc w:val="center"/>
-            </w:pPr>
-            <w:r>
-              <w:rPr>
-                <w:rFonts w:ascii="Calibri" w:cs="Calibri" w:eastAsia="Calibri" w:hAnsi="Calibri"/>
-                <w:sz w:val="22"/>
-                <w:szCs w:val="22"/>
-              </w:rPr>
-              <w:t>66</w:t>
-            </w:r>
-          </w:p>
-        </w:tc>
-        <w:tc>
-          <w:tcPr>
-            <w:tcW w:type="dxa" w:w="3580"/>
-            <w:tcBorders>
-              <w:top w:val="single" w:color="BFBFBF" w:sz="4"/>
-              <w:left w:val="single" w:color="BFBFBF" w:sz="4"/>
-              <w:bottom w:val="single" w:color="BFBFBF" w:sz="4"/>
-              <w:right w:val="single" w:color="BFBFBF" w:sz="4"/>
-            </w:tcBorders>
-            <w:shd w:fill="F3F4F6" w:val="clear"/>
-            <w:tcMar>
-              <w:top w:type="dxa" w:w="100"/>
-              <w:left w:type="dxa" w:w="140"/>
-              <w:bottom w:type="dxa" w:w="100"/>
-              <w:right w:type="dxa" w:w="140"/>
-            </w:tcMar>
-            <w:vAlign w:val="center"/>
-          </w:tcPr>
-          <w:p>
-            <w:pPr>
-              <w:spacing w:after="40" w:before="40"/>
-              <w:jc w:val="left"/>
-            </w:pPr>
-            <w:r>
-              <w:rPr>
-                <w:rFonts w:ascii="Calibri" w:cs="Calibri" w:eastAsia="Calibri" w:hAnsi="Calibri"/>
-                <w:b/>
-                <w:bCs/>
-                <w:sz w:val="22"/>
-                <w:szCs w:val="22"/>
-              </w:rPr>
-              <w:t xml:space="preserve">Topworth Steels &amp; Power Pvt. Ltd.</w:t>
-            </w:r>
-          </w:p>
-        </w:tc>
-        <w:tc>
-          <w:tcPr>
-            <w:tcW w:type="dxa" w:w="5000"/>
-            <w:tcBorders>
-              <w:top w:val="single" w:color="BFBFBF" w:sz="4"/>
-              <w:left w:val="single" w:color="BFBFBF" w:sz="4"/>
-              <w:bottom w:val="single" w:color="BFBFBF" w:sz="4"/>
-              <w:right w:val="single" w:color="BFBFBF" w:sz="4"/>
-            </w:tcBorders>
-            <w:shd w:fill="F3F4F6" w:val="clear"/>
-            <w:tcMar>
-              <w:top w:type="dxa" w:w="100"/>
-              <w:left w:type="dxa" w:w="140"/>
-              <w:bottom w:type="dxa" w:w="100"/>
-              <w:right w:type="dxa" w:w="140"/>
-            </w:tcMar>
-            <w:vAlign w:val="center"/>
-          </w:tcPr>
-          <w:p>
-            <w:pPr>
-              <w:spacing w:after="40" w:before="40"/>
-              <w:jc w:val="left"/>
-            </w:pPr>
-            <w:r>
-              <w:rPr>
-                <w:rFonts w:ascii="Calibri" w:cs="Calibri" w:eastAsia="Calibri" w:hAnsi="Calibri"/>
-                <w:sz w:val="22"/>
-                <w:szCs w:val="22"/>
-              </w:rPr>
-              <w:t xml:space="preserve">Vertical Ladle Preheater</w:t>
-            </w:r>
-          </w:p>
-        </w:tc>
-      </w:tr>
-      <w:tr>
-        <w:tc>
-          <w:tcPr>
-            <w:tcW w:type="dxa" w:w="780"/>
-            <w:tcBorders>
-              <w:top w:val="single" w:color="BFBFBF" w:sz="4"/>
-              <w:left w:val="single" w:color="BFBFBF" w:sz="4"/>
-              <w:bottom w:val="single" w:color="BFBFBF" w:sz="4"/>
-              <w:right w:val="single" w:color="BFBFBF" w:sz="4"/>
-            </w:tcBorders>
-            <w:shd w:fill="F3F4F6" w:val="clear"/>
-            <w:tcMar>
-              <w:top w:type="dxa" w:w="100"/>
-              <w:left w:type="dxa" w:w="140"/>
-              <w:bottom w:type="dxa" w:w="100"/>
-              <w:right w:type="dxa" w:w="140"/>
-            </w:tcMar>
-            <w:vAlign w:val="center"/>
-          </w:tcPr>
-          <w:p>
-            <w:pPr>
-              <w:spacing w:after="40" w:before="40"/>
-              <w:jc w:val="center"/>
-            </w:pPr>
-            <w:r>
-              <w:rPr>
-                <w:rFonts w:ascii="Calibri" w:cs="Calibri" w:eastAsia="Calibri" w:hAnsi="Calibri"/>
-                <w:sz w:val="22"/>
-                <w:szCs w:val="22"/>
-              </w:rPr>
-              <w:t>67</w:t>
-            </w:r>
-          </w:p>
-        </w:tc>
-        <w:tc>
-          <w:tcPr>
-            <w:tcW w:type="dxa" w:w="3580"/>
-            <w:tcBorders>
-              <w:top w:val="single" w:color="BFBFBF" w:sz="4"/>
-              <w:left w:val="single" w:color="BFBFBF" w:sz="4"/>
-              <w:bottom w:val="single" w:color="BFBFBF" w:sz="4"/>
-              <w:right w:val="single" w:color="BFBFBF" w:sz="4"/>
-            </w:tcBorders>
-            <w:shd w:fill="F3F4F6" w:val="clear"/>
-            <w:tcMar>
-              <w:top w:type="dxa" w:w="100"/>
-              <w:left w:type="dxa" w:w="140"/>
-              <w:bottom w:type="dxa" w:w="100"/>
-              <w:right w:type="dxa" w:w="140"/>
-            </w:tcMar>
-            <w:vAlign w:val="center"/>
-          </w:tcPr>
-          <w:p>
-            <w:pPr>
-              <w:spacing w:after="40" w:before="40"/>
-              <w:jc w:val="left"/>
-            </w:pPr>
-            <w:r>
-              <w:rPr>
-                <w:rFonts w:ascii="Calibri" w:cs="Calibri" w:eastAsia="Calibri" w:hAnsi="Calibri"/>
-                <w:b/>
-                <w:bCs/>
-                <w:sz w:val="22"/>
-                <w:szCs w:val="22"/>
-              </w:rPr>
-              <w:t xml:space="preserve">JSW Steel Limited</w:t>
-            </w:r>
-          </w:p>
-        </w:tc>
-        <w:tc>
-          <w:tcPr>
-            <w:tcW w:type="dxa" w:w="5000"/>
-            <w:tcBorders>
-              <w:top w:val="single" w:color="BFBFBF" w:sz="4"/>
-              <w:left w:val="single" w:color="BFBFBF" w:sz="4"/>
-              <w:bottom w:val="single" w:color="BFBFBF" w:sz="4"/>
-              <w:right w:val="single" w:color="BFBFBF" w:sz="4"/>
-            </w:tcBorders>
-            <w:shd w:fill="F3F4F6" w:val="clear"/>
-            <w:tcMar>
-              <w:top w:type="dxa" w:w="100"/>
-              <w:left w:type="dxa" w:w="140"/>
-              <w:bottom w:type="dxa" w:w="100"/>
-              <w:right w:type="dxa" w:w="140"/>
-            </w:tcMar>
-            <w:vAlign w:val="center"/>
-          </w:tcPr>
-          <w:p>
-            <w:pPr>
-              <w:spacing w:after="40" w:before="40"/>
-              <w:jc w:val="left"/>
-            </w:pPr>
-            <w:r>
-              <w:rPr>
-                <w:rFonts w:ascii="Calibri" w:cs="Calibri" w:eastAsia="Calibri" w:hAnsi="Calibri"/>
-                <w:sz w:val="22"/>
-                <w:szCs w:val="22"/>
-              </w:rPr>
-              <w:t xml:space="preserve">Vertical Ladle Preheater</w:t>
-            </w:r>
-          </w:p>
-        </w:tc>
-      </w:tr>
-      <w:tr>
-        <w:tc>
-          <w:tcPr>
-            <w:tcW w:type="dxa" w:w="780"/>
-            <w:tcBorders>
-              <w:top w:val="single" w:color="BFBFBF" w:sz="4"/>
-              <w:left w:val="single" w:color="BFBFBF" w:sz="4"/>
-              <w:bottom w:val="single" w:color="BFBFBF" w:sz="4"/>
-              <w:right w:val="single" w:color="BFBFBF" w:sz="4"/>
-            </w:tcBorders>
-            <w:shd w:fill="F3F4F6" w:val="clear"/>
-            <w:tcMar>
-              <w:top w:type="dxa" w:w="100"/>
-              <w:left w:type="dxa" w:w="140"/>
-              <w:bottom w:type="dxa" w:w="100"/>
-              <w:right w:type="dxa" w:w="140"/>
-            </w:tcMar>
-            <w:vAlign w:val="center"/>
-          </w:tcPr>
-          <w:p>
-            <w:pPr>
-              <w:spacing w:after="40" w:before="40"/>
-              <w:jc w:val="center"/>
-            </w:pPr>
-            <w:r>
-              <w:rPr>
-                <w:rFonts w:ascii="Calibri" w:cs="Calibri" w:eastAsia="Calibri" w:hAnsi="Calibri"/>
-                <w:sz w:val="22"/>
-                <w:szCs w:val="22"/>
-              </w:rPr>
-              <w:t>68</w:t>
-            </w:r>
-          </w:p>
-        </w:tc>
-        <w:tc>
-          <w:tcPr>
-            <w:tcW w:type="dxa" w:w="3580"/>
-            <w:tcBorders>
-              <w:top w:val="single" w:color="BFBFBF" w:sz="4"/>
-              <w:left w:val="single" w:color="BFBFBF" w:sz="4"/>
-              <w:bottom w:val="single" w:color="BFBFBF" w:sz="4"/>
-              <w:right w:val="single" w:color="BFBFBF" w:sz="4"/>
-            </w:tcBorders>
-            <w:shd w:fill="F3F4F6" w:val="clear"/>
-            <w:tcMar>
-              <w:top w:type="dxa" w:w="100"/>
-              <w:left w:type="dxa" w:w="140"/>
-              <w:bottom w:type="dxa" w:w="100"/>
-              <w:right w:type="dxa" w:w="140"/>
-            </w:tcMar>
-            <w:vAlign w:val="center"/>
-          </w:tcPr>
-          <w:p>
-            <w:pPr>
-              <w:spacing w:after="40" w:before="40"/>
-              <w:jc w:val="left"/>
-            </w:pPr>
-            <w:r>
-              <w:rPr>
-                <w:rFonts w:ascii="Calibri" w:cs="Calibri" w:eastAsia="Calibri" w:hAnsi="Calibri"/>
-                <w:b/>
-                <w:bCs/>
-                <w:sz w:val="22"/>
-                <w:szCs w:val="22"/>
-              </w:rPr>
-              <w:t xml:space="preserve">Sohar Steel LLC</w:t>
-            </w:r>
-          </w:p>
-        </w:tc>
-        <w:tc>
-          <w:tcPr>
-            <w:tcW w:type="dxa" w:w="5000"/>
-            <w:tcBorders>
-              <w:top w:val="single" w:color="BFBFBF" w:sz="4"/>
-              <w:left w:val="single" w:color="BFBFBF" w:sz="4"/>
-              <w:bottom w:val="single" w:color="BFBFBF" w:sz="4"/>
-              <w:right w:val="single" w:color="BFBFBF" w:sz="4"/>
-            </w:tcBorders>
-            <w:shd w:fill="F3F4F6" w:val="clear"/>
-            <w:tcMar>
-              <w:top w:type="dxa" w:w="100"/>
-              <w:left w:type="dxa" w:w="140"/>
-              <w:bottom w:type="dxa" w:w="100"/>
-              <w:right w:type="dxa" w:w="140"/>
-            </w:tcMar>
-            <w:vAlign w:val="center"/>
-          </w:tcPr>
-          <w:p>
-            <w:pPr>
-              <w:spacing w:after="40" w:before="40"/>
-              <w:jc w:val="left"/>
-            </w:pPr>
-            <w:r>
-              <w:rPr>
-                <w:rFonts w:ascii="Calibri" w:cs="Calibri" w:eastAsia="Calibri" w:hAnsi="Calibri"/>
-                <w:sz w:val="22"/>
-                <w:szCs w:val="22"/>
-              </w:rPr>
-              <w:t xml:space="preserve">Vertical Ladle Preheater</w:t>
-            </w:r>
-          </w:p>
-        </w:tc>
-      </w:tr>
-      <w:tr>
-        <w:tc>
-          <w:tcPr>
-            <w:tcW w:type="dxa" w:w="780"/>
-            <w:tcBorders>
-              <w:top w:val="single" w:color="BFBFBF" w:sz="4"/>
-              <w:left w:val="single" w:color="BFBFBF" w:sz="4"/>
-              <w:bottom w:val="single" w:color="BFBFBF" w:sz="4"/>
-              <w:right w:val="single" w:color="BFBFBF" w:sz="4"/>
-            </w:tcBorders>
-            <w:shd w:fill="F3F4F6" w:val="clear"/>
-            <w:tcMar>
-              <w:top w:type="dxa" w:w="100"/>
-              <w:left w:type="dxa" w:w="140"/>
-              <w:bottom w:type="dxa" w:w="100"/>
-              <w:right w:type="dxa" w:w="140"/>
-            </w:tcMar>
-            <w:vAlign w:val="center"/>
-          </w:tcPr>
-          <w:p>
-            <w:pPr>
-              <w:spacing w:after="40" w:before="40"/>
-              <w:jc w:val="center"/>
-            </w:pPr>
-            <w:r>
-              <w:rPr>
-                <w:rFonts w:ascii="Calibri" w:cs="Calibri" w:eastAsia="Calibri" w:hAnsi="Calibri"/>
-                <w:sz w:val="22"/>
-                <w:szCs w:val="22"/>
-              </w:rPr>
-              <w:t>69</w:t>
-            </w:r>
-          </w:p>
-        </w:tc>
-        <w:tc>
-          <w:tcPr>
-            <w:tcW w:type="dxa" w:w="3580"/>
-            <w:tcBorders>
-              <w:top w:val="single" w:color="BFBFBF" w:sz="4"/>
-              <w:left w:val="single" w:color="BFBFBF" w:sz="4"/>
-              <w:bottom w:val="single" w:color="BFBFBF" w:sz="4"/>
-              <w:right w:val="single" w:color="BFBFBF" w:sz="4"/>
-            </w:tcBorders>
-            <w:shd w:fill="F3F4F6" w:val="clear"/>
-            <w:tcMar>
-              <w:top w:type="dxa" w:w="100"/>
-              <w:left w:type="dxa" w:w="140"/>
-              <w:bottom w:type="dxa" w:w="100"/>
-              <w:right w:type="dxa" w:w="140"/>
-            </w:tcMar>
-            <w:vAlign w:val="center"/>
-          </w:tcPr>
-          <w:p>
-            <w:pPr>
-              <w:spacing w:after="40" w:before="40"/>
-              <w:jc w:val="left"/>
-            </w:pPr>
-            <w:r>
-              <w:rPr>
-                <w:rFonts w:ascii="Calibri" w:cs="Calibri" w:eastAsia="Calibri" w:hAnsi="Calibri"/>
-                <w:b/>
-                <w:bCs/>
-                <w:sz w:val="22"/>
-                <w:szCs w:val="22"/>
-              </w:rPr>
-              <w:t xml:space="preserve">Sohar Steel LLC</w:t>
-            </w:r>
-          </w:p>
-        </w:tc>
-        <w:tc>
-          <w:tcPr>
-            <w:tcW w:type="dxa" w:w="5000"/>
-            <w:tcBorders>
-              <w:top w:val="single" w:color="BFBFBF" w:sz="4"/>
-              <w:left w:val="single" w:color="BFBFBF" w:sz="4"/>
-              <w:bottom w:val="single" w:color="BFBFBF" w:sz="4"/>
-              <w:right w:val="single" w:color="BFBFBF" w:sz="4"/>
-            </w:tcBorders>
-            <w:shd w:fill="F3F4F6" w:val="clear"/>
-            <w:tcMar>
-              <w:top w:type="dxa" w:w="100"/>
-              <w:left w:type="dxa" w:w="140"/>
-              <w:bottom w:type="dxa" w:w="100"/>
-              <w:right w:type="dxa" w:w="140"/>
-            </w:tcMar>
-            <w:vAlign w:val="center"/>
-          </w:tcPr>
-          <w:p>
-            <w:pPr>
-              <w:spacing w:after="40" w:before="40"/>
-              <w:jc w:val="left"/>
-            </w:pPr>
-            <w:r>
-              <w:rPr>
-                <w:rFonts w:ascii="Calibri" w:cs="Calibri" w:eastAsia="Calibri" w:hAnsi="Calibri"/>
-                <w:sz w:val="22"/>
-                <w:szCs w:val="22"/>
-              </w:rPr>
-              <w:t xml:space="preserve">Horizontal Ladle Preheater</w:t>
-            </w:r>
-          </w:p>
-        </w:tc>
-      </w:tr>
-      <w:tr>
-        <w:tc>
-          <w:tcPr>
-            <w:tcW w:type="dxa" w:w="780"/>
-            <w:tcBorders>
-              <w:top w:val="single" w:color="BFBFBF" w:sz="4"/>
-              <w:left w:val="single" w:color="BFBFBF" w:sz="4"/>
-              <w:bottom w:val="single" w:color="BFBFBF" w:sz="4"/>
-              <w:right w:val="single" w:color="BFBFBF" w:sz="4"/>
-            </w:tcBorders>
-            <w:shd w:fill="F3F4F6" w:val="clear"/>
-            <w:tcMar>
-              <w:top w:type="dxa" w:w="100"/>
-              <w:left w:type="dxa" w:w="140"/>
-              <w:bottom w:type="dxa" w:w="100"/>
-              <w:right w:type="dxa" w:w="140"/>
-            </w:tcMar>
-            <w:vAlign w:val="center"/>
-          </w:tcPr>
-          <w:p>
-            <w:pPr>
-              <w:spacing w:after="40" w:before="40"/>
-              <w:jc w:val="center"/>
-            </w:pPr>
-            <w:r>
-              <w:rPr>
-                <w:rFonts w:ascii="Calibri" w:cs="Calibri" w:eastAsia="Calibri" w:hAnsi="Calibri"/>
-                <w:sz w:val="22"/>
-                <w:szCs w:val="22"/>
-              </w:rPr>
-              <w:t>70</w:t>
-            </w:r>
-          </w:p>
-        </w:tc>
-        <w:tc>
-          <w:tcPr>
-            <w:tcW w:type="dxa" w:w="3580"/>
-            <w:tcBorders>
-              <w:top w:val="single" w:color="BFBFBF" w:sz="4"/>
-              <w:left w:val="single" w:color="BFBFBF" w:sz="4"/>
-              <w:bottom w:val="single" w:color="BFBFBF" w:sz="4"/>
-              <w:right w:val="single" w:color="BFBFBF" w:sz="4"/>
-            </w:tcBorders>
-            <w:shd w:fill="F3F4F6" w:val="clear"/>
-            <w:tcMar>
-              <w:top w:type="dxa" w:w="100"/>
-              <w:left w:type="dxa" w:w="140"/>
-              <w:bottom w:type="dxa" w:w="100"/>
-              <w:right w:type="dxa" w:w="140"/>
-            </w:tcMar>
-            <w:vAlign w:val="center"/>
-          </w:tcPr>
-          <w:p>
-            <w:pPr>
-              <w:spacing w:after="40" w:before="40"/>
-              <w:jc w:val="left"/>
-            </w:pPr>
-            <w:r>
-              <w:rPr>
-                <w:rFonts w:ascii="Calibri" w:cs="Calibri" w:eastAsia="Calibri" w:hAnsi="Calibri"/>
-                <w:b/>
-                <w:bCs/>
-                <w:sz w:val="22"/>
-                <w:szCs w:val="22"/>
-              </w:rPr>
-              <w:t xml:space="preserve">Quality Industries P Ltd.</w:t>
-            </w:r>
-          </w:p>
-        </w:tc>
-        <w:tc>
-          <w:tcPr>
-            <w:tcW w:type="dxa" w:w="5000"/>
-            <w:tcBorders>
-              <w:top w:val="single" w:color="BFBFBF" w:sz="4"/>
-              <w:left w:val="single" w:color="BFBFBF" w:sz="4"/>
-              <w:bottom w:val="single" w:color="BFBFBF" w:sz="4"/>
-              <w:right w:val="single" w:color="BFBFBF" w:sz="4"/>
-            </w:tcBorders>
-            <w:shd w:fill="F3F4F6" w:val="clear"/>
-            <w:tcMar>
-              <w:top w:type="dxa" w:w="100"/>
-              <w:left w:type="dxa" w:w="140"/>
-              <w:bottom w:type="dxa" w:w="100"/>
-              <w:right w:type="dxa" w:w="140"/>
-            </w:tcMar>
-            <w:vAlign w:val="center"/>
-          </w:tcPr>
-          <w:p>
-            <w:pPr>
-              <w:spacing w:after="40" w:before="40"/>
-              <w:jc w:val="left"/>
-            </w:pPr>
-            <w:r>
-              <w:rPr>
-                <w:rFonts w:ascii="Calibri" w:cs="Calibri" w:eastAsia="Calibri" w:hAnsi="Calibri"/>
-                <w:sz w:val="22"/>
-                <w:szCs w:val="22"/>
-              </w:rPr>
-              <w:t xml:space="preserve">Vertical Ladle Preheater - 30 MT</w:t>
-            </w:r>
-          </w:p>
-        </w:tc>
-      </w:tr>
-      <w:tr>
-        <w:tc>
-          <w:tcPr>
-            <w:tcW w:type="dxa" w:w="780"/>
-            <w:tcBorders>
-              <w:top w:val="single" w:color="BFBFBF" w:sz="4"/>
-              <w:left w:val="single" w:color="BFBFBF" w:sz="4"/>
-              <w:bottom w:val="single" w:color="BFBFBF" w:sz="4"/>
-              <w:right w:val="single" w:color="BFBFBF" w:sz="4"/>
-            </w:tcBorders>
-            <w:shd w:fill="F3F4F6" w:val="clear"/>
-            <w:tcMar>
-              <w:top w:type="dxa" w:w="100"/>
-              <w:left w:type="dxa" w:w="140"/>
-              <w:bottom w:type="dxa" w:w="100"/>
-              <w:right w:type="dxa" w:w="140"/>
-            </w:tcMar>
-            <w:vAlign w:val="center"/>
-          </w:tcPr>
-          <w:p>
-            <w:pPr>
-              <w:spacing w:after="40" w:before="40"/>
-              <w:jc w:val="center"/>
-            </w:pPr>
-            <w:r>
-              <w:rPr>
-                <w:rFonts w:ascii="Calibri" w:cs="Calibri" w:eastAsia="Calibri" w:hAnsi="Calibri"/>
-                <w:sz w:val="22"/>
-                <w:szCs w:val="22"/>
-              </w:rPr>
-              <w:t>71</w:t>
-            </w:r>
-          </w:p>
-        </w:tc>
-        <w:tc>
-          <w:tcPr>
-            <w:tcW w:type="dxa" w:w="3580"/>
-            <w:tcBorders>
-              <w:top w:val="single" w:color="BFBFBF" w:sz="4"/>
-              <w:left w:val="single" w:color="BFBFBF" w:sz="4"/>
-              <w:bottom w:val="single" w:color="BFBFBF" w:sz="4"/>
-              <w:right w:val="single" w:color="BFBFBF" w:sz="4"/>
-            </w:tcBorders>
-            <w:shd w:fill="F3F4F6" w:val="clear"/>
-            <w:tcMar>
-              <w:top w:type="dxa" w:w="100"/>
-              <w:left w:type="dxa" w:w="140"/>
-              <w:bottom w:type="dxa" w:w="100"/>
-              <w:right w:type="dxa" w:w="140"/>
-            </w:tcMar>
-            <w:vAlign w:val="center"/>
-          </w:tcPr>
-          <w:p>
-            <w:pPr>
-              <w:spacing w:after="40" w:before="40"/>
-              <w:jc w:val="left"/>
-            </w:pPr>
-            <w:r>
-              <w:rPr>
-                <w:rFonts w:ascii="Calibri" w:cs="Calibri" w:eastAsia="Calibri" w:hAnsi="Calibri"/>
-                <w:b/>
-                <w:bCs/>
-                <w:sz w:val="22"/>
-                <w:szCs w:val="22"/>
-              </w:rPr>
-              <w:t xml:space="preserve">Quality Industries P Ltd.</w:t>
-            </w:r>
-          </w:p>
-        </w:tc>
-        <w:tc>
-          <w:tcPr>
-            <w:tcW w:type="dxa" w:w="5000"/>
-            <w:tcBorders>
-              <w:top w:val="single" w:color="BFBFBF" w:sz="4"/>
-              <w:left w:val="single" w:color="BFBFBF" w:sz="4"/>
-              <w:bottom w:val="single" w:color="BFBFBF" w:sz="4"/>
-              <w:right w:val="single" w:color="BFBFBF" w:sz="4"/>
-            </w:tcBorders>
-            <w:shd w:fill="F3F4F6" w:val="clear"/>
-            <w:tcMar>
-              <w:top w:type="dxa" w:w="100"/>
-              <w:left w:type="dxa" w:w="140"/>
-              <w:bottom w:type="dxa" w:w="100"/>
-              <w:right w:type="dxa" w:w="140"/>
-            </w:tcMar>
-            <w:vAlign w:val="center"/>
-          </w:tcPr>
-          <w:p>
-            <w:pPr>
-              <w:spacing w:after="40" w:before="40"/>
-              <w:jc w:val="left"/>
-            </w:pPr>
-            <w:r>
-              <w:rPr>
-                <w:rFonts w:ascii="Calibri" w:cs="Calibri" w:eastAsia="Calibri" w:hAnsi="Calibri"/>
-                <w:sz w:val="22"/>
-                <w:szCs w:val="22"/>
-              </w:rPr>
-              <w:t xml:space="preserve">Horizontal Ladle Preheater - 30 MT</w:t>
-            </w:r>
-          </w:p>
-        </w:tc>
-      </w:tr>
-      <w:tr>
-        <w:tc>
-          <w:tcPr>
-            <w:tcW w:type="dxa" w:w="780"/>
-            <w:tcBorders>
-              <w:top w:val="single" w:color="BFBFBF" w:sz="4"/>
-              <w:left w:val="single" w:color="BFBFBF" w:sz="4"/>
-              <w:bottom w:val="single" w:color="BFBFBF" w:sz="4"/>
-              <w:right w:val="single" w:color="BFBFBF" w:sz="4"/>
-            </w:tcBorders>
-            <w:shd w:fill="F3F4F6" w:val="clear"/>
-            <w:tcMar>
-              <w:top w:type="dxa" w:w="100"/>
-              <w:left w:type="dxa" w:w="140"/>
-              <w:bottom w:type="dxa" w:w="100"/>
-              <w:right w:type="dxa" w:w="140"/>
-            </w:tcMar>
-            <w:vAlign w:val="center"/>
-          </w:tcPr>
-          <w:p>
-            <w:pPr>
-              <w:spacing w:after="40" w:before="40"/>
-              <w:jc w:val="center"/>
-            </w:pPr>
-            <w:r>
-              <w:rPr>
-                <w:rFonts w:ascii="Calibri" w:cs="Calibri" w:eastAsia="Calibri" w:hAnsi="Calibri"/>
-                <w:sz w:val="22"/>
-                <w:szCs w:val="22"/>
-              </w:rPr>
-              <w:t>72</w:t>
-            </w:r>
-          </w:p>
-        </w:tc>
-        <w:tc>
-          <w:tcPr>
-            <w:tcW w:type="dxa" w:w="3580"/>
-            <w:tcBorders>
-              <w:top w:val="single" w:color="BFBFBF" w:sz="4"/>
-              <w:left w:val="single" w:color="BFBFBF" w:sz="4"/>
-              <w:bottom w:val="single" w:color="BFBFBF" w:sz="4"/>
-              <w:right w:val="single" w:color="BFBFBF" w:sz="4"/>
-            </w:tcBorders>
-            <w:shd w:fill="F3F4F6" w:val="clear"/>
-            <w:tcMar>
-              <w:top w:type="dxa" w:w="100"/>
-              <w:left w:type="dxa" w:w="140"/>
-              <w:bottom w:type="dxa" w:w="100"/>
-              <w:right w:type="dxa" w:w="140"/>
-            </w:tcMar>
-            <w:vAlign w:val="center"/>
-          </w:tcPr>
-          <w:p>
-            <w:pPr>
-              <w:spacing w:after="40" w:before="40"/>
-              <w:jc w:val="left"/>
-            </w:pPr>
-            <w:r>
-              <w:rPr>
-                <w:rFonts w:ascii="Calibri" w:cs="Calibri" w:eastAsia="Calibri" w:hAnsi="Calibri"/>
-                <w:b/>
-                <w:bCs/>
-                <w:sz w:val="22"/>
-                <w:szCs w:val="22"/>
-              </w:rPr>
-              <w:t xml:space="preserve">Rashtriya Ispat Nigam Limited</w:t>
-            </w:r>
-          </w:p>
-        </w:tc>
-        <w:tc>
-          <w:tcPr>
-            <w:tcW w:type="dxa" w:w="5000"/>
-            <w:tcBorders>
-              <w:top w:val="single" w:color="BFBFBF" w:sz="4"/>
-              <w:left w:val="single" w:color="BFBFBF" w:sz="4"/>
-              <w:bottom w:val="single" w:color="BFBFBF" w:sz="4"/>
-              <w:right w:val="single" w:color="BFBFBF" w:sz="4"/>
-            </w:tcBorders>
-            <w:shd w:fill="F3F4F6" w:val="clear"/>
-            <w:tcMar>
-              <w:top w:type="dxa" w:w="100"/>
-              <w:left w:type="dxa" w:w="140"/>
-              <w:bottom w:type="dxa" w:w="100"/>
-              <w:right w:type="dxa" w:w="140"/>
-            </w:tcMar>
-            <w:vAlign w:val="center"/>
-          </w:tcPr>
-          <w:p>
-            <w:pPr>
-              <w:spacing w:after="40" w:before="40"/>
-              <w:jc w:val="left"/>
-            </w:pPr>
-            <w:r>
-              <w:rPr>
-                <w:rFonts w:ascii="Calibri" w:cs="Calibri" w:eastAsia="Calibri" w:hAnsi="Calibri"/>
-                <w:sz w:val="22"/>
-                <w:szCs w:val="22"/>
-              </w:rPr>
-              <w:t xml:space="preserve">Tundish Preheater</w:t>
-            </w:r>
-          </w:p>
-        </w:tc>
-      </w:tr>
-      <w:tr>
-        <w:tc>
-          <w:tcPr>
-            <w:tcW w:type="dxa" w:w="780"/>
-            <w:tcBorders>
-              <w:top w:val="single" w:color="BFBFBF" w:sz="4"/>
-              <w:left w:val="single" w:color="BFBFBF" w:sz="4"/>
-              <w:bottom w:val="single" w:color="BFBFBF" w:sz="4"/>
-              <w:right w:val="single" w:color="BFBFBF" w:sz="4"/>
-            </w:tcBorders>
-            <w:shd w:fill="F3F4F6" w:val="clear"/>
-            <w:tcMar>
-              <w:top w:type="dxa" w:w="100"/>
-              <w:left w:type="dxa" w:w="140"/>
-              <w:bottom w:type="dxa" w:w="100"/>
-              <w:right w:type="dxa" w:w="140"/>
-            </w:tcMar>
-            <w:vAlign w:val="center"/>
-          </w:tcPr>
-          <w:p>
-            <w:pPr>
-              <w:spacing w:after="40" w:before="40"/>
-              <w:jc w:val="center"/>
-            </w:pPr>
-            <w:r>
-              <w:rPr>
-                <w:rFonts w:ascii="Calibri" w:cs="Calibri" w:eastAsia="Calibri" w:hAnsi="Calibri"/>
-                <w:sz w:val="22"/>
-                <w:szCs w:val="22"/>
-              </w:rPr>
-              <w:t>73</w:t>
-            </w:r>
-          </w:p>
-        </w:tc>
-        <w:tc>
-          <w:tcPr>
-            <w:tcW w:type="dxa" w:w="3580"/>
-            <w:tcBorders>
-              <w:top w:val="single" w:color="BFBFBF" w:sz="4"/>
-              <w:left w:val="single" w:color="BFBFBF" w:sz="4"/>
-              <w:bottom w:val="single" w:color="BFBFBF" w:sz="4"/>
-              <w:right w:val="single" w:color="BFBFBF" w:sz="4"/>
-            </w:tcBorders>
-            <w:shd w:fill="F3F4F6" w:val="clear"/>
-            <w:tcMar>
-              <w:top w:type="dxa" w:w="100"/>
-              <w:left w:type="dxa" w:w="140"/>
-              <w:bottom w:type="dxa" w:w="100"/>
-              <w:right w:type="dxa" w:w="140"/>
-            </w:tcMar>
-            <w:vAlign w:val="center"/>
-          </w:tcPr>
-          <w:p>
-            <w:pPr>
-              <w:spacing w:after="40" w:before="40"/>
-              <w:jc w:val="left"/>
-            </w:pPr>
-            <w:r>
-              <w:rPr>
-                <w:rFonts w:ascii="Calibri" w:cs="Calibri" w:eastAsia="Calibri" w:hAnsi="Calibri"/>
-                <w:b/>
-                <w:bCs/>
-                <w:sz w:val="22"/>
-                <w:szCs w:val="22"/>
-              </w:rPr>
-              <w:t xml:space="preserve">PT. Garuda Yamato Steel</w:t>
-            </w:r>
-          </w:p>
-        </w:tc>
-        <w:tc>
-          <w:tcPr>
-            <w:tcW w:type="dxa" w:w="5000"/>
-            <w:tcBorders>
-              <w:top w:val="single" w:color="BFBFBF" w:sz="4"/>
-              <w:left w:val="single" w:color="BFBFBF" w:sz="4"/>
-              <w:bottom w:val="single" w:color="BFBFBF" w:sz="4"/>
-              <w:right w:val="single" w:color="BFBFBF" w:sz="4"/>
-            </w:tcBorders>
-            <w:shd w:fill="F3F4F6" w:val="clear"/>
-            <w:tcMar>
-              <w:top w:type="dxa" w:w="100"/>
-              <w:left w:type="dxa" w:w="140"/>
-              <w:bottom w:type="dxa" w:w="100"/>
-              <w:right w:type="dxa" w:w="140"/>
-            </w:tcMar>
-            <w:vAlign w:val="center"/>
-          </w:tcPr>
-          <w:p>
-            <w:pPr>
-              <w:spacing w:after="40" w:before="40"/>
-              <w:jc w:val="left"/>
-            </w:pPr>
-            <w:r>
-              <w:rPr>
-                <w:rFonts w:ascii="Calibri" w:cs="Calibri" w:eastAsia="Calibri" w:hAnsi="Calibri"/>
-                <w:sz w:val="22"/>
-                <w:szCs w:val="22"/>
-              </w:rPr>
-              <w:t xml:space="preserve">Horizontal Ladle Preheater</w:t>
-            </w:r>
-          </w:p>
-        </w:tc>
-      </w:tr>
-      <w:tr>
-        <w:tc>
-          <w:tcPr>
-            <w:tcW w:type="dxa" w:w="780"/>
-            <w:tcBorders>
-              <w:top w:val="single" w:color="BFBFBF" w:sz="4"/>
-              <w:left w:val="single" w:color="BFBFBF" w:sz="4"/>
-              <w:bottom w:val="single" w:color="BFBFBF" w:sz="4"/>
-              <w:right w:val="single" w:color="BFBFBF" w:sz="4"/>
-            </w:tcBorders>
-            <w:shd w:fill="F3F4F6" w:val="clear"/>
-            <w:tcMar>
-              <w:top w:type="dxa" w:w="100"/>
-              <w:left w:type="dxa" w:w="140"/>
-              <w:bottom w:type="dxa" w:w="100"/>
-              <w:right w:type="dxa" w:w="140"/>
-            </w:tcMar>
-            <w:vAlign w:val="center"/>
-          </w:tcPr>
-          <w:p>
-            <w:pPr>
-              <w:spacing w:after="40" w:before="40"/>
-              <w:jc w:val="center"/>
-            </w:pPr>
-            <w:r>
-              <w:rPr>
-                <w:rFonts w:ascii="Calibri" w:cs="Calibri" w:eastAsia="Calibri" w:hAnsi="Calibri"/>
-                <w:sz w:val="22"/>
-                <w:szCs w:val="22"/>
-              </w:rPr>
-              <w:t>74</w:t>
-            </w:r>
-          </w:p>
-        </w:tc>
-        <w:tc>
-          <w:tcPr>
-            <w:tcW w:type="dxa" w:w="3580"/>
-            <w:tcBorders>
-              <w:top w:val="single" w:color="BFBFBF" w:sz="4"/>
-              <w:left w:val="single" w:color="BFBFBF" w:sz="4"/>
-              <w:bottom w:val="single" w:color="BFBFBF" w:sz="4"/>
-              <w:right w:val="single" w:color="BFBFBF" w:sz="4"/>
-            </w:tcBorders>
-            <w:shd w:fill="F3F4F6" w:val="clear"/>
-            <w:tcMar>
-              <w:top w:type="dxa" w:w="100"/>
-              <w:left w:type="dxa" w:w="140"/>
-              <w:bottom w:type="dxa" w:w="100"/>
-              <w:right w:type="dxa" w:w="140"/>
-            </w:tcMar>
-            <w:vAlign w:val="center"/>
-          </w:tcPr>
-          <w:p>
-            <w:pPr>
-              <w:spacing w:after="40" w:before="40"/>
-              <w:jc w:val="left"/>
-            </w:pPr>
-            <w:r>
-              <w:rPr>
-                <w:rFonts w:ascii="Calibri" w:cs="Calibri" w:eastAsia="Calibri" w:hAnsi="Calibri"/>
-                <w:b/>
-                <w:bCs/>
-                <w:sz w:val="22"/>
-                <w:szCs w:val="22"/>
-              </w:rPr>
-              <w:t xml:space="preserve">PT. Garuda Yamato Steel</w:t>
-            </w:r>
-          </w:p>
-        </w:tc>
-        <w:tc>
-          <w:tcPr>
-            <w:tcW w:type="dxa" w:w="5000"/>
-            <w:tcBorders>
-              <w:top w:val="single" w:color="BFBFBF" w:sz="4"/>
-              <w:left w:val="single" w:color="BFBFBF" w:sz="4"/>
-              <w:bottom w:val="single" w:color="BFBFBF" w:sz="4"/>
-              <w:right w:val="single" w:color="BFBFBF" w:sz="4"/>
-            </w:tcBorders>
-            <w:shd w:fill="F3F4F6" w:val="clear"/>
-            <w:tcMar>
-              <w:top w:type="dxa" w:w="100"/>
-              <w:left w:type="dxa" w:w="140"/>
-              <w:bottom w:type="dxa" w:w="100"/>
-              <w:right w:type="dxa" w:w="140"/>
-            </w:tcMar>
-            <w:vAlign w:val="center"/>
-          </w:tcPr>
-          <w:p>
-            <w:pPr>
-              <w:spacing w:after="40" w:before="40"/>
-              <w:jc w:val="left"/>
-            </w:pPr>
-            <w:r>
-              <w:rPr>
-                <w:rFonts w:ascii="Calibri" w:cs="Calibri" w:eastAsia="Calibri" w:hAnsi="Calibri"/>
-                <w:sz w:val="22"/>
-                <w:szCs w:val="22"/>
-              </w:rPr>
-              <w:t xml:space="preserve">Vertical Ladle Preheater</w:t>
-            </w:r>
-          </w:p>
-        </w:tc>
-      </w:tr>
-      <w:tr>
-        <w:tc>
-          <w:tcPr>
-            <w:tcW w:type="dxa" w:w="780"/>
-            <w:tcBorders>
-              <w:top w:val="single" w:color="BFBFBF" w:sz="4"/>
-              <w:left w:val="single" w:color="BFBFBF" w:sz="4"/>
-              <w:bottom w:val="single" w:color="BFBFBF" w:sz="4"/>
-              <w:right w:val="single" w:color="BFBFBF" w:sz="4"/>
-            </w:tcBorders>
-            <w:shd w:fill="F3F4F6" w:val="clear"/>
-            <w:tcMar>
-              <w:top w:type="dxa" w:w="100"/>
-              <w:left w:type="dxa" w:w="140"/>
-              <w:bottom w:type="dxa" w:w="100"/>
-              <w:right w:type="dxa" w:w="140"/>
-            </w:tcMar>
-            <w:vAlign w:val="center"/>
-          </w:tcPr>
-          <w:p>
-            <w:pPr>
-              <w:spacing w:after="40" w:before="40"/>
-              <w:jc w:val="center"/>
-            </w:pPr>
-            <w:r>
-              <w:rPr>
-                <w:rFonts w:ascii="Calibri" w:cs="Calibri" w:eastAsia="Calibri" w:hAnsi="Calibri"/>
-                <w:sz w:val="22"/>
-                <w:szCs w:val="22"/>
-              </w:rPr>
-              <w:t>75</w:t>
-            </w:r>
-          </w:p>
-        </w:tc>
-        <w:tc>
-          <w:tcPr>
-            <w:tcW w:type="dxa" w:w="3580"/>
-            <w:tcBorders>
-              <w:top w:val="single" w:color="BFBFBF" w:sz="4"/>
-              <w:left w:val="single" w:color="BFBFBF" w:sz="4"/>
-              <w:bottom w:val="single" w:color="BFBFBF" w:sz="4"/>
-              <w:right w:val="single" w:color="BFBFBF" w:sz="4"/>
-            </w:tcBorders>
-            <w:shd w:fill="F3F4F6" w:val="clear"/>
-            <w:tcMar>
-              <w:top w:type="dxa" w:w="100"/>
-              <w:left w:type="dxa" w:w="140"/>
-              <w:bottom w:type="dxa" w:w="100"/>
-              <w:right w:type="dxa" w:w="140"/>
-            </w:tcMar>
-            <w:vAlign w:val="center"/>
-          </w:tcPr>
-          <w:p>
-            <w:pPr>
-              <w:spacing w:after="40" w:before="40"/>
-              <w:jc w:val="left"/>
-            </w:pPr>
-            <w:r>
-              <w:rPr>
-                <w:rFonts w:ascii="Calibri" w:cs="Calibri" w:eastAsia="Calibri" w:hAnsi="Calibri"/>
-                <w:b/>
-                <w:bCs/>
-                <w:sz w:val="22"/>
-                <w:szCs w:val="22"/>
-              </w:rPr>
-              <w:t xml:space="preserve">PT. Garuda Yamato Steel</w:t>
-            </w:r>
-          </w:p>
-        </w:tc>
-        <w:tc>
-          <w:tcPr>
-            <w:tcW w:type="dxa" w:w="5000"/>
-            <w:tcBorders>
-              <w:top w:val="single" w:color="BFBFBF" w:sz="4"/>
-              <w:left w:val="single" w:color="BFBFBF" w:sz="4"/>
-              <w:bottom w:val="single" w:color="BFBFBF" w:sz="4"/>
-              <w:right w:val="single" w:color="BFBFBF" w:sz="4"/>
-            </w:tcBorders>
-            <w:shd w:fill="F3F4F6" w:val="clear"/>
-            <w:tcMar>
-              <w:top w:type="dxa" w:w="100"/>
-              <w:left w:type="dxa" w:w="140"/>
-              <w:bottom w:type="dxa" w:w="100"/>
-              <w:right w:type="dxa" w:w="140"/>
-            </w:tcMar>
-            <w:vAlign w:val="center"/>
-          </w:tcPr>
           <w:p>
             <w:pPr>
               <w:spacing w:after="40" w:before="40"/>

</xml_diff>

<commit_message>
chore: gas-train sub-bullets use the same '•' bullet as parents
Change ilvl=1 (sub-list level) of abstractNumId=2 from the open-circle
'○' (Symbol font) to the regular filled bullet '•', matching ilvl=0.
The nesting still works through the deeper indent defined in the
level-1 pPr/ind, so sub-bullets stay visually nested -- just with the
same bullet character.

Co-Authored-By: Claude Opus 4.7 (1M context) <noreply@anthropic.com>
</commit_message>
<xml_diff>
--- a/Offer_Template.docx
+++ b/Offer_Template.docx
@@ -16887,14 +16887,11 @@
     <w:lvl w:ilvl="1">
       <w:start w:val="1"/>
       <w:numFmt w:val="bullet"/>
-      <w:lvlText w:val="○"/>
+      <w:lvlText w:val="•"/>
       <w:lvlJc w:val="left"/>
       <w:pPr>
         <w:ind w:left="1440" w:hanging="360"/>
       </w:pPr>
-      <w:rPr>
-        <w:rFonts w:ascii="Symbol" w:hAnsi="Symbol" w:hint="default"/>
-      </w:rPr>
     </w:lvl>
   </w:abstractNum>
   <w:abstractNum w:abstractNumId="3" w15:restartNumberingAfterBreak="0">

</xml_diff>

<commit_message>
fix: hide Lifting & Lowering Mechanism for swivel hoods
The Lifting & Lowering Mechanism heading + body describes the
hydraulic-cylinder lift system, which only applies to the 'up_down'
hood type. Swivel hoods (swivel_manual + swivel_geared) move sideways
via gears or hand and don't carry that hydraulic system, so the
paragraph is now wrapped in {%p if hood_type == 'up_down' %} ...
{%p endif %}.

Co-Authored-By: Claude Opus 4.7 (1M context) <noreply@anthropic.com>
</commit_message>
<xml_diff>
--- a/Offer_Template.docx
+++ b/Offer_Template.docx
@@ -4345,6 +4345,15 @@
         <w:spacing w:after="80" w:before="200"/>
       </w:pPr>
       <w:r>
+        <w:t xml:space="preserve">{%p if hood_type == "up_down" %}</w:t>
+      </w:r>
+    </w:p>
+    <w:p>
+      <w:pPr>
+        <w:pStyle w:val="Heading3"/>
+        <w:spacing w:after="80" w:before="200"/>
+      </w:pPr>
+      <w:r>
         <w:rPr>
           <w:rFonts w:ascii="Calibri" w:cs="Calibri" w:eastAsia="Calibri" w:hAnsi="Calibri"/>
           <w:b/>
@@ -4366,6 +4375,15 @@
           <w:rFonts w:ascii="Calibri" w:cs="Calibri" w:eastAsia="Calibri" w:hAnsi="Calibri"/>
         </w:rPr>
         <w:t>To remove the ladle easily after drying/heating, the system provides “up and down” movement of the hood. Lifting/lowering is performed by a single-acting (push) hydraulic cylinder fitted in the column with a dedicated power pack of suitable capacity. Limit switches LS1 and LS2 indicate the parking and working positions respectively, with a maximum lift of 85° from the parking position. An additional mechanical locking arrangement prevents the hood from dropping in case of hydraulic failure. The hydraulic system comprises an oil tank, oil pump with motor, suction strainer, pressure gauges with thumb-operated needle valve, directional valves, pilot-operated check valves, pressure hoses, level switch, return-line filter (with clogging switch and indicator), pressure-relief valve, pressure switch, and temperature gauge.</w:t>
+      </w:r>
+    </w:p>
+    <w:p>
+      <w:pPr>
+        <w:spacing w:after="60" w:before="60" w:line="300"/>
+        <w:jc w:val="left"/>
+      </w:pPr>
+      <w:r>
+        <w:t xml:space="preserve">{%p endif %}</w:t>
       </w:r>
     </w:p>
     <w:p>

</xml_diff>

<commit_message>
feat: manual-swivel hood gets its own 'Swivelling Mechanism' paragraph
For hood_type == 'swivel_manual', the offer now renders a Swivelling
Mechanism heading + body in place of the Lifting & Lowering paragraph
(which still renders only for up_down hydraulic hoods). swivel_geared
remains unaddressed and shows neither paragraph; raise a separate ask
if a geared-swivel variant should be wired in too.

The swivel-manual paragraph reads:
  'The swivelling mechanism of the preheating hood will be made
  effective manually to rotate in longitudinal direction through a
  bearing mechanism. To counter-balance the hood, the blower will be
  fixed on a platform attached to the structural arms of the converter
  supporting structure. A sturdy mechanical locking arrangement,
  fabricated out of steel plates, will be fixed with the main column
  to lock the dish-hood movement at the desired position.'

Co-Authored-By: Claude Opus 4.7 (1M context) <noreply@anthropic.com>
</commit_message>
<xml_diff>
--- a/Offer_Template.docx
+++ b/Offer_Template.docx
@@ -4375,6 +4375,42 @@
           <w:rFonts w:ascii="Calibri" w:cs="Calibri" w:eastAsia="Calibri" w:hAnsi="Calibri"/>
         </w:rPr>
         <w:t>To remove the ladle easily after drying/heating, the system provides “up and down” movement of the hood. Lifting/lowering is performed by a single-acting (push) hydraulic cylinder fitted in the column with a dedicated power pack of suitable capacity. Limit switches LS1 and LS2 indicate the parking and working positions respectively, with a maximum lift of 85° from the parking position. An additional mechanical locking arrangement prevents the hood from dropping in case of hydraulic failure. The hydraulic system comprises an oil tank, oil pump with motor, suction strainer, pressure gauges with thumb-operated needle valve, directional valves, pilot-operated check valves, pressure hoses, level switch, return-line filter (with clogging switch and indicator), pressure-relief valve, pressure switch, and temperature gauge.</w:t>
+      </w:r>
+    </w:p>
+    <w:p>
+      <w:pPr>
+        <w:spacing w:after="60" w:before="60" w:line="300"/>
+        <w:jc w:val="left"/>
+      </w:pPr>
+      <w:r>
+        <w:t xml:space="preserve">{%p endif %}</w:t>
+      </w:r>
+    </w:p>
+    <w:p>
+      <w:pPr>
+        <w:spacing w:after="60" w:before="60" w:line="300"/>
+        <w:jc w:val="left"/>
+      </w:pPr>
+      <w:r>
+        <w:t xml:space="preserve">{%p if hood_type == "swivel_manual" %}</w:t>
+      </w:r>
+    </w:p>
+    <w:p>
+      <w:pPr>
+        <w:pStyle w:val="Heading3"/>
+        <w:spacing w:after="80" w:before="200"/>
+      </w:pPr>
+      <w:r>
+        <w:t xml:space="preserve">Swivelling Mechanism</w:t>
+      </w:r>
+    </w:p>
+    <w:p>
+      <w:pPr>
+        <w:spacing w:after="60" w:before="60" w:line="300"/>
+        <w:jc w:val="left"/>
+      </w:pPr>
+      <w:r>
+        <w:t xml:space="preserve">The swivelling mechanism of the preheating hood will be made effective manually to rotate in longitudinal direction through a bearing mechanism. To counter-balance the hood, the blower will be fixed on a platform attached to the structural arms of the converter supporting structure. A sturdy mechanical locking arrangement, fabricated out of steel plates, will be fixed with the main column to lock the dish-hood movement at the desired position.</w:t>
       </w:r>
     </w:p>
     <w:p>

</xml_diff>

<commit_message>
feat: geared-swivel hood gets matching Swivelling Mechanism paragraph
Mirrors the manual-swivel paragraph but swaps 'manually' for 'using a
motor and gearbox':

  'The swivelling mechanism of the preheating hood will be made
  effective using a motor and gearbox to rotate in longitudinal
  direction through a bearing mechanism. To counter-balance the
  hood...'

Hood-type branches:
  up_down       -> Lifting & Lowering Mechanism (hydraulic)
  swivel_manual -> Swivelling Mechanism, manual
  swivel_geared -> Swivelling Mechanism, motor + gearbox

Co-Authored-By: Claude Opus 4.7 (1M context) <noreply@anthropic.com>
</commit_message>
<xml_diff>
--- a/Offer_Template.docx
+++ b/Offer_Template.docx
@@ -4411,6 +4411,42 @@
       </w:pPr>
       <w:r>
         <w:t xml:space="preserve">The swivelling mechanism of the preheating hood will be made effective manually to rotate in longitudinal direction through a bearing mechanism. To counter-balance the hood, the blower will be fixed on a platform attached to the structural arms of the converter supporting structure. A sturdy mechanical locking arrangement, fabricated out of steel plates, will be fixed with the main column to lock the dish-hood movement at the desired position.</w:t>
+      </w:r>
+    </w:p>
+    <w:p>
+      <w:pPr>
+        <w:spacing w:after="60" w:before="60" w:line="300"/>
+        <w:jc w:val="left"/>
+      </w:pPr>
+      <w:r>
+        <w:t xml:space="preserve">{%p endif %}</w:t>
+      </w:r>
+    </w:p>
+    <w:p>
+      <w:pPr>
+        <w:spacing w:after="60" w:before="60" w:line="300"/>
+        <w:jc w:val="left"/>
+      </w:pPr>
+      <w:r>
+        <w:t xml:space="preserve">{%p if hood_type == "swivel_geared" %}</w:t>
+      </w:r>
+    </w:p>
+    <w:p>
+      <w:pPr>
+        <w:pStyle w:val="Heading3"/>
+        <w:spacing w:after="80" w:before="200"/>
+      </w:pPr>
+      <w:r>
+        <w:t xml:space="preserve">Swivelling Mechanism</w:t>
+      </w:r>
+    </w:p>
+    <w:p>
+      <w:pPr>
+        <w:spacing w:after="60" w:before="60" w:line="300"/>
+        <w:jc w:val="left"/>
+      </w:pPr>
+      <w:r>
+        <w:t xml:space="preserve">The swivelling mechanism of the preheating hood will be made effective using a motor and gearbox to rotate in longitudinal direction through a bearing mechanism. To counter-balance the hood, the blower will be fixed on a platform attached to the structural arms of the converter supporting structure. A sturdy mechanical locking arrangement, fabricated out of steel plates, will be fixed with the main column to lock the dish-hood movement at the desired position.</w:t>
       </w:r>
     </w:p>
     <w:p>

</xml_diff>

<commit_message>
fix: VLPH hood-mechanism paragraphs hidden on HLPH offers
The QuoteRequest schema defaults hood_type to 'up_down', so HLPH offers
(which don't surface a hood-type selector) ended up rendering the
Lifting & Lowering Mechanism paragraph alongside the new HLPH-specific
Hood Movement Mechanism block. Add 'and not is_horizontal' to all
three hood_type conditionals so VLPH-only paragraphs are suppressed
for horizontal offers.

  hood_type == 'up_down'       AND not is_horizontal -> Lifting & Lowering
  hood_type == 'swivel_manual' AND not is_horizontal -> Swivelling, manual
  hood_type == 'swivel_geared' AND not is_horizontal -> Swivelling, geared
  is_horizontal                                       -> Hood Movement (trolley)

Co-Authored-By: Claude Opus 4.7 (1M context) <noreply@anthropic.com>
</commit_message>
<xml_diff>
--- a/Offer_Template.docx
+++ b/Offer_Template.docx
@@ -4345,7 +4345,7 @@
         <w:spacing w:after="80" w:before="200"/>
       </w:pPr>
       <w:r>
-        <w:t xml:space="preserve">{%p if hood_type == "up_down" %}</w:t>
+        <w:t xml:space="preserve">{%p if hood_type == "up_down" and not is_horizontal %}</w:t>
       </w:r>
     </w:p>
     <w:p>
@@ -4392,7 +4392,7 @@
         <w:jc w:val="left"/>
       </w:pPr>
       <w:r>
-        <w:t xml:space="preserve">{%p if hood_type == "swivel_manual" %}</w:t>
+        <w:t xml:space="preserve">{%p if hood_type == "swivel_manual" and not is_horizontal %}</w:t>
       </w:r>
     </w:p>
     <w:p>
@@ -4428,7 +4428,7 @@
         <w:jc w:val="left"/>
       </w:pPr>
       <w:r>
-        <w:t xml:space="preserve">{%p if hood_type == "swivel_geared" %}</w:t>
+        <w:t xml:space="preserve">{%p if hood_type == "swivel_geared" and not is_horizontal %}</w:t>
       </w:r>
     </w:p>
     <w:p>

</xml_diff>

<commit_message>
fix: offer template — restore Global Presence flag image; drop YOUR REF/OUR REF/DATE table
Pulled the country-flag composite image (image_flags.jpg) back into the
Global Presence section between the intro paragraph and the page break.
The flag block had silently disappeared when the template was last
regenerated and only one media file was retained.

Also dropped the YOUR REF / OUR REF / DATE 3-column table near the top
of the offer for both VLPH and HLPH variants.

Co-Authored-By: Claude Opus 4.7 (1M context) <noreply@anthropic.com>
</commit_message>
<xml_diff>
--- a/Offer_Template.docx
+++ b/Offer_Template.docx
@@ -658,220 +658,6 @@
         <w:t>Email: {{email}}</w:t>
       </w:r>
     </w:p>
-    <w:tbl>
-      <w:tblPr>
-        <w:tblW w:type="dxa" w:w="9360"/>
-        <w:tblBorders>
-          <w:top w:val="single" w:color="auto" w:sz="4"/>
-          <w:left w:val="single" w:color="auto" w:sz="4"/>
-          <w:bottom w:val="single" w:color="auto" w:sz="4"/>
-          <w:right w:val="single" w:color="auto" w:sz="4"/>
-          <w:insideH w:val="single" w:color="auto" w:sz="4"/>
-          <w:insideV w:val="single" w:color="auto" w:sz="4"/>
-        </w:tblBorders>
-      </w:tblPr>
-      <w:tblGrid>
-        <w:gridCol w:w="3120"/>
-        <w:gridCol w:w="3120"/>
-        <w:gridCol w:w="3120"/>
-      </w:tblGrid>
-      <w:tr>
-        <w:trPr>
-          <w:tblHeader/>
-        </w:trPr>
-        <w:tc>
-          <w:tcPr>
-            <w:tcW w:type="dxa" w:w="3120"/>
-            <w:tcBorders>
-              <w:top w:val="single" w:color="BFBFBF" w:sz="4"/>
-              <w:left w:val="single" w:color="BFBFBF" w:sz="4"/>
-              <w:bottom w:val="single" w:color="BFBFBF" w:sz="4"/>
-              <w:right w:val="single" w:color="BFBFBF" w:sz="4"/>
-            </w:tcBorders>
-            <w:shd w:fill="E87722" w:val="clear"/>
-            <w:tcMar>
-              <w:top w:type="dxa" w:w="100"/>
-              <w:left w:type="dxa" w:w="140"/>
-              <w:bottom w:type="dxa" w:w="100"/>
-              <w:right w:type="dxa" w:w="140"/>
-            </w:tcMar>
-            <w:vAlign w:val="center"/>
-          </w:tcPr>
-          <w:p>
-            <w:pPr>
-              <w:spacing w:after="40" w:before="40"/>
-              <w:jc w:val="center"/>
-            </w:pPr>
-            <w:r>
-              <w:rPr>
-                <w:rFonts w:ascii="Calibri" w:cs="Calibri" w:eastAsia="Calibri" w:hAnsi="Calibri"/>
-                <w:b/>
-                <w:bCs/>
-                <w:color w:val="FFFFFF"/>
-                <w:sz w:val="22"/>
-                <w:szCs w:val="22"/>
-              </w:rPr>
-              <w:t xml:space="preserve">YOUR REF</w:t>
-            </w:r>
-          </w:p>
-        </w:tc>
-        <w:tc>
-          <w:tcPr>
-            <w:tcW w:type="dxa" w:w="3120"/>
-            <w:tcBorders>
-              <w:top w:val="single" w:color="BFBFBF" w:sz="4"/>
-              <w:left w:val="single" w:color="BFBFBF" w:sz="4"/>
-              <w:bottom w:val="single" w:color="BFBFBF" w:sz="4"/>
-              <w:right w:val="single" w:color="BFBFBF" w:sz="4"/>
-            </w:tcBorders>
-            <w:shd w:fill="E87722" w:val="clear"/>
-            <w:tcMar>
-              <w:top w:type="dxa" w:w="100"/>
-              <w:left w:type="dxa" w:w="140"/>
-              <w:bottom w:type="dxa" w:w="100"/>
-              <w:right w:type="dxa" w:w="140"/>
-            </w:tcMar>
-            <w:vAlign w:val="center"/>
-          </w:tcPr>
-          <w:p>
-            <w:pPr>
-              <w:spacing w:after="40" w:before="40"/>
-              <w:jc w:val="center"/>
-            </w:pPr>
-            <w:r>
-              <w:rPr>
-                <w:rFonts w:ascii="Calibri" w:cs="Calibri" w:eastAsia="Calibri" w:hAnsi="Calibri"/>
-                <w:b/>
-                <w:bCs/>
-                <w:color w:val="FFFFFF"/>
-                <w:sz w:val="22"/>
-                <w:szCs w:val="22"/>
-              </w:rPr>
-              <w:t xml:space="preserve">OUR REF</w:t>
-            </w:r>
-          </w:p>
-        </w:tc>
-        <w:tc>
-          <w:tcPr>
-            <w:tcW w:type="dxa" w:w="3120"/>
-            <w:tcBorders>
-              <w:top w:val="single" w:color="BFBFBF" w:sz="4"/>
-              <w:left w:val="single" w:color="BFBFBF" w:sz="4"/>
-              <w:bottom w:val="single" w:color="BFBFBF" w:sz="4"/>
-              <w:right w:val="single" w:color="BFBFBF" w:sz="4"/>
-            </w:tcBorders>
-            <w:shd w:fill="E87722" w:val="clear"/>
-            <w:tcMar>
-              <w:top w:type="dxa" w:w="100"/>
-              <w:left w:type="dxa" w:w="140"/>
-              <w:bottom w:type="dxa" w:w="100"/>
-              <w:right w:type="dxa" w:w="140"/>
-            </w:tcMar>
-            <w:vAlign w:val="center"/>
-          </w:tcPr>
-          <w:p>
-            <w:pPr>
-              <w:spacing w:after="40" w:before="40"/>
-              <w:jc w:val="center"/>
-            </w:pPr>
-            <w:r>
-              <w:rPr>
-                <w:rFonts w:ascii="Calibri" w:cs="Calibri" w:eastAsia="Calibri" w:hAnsi="Calibri"/>
-                <w:b/>
-                <w:bCs/>
-                <w:color w:val="FFFFFF"/>
-                <w:sz w:val="22"/>
-                <w:szCs w:val="22"/>
-              </w:rPr>
-              <w:t xml:space="preserve">DATE</w:t>
-            </w:r>
-          </w:p>
-        </w:tc>
-      </w:tr>
-      <w:tr>
-        <w:tc>
-          <w:tcPr>
-            <w:tcW w:type="dxa" w:w="3120"/>
-            <w:tcBorders>
-              <w:top w:val="single" w:color="BFBFBF" w:sz="4"/>
-              <w:left w:val="single" w:color="BFBFBF" w:sz="4"/>
-              <w:bottom w:val="single" w:color="BFBFBF" w:sz="4"/>
-              <w:right w:val="single" w:color="BFBFBF" w:sz="4"/>
-            </w:tcBorders>
-            <w:tcMar>
-              <w:top w:type="dxa" w:w="100"/>
-              <w:left w:type="dxa" w:w="140"/>
-              <w:bottom w:type="dxa" w:w="100"/>
-              <w:right w:type="dxa" w:w="140"/>
-            </w:tcMar>
-            <w:vAlign w:val="center"/>
-          </w:tcPr>
-          <w:p>
-            <w:pPr>
-              <w:spacing w:after="40" w:before="40"/>
-              <w:jc w:val="center"/>
-            </w:pPr>
-            <w:r>
-              <w:t>{{your_ref}}</w:t>
-            </w:r>
-          </w:p>
-        </w:tc>
-        <w:tc>
-          <w:tcPr>
-            <w:tcW w:type="dxa" w:w="3120"/>
-            <w:tcBorders>
-              <w:top w:val="single" w:color="BFBFBF" w:sz="4"/>
-              <w:left w:val="single" w:color="BFBFBF" w:sz="4"/>
-              <w:bottom w:val="single" w:color="BFBFBF" w:sz="4"/>
-              <w:right w:val="single" w:color="BFBFBF" w:sz="4"/>
-            </w:tcBorders>
-            <w:tcMar>
-              <w:top w:type="dxa" w:w="100"/>
-              <w:left w:type="dxa" w:w="140"/>
-              <w:bottom w:type="dxa" w:w="100"/>
-              <w:right w:type="dxa" w:w="140"/>
-            </w:tcMar>
-            <w:vAlign w:val="center"/>
-          </w:tcPr>
-          <w:p>
-            <w:pPr>
-              <w:spacing w:after="40" w:before="40"/>
-              <w:jc w:val="center"/>
-            </w:pPr>
-            <w:r>
-              <w:t>{{quote_no}}</w:t>
-            </w:r>
-          </w:p>
-        </w:tc>
-        <w:tc>
-          <w:tcPr>
-            <w:tcW w:type="dxa" w:w="3120"/>
-            <w:tcBorders>
-              <w:top w:val="single" w:color="BFBFBF" w:sz="4"/>
-              <w:left w:val="single" w:color="BFBFBF" w:sz="4"/>
-              <w:bottom w:val="single" w:color="BFBFBF" w:sz="4"/>
-              <w:right w:val="single" w:color="BFBFBF" w:sz="4"/>
-            </w:tcBorders>
-            <w:tcMar>
-              <w:top w:type="dxa" w:w="100"/>
-              <w:left w:type="dxa" w:w="140"/>
-              <w:bottom w:type="dxa" w:w="100"/>
-              <w:right w:type="dxa" w:w="140"/>
-            </w:tcMar>
-            <w:vAlign w:val="center"/>
-          </w:tcPr>
-          <w:p>
-            <w:pPr>
-              <w:spacing w:after="40" w:before="40"/>
-              <w:jc w:val="center"/>
-            </w:pPr>
-            <w:r>
-              <w:t>{{date}}</w:t>
-            </w:r>
-          </w:p>
-        </w:tc>
-      </w:tr>
-    </w:tbl>
     <w:p>
       <w:pPr>
         <w:spacing w:after="160" w:before="160"/>
@@ -2450,6 +2236,76 @@
         <w:t xml:space="preserve">With installations across India, the Middle East, and South-East Asia, ENCON serves a global customer base — backed by responsive after-sales support and a worldwide network of partners.</w:t>
       </w:r>
     </w:p>
+    <ns0:p xmlns:ns0="http://schemas.openxmlformats.org/wordprocessingml/2006/main" xmlns:ns1="http://schemas.microsoft.com/office/word/2010/wordml" xmlns:ns2="http://schemas.openxmlformats.org/drawingml/2006/wordprocessingDrawing" xmlns:ns3="http://schemas.microsoft.com/office/word/2010/wordprocessingDrawing" xmlns:ns4="http://schemas.openxmlformats.org/drawingml/2006/main" xmlns:ns5="http://schemas.openxmlformats.org/drawingml/2006/picture" xmlns:ns6="http://schemas.openxmlformats.org/officeDocument/2006/relationships" ns1:paraId="0B67A015" ns1:textId="77777777" ns0:rsidR="009C3D95" ns0:rsidRDefault="00000000">
+      <ns0:pPr>
+        <ns0:pBdr>
+          <ns0:top ns0:val="nil"/>
+          <ns0:left ns0:val="nil"/>
+          <ns0:bottom ns0:val="nil"/>
+          <ns0:right ns0:val="nil"/>
+          <ns0:between ns0:val="nil"/>
+        </ns0:pBdr>
+        <ns0:spacing ns0:before="163"/>
+        <ns0:rPr>
+          <ns0:color ns0:val="000000"/>
+          <ns0:sz ns0:val="20"/>
+          <ns0:szCs ns0:val="20"/>
+        </ns0:rPr>
+        <ns0:sectPr ns0:rsidR="009C3D95">
+          <ns0:pgSz ns0:w="11920" ns0:h="16850"/>
+          <ns0:pgMar ns0:top="1340" ns0:right="340" ns0:bottom="1540" ns0:left="440" ns0:header="0" ns0:footer="1341" ns0:gutter="0"/>
+          <ns0:cols ns0:space="720"/>
+        </ns0:sectPr>
+      </ns0:pPr>
+      <ns0:r>
+        <ns0:rPr>
+          <ns0:noProof/>
+        </ns0:rPr>
+        <ns0:drawing>
+          <ns2:anchor distT="0" distB="0" distL="0" distR="0" simplePos="0" relativeHeight="251682816" behindDoc="0" locked="0" layoutInCell="1" hidden="0" allowOverlap="1" ns3:anchorId="14434975" ns3:editId="7465BD3B">
+            <ns2:simplePos x="0" y="0"/>
+            <ns2:positionH relativeFrom="column">
+              <ns2:posOffset>527050</ns2:posOffset>
+            </ns2:positionH>
+            <ns2:positionV relativeFrom="paragraph">
+              <ns2:posOffset>262890</ns2:posOffset>
+            </ns2:positionV>
+            <ns2:extent cx="6165215" cy="3194050"/>
+            <ns2:effectExtent l="0" t="0" r="0" b="0"/>
+            <ns2:wrapTopAndBottom distT="0" distB="0"/>
+            <ns2:docPr id="909070903" name="image22.jpg"/>
+            <ns2:cNvGraphicFramePr/>
+            <ns4:graphic>
+              <ns4:graphicData uri="http://schemas.openxmlformats.org/drawingml/2006/picture">
+                <ns5:pic>
+                  <ns5:nvPicPr>
+                    <ns5:cNvPr id="0" name="image22.jpg"/>
+                    <ns5:cNvPicPr preferRelativeResize="0"/>
+                  </ns5:nvPicPr>
+                  <ns5:blipFill>
+                    <ns4:blip ns6:embed="rId16"/>
+                    <ns4:srcRect/>
+                    <ns4:stretch>
+                      <ns4:fillRect/>
+                    </ns4:stretch>
+                  </ns5:blipFill>
+                  <ns5:spPr>
+                    <ns4:xfrm>
+                      <ns4:off x="0" y="0"/>
+                      <ns4:ext cx="6165215" cy="3194050"/>
+                    </ns4:xfrm>
+                    <ns4:prstGeom prst="rect">
+                      <ns4:avLst/>
+                    </ns4:prstGeom>
+                    <ns4:ln/>
+                  </ns5:spPr>
+                </ns5:pic>
+              </ns4:graphicData>
+            </ns4:graphic>
+          </ns2:anchor>
+        </ns0:drawing>
+      </ns0:r>
+    </ns0:p>
     <w:p>
       <w:r>
         <w:br w:type="page"/>

</xml_diff>

<commit_message>
fix: offer header table — keep only Enquiry No., drop Our Reference + Date
Simplifies the Project/Equipment header table. The 'Enquiry No. / Date'
row is renamed to 'Enquiry No.', and the 'Our Reference' and 'Date' rows
are removed. Applies to both VLPH and HLPH offers.

Co-Authored-By: Claude Opus 4.7 (1M context) <noreply@anthropic.com>
</commit_message>
<xml_diff>
--- a/Offer_Template.docx
+++ b/Offer_Template.docx
@@ -313,7 +313,7 @@
                 <w:sz w:val="22"/>
                 <w:szCs w:val="22"/>
               </w:rPr>
-              <w:t xml:space="preserve">Enquiry No. / Date</w:t>
+              <w:t>Enquiry No.</w:t>
             </w:r>
           </w:p>
         </w:tc>
@@ -341,132 +341,6 @@
             </w:pPr>
             <w:r>
               <w:t>{{enquiry_ref}}</w:t>
-            </w:r>
-          </w:p>
-        </w:tc>
-      </w:tr>
-      <w:tr>
-        <w:tc>
-          <w:tcPr>
-            <w:tcW w:w="2400" w:type="dxa"/>
-            <w:shd w:fill="F3F4F6" w:val="clear"/>
-            <w:tcMar>
-              <w:top w:w="100" w:type="dxa"/>
-              <w:bottom w:w="100" w:type="dxa"/>
-              <w:left w:w="140" w:type="dxa"/>
-              <w:right w:w="140" w:type="dxa"/>
-            </w:tcMar>
-            <w:tcBorders>
-              <w:top w:val="single" w:sz="4" w:color="BFBFBF"/>
-              <w:bottom w:val="single" w:sz="4" w:color="BFBFBF"/>
-              <w:left w:val="single" w:sz="4" w:color="BFBFBF"/>
-              <w:right w:val="single" w:sz="4" w:color="BFBFBF"/>
-            </w:tcBorders>
-            <w:vAlign w:val="center"/>
-          </w:tcPr>
-          <w:p>
-            <w:pPr>
-              <w:spacing w:before="40" w:after="40"/>
-            </w:pPr>
-            <w:r>
-              <w:rPr>
-                <w:rFonts w:ascii="Calibri" w:cs="Calibri" w:eastAsia="Calibri" w:hAnsi="Calibri"/>
-                <w:b/>
-                <w:bCs/>
-                <w:sz w:val="22"/>
-                <w:szCs w:val="22"/>
-              </w:rPr>
-              <w:t xml:space="preserve">Our Reference</w:t>
-            </w:r>
-          </w:p>
-        </w:tc>
-        <w:tc>
-          <w:tcPr>
-            <w:tcW w:w="4800" w:type="dxa"/>
-            <w:shd w:fill="F3F4F6" w:val="clear"/>
-            <w:tcMar>
-              <w:top w:w="100" w:type="dxa"/>
-              <w:bottom w:w="100" w:type="dxa"/>
-              <w:left w:w="140" w:type="dxa"/>
-              <w:right w:w="140" w:type="dxa"/>
-            </w:tcMar>
-            <w:tcBorders>
-              <w:top w:val="single" w:sz="4" w:color="BFBFBF"/>
-              <w:bottom w:val="single" w:sz="4" w:color="BFBFBF"/>
-              <w:left w:val="single" w:sz="4" w:color="BFBFBF"/>
-              <w:right w:val="single" w:sz="4" w:color="BFBFBF"/>
-            </w:tcBorders>
-            <w:vAlign w:val="center"/>
-          </w:tcPr>
-          <w:p>
-            <w:pPr>
-              <w:spacing w:before="40" w:after="40"/>
-            </w:pPr>
-            <w:r>
-              <w:t>{{quote_no}}</w:t>
-            </w:r>
-          </w:p>
-        </w:tc>
-      </w:tr>
-      <w:tr>
-        <w:tc>
-          <w:tcPr>
-            <w:tcW w:w="2400" w:type="dxa"/>
-            <w:shd w:fill="FFFFFF" w:val="clear"/>
-            <w:tcMar>
-              <w:top w:w="100" w:type="dxa"/>
-              <w:bottom w:w="100" w:type="dxa"/>
-              <w:left w:w="140" w:type="dxa"/>
-              <w:right w:w="140" w:type="dxa"/>
-            </w:tcMar>
-            <w:tcBorders>
-              <w:top w:val="single" w:sz="4" w:color="BFBFBF"/>
-              <w:bottom w:val="single" w:sz="4" w:color="BFBFBF"/>
-              <w:left w:val="single" w:sz="4" w:color="BFBFBF"/>
-              <w:right w:val="single" w:sz="4" w:color="BFBFBF"/>
-            </w:tcBorders>
-            <w:vAlign w:val="center"/>
-          </w:tcPr>
-          <w:p>
-            <w:pPr>
-              <w:spacing w:before="40" w:after="40"/>
-            </w:pPr>
-            <w:r>
-              <w:rPr>
-                <w:rFonts w:ascii="Calibri" w:cs="Calibri" w:eastAsia="Calibri" w:hAnsi="Calibri"/>
-                <w:b/>
-                <w:bCs/>
-                <w:sz w:val="22"/>
-                <w:szCs w:val="22"/>
-              </w:rPr>
-              <w:t xml:space="preserve">Date</w:t>
-            </w:r>
-          </w:p>
-        </w:tc>
-        <w:tc>
-          <w:tcPr>
-            <w:tcW w:w="4800" w:type="dxa"/>
-            <w:shd w:fill="FFFFFF" w:val="clear"/>
-            <w:tcMar>
-              <w:top w:w="100" w:type="dxa"/>
-              <w:bottom w:w="100" w:type="dxa"/>
-              <w:left w:w="140" w:type="dxa"/>
-              <w:right w:w="140" w:type="dxa"/>
-            </w:tcMar>
-            <w:tcBorders>
-              <w:top w:val="single" w:sz="4" w:color="BFBFBF"/>
-              <w:bottom w:val="single" w:sz="4" w:color="BFBFBF"/>
-              <w:left w:val="single" w:sz="4" w:color="BFBFBF"/>
-              <w:right w:val="single" w:sz="4" w:color="BFBFBF"/>
-            </w:tcBorders>
-            <w:vAlign w:val="center"/>
-          </w:tcPr>
-          <w:p>
-            <w:pPr>
-              <w:spacing w:before="40" w:after="40"/>
-            </w:pPr>
-            <w:r>
-              <w:t>{{date}}</w:t>
             </w:r>
           </w:p>
         </w:tc>

</xml_diff>

<commit_message>
fix: HLPH price schedule renders price; tighten template wording
- engine/quote_writer.py: when an offer carries only horizontal items,
  pour the horizontal grand-total into the *_vertical template slots so
  the Annexure III price row no longer shows 0.00 (template only has
  one equipment row bound to the vertical variables).
- Offer_Template.docx: shorten exclusion bullet
  'Pipeline / piping from T.O.P to inlet of pumping unit' -> 'Pipeline'.
- Offer_Template.docx: drop the word 'revised' from the cover letter
  ('revised offer' -> 'offer').

Co-Authored-By: Claude Opus 4.7 (1M context) <noreply@anthropic.com>
</commit_message>
<xml_diff>
--- a/Offer_Template.docx
+++ b/Offer_Template.docx
@@ -598,7 +598,7 @@
         <w:rPr>
           <w:rFonts w:ascii="Calibri" w:cs="Calibri" w:eastAsia="Calibri" w:hAnsi="Calibri"/>
         </w:rPr>
-        <w:t xml:space="preserve">We are pleased to enclose herewith our most competitive and comprehensive revised offer for the same for your kind perusal.</w:t>
+        <w:t>We are pleased to enclose herewith our most competitive and comprehensive offer for the same for your kind perusal.</w:t>
       </w:r>
     </w:p>
     <w:p>
@@ -6265,7 +6265,7 @@
           <w:sz w:val="22"/>
           <w:szCs w:val="22"/>
         </w:rPr>
-        <w:t xml:space="preserve">Pipeline / piping from T.O.P to inlet of pumping unit</w:t>
+        <w:t>Pipeline</w:t>
       </w:r>
     </w:p>
     <w:p>

</xml_diff>

<commit_message>
fix: drop manual page break between Global Presence flag and About the Client
The explicit page break after the flag image was producing an apparent
blank page when the image triggered a natural break before it. Letting
the layout flow naturally avoids the double-break.

Co-Authored-By: Claude Opus 4.7 (1M context) <noreply@anthropic.com>
</commit_message>
<xml_diff>
--- a/Offer_Template.docx
+++ b/Offer_Template.docx
@@ -2180,11 +2180,6 @@
         </ns0:drawing>
       </ns0:r>
     </ns0:p>
-    <w:p>
-      <w:r>
-        <w:br w:type="page"/>
-      </w:r>
-    </w:p>
     <w:p>
       <w:pPr>
         <w:pStyle w:val="Heading1"/>

</xml_diff>

<commit_message>
fix: ENCON Burner section — new intro wording + 6 component bullets
Replaces 'For {{equipment_name}}, we will supply 1 No. of ENCON burner
of {{burner_kw}}.' with:

  'For preheating the system, we have provided 1 No. ENCON
   {Film/Dual/Gas} Burner with a firing rate of {{fuel_consumption}} to
   achieve the desired temperature at required time. The burner will
   consist of the following main components:'

…followed by a bulleted list (List Paragraph style, cloned from the
Annexure II exclusion bullets):
  - Burner alone
  - Ball valve
  - CI Burner mounting plate
  - Burner Block
  - Flexible Hoses Set
  - Butterfly Valve

Burner type (Film/Dual/Gas) and firing rate stay dynamic via Jinja.

Co-Authored-By: Claude Opus 4.7 (1M context) <noreply@anthropic.com>
</commit_message>
<xml_diff>
--- a/Offer_Template.docx
+++ b/Offer_Template.docx
@@ -4245,7 +4245,115 @@
         <w:rPr>
           <w:rFonts w:ascii="Calibri" w:cs="Calibri" w:eastAsia="Calibri" w:hAnsi="Calibri"/>
         </w:rPr>
-        <w:t>For {{equipment_name}}, we will supply 1 No. of ENCON burner of {{burner_kw}}.</w:t>
+        <w:t>For preheating the system, we have provided 1 No. ENCON {% if is_oil %}Film{% elif is_dual %}Dual{% else %}Gas{% endif %} Burner with a firing rate of {{ fuel_consumption }} to achieve the desired temperature at required time. The burner will consist of the following main components:</w:t>
+      </w:r>
+    </w:p>
+    <w:p>
+      <w:pPr>
+        <w:pStyle w:val="ListParagraph"/>
+        <w:numPr>
+          <w:ilvl w:val="0"/>
+          <w:numId w:val="2"/>
+        </w:numPr>
+        <w:spacing w:after="40" w:before="40" w:line="280"/>
+      </w:pPr>
+      <w:r>
+        <w:rPr>
+          <w:rFonts w:ascii="Calibri" w:cs="Calibri" w:eastAsia="Calibri" w:hAnsi="Calibri"/>
+          <w:sz w:val="22"/>
+          <w:szCs w:val="22"/>
+        </w:rPr>
+        <w:t xml:space="preserve">Burner alone</w:t>
+      </w:r>
+    </w:p>
+    <w:p>
+      <w:pPr>
+        <w:pStyle w:val="ListParagraph"/>
+        <w:numPr>
+          <w:ilvl w:val="0"/>
+          <w:numId w:val="2"/>
+        </w:numPr>
+        <w:spacing w:after="40" w:before="40" w:line="280"/>
+      </w:pPr>
+      <w:r>
+        <w:rPr>
+          <w:rFonts w:ascii="Calibri" w:cs="Calibri" w:eastAsia="Calibri" w:hAnsi="Calibri"/>
+          <w:sz w:val="22"/>
+          <w:szCs w:val="22"/>
+        </w:rPr>
+        <w:t xml:space="preserve">Ball valve</w:t>
+      </w:r>
+    </w:p>
+    <w:p>
+      <w:pPr>
+        <w:pStyle w:val="ListParagraph"/>
+        <w:numPr>
+          <w:ilvl w:val="0"/>
+          <w:numId w:val="2"/>
+        </w:numPr>
+        <w:spacing w:after="40" w:before="40" w:line="280"/>
+      </w:pPr>
+      <w:r>
+        <w:rPr>
+          <w:rFonts w:ascii="Calibri" w:cs="Calibri" w:eastAsia="Calibri" w:hAnsi="Calibri"/>
+          <w:sz w:val="22"/>
+          <w:szCs w:val="22"/>
+        </w:rPr>
+        <w:t xml:space="preserve">CI Burner mounting plate</w:t>
+      </w:r>
+    </w:p>
+    <w:p>
+      <w:pPr>
+        <w:pStyle w:val="ListParagraph"/>
+        <w:numPr>
+          <w:ilvl w:val="0"/>
+          <w:numId w:val="2"/>
+        </w:numPr>
+        <w:spacing w:after="40" w:before="40" w:line="280"/>
+      </w:pPr>
+      <w:r>
+        <w:rPr>
+          <w:rFonts w:ascii="Calibri" w:cs="Calibri" w:eastAsia="Calibri" w:hAnsi="Calibri"/>
+          <w:sz w:val="22"/>
+          <w:szCs w:val="22"/>
+        </w:rPr>
+        <w:t xml:space="preserve">Burner Block</w:t>
+      </w:r>
+    </w:p>
+    <w:p>
+      <w:pPr>
+        <w:pStyle w:val="ListParagraph"/>
+        <w:numPr>
+          <w:ilvl w:val="0"/>
+          <w:numId w:val="2"/>
+        </w:numPr>
+        <w:spacing w:after="40" w:before="40" w:line="280"/>
+      </w:pPr>
+      <w:r>
+        <w:rPr>
+          <w:rFonts w:ascii="Calibri" w:cs="Calibri" w:eastAsia="Calibri" w:hAnsi="Calibri"/>
+          <w:sz w:val="22"/>
+          <w:szCs w:val="22"/>
+        </w:rPr>
+        <w:t xml:space="preserve">Flexible Hoses Set</w:t>
+      </w:r>
+    </w:p>
+    <w:p>
+      <w:pPr>
+        <w:pStyle w:val="ListParagraph"/>
+        <w:numPr>
+          <w:ilvl w:val="0"/>
+          <w:numId w:val="2"/>
+        </w:numPr>
+        <w:spacing w:after="40" w:before="40" w:line="280"/>
+      </w:pPr>
+      <w:r>
+        <w:rPr>
+          <w:rFonts w:ascii="Calibri" w:cs="Calibri" w:eastAsia="Calibri" w:hAnsi="Calibri"/>
+          <w:sz w:val="22"/>
+          <w:szCs w:val="22"/>
+        </w:rPr>
+        <w:t xml:space="preserve">Butterfly Valve</w:t>
       </w:r>
     </w:p>
     <w:p>

</xml_diff>

<commit_message>
fix: drop 'Burner Control System' heading from offer template
The heading was redundant — the items below already roll up under the
ENCON Gas/Film/Dual Burner section.

Co-Authored-By: Claude Opus 4.7 (1M context) <noreply@anthropic.com>
</commit_message>
<xml_diff>
--- a/Offer_Template.docx
+++ b/Offer_Template.docx
@@ -4354,23 +4354,6 @@
           <w:szCs w:val="22"/>
         </w:rPr>
         <w:t xml:space="preserve">Butterfly Valve</w:t>
-      </w:r>
-    </w:p>
-    <w:p>
-      <w:pPr>
-        <w:pStyle w:val="Heading3"/>
-        <w:spacing w:after="80" w:before="200"/>
-      </w:pPr>
-      <w:r>
-        <w:rPr>
-          <w:rFonts w:ascii="Calibri" w:cs="Calibri" w:eastAsia="Calibri" w:hAnsi="Calibri"/>
-          <w:b/>
-          <w:bCs/>
-          <w:color w:val="1F2937"/>
-          <w:sz w:val="22"/>
-          <w:szCs w:val="22"/>
-        </w:rPr>
-        <w:t xml:space="preserve">Burner Control System</w:t>
       </w:r>
     </w:p>
     <w:p>

</xml_diff>

<commit_message>
fix: add Instrumentation & Control section before Temperature Control System
New section in the offer:
  Instrumentation & Control
    'The burner will be governed by the following scheme fitted on the
     main gas and air pipeline.'
    On the main air pipeline:
      - Orifice plate fitted with differential pressure transmitter
      - Pneumatic control valve
      - Pipeline and pipe fittings
    On the main {{ fuel1_line_label or 'gas' }} pipeline:
      - Orifice plate fitted with differential pressure transmitter
      - Pneumatic control valve
      - Pipeline and pipe fittings

The gas-line sub-heading is dynamic — picks up NG / LPG / COG / etc.
from the BOM media so it matches the actual fuel selection.

Co-Authored-By: Claude Opus 4.7 (1M context) <noreply@anthropic.com>
</commit_message>
<xml_diff>
--- a/Offer_Template.docx
+++ b/Offer_Template.docx
@@ -5108,6 +5108,169 @@
     </w:p>
     <w:p>
       <w:r/>
+    </w:p>
+    <w:p>
+      <w:pPr>
+        <w:pStyle w:val="Heading3"/>
+        <w:spacing w:after="80" w:before="200"/>
+      </w:pPr>
+      <w:r>
+        <w:rPr>
+          <w:rFonts w:ascii="Calibri" w:cs="Calibri" w:eastAsia="Calibri" w:hAnsi="Calibri"/>
+          <w:b/>
+          <w:bCs/>
+          <w:color w:val="1F2937"/>
+          <w:sz w:val="22"/>
+          <w:szCs w:val="22"/>
+        </w:rPr>
+        <w:t xml:space="preserve">Instrumentation &amp; Control</w:t>
+      </w:r>
+    </w:p>
+    <w:p>
+      <w:pPr>
+        <w:spacing w:after="60" w:before="60" w:line="300"/>
+        <w:jc w:val="left"/>
+      </w:pPr>
+      <w:r>
+        <w:rPr>
+          <w:rFonts w:ascii="Calibri" w:cs="Calibri" w:eastAsia="Calibri" w:hAnsi="Calibri"/>
+        </w:rPr>
+        <w:t xml:space="preserve">The burner will be governed by the following scheme fitted on the main gas and air pipeline.</w:t>
+      </w:r>
+    </w:p>
+    <w:p>
+      <w:pPr>
+        <w:spacing w:after="60" w:before="60" w:line="300"/>
+        <w:jc w:val="left"/>
+      </w:pPr>
+      <w:r>
+        <w:rPr>
+          <w:rFonts w:ascii="Calibri" w:cs="Calibri" w:eastAsia="Calibri" w:hAnsi="Calibri"/>
+          <w:b/>
+        </w:rPr>
+        <w:t xml:space="preserve">On the main air pipeline:</w:t>
+      </w:r>
+    </w:p>
+    <w:p>
+      <w:pPr>
+        <w:pStyle w:val="ListParagraph"/>
+        <w:numPr>
+          <w:ilvl w:val="0"/>
+          <w:numId w:val="2"/>
+        </w:numPr>
+        <w:spacing w:after="40" w:before="40" w:line="280"/>
+      </w:pPr>
+      <w:r>
+        <w:rPr>
+          <w:rFonts w:ascii="Calibri" w:cs="Calibri" w:eastAsia="Calibri" w:hAnsi="Calibri"/>
+          <w:sz w:val="22"/>
+          <w:szCs w:val="22"/>
+        </w:rPr>
+        <w:t xml:space="preserve">Orifice plate fitted with differential pressure transmitter</w:t>
+      </w:r>
+    </w:p>
+    <w:p>
+      <w:pPr>
+        <w:pStyle w:val="ListParagraph"/>
+        <w:numPr>
+          <w:ilvl w:val="0"/>
+          <w:numId w:val="2"/>
+        </w:numPr>
+        <w:spacing w:after="40" w:before="40" w:line="280"/>
+      </w:pPr>
+      <w:r>
+        <w:rPr>
+          <w:rFonts w:ascii="Calibri" w:cs="Calibri" w:eastAsia="Calibri" w:hAnsi="Calibri"/>
+          <w:sz w:val="22"/>
+          <w:szCs w:val="22"/>
+        </w:rPr>
+        <w:t xml:space="preserve">Pneumatic control valve</w:t>
+      </w:r>
+    </w:p>
+    <w:p>
+      <w:pPr>
+        <w:pStyle w:val="ListParagraph"/>
+        <w:numPr>
+          <w:ilvl w:val="0"/>
+          <w:numId w:val="2"/>
+        </w:numPr>
+        <w:spacing w:after="40" w:before="40" w:line="280"/>
+      </w:pPr>
+      <w:r>
+        <w:rPr>
+          <w:rFonts w:ascii="Calibri" w:cs="Calibri" w:eastAsia="Calibri" w:hAnsi="Calibri"/>
+          <w:sz w:val="22"/>
+          <w:szCs w:val="22"/>
+        </w:rPr>
+        <w:t xml:space="preserve">Pipeline and pipe fittings</w:t>
+      </w:r>
+    </w:p>
+    <w:p>
+      <w:pPr>
+        <w:spacing w:after="60" w:before="60" w:line="300"/>
+        <w:jc w:val="left"/>
+      </w:pPr>
+      <w:r>
+        <w:rPr>
+          <w:rFonts w:ascii="Calibri" w:cs="Calibri" w:eastAsia="Calibri" w:hAnsi="Calibri"/>
+          <w:b/>
+        </w:rPr>
+        <w:t xml:space="preserve">On the main {{ fuel1_line_label or "gas" }} pipeline:</w:t>
+      </w:r>
+    </w:p>
+    <w:p>
+      <w:pPr>
+        <w:pStyle w:val="ListParagraph"/>
+        <w:numPr>
+          <w:ilvl w:val="0"/>
+          <w:numId w:val="2"/>
+        </w:numPr>
+        <w:spacing w:after="40" w:before="40" w:line="280"/>
+      </w:pPr>
+      <w:r>
+        <w:rPr>
+          <w:rFonts w:ascii="Calibri" w:cs="Calibri" w:eastAsia="Calibri" w:hAnsi="Calibri"/>
+          <w:sz w:val="22"/>
+          <w:szCs w:val="22"/>
+        </w:rPr>
+        <w:t xml:space="preserve">Orifice plate fitted with differential pressure transmitter</w:t>
+      </w:r>
+    </w:p>
+    <w:p>
+      <w:pPr>
+        <w:pStyle w:val="ListParagraph"/>
+        <w:numPr>
+          <w:ilvl w:val="0"/>
+          <w:numId w:val="2"/>
+        </w:numPr>
+        <w:spacing w:after="40" w:before="40" w:line="280"/>
+      </w:pPr>
+      <w:r>
+        <w:rPr>
+          <w:rFonts w:ascii="Calibri" w:cs="Calibri" w:eastAsia="Calibri" w:hAnsi="Calibri"/>
+          <w:sz w:val="22"/>
+          <w:szCs w:val="22"/>
+        </w:rPr>
+        <w:t xml:space="preserve">Pneumatic control valve</w:t>
+      </w:r>
+    </w:p>
+    <w:p>
+      <w:pPr>
+        <w:pStyle w:val="ListParagraph"/>
+        <w:numPr>
+          <w:ilvl w:val="0"/>
+          <w:numId w:val="2"/>
+        </w:numPr>
+        <w:spacing w:after="40" w:before="40" w:line="280"/>
+      </w:pPr>
+      <w:r>
+        <w:rPr>
+          <w:rFonts w:ascii="Calibri" w:cs="Calibri" w:eastAsia="Calibri" w:hAnsi="Calibri"/>
+          <w:sz w:val="22"/>
+          <w:szCs w:val="22"/>
+        </w:rPr>
+        <w:t xml:space="preserve">Pipeline and pipe fittings</w:t>
+      </w:r>
     </w:p>
     <w:p>
       <w:pPr>

</xml_diff>

<commit_message>
fix: hardcode Temperature Control System content (4 bullets)
Replaces the dynamic temp_control_items for-loop with the agreed
hardcoded scope:
  Intro: 'To control and maintain the temperature of Ladle accurately,
   the thermocouple will be fitted in the Ladle Hood at suitable
   location. The scheme and sequence of burner operation is described
   as below:-'
  Sub-intro: 'Temperature control system will consist of the following
   main components:-'
  Bullets:
    - PLC Controller
    - Thermocouple
    - Pneumatic Control valve air line
    - Pneumatic Control valve gas line

Will be made dynamic per control type (PLC / PLC+AGR / PID) once the
spec for each mode lands.

Co-Authored-By: Claude Opus 4.7 (1M context) <noreply@anthropic.com>
</commit_message>
<xml_diff>
--- a/Offer_Template.docx
+++ b/Offer_Template.docx
@@ -5291,15 +5291,26 @@
     </w:p>
     <w:p>
       <w:pPr>
-        <w:pStyle w:val="ListParagraph"/>
-        <w:numPr>
-          <w:ilvl w:val="0"/>
-          <w:numId w:val="3"/>
-        </w:numPr>
-        <w:spacing w:after="40" w:before="40" w:line="280"/>
-      </w:pPr>
-      <w:r>
-        <w:t xml:space="preserve">{%p for x in temp_control_items %}</w:t>
+        <w:spacing w:after="60" w:before="60" w:line="300"/>
+        <w:jc w:val="left"/>
+      </w:pPr>
+      <w:r>
+        <w:rPr>
+          <w:rFonts w:ascii="Calibri" w:cs="Calibri" w:eastAsia="Calibri" w:hAnsi="Calibri"/>
+        </w:rPr>
+        <w:t xml:space="preserve">To control and maintain the temperature of Ladle accurately, the thermocouple will be fitted in the Ladle Hood at suitable location. The scheme and sequence of burner operation is described as below:-</w:t>
+      </w:r>
+    </w:p>
+    <w:p>
+      <w:pPr>
+        <w:spacing w:after="60" w:before="60" w:line="300"/>
+        <w:jc w:val="left"/>
+      </w:pPr>
+      <w:r>
+        <w:rPr>
+          <w:rFonts w:ascii="Calibri" w:cs="Calibri" w:eastAsia="Calibri" w:hAnsi="Calibri"/>
+        </w:rPr>
+        <w:t xml:space="preserve">Temperature control system will consist of the following main components:-</w:t>
       </w:r>
     </w:p>
     <w:p>
@@ -5312,7 +5323,12 @@
         <w:spacing w:after="40" w:before="40" w:line="280"/>
       </w:pPr>
       <w:r>
-        <w:t xml:space="preserve">{{ x.item }}</w:t>
+        <w:rPr>
+          <w:rFonts w:ascii="Calibri" w:cs="Calibri" w:eastAsia="Calibri" w:hAnsi="Calibri"/>
+          <w:sz w:val="22"/>
+          <w:szCs w:val="22"/>
+        </w:rPr>
+        <w:t xml:space="preserve">PLC Controller</w:t>
       </w:r>
     </w:p>
     <w:p>
@@ -5320,25 +5336,17 @@
         <w:pStyle w:val="ListParagraph"/>
         <w:numPr>
           <w:ilvl w:val="0"/>
-          <w:numId w:val="3"/>
+          <w:numId w:val="2"/>
         </w:numPr>
         <w:spacing w:after="40" w:before="40" w:line="280"/>
       </w:pPr>
       <w:r>
-        <w:t xml:space="preserve">{%p for s in x.sub_items %}</w:t>
-      </w:r>
-    </w:p>
-    <w:p>
-      <w:pPr>
-        <w:pStyle w:val="ListParagraph"/>
-        <w:numPr>
-          <w:ilvl w:val="1"/>
-          <w:numId w:val="3"/>
-        </w:numPr>
-        <w:spacing w:after="40" w:before="40" w:line="280"/>
-      </w:pPr>
-      <w:r>
-        <w:t xml:space="preserve">{{ s.item }}</w:t>
+        <w:rPr>
+          <w:rFonts w:ascii="Calibri" w:cs="Calibri" w:eastAsia="Calibri" w:hAnsi="Calibri"/>
+          <w:sz w:val="22"/>
+          <w:szCs w:val="22"/>
+        </w:rPr>
+        <w:t xml:space="preserve">Thermocouple</w:t>
       </w:r>
     </w:p>
     <w:p>
@@ -5346,12 +5354,17 @@
         <w:pStyle w:val="ListParagraph"/>
         <w:numPr>
           <w:ilvl w:val="0"/>
-          <w:numId w:val="3"/>
+          <w:numId w:val="2"/>
         </w:numPr>
         <w:spacing w:after="40" w:before="40" w:line="280"/>
       </w:pPr>
       <w:r>
-        <w:t xml:space="preserve">{%p endfor %}</w:t>
+        <w:rPr>
+          <w:rFonts w:ascii="Calibri" w:cs="Calibri" w:eastAsia="Calibri" w:hAnsi="Calibri"/>
+          <w:sz w:val="22"/>
+          <w:szCs w:val="22"/>
+        </w:rPr>
+        <w:t xml:space="preserve">Pneumatic Control valve air line</w:t>
       </w:r>
     </w:p>
     <w:p>
@@ -5359,12 +5372,17 @@
         <w:pStyle w:val="ListParagraph"/>
         <w:numPr>
           <w:ilvl w:val="0"/>
-          <w:numId w:val="3"/>
+          <w:numId w:val="2"/>
         </w:numPr>
         <w:spacing w:after="40" w:before="40" w:line="280"/>
       </w:pPr>
       <w:r>
-        <w:t xml:space="preserve">{%p endfor %}</w:t>
+        <w:rPr>
+          <w:rFonts w:ascii="Calibri" w:cs="Calibri" w:eastAsia="Calibri" w:hAnsi="Calibri"/>
+          <w:sz w:val="22"/>
+          <w:szCs w:val="22"/>
+        </w:rPr>
+        <w:t xml:space="preserve">Pneumatic Control valve gas line</w:t>
       </w:r>
     </w:p>
     <w:p>

</xml_diff>

<commit_message>
fix: cover letter shows company address before Contact No.
Inserts a new {{company_address}} line between 'Kind Attn:' and
'Contact No.:' in the cover-letter section. The variable already pulls
from the joined address (street + city + state + pin) typed in Step 1.

Co-Authored-By: Claude Opus 4.7 (1M context) <noreply@anthropic.com>
</commit_message>
<xml_diff>
--- a/Offer_Template.docx
+++ b/Offer_Template.docx
@@ -504,6 +504,18 @@
           <w:rFonts w:ascii="Calibri" w:cs="Calibri" w:eastAsia="Calibri" w:hAnsi="Calibri"/>
         </w:rPr>
         <w:t>Kind Attn: {{poc_name}} ({{poc_designation}})</w:t>
+      </w:r>
+    </w:p>
+    <w:p>
+      <w:pPr>
+        <w:spacing w:after="60" w:before="0" w:line="300"/>
+        <w:jc w:val="left"/>
+      </w:pPr>
+      <w:r>
+        <w:rPr>
+          <w:rFonts w:ascii="Calibri" w:cs="Calibri" w:eastAsia="Calibri" w:hAnsi="Calibri"/>
+        </w:rPr>
+        <w:t xml:space="preserve">{{company_address}}</w:t>
       </w:r>
     </w:p>
     <w:p>

</xml_diff>

<commit_message>
fix: page numbers render on every page of the offer
Sections 0 and 1 had empty footers; only section 2 carried the PAGE
field. Cloned section 2's footer paragraphs into sections 0 and 1 and
detached is_linked_to_previous so every page in the document shows the
page number.

Co-Authored-By: Claude Opus 4.7 (1M context) <noreply@anthropic.com>
</commit_message>
<xml_diff>
--- a/Offer_Template.docx
+++ b/Offer_Template.docx
@@ -2138,6 +2138,7 @@
           <ns0:szCs ns0:val="20"/>
         </ns0:rPr>
         <ns0:sectPr ns0:rsidR="009C3D95">
+          <ns0:footerReference ns0:type="default" ns6:id="rId12"/>
           <ns0:pgSz ns0:w="11920" ns0:h="16850"/>
           <ns0:pgMar ns0:top="1340" ns0:right="340" ns0:bottom="1540" ns0:left="440" ns0:header="0" ns0:footer="1341" ns0:gutter="0"/>
           <ns0:cols ns0:space="720"/>
@@ -16671,8 +16672,87 @@
 <file path=word/footer1.xml><?xml version="1.0" encoding="utf-8"?>
 <w:ftr xmlns:wpc="http://schemas.microsoft.com/office/word/2010/wordprocessingCanvas" xmlns:mc="http://schemas.openxmlformats.org/markup-compatibility/2006" xmlns:o="urn:schemas-microsoft-com:office:office" xmlns:r="http://schemas.openxmlformats.org/officeDocument/2006/relationships" xmlns:m="http://schemas.openxmlformats.org/officeDocument/2006/math" xmlns:v="urn:schemas-microsoft-com:vml" xmlns:wp14="http://schemas.microsoft.com/office/word/2010/wordprocessingDrawing" xmlns:wp="http://schemas.openxmlformats.org/drawingml/2006/wordprocessingDrawing" xmlns:w10="urn:schemas-microsoft-com:office:word" xmlns:w="http://schemas.openxmlformats.org/wordprocessingml/2006/main" xmlns:w14="http://schemas.microsoft.com/office/word/2010/wordml" xmlns:w15="http://schemas.microsoft.com/office/word/2012/wordml" xmlns:wpg="http://schemas.microsoft.com/office/word/2010/wordprocessingGroup" xmlns:wpi="http://schemas.microsoft.com/office/word/2010/wordprocessingInk" xmlns:wne="http://schemas.microsoft.com/office/word/2006/wordml" xmlns:wps="http://schemas.microsoft.com/office/word/2010/wordprocessingShape">
   <w:p>
+    <w:pPr>
+      <w:pBdr>
+        <w:top w:val="single" w:color="E87722" w:sz="6" w:space="6"/>
+      </w:pBdr>
+      <w:spacing w:after="0" w:before="60"/>
+      <w:jc w:val="center"/>
+    </w:pPr>
     <w:r>
-      <w:t xml:space="preserve"/>
+      <w:rPr>
+        <w:rFonts w:ascii="Calibri" w:cs="Calibri" w:eastAsia="Calibri" w:hAnsi="Calibri"/>
+        <w:color w:val="6B7280"/>
+        <w:sz w:val="16"/>
+        <w:szCs w:val="16"/>
+      </w:rPr>
+      <w:t xml:space="preserve">297, Sector‑21B Faridabad – 121 001 (Haryana) India  •  Tel: +91 (129) 4047847, 2439458  •  </w:t>
+    </w:r>
+    <w:r>
+      <w:rPr>
+        <w:rFonts w:ascii="Calibri" w:cs="Calibri" w:eastAsia="Calibri" w:hAnsi="Calibri"/>
+        <w:color w:val="6B7280"/>
+        <w:sz w:val="16"/>
+        <w:szCs w:val="16"/>
+      </w:rPr>
+      <w:t xml:space="preserve">sales@encon.co.in</w:t>
+    </w:r>
+    <w:r>
+      <w:rPr>
+        <w:rFonts w:ascii="Calibri" w:cs="Calibri" w:eastAsia="Calibri" w:hAnsi="Calibri"/>
+        <w:color w:val="6B7280"/>
+        <w:sz w:val="16"/>
+        <w:szCs w:val="16"/>
+      </w:rPr>
+      <w:t xml:space="preserve">  •  www.encon.co.in</w:t>
+    </w:r>
+  </w:p>
+  <w:p>
+    <w:pPr>
+      <w:spacing w:after="0" w:before="40"/>
+      <w:jc w:val="right"/>
+    </w:pPr>
+    <w:r>
+      <w:rPr>
+        <w:rFonts w:ascii="Calibri" w:cs="Calibri" w:eastAsia="Calibri" w:hAnsi="Calibri"/>
+        <w:color w:val="6B7280"/>
+        <w:sz w:val="16"/>
+        <w:szCs w:val="16"/>
+      </w:rPr>
+      <w:t xml:space="preserve">Page </w:t>
+    </w:r>
+    <w:r>
+      <w:rPr>
+        <w:rFonts w:ascii="Calibri" w:cs="Calibri" w:eastAsia="Calibri" w:hAnsi="Calibri"/>
+        <w:color w:val="6B7280"/>
+        <w:sz w:val="16"/>
+        <w:szCs w:val="16"/>
+      </w:rPr>
+      <w:fldChar w:fldCharType="begin"/>
+      <w:instrText xml:space="preserve">PAGE</w:instrText>
+      <w:fldChar w:fldCharType="separate"/>
+      <w:fldChar w:fldCharType="end"/>
+    </w:r>
+    <w:r>
+      <w:rPr>
+        <w:rFonts w:ascii="Calibri" w:cs="Calibri" w:eastAsia="Calibri" w:hAnsi="Calibri"/>
+        <w:color w:val="6B7280"/>
+        <w:sz w:val="16"/>
+        <w:szCs w:val="16"/>
+      </w:rPr>
+      <w:t xml:space="preserve"> of </w:t>
+    </w:r>
+    <w:r>
+      <w:rPr>
+        <w:rFonts w:ascii="Calibri" w:cs="Calibri" w:eastAsia="Calibri" w:hAnsi="Calibri"/>
+        <w:color w:val="6B7280"/>
+        <w:sz w:val="16"/>
+        <w:szCs w:val="16"/>
+      </w:rPr>
+      <w:fldChar w:fldCharType="begin"/>
+      <w:instrText xml:space="preserve">NUMPAGES</w:instrText>
+      <w:fldChar w:fldCharType="separate"/>
+      <w:fldChar w:fldCharType="end"/>
     </w:r>
   </w:p>
 </w:ftr>
@@ -16680,6 +16760,95 @@
 
 <file path=word/footer2.xml><?xml version="1.0" encoding="utf-8"?>
 <w:ftr xmlns:wpc="http://schemas.microsoft.com/office/word/2010/wordprocessingCanvas" xmlns:mc="http://schemas.openxmlformats.org/markup-compatibility/2006" xmlns:o="urn:schemas-microsoft-com:office:office" xmlns:r="http://schemas.openxmlformats.org/officeDocument/2006/relationships" xmlns:m="http://schemas.openxmlformats.org/officeDocument/2006/math" xmlns:v="urn:schemas-microsoft-com:vml" xmlns:wp14="http://schemas.microsoft.com/office/word/2010/wordprocessingDrawing" xmlns:wp="http://schemas.openxmlformats.org/drawingml/2006/wordprocessingDrawing" xmlns:w10="urn:schemas-microsoft-com:office:word" xmlns:w="http://schemas.openxmlformats.org/wordprocessingml/2006/main" xmlns:w14="http://schemas.microsoft.com/office/word/2010/wordml" xmlns:w15="http://schemas.microsoft.com/office/word/2012/wordml" xmlns:wpg="http://schemas.microsoft.com/office/word/2010/wordprocessingGroup" xmlns:wpi="http://schemas.microsoft.com/office/word/2010/wordprocessingInk" xmlns:wne="http://schemas.microsoft.com/office/word/2006/wordml" xmlns:wps="http://schemas.microsoft.com/office/word/2010/wordprocessingShape">
+  <w:p>
+    <w:pPr>
+      <w:pBdr>
+        <w:top w:val="single" w:color="E87722" w:sz="6" w:space="6"/>
+      </w:pBdr>
+      <w:spacing w:after="0" w:before="60"/>
+      <w:jc w:val="center"/>
+    </w:pPr>
+    <w:r>
+      <w:rPr>
+        <w:rFonts w:ascii="Calibri" w:cs="Calibri" w:eastAsia="Calibri" w:hAnsi="Calibri"/>
+        <w:color w:val="6B7280"/>
+        <w:sz w:val="16"/>
+        <w:szCs w:val="16"/>
+      </w:rPr>
+      <w:t xml:space="preserve">297, Sector‑21B Faridabad – 121 001 (Haryana) India  •  Tel: +91 (129) 4047847, 2439458  •  </w:t>
+    </w:r>
+    <w:r>
+      <w:rPr>
+        <w:rFonts w:ascii="Calibri" w:cs="Calibri" w:eastAsia="Calibri" w:hAnsi="Calibri"/>
+        <w:color w:val="6B7280"/>
+        <w:sz w:val="16"/>
+        <w:szCs w:val="16"/>
+      </w:rPr>
+      <w:t xml:space="preserve">sales@encon.co.in</w:t>
+    </w:r>
+    <w:r>
+      <w:rPr>
+        <w:rFonts w:ascii="Calibri" w:cs="Calibri" w:eastAsia="Calibri" w:hAnsi="Calibri"/>
+        <w:color w:val="6B7280"/>
+        <w:sz w:val="16"/>
+        <w:szCs w:val="16"/>
+      </w:rPr>
+      <w:t xml:space="preserve">  •  www.encon.co.in</w:t>
+    </w:r>
+  </w:p>
+  <w:p>
+    <w:pPr>
+      <w:spacing w:after="0" w:before="40"/>
+      <w:jc w:val="right"/>
+    </w:pPr>
+    <w:r>
+      <w:rPr>
+        <w:rFonts w:ascii="Calibri" w:cs="Calibri" w:eastAsia="Calibri" w:hAnsi="Calibri"/>
+        <w:color w:val="6B7280"/>
+        <w:sz w:val="16"/>
+        <w:szCs w:val="16"/>
+      </w:rPr>
+      <w:t xml:space="preserve">Page </w:t>
+    </w:r>
+    <w:r>
+      <w:rPr>
+        <w:rFonts w:ascii="Calibri" w:cs="Calibri" w:eastAsia="Calibri" w:hAnsi="Calibri"/>
+        <w:color w:val="6B7280"/>
+        <w:sz w:val="16"/>
+        <w:szCs w:val="16"/>
+      </w:rPr>
+      <w:fldChar w:fldCharType="begin"/>
+      <w:instrText xml:space="preserve">PAGE</w:instrText>
+      <w:fldChar w:fldCharType="separate"/>
+      <w:fldChar w:fldCharType="end"/>
+    </w:r>
+    <w:r>
+      <w:rPr>
+        <w:rFonts w:ascii="Calibri" w:cs="Calibri" w:eastAsia="Calibri" w:hAnsi="Calibri"/>
+        <w:color w:val="6B7280"/>
+        <w:sz w:val="16"/>
+        <w:szCs w:val="16"/>
+      </w:rPr>
+      <w:t xml:space="preserve"> of </w:t>
+    </w:r>
+    <w:r>
+      <w:rPr>
+        <w:rFonts w:ascii="Calibri" w:cs="Calibri" w:eastAsia="Calibri" w:hAnsi="Calibri"/>
+        <w:color w:val="6B7280"/>
+        <w:sz w:val="16"/>
+        <w:szCs w:val="16"/>
+      </w:rPr>
+      <w:fldChar w:fldCharType="begin"/>
+      <w:instrText xml:space="preserve">NUMPAGES</w:instrText>
+      <w:fldChar w:fldCharType="separate"/>
+      <w:fldChar w:fldCharType="end"/>
+    </w:r>
+  </w:p>
+</w:ftr>
+</file>
+
+<file path=word/footer3.xml><?xml version="1.0" encoding="utf-8"?>
+<w:ftr xmlns:m="http://schemas.openxmlformats.org/officeDocument/2006/math" xmlns:mc="http://schemas.openxmlformats.org/markup-compatibility/2006" xmlns:mo="http://schemas.microsoft.com/office/mac/office/2008/main" xmlns:mv="urn:schemas-microsoft-com:mac:vml" xmlns:o="urn:schemas-microsoft-com:office:office" xmlns:r="http://schemas.openxmlformats.org/officeDocument/2006/relationships" xmlns:v="urn:schemas-microsoft-com:vml" xmlns:w10="urn:schemas-microsoft-com:office:word" xmlns:w14="http://schemas.microsoft.com/office/word/2010/wordml" xmlns:w="http://schemas.openxmlformats.org/wordprocessingml/2006/main" xmlns:wne="http://schemas.microsoft.com/office/word/2006/wordml" xmlns:wp14="http://schemas.microsoft.com/office/word/2010/wordprocessingDrawing" xmlns:wp="http://schemas.openxmlformats.org/drawingml/2006/wordprocessingDrawing" xmlns:wpc="http://schemas.microsoft.com/office/word/2010/wordprocessingCanvas" xmlns:wpg="http://schemas.microsoft.com/office/word/2010/wordprocessingGroup" xmlns:wpi="http://schemas.microsoft.com/office/word/2010/wordprocessingInk" xmlns:wps="http://schemas.microsoft.com/office/word/2010/wordprocessingShape" mc:Ignorable="w14 wp14">
   <w:p>
     <w:pPr>
       <w:pBdr>

</xml_diff>

<commit_message>
fix: page 1 shows page number; enlarge ENCON logo by ~35%
1. Section 0 had different_first_page_header_footer = True, which
   meant page 1 used an empty first-page footer instead of the default
   one carrying the PAGE field. Disabled that flag so every page
   inherits the default footer with the page number.

2. ENCON header logo was 2.12 cm x 1.69 cm. Scaled by 1.35x to about
   2.86 cm x 2.28 cm so it reads more clearly on each page.

Co-Authored-By: Claude Opus 4.7 (1M context) <noreply@anthropic.com>
</commit_message>
<xml_diff>
--- a/Offer_Template.docx
+++ b/Offer_Template.docx
@@ -438,10 +438,10 @@
         <w:sectPr>
           <w:headerReference w:type="default" r:id="rId7"/>
           <w:footerReference w:type="default" r:id="rId8"/>
+          <w:headerReference w:type="first" r:id="rId13"/>
           <w:pgSz w:w="12240" w:h="15840" w:orient="portrait"/>
           <w:pgMar w:top="1080" w:right="1080" w:bottom="1080" w:left="1080" w:header="708" w:footer="708" w:gutter="0"/>
           <w:pgNumType/>
-          <w:titlePg/>
           <w:docGrid w:linePitch="360"/>
         </w:sectPr>
       </w:pPr>
@@ -17020,7 +17020,7 @@
           <w:r>
             <w:drawing>
               <wp:inline distT="0" distB="0" distL="0" distR="0">
-                <wp:extent cx="762000" cy="609600"/>
+                <wp:extent cx="1028700" cy="822960"/>
                 <wp:effectExtent t="0" r="0" b="0" l="0"/>
                 <wp:docPr id="1" name="ENCON" descr="ENCON logo" title="ENCON"/>
                 <wp:cNvGraphicFramePr>
@@ -17045,7 +17045,7 @@
                       <pic:spPr bwMode="auto">
                         <a:xfrm>
                           <a:off x="0" y="0"/>
-                          <a:ext cx="762000" cy="609600"/>
+                          <a:ext cx="1028700" cy="822960"/>
                         </a:xfrm>
                         <a:prstGeom prst="rect">
                           <a:avLst/>
@@ -17088,6 +17088,16 @@
       </w:tc>
     </w:tr>
   </w:tbl>
+</w:hdr>
+</file>
+
+<file path=word/header3.xml><?xml version="1.0" encoding="utf-8"?>
+<w:hdr xmlns:m="http://schemas.openxmlformats.org/officeDocument/2006/math" xmlns:mc="http://schemas.openxmlformats.org/markup-compatibility/2006" xmlns:mo="http://schemas.microsoft.com/office/mac/office/2008/main" xmlns:mv="urn:schemas-microsoft-com:mac:vml" xmlns:o="urn:schemas-microsoft-com:office:office" xmlns:r="http://schemas.openxmlformats.org/officeDocument/2006/relationships" xmlns:v="urn:schemas-microsoft-com:vml" xmlns:w10="urn:schemas-microsoft-com:office:word" xmlns:w14="http://schemas.microsoft.com/office/word/2010/wordml" xmlns:w="http://schemas.openxmlformats.org/wordprocessingml/2006/main" xmlns:wne="http://schemas.microsoft.com/office/word/2006/wordml" xmlns:wp14="http://schemas.microsoft.com/office/word/2010/wordprocessingDrawing" xmlns:wp="http://schemas.openxmlformats.org/drawingml/2006/wordprocessingDrawing" xmlns:wpc="http://schemas.microsoft.com/office/word/2010/wordprocessingCanvas" xmlns:wpg="http://schemas.microsoft.com/office/word/2010/wordprocessingGroup" xmlns:wpi="http://schemas.microsoft.com/office/word/2010/wordprocessingInk" xmlns:wps="http://schemas.microsoft.com/office/word/2010/wordprocessingShape" mc:Ignorable="w14 wp14">
+  <w:p>
+    <w:pPr>
+      <w:pStyle w:val="Header"/>
+    </w:pPr>
+  </w:p>
 </w:hdr>
 </file>
 

</xml_diff>

<commit_message>
fix: Annexure III splits supervision charges into 5 specific rows
Replaces the single merged 'Supervision Charges...' cell (which jammed
all rates and incidentals into one block) with five distinct line items:

  2. Supervision Charges - Mechanical (per day, per person)
       Unit Price -> {{ supervision_mech }}
  3. Supervision Charges - PLC and Instrumentation (per day, per person)
       Unit Price -> {{ supervision_plc }}
  4. To-and-fro fare from Delhi to site               (At actuals)
  5. Boarding, lodging, and local conveyance at site  (At actuals)
  6. Medical assistance, if required                  (At actuals)

The Mechanical / PLC unit prices reuse the existing supervision_mech /
supervision_plc template variables so they stay live from the master
rates table.

Co-Authored-By: Claude Opus 4.7 (1M context) <noreply@anthropic.com>
</commit_message>
<xml_diff>
--- a/Offer_Template.docx
+++ b/Offer_Template.docx
@@ -7027,7 +7027,7 @@
               <w:bottom w:type="dxa" w:w="100"/>
               <w:right w:type="dxa" w:w="140"/>
             </w:tcMar>
-            <w:vAlign w:val="top"/>
+            <w:vAlign w:val="center"/>
           </w:tcPr>
           <w:p>
             <w:pPr>
@@ -7049,27 +7049,108 @@
         <w:tc>
           <w:tcPr>
             <w:tcW w:type="dxa" w:w="4080"/>
-            <w:gridSpan w:val="4"/>
-            <w:tcBorders>
-              <w:top w:val="single" w:color="BFBFBF" w:sz="4"/>
-              <w:left w:val="single" w:color="BFBFBF" w:sz="4"/>
-              <w:bottom w:val="single" w:color="BFBFBF" w:sz="4"/>
-              <w:right w:val="single" w:color="BFBFBF" w:sz="4"/>
-            </w:tcBorders>
-            <w:tcMar>
-              <w:top w:type="dxa" w:w="100"/>
-              <w:left w:type="dxa" w:w="140"/>
-              <w:bottom w:type="dxa" w:w="100"/>
-              <w:right w:type="dxa" w:w="140"/>
-            </w:tcMar>
-            <w:vAlign w:val="top"/>
-          </w:tcPr>
-          <w:p>
-            <w:pPr>
-              <w:spacing w:after="60" w:before="40"/>
-            </w:pPr>
-            <w:r>
-              <w:t>Supervision Charges for Erection and Commissioning. Erection by client; supervision by ENCON. Per-day rates: INR {{supervision_mech}} (Mechanical), INR {{supervision_plc}} (PLC and Instrumentation). To-and-fro fare from Delhi to site, plus boarding, lodging, local conveyance, and medical assistance if required.</w:t>
+            <w:tcBorders>
+              <w:top w:val="single" w:color="BFBFBF" w:sz="4"/>
+              <w:left w:val="single" w:color="BFBFBF" w:sz="4"/>
+              <w:bottom w:val="single" w:color="BFBFBF" w:sz="4"/>
+              <w:right w:val="single" w:color="BFBFBF" w:sz="4"/>
+            </w:tcBorders>
+            <w:tcMar>
+              <w:top w:type="dxa" w:w="100"/>
+              <w:left w:type="dxa" w:w="140"/>
+              <w:bottom w:type="dxa" w:w="100"/>
+              <w:right w:type="dxa" w:w="140"/>
+            </w:tcMar>
+            <w:vAlign w:val="center"/>
+          </w:tcPr>
+          <w:p>
+            <w:pPr>
+              <w:spacing w:after="40" w:before="40"/>
+              <w:jc w:val="left"/>
+            </w:pPr>
+            <w:r>
+              <w:t xml:space="preserve">Supervision Charges - Mechanical (per day, per person)</w:t>
+            </w:r>
+          </w:p>
+        </w:tc>
+        <w:tc>
+          <w:tcPr>
+            <w:tcW w:type="dxa" w:w="1100"/>
+            <w:tcBorders>
+              <w:top w:val="single" w:color="BFBFBF" w:sz="4"/>
+              <w:left w:val="single" w:color="BFBFBF" w:sz="4"/>
+              <w:bottom w:val="single" w:color="BFBFBF" w:sz="4"/>
+              <w:right w:val="single" w:color="BFBFBF" w:sz="4"/>
+            </w:tcBorders>
+            <w:tcMar>
+              <w:top w:type="dxa" w:w="100"/>
+              <w:left w:type="dxa" w:w="140"/>
+              <w:bottom w:type="dxa" w:w="100"/>
+              <w:right w:type="dxa" w:w="140"/>
+            </w:tcMar>
+            <w:vAlign w:val="center"/>
+          </w:tcPr>
+          <w:p>
+            <w:pPr>
+              <w:spacing w:after="40" w:before="40"/>
+              <w:jc w:val="center"/>
+            </w:pPr>
+            <w:r>
+              <w:t xml:space="preserve">As required</w:t>
+            </w:r>
+          </w:p>
+        </w:tc>
+        <w:tc>
+          <w:tcPr>
+            <w:tcW w:type="dxa" w:w="1700"/>
+            <w:tcBorders>
+              <w:top w:val="single" w:color="BFBFBF" w:sz="4"/>
+              <w:left w:val="single" w:color="BFBFBF" w:sz="4"/>
+              <w:bottom w:val="single" w:color="BFBFBF" w:sz="4"/>
+              <w:right w:val="single" w:color="BFBFBF" w:sz="4"/>
+            </w:tcBorders>
+            <w:tcMar>
+              <w:top w:type="dxa" w:w="100"/>
+              <w:left w:type="dxa" w:w="140"/>
+              <w:bottom w:type="dxa" w:w="100"/>
+              <w:right w:type="dxa" w:w="140"/>
+            </w:tcMar>
+            <w:vAlign w:val="center"/>
+          </w:tcPr>
+          <w:p>
+            <w:pPr>
+              <w:spacing w:after="40" w:before="40"/>
+              <w:jc w:val="right"/>
+            </w:pPr>
+            <w:r>
+              <w:t xml:space="preserve">{{ supervision_mech }}</w:t>
+            </w:r>
+          </w:p>
+        </w:tc>
+        <w:tc>
+          <w:tcPr>
+            <w:tcW w:type="dxa" w:w="1700"/>
+            <w:tcBorders>
+              <w:top w:val="single" w:color="BFBFBF" w:sz="4"/>
+              <w:left w:val="single" w:color="BFBFBF" w:sz="4"/>
+              <w:bottom w:val="single" w:color="BFBFBF" w:sz="4"/>
+              <w:right w:val="single" w:color="BFBFBF" w:sz="4"/>
+            </w:tcBorders>
+            <w:tcMar>
+              <w:top w:type="dxa" w:w="100"/>
+              <w:left w:type="dxa" w:w="140"/>
+              <w:bottom w:type="dxa" w:w="100"/>
+              <w:right w:type="dxa" w:w="140"/>
+            </w:tcMar>
+            <w:vAlign w:val="center"/>
+          </w:tcPr>
+          <w:p>
+            <w:pPr>
+              <w:spacing w:after="40" w:before="40"/>
+              <w:jc w:val="right"/>
+            </w:pPr>
+            <w:r>
+              <w:t xml:space="preserve">As applicable</w:t>
             </w:r>
           </w:p>
         </w:tc>
@@ -7077,15 +7158,101 @@
       <w:tr>
         <w:tc>
           <w:tcPr>
-            <w:tcW w:type="dxa" w:w="7660"/>
-            <w:gridSpan w:val="4"/>
-            <w:tcBorders>
-              <w:top w:val="single" w:color="BFBFBF" w:sz="4"/>
-              <w:left w:val="single" w:color="BFBFBF" w:sz="4"/>
-              <w:bottom w:val="single" w:color="BFBFBF" w:sz="4"/>
-              <w:right w:val="single" w:color="BFBFBF" w:sz="4"/>
-            </w:tcBorders>
-            <w:shd w:fill="DCE6F1" w:val="clear"/>
+            <w:tcW w:type="dxa" w:w="780"/>
+            <w:tcBorders>
+              <w:top w:val="single" w:color="BFBFBF" w:sz="4"/>
+              <w:left w:val="single" w:color="BFBFBF" w:sz="4"/>
+              <w:bottom w:val="single" w:color="BFBFBF" w:sz="4"/>
+              <w:right w:val="single" w:color="BFBFBF" w:sz="4"/>
+            </w:tcBorders>
+            <w:tcMar>
+              <w:top w:type="dxa" w:w="100"/>
+              <w:left w:type="dxa" w:w="140"/>
+              <w:bottom w:type="dxa" w:w="100"/>
+              <w:right w:type="dxa" w:w="140"/>
+            </w:tcMar>
+            <w:vAlign w:val="center"/>
+          </w:tcPr>
+          <w:p>
+            <w:pPr>
+              <w:spacing w:after="40" w:before="40"/>
+              <w:jc w:val="center"/>
+            </w:pPr>
+            <w:r>
+              <w:rPr>
+                <w:rFonts w:ascii="Calibri" w:cs="Calibri" w:eastAsia="Calibri" w:hAnsi="Calibri"/>
+                <w:b/>
+                <w:bCs/>
+                <w:sz w:val="22"/>
+                <w:szCs w:val="22"/>
+              </w:rPr>
+              <w:t xml:space="preserve">3</w:t>
+            </w:r>
+          </w:p>
+        </w:tc>
+        <w:tc>
+          <w:tcPr>
+            <w:tcW w:type="dxa" w:w="4080"/>
+            <w:tcBorders>
+              <w:top w:val="single" w:color="BFBFBF" w:sz="4"/>
+              <w:left w:val="single" w:color="BFBFBF" w:sz="4"/>
+              <w:bottom w:val="single" w:color="BFBFBF" w:sz="4"/>
+              <w:right w:val="single" w:color="BFBFBF" w:sz="4"/>
+            </w:tcBorders>
+            <w:tcMar>
+              <w:top w:type="dxa" w:w="100"/>
+              <w:left w:type="dxa" w:w="140"/>
+              <w:bottom w:type="dxa" w:w="100"/>
+              <w:right w:type="dxa" w:w="140"/>
+            </w:tcMar>
+            <w:vAlign w:val="center"/>
+          </w:tcPr>
+          <w:p>
+            <w:pPr>
+              <w:spacing w:after="40" w:before="40"/>
+              <w:jc w:val="left"/>
+            </w:pPr>
+            <w:r>
+              <w:t xml:space="preserve">Supervision Charges - PLC and Instrumentation (per day, per person)</w:t>
+            </w:r>
+          </w:p>
+        </w:tc>
+        <w:tc>
+          <w:tcPr>
+            <w:tcW w:type="dxa" w:w="1100"/>
+            <w:tcBorders>
+              <w:top w:val="single" w:color="BFBFBF" w:sz="4"/>
+              <w:left w:val="single" w:color="BFBFBF" w:sz="4"/>
+              <w:bottom w:val="single" w:color="BFBFBF" w:sz="4"/>
+              <w:right w:val="single" w:color="BFBFBF" w:sz="4"/>
+            </w:tcBorders>
+            <w:tcMar>
+              <w:top w:type="dxa" w:w="100"/>
+              <w:left w:type="dxa" w:w="140"/>
+              <w:bottom w:type="dxa" w:w="100"/>
+              <w:right w:type="dxa" w:w="140"/>
+            </w:tcMar>
+            <w:vAlign w:val="center"/>
+          </w:tcPr>
+          <w:p>
+            <w:pPr>
+              <w:spacing w:after="40" w:before="40"/>
+              <w:jc w:val="center"/>
+            </w:pPr>
+            <w:r>
+              <w:t xml:space="preserve">As required</w:t>
+            </w:r>
+          </w:p>
+        </w:tc>
+        <w:tc>
+          <w:tcPr>
+            <w:tcW w:type="dxa" w:w="1700"/>
+            <w:tcBorders>
+              <w:top w:val="single" w:color="BFBFBF" w:sz="4"/>
+              <w:left w:val="single" w:color="BFBFBF" w:sz="4"/>
+              <w:bottom w:val="single" w:color="BFBFBF" w:sz="4"/>
+              <w:right w:val="single" w:color="BFBFBF" w:sz="4"/>
+            </w:tcBorders>
             <w:tcMar>
               <w:top w:type="dxa" w:w="100"/>
               <w:left w:type="dxa" w:w="140"/>
@@ -7099,7 +7266,9 @@
               <w:spacing w:after="40" w:before="40"/>
               <w:jc w:val="right"/>
             </w:pPr>
-            <w:r/>
+            <w:r>
+              <w:t xml:space="preserve">{{ supervision_plc }}</w:t>
+            </w:r>
           </w:p>
         </w:tc>
         <w:tc>
@@ -7111,7 +7280,6 @@
               <w:bottom w:val="single" w:color="BFBFBF" w:sz="4"/>
               <w:right w:val="single" w:color="BFBFBF" w:sz="4"/>
             </w:tcBorders>
-            <w:shd w:fill="DCE6F1" w:val="clear"/>
             <w:tcMar>
               <w:top w:type="dxa" w:w="100"/>
               <w:left w:type="dxa" w:w="140"/>
@@ -7125,22 +7293,22 @@
               <w:spacing w:after="40" w:before="40"/>
               <w:jc w:val="right"/>
             </w:pPr>
-            <w:r/>
+            <w:r>
+              <w:t xml:space="preserve">As applicable</w:t>
+            </w:r>
           </w:p>
         </w:tc>
       </w:tr>
       <w:tr>
         <w:tc>
           <w:tcPr>
-            <w:tcW w:type="dxa" w:w="9360"/>
-            <w:gridSpan w:val="5"/>
-            <w:tcBorders>
-              <w:top w:val="single" w:color="BFBFBF" w:sz="4"/>
-              <w:left w:val="single" w:color="BFBFBF" w:sz="4"/>
-              <w:bottom w:val="single" w:color="BFBFBF" w:sz="4"/>
-              <w:right w:val="single" w:color="BFBFBF" w:sz="4"/>
-            </w:tcBorders>
-            <w:shd w:fill="F3F4F6" w:val="clear"/>
+            <w:tcW w:type="dxa" w:w="780"/>
+            <w:tcBorders>
+              <w:top w:val="single" w:color="BFBFBF" w:sz="4"/>
+              <w:left w:val="single" w:color="BFBFBF" w:sz="4"/>
+              <w:bottom w:val="single" w:color="BFBFBF" w:sz="4"/>
+              <w:right w:val="single" w:color="BFBFBF" w:sz="4"/>
+            </w:tcBorders>
             <w:tcMar>
               <w:top w:type="dxa" w:w="100"/>
               <w:left w:type="dxa" w:w="140"/>
@@ -7154,7 +7322,412 @@
               <w:spacing w:after="40" w:before="40"/>
               <w:jc w:val="center"/>
             </w:pPr>
-            <w:r/>
+            <w:r>
+              <w:rPr>
+                <w:rFonts w:ascii="Calibri" w:cs="Calibri" w:eastAsia="Calibri" w:hAnsi="Calibri"/>
+                <w:b/>
+                <w:bCs/>
+                <w:sz w:val="22"/>
+                <w:szCs w:val="22"/>
+              </w:rPr>
+              <w:t xml:space="preserve">4</w:t>
+            </w:r>
+          </w:p>
+        </w:tc>
+        <w:tc>
+          <w:tcPr>
+            <w:tcW w:type="dxa" w:w="4080"/>
+            <w:tcBorders>
+              <w:top w:val="single" w:color="BFBFBF" w:sz="4"/>
+              <w:left w:val="single" w:color="BFBFBF" w:sz="4"/>
+              <w:bottom w:val="single" w:color="BFBFBF" w:sz="4"/>
+              <w:right w:val="single" w:color="BFBFBF" w:sz="4"/>
+            </w:tcBorders>
+            <w:tcMar>
+              <w:top w:type="dxa" w:w="100"/>
+              <w:left w:type="dxa" w:w="140"/>
+              <w:bottom w:type="dxa" w:w="100"/>
+              <w:right w:type="dxa" w:w="140"/>
+            </w:tcMar>
+            <w:vAlign w:val="center"/>
+          </w:tcPr>
+          <w:p>
+            <w:pPr>
+              <w:spacing w:after="40" w:before="40"/>
+              <w:jc w:val="left"/>
+            </w:pPr>
+            <w:r>
+              <w:t xml:space="preserve">To-and-fro fare from Delhi to site</w:t>
+            </w:r>
+          </w:p>
+        </w:tc>
+        <w:tc>
+          <w:tcPr>
+            <w:tcW w:type="dxa" w:w="1100"/>
+            <w:tcBorders>
+              <w:top w:val="single" w:color="BFBFBF" w:sz="4"/>
+              <w:left w:val="single" w:color="BFBFBF" w:sz="4"/>
+              <w:bottom w:val="single" w:color="BFBFBF" w:sz="4"/>
+              <w:right w:val="single" w:color="BFBFBF" w:sz="4"/>
+            </w:tcBorders>
+            <w:tcMar>
+              <w:top w:type="dxa" w:w="100"/>
+              <w:left w:type="dxa" w:w="140"/>
+              <w:bottom w:type="dxa" w:w="100"/>
+              <w:right w:type="dxa" w:w="140"/>
+            </w:tcMar>
+            <w:vAlign w:val="center"/>
+          </w:tcPr>
+          <w:p>
+            <w:pPr>
+              <w:spacing w:after="40" w:before="40"/>
+              <w:jc w:val="center"/>
+            </w:pPr>
+            <w:r>
+              <w:t xml:space="preserve">As actual</w:t>
+            </w:r>
+          </w:p>
+        </w:tc>
+        <w:tc>
+          <w:tcPr>
+            <w:tcW w:type="dxa" w:w="1700"/>
+            <w:tcBorders>
+              <w:top w:val="single" w:color="BFBFBF" w:sz="4"/>
+              <w:left w:val="single" w:color="BFBFBF" w:sz="4"/>
+              <w:bottom w:val="single" w:color="BFBFBF" w:sz="4"/>
+              <w:right w:val="single" w:color="BFBFBF" w:sz="4"/>
+            </w:tcBorders>
+            <w:tcMar>
+              <w:top w:type="dxa" w:w="100"/>
+              <w:left w:type="dxa" w:w="140"/>
+              <w:bottom w:type="dxa" w:w="100"/>
+              <w:right w:type="dxa" w:w="140"/>
+            </w:tcMar>
+            <w:vAlign w:val="center"/>
+          </w:tcPr>
+          <w:p>
+            <w:pPr>
+              <w:spacing w:after="40" w:before="40"/>
+              <w:jc w:val="right"/>
+            </w:pPr>
+            <w:r>
+              <w:t xml:space="preserve">-</w:t>
+            </w:r>
+          </w:p>
+        </w:tc>
+        <w:tc>
+          <w:tcPr>
+            <w:tcW w:type="dxa" w:w="1700"/>
+            <w:tcBorders>
+              <w:top w:val="single" w:color="BFBFBF" w:sz="4"/>
+              <w:left w:val="single" w:color="BFBFBF" w:sz="4"/>
+              <w:bottom w:val="single" w:color="BFBFBF" w:sz="4"/>
+              <w:right w:val="single" w:color="BFBFBF" w:sz="4"/>
+            </w:tcBorders>
+            <w:tcMar>
+              <w:top w:type="dxa" w:w="100"/>
+              <w:left w:type="dxa" w:w="140"/>
+              <w:bottom w:type="dxa" w:w="100"/>
+              <w:right w:type="dxa" w:w="140"/>
+            </w:tcMar>
+            <w:vAlign w:val="center"/>
+          </w:tcPr>
+          <w:p>
+            <w:pPr>
+              <w:spacing w:after="40" w:before="40"/>
+              <w:jc w:val="right"/>
+            </w:pPr>
+            <w:r>
+              <w:t xml:space="preserve">-</w:t>
+            </w:r>
+          </w:p>
+        </w:tc>
+      </w:tr>
+      <w:tr>
+        <w:tc>
+          <w:tcPr>
+            <w:tcW w:type="dxa" w:w="780"/>
+            <w:tcBorders>
+              <w:top w:val="single" w:color="BFBFBF" w:sz="4"/>
+              <w:left w:val="single" w:color="BFBFBF" w:sz="4"/>
+              <w:bottom w:val="single" w:color="BFBFBF" w:sz="4"/>
+              <w:right w:val="single" w:color="BFBFBF" w:sz="4"/>
+            </w:tcBorders>
+            <w:tcMar>
+              <w:top w:type="dxa" w:w="100"/>
+              <w:left w:type="dxa" w:w="140"/>
+              <w:bottom w:type="dxa" w:w="100"/>
+              <w:right w:type="dxa" w:w="140"/>
+            </w:tcMar>
+            <w:vAlign w:val="center"/>
+          </w:tcPr>
+          <w:p>
+            <w:pPr>
+              <w:spacing w:after="40" w:before="40"/>
+              <w:jc w:val="center"/>
+            </w:pPr>
+            <w:r>
+              <w:rPr>
+                <w:rFonts w:ascii="Calibri" w:cs="Calibri" w:eastAsia="Calibri" w:hAnsi="Calibri"/>
+                <w:b/>
+                <w:bCs/>
+                <w:sz w:val="22"/>
+                <w:szCs w:val="22"/>
+              </w:rPr>
+              <w:t xml:space="preserve">5</w:t>
+            </w:r>
+          </w:p>
+        </w:tc>
+        <w:tc>
+          <w:tcPr>
+            <w:tcW w:type="dxa" w:w="4080"/>
+            <w:tcBorders>
+              <w:top w:val="single" w:color="BFBFBF" w:sz="4"/>
+              <w:left w:val="single" w:color="BFBFBF" w:sz="4"/>
+              <w:bottom w:val="single" w:color="BFBFBF" w:sz="4"/>
+              <w:right w:val="single" w:color="BFBFBF" w:sz="4"/>
+            </w:tcBorders>
+            <w:tcMar>
+              <w:top w:type="dxa" w:w="100"/>
+              <w:left w:type="dxa" w:w="140"/>
+              <w:bottom w:type="dxa" w:w="100"/>
+              <w:right w:type="dxa" w:w="140"/>
+            </w:tcMar>
+            <w:vAlign w:val="center"/>
+          </w:tcPr>
+          <w:p>
+            <w:pPr>
+              <w:spacing w:after="40" w:before="40"/>
+              <w:jc w:val="left"/>
+            </w:pPr>
+            <w:r>
+              <w:t xml:space="preserve">Boarding, lodging, and local conveyance at site</w:t>
+            </w:r>
+          </w:p>
+        </w:tc>
+        <w:tc>
+          <w:tcPr>
+            <w:tcW w:type="dxa" w:w="1100"/>
+            <w:tcBorders>
+              <w:top w:val="single" w:color="BFBFBF" w:sz="4"/>
+              <w:left w:val="single" w:color="BFBFBF" w:sz="4"/>
+              <w:bottom w:val="single" w:color="BFBFBF" w:sz="4"/>
+              <w:right w:val="single" w:color="BFBFBF" w:sz="4"/>
+            </w:tcBorders>
+            <w:tcMar>
+              <w:top w:type="dxa" w:w="100"/>
+              <w:left w:type="dxa" w:w="140"/>
+              <w:bottom w:type="dxa" w:w="100"/>
+              <w:right w:type="dxa" w:w="140"/>
+            </w:tcMar>
+            <w:vAlign w:val="center"/>
+          </w:tcPr>
+          <w:p>
+            <w:pPr>
+              <w:spacing w:after="40" w:before="40"/>
+              <w:jc w:val="center"/>
+            </w:pPr>
+            <w:r>
+              <w:t xml:space="preserve">As actual</w:t>
+            </w:r>
+          </w:p>
+        </w:tc>
+        <w:tc>
+          <w:tcPr>
+            <w:tcW w:type="dxa" w:w="1700"/>
+            <w:tcBorders>
+              <w:top w:val="single" w:color="BFBFBF" w:sz="4"/>
+              <w:left w:val="single" w:color="BFBFBF" w:sz="4"/>
+              <w:bottom w:val="single" w:color="BFBFBF" w:sz="4"/>
+              <w:right w:val="single" w:color="BFBFBF" w:sz="4"/>
+            </w:tcBorders>
+            <w:tcMar>
+              <w:top w:type="dxa" w:w="100"/>
+              <w:left w:type="dxa" w:w="140"/>
+              <w:bottom w:type="dxa" w:w="100"/>
+              <w:right w:type="dxa" w:w="140"/>
+            </w:tcMar>
+            <w:vAlign w:val="center"/>
+          </w:tcPr>
+          <w:p>
+            <w:pPr>
+              <w:spacing w:after="40" w:before="40"/>
+              <w:jc w:val="right"/>
+            </w:pPr>
+            <w:r>
+              <w:t xml:space="preserve">-</w:t>
+            </w:r>
+          </w:p>
+        </w:tc>
+        <w:tc>
+          <w:tcPr>
+            <w:tcW w:type="dxa" w:w="1700"/>
+            <w:tcBorders>
+              <w:top w:val="single" w:color="BFBFBF" w:sz="4"/>
+              <w:left w:val="single" w:color="BFBFBF" w:sz="4"/>
+              <w:bottom w:val="single" w:color="BFBFBF" w:sz="4"/>
+              <w:right w:val="single" w:color="BFBFBF" w:sz="4"/>
+            </w:tcBorders>
+            <w:tcMar>
+              <w:top w:type="dxa" w:w="100"/>
+              <w:left w:type="dxa" w:w="140"/>
+              <w:bottom w:type="dxa" w:w="100"/>
+              <w:right w:type="dxa" w:w="140"/>
+            </w:tcMar>
+            <w:vAlign w:val="center"/>
+          </w:tcPr>
+          <w:p>
+            <w:pPr>
+              <w:spacing w:after="40" w:before="40"/>
+              <w:jc w:val="right"/>
+            </w:pPr>
+            <w:r>
+              <w:t xml:space="preserve">-</w:t>
+            </w:r>
+          </w:p>
+        </w:tc>
+      </w:tr>
+      <w:tr>
+        <w:tc>
+          <w:tcPr>
+            <w:tcW w:type="dxa" w:w="780"/>
+            <w:tcBorders>
+              <w:top w:val="single" w:color="BFBFBF" w:sz="4"/>
+              <w:left w:val="single" w:color="BFBFBF" w:sz="4"/>
+              <w:bottom w:val="single" w:color="BFBFBF" w:sz="4"/>
+              <w:right w:val="single" w:color="BFBFBF" w:sz="4"/>
+            </w:tcBorders>
+            <w:tcMar>
+              <w:top w:type="dxa" w:w="100"/>
+              <w:left w:type="dxa" w:w="140"/>
+              <w:bottom w:type="dxa" w:w="100"/>
+              <w:right w:type="dxa" w:w="140"/>
+            </w:tcMar>
+            <w:vAlign w:val="center"/>
+          </w:tcPr>
+          <w:p>
+            <w:pPr>
+              <w:spacing w:after="40" w:before="40"/>
+              <w:jc w:val="center"/>
+            </w:pPr>
+            <w:r>
+              <w:rPr>
+                <w:rFonts w:ascii="Calibri" w:cs="Calibri" w:eastAsia="Calibri" w:hAnsi="Calibri"/>
+                <w:b/>
+                <w:bCs/>
+                <w:sz w:val="22"/>
+                <w:szCs w:val="22"/>
+              </w:rPr>
+              <w:t xml:space="preserve">6</w:t>
+            </w:r>
+          </w:p>
+        </w:tc>
+        <w:tc>
+          <w:tcPr>
+            <w:tcW w:type="dxa" w:w="4080"/>
+            <w:tcBorders>
+              <w:top w:val="single" w:color="BFBFBF" w:sz="4"/>
+              <w:left w:val="single" w:color="BFBFBF" w:sz="4"/>
+              <w:bottom w:val="single" w:color="BFBFBF" w:sz="4"/>
+              <w:right w:val="single" w:color="BFBFBF" w:sz="4"/>
+            </w:tcBorders>
+            <w:tcMar>
+              <w:top w:type="dxa" w:w="100"/>
+              <w:left w:type="dxa" w:w="140"/>
+              <w:bottom w:type="dxa" w:w="100"/>
+              <w:right w:type="dxa" w:w="140"/>
+            </w:tcMar>
+            <w:vAlign w:val="center"/>
+          </w:tcPr>
+          <w:p>
+            <w:pPr>
+              <w:spacing w:after="40" w:before="40"/>
+              <w:jc w:val="left"/>
+            </w:pPr>
+            <w:r>
+              <w:t xml:space="preserve">Medical assistance, if required</w:t>
+            </w:r>
+          </w:p>
+        </w:tc>
+        <w:tc>
+          <w:tcPr>
+            <w:tcW w:type="dxa" w:w="1100"/>
+            <w:tcBorders>
+              <w:top w:val="single" w:color="BFBFBF" w:sz="4"/>
+              <w:left w:val="single" w:color="BFBFBF" w:sz="4"/>
+              <w:bottom w:val="single" w:color="BFBFBF" w:sz="4"/>
+              <w:right w:val="single" w:color="BFBFBF" w:sz="4"/>
+            </w:tcBorders>
+            <w:tcMar>
+              <w:top w:type="dxa" w:w="100"/>
+              <w:left w:type="dxa" w:w="140"/>
+              <w:bottom w:type="dxa" w:w="100"/>
+              <w:right w:type="dxa" w:w="140"/>
+            </w:tcMar>
+            <w:vAlign w:val="center"/>
+          </w:tcPr>
+          <w:p>
+            <w:pPr>
+              <w:spacing w:after="40" w:before="40"/>
+              <w:jc w:val="center"/>
+            </w:pPr>
+            <w:r>
+              <w:t xml:space="preserve">As actual</w:t>
+            </w:r>
+          </w:p>
+        </w:tc>
+        <w:tc>
+          <w:tcPr>
+            <w:tcW w:type="dxa" w:w="1700"/>
+            <w:tcBorders>
+              <w:top w:val="single" w:color="BFBFBF" w:sz="4"/>
+              <w:left w:val="single" w:color="BFBFBF" w:sz="4"/>
+              <w:bottom w:val="single" w:color="BFBFBF" w:sz="4"/>
+              <w:right w:val="single" w:color="BFBFBF" w:sz="4"/>
+            </w:tcBorders>
+            <w:tcMar>
+              <w:top w:type="dxa" w:w="100"/>
+              <w:left w:type="dxa" w:w="140"/>
+              <w:bottom w:type="dxa" w:w="100"/>
+              <w:right w:type="dxa" w:w="140"/>
+            </w:tcMar>
+            <w:vAlign w:val="center"/>
+          </w:tcPr>
+          <w:p>
+            <w:pPr>
+              <w:spacing w:after="40" w:before="40"/>
+              <w:jc w:val="right"/>
+            </w:pPr>
+            <w:r>
+              <w:t xml:space="preserve">-</w:t>
+            </w:r>
+          </w:p>
+        </w:tc>
+        <w:tc>
+          <w:tcPr>
+            <w:tcW w:type="dxa" w:w="1700"/>
+            <w:tcBorders>
+              <w:top w:val="single" w:color="BFBFBF" w:sz="4"/>
+              <w:left w:val="single" w:color="BFBFBF" w:sz="4"/>
+              <w:bottom w:val="single" w:color="BFBFBF" w:sz="4"/>
+              <w:right w:val="single" w:color="BFBFBF" w:sz="4"/>
+            </w:tcBorders>
+            <w:tcMar>
+              <w:top w:type="dxa" w:w="100"/>
+              <w:left w:type="dxa" w:w="140"/>
+              <w:bottom w:type="dxa" w:w="100"/>
+              <w:right w:type="dxa" w:w="140"/>
+            </w:tcMar>
+            <w:vAlign w:val="center"/>
+          </w:tcPr>
+          <w:p>
+            <w:pPr>
+              <w:spacing w:after="40" w:before="40"/>
+              <w:jc w:val="right"/>
+            </w:pPr>
+            <w:r>
+              <w:t xml:space="preserve">-</w:t>
+            </w:r>
           </w:p>
         </w:tc>
       </w:tr>

</xml_diff>

<commit_message>
fix: Instrumentation & Control bullets vary by control mode
Wire the air and gas pipeline bullets in the I&C section with Jinja
{%p if %} markers driven by control_mode + auto_control_type:

  PLC (automatic):       Orifice + DPT, Pneumatic control valve, Pipeline
  PLC + AGR (automatic): AGR regulator, Pneumatic control valve, Pipeline
  PID (automatic):       AGR regulator, Pipeline
  Manual:                AGR regulator, Pipeline

Matches the existing BOM swap rule documented in vlph_builder.py
(orifice + DPT replaced by AGR for plc_agr / pid / manual; PCV dropped
when AGR handles the air-gas ratio directly).

Co-Authored-By: Claude Opus 4.7 (1M context) <noreply@anthropic.com>
</commit_message>
<xml_diff>
--- a/Offer_Template.docx
+++ b/Offer_Template.docx
@@ -5166,6 +5166,18 @@
     </w:p>
     <w:p>
       <w:pPr>
+        <w:spacing w:after="60" w:before="60" w:line="300"/>
+        <w:jc w:val="left"/>
+      </w:pPr>
+      <w:r>
+        <w:rPr>
+          <w:rFonts w:ascii="Calibri" w:cs="Calibri" w:eastAsia="Calibri" w:hAnsi="Calibri"/>
+        </w:rPr>
+        <w:t xml:space="preserve">{%p if control_mode != "manual" and auto_control_type == "plc" %}</w:t>
+      </w:r>
+    </w:p>
+    <w:p>
+      <w:pPr>
         <w:pStyle w:val="ListParagraph"/>
         <w:numPr>
           <w:ilvl w:val="0"/>
@@ -5184,6 +5196,30 @@
     </w:p>
     <w:p>
       <w:pPr>
+        <w:spacing w:after="60" w:before="60" w:line="300"/>
+        <w:jc w:val="left"/>
+      </w:pPr>
+      <w:r>
+        <w:rPr>
+          <w:rFonts w:ascii="Calibri" w:cs="Calibri" w:eastAsia="Calibri" w:hAnsi="Calibri"/>
+        </w:rPr>
+        <w:t xml:space="preserve">{%p endif %}</w:t>
+      </w:r>
+    </w:p>
+    <w:p>
+      <w:pPr>
+        <w:spacing w:after="60" w:before="60" w:line="300"/>
+        <w:jc w:val="left"/>
+      </w:pPr>
+      <w:r>
+        <w:rPr>
+          <w:rFonts w:ascii="Calibri" w:cs="Calibri" w:eastAsia="Calibri" w:hAnsi="Calibri"/>
+        </w:rPr>
+        <w:t xml:space="preserve">{%p if control_mode == "manual" or auto_control_type in ["plc_agr", "pid"] %}</w:t>
+      </w:r>
+    </w:p>
+    <w:p>
+      <w:pPr>
         <w:pStyle w:val="ListParagraph"/>
         <w:numPr>
           <w:ilvl w:val="0"/>
@@ -5197,7 +5233,31 @@
           <w:sz w:val="22"/>
           <w:szCs w:val="22"/>
         </w:rPr>
-        <w:t xml:space="preserve">Pneumatic control valve</w:t>
+        <w:t xml:space="preserve">Air-Gas Ratio (AGR) regulator</w:t>
+      </w:r>
+    </w:p>
+    <w:p>
+      <w:pPr>
+        <w:spacing w:after="60" w:before="60" w:line="300"/>
+        <w:jc w:val="left"/>
+      </w:pPr>
+      <w:r>
+        <w:rPr>
+          <w:rFonts w:ascii="Calibri" w:cs="Calibri" w:eastAsia="Calibri" w:hAnsi="Calibri"/>
+        </w:rPr>
+        <w:t xml:space="preserve">{%p endif %}</w:t>
+      </w:r>
+    </w:p>
+    <w:p>
+      <w:pPr>
+        <w:spacing w:after="60" w:before="60" w:line="300"/>
+        <w:jc w:val="left"/>
+      </w:pPr>
+      <w:r>
+        <w:rPr>
+          <w:rFonts w:ascii="Calibri" w:cs="Calibri" w:eastAsia="Calibri" w:hAnsi="Calibri"/>
+        </w:rPr>
+        <w:t xml:space="preserve">{%p if control_mode != "manual" and auto_control_type in ["plc", "plc_agr"] %}</w:t>
       </w:r>
     </w:p>
     <w:p>
@@ -5215,7 +5275,7 @@
           <w:sz w:val="22"/>
           <w:szCs w:val="22"/>
         </w:rPr>
-        <w:t xml:space="preserve">Pipeline and pipe fittings</w:t>
+        <w:t xml:space="preserve">Pneumatic control valve</w:t>
       </w:r>
     </w:p>
     <w:p>
@@ -5226,9 +5286,8 @@
       <w:r>
         <w:rPr>
           <w:rFonts w:ascii="Calibri" w:cs="Calibri" w:eastAsia="Calibri" w:hAnsi="Calibri"/>
-          <w:b/>
         </w:rPr>
-        <w:t xml:space="preserve">On the main {{ fuel1_line_label or "gas" }} pipeline:</w:t>
+        <w:t xml:space="preserve">{%p endif %}</w:t>
       </w:r>
     </w:p>
     <w:p>
@@ -5246,7 +5305,32 @@
           <w:sz w:val="22"/>
           <w:szCs w:val="22"/>
         </w:rPr>
-        <w:t xml:space="preserve">Orifice plate fitted with differential pressure transmitter</w:t>
+        <w:t xml:space="preserve">Pipeline and pipe fittings</w:t>
+      </w:r>
+    </w:p>
+    <w:p>
+      <w:pPr>
+        <w:spacing w:after="60" w:before="60" w:line="300"/>
+        <w:jc w:val="left"/>
+      </w:pPr>
+      <w:r>
+        <w:rPr>
+          <w:rFonts w:ascii="Calibri" w:cs="Calibri" w:eastAsia="Calibri" w:hAnsi="Calibri"/>
+          <w:b/>
+        </w:rPr>
+        <w:t xml:space="preserve">On the main {{ fuel1_line_label or "gas" }} pipeline:</w:t>
+      </w:r>
+    </w:p>
+    <w:p>
+      <w:pPr>
+        <w:spacing w:after="60" w:before="60" w:line="300"/>
+        <w:jc w:val="left"/>
+      </w:pPr>
+      <w:r>
+        <w:rPr>
+          <w:rFonts w:ascii="Calibri" w:cs="Calibri" w:eastAsia="Calibri" w:hAnsi="Calibri"/>
+        </w:rPr>
+        <w:t xml:space="preserve">{%p if control_mode != "manual" and auto_control_type == "plc" %}</w:t>
       </w:r>
     </w:p>
     <w:p>
@@ -5264,7 +5348,103 @@
           <w:sz w:val="22"/>
           <w:szCs w:val="22"/>
         </w:rPr>
+        <w:t xml:space="preserve">Orifice plate fitted with differential pressure transmitter</w:t>
+      </w:r>
+    </w:p>
+    <w:p>
+      <w:pPr>
+        <w:spacing w:after="60" w:before="60" w:line="300"/>
+        <w:jc w:val="left"/>
+      </w:pPr>
+      <w:r>
+        <w:rPr>
+          <w:rFonts w:ascii="Calibri" w:cs="Calibri" w:eastAsia="Calibri" w:hAnsi="Calibri"/>
+        </w:rPr>
+        <w:t xml:space="preserve">{%p endif %}</w:t>
+      </w:r>
+    </w:p>
+    <w:p>
+      <w:pPr>
+        <w:spacing w:after="60" w:before="60" w:line="300"/>
+        <w:jc w:val="left"/>
+      </w:pPr>
+      <w:r>
+        <w:rPr>
+          <w:rFonts w:ascii="Calibri" w:cs="Calibri" w:eastAsia="Calibri" w:hAnsi="Calibri"/>
+        </w:rPr>
+        <w:t xml:space="preserve">{%p if control_mode == "manual" or auto_control_type in ["plc_agr", "pid"] %}</w:t>
+      </w:r>
+    </w:p>
+    <w:p>
+      <w:pPr>
+        <w:pStyle w:val="ListParagraph"/>
+        <w:numPr>
+          <w:ilvl w:val="0"/>
+          <w:numId w:val="2"/>
+        </w:numPr>
+        <w:spacing w:after="40" w:before="40" w:line="280"/>
+      </w:pPr>
+      <w:r>
+        <w:rPr>
+          <w:rFonts w:ascii="Calibri" w:cs="Calibri" w:eastAsia="Calibri" w:hAnsi="Calibri"/>
+          <w:sz w:val="22"/>
+          <w:szCs w:val="22"/>
+        </w:rPr>
+        <w:t xml:space="preserve">Air-Gas Ratio (AGR) regulator</w:t>
+      </w:r>
+    </w:p>
+    <w:p>
+      <w:pPr>
+        <w:spacing w:after="60" w:before="60" w:line="300"/>
+        <w:jc w:val="left"/>
+      </w:pPr>
+      <w:r>
+        <w:rPr>
+          <w:rFonts w:ascii="Calibri" w:cs="Calibri" w:eastAsia="Calibri" w:hAnsi="Calibri"/>
+        </w:rPr>
+        <w:t xml:space="preserve">{%p endif %}</w:t>
+      </w:r>
+    </w:p>
+    <w:p>
+      <w:pPr>
+        <w:spacing w:after="60" w:before="60" w:line="300"/>
+        <w:jc w:val="left"/>
+      </w:pPr>
+      <w:r>
+        <w:rPr>
+          <w:rFonts w:ascii="Calibri" w:cs="Calibri" w:eastAsia="Calibri" w:hAnsi="Calibri"/>
+        </w:rPr>
+        <w:t xml:space="preserve">{%p if control_mode != "manual" and auto_control_type in ["plc", "plc_agr"] %}</w:t>
+      </w:r>
+    </w:p>
+    <w:p>
+      <w:pPr>
+        <w:pStyle w:val="ListParagraph"/>
+        <w:numPr>
+          <w:ilvl w:val="0"/>
+          <w:numId w:val="2"/>
+        </w:numPr>
+        <w:spacing w:after="40" w:before="40" w:line="280"/>
+      </w:pPr>
+      <w:r>
+        <w:rPr>
+          <w:rFonts w:ascii="Calibri" w:cs="Calibri" w:eastAsia="Calibri" w:hAnsi="Calibri"/>
+          <w:sz w:val="22"/>
+          <w:szCs w:val="22"/>
+        </w:rPr>
         <w:t xml:space="preserve">Pneumatic control valve</w:t>
+      </w:r>
+    </w:p>
+    <w:p>
+      <w:pPr>
+        <w:spacing w:after="60" w:before="60" w:line="300"/>
+        <w:jc w:val="left"/>
+      </w:pPr>
+      <w:r>
+        <w:rPr>
+          <w:rFonts w:ascii="Calibri" w:cs="Calibri" w:eastAsia="Calibri" w:hAnsi="Calibri"/>
+        </w:rPr>
+        <w:t xml:space="preserve">{%p endif %}</w:t>
       </w:r>
     </w:p>
     <w:p>

</xml_diff>

<commit_message>
fix: Instrumentation & Control oil-line uses Flowmeter / AOR
Wraps the fuel-line bullets in {%p if is_oil %}…{%p else %}…{%p endif %}.

Oil branch (HSD / LDO / FO / etc.):
  PLC (auto):       Flowmeter, Motorised control valve, Pipeline
  PLC + AGR (auto): Air-Oil Ratio (AOR) regulator, Pipeline
  PID (auto):       AOR, Pipeline
  Manual:           AOR, Pipeline

Gas branch (NG / COG / LPG / etc.) keeps the existing matrix:
  PLC: Orifice + DPT, PCV, Pipeline
  PLC + AGR: AGR, PCV, Pipeline
  PID: AGR, Pipeline
  Manual: AGR, Pipeline

Air pipeline section is unchanged (same items regardless of fuel kind).

Co-Authored-By: Claude Opus 4.7 (1M context) <noreply@anthropic.com>
</commit_message>
<xml_diff>
--- a/Offer_Template.docx
+++ b/Offer_Template.docx
@@ -5330,6 +5330,18 @@
         <w:rPr>
           <w:rFonts w:ascii="Calibri" w:cs="Calibri" w:eastAsia="Calibri" w:hAnsi="Calibri"/>
         </w:rPr>
+        <w:t xml:space="preserve">{%p if is_oil %}</w:t>
+      </w:r>
+    </w:p>
+    <w:p>
+      <w:pPr>
+        <w:spacing w:after="60" w:before="60" w:line="300"/>
+        <w:jc w:val="left"/>
+      </w:pPr>
+      <w:r>
+        <w:rPr>
+          <w:rFonts w:ascii="Calibri" w:cs="Calibri" w:eastAsia="Calibri" w:hAnsi="Calibri"/>
+        </w:rPr>
         <w:t xml:space="preserve">{%p if control_mode != "manual" and auto_control_type == "plc" %}</w:t>
       </w:r>
     </w:p>
@@ -5348,31 +5360,7 @@
           <w:sz w:val="22"/>
           <w:szCs w:val="22"/>
         </w:rPr>
-        <w:t xml:space="preserve">Orifice plate fitted with differential pressure transmitter</w:t>
-      </w:r>
-    </w:p>
-    <w:p>
-      <w:pPr>
-        <w:spacing w:after="60" w:before="60" w:line="300"/>
-        <w:jc w:val="left"/>
-      </w:pPr>
-      <w:r>
-        <w:rPr>
-          <w:rFonts w:ascii="Calibri" w:cs="Calibri" w:eastAsia="Calibri" w:hAnsi="Calibri"/>
-        </w:rPr>
-        <w:t xml:space="preserve">{%p endif %}</w:t>
-      </w:r>
-    </w:p>
-    <w:p>
-      <w:pPr>
-        <w:spacing w:after="60" w:before="60" w:line="300"/>
-        <w:jc w:val="left"/>
-      </w:pPr>
-      <w:r>
-        <w:rPr>
-          <w:rFonts w:ascii="Calibri" w:cs="Calibri" w:eastAsia="Calibri" w:hAnsi="Calibri"/>
-        </w:rPr>
-        <w:t xml:space="preserve">{%p if control_mode == "manual" or auto_control_type in ["plc_agr", "pid"] %}</w:t>
+        <w:t xml:space="preserve">Flowmeter</w:t>
       </w:r>
     </w:p>
     <w:p>
@@ -5390,7 +5378,7 @@
           <w:sz w:val="22"/>
           <w:szCs w:val="22"/>
         </w:rPr>
-        <w:t xml:space="preserve">Air-Gas Ratio (AGR) regulator</w:t>
+        <w:t xml:space="preserve">Motorised control valve</w:t>
       </w:r>
     </w:p>
     <w:p>
@@ -5414,7 +5402,7 @@
         <w:rPr>
           <w:rFonts w:ascii="Calibri" w:cs="Calibri" w:eastAsia="Calibri" w:hAnsi="Calibri"/>
         </w:rPr>
-        <w:t xml:space="preserve">{%p if control_mode != "manual" and auto_control_type in ["plc", "plc_agr"] %}</w:t>
+        <w:t xml:space="preserve">{%p if control_mode == "manual" or auto_control_type in ["plc_agr", "pid"] %}</w:t>
       </w:r>
     </w:p>
     <w:p>
@@ -5432,7 +5420,7 @@
           <w:sz w:val="22"/>
           <w:szCs w:val="22"/>
         </w:rPr>
-        <w:t xml:space="preserve">Pneumatic control valve</w:t>
+        <w:t xml:space="preserve">Air-Oil Ratio (AOR) regulator</w:t>
       </w:r>
     </w:p>
     <w:p>
@@ -5463,6 +5451,174 @@
           <w:szCs w:val="22"/>
         </w:rPr>
         <w:t xml:space="preserve">Pipeline and pipe fittings</w:t>
+      </w:r>
+    </w:p>
+    <w:p>
+      <w:pPr>
+        <w:spacing w:after="60" w:before="60" w:line="300"/>
+        <w:jc w:val="left"/>
+      </w:pPr>
+      <w:r>
+        <w:rPr>
+          <w:rFonts w:ascii="Calibri" w:cs="Calibri" w:eastAsia="Calibri" w:hAnsi="Calibri"/>
+        </w:rPr>
+        <w:t xml:space="preserve">{%p else %}</w:t>
+      </w:r>
+    </w:p>
+    <w:p>
+      <w:pPr>
+        <w:spacing w:after="60" w:before="60" w:line="300"/>
+        <w:jc w:val="left"/>
+      </w:pPr>
+      <w:r>
+        <w:rPr>
+          <w:rFonts w:ascii="Calibri" w:cs="Calibri" w:eastAsia="Calibri" w:hAnsi="Calibri"/>
+        </w:rPr>
+        <w:t xml:space="preserve">{%p if control_mode != "manual" and auto_control_type == "plc" %}</w:t>
+      </w:r>
+    </w:p>
+    <w:p>
+      <w:pPr>
+        <w:pStyle w:val="ListParagraph"/>
+        <w:numPr>
+          <w:ilvl w:val="0"/>
+          <w:numId w:val="2"/>
+        </w:numPr>
+        <w:spacing w:after="40" w:before="40" w:line="280"/>
+      </w:pPr>
+      <w:r>
+        <w:rPr>
+          <w:rFonts w:ascii="Calibri" w:cs="Calibri" w:eastAsia="Calibri" w:hAnsi="Calibri"/>
+          <w:sz w:val="22"/>
+          <w:szCs w:val="22"/>
+        </w:rPr>
+        <w:t xml:space="preserve">Orifice plate fitted with differential pressure transmitter</w:t>
+      </w:r>
+    </w:p>
+    <w:p>
+      <w:pPr>
+        <w:spacing w:after="60" w:before="60" w:line="300"/>
+        <w:jc w:val="left"/>
+      </w:pPr>
+      <w:r>
+        <w:rPr>
+          <w:rFonts w:ascii="Calibri" w:cs="Calibri" w:eastAsia="Calibri" w:hAnsi="Calibri"/>
+        </w:rPr>
+        <w:t xml:space="preserve">{%p endif %}</w:t>
+      </w:r>
+    </w:p>
+    <w:p>
+      <w:pPr>
+        <w:spacing w:after="60" w:before="60" w:line="300"/>
+        <w:jc w:val="left"/>
+      </w:pPr>
+      <w:r>
+        <w:rPr>
+          <w:rFonts w:ascii="Calibri" w:cs="Calibri" w:eastAsia="Calibri" w:hAnsi="Calibri"/>
+        </w:rPr>
+        <w:t xml:space="preserve">{%p if control_mode == "manual" or auto_control_type in ["plc_agr", "pid"] %}</w:t>
+      </w:r>
+    </w:p>
+    <w:p>
+      <w:pPr>
+        <w:pStyle w:val="ListParagraph"/>
+        <w:numPr>
+          <w:ilvl w:val="0"/>
+          <w:numId w:val="2"/>
+        </w:numPr>
+        <w:spacing w:after="40" w:before="40" w:line="280"/>
+      </w:pPr>
+      <w:r>
+        <w:rPr>
+          <w:rFonts w:ascii="Calibri" w:cs="Calibri" w:eastAsia="Calibri" w:hAnsi="Calibri"/>
+          <w:sz w:val="22"/>
+          <w:szCs w:val="22"/>
+        </w:rPr>
+        <w:t xml:space="preserve">Air-Gas Ratio (AGR) regulator</w:t>
+      </w:r>
+    </w:p>
+    <w:p>
+      <w:pPr>
+        <w:spacing w:after="60" w:before="60" w:line="300"/>
+        <w:jc w:val="left"/>
+      </w:pPr>
+      <w:r>
+        <w:rPr>
+          <w:rFonts w:ascii="Calibri" w:cs="Calibri" w:eastAsia="Calibri" w:hAnsi="Calibri"/>
+        </w:rPr>
+        <w:t xml:space="preserve">{%p endif %}</w:t>
+      </w:r>
+    </w:p>
+    <w:p>
+      <w:pPr>
+        <w:spacing w:after="60" w:before="60" w:line="300"/>
+        <w:jc w:val="left"/>
+      </w:pPr>
+      <w:r>
+        <w:rPr>
+          <w:rFonts w:ascii="Calibri" w:cs="Calibri" w:eastAsia="Calibri" w:hAnsi="Calibri"/>
+        </w:rPr>
+        <w:t xml:space="preserve">{%p if control_mode != "manual" and auto_control_type in ["plc", "plc_agr"] %}</w:t>
+      </w:r>
+    </w:p>
+    <w:p>
+      <w:pPr>
+        <w:pStyle w:val="ListParagraph"/>
+        <w:numPr>
+          <w:ilvl w:val="0"/>
+          <w:numId w:val="2"/>
+        </w:numPr>
+        <w:spacing w:after="40" w:before="40" w:line="280"/>
+      </w:pPr>
+      <w:r>
+        <w:rPr>
+          <w:rFonts w:ascii="Calibri" w:cs="Calibri" w:eastAsia="Calibri" w:hAnsi="Calibri"/>
+          <w:sz w:val="22"/>
+          <w:szCs w:val="22"/>
+        </w:rPr>
+        <w:t xml:space="preserve">Pneumatic control valve</w:t>
+      </w:r>
+    </w:p>
+    <w:p>
+      <w:pPr>
+        <w:spacing w:after="60" w:before="60" w:line="300"/>
+        <w:jc w:val="left"/>
+      </w:pPr>
+      <w:r>
+        <w:rPr>
+          <w:rFonts w:ascii="Calibri" w:cs="Calibri" w:eastAsia="Calibri" w:hAnsi="Calibri"/>
+        </w:rPr>
+        <w:t xml:space="preserve">{%p endif %}</w:t>
+      </w:r>
+    </w:p>
+    <w:p>
+      <w:pPr>
+        <w:pStyle w:val="ListParagraph"/>
+        <w:numPr>
+          <w:ilvl w:val="0"/>
+          <w:numId w:val="2"/>
+        </w:numPr>
+        <w:spacing w:after="40" w:before="40" w:line="280"/>
+      </w:pPr>
+      <w:r>
+        <w:rPr>
+          <w:rFonts w:ascii="Calibri" w:cs="Calibri" w:eastAsia="Calibri" w:hAnsi="Calibri"/>
+          <w:sz w:val="22"/>
+          <w:szCs w:val="22"/>
+        </w:rPr>
+        <w:t xml:space="preserve">Pipeline and pipe fittings</w:t>
+      </w:r>
+    </w:p>
+    <w:p>
+      <w:pPr>
+        <w:spacing w:after="60" w:before="60" w:line="300"/>
+        <w:jc w:val="left"/>
+      </w:pPr>
+      <w:r>
+        <w:rPr>
+          <w:rFonts w:ascii="Calibri" w:cs="Calibri" w:eastAsia="Calibri" w:hAnsi="Calibri"/>
+        </w:rPr>
+        <w:t xml:space="preserve">{%p endif %}</w:t>
       </w:r>
     </w:p>
     <w:p>

</xml_diff>

<commit_message>
fix: oil-line Motorised CV stays for PLC + PLC+AGR + PID
Updated I&C oil branch so the Motorised control valve appears in every
automatic mode (PLC, PLC+AGR, PID), not just PLC. Manual still drops it.

Final oil-line matrix:
  PLC (auto):       Flowmeter, Motorised control valve, Pipeline
  PLC + AGR (auto): AOR, Motorised control valve, Pipeline
  PID (auto):       AOR, Motorised control valve, Pipeline
  Manual:           AOR, Pipeline

Co-Authored-By: Claude Opus 4.7 (1M context) <noreply@anthropic.com>
</commit_message>
<xml_diff>
--- a/Offer_Template.docx
+++ b/Offer_Template.docx
@@ -5365,6 +5365,30 @@
     </w:p>
     <w:p>
       <w:pPr>
+        <w:spacing w:after="60" w:before="60" w:line="300"/>
+        <w:jc w:val="left"/>
+      </w:pPr>
+      <w:r>
+        <w:rPr>
+          <w:rFonts w:ascii="Calibri" w:cs="Calibri" w:eastAsia="Calibri" w:hAnsi="Calibri"/>
+        </w:rPr>
+        <w:t xml:space="preserve">{%p endif %}</w:t>
+      </w:r>
+    </w:p>
+    <w:p>
+      <w:pPr>
+        <w:spacing w:after="60" w:before="60" w:line="300"/>
+        <w:jc w:val="left"/>
+      </w:pPr>
+      <w:r>
+        <w:rPr>
+          <w:rFonts w:ascii="Calibri" w:cs="Calibri" w:eastAsia="Calibri" w:hAnsi="Calibri"/>
+        </w:rPr>
+        <w:t xml:space="preserve">{%p if control_mode == "manual" or auto_control_type in ["plc_agr", "pid"] %}</w:t>
+      </w:r>
+    </w:p>
+    <w:p>
+      <w:pPr>
         <w:pStyle w:val="ListParagraph"/>
         <w:numPr>
           <w:ilvl w:val="0"/>
@@ -5378,7 +5402,7 @@
           <w:sz w:val="22"/>
           <w:szCs w:val="22"/>
         </w:rPr>
-        <w:t xml:space="preserve">Motorised control valve</w:t>
+        <w:t xml:space="preserve">Air-Oil Ratio (AOR) regulator</w:t>
       </w:r>
     </w:p>
     <w:p>
@@ -5402,7 +5426,7 @@
         <w:rPr>
           <w:rFonts w:ascii="Calibri" w:cs="Calibri" w:eastAsia="Calibri" w:hAnsi="Calibri"/>
         </w:rPr>
-        <w:t xml:space="preserve">{%p if control_mode == "manual" or auto_control_type in ["plc_agr", "pid"] %}</w:t>
+        <w:t xml:space="preserve">{%p if control_mode != "manual" %}</w:t>
       </w:r>
     </w:p>
     <w:p>
@@ -5420,7 +5444,7 @@
           <w:sz w:val="22"/>
           <w:szCs w:val="22"/>
         </w:rPr>
-        <w:t xml:space="preserve">Air-Oil Ratio (AOR) regulator</w:t>
+        <w:t xml:space="preserve">Motorised control valve</w:t>
       </w:r>
     </w:p>
     <w:p>

</xml_diff>

<commit_message>
fix: Temperature Control System bullets vary by control mode + fuel kind
Replaces the hardcoded 4 bullets with conditional blocks driven by
control_mode + auto_control_type + is_oil:

  PLC (auto):       PLC Controller, Thermocouple, Pneumatic/Motorised CV
  PLC + AGR (auto): PLC Controller, Thermocouple, AGR regulator,
                    Pneumatic/Motorised CV
  PID (auto):       PID Controller, Thermocouple, AGR regulator,
                    Pneumatic/Motorised CV
  Manual:           Thermocouple, AGR regulator (no controller, no CV)

Control valve label is 'Motorised' for oil offers (is_oil) and
'Pneumatic' otherwise, mirroring the I&C section convention.

Co-Authored-By: Claude Opus 4.7 (1M context) <noreply@anthropic.com>
</commit_message>
<xml_diff>
--- a/Offer_Template.docx
+++ b/Offer_Template.docx
@@ -5688,6 +5688,18 @@
     </w:p>
     <w:p>
       <w:pPr>
+        <w:spacing w:after="60" w:before="60" w:line="300"/>
+        <w:jc w:val="left"/>
+      </w:pPr>
+      <w:r>
+        <w:rPr>
+          <w:rFonts w:ascii="Calibri" w:cs="Calibri" w:eastAsia="Calibri" w:hAnsi="Calibri"/>
+        </w:rPr>
+        <w:t xml:space="preserve">{%p if control_mode != "manual" and auto_control_type in ["plc", "plc_agr"] %}</w:t>
+      </w:r>
+    </w:p>
+    <w:p>
+      <w:pPr>
         <w:pStyle w:val="ListParagraph"/>
         <w:numPr>
           <w:ilvl w:val="0"/>
@@ -5706,6 +5718,30 @@
     </w:p>
     <w:p>
       <w:pPr>
+        <w:spacing w:after="60" w:before="60" w:line="300"/>
+        <w:jc w:val="left"/>
+      </w:pPr>
+      <w:r>
+        <w:rPr>
+          <w:rFonts w:ascii="Calibri" w:cs="Calibri" w:eastAsia="Calibri" w:hAnsi="Calibri"/>
+        </w:rPr>
+        <w:t xml:space="preserve">{%p endif %}</w:t>
+      </w:r>
+    </w:p>
+    <w:p>
+      <w:pPr>
+        <w:spacing w:after="60" w:before="60" w:line="300"/>
+        <w:jc w:val="left"/>
+      </w:pPr>
+      <w:r>
+        <w:rPr>
+          <w:rFonts w:ascii="Calibri" w:cs="Calibri" w:eastAsia="Calibri" w:hAnsi="Calibri"/>
+        </w:rPr>
+        <w:t xml:space="preserve">{%p if control_mode != "manual" and auto_control_type == "pid" %}</w:t>
+      </w:r>
+    </w:p>
+    <w:p>
+      <w:pPr>
         <w:pStyle w:val="ListParagraph"/>
         <w:numPr>
           <w:ilvl w:val="0"/>
@@ -5719,7 +5755,19 @@
           <w:sz w:val="22"/>
           <w:szCs w:val="22"/>
         </w:rPr>
-        <w:t xml:space="preserve">Thermocouple</w:t>
+        <w:t xml:space="preserve">PID Controller</w:t>
+      </w:r>
+    </w:p>
+    <w:p>
+      <w:pPr>
+        <w:spacing w:after="60" w:before="60" w:line="300"/>
+        <w:jc w:val="left"/>
+      </w:pPr>
+      <w:r>
+        <w:rPr>
+          <w:rFonts w:ascii="Calibri" w:cs="Calibri" w:eastAsia="Calibri" w:hAnsi="Calibri"/>
+        </w:rPr>
+        <w:t xml:space="preserve">{%p endif %}</w:t>
       </w:r>
     </w:p>
     <w:p>
@@ -5737,7 +5785,19 @@
           <w:sz w:val="22"/>
           <w:szCs w:val="22"/>
         </w:rPr>
-        <w:t xml:space="preserve">Pneumatic Control valve air line</w:t>
+        <w:t xml:space="preserve">Thermocouple</w:t>
+      </w:r>
+    </w:p>
+    <w:p>
+      <w:pPr>
+        <w:spacing w:after="60" w:before="60" w:line="300"/>
+        <w:jc w:val="left"/>
+      </w:pPr>
+      <w:r>
+        <w:rPr>
+          <w:rFonts w:ascii="Calibri" w:cs="Calibri" w:eastAsia="Calibri" w:hAnsi="Calibri"/>
+        </w:rPr>
+        <w:t xml:space="preserve">{%p if control_mode == "manual" or auto_control_type in ["plc_agr", "pid"] %}</w:t>
       </w:r>
     </w:p>
     <w:p>
@@ -5755,7 +5815,115 @@
           <w:sz w:val="22"/>
           <w:szCs w:val="22"/>
         </w:rPr>
-        <w:t xml:space="preserve">Pneumatic Control valve gas line</w:t>
+        <w:t xml:space="preserve">Air-Gas Ratio (AGR) regulator</w:t>
+      </w:r>
+    </w:p>
+    <w:p>
+      <w:pPr>
+        <w:spacing w:after="60" w:before="60" w:line="300"/>
+        <w:jc w:val="left"/>
+      </w:pPr>
+      <w:r>
+        <w:rPr>
+          <w:rFonts w:ascii="Calibri" w:cs="Calibri" w:eastAsia="Calibri" w:hAnsi="Calibri"/>
+        </w:rPr>
+        <w:t xml:space="preserve">{%p endif %}</w:t>
+      </w:r>
+    </w:p>
+    <w:p>
+      <w:pPr>
+        <w:spacing w:after="60" w:before="60" w:line="300"/>
+        <w:jc w:val="left"/>
+      </w:pPr>
+      <w:r>
+        <w:rPr>
+          <w:rFonts w:ascii="Calibri" w:cs="Calibri" w:eastAsia="Calibri" w:hAnsi="Calibri"/>
+        </w:rPr>
+        <w:t xml:space="preserve">{%p if control_mode != "manual" %}</w:t>
+      </w:r>
+    </w:p>
+    <w:p>
+      <w:pPr>
+        <w:spacing w:after="60" w:before="60" w:line="300"/>
+        <w:jc w:val="left"/>
+      </w:pPr>
+      <w:r>
+        <w:rPr>
+          <w:rFonts w:ascii="Calibri" w:cs="Calibri" w:eastAsia="Calibri" w:hAnsi="Calibri"/>
+        </w:rPr>
+        <w:t xml:space="preserve">{%p if is_oil %}</w:t>
+      </w:r>
+    </w:p>
+    <w:p>
+      <w:pPr>
+        <w:pStyle w:val="ListParagraph"/>
+        <w:numPr>
+          <w:ilvl w:val="0"/>
+          <w:numId w:val="2"/>
+        </w:numPr>
+        <w:spacing w:after="40" w:before="40" w:line="280"/>
+      </w:pPr>
+      <w:r>
+        <w:rPr>
+          <w:rFonts w:ascii="Calibri" w:cs="Calibri" w:eastAsia="Calibri" w:hAnsi="Calibri"/>
+          <w:sz w:val="22"/>
+          <w:szCs w:val="22"/>
+        </w:rPr>
+        <w:t xml:space="preserve">Motorised control valve</w:t>
+      </w:r>
+    </w:p>
+    <w:p>
+      <w:pPr>
+        <w:spacing w:after="60" w:before="60" w:line="300"/>
+        <w:jc w:val="left"/>
+      </w:pPr>
+      <w:r>
+        <w:rPr>
+          <w:rFonts w:ascii="Calibri" w:cs="Calibri" w:eastAsia="Calibri" w:hAnsi="Calibri"/>
+        </w:rPr>
+        <w:t xml:space="preserve">{%p else %}</w:t>
+      </w:r>
+    </w:p>
+    <w:p>
+      <w:pPr>
+        <w:pStyle w:val="ListParagraph"/>
+        <w:numPr>
+          <w:ilvl w:val="0"/>
+          <w:numId w:val="2"/>
+        </w:numPr>
+        <w:spacing w:after="40" w:before="40" w:line="280"/>
+      </w:pPr>
+      <w:r>
+        <w:rPr>
+          <w:rFonts w:ascii="Calibri" w:cs="Calibri" w:eastAsia="Calibri" w:hAnsi="Calibri"/>
+          <w:sz w:val="22"/>
+          <w:szCs w:val="22"/>
+        </w:rPr>
+        <w:t xml:space="preserve">Pneumatic control valve</w:t>
+      </w:r>
+    </w:p>
+    <w:p>
+      <w:pPr>
+        <w:spacing w:after="60" w:before="60" w:line="300"/>
+        <w:jc w:val="left"/>
+      </w:pPr>
+      <w:r>
+        <w:rPr>
+          <w:rFonts w:ascii="Calibri" w:cs="Calibri" w:eastAsia="Calibri" w:hAnsi="Calibri"/>
+        </w:rPr>
+        <w:t xml:space="preserve">{%p endif %}</w:t>
+      </w:r>
+    </w:p>
+    <w:p>
+      <w:pPr>
+        <w:spacing w:after="60" w:before="60" w:line="300"/>
+        <w:jc w:val="left"/>
+      </w:pPr>
+      <w:r>
+        <w:rPr>
+          <w:rFonts w:ascii="Calibri" w:cs="Calibri" w:eastAsia="Calibri" w:hAnsi="Calibri"/>
+        </w:rPr>
+        <w:t xml:space="preserve">{%p endif %}</w:t>
       </w:r>
     </w:p>
     <w:p>

</xml_diff>

<commit_message>
fix: I&C air pipeline drops AGR; CV always shown
AGR is a gas-line concept and shouldn't appear on the air pipeline.
Air-line bullets now read:
  - Orifice + DPT (only when PLC + automatic)
  - Pneumatic / Motorised control valve (always; Motorised when is_oil)
  - Pipeline and pipe fittings (always)

Gas / oil pipeline structure is unchanged.

Co-Authored-By: Claude Opus 4.7 (1M context) <noreply@anthropic.com>
</commit_message>
<xml_diff>
--- a/Offer_Template.docx
+++ b/Offer_Template.docx
@@ -5215,7 +5215,7 @@
         <w:rPr>
           <w:rFonts w:ascii="Calibri" w:cs="Calibri" w:eastAsia="Calibri" w:hAnsi="Calibri"/>
         </w:rPr>
-        <w:t xml:space="preserve">{%p if control_mode == "manual" or auto_control_type in ["plc_agr", "pid"] %}</w:t>
+        <w:t xml:space="preserve">{%p if is_oil %}</w:t>
       </w:r>
     </w:p>
     <w:p>
@@ -5233,7 +5233,7 @@
           <w:sz w:val="22"/>
           <w:szCs w:val="22"/>
         </w:rPr>
-        <w:t xml:space="preserve">Air-Gas Ratio (AGR) regulator</w:t>
+        <w:t xml:space="preserve">Motorised control valve</w:t>
       </w:r>
     </w:p>
     <w:p>
@@ -5245,19 +5245,7 @@
         <w:rPr>
           <w:rFonts w:ascii="Calibri" w:cs="Calibri" w:eastAsia="Calibri" w:hAnsi="Calibri"/>
         </w:rPr>
-        <w:t xml:space="preserve">{%p endif %}</w:t>
-      </w:r>
-    </w:p>
-    <w:p>
-      <w:pPr>
-        <w:spacing w:after="60" w:before="60" w:line="300"/>
-        <w:jc w:val="left"/>
-      </w:pPr>
-      <w:r>
-        <w:rPr>
-          <w:rFonts w:ascii="Calibri" w:cs="Calibri" w:eastAsia="Calibri" w:hAnsi="Calibri"/>
-        </w:rPr>
-        <w:t xml:space="preserve">{%p if control_mode != "manual" and auto_control_type in ["plc", "plc_agr"] %}</w:t>
+        <w:t xml:space="preserve">{%p else %}</w:t>
       </w:r>
     </w:p>
     <w:p>

</xml_diff>

<commit_message>
fix: normalize page size and margins across all sections
Section 1 had very thin margins (0.78 cm left / 0.60 cm right) so
pages in the body section ran content right up against the page edges.
Sections 0 and 2 also used US Letter (21.6 cm wide) while section 1
used A4. Standardizes every section to:

  Page size: A4 (21.0 cm x 29.7 cm)
  Margins:   1.91 cm L/R, 2.54 cm T/B

Co-Authored-By: Claude Opus 4.7 (1M context) <noreply@anthropic.com>
</commit_message>
<xml_diff>
--- a/Offer_Template.docx
+++ b/Offer_Template.docx
@@ -439,8 +439,8 @@
           <w:headerReference w:type="default" r:id="rId7"/>
           <w:footerReference w:type="default" r:id="rId8"/>
           <w:headerReference w:type="first" r:id="rId13"/>
-          <w:pgSz w:w="12240" w:h="15840" w:orient="portrait"/>
-          <w:pgMar w:top="1080" w:right="1080" w:bottom="1080" w:left="1080" w:header="708" w:footer="708" w:gutter="0"/>
+          <w:pgSz w:w="11906" w:h="16838" w:orient="portrait"/>
+          <w:pgMar w:top="1440" w:right="1083" w:bottom="1440" w:left="1083" w:header="708" w:footer="708" w:gutter="0"/>
           <w:pgNumType/>
           <w:docGrid w:linePitch="360"/>
         </w:sectPr>
@@ -2139,8 +2139,8 @@
         </ns0:rPr>
         <ns0:sectPr ns0:rsidR="009C3D95">
           <ns0:footerReference ns0:type="default" ns6:id="rId12"/>
-          <ns0:pgSz ns0:w="11920" ns0:h="16850"/>
-          <ns0:pgMar ns0:top="1340" ns0:right="340" ns0:bottom="1540" ns0:left="440" ns0:header="0" ns0:footer="1341" ns0:gutter="0"/>
+          <ns0:pgSz ns0:w="11906" ns0:h="16838"/>
+          <ns0:pgMar ns0:top="1440" ns0:right="1083" ns0:bottom="1440" ns0:left="1083" ns0:header="0" ns0:footer="1341" ns0:gutter="0"/>
           <ns0:cols ns0:space="720"/>
         </ns0:sectPr>
       </ns0:pPr>
@@ -17708,8 +17708,8 @@
     <w:sectPr>
       <w:headerReference w:type="default" r:id="rId9"/>
       <w:footerReference w:type="default" r:id="rId10"/>
-      <w:pgSz w:w="12240" w:h="15840" w:orient="portrait"/>
-      <w:pgMar w:top="1800" w:right="1080" w:bottom="1440" w:left="1080" w:header="708" w:footer="708" w:gutter="0"/>
+      <w:pgSz w:w="11906" w:h="16838" w:orient="portrait"/>
+      <w:pgMar w:top="1440" w:right="1083" w:bottom="1440" w:left="1083" w:header="708" w:footer="708" w:gutter="0"/>
       <w:pgNumType/>
       <w:docGrid w:linePitch="360"/>
     </w:sectPr>

</xml_diff>

<commit_message>
fix: add TOTAL row at bottom of Annexure III price schedule
New row 7 with cells: blank, 'TOTAL' (bold), blank, blank,
{{ total_price_vertical }} (bold). Mirrors the equipment line's grand
total since the supervision rows are 'As applicable' / 'At actuals'
and don't carry monetary line totals.

Co-Authored-By: Claude Opus 4.7 (1M context) <noreply@anthropic.com>
</commit_message>
<xml_diff>
--- a/Offer_Template.docx
+++ b/Offer_Template.docx
@@ -8244,6 +8244,162 @@
             </w:pPr>
             <w:r>
               <w:t xml:space="preserve">-</w:t>
+            </w:r>
+          </w:p>
+        </w:tc>
+      </w:tr>
+      <w:tr>
+        <w:tc>
+          <w:tcPr>
+            <w:tcW w:type="dxa" w:w="780"/>
+            <w:tcBorders>
+              <w:top w:val="single" w:color="BFBFBF" w:sz="4"/>
+              <w:left w:val="single" w:color="BFBFBF" w:sz="4"/>
+              <w:bottom w:val="single" w:color="BFBFBF" w:sz="4"/>
+              <w:right w:val="single" w:color="BFBFBF" w:sz="4"/>
+            </w:tcBorders>
+            <w:tcMar>
+              <w:top w:type="dxa" w:w="100"/>
+              <w:left w:type="dxa" w:w="140"/>
+              <w:bottom w:type="dxa" w:w="100"/>
+              <w:right w:type="dxa" w:w="140"/>
+            </w:tcMar>
+            <w:vAlign w:val="center"/>
+          </w:tcPr>
+          <w:p>
+            <w:pPr>
+              <w:spacing w:after="40" w:before="40"/>
+              <w:jc w:val="center"/>
+            </w:pPr>
+            <w:r>
+              <w:rPr>
+                <w:rFonts w:ascii="Calibri" w:cs="Calibri" w:eastAsia="Calibri" w:hAnsi="Calibri"/>
+                <w:b/>
+                <w:bCs/>
+                <w:sz w:val="22"/>
+                <w:szCs w:val="22"/>
+              </w:rPr>
+              <w:t xml:space="preserve"/>
+            </w:r>
+          </w:p>
+        </w:tc>
+        <w:tc>
+          <w:tcPr>
+            <w:tcW w:type="dxa" w:w="4080"/>
+            <w:tcBorders>
+              <w:top w:val="single" w:color="BFBFBF" w:sz="4"/>
+              <w:left w:val="single" w:color="BFBFBF" w:sz="4"/>
+              <w:bottom w:val="single" w:color="BFBFBF" w:sz="4"/>
+              <w:right w:val="single" w:color="BFBFBF" w:sz="4"/>
+            </w:tcBorders>
+            <w:tcMar>
+              <w:top w:type="dxa" w:w="100"/>
+              <w:left w:type="dxa" w:w="140"/>
+              <w:bottom w:type="dxa" w:w="100"/>
+              <w:right w:type="dxa" w:w="140"/>
+            </w:tcMar>
+            <w:vAlign w:val="center"/>
+          </w:tcPr>
+          <w:p>
+            <w:pPr>
+              <w:spacing w:after="40" w:before="40"/>
+              <w:jc w:val="left"/>
+            </w:pPr>
+            <w:r>
+              <w:rPr>
+                <w:b/>
+              </w:rPr>
+              <w:t xml:space="preserve">TOTAL</w:t>
+            </w:r>
+          </w:p>
+        </w:tc>
+        <w:tc>
+          <w:tcPr>
+            <w:tcW w:type="dxa" w:w="1100"/>
+            <w:tcBorders>
+              <w:top w:val="single" w:color="BFBFBF" w:sz="4"/>
+              <w:left w:val="single" w:color="BFBFBF" w:sz="4"/>
+              <w:bottom w:val="single" w:color="BFBFBF" w:sz="4"/>
+              <w:right w:val="single" w:color="BFBFBF" w:sz="4"/>
+            </w:tcBorders>
+            <w:tcMar>
+              <w:top w:type="dxa" w:w="100"/>
+              <w:left w:type="dxa" w:w="140"/>
+              <w:bottom w:type="dxa" w:w="100"/>
+              <w:right w:type="dxa" w:w="140"/>
+            </w:tcMar>
+            <w:vAlign w:val="center"/>
+          </w:tcPr>
+          <w:p>
+            <w:pPr>
+              <w:spacing w:after="40" w:before="40"/>
+              <w:jc w:val="center"/>
+            </w:pPr>
+            <w:r>
+              <w:rPr>
+                <w:b/>
+              </w:rPr>
+              <w:t xml:space="preserve"/>
+            </w:r>
+          </w:p>
+        </w:tc>
+        <w:tc>
+          <w:tcPr>
+            <w:tcW w:type="dxa" w:w="1700"/>
+            <w:tcBorders>
+              <w:top w:val="single" w:color="BFBFBF" w:sz="4"/>
+              <w:left w:val="single" w:color="BFBFBF" w:sz="4"/>
+              <w:bottom w:val="single" w:color="BFBFBF" w:sz="4"/>
+              <w:right w:val="single" w:color="BFBFBF" w:sz="4"/>
+            </w:tcBorders>
+            <w:tcMar>
+              <w:top w:type="dxa" w:w="100"/>
+              <w:left w:type="dxa" w:w="140"/>
+              <w:bottom w:type="dxa" w:w="100"/>
+              <w:right w:type="dxa" w:w="140"/>
+            </w:tcMar>
+            <w:vAlign w:val="center"/>
+          </w:tcPr>
+          <w:p>
+            <w:pPr>
+              <w:spacing w:after="40" w:before="40"/>
+              <w:jc w:val="right"/>
+            </w:pPr>
+            <w:r>
+              <w:rPr>
+                <w:b/>
+              </w:rPr>
+              <w:t xml:space="preserve"/>
+            </w:r>
+          </w:p>
+        </w:tc>
+        <w:tc>
+          <w:tcPr>
+            <w:tcW w:type="dxa" w:w="1700"/>
+            <w:tcBorders>
+              <w:top w:val="single" w:color="BFBFBF" w:sz="4"/>
+              <w:left w:val="single" w:color="BFBFBF" w:sz="4"/>
+              <w:bottom w:val="single" w:color="BFBFBF" w:sz="4"/>
+              <w:right w:val="single" w:color="BFBFBF" w:sz="4"/>
+            </w:tcBorders>
+            <w:tcMar>
+              <w:top w:type="dxa" w:w="100"/>
+              <w:left w:type="dxa" w:w="140"/>
+              <w:bottom w:type="dxa" w:w="100"/>
+              <w:right w:type="dxa" w:w="140"/>
+            </w:tcMar>
+            <w:vAlign w:val="center"/>
+          </w:tcPr>
+          <w:p>
+            <w:pPr>
+              <w:spacing w:after="40" w:before="40"/>
+              <w:jc w:val="right"/>
+            </w:pPr>
+            <w:r>
+              <w:rPr>
+                <w:b/>
+              </w:rPr>
+              <w:t xml:space="preserve">{{ total_price_vertical }}</w:t>
             </w:r>
           </w:p>
         </w:tc>

</xml_diff>

<commit_message>
fix: AGR replaces PCV in PLC+AGR too (not just PID/manual)
Aligns PCV inclusion across the BOM and the offer template with the
unified rule: pneumatic control valve appears ONLY in PLC mode. In
PLC+AGR / PID / Manual, the AGR regulator handles air-gas ratio
directly so the PCV is dropped.

bom/vlph_builder.py:
  - 3 PCV gates rewritten from 'if not is_pid' / 'if not is_pid and
    not is_manual' -> 'if is_plc'. Dropped now-unused is_pid /
    is_manual locals.

Offer_Template.docx:
  - I&C section gas-line PCV gate: ['plc', 'plc_agr'] -> 'plc' only.
  - Temperature Control System CV gate: tightened from
    'control_mode != \"manual\"' to PLC-only.
  - PLC Controller gate restored to ['plc', 'plc_agr'] (it was
    inadvertently caught by the earlier bulk replace).

Co-Authored-By: Claude Opus 4.7 (1M context) <noreply@anthropic.com>
</commit_message>
<xml_diff>
--- a/Offer_Template.docx
+++ b/Offer_Template.docx
@@ -5571,7 +5571,7 @@
         <w:rPr>
           <w:rFonts w:ascii="Calibri" w:cs="Calibri" w:eastAsia="Calibri" w:hAnsi="Calibri"/>
         </w:rPr>
-        <w:t xml:space="preserve">{%p if control_mode != "manual" and auto_control_type in ["plc", "plc_agr"] %}</w:t>
+        <w:t>{%p if control_mode != "manual" and auto_control_type == "plc" %}</w:t>
       </w:r>
     </w:p>
     <w:p>
@@ -5684,7 +5684,7 @@
         <w:rPr>
           <w:rFonts w:ascii="Calibri" w:cs="Calibri" w:eastAsia="Calibri" w:hAnsi="Calibri"/>
         </w:rPr>
-        <w:t xml:space="preserve">{%p if control_mode != "manual" and auto_control_type in ["plc", "plc_agr"] %}</w:t>
+        <w:t>{%p if control_mode != "manual" and auto_control_type in ["plc", "plc_agr"] %}</w:t>
       </w:r>
     </w:p>
     <w:p>
@@ -5828,7 +5828,7 @@
         <w:rPr>
           <w:rFonts w:ascii="Calibri" w:cs="Calibri" w:eastAsia="Calibri" w:hAnsi="Calibri"/>
         </w:rPr>
-        <w:t xml:space="preserve">{%p if control_mode != "manual" %}</w:t>
+        <w:t>{%p if control_mode != "manual" and auto_control_type == "plc" %}</w:t>
       </w:r>
     </w:p>
     <w:p>

</xml_diff>

<commit_message>
fix: pneumatic CV never shows in PLC+AGR (motorised CV unaffected)
The I&C air-pipeline and Temperature Control System CV bullets used
to render 'Pneumatic control valve' in any non-manual mode. Per the
unified rule, pneumatic CV exists only in PLC. Motorised CV (oil
offers) keeps its earlier matrix (PLC + PLC+AGR + PID).

Both CV blocks now share a combined gate:

  show if (control_valve_type == 'pneumatic' AND auto_control_type == 'plc'
          AND control_mode != 'manual')
       OR (control_valve_type == 'motorised' AND control_mode != 'manual')

Co-Authored-By: Claude Opus 4.7 (1M context) <noreply@anthropic.com>
</commit_message>
<xml_diff>
--- a/Offer_Template.docx
+++ b/Offer_Template.docx
@@ -5216,6 +5216,18 @@
         <w:rPr>
           <w:rFonts w:ascii="Calibri" w:cs="Calibri" w:eastAsia="Calibri" w:hAnsi="Calibri"/>
         </w:rPr>
+        <w:t xml:space="preserve">{%p if (control_valve_type != "motorised" and control_mode != "manual" and auto_control_type == "plc") or (control_valve_type == "motorised" and control_mode != "manual") %}</w:t>
+      </w:r>
+    </w:p>
+    <w:p>
+      <w:pPr>
+        <w:spacing w:after="60" w:before="60" w:line="300"/>
+        <w:jc w:val="left"/>
+      </w:pPr>
+      <w:r>
+        <w:rPr>
+          <w:rFonts w:ascii="Calibri" w:cs="Calibri" w:eastAsia="Calibri" w:hAnsi="Calibri"/>
+        </w:rPr>
         <w:t>{%p if control_valve_type == "motorised" %}</w:t>
       </w:r>
     </w:p>
@@ -5265,6 +5277,18 @@
           <w:szCs w:val="22"/>
         </w:rPr>
         <w:t xml:space="preserve">Pneumatic control valve</w:t>
+      </w:r>
+    </w:p>
+    <w:p>
+      <w:pPr>
+        <w:spacing w:after="60" w:before="60" w:line="300"/>
+        <w:jc w:val="left"/>
+      </w:pPr>
+      <w:r>
+        <w:rPr>
+          <w:rFonts w:ascii="Calibri" w:cs="Calibri" w:eastAsia="Calibri" w:hAnsi="Calibri"/>
+        </w:rPr>
+        <w:t xml:space="preserve">{%p endif %}</w:t>
       </w:r>
     </w:p>
     <w:p>
@@ -5828,7 +5852,7 @@
         <w:rPr>
           <w:rFonts w:ascii="Calibri" w:cs="Calibri" w:eastAsia="Calibri" w:hAnsi="Calibri"/>
         </w:rPr>
-        <w:t>{%p if control_mode != "manual" and auto_control_type == "plc" %}</w:t>
+        <w:t>{%p if (control_valve_type != "motorised" and control_mode != "manual" and auto_control_type == "plc") or (control_valve_type == "motorised" and control_mode != "manual") %}</w:t>
       </w:r>
     </w:p>
     <w:p>

</xml_diff>

<commit_message>
fix: control valve dropped in PLC+AGR for ALL fuels (gas + oil)
Earlier change kept Motorised CV in PLC+AGR / PID for oil offers per
older spec. User clarified the AGR/AOR-replaces-CV rule applies
uniformly across fuels: in PLC+AGR (and PID and Manual), there is no
control valve regardless of pneumatic/motorised label.

All three CV gates simplified to:
  {%p if control_mode != 'manual' and auto_control_type == 'plc' %}

Locations:
  - I&C air pipeline CV
  - I&C oil-line Motorised CV
  - Temperature Control System CV

Wording (Pneumatic vs Motorised) still driven by control_valve_type
inside each gated block.

Co-Authored-By: Claude Opus 4.7 (1M context) <noreply@anthropic.com>
</commit_message>
<xml_diff>
--- a/Offer_Template.docx
+++ b/Offer_Template.docx
@@ -5216,7 +5216,7 @@
         <w:rPr>
           <w:rFonts w:ascii="Calibri" w:cs="Calibri" w:eastAsia="Calibri" w:hAnsi="Calibri"/>
         </w:rPr>
-        <w:t xml:space="preserve">{%p if (control_valve_type != "motorised" and control_mode != "manual" and auto_control_type == "plc") or (control_valve_type == "motorised" and control_mode != "manual") %}</w:t>
+        <w:t>{%p if control_mode != "manual" and auto_control_type == "plc" %}</w:t>
       </w:r>
     </w:p>
     <w:p>
@@ -5439,7 +5439,7 @@
         <w:rPr>
           <w:rFonts w:ascii="Calibri" w:cs="Calibri" w:eastAsia="Calibri" w:hAnsi="Calibri"/>
         </w:rPr>
-        <w:t xml:space="preserve">{%p if control_mode != "manual" %}</w:t>
+        <w:t>{%p if control_mode != "manual" and auto_control_type == "plc" %}</w:t>
       </w:r>
     </w:p>
     <w:p>
@@ -5852,7 +5852,7 @@
         <w:rPr>
           <w:rFonts w:ascii="Calibri" w:cs="Calibri" w:eastAsia="Calibri" w:hAnsi="Calibri"/>
         </w:rPr>
-        <w:t>{%p if (control_valve_type != "motorised" and control_mode != "manual" and auto_control_type == "plc") or (control_valve_type == "motorised" and control_mode != "manual") %}</w:t>
+        <w:t>{%p if control_mode != "manual" and auto_control_type == "plc" %}</w:t>
       </w:r>
     </w:p>
     <w:p>

</xml_diff>

<commit_message>
fix: Annexure III collapses to 3 data rows
Replaces the 5 separate supervision-charges rows (Mechanical, PLC,
to-and-fro, boarding/lodging, medical) with one consolidated row that
inlines the rates and incidentals as one paragraph. Final structure:

  Row 1: Equipment line (Horizontal/Vertical Ladle Preheater)
  Row 2: 'Supervision Charges for Erection and Commissioning:
          INR {{supervision_mech}} (Mechanical),
          INR {{supervision_plc}} (PLC and Instrumentation).
          To-and-fro fare from Delhi to site, plus boarding, lodging,
          local conveyance, and medical assistance if required.'
  Row 3: TOTAL

The mechanical / PLC rates stay live via the existing
supervision_mech / supervision_plc template variables.

Co-Authored-By: Claude Opus 4.7 (1M context) <noreply@anthropic.com>
</commit_message>
<xml_diff>
--- a/Offer_Template.docx
+++ b/Offer_Template.docx
@@ -7610,583 +7610,7 @@
               <w:jc w:val="left"/>
             </w:pPr>
             <w:r>
-              <w:t xml:space="preserve">Supervision Charges - Mechanical (per day, per person)</w:t>
-            </w:r>
-          </w:p>
-        </w:tc>
-        <w:tc>
-          <w:tcPr>
-            <w:tcW w:type="dxa" w:w="1100"/>
-            <w:tcBorders>
-              <w:top w:val="single" w:color="BFBFBF" w:sz="4"/>
-              <w:left w:val="single" w:color="BFBFBF" w:sz="4"/>
-              <w:bottom w:val="single" w:color="BFBFBF" w:sz="4"/>
-              <w:right w:val="single" w:color="BFBFBF" w:sz="4"/>
-            </w:tcBorders>
-            <w:tcMar>
-              <w:top w:type="dxa" w:w="100"/>
-              <w:left w:type="dxa" w:w="140"/>
-              <w:bottom w:type="dxa" w:w="100"/>
-              <w:right w:type="dxa" w:w="140"/>
-            </w:tcMar>
-            <w:vAlign w:val="center"/>
-          </w:tcPr>
-          <w:p>
-            <w:pPr>
-              <w:spacing w:after="40" w:before="40"/>
-              <w:jc w:val="center"/>
-            </w:pPr>
-            <w:r>
-              <w:t xml:space="preserve">As required</w:t>
-            </w:r>
-          </w:p>
-        </w:tc>
-        <w:tc>
-          <w:tcPr>
-            <w:tcW w:type="dxa" w:w="1700"/>
-            <w:tcBorders>
-              <w:top w:val="single" w:color="BFBFBF" w:sz="4"/>
-              <w:left w:val="single" w:color="BFBFBF" w:sz="4"/>
-              <w:bottom w:val="single" w:color="BFBFBF" w:sz="4"/>
-              <w:right w:val="single" w:color="BFBFBF" w:sz="4"/>
-            </w:tcBorders>
-            <w:tcMar>
-              <w:top w:type="dxa" w:w="100"/>
-              <w:left w:type="dxa" w:w="140"/>
-              <w:bottom w:type="dxa" w:w="100"/>
-              <w:right w:type="dxa" w:w="140"/>
-            </w:tcMar>
-            <w:vAlign w:val="center"/>
-          </w:tcPr>
-          <w:p>
-            <w:pPr>
-              <w:spacing w:after="40" w:before="40"/>
-              <w:jc w:val="right"/>
-            </w:pPr>
-            <w:r>
-              <w:t xml:space="preserve">{{ supervision_mech }}</w:t>
-            </w:r>
-          </w:p>
-        </w:tc>
-        <w:tc>
-          <w:tcPr>
-            <w:tcW w:type="dxa" w:w="1700"/>
-            <w:tcBorders>
-              <w:top w:val="single" w:color="BFBFBF" w:sz="4"/>
-              <w:left w:val="single" w:color="BFBFBF" w:sz="4"/>
-              <w:bottom w:val="single" w:color="BFBFBF" w:sz="4"/>
-              <w:right w:val="single" w:color="BFBFBF" w:sz="4"/>
-            </w:tcBorders>
-            <w:tcMar>
-              <w:top w:type="dxa" w:w="100"/>
-              <w:left w:type="dxa" w:w="140"/>
-              <w:bottom w:type="dxa" w:w="100"/>
-              <w:right w:type="dxa" w:w="140"/>
-            </w:tcMar>
-            <w:vAlign w:val="center"/>
-          </w:tcPr>
-          <w:p>
-            <w:pPr>
-              <w:spacing w:after="40" w:before="40"/>
-              <w:jc w:val="right"/>
-            </w:pPr>
-            <w:r>
-              <w:t xml:space="preserve">As applicable</w:t>
-            </w:r>
-          </w:p>
-        </w:tc>
-      </w:tr>
-      <w:tr>
-        <w:tc>
-          <w:tcPr>
-            <w:tcW w:type="dxa" w:w="780"/>
-            <w:tcBorders>
-              <w:top w:val="single" w:color="BFBFBF" w:sz="4"/>
-              <w:left w:val="single" w:color="BFBFBF" w:sz="4"/>
-              <w:bottom w:val="single" w:color="BFBFBF" w:sz="4"/>
-              <w:right w:val="single" w:color="BFBFBF" w:sz="4"/>
-            </w:tcBorders>
-            <w:tcMar>
-              <w:top w:type="dxa" w:w="100"/>
-              <w:left w:type="dxa" w:w="140"/>
-              <w:bottom w:type="dxa" w:w="100"/>
-              <w:right w:type="dxa" w:w="140"/>
-            </w:tcMar>
-            <w:vAlign w:val="center"/>
-          </w:tcPr>
-          <w:p>
-            <w:pPr>
-              <w:spacing w:after="40" w:before="40"/>
-              <w:jc w:val="center"/>
-            </w:pPr>
-            <w:r>
-              <w:rPr>
-                <w:rFonts w:ascii="Calibri" w:cs="Calibri" w:eastAsia="Calibri" w:hAnsi="Calibri"/>
-                <w:b/>
-                <w:bCs/>
-                <w:sz w:val="22"/>
-                <w:szCs w:val="22"/>
-              </w:rPr>
-              <w:t xml:space="preserve">3</w:t>
-            </w:r>
-          </w:p>
-        </w:tc>
-        <w:tc>
-          <w:tcPr>
-            <w:tcW w:type="dxa" w:w="4080"/>
-            <w:tcBorders>
-              <w:top w:val="single" w:color="BFBFBF" w:sz="4"/>
-              <w:left w:val="single" w:color="BFBFBF" w:sz="4"/>
-              <w:bottom w:val="single" w:color="BFBFBF" w:sz="4"/>
-              <w:right w:val="single" w:color="BFBFBF" w:sz="4"/>
-            </w:tcBorders>
-            <w:tcMar>
-              <w:top w:type="dxa" w:w="100"/>
-              <w:left w:type="dxa" w:w="140"/>
-              <w:bottom w:type="dxa" w:w="100"/>
-              <w:right w:type="dxa" w:w="140"/>
-            </w:tcMar>
-            <w:vAlign w:val="center"/>
-          </w:tcPr>
-          <w:p>
-            <w:pPr>
-              <w:spacing w:after="40" w:before="40"/>
-              <w:jc w:val="left"/>
-            </w:pPr>
-            <w:r>
-              <w:t xml:space="preserve">Supervision Charges - PLC and Instrumentation (per day, per person)</w:t>
-            </w:r>
-          </w:p>
-        </w:tc>
-        <w:tc>
-          <w:tcPr>
-            <w:tcW w:type="dxa" w:w="1100"/>
-            <w:tcBorders>
-              <w:top w:val="single" w:color="BFBFBF" w:sz="4"/>
-              <w:left w:val="single" w:color="BFBFBF" w:sz="4"/>
-              <w:bottom w:val="single" w:color="BFBFBF" w:sz="4"/>
-              <w:right w:val="single" w:color="BFBFBF" w:sz="4"/>
-            </w:tcBorders>
-            <w:tcMar>
-              <w:top w:type="dxa" w:w="100"/>
-              <w:left w:type="dxa" w:w="140"/>
-              <w:bottom w:type="dxa" w:w="100"/>
-              <w:right w:type="dxa" w:w="140"/>
-            </w:tcMar>
-            <w:vAlign w:val="center"/>
-          </w:tcPr>
-          <w:p>
-            <w:pPr>
-              <w:spacing w:after="40" w:before="40"/>
-              <w:jc w:val="center"/>
-            </w:pPr>
-            <w:r>
-              <w:t xml:space="preserve">As required</w:t>
-            </w:r>
-          </w:p>
-        </w:tc>
-        <w:tc>
-          <w:tcPr>
-            <w:tcW w:type="dxa" w:w="1700"/>
-            <w:tcBorders>
-              <w:top w:val="single" w:color="BFBFBF" w:sz="4"/>
-              <w:left w:val="single" w:color="BFBFBF" w:sz="4"/>
-              <w:bottom w:val="single" w:color="BFBFBF" w:sz="4"/>
-              <w:right w:val="single" w:color="BFBFBF" w:sz="4"/>
-            </w:tcBorders>
-            <w:tcMar>
-              <w:top w:type="dxa" w:w="100"/>
-              <w:left w:type="dxa" w:w="140"/>
-              <w:bottom w:type="dxa" w:w="100"/>
-              <w:right w:type="dxa" w:w="140"/>
-            </w:tcMar>
-            <w:vAlign w:val="center"/>
-          </w:tcPr>
-          <w:p>
-            <w:pPr>
-              <w:spacing w:after="40" w:before="40"/>
-              <w:jc w:val="right"/>
-            </w:pPr>
-            <w:r>
-              <w:t xml:space="preserve">{{ supervision_plc }}</w:t>
-            </w:r>
-          </w:p>
-        </w:tc>
-        <w:tc>
-          <w:tcPr>
-            <w:tcW w:type="dxa" w:w="1700"/>
-            <w:tcBorders>
-              <w:top w:val="single" w:color="BFBFBF" w:sz="4"/>
-              <w:left w:val="single" w:color="BFBFBF" w:sz="4"/>
-              <w:bottom w:val="single" w:color="BFBFBF" w:sz="4"/>
-              <w:right w:val="single" w:color="BFBFBF" w:sz="4"/>
-            </w:tcBorders>
-            <w:tcMar>
-              <w:top w:type="dxa" w:w="100"/>
-              <w:left w:type="dxa" w:w="140"/>
-              <w:bottom w:type="dxa" w:w="100"/>
-              <w:right w:type="dxa" w:w="140"/>
-            </w:tcMar>
-            <w:vAlign w:val="center"/>
-          </w:tcPr>
-          <w:p>
-            <w:pPr>
-              <w:spacing w:after="40" w:before="40"/>
-              <w:jc w:val="right"/>
-            </w:pPr>
-            <w:r>
-              <w:t xml:space="preserve">As applicable</w:t>
-            </w:r>
-          </w:p>
-        </w:tc>
-      </w:tr>
-      <w:tr>
-        <w:tc>
-          <w:tcPr>
-            <w:tcW w:type="dxa" w:w="780"/>
-            <w:tcBorders>
-              <w:top w:val="single" w:color="BFBFBF" w:sz="4"/>
-              <w:left w:val="single" w:color="BFBFBF" w:sz="4"/>
-              <w:bottom w:val="single" w:color="BFBFBF" w:sz="4"/>
-              <w:right w:val="single" w:color="BFBFBF" w:sz="4"/>
-            </w:tcBorders>
-            <w:tcMar>
-              <w:top w:type="dxa" w:w="100"/>
-              <w:left w:type="dxa" w:w="140"/>
-              <w:bottom w:type="dxa" w:w="100"/>
-              <w:right w:type="dxa" w:w="140"/>
-            </w:tcMar>
-            <w:vAlign w:val="center"/>
-          </w:tcPr>
-          <w:p>
-            <w:pPr>
-              <w:spacing w:after="40" w:before="40"/>
-              <w:jc w:val="center"/>
-            </w:pPr>
-            <w:r>
-              <w:rPr>
-                <w:rFonts w:ascii="Calibri" w:cs="Calibri" w:eastAsia="Calibri" w:hAnsi="Calibri"/>
-                <w:b/>
-                <w:bCs/>
-                <w:sz w:val="22"/>
-                <w:szCs w:val="22"/>
-              </w:rPr>
-              <w:t xml:space="preserve">4</w:t>
-            </w:r>
-          </w:p>
-        </w:tc>
-        <w:tc>
-          <w:tcPr>
-            <w:tcW w:type="dxa" w:w="4080"/>
-            <w:tcBorders>
-              <w:top w:val="single" w:color="BFBFBF" w:sz="4"/>
-              <w:left w:val="single" w:color="BFBFBF" w:sz="4"/>
-              <w:bottom w:val="single" w:color="BFBFBF" w:sz="4"/>
-              <w:right w:val="single" w:color="BFBFBF" w:sz="4"/>
-            </w:tcBorders>
-            <w:tcMar>
-              <w:top w:type="dxa" w:w="100"/>
-              <w:left w:type="dxa" w:w="140"/>
-              <w:bottom w:type="dxa" w:w="100"/>
-              <w:right w:type="dxa" w:w="140"/>
-            </w:tcMar>
-            <w:vAlign w:val="center"/>
-          </w:tcPr>
-          <w:p>
-            <w:pPr>
-              <w:spacing w:after="40" w:before="40"/>
-              <w:jc w:val="left"/>
-            </w:pPr>
-            <w:r>
-              <w:t xml:space="preserve">To-and-fro fare from Delhi to site</w:t>
-            </w:r>
-          </w:p>
-        </w:tc>
-        <w:tc>
-          <w:tcPr>
-            <w:tcW w:type="dxa" w:w="1100"/>
-            <w:tcBorders>
-              <w:top w:val="single" w:color="BFBFBF" w:sz="4"/>
-              <w:left w:val="single" w:color="BFBFBF" w:sz="4"/>
-              <w:bottom w:val="single" w:color="BFBFBF" w:sz="4"/>
-              <w:right w:val="single" w:color="BFBFBF" w:sz="4"/>
-            </w:tcBorders>
-            <w:tcMar>
-              <w:top w:type="dxa" w:w="100"/>
-              <w:left w:type="dxa" w:w="140"/>
-              <w:bottom w:type="dxa" w:w="100"/>
-              <w:right w:type="dxa" w:w="140"/>
-            </w:tcMar>
-            <w:vAlign w:val="center"/>
-          </w:tcPr>
-          <w:p>
-            <w:pPr>
-              <w:spacing w:after="40" w:before="40"/>
-              <w:jc w:val="center"/>
-            </w:pPr>
-            <w:r>
-              <w:t xml:space="preserve">As actual</w:t>
-            </w:r>
-          </w:p>
-        </w:tc>
-        <w:tc>
-          <w:tcPr>
-            <w:tcW w:type="dxa" w:w="1700"/>
-            <w:tcBorders>
-              <w:top w:val="single" w:color="BFBFBF" w:sz="4"/>
-              <w:left w:val="single" w:color="BFBFBF" w:sz="4"/>
-              <w:bottom w:val="single" w:color="BFBFBF" w:sz="4"/>
-              <w:right w:val="single" w:color="BFBFBF" w:sz="4"/>
-            </w:tcBorders>
-            <w:tcMar>
-              <w:top w:type="dxa" w:w="100"/>
-              <w:left w:type="dxa" w:w="140"/>
-              <w:bottom w:type="dxa" w:w="100"/>
-              <w:right w:type="dxa" w:w="140"/>
-            </w:tcMar>
-            <w:vAlign w:val="center"/>
-          </w:tcPr>
-          <w:p>
-            <w:pPr>
-              <w:spacing w:after="40" w:before="40"/>
-              <w:jc w:val="right"/>
-            </w:pPr>
-            <w:r>
-              <w:t xml:space="preserve">-</w:t>
-            </w:r>
-          </w:p>
-        </w:tc>
-        <w:tc>
-          <w:tcPr>
-            <w:tcW w:type="dxa" w:w="1700"/>
-            <w:tcBorders>
-              <w:top w:val="single" w:color="BFBFBF" w:sz="4"/>
-              <w:left w:val="single" w:color="BFBFBF" w:sz="4"/>
-              <w:bottom w:val="single" w:color="BFBFBF" w:sz="4"/>
-              <w:right w:val="single" w:color="BFBFBF" w:sz="4"/>
-            </w:tcBorders>
-            <w:tcMar>
-              <w:top w:type="dxa" w:w="100"/>
-              <w:left w:type="dxa" w:w="140"/>
-              <w:bottom w:type="dxa" w:w="100"/>
-              <w:right w:type="dxa" w:w="140"/>
-            </w:tcMar>
-            <w:vAlign w:val="center"/>
-          </w:tcPr>
-          <w:p>
-            <w:pPr>
-              <w:spacing w:after="40" w:before="40"/>
-              <w:jc w:val="right"/>
-            </w:pPr>
-            <w:r>
-              <w:t xml:space="preserve">-</w:t>
-            </w:r>
-          </w:p>
-        </w:tc>
-      </w:tr>
-      <w:tr>
-        <w:tc>
-          <w:tcPr>
-            <w:tcW w:type="dxa" w:w="780"/>
-            <w:tcBorders>
-              <w:top w:val="single" w:color="BFBFBF" w:sz="4"/>
-              <w:left w:val="single" w:color="BFBFBF" w:sz="4"/>
-              <w:bottom w:val="single" w:color="BFBFBF" w:sz="4"/>
-              <w:right w:val="single" w:color="BFBFBF" w:sz="4"/>
-            </w:tcBorders>
-            <w:tcMar>
-              <w:top w:type="dxa" w:w="100"/>
-              <w:left w:type="dxa" w:w="140"/>
-              <w:bottom w:type="dxa" w:w="100"/>
-              <w:right w:type="dxa" w:w="140"/>
-            </w:tcMar>
-            <w:vAlign w:val="center"/>
-          </w:tcPr>
-          <w:p>
-            <w:pPr>
-              <w:spacing w:after="40" w:before="40"/>
-              <w:jc w:val="center"/>
-            </w:pPr>
-            <w:r>
-              <w:rPr>
-                <w:rFonts w:ascii="Calibri" w:cs="Calibri" w:eastAsia="Calibri" w:hAnsi="Calibri"/>
-                <w:b/>
-                <w:bCs/>
-                <w:sz w:val="22"/>
-                <w:szCs w:val="22"/>
-              </w:rPr>
-              <w:t xml:space="preserve">5</w:t>
-            </w:r>
-          </w:p>
-        </w:tc>
-        <w:tc>
-          <w:tcPr>
-            <w:tcW w:type="dxa" w:w="4080"/>
-            <w:tcBorders>
-              <w:top w:val="single" w:color="BFBFBF" w:sz="4"/>
-              <w:left w:val="single" w:color="BFBFBF" w:sz="4"/>
-              <w:bottom w:val="single" w:color="BFBFBF" w:sz="4"/>
-              <w:right w:val="single" w:color="BFBFBF" w:sz="4"/>
-            </w:tcBorders>
-            <w:tcMar>
-              <w:top w:type="dxa" w:w="100"/>
-              <w:left w:type="dxa" w:w="140"/>
-              <w:bottom w:type="dxa" w:w="100"/>
-              <w:right w:type="dxa" w:w="140"/>
-            </w:tcMar>
-            <w:vAlign w:val="center"/>
-          </w:tcPr>
-          <w:p>
-            <w:pPr>
-              <w:spacing w:after="40" w:before="40"/>
-              <w:jc w:val="left"/>
-            </w:pPr>
-            <w:r>
-              <w:t xml:space="preserve">Boarding, lodging, and local conveyance at site</w:t>
-            </w:r>
-          </w:p>
-        </w:tc>
-        <w:tc>
-          <w:tcPr>
-            <w:tcW w:type="dxa" w:w="1100"/>
-            <w:tcBorders>
-              <w:top w:val="single" w:color="BFBFBF" w:sz="4"/>
-              <w:left w:val="single" w:color="BFBFBF" w:sz="4"/>
-              <w:bottom w:val="single" w:color="BFBFBF" w:sz="4"/>
-              <w:right w:val="single" w:color="BFBFBF" w:sz="4"/>
-            </w:tcBorders>
-            <w:tcMar>
-              <w:top w:type="dxa" w:w="100"/>
-              <w:left w:type="dxa" w:w="140"/>
-              <w:bottom w:type="dxa" w:w="100"/>
-              <w:right w:type="dxa" w:w="140"/>
-            </w:tcMar>
-            <w:vAlign w:val="center"/>
-          </w:tcPr>
-          <w:p>
-            <w:pPr>
-              <w:spacing w:after="40" w:before="40"/>
-              <w:jc w:val="center"/>
-            </w:pPr>
-            <w:r>
-              <w:t xml:space="preserve">As actual</w:t>
-            </w:r>
-          </w:p>
-        </w:tc>
-        <w:tc>
-          <w:tcPr>
-            <w:tcW w:type="dxa" w:w="1700"/>
-            <w:tcBorders>
-              <w:top w:val="single" w:color="BFBFBF" w:sz="4"/>
-              <w:left w:val="single" w:color="BFBFBF" w:sz="4"/>
-              <w:bottom w:val="single" w:color="BFBFBF" w:sz="4"/>
-              <w:right w:val="single" w:color="BFBFBF" w:sz="4"/>
-            </w:tcBorders>
-            <w:tcMar>
-              <w:top w:type="dxa" w:w="100"/>
-              <w:left w:type="dxa" w:w="140"/>
-              <w:bottom w:type="dxa" w:w="100"/>
-              <w:right w:type="dxa" w:w="140"/>
-            </w:tcMar>
-            <w:vAlign w:val="center"/>
-          </w:tcPr>
-          <w:p>
-            <w:pPr>
-              <w:spacing w:after="40" w:before="40"/>
-              <w:jc w:val="right"/>
-            </w:pPr>
-            <w:r>
-              <w:t xml:space="preserve">-</w:t>
-            </w:r>
-          </w:p>
-        </w:tc>
-        <w:tc>
-          <w:tcPr>
-            <w:tcW w:type="dxa" w:w="1700"/>
-            <w:tcBorders>
-              <w:top w:val="single" w:color="BFBFBF" w:sz="4"/>
-              <w:left w:val="single" w:color="BFBFBF" w:sz="4"/>
-              <w:bottom w:val="single" w:color="BFBFBF" w:sz="4"/>
-              <w:right w:val="single" w:color="BFBFBF" w:sz="4"/>
-            </w:tcBorders>
-            <w:tcMar>
-              <w:top w:type="dxa" w:w="100"/>
-              <w:left w:type="dxa" w:w="140"/>
-              <w:bottom w:type="dxa" w:w="100"/>
-              <w:right w:type="dxa" w:w="140"/>
-            </w:tcMar>
-            <w:vAlign w:val="center"/>
-          </w:tcPr>
-          <w:p>
-            <w:pPr>
-              <w:spacing w:after="40" w:before="40"/>
-              <w:jc w:val="right"/>
-            </w:pPr>
-            <w:r>
-              <w:t xml:space="preserve">-</w:t>
-            </w:r>
-          </w:p>
-        </w:tc>
-      </w:tr>
-      <w:tr>
-        <w:tc>
-          <w:tcPr>
-            <w:tcW w:type="dxa" w:w="780"/>
-            <w:tcBorders>
-              <w:top w:val="single" w:color="BFBFBF" w:sz="4"/>
-              <w:left w:val="single" w:color="BFBFBF" w:sz="4"/>
-              <w:bottom w:val="single" w:color="BFBFBF" w:sz="4"/>
-              <w:right w:val="single" w:color="BFBFBF" w:sz="4"/>
-            </w:tcBorders>
-            <w:tcMar>
-              <w:top w:type="dxa" w:w="100"/>
-              <w:left w:type="dxa" w:w="140"/>
-              <w:bottom w:type="dxa" w:w="100"/>
-              <w:right w:type="dxa" w:w="140"/>
-            </w:tcMar>
-            <w:vAlign w:val="center"/>
-          </w:tcPr>
-          <w:p>
-            <w:pPr>
-              <w:spacing w:after="40" w:before="40"/>
-              <w:jc w:val="center"/>
-            </w:pPr>
-            <w:r>
-              <w:rPr>
-                <w:rFonts w:ascii="Calibri" w:cs="Calibri" w:eastAsia="Calibri" w:hAnsi="Calibri"/>
-                <w:b/>
-                <w:bCs/>
-                <w:sz w:val="22"/>
-                <w:szCs w:val="22"/>
-              </w:rPr>
-              <w:t xml:space="preserve">6</w:t>
-            </w:r>
-          </w:p>
-        </w:tc>
-        <w:tc>
-          <w:tcPr>
-            <w:tcW w:type="dxa" w:w="4080"/>
-            <w:tcBorders>
-              <w:top w:val="single" w:color="BFBFBF" w:sz="4"/>
-              <w:left w:val="single" w:color="BFBFBF" w:sz="4"/>
-              <w:bottom w:val="single" w:color="BFBFBF" w:sz="4"/>
-              <w:right w:val="single" w:color="BFBFBF" w:sz="4"/>
-            </w:tcBorders>
-            <w:tcMar>
-              <w:top w:type="dxa" w:w="100"/>
-              <w:left w:type="dxa" w:w="140"/>
-              <w:bottom w:type="dxa" w:w="100"/>
-              <w:right w:type="dxa" w:w="140"/>
-            </w:tcMar>
-            <w:vAlign w:val="center"/>
-          </w:tcPr>
-          <w:p>
-            <w:pPr>
-              <w:spacing w:after="40" w:before="40"/>
-              <w:jc w:val="left"/>
-            </w:pPr>
-            <w:r>
-              <w:t xml:space="preserve">Medical assistance, if required</w:t>
+              <w:t xml:space="preserve">Supervision Charges for Erection and Commissioning: INR {{ supervision_mech }} (Mechanical), INR {{ supervision_plc }} (PLC and Instrumentation). To-and-fro fare from Delhi to site, plus boarding, lodging, local conveyance, and medical assistance if required.</w:t>
             </w:r>
           </w:p>
         </w:tc>

</xml_diff>

<commit_message>
fix: TCS PLC mode adds orifice+DPT on fuel line and air line
Two new bullets gated to PLC mode (auto_control_type == 'plc'):
  - Orifice plate fitted with differential pressure transmitter on
    gas/oil line (uses is_oil to swap label)
  - Orifice plate fitted with differential pressure transmitter on
    air line

Other modes (PLC+AGR, PID, P.PID with Ratio Controller, Manual) skip
both bullets — those modes get AGR or Ratio Controller instead.

Co-Authored-By: Claude Opus 4.7 (1M context) <noreply@anthropic.com>
</commit_message>
<xml_diff>
--- a/Offer_Template.docx
+++ b/Offer_Template.docx
@@ -5841,6 +5841,66 @@
           <w:szCs w:val="22"/>
         </w:rPr>
         <w:t xml:space="preserve">Thermocouple</w:t>
+      </w:r>
+    </w:p>
+    <w:p>
+      <w:pPr>
+        <w:spacing w:after="60" w:before="60" w:line="300"/>
+        <w:jc w:val="left"/>
+      </w:pPr>
+      <w:r>
+        <w:rPr>
+          <w:rFonts w:ascii="Calibri" w:cs="Calibri" w:eastAsia="Calibri" w:hAnsi="Calibri"/>
+        </w:rPr>
+        <w:t xml:space="preserve">{%p if control_mode != "manual" and auto_control_type == "plc" %}</w:t>
+      </w:r>
+    </w:p>
+    <w:p>
+      <w:pPr>
+        <w:pStyle w:val="ListParagraph"/>
+        <w:numPr>
+          <w:ilvl w:val="0"/>
+          <w:numId w:val="2"/>
+        </w:numPr>
+        <w:spacing w:after="40" w:before="40" w:line="280"/>
+      </w:pPr>
+      <w:r>
+        <w:rPr>
+          <w:rFonts w:ascii="Calibri" w:cs="Calibri" w:eastAsia="Calibri" w:hAnsi="Calibri"/>
+          <w:sz w:val="22"/>
+          <w:szCs w:val="22"/>
+        </w:rPr>
+        <w:t xml:space="preserve">Orifice plate fitted with differential pressure transmitter on {% if is_oil %}oil{% else %}gas{% endif %} line</w:t>
+      </w:r>
+    </w:p>
+    <w:p>
+      <w:pPr>
+        <w:pStyle w:val="ListParagraph"/>
+        <w:numPr>
+          <w:ilvl w:val="0"/>
+          <w:numId w:val="2"/>
+        </w:numPr>
+        <w:spacing w:after="40" w:before="40" w:line="280"/>
+      </w:pPr>
+      <w:r>
+        <w:rPr>
+          <w:rFonts w:ascii="Calibri" w:cs="Calibri" w:eastAsia="Calibri" w:hAnsi="Calibri"/>
+          <w:sz w:val="22"/>
+          <w:szCs w:val="22"/>
+        </w:rPr>
+        <w:t xml:space="preserve">Orifice plate fitted with differential pressure transmitter on air line</w:t>
+      </w:r>
+    </w:p>
+    <w:p>
+      <w:pPr>
+        <w:spacing w:after="60" w:before="60" w:line="300"/>
+        <w:jc w:val="left"/>
+      </w:pPr>
+      <w:r>
+        <w:rPr>
+          <w:rFonts w:ascii="Calibri" w:cs="Calibri" w:eastAsia="Calibri" w:hAnsi="Calibri"/>
+        </w:rPr>
+        <w:t xml:space="preserve">{%p endif %}</w:t>
       </w:r>
     </w:p>
     <w:p>

</xml_diff>

<commit_message>
fix: tech-spec table picks up form fields that weren't wired
Five fields filled in the cost form's tech-data preview were not
making it to the offer's Tech Specs table. Added rows wired to the
existing template variables:

  - Ladle Dimensions      -> {{ladle_dim}}
  - Drawing No.           -> {{ladle_drawing_no}}
  - No. of Burner         -> {{num_burners}} No.
  - No. of Units          -> {{horizontal_qty}} or {{vertical_qty}}
                             (inline Jinja switches on is_horizontal)
  - Blower Size           -> {{blower_size}}

Layout matches the form preview ordering.

Co-Authored-By: Claude Opus 4.7 (1M context) <noreply@anthropic.com>
</commit_message>
<xml_diff>
--- a/Offer_Template.docx
+++ b/Offer_Template.docx
@@ -3077,7 +3077,7 @@
               <w:bottom w:val="single" w:color="BFBFBF" w:sz="4"/>
               <w:right w:val="single" w:color="BFBFBF" w:sz="4"/>
             </w:tcBorders>
-            <w:shd w:fill="F3F4F6" w:val="clear"/>
+            <w:shd w:fill="FFFFFF" w:val="clear"/>
             <w:tcMar>
               <w:top w:type="dxa" w:w="100"/>
               <w:left w:type="dxa" w:w="140"/>
@@ -3099,7 +3099,7 @@
                 <w:sz w:val="22"/>
                 <w:szCs w:val="22"/>
               </w:rPr>
-              <w:t xml:space="preserve">Weight of Refractory Lining</w:t>
+              <w:t xml:space="preserve">Ladle Dimensions</w:t>
             </w:r>
           </w:p>
         </w:tc>
@@ -3112,22 +3112,22 @@
               <w:bottom w:val="single" w:color="BFBFBF" w:sz="4"/>
               <w:right w:val="single" w:color="BFBFBF" w:sz="4"/>
             </w:tcBorders>
-            <w:shd w:fill="F3F4F6" w:val="clear"/>
-            <w:tcMar>
-              <w:top w:type="dxa" w:w="100"/>
-              <w:left w:type="dxa" w:w="140"/>
-              <w:bottom w:type="dxa" w:w="100"/>
-              <w:right w:type="dxa" w:w="140"/>
-            </w:tcMar>
-            <w:vAlign w:val="center"/>
-          </w:tcPr>
-          <w:p>
-            <w:pPr>
-              <w:spacing w:after="40" w:before="40"/>
-              <w:jc w:val="left"/>
-            </w:pPr>
-            <w:r>
-              <w:t>{{refractory_weight_kg}}</w:t>
+            <w:shd w:fill="FFFFFF" w:val="clear"/>
+            <w:tcMar>
+              <w:top w:type="dxa" w:w="100"/>
+              <w:left w:type="dxa" w:w="140"/>
+              <w:bottom w:type="dxa" w:w="100"/>
+              <w:right w:type="dxa" w:w="140"/>
+            </w:tcMar>
+            <w:vAlign w:val="center"/>
+          </w:tcPr>
+          <w:p>
+            <w:pPr>
+              <w:spacing w:after="40" w:before="40"/>
+              <w:jc w:val="left"/>
+            </w:pPr>
+            <w:r>
+              <w:t xml:space="preserve">{{ladle_dim}}</w:t>
             </w:r>
           </w:p>
         </w:tc>
@@ -3164,7 +3164,7 @@
                 <w:sz w:val="22"/>
                 <w:szCs w:val="22"/>
               </w:rPr>
-              <w:t xml:space="preserve">Heating Temperature</w:t>
+              <w:t xml:space="preserve">Drawing No.</w:t>
             </w:r>
           </w:p>
         </w:tc>
@@ -3192,7 +3192,7 @@
               <w:jc w:val="left"/>
             </w:pPr>
             <w:r>
-              <w:t>{{heating_schedule}}</w:t>
+              <w:t xml:space="preserve">{{ladle_drawing_no}}</w:t>
             </w:r>
           </w:p>
         </w:tc>
@@ -3229,7 +3229,7 @@
                 <w:sz w:val="22"/>
                 <w:szCs w:val="22"/>
               </w:rPr>
-              <w:t xml:space="preserve">Heating Time</w:t>
+              <w:t xml:space="preserve">Weight of Refractory Lining</w:t>
             </w:r>
           </w:p>
         </w:tc>
@@ -3257,7 +3257,7 @@
               <w:jc w:val="left"/>
             </w:pPr>
             <w:r>
-              <w:t>{{heating_time}}</w:t>
+              <w:t>{{refractory_weight_kg}}</w:t>
             </w:r>
           </w:p>
         </w:tc>
@@ -3294,7 +3294,7 @@
                 <w:sz w:val="22"/>
                 <w:szCs w:val="22"/>
               </w:rPr>
-              <w:t xml:space="preserve">Type of Fuel</w:t>
+              <w:t xml:space="preserve">Heating Temperature</w:t>
             </w:r>
           </w:p>
         </w:tc>
@@ -3322,7 +3322,7 @@
               <w:jc w:val="left"/>
             </w:pPr>
             <w:r>
-              <w:t>{{fuel_name}}</w:t>
+              <w:t>{{heating_schedule}}</w:t>
             </w:r>
           </w:p>
         </w:tc>
@@ -3359,7 +3359,7 @@
                 <w:sz w:val="22"/>
                 <w:szCs w:val="22"/>
               </w:rPr>
-              <w:t xml:space="preserve">Calorific Value of Fuel</w:t>
+              <w:t xml:space="preserve">Heating Time</w:t>
             </w:r>
           </w:p>
         </w:tc>
@@ -3387,7 +3387,7 @@
               <w:jc w:val="left"/>
             </w:pPr>
             <w:r>
-              <w:t>{{fuel_cv}}</w:t>
+              <w:t>{{heating_time}}</w:t>
             </w:r>
           </w:p>
         </w:tc>
@@ -3402,7 +3402,7 @@
               <w:bottom w:val="single" w:color="BFBFBF" w:sz="4"/>
               <w:right w:val="single" w:color="BFBFBF" w:sz="4"/>
             </w:tcBorders>
-            <w:shd w:fill="FFFFFF" w:val="clear"/>
+            <w:shd w:fill="F3F4F6" w:val="clear"/>
             <w:tcMar>
               <w:top w:type="dxa" w:w="100"/>
               <w:left w:type="dxa" w:w="140"/>
@@ -3424,7 +3424,7 @@
                 <w:sz w:val="22"/>
                 <w:szCs w:val="22"/>
               </w:rPr>
-              <w:t>Firing Rate</w:t>
+              <w:t xml:space="preserve">No. of Burner</w:t>
             </w:r>
           </w:p>
         </w:tc>
@@ -3437,22 +3437,22 @@
               <w:bottom w:val="single" w:color="BFBFBF" w:sz="4"/>
               <w:right w:val="single" w:color="BFBFBF" w:sz="4"/>
             </w:tcBorders>
-            <w:shd w:fill="FFFFFF" w:val="clear"/>
-            <w:tcMar>
-              <w:top w:type="dxa" w:w="100"/>
-              <w:left w:type="dxa" w:w="140"/>
-              <w:bottom w:type="dxa" w:w="100"/>
-              <w:right w:type="dxa" w:w="140"/>
-            </w:tcMar>
-            <w:vAlign w:val="center"/>
-          </w:tcPr>
-          <w:p>
-            <w:pPr>
-              <w:spacing w:after="40" w:before="40"/>
-              <w:jc w:val="left"/>
-            </w:pPr>
-            <w:r>
-              <w:t>{{fuel_consumption}}</w:t>
+            <w:shd w:fill="F3F4F6" w:val="clear"/>
+            <w:tcMar>
+              <w:top w:type="dxa" w:w="100"/>
+              <w:left w:type="dxa" w:w="140"/>
+              <w:bottom w:type="dxa" w:w="100"/>
+              <w:right w:type="dxa" w:w="140"/>
+            </w:tcMar>
+            <w:vAlign w:val="center"/>
+          </w:tcPr>
+          <w:p>
+            <w:pPr>
+              <w:spacing w:after="40" w:before="40"/>
+              <w:jc w:val="left"/>
+            </w:pPr>
+            <w:r>
+              <w:t xml:space="preserve">{{num_burners}} No.</w:t>
             </w:r>
           </w:p>
         </w:tc>
@@ -3489,7 +3489,7 @@
                 <w:sz w:val="22"/>
                 <w:szCs w:val="22"/>
               </w:rPr>
-              <w:t>Burner Capacity</w:t>
+              <w:t xml:space="preserve">No. of Units</w:t>
             </w:r>
           </w:p>
         </w:tc>
@@ -3517,7 +3517,7 @@
               <w:jc w:val="left"/>
             </w:pPr>
             <w:r>
-              <w:t>{{burner_capacity_range}}</w:t>
+              <w:t xml:space="preserve">{% if is_horizontal %}{{horizontal_qty}}{% else %}{{vertical_qty}}{% endif %}</w:t>
             </w:r>
           </w:p>
         </w:tc>
@@ -3554,6 +3554,266 @@
                 <w:sz w:val="22"/>
                 <w:szCs w:val="22"/>
               </w:rPr>
+              <w:t xml:space="preserve">Type of Fuel</w:t>
+            </w:r>
+          </w:p>
+        </w:tc>
+        <w:tc>
+          <w:tcPr>
+            <w:tcW w:type="dxa" w:w="5616"/>
+            <w:tcBorders>
+              <w:top w:val="single" w:color="BFBFBF" w:sz="4"/>
+              <w:left w:val="single" w:color="BFBFBF" w:sz="4"/>
+              <w:bottom w:val="single" w:color="BFBFBF" w:sz="4"/>
+              <w:right w:val="single" w:color="BFBFBF" w:sz="4"/>
+            </w:tcBorders>
+            <w:shd w:fill="FFFFFF" w:val="clear"/>
+            <w:tcMar>
+              <w:top w:type="dxa" w:w="100"/>
+              <w:left w:type="dxa" w:w="140"/>
+              <w:bottom w:type="dxa" w:w="100"/>
+              <w:right w:type="dxa" w:w="140"/>
+            </w:tcMar>
+            <w:vAlign w:val="center"/>
+          </w:tcPr>
+          <w:p>
+            <w:pPr>
+              <w:spacing w:after="40" w:before="40"/>
+              <w:jc w:val="left"/>
+            </w:pPr>
+            <w:r>
+              <w:t>{{fuel_name}}</w:t>
+            </w:r>
+          </w:p>
+        </w:tc>
+      </w:tr>
+      <w:tr>
+        <w:tc>
+          <w:tcPr>
+            <w:tcW w:type="dxa" w:w="3744"/>
+            <w:tcBorders>
+              <w:top w:val="single" w:color="BFBFBF" w:sz="4"/>
+              <w:left w:val="single" w:color="BFBFBF" w:sz="4"/>
+              <w:bottom w:val="single" w:color="BFBFBF" w:sz="4"/>
+              <w:right w:val="single" w:color="BFBFBF" w:sz="4"/>
+            </w:tcBorders>
+            <w:shd w:fill="F3F4F6" w:val="clear"/>
+            <w:tcMar>
+              <w:top w:type="dxa" w:w="100"/>
+              <w:left w:type="dxa" w:w="140"/>
+              <w:bottom w:type="dxa" w:w="100"/>
+              <w:right w:type="dxa" w:w="140"/>
+            </w:tcMar>
+            <w:vAlign w:val="center"/>
+          </w:tcPr>
+          <w:p>
+            <w:pPr>
+              <w:spacing w:after="40" w:before="40"/>
+              <w:jc w:val="left"/>
+            </w:pPr>
+            <w:r>
+              <w:rPr>
+                <w:rFonts w:ascii="Calibri" w:cs="Calibri" w:eastAsia="Calibri" w:hAnsi="Calibri"/>
+                <w:b/>
+                <w:bCs/>
+                <w:sz w:val="22"/>
+                <w:szCs w:val="22"/>
+              </w:rPr>
+              <w:t xml:space="preserve">Calorific Value of Fuel</w:t>
+            </w:r>
+          </w:p>
+        </w:tc>
+        <w:tc>
+          <w:tcPr>
+            <w:tcW w:type="dxa" w:w="5616"/>
+            <w:tcBorders>
+              <w:top w:val="single" w:color="BFBFBF" w:sz="4"/>
+              <w:left w:val="single" w:color="BFBFBF" w:sz="4"/>
+              <w:bottom w:val="single" w:color="BFBFBF" w:sz="4"/>
+              <w:right w:val="single" w:color="BFBFBF" w:sz="4"/>
+            </w:tcBorders>
+            <w:shd w:fill="F3F4F6" w:val="clear"/>
+            <w:tcMar>
+              <w:top w:type="dxa" w:w="100"/>
+              <w:left w:type="dxa" w:w="140"/>
+              <w:bottom w:type="dxa" w:w="100"/>
+              <w:right w:type="dxa" w:w="140"/>
+            </w:tcMar>
+            <w:vAlign w:val="center"/>
+          </w:tcPr>
+          <w:p>
+            <w:pPr>
+              <w:spacing w:after="40" w:before="40"/>
+              <w:jc w:val="left"/>
+            </w:pPr>
+            <w:r>
+              <w:t>{{fuel_cv}}</w:t>
+            </w:r>
+          </w:p>
+        </w:tc>
+      </w:tr>
+      <w:tr>
+        <w:tc>
+          <w:tcPr>
+            <w:tcW w:type="dxa" w:w="3744"/>
+            <w:tcBorders>
+              <w:top w:val="single" w:color="BFBFBF" w:sz="4"/>
+              <w:left w:val="single" w:color="BFBFBF" w:sz="4"/>
+              <w:bottom w:val="single" w:color="BFBFBF" w:sz="4"/>
+              <w:right w:val="single" w:color="BFBFBF" w:sz="4"/>
+            </w:tcBorders>
+            <w:shd w:fill="FFFFFF" w:val="clear"/>
+            <w:tcMar>
+              <w:top w:type="dxa" w:w="100"/>
+              <w:left w:type="dxa" w:w="140"/>
+              <w:bottom w:type="dxa" w:w="100"/>
+              <w:right w:type="dxa" w:w="140"/>
+            </w:tcMar>
+            <w:vAlign w:val="center"/>
+          </w:tcPr>
+          <w:p>
+            <w:pPr>
+              <w:spacing w:after="40" w:before="40"/>
+              <w:jc w:val="left"/>
+            </w:pPr>
+            <w:r>
+              <w:rPr>
+                <w:rFonts w:ascii="Calibri" w:cs="Calibri" w:eastAsia="Calibri" w:hAnsi="Calibri"/>
+                <w:b/>
+                <w:bCs/>
+                <w:sz w:val="22"/>
+                <w:szCs w:val="22"/>
+              </w:rPr>
+              <w:t>Firing Rate</w:t>
+            </w:r>
+          </w:p>
+        </w:tc>
+        <w:tc>
+          <w:tcPr>
+            <w:tcW w:type="dxa" w:w="5616"/>
+            <w:tcBorders>
+              <w:top w:val="single" w:color="BFBFBF" w:sz="4"/>
+              <w:left w:val="single" w:color="BFBFBF" w:sz="4"/>
+              <w:bottom w:val="single" w:color="BFBFBF" w:sz="4"/>
+              <w:right w:val="single" w:color="BFBFBF" w:sz="4"/>
+            </w:tcBorders>
+            <w:shd w:fill="FFFFFF" w:val="clear"/>
+            <w:tcMar>
+              <w:top w:type="dxa" w:w="100"/>
+              <w:left w:type="dxa" w:w="140"/>
+              <w:bottom w:type="dxa" w:w="100"/>
+              <w:right w:type="dxa" w:w="140"/>
+            </w:tcMar>
+            <w:vAlign w:val="center"/>
+          </w:tcPr>
+          <w:p>
+            <w:pPr>
+              <w:spacing w:after="40" w:before="40"/>
+              <w:jc w:val="left"/>
+            </w:pPr>
+            <w:r>
+              <w:t>{{fuel_consumption}}</w:t>
+            </w:r>
+          </w:p>
+        </w:tc>
+      </w:tr>
+      <w:tr>
+        <w:tc>
+          <w:tcPr>
+            <w:tcW w:type="dxa" w:w="3744"/>
+            <w:tcBorders>
+              <w:top w:val="single" w:color="BFBFBF" w:sz="4"/>
+              <w:left w:val="single" w:color="BFBFBF" w:sz="4"/>
+              <w:bottom w:val="single" w:color="BFBFBF" w:sz="4"/>
+              <w:right w:val="single" w:color="BFBFBF" w:sz="4"/>
+            </w:tcBorders>
+            <w:shd w:fill="F3F4F6" w:val="clear"/>
+            <w:tcMar>
+              <w:top w:type="dxa" w:w="100"/>
+              <w:left w:type="dxa" w:w="140"/>
+              <w:bottom w:type="dxa" w:w="100"/>
+              <w:right w:type="dxa" w:w="140"/>
+            </w:tcMar>
+            <w:vAlign w:val="center"/>
+          </w:tcPr>
+          <w:p>
+            <w:pPr>
+              <w:spacing w:after="40" w:before="40"/>
+              <w:jc w:val="left"/>
+            </w:pPr>
+            <w:r>
+              <w:rPr>
+                <w:rFonts w:ascii="Calibri" w:cs="Calibri" w:eastAsia="Calibri" w:hAnsi="Calibri"/>
+                <w:b/>
+                <w:bCs/>
+                <w:sz w:val="22"/>
+                <w:szCs w:val="22"/>
+              </w:rPr>
+              <w:t>Burner Capacity</w:t>
+            </w:r>
+          </w:p>
+        </w:tc>
+        <w:tc>
+          <w:tcPr>
+            <w:tcW w:type="dxa" w:w="5616"/>
+            <w:tcBorders>
+              <w:top w:val="single" w:color="BFBFBF" w:sz="4"/>
+              <w:left w:val="single" w:color="BFBFBF" w:sz="4"/>
+              <w:bottom w:val="single" w:color="BFBFBF" w:sz="4"/>
+              <w:right w:val="single" w:color="BFBFBF" w:sz="4"/>
+            </w:tcBorders>
+            <w:shd w:fill="F3F4F6" w:val="clear"/>
+            <w:tcMar>
+              <w:top w:type="dxa" w:w="100"/>
+              <w:left w:type="dxa" w:w="140"/>
+              <w:bottom w:type="dxa" w:w="100"/>
+              <w:right w:type="dxa" w:w="140"/>
+            </w:tcMar>
+            <w:vAlign w:val="center"/>
+          </w:tcPr>
+          <w:p>
+            <w:pPr>
+              <w:spacing w:after="40" w:before="40"/>
+              <w:jc w:val="left"/>
+            </w:pPr>
+            <w:r>
+              <w:t>{{burner_capacity_range}}</w:t>
+            </w:r>
+          </w:p>
+        </w:tc>
+      </w:tr>
+      <w:tr>
+        <w:tc>
+          <w:tcPr>
+            <w:tcW w:type="dxa" w:w="3744"/>
+            <w:tcBorders>
+              <w:top w:val="single" w:color="BFBFBF" w:sz="4"/>
+              <w:left w:val="single" w:color="BFBFBF" w:sz="4"/>
+              <w:bottom w:val="single" w:color="BFBFBF" w:sz="4"/>
+              <w:right w:val="single" w:color="BFBFBF" w:sz="4"/>
+            </w:tcBorders>
+            <w:shd w:fill="FFFFFF" w:val="clear"/>
+            <w:tcMar>
+              <w:top w:type="dxa" w:w="100"/>
+              <w:left w:type="dxa" w:w="140"/>
+              <w:bottom w:type="dxa" w:w="100"/>
+              <w:right w:type="dxa" w:w="140"/>
+            </w:tcMar>
+            <w:vAlign w:val="center"/>
+          </w:tcPr>
+          <w:p>
+            <w:pPr>
+              <w:spacing w:after="40" w:before="40"/>
+              <w:jc w:val="left"/>
+            </w:pPr>
+            <w:r>
+              <w:rPr>
+                <w:rFonts w:ascii="Calibri" w:cs="Calibri" w:eastAsia="Calibri" w:hAnsi="Calibri"/>
+                <w:b/>
+                <w:bCs/>
+                <w:sz w:val="22"/>
+                <w:szCs w:val="22"/>
+              </w:rPr>
               <w:t xml:space="preserve">Combustion Air Blower</w:t>
             </w:r>
           </w:p>
@@ -3583,6 +3843,71 @@
             </w:pPr>
             <w:r>
               <w:t>{{blower_model}}</w:t>
+            </w:r>
+          </w:p>
+        </w:tc>
+      </w:tr>
+      <w:tr>
+        <w:tc>
+          <w:tcPr>
+            <w:tcW w:type="dxa" w:w="3744"/>
+            <w:tcBorders>
+              <w:top w:val="single" w:color="BFBFBF" w:sz="4"/>
+              <w:left w:val="single" w:color="BFBFBF" w:sz="4"/>
+              <w:bottom w:val="single" w:color="BFBFBF" w:sz="4"/>
+              <w:right w:val="single" w:color="BFBFBF" w:sz="4"/>
+            </w:tcBorders>
+            <w:shd w:fill="FFFFFF" w:val="clear"/>
+            <w:tcMar>
+              <w:top w:type="dxa" w:w="100"/>
+              <w:left w:type="dxa" w:w="140"/>
+              <w:bottom w:type="dxa" w:w="100"/>
+              <w:right w:type="dxa" w:w="140"/>
+            </w:tcMar>
+            <w:vAlign w:val="center"/>
+          </w:tcPr>
+          <w:p>
+            <w:pPr>
+              <w:spacing w:after="40" w:before="40"/>
+              <w:jc w:val="left"/>
+            </w:pPr>
+            <w:r>
+              <w:rPr>
+                <w:rFonts w:ascii="Calibri" w:cs="Calibri" w:eastAsia="Calibri" w:hAnsi="Calibri"/>
+                <w:b/>
+                <w:bCs/>
+                <w:sz w:val="22"/>
+                <w:szCs w:val="22"/>
+              </w:rPr>
+              <w:t xml:space="preserve">Blower Size</w:t>
+            </w:r>
+          </w:p>
+        </w:tc>
+        <w:tc>
+          <w:tcPr>
+            <w:tcW w:type="dxa" w:w="5616"/>
+            <w:tcBorders>
+              <w:top w:val="single" w:color="BFBFBF" w:sz="4"/>
+              <w:left w:val="single" w:color="BFBFBF" w:sz="4"/>
+              <w:bottom w:val="single" w:color="BFBFBF" w:sz="4"/>
+              <w:right w:val="single" w:color="BFBFBF" w:sz="4"/>
+            </w:tcBorders>
+            <w:shd w:fill="FFFFFF" w:val="clear"/>
+            <w:tcMar>
+              <w:top w:type="dxa" w:w="100"/>
+              <w:left w:type="dxa" w:w="140"/>
+              <w:bottom w:type="dxa" w:w="100"/>
+              <w:right w:type="dxa" w:w="140"/>
+            </w:tcMar>
+            <w:vAlign w:val="center"/>
+          </w:tcPr>
+          <w:p>
+            <w:pPr>
+              <w:spacing w:after="40" w:before="40"/>
+              <w:jc w:val="left"/>
+            </w:pPr>
+            <w:r>
+              <w:t xml:space="preserve">{{blower_size}}</w:t>
             </w:r>
           </w:p>
         </w:tc>

</xml_diff>

<commit_message>
fix: all offer headings rendered in UPPERCASE and bold
Walked every paragraph styled as Heading 1/2/3 in Offer_Template.docx,
uppercased the literal text (preserving any inline Jinja markers like
{{ var }} / {%p if ... %} verbatim), and forced bold on every run.

Sample after change:
  COVER LETTER
  TABLE OF CONTENTS
  1. COMPANY PROFILE
  ABOUT US
  ENCON'S GLOBAL PRESENCE
  3. TECHNICAL SPECIFICATIONS
  SCOPE OF SUPPLY
  LADLE HOOD{% if not is_horizontal %} WITH ARM{% endif %}
  ...

Co-Authored-By: Claude Opus 4.7 (1M context) <noreply@anthropic.com>
</commit_message>
<xml_diff>
--- a/Offer_Template.docx
+++ b/Offer_Template.docx
@@ -463,7 +463,7 @@
           <w:sz w:val="32"/>
           <w:szCs w:val="32"/>
         </w:rPr>
-        <w:t xml:space="preserve">Cover Letter</w:t>
+        <w:t>COVER LETTER</w:t>
       </w:r>
     </w:p>
     <w:p>
@@ -723,7 +723,7 @@
           <w:sz w:val="32"/>
           <w:szCs w:val="32"/>
         </w:rPr>
-        <w:t xml:space="preserve">Table of Contents</w:t>
+        <w:t>TABLE OF CONTENTS</w:t>
       </w:r>
     </w:p>
     <w:tbl>
@@ -1114,7 +1114,7 @@
           <w:sz w:val="22"/>
           <w:szCs w:val="22"/>
         </w:rPr>
-        <w:t xml:space="preserve">List of Annexures</w:t>
+        <w:t>LIST OF ANNEXURES</w:t>
       </w:r>
     </w:p>
     <w:tbl>
@@ -1906,7 +1906,7 @@
           <w:sz w:val="32"/>
           <w:szCs w:val="32"/>
         </w:rPr>
-        <w:t xml:space="preserve">1. Company Profile</w:t>
+        <w:t>1. COMPANY PROFILE</w:t>
       </w:r>
     </w:p>
     <w:p>
@@ -1923,7 +1923,7 @@
           <w:sz w:val="26"/>
           <w:szCs w:val="26"/>
         </w:rPr>
-        <w:t xml:space="preserve">About Us</w:t>
+        <w:t>ABOUT US</w:t>
       </w:r>
     </w:p>
     <w:p>
@@ -1964,7 +1964,7 @@
           <w:sz w:val="26"/>
           <w:szCs w:val="26"/>
         </w:rPr>
-        <w:t xml:space="preserve">Industries We Serve</w:t>
+        <w:t>INDUSTRIES WE SERVE</w:t>
       </w:r>
     </w:p>
     <w:p>
@@ -1996,7 +1996,7 @@
           <w:sz w:val="26"/>
           <w:szCs w:val="26"/>
         </w:rPr>
-        <w:t xml:space="preserve">Some of Our Esteemed Clients</w:t>
+        <w:t>SOME OF OUR ESTEEMED CLIENTS</w:t>
       </w:r>
     </w:p>
     <w:p>
@@ -2025,7 +2025,7 @@
           <w:sz w:val="26"/>
           <w:szCs w:val="26"/>
         </w:rPr>
-        <w:t xml:space="preserve">Research &amp; Development</w:t>
+        <w:t>RESEARCH &amp; DEVELOPMENT</w:t>
       </w:r>
     </w:p>
     <w:p>
@@ -2066,7 +2066,7 @@
           <w:sz w:val="26"/>
           <w:szCs w:val="26"/>
         </w:rPr>
-        <w:t xml:space="preserve">Our Commitment</w:t>
+        <w:t>OUR COMMITMENT</w:t>
       </w:r>
     </w:p>
     <w:p>
@@ -2107,7 +2107,7 @@
           <w:sz w:val="26"/>
           <w:szCs w:val="26"/>
         </w:rPr>
-        <w:t xml:space="preserve">ENCON’s Global Presence</w:t>
+        <w:t>ENCON’S GLOBAL PRESENCE</w:t>
       </w:r>
     </w:p>
     <w:p>
@@ -2211,7 +2211,7 @@
           <w:sz w:val="32"/>
           <w:szCs w:val="32"/>
         </w:rPr>
-        <w:t xml:space="preserve">2. About the Client</w:t>
+        <w:t>2. ABOUT THE CLIENT</w:t>
       </w:r>
     </w:p>
     <w:p>
@@ -2228,7 +2228,7 @@
           <w:sz w:val="22"/>
           <w:szCs w:val="22"/>
         </w:rPr>
-        <w:t xml:space="preserve">Client Details</w:t>
+        <w:t>CLIENT DETAILS</w:t>
       </w:r>
     </w:p>
     <w:tbl>
@@ -2590,7 +2590,7 @@
           <w:sz w:val="22"/>
           <w:szCs w:val="22"/>
         </w:rPr>
-        <w:t xml:space="preserve">Marketing Person Details</w:t>
+        <w:t>MARKETING PERSON DETAILS</w:t>
       </w:r>
     </w:p>
     <w:tbl>
@@ -2824,7 +2824,7 @@
           <w:sz w:val="32"/>
           <w:szCs w:val="32"/>
         </w:rPr>
-        <w:t xml:space="preserve">3. Technical Specifications</w:t>
+        <w:t>3. TECHNICAL SPECIFICATIONS</w:t>
       </w:r>
     </w:p>
     <w:p>
@@ -2841,7 +2841,7 @@
           <w:sz w:val="26"/>
           <w:szCs w:val="26"/>
         </w:rPr>
-        <w:t xml:space="preserve">Vertical Ladle Preheaters and Dryers</w:t>
+        <w:t>VERTICAL LADLE PREHEATERS AND DRYERS</w:t>
       </w:r>
     </w:p>
     <w:tbl>
@@ -4330,7 +4330,7 @@
           <w:sz w:val="26"/>
           <w:szCs w:val="26"/>
         </w:rPr>
-        <w:t xml:space="preserve">Scope of Supply</w:t>
+        <w:t>SCOPE OF SUPPLY</w:t>
       </w:r>
     </w:p>
     <w:p>
@@ -4359,7 +4359,7 @@
           <w:sz w:val="22"/>
           <w:szCs w:val="22"/>
         </w:rPr>
-        <w:t>Ladle Hood{% if not is_horizontal %} with Arm{% endif %}</w:t>
+        <w:t>LADLE HOOD{% if not is_horizontal %} WITH ARM{% endif %}</w:t>
       </w:r>
     </w:p>
     <w:p>
@@ -4388,7 +4388,7 @@
           <w:sz w:val="22"/>
           <w:szCs w:val="22"/>
         </w:rPr>
-        <w:t xml:space="preserve">Hood Lining</w:t>
+        <w:t>HOOD LINING</w:t>
       </w:r>
     </w:p>
     <w:p>
@@ -4409,6 +4409,9 @@
         <w:spacing w:after="80" w:before="200"/>
       </w:pPr>
       <w:r>
+        <w:rPr>
+          <w:b/>
+        </w:rPr>
         <w:t xml:space="preserve">{%p if hood_type == "up_down" and not is_horizontal %}</w:t>
       </w:r>
     </w:p>
@@ -4426,7 +4429,7 @@
           <w:sz w:val="22"/>
           <w:szCs w:val="22"/>
         </w:rPr>
-        <w:t xml:space="preserve">Lifting &amp; Lowering Mechanism</w:t>
+        <w:t>LIFTING &amp; LOWERING MECHANISM</w:t>
       </w:r>
     </w:p>
     <w:p>
@@ -4465,7 +4468,10 @@
         <w:spacing w:after="80" w:before="200"/>
       </w:pPr>
       <w:r>
-        <w:t xml:space="preserve">Swivelling Mechanism</w:t>
+        <w:rPr>
+          <w:b/>
+        </w:rPr>
+        <w:t>SWIVELLING MECHANISM</w:t>
       </w:r>
     </w:p>
     <w:p>
@@ -4501,7 +4507,10 @@
         <w:spacing w:after="80" w:before="200"/>
       </w:pPr>
       <w:r>
-        <w:t xml:space="preserve">Swivelling Mechanism</w:t>
+        <w:rPr>
+          <w:b/>
+        </w:rPr>
+        <w:t>SWIVELLING MECHANISM</w:t>
       </w:r>
     </w:p>
     <w:p>
@@ -4537,7 +4546,10 @@
         <w:spacing w:after="80" w:before="200"/>
       </w:pPr>
       <w:r>
-        <w:t xml:space="preserve">Hood Movement Mechanism</w:t>
+        <w:rPr>
+          <w:b/>
+        </w:rPr>
+        <w:t>HOOD MOVEMENT MECHANISM</w:t>
       </w:r>
     </w:p>
     <w:p>
@@ -4572,7 +4584,7 @@
           <w:sz w:val="22"/>
           <w:szCs w:val="22"/>
         </w:rPr>
-        <w:t>{% if is_oil %}ENCON Film Burner{% elif is_dual %}ENCON Dual Burner{% else %}ENCON Gas Burner{% endif %}</w:t>
+        <w:t>{% if is_oil %}ENCON FILM BURNER{% elif is_dual %}ENCON DUAL BURNER{% else %}ENCON GAS BURNER{% endif %}</w:t>
       </w:r>
     </w:p>
     <w:p>
@@ -5215,7 +5227,7 @@
           <w:sz w:val="22"/>
           <w:szCs w:val="22"/>
         </w:rPr>
-        <w:t xml:space="preserve">Combustion Air Blower</w:t>
+        <w:t>COMBUSTION AIR BLOWER</w:t>
       </w:r>
     </w:p>
     <w:p>
@@ -5245,6 +5257,9 @@
         <w:spacing w:after="80" w:before="200"/>
       </w:pPr>
       <w:r>
+        <w:rPr>
+          <w:b/>
+        </w:rPr>
         <w:t xml:space="preserve">{{ pumping_unit_heading }}</w:t>
       </w:r>
     </w:p>
@@ -5462,7 +5477,7 @@
           <w:sz w:val="22"/>
           <w:szCs w:val="22"/>
         </w:rPr>
-        <w:t xml:space="preserve">Instrumentation &amp; Control</w:t>
+        <w:t>INSTRUMENTATION &amp; CONTROL</w:t>
       </w:r>
     </w:p>
     <w:p>
@@ -5997,7 +6012,7 @@
           <w:sz w:val="22"/>
           <w:szCs w:val="22"/>
         </w:rPr>
-        <w:t xml:space="preserve">Temperature Control System</w:t>
+        <w:t>TEMPERATURE CONTROL SYSTEM</w:t>
       </w:r>
     </w:p>
     <w:p>
@@ -6422,7 +6437,7 @@
           <w:sz w:val="22"/>
           <w:szCs w:val="22"/>
         </w:rPr>
-        <w:t xml:space="preserve">Operational Sequence</w:t>
+        <w:t>OPERATIONAL SEQUENCE</w:t>
       </w:r>
     </w:p>
     <w:p>
@@ -6451,7 +6466,7 @@
           <w:sz w:val="22"/>
           <w:szCs w:val="22"/>
         </w:rPr>
-        <w:t xml:space="preserve">Electrical Control Panel</w:t>
+        <w:t>ELECTRICAL CONTROL PANEL</w:t>
       </w:r>
     </w:p>
     <w:p>
@@ -6662,7 +6677,7 @@
           <w:sz w:val="22"/>
           <w:szCs w:val="22"/>
         </w:rPr>
-        <w:t xml:space="preserve">Pipeline</w:t>
+        <w:t>PIPELINE</w:t>
       </w:r>
     </w:p>
     <w:p>
@@ -6691,7 +6706,7 @@
           <w:sz w:val="22"/>
           <w:szCs w:val="22"/>
         </w:rPr>
-        <w:t xml:space="preserve">Painting</w:t>
+        <w:t>PAINTING</w:t>
       </w:r>
     </w:p>
     <w:p>
@@ -6728,7 +6743,7 @@
           <w:sz w:val="32"/>
           <w:szCs w:val="32"/>
         </w:rPr>
-        <w:t xml:space="preserve">Annexure I — Scope of Supply</w:t>
+        <w:t>ANNEXURE I — SCOPE OF SUPPLY</w:t>
       </w:r>
     </w:p>
     <w:p>
@@ -7525,7 +7540,7 @@
           <w:sz w:val="32"/>
           <w:szCs w:val="32"/>
         </w:rPr>
-        <w:t xml:space="preserve">Annexure II — Exclusions</w:t>
+        <w:t>ANNEXURE II — EXCLUSIONS</w:t>
       </w:r>
     </w:p>
     <w:p>
@@ -7670,7 +7685,7 @@
           <w:sz w:val="32"/>
           <w:szCs w:val="32"/>
         </w:rPr>
-        <w:t xml:space="preserve">Annexure III — Price Schedule</w:t>
+        <w:t>ANNEXURE III — PRICE SCHEDULE</w:t>
       </w:r>
     </w:p>
     <w:tbl>
@@ -8344,7 +8359,7 @@
           <w:sz w:val="32"/>
           <w:szCs w:val="32"/>
         </w:rPr>
-        <w:t xml:space="preserve">Annexure IV — Terms &amp; Conditions</w:t>
+        <w:t>ANNEXURE IV — TERMS &amp; CONDITIONS</w:t>
       </w:r>
     </w:p>
     <w:tbl>
@@ -9248,7 +9263,7 @@
           <w:sz w:val="32"/>
           <w:szCs w:val="32"/>
         </w:rPr>
-        <w:t xml:space="preserve">Annexure V — Reference List of Clients</w:t>
+        <w:t>ANNEXURE V — REFERENCE LIST OF CLIENTS</w:t>
       </w:r>
     </w:p>
     <w:p>
@@ -14827,7 +14842,7 @@
           <w:sz w:val="32"/>
           <w:szCs w:val="32"/>
         </w:rPr>
-        <w:t xml:space="preserve">Annexure VI — Make List</w:t>
+        <w:t>ANNEXURE VI — MAKE LIST</w:t>
       </w:r>
     </w:p>
     <w:p>

</xml_diff>

<commit_message>
fix: uppercase 'On the main ... pipeline:' sub-headings + pilot line label
7 sub-headings under the Burner section weren't styled as Headings, so
the earlier uppercase pass missed them:
  - 'On the main air pipeline:'         (twice; burner section + I&C)
  - 'On the main NG/LPG/COG... pipeline:'(both fuel1 and fuel2 variants)
  - '{{pilot_gas_type}} Line for Pilot Burner:'

Now uppercased while preserving inline Jinja chunks ({{ fuel1_line_label }},
{{pilot_gas_type}}) verbatim, so dynamic substitution still works.

Co-Authored-By: Claude Opus 4.7 (1M context) <noreply@anthropic.com>
</commit_message>
<xml_diff>
--- a/Offer_Template.docx
+++ b/Offer_Template.docx
@@ -4725,7 +4725,7 @@
         <w:spacing w:after="60" w:before="100"/>
       </w:pPr>
       <w:r>
-        <w:t xml:space="preserve">On the main {{ fuel1_line_label }} pipeline:</w:t>
+        <w:t>ON THE MAIN {{ fuel1_line_label }} PIPELINE:</w:t>
       </w:r>
     </w:p>
     <w:p>
@@ -4811,7 +4811,7 @@
         <w:spacing w:after="60" w:before="100"/>
       </w:pPr>
       <w:r>
-        <w:t xml:space="preserve">On the main {{ fuel2_line_label }} pipeline:</w:t>
+        <w:t>ON THE MAIN {{ fuel2_line_label }} PIPELINE:</w:t>
       </w:r>
     </w:p>
     <w:p>
@@ -4917,7 +4917,7 @@
           <w:sz w:val="22"/>
           <w:szCs w:val="22"/>
         </w:rPr>
-        <w:t>On the main {{ fuel1_line_label or "gas" }} pipeline:</w:t>
+        <w:t>ON THE MAIN {{ fuel1_line_label or "gas" }} PIPELINE:</w:t>
       </w:r>
     </w:p>
     <w:p>
@@ -5023,7 +5023,7 @@
           <w:sz w:val="22"/>
           <w:szCs w:val="22"/>
         </w:rPr>
-        <w:t xml:space="preserve">On the main air pipeline:</w:t>
+        <w:t>ON THE MAIN AIR PIPELINE:</w:t>
       </w:r>
     </w:p>
     <w:p>
@@ -5124,7 +5124,7 @@
           <w:sz w:val="22"/>
           <w:szCs w:val="22"/>
         </w:rPr>
-        <w:t>{{pilot_gas_type}} Line for Pilot Burner:</w:t>
+        <w:t>{{pilot_gas_type}} LINE FOR PILOT BURNER:</w:t>
       </w:r>
     </w:p>
     <w:p>
@@ -5502,7 +5502,7 @@
           <w:rFonts w:ascii="Calibri" w:cs="Calibri" w:eastAsia="Calibri" w:hAnsi="Calibri"/>
           <w:b/>
         </w:rPr>
-        <w:t xml:space="preserve">On the main air pipeline:</w:t>
+        <w:t>ON THE MAIN AIR PIPELINE:</w:t>
       </w:r>
     </w:p>
     <w:p>
@@ -5671,7 +5671,7 @@
           <w:rFonts w:ascii="Calibri" w:cs="Calibri" w:eastAsia="Calibri" w:hAnsi="Calibri"/>
           <w:b/>
         </w:rPr>
-        <w:t xml:space="preserve">On the main {{ fuel1_line_label or "gas" }} pipeline:</w:t>
+        <w:t>ON THE MAIN {{ fuel1_line_label or "gas" }} PIPELINE:</w:t>
       </w:r>
     </w:p>
     <w:p>

</xml_diff>

<commit_message>
fix: drop empty-page-break paragraph after Tech Specs table
A standalone <w:br w:type='page'/> paragraph sat between the 22-row
Tech Specs table and the SCOPE OF SUPPLY heading. When the table
ended near the bottom of a page, the preceding empty/spacing paragraph
spilled onto a new page first, then the explicit break forced
*another* new page, leaving an empty page between sections.

Removed the page break — Word naturally pages content forward, so
SCOPE OF SUPPLY now starts on the next available page without the
phantom blank page in between.

Co-Authored-By: Claude Opus 4.7 (1M context) <noreply@anthropic.com>
</commit_message>
<xml_diff>
--- a/Offer_Template.docx
+++ b/Offer_Template.docx
@@ -4309,11 +4309,6 @@
       </w:pPr>
       <w:r>
         <w:t xml:space="preserve"/>
-      </w:r>
-    </w:p>
-    <w:p>
-      <w:r>
-        <w:br w:type="page"/>
       </w:r>
     </w:p>
     <w:p>

</xml_diff>

<commit_message>
fix: uppercase all bullet items in the offer
Walked every paragraph styled as 'List Paragraph' (the bullet-list style
used throughout the offer) and uppercased the literal text while keeping
inline Jinja markers ({{ x.item }}, {% if ... %}, etc.) verbatim so
dynamic substitution still works.

Affects bullets under ENCON Gas/Dual/Film Burner, ON THE MAIN AIR/<fuel>
PIPELINE blocks, Temperature Control System, Annexure II Exclusions,
Electrical Control Panel, Make List, etc. — 42 paragraphs in total.

Co-Authored-By: Claude Opus 4.7 (1M context) <noreply@anthropic.com>
</commit_message>
<xml_diff>
--- a/Offer_Template.docx
+++ b/Offer_Template.docx
@@ -4609,7 +4609,7 @@
           <w:sz w:val="22"/>
           <w:szCs w:val="22"/>
         </w:rPr>
-        <w:t xml:space="preserve">Burner alone</w:t>
+        <w:t>BURNER ALONE</w:t>
       </w:r>
     </w:p>
     <w:p>
@@ -4627,7 +4627,7 @@
           <w:sz w:val="22"/>
           <w:szCs w:val="22"/>
         </w:rPr>
-        <w:t xml:space="preserve">Ball valve</w:t>
+        <w:t>BALL VALVE</w:t>
       </w:r>
     </w:p>
     <w:p>
@@ -4645,7 +4645,7 @@
           <w:sz w:val="22"/>
           <w:szCs w:val="22"/>
         </w:rPr>
-        <w:t xml:space="preserve">CI Burner mounting plate</w:t>
+        <w:t>CI BURNER MOUNTING PLATE</w:t>
       </w:r>
     </w:p>
     <w:p>
@@ -4663,7 +4663,7 @@
           <w:sz w:val="22"/>
           <w:szCs w:val="22"/>
         </w:rPr>
-        <w:t xml:space="preserve">Burner Block</w:t>
+        <w:t>BURNER BLOCK</w:t>
       </w:r>
     </w:p>
     <w:p>
@@ -4681,7 +4681,7 @@
           <w:sz w:val="22"/>
           <w:szCs w:val="22"/>
         </w:rPr>
-        <w:t xml:space="preserve">Flexible Hoses Set</w:t>
+        <w:t>FLEXIBLE HOSES SET</w:t>
       </w:r>
     </w:p>
     <w:p>
@@ -4699,7 +4699,7 @@
           <w:sz w:val="22"/>
           <w:szCs w:val="22"/>
         </w:rPr>
-        <w:t xml:space="preserve">Butterfly Valve</w:t>
+        <w:t>BUTTERFLY VALVE</w:t>
       </w:r>
     </w:p>
     <w:p>
@@ -5527,7 +5527,7 @@
           <w:sz w:val="22"/>
           <w:szCs w:val="22"/>
         </w:rPr>
-        <w:t xml:space="preserve">Orifice plate fitted with differential pressure transmitter</w:t>
+        <w:t>ORIFICE PLATE FITTED WITH DIFFERENTIAL PRESSURE TRANSMITTER</w:t>
       </w:r>
     </w:p>
     <w:p>
@@ -5581,7 +5581,7 @@
           <w:sz w:val="22"/>
           <w:szCs w:val="22"/>
         </w:rPr>
-        <w:t xml:space="preserve">Motorised control valve</w:t>
+        <w:t>MOTORISED CONTROL VALVE</w:t>
       </w:r>
     </w:p>
     <w:p>
@@ -5611,7 +5611,7 @@
           <w:sz w:val="22"/>
           <w:szCs w:val="22"/>
         </w:rPr>
-        <w:t xml:space="preserve">Pneumatic control valve</w:t>
+        <w:t>PNEUMATIC CONTROL VALVE</w:t>
       </w:r>
     </w:p>
     <w:p>
@@ -5653,7 +5653,7 @@
           <w:sz w:val="22"/>
           <w:szCs w:val="22"/>
         </w:rPr>
-        <w:t xml:space="preserve">Pipeline and pipe fittings</w:t>
+        <w:t>PIPELINE AND PIPE FITTINGS</w:t>
       </w:r>
     </w:p>
     <w:p>
@@ -5708,7 +5708,7 @@
           <w:sz w:val="22"/>
           <w:szCs w:val="22"/>
         </w:rPr>
-        <w:t xml:space="preserve">Flowmeter</w:t>
+        <w:t>FLOWMETER</w:t>
       </w:r>
     </w:p>
     <w:p>
@@ -5750,7 +5750,7 @@
           <w:sz w:val="22"/>
           <w:szCs w:val="22"/>
         </w:rPr>
-        <w:t xml:space="preserve">Air-Oil Ratio (AOR) regulator</w:t>
+        <w:t>AIR-OIL RATIO (AOR) REGULATOR</w:t>
       </w:r>
     </w:p>
     <w:p>
@@ -5792,7 +5792,7 @@
           <w:sz w:val="22"/>
           <w:szCs w:val="22"/>
         </w:rPr>
-        <w:t xml:space="preserve">Motorised control valve</w:t>
+        <w:t>MOTORISED CONTROL VALVE</w:t>
       </w:r>
     </w:p>
     <w:p>
@@ -5822,7 +5822,7 @@
           <w:sz w:val="22"/>
           <w:szCs w:val="22"/>
         </w:rPr>
-        <w:t xml:space="preserve">Pipeline and pipe fittings</w:t>
+        <w:t>PIPELINE AND PIPE FITTINGS</w:t>
       </w:r>
     </w:p>
     <w:p>
@@ -5864,7 +5864,7 @@
           <w:sz w:val="22"/>
           <w:szCs w:val="22"/>
         </w:rPr>
-        <w:t xml:space="preserve">Orifice plate fitted with differential pressure transmitter</w:t>
+        <w:t>ORIFICE PLATE FITTED WITH DIFFERENTIAL PRESSURE TRANSMITTER</w:t>
       </w:r>
     </w:p>
     <w:p>
@@ -5906,7 +5906,7 @@
           <w:sz w:val="22"/>
           <w:szCs w:val="22"/>
         </w:rPr>
-        <w:t xml:space="preserve">Air-Gas Ratio (AGR) regulator</w:t>
+        <w:t>AIR-GAS RATIO (AGR) REGULATOR</w:t>
       </w:r>
     </w:p>
     <w:p>
@@ -5948,7 +5948,7 @@
           <w:sz w:val="22"/>
           <w:szCs w:val="22"/>
         </w:rPr>
-        <w:t xml:space="preserve">Pneumatic control valve</w:t>
+        <w:t>PNEUMATIC CONTROL VALVE</w:t>
       </w:r>
     </w:p>
     <w:p>
@@ -5978,7 +5978,7 @@
           <w:sz w:val="22"/>
           <w:szCs w:val="22"/>
         </w:rPr>
-        <w:t xml:space="preserve">Pipeline and pipe fittings</w:t>
+        <w:t>PIPELINE AND PIPE FITTINGS</w:t>
       </w:r>
     </w:p>
     <w:p>
@@ -6061,7 +6061,7 @@
           <w:sz w:val="22"/>
           <w:szCs w:val="22"/>
         </w:rPr>
-        <w:t xml:space="preserve">PLC Controller</w:t>
+        <w:t>PLC CONTROLLER</w:t>
       </w:r>
     </w:p>
     <w:p>
@@ -6103,7 +6103,7 @@
           <w:sz w:val="22"/>
           <w:szCs w:val="22"/>
         </w:rPr>
-        <w:t xml:space="preserve">PID Controller</w:t>
+        <w:t>PID CONTROLLER</w:t>
       </w:r>
     </w:p>
     <w:p>
@@ -6145,7 +6145,7 @@
           <w:sz w:val="22"/>
           <w:szCs w:val="22"/>
         </w:rPr>
-        <w:t xml:space="preserve">P.PID Controller</w:t>
+        <w:t>P.PID CONTROLLER</w:t>
       </w:r>
     </w:p>
     <w:p>
@@ -6175,7 +6175,7 @@
           <w:sz w:val="22"/>
           <w:szCs w:val="22"/>
         </w:rPr>
-        <w:t xml:space="preserve">Thermocouple</w:t>
+        <w:t>THERMOCOUPLE</w:t>
       </w:r>
     </w:p>
     <w:p>
@@ -6205,7 +6205,7 @@
           <w:sz w:val="22"/>
           <w:szCs w:val="22"/>
         </w:rPr>
-        <w:t xml:space="preserve">Orifice plate fitted with differential pressure transmitter on {% if is_oil %}oil{% else %}gas{% endif %} line</w:t>
+        <w:t>ORIFICE PLATE FITTED WITH DIFFERENTIAL PRESSURE TRANSMITTER ON {% if is_oil %}OIL{% else %}GAS{% endif %} LINE</w:t>
       </w:r>
     </w:p>
     <w:p>
@@ -6223,7 +6223,7 @@
           <w:sz w:val="22"/>
           <w:szCs w:val="22"/>
         </w:rPr>
-        <w:t xml:space="preserve">Orifice plate fitted with differential pressure transmitter on air line</w:t>
+        <w:t>ORIFICE PLATE FITTED WITH DIFFERENTIAL PRESSURE TRANSMITTER ON AIR LINE</w:t>
       </w:r>
     </w:p>
     <w:p>
@@ -6265,7 +6265,7 @@
           <w:sz w:val="22"/>
           <w:szCs w:val="22"/>
         </w:rPr>
-        <w:t xml:space="preserve">Ratio Controller</w:t>
+        <w:t>RATIO CONTROLLER</w:t>
       </w:r>
     </w:p>
     <w:p>
@@ -6307,7 +6307,7 @@
           <w:sz w:val="22"/>
           <w:szCs w:val="22"/>
         </w:rPr>
-        <w:t xml:space="preserve">Air-Gas Ratio (AGR) regulator</w:t>
+        <w:t>AIR-GAS RATIO (AGR) REGULATOR</w:t>
       </w:r>
     </w:p>
     <w:p>
@@ -6361,7 +6361,7 @@
           <w:sz w:val="22"/>
           <w:szCs w:val="22"/>
         </w:rPr>
-        <w:t xml:space="preserve">Motorised control valve</w:t>
+        <w:t>MOTORISED CONTROL VALVE</w:t>
       </w:r>
     </w:p>
     <w:p>
@@ -6391,7 +6391,7 @@
           <w:sz w:val="22"/>
           <w:szCs w:val="22"/>
         </w:rPr>
-        <w:t xml:space="preserve">Pneumatic control valve</w:t>
+        <w:t>PNEUMATIC CONTROL VALVE</w:t>
       </w:r>
     </w:p>
     <w:p>
@@ -6503,7 +6503,7 @@
           <w:sz w:val="22"/>
           <w:szCs w:val="22"/>
         </w:rPr>
-        <w:t xml:space="preserve">Ammeter and voltmeter of suitable capacity</w:t>
+        <w:t>AMMETER AND VOLTMETER OF SUITABLE CAPACITY</w:t>
       </w:r>
     </w:p>
     <w:p>
@@ -6521,7 +6521,7 @@
           <w:sz w:val="22"/>
           <w:szCs w:val="22"/>
         </w:rPr>
-        <w:t xml:space="preserve">Combustion air blower start/stop push buttons</w:t>
+        <w:t>COMBUSTION AIR BLOWER START/STOP PUSH BUTTONS</w:t>
       </w:r>
     </w:p>
     <w:p>
@@ -6539,7 +6539,7 @@
           <w:sz w:val="22"/>
           <w:szCs w:val="22"/>
         </w:rPr>
-        <w:t xml:space="preserve">Indicating lamps and fuses</w:t>
+        <w:t>INDICATING LAMPS AND FUSES</w:t>
       </w:r>
     </w:p>
     <w:p>
@@ -6557,7 +6557,7 @@
           <w:sz w:val="22"/>
           <w:szCs w:val="22"/>
         </w:rPr>
-        <w:t xml:space="preserve">Safety relays and contactors</w:t>
+        <w:t>SAFETY RELAYS AND CONTACTORS</w:t>
       </w:r>
     </w:p>
     <w:p>
@@ -6588,7 +6588,7 @@
           <w:sz w:val="22"/>
           <w:szCs w:val="22"/>
         </w:rPr>
-        <w:t>{% if auto_control_type == "pid" %}PID{% elif auto_control_type == "ppid_ratio" %}PPID{% else %}PLC (Siemens S7-1200){% endif %}</w:t>
+        <w:t>{% if auto_control_type == "pid" %}PID{% elif auto_control_type == "ppid_ratio" %}PPID{% else %}PLC (SIEMENS S7-1200){% endif %}</w:t>
       </w:r>
     </w:p>
     <w:p>
@@ -6619,7 +6619,7 @@
           <w:sz w:val="22"/>
           <w:szCs w:val="22"/>
         </w:rPr>
-        <w:t xml:space="preserve">MCBs of suitable capacity</w:t>
+        <w:t>MCBS OF SUITABLE CAPACITY</w:t>
       </w:r>
     </w:p>
     <w:p>
@@ -6637,7 +6637,7 @@
           <w:sz w:val="22"/>
           <w:szCs w:val="22"/>
         </w:rPr>
-        <w:t xml:space="preserve">Burner control unit for pilot burner</w:t>
+        <w:t>BURNER CONTROL UNIT FOR PILOT BURNER</w:t>
       </w:r>
     </w:p>
     <w:p>
@@ -6655,7 +6655,7 @@
           <w:sz w:val="22"/>
           <w:szCs w:val="22"/>
         </w:rPr>
-        <w:t xml:space="preserve">Inching push buttons for hydraulic cylinder operation</w:t>
+        <w:t>INCHING PUSH BUTTONS FOR HYDRAULIC CYLINDER OPERATION</w:t>
       </w:r>
     </w:p>
     <w:p>
@@ -7565,7 +7565,7 @@
           <w:sz w:val="22"/>
           <w:szCs w:val="22"/>
         </w:rPr>
-        <w:t>Pipeline</w:t>
+        <w:t>PIPELINE</w:t>
       </w:r>
     </w:p>
     <w:p>
@@ -7583,7 +7583,7 @@
           <w:sz w:val="22"/>
           <w:szCs w:val="22"/>
         </w:rPr>
-        <w:t xml:space="preserve">Civil work, cabling, and piping work</w:t>
+        <w:t>CIVIL WORK, CABLING, AND PIPING WORK</w:t>
       </w:r>
     </w:p>
     <w:p>
@@ -7601,7 +7601,7 @@
           <w:sz w:val="22"/>
           <w:szCs w:val="22"/>
         </w:rPr>
-        <w:t xml:space="preserve">Any fume-extraction system</w:t>
+        <w:t>ANY FUME-EXTRACTION SYSTEM</w:t>
       </w:r>
     </w:p>
     <w:p>
@@ -7619,7 +7619,7 @@
           <w:sz w:val="22"/>
           <w:szCs w:val="22"/>
         </w:rPr>
-        <w:t xml:space="preserve">Any material-handling equipment</w:t>
+        <w:t>ANY MATERIAL-HANDLING EQUIPMENT</w:t>
       </w:r>
     </w:p>
     <w:p>
@@ -7637,7 +7637,7 @@
           <w:sz w:val="22"/>
           <w:szCs w:val="22"/>
         </w:rPr>
-        <w:t xml:space="preserve">Foundation bolts for column / structure</w:t>
+        <w:t>FOUNDATION BOLTS FOR COLUMN / STRUCTURE</w:t>
       </w:r>
     </w:p>
     <w:p>
@@ -7655,7 +7655,7 @@
           <w:sz w:val="22"/>
           <w:szCs w:val="22"/>
         </w:rPr>
-        <w:t xml:space="preserve">Ladle stand / support</w:t>
+        <w:t>LADLE STAND / SUPPORT</w:t>
       </w:r>
     </w:p>
     <w:p>

</xml_diff>

<commit_message>
fix: bold the 'ON THE MAIN ... PIPELINE:' sub-headings
Six pipeline sub-headings (air + fuel-line variants in both burner
and I&C sections) were uppercased in an earlier change but stayed
non-bold. Now forced bold to match the rest of the heading hierarchy.

Co-Authored-By: Claude Opus 4.7 (1M context) <noreply@anthropic.com>
</commit_message>
<xml_diff>
--- a/Offer_Template.docx
+++ b/Offer_Template.docx
@@ -4720,6 +4720,9 @@
         <w:spacing w:after="60" w:before="100"/>
       </w:pPr>
       <w:r>
+        <w:rPr>
+          <w:b/>
+        </w:rPr>
         <w:t>ON THE MAIN {{ fuel1_line_label }} PIPELINE:</w:t>
       </w:r>
     </w:p>
@@ -4806,6 +4809,9 @@
         <w:spacing w:after="60" w:before="100"/>
       </w:pPr>
       <w:r>
+        <w:rPr>
+          <w:b/>
+        </w:rPr>
         <w:t>ON THE MAIN {{ fuel2_line_label }} PIPELINE:</w:t>
       </w:r>
     </w:p>

</xml_diff>

<commit_message>
fix: hide empty fuel2 pipeline heading when no second fuel line
Burner section's dual-fuel branch always rendered both
'ON THE MAIN {{ fuel1_line_label }} PIPELINE:' and
'ON THE MAIN {{ fuel2_line_label }} PIPELINE:', even when fuel2_line_label
was empty (e.g. the BOM only carried one fuel media). That left an
extra blank 'ON THE MAIN PIPELINE:' heading above the air section.

Wrapped the fuel2 heading + its for-loop with
'{%p if fuel2_line_label %}...{%p endif %}' so the second heading only
renders when there's a second fuel to label.

Co-Authored-By: Claude Opus 4.7 (1M context) <noreply@anthropic.com>
</commit_message>
<xml_diff>
--- a/Offer_Template.docx
+++ b/Offer_Template.docx
@@ -4806,6 +4806,18 @@
     </w:p>
     <w:p>
       <w:pPr>
+        <w:spacing w:after="60" w:before="60" w:line="300"/>
+        <w:jc w:val="left"/>
+      </w:pPr>
+      <w:r>
+        <w:rPr>
+          <w:rFonts w:ascii="Calibri" w:cs="Calibri" w:eastAsia="Calibri" w:hAnsi="Calibri"/>
+        </w:rPr>
+        <w:t xml:space="preserve">{%p if fuel2_line_label %}</w:t>
+      </w:r>
+    </w:p>
+    <w:p>
+      <w:pPr>
         <w:spacing w:after="60" w:before="100"/>
       </w:pPr>
       <w:r>
@@ -4891,6 +4903,18 @@
       </w:pPr>
       <w:r>
         <w:t xml:space="preserve">{%p endfor %}</w:t>
+      </w:r>
+    </w:p>
+    <w:p>
+      <w:pPr>
+        <w:spacing w:after="60" w:before="60" w:line="300"/>
+        <w:jc w:val="left"/>
+      </w:pPr>
+      <w:r>
+        <w:rPr>
+          <w:rFonts w:ascii="Calibri" w:cs="Calibri" w:eastAsia="Calibri" w:hAnsi="Calibri"/>
+        </w:rPr>
+        <w:t xml:space="preserve">{%p endif %}</w:t>
       </w:r>
     </w:p>
     <w:p>

</xml_diff>

<commit_message>
fix: I&C section adds a second fuel-pipeline block for dual fuel
The I&C section's fuel-pipeline block only rendered once, keyed to
fuel1_line_label, so dual-fuel offers showed only one fuel line and
hid the second. Cloned the block (heading + bullets, including the
oil/gas branches and all PLC/AGR/PID conditionals) and gated the
copy with '{%p if fuel2_line_label %}', substituting fuel2_line_label
in the heading.

Result for a dual-fuel offer: ON THE MAIN AIR PIPELINE:, ON THE MAIN
NG PIPELINE:, ON THE MAIN LPG PIPELINE: each with its own bullets.
Single-fuel offers are unchanged (the fuel2 block is hidden).

Co-Authored-By: Claude Opus 4.7 (1M context) <noreply@anthropic.com>
</commit_message>
<xml_diff>
--- a/Offer_Template.docx
+++ b/Offer_Template.docx
@@ -6009,6 +6009,367 @@
           <w:szCs w:val="22"/>
         </w:rPr>
         <w:t>PIPELINE AND PIPE FITTINGS</w:t>
+      </w:r>
+    </w:p>
+    <w:p>
+      <w:pPr>
+        <w:spacing w:after="60" w:before="60" w:line="300"/>
+        <w:jc w:val="left"/>
+      </w:pPr>
+      <w:r>
+        <w:rPr>
+          <w:rFonts w:ascii="Calibri" w:cs="Calibri" w:eastAsia="Calibri" w:hAnsi="Calibri"/>
+        </w:rPr>
+        <w:t xml:space="preserve">{%p endif %}</w:t>
+      </w:r>
+    </w:p>
+    <w:p>
+      <w:pPr>
+        <w:spacing w:after="60" w:before="60" w:line="300"/>
+        <w:jc w:val="left"/>
+      </w:pPr>
+      <w:r>
+        <w:rPr>
+          <w:rFonts w:ascii="Calibri" w:cs="Calibri" w:eastAsia="Calibri" w:hAnsi="Calibri"/>
+        </w:rPr>
+        <w:t xml:space="preserve">{%p if fuel2_line_label %}</w:t>
+      </w:r>
+    </w:p>
+    <w:p>
+      <w:pPr>
+        <w:spacing w:after="60" w:before="60" w:line="300"/>
+        <w:jc w:val="left"/>
+      </w:pPr>
+      <w:r>
+        <w:rPr>
+          <w:rFonts w:ascii="Calibri" w:cs="Calibri" w:eastAsia="Calibri" w:hAnsi="Calibri"/>
+          <w:b/>
+        </w:rPr>
+        <w:t>ON THE MAIN {{ fuel2_line_label }} PIPELINE:</w:t>
+      </w:r>
+    </w:p>
+    <w:p>
+      <w:pPr>
+        <w:spacing w:after="60" w:before="60" w:line="300"/>
+        <w:jc w:val="left"/>
+      </w:pPr>
+      <w:r>
+        <w:rPr>
+          <w:rFonts w:ascii="Calibri" w:cs="Calibri" w:eastAsia="Calibri" w:hAnsi="Calibri"/>
+        </w:rPr>
+        <w:t xml:space="preserve">{%p if is_oil %}</w:t>
+      </w:r>
+    </w:p>
+    <w:p>
+      <w:pPr>
+        <w:spacing w:after="60" w:before="60" w:line="300"/>
+        <w:jc w:val="left"/>
+      </w:pPr>
+      <w:r>
+        <w:rPr>
+          <w:rFonts w:ascii="Calibri" w:cs="Calibri" w:eastAsia="Calibri" w:hAnsi="Calibri"/>
+        </w:rPr>
+        <w:t>{%p if control_mode != "manual" and auto_control_type in ["plc", "ppid_ratio"] %}</w:t>
+      </w:r>
+    </w:p>
+    <w:p>
+      <w:pPr>
+        <w:pStyle w:val="ListParagraph"/>
+        <w:numPr>
+          <w:ilvl w:val="0"/>
+          <w:numId w:val="2"/>
+        </w:numPr>
+        <w:spacing w:after="40" w:before="40" w:line="280"/>
+      </w:pPr>
+      <w:r>
+        <w:rPr>
+          <w:rFonts w:ascii="Calibri" w:cs="Calibri" w:eastAsia="Calibri" w:hAnsi="Calibri"/>
+          <w:sz w:val="22"/>
+          <w:szCs w:val="22"/>
+        </w:rPr>
+        <w:t>FLOWMETER</w:t>
+      </w:r>
+    </w:p>
+    <w:p>
+      <w:pPr>
+        <w:spacing w:after="60" w:before="60" w:line="300"/>
+        <w:jc w:val="left"/>
+      </w:pPr>
+      <w:r>
+        <w:rPr>
+          <w:rFonts w:ascii="Calibri" w:cs="Calibri" w:eastAsia="Calibri" w:hAnsi="Calibri"/>
+        </w:rPr>
+        <w:t xml:space="preserve">{%p endif %}</w:t>
+      </w:r>
+    </w:p>
+    <w:p>
+      <w:pPr>
+        <w:spacing w:after="60" w:before="60" w:line="300"/>
+        <w:jc w:val="left"/>
+      </w:pPr>
+      <w:r>
+        <w:rPr>
+          <w:rFonts w:ascii="Calibri" w:cs="Calibri" w:eastAsia="Calibri" w:hAnsi="Calibri"/>
+        </w:rPr>
+        <w:t>{%p if control_mode == "manual" or auto_control_type in ["plc_agr", "pid"] %}</w:t>
+      </w:r>
+    </w:p>
+    <w:p>
+      <w:pPr>
+        <w:pStyle w:val="ListParagraph"/>
+        <w:numPr>
+          <w:ilvl w:val="0"/>
+          <w:numId w:val="2"/>
+        </w:numPr>
+        <w:spacing w:after="40" w:before="40" w:line="280"/>
+      </w:pPr>
+      <w:r>
+        <w:rPr>
+          <w:rFonts w:ascii="Calibri" w:cs="Calibri" w:eastAsia="Calibri" w:hAnsi="Calibri"/>
+          <w:sz w:val="22"/>
+          <w:szCs w:val="22"/>
+        </w:rPr>
+        <w:t>AIR-OIL RATIO (AOR) REGULATOR</w:t>
+      </w:r>
+    </w:p>
+    <w:p>
+      <w:pPr>
+        <w:spacing w:after="60" w:before="60" w:line="300"/>
+        <w:jc w:val="left"/>
+      </w:pPr>
+      <w:r>
+        <w:rPr>
+          <w:rFonts w:ascii="Calibri" w:cs="Calibri" w:eastAsia="Calibri" w:hAnsi="Calibri"/>
+        </w:rPr>
+        <w:t xml:space="preserve">{%p endif %}</w:t>
+      </w:r>
+    </w:p>
+    <w:p>
+      <w:pPr>
+        <w:spacing w:after="60" w:before="60" w:line="300"/>
+        <w:jc w:val="left"/>
+      </w:pPr>
+      <w:r>
+        <w:rPr>
+          <w:rFonts w:ascii="Calibri" w:cs="Calibri" w:eastAsia="Calibri" w:hAnsi="Calibri"/>
+        </w:rPr>
+        <w:t>{%p if control_mode != "manual" and auto_control_type in ["plc", "ppid_ratio"] %}</w:t>
+      </w:r>
+    </w:p>
+    <w:p>
+      <w:pPr>
+        <w:pStyle w:val="ListParagraph"/>
+        <w:numPr>
+          <w:ilvl w:val="0"/>
+          <w:numId w:val="2"/>
+        </w:numPr>
+        <w:spacing w:after="40" w:before="40" w:line="280"/>
+      </w:pPr>
+      <w:r>
+        <w:rPr>
+          <w:rFonts w:ascii="Calibri" w:cs="Calibri" w:eastAsia="Calibri" w:hAnsi="Calibri"/>
+          <w:sz w:val="22"/>
+          <w:szCs w:val="22"/>
+        </w:rPr>
+        <w:t>MOTORISED CONTROL VALVE</w:t>
+      </w:r>
+    </w:p>
+    <w:p>
+      <w:pPr>
+        <w:spacing w:after="60" w:before="60" w:line="300"/>
+        <w:jc w:val="left"/>
+      </w:pPr>
+      <w:r>
+        <w:rPr>
+          <w:rFonts w:ascii="Calibri" w:cs="Calibri" w:eastAsia="Calibri" w:hAnsi="Calibri"/>
+        </w:rPr>
+        <w:t xml:space="preserve">{%p endif %}</w:t>
+      </w:r>
+    </w:p>
+    <w:p>
+      <w:pPr>
+        <w:pStyle w:val="ListParagraph"/>
+        <w:numPr>
+          <w:ilvl w:val="0"/>
+          <w:numId w:val="2"/>
+        </w:numPr>
+        <w:spacing w:after="40" w:before="40" w:line="280"/>
+      </w:pPr>
+      <w:r>
+        <w:rPr>
+          <w:rFonts w:ascii="Calibri" w:cs="Calibri" w:eastAsia="Calibri" w:hAnsi="Calibri"/>
+          <w:sz w:val="22"/>
+          <w:szCs w:val="22"/>
+        </w:rPr>
+        <w:t>PIPELINE AND PIPE FITTINGS</w:t>
+      </w:r>
+    </w:p>
+    <w:p>
+      <w:pPr>
+        <w:spacing w:after="60" w:before="60" w:line="300"/>
+        <w:jc w:val="left"/>
+      </w:pPr>
+      <w:r>
+        <w:rPr>
+          <w:rFonts w:ascii="Calibri" w:cs="Calibri" w:eastAsia="Calibri" w:hAnsi="Calibri"/>
+        </w:rPr>
+        <w:t xml:space="preserve">{%p else %}</w:t>
+      </w:r>
+    </w:p>
+    <w:p>
+      <w:pPr>
+        <w:spacing w:after="60" w:before="60" w:line="300"/>
+        <w:jc w:val="left"/>
+      </w:pPr>
+      <w:r>
+        <w:rPr>
+          <w:rFonts w:ascii="Calibri" w:cs="Calibri" w:eastAsia="Calibri" w:hAnsi="Calibri"/>
+        </w:rPr>
+        <w:t>{%p if control_mode != "manual" and auto_control_type in ["plc", "ppid_ratio"] %}</w:t>
+      </w:r>
+    </w:p>
+    <w:p>
+      <w:pPr>
+        <w:pStyle w:val="ListParagraph"/>
+        <w:numPr>
+          <w:ilvl w:val="0"/>
+          <w:numId w:val="2"/>
+        </w:numPr>
+        <w:spacing w:after="40" w:before="40" w:line="280"/>
+      </w:pPr>
+      <w:r>
+        <w:rPr>
+          <w:rFonts w:ascii="Calibri" w:cs="Calibri" w:eastAsia="Calibri" w:hAnsi="Calibri"/>
+          <w:sz w:val="22"/>
+          <w:szCs w:val="22"/>
+        </w:rPr>
+        <w:t>ORIFICE PLATE FITTED WITH DIFFERENTIAL PRESSURE TRANSMITTER</w:t>
+      </w:r>
+    </w:p>
+    <w:p>
+      <w:pPr>
+        <w:spacing w:after="60" w:before="60" w:line="300"/>
+        <w:jc w:val="left"/>
+      </w:pPr>
+      <w:r>
+        <w:rPr>
+          <w:rFonts w:ascii="Calibri" w:cs="Calibri" w:eastAsia="Calibri" w:hAnsi="Calibri"/>
+        </w:rPr>
+        <w:t xml:space="preserve">{%p endif %}</w:t>
+      </w:r>
+    </w:p>
+    <w:p>
+      <w:pPr>
+        <w:spacing w:after="60" w:before="60" w:line="300"/>
+        <w:jc w:val="left"/>
+      </w:pPr>
+      <w:r>
+        <w:rPr>
+          <w:rFonts w:ascii="Calibri" w:cs="Calibri" w:eastAsia="Calibri" w:hAnsi="Calibri"/>
+        </w:rPr>
+        <w:t>{%p if control_mode == "manual" or auto_control_type in ["plc_agr", "pid"] %}</w:t>
+      </w:r>
+    </w:p>
+    <w:p>
+      <w:pPr>
+        <w:pStyle w:val="ListParagraph"/>
+        <w:numPr>
+          <w:ilvl w:val="0"/>
+          <w:numId w:val="2"/>
+        </w:numPr>
+        <w:spacing w:after="40" w:before="40" w:line="280"/>
+      </w:pPr>
+      <w:r>
+        <w:rPr>
+          <w:rFonts w:ascii="Calibri" w:cs="Calibri" w:eastAsia="Calibri" w:hAnsi="Calibri"/>
+          <w:sz w:val="22"/>
+          <w:szCs w:val="22"/>
+        </w:rPr>
+        <w:t>AIR-GAS RATIO (AGR) REGULATOR</w:t>
+      </w:r>
+    </w:p>
+    <w:p>
+      <w:pPr>
+        <w:spacing w:after="60" w:before="60" w:line="300"/>
+        <w:jc w:val="left"/>
+      </w:pPr>
+      <w:r>
+        <w:rPr>
+          <w:rFonts w:ascii="Calibri" w:cs="Calibri" w:eastAsia="Calibri" w:hAnsi="Calibri"/>
+        </w:rPr>
+        <w:t xml:space="preserve">{%p endif %}</w:t>
+      </w:r>
+    </w:p>
+    <w:p>
+      <w:pPr>
+        <w:spacing w:after="60" w:before="60" w:line="300"/>
+        <w:jc w:val="left"/>
+      </w:pPr>
+      <w:r>
+        <w:rPr>
+          <w:rFonts w:ascii="Calibri" w:cs="Calibri" w:eastAsia="Calibri" w:hAnsi="Calibri"/>
+        </w:rPr>
+        <w:t>{%p if control_mode != "manual" and auto_control_type in ["plc", "ppid_ratio"] %}</w:t>
+      </w:r>
+    </w:p>
+    <w:p>
+      <w:pPr>
+        <w:pStyle w:val="ListParagraph"/>
+        <w:numPr>
+          <w:ilvl w:val="0"/>
+          <w:numId w:val="2"/>
+        </w:numPr>
+        <w:spacing w:after="40" w:before="40" w:line="280"/>
+      </w:pPr>
+      <w:r>
+        <w:rPr>
+          <w:rFonts w:ascii="Calibri" w:cs="Calibri" w:eastAsia="Calibri" w:hAnsi="Calibri"/>
+          <w:sz w:val="22"/>
+          <w:szCs w:val="22"/>
+        </w:rPr>
+        <w:t>PNEUMATIC CONTROL VALVE</w:t>
+      </w:r>
+    </w:p>
+    <w:p>
+      <w:pPr>
+        <w:spacing w:after="60" w:before="60" w:line="300"/>
+        <w:jc w:val="left"/>
+      </w:pPr>
+      <w:r>
+        <w:rPr>
+          <w:rFonts w:ascii="Calibri" w:cs="Calibri" w:eastAsia="Calibri" w:hAnsi="Calibri"/>
+        </w:rPr>
+        <w:t xml:space="preserve">{%p endif %}</w:t>
+      </w:r>
+    </w:p>
+    <w:p>
+      <w:pPr>
+        <w:pStyle w:val="ListParagraph"/>
+        <w:numPr>
+          <w:ilvl w:val="0"/>
+          <w:numId w:val="2"/>
+        </w:numPr>
+        <w:spacing w:after="40" w:before="40" w:line="280"/>
+      </w:pPr>
+      <w:r>
+        <w:rPr>
+          <w:rFonts w:ascii="Calibri" w:cs="Calibri" w:eastAsia="Calibri" w:hAnsi="Calibri"/>
+          <w:sz w:val="22"/>
+          <w:szCs w:val="22"/>
+        </w:rPr>
+        <w:t>PIPELINE AND PIPE FITTINGS</w:t>
+      </w:r>
+    </w:p>
+    <w:p>
+      <w:pPr>
+        <w:spacing w:after="60" w:before="60" w:line="300"/>
+        <w:jc w:val="left"/>
+      </w:pPr>
+      <w:r>
+        <w:rPr>
+          <w:rFonts w:ascii="Calibri" w:cs="Calibri" w:eastAsia="Calibri" w:hAnsi="Calibri"/>
+        </w:rPr>
+        <w:t xml:space="preserve">{%p endif %}</w:t>
       </w:r>
     </w:p>
     <w:p>

</xml_diff>

<commit_message>
fix: fuel-line CV honours Motorised/Pneumatic dropdown choice (gas branch)
The gas branches of both fuel1 and fuel2 I&C blocks rendered a
hardcoded 'PNEUMATIC CONTROL VALVE'. The air line already switched on
control_valve_type, but the fuel lines didn't — so picking 'Motorised'
in Step 3 only flipped the air bullet, not the gas-fuel ones.

Each hardcoded paragraph is now wrapped with:
  {%p if control_valve_type == \"motorised\" %}
    MOTORISED CONTROL VALVE
  {%p else %}
    PNEUMATIC CONTROL VALVE
  {%p endif %}

Oil-branch CVs already say MOTORISED (correct for oil). Air-line CV is
unchanged.

Co-Authored-By: Claude Opus 4.7 (1M context) <noreply@anthropic.com>
</commit_message>
<xml_diff>
--- a/Offer_Template.docx
+++ b/Offer_Template.docx
@@ -5965,6 +5965,18 @@
     </w:p>
     <w:p>
       <w:pPr>
+        <w:spacing w:after="60" w:before="60" w:line="300"/>
+        <w:jc w:val="left"/>
+      </w:pPr>
+      <w:r>
+        <w:rPr>
+          <w:rFonts w:ascii="Calibri" w:cs="Calibri" w:eastAsia="Calibri" w:hAnsi="Calibri"/>
+        </w:rPr>
+        <w:t xml:space="preserve">{%p if control_valve_type == "motorised" %}</w:t>
+      </w:r>
+    </w:p>
+    <w:p>
+      <w:pPr>
         <w:pStyle w:val="ListParagraph"/>
         <w:numPr>
           <w:ilvl w:val="0"/>
@@ -5978,7 +5990,7 @@
           <w:sz w:val="22"/>
           <w:szCs w:val="22"/>
         </w:rPr>
-        <w:t>PNEUMATIC CONTROL VALVE</w:t>
+        <w:t xml:space="preserve">MOTORISED CONTROL VALVE</w:t>
       </w:r>
     </w:p>
     <w:p>
@@ -5990,7 +6002,7 @@
         <w:rPr>
           <w:rFonts w:ascii="Calibri" w:cs="Calibri" w:eastAsia="Calibri" w:hAnsi="Calibri"/>
         </w:rPr>
-        <w:t xml:space="preserve">{%p endif %}</w:t>
+        <w:t xml:space="preserve">{%p else %}</w:t>
       </w:r>
     </w:p>
     <w:p>
@@ -6008,7 +6020,7 @@
           <w:sz w:val="22"/>
           <w:szCs w:val="22"/>
         </w:rPr>
-        <w:t>PIPELINE AND PIPE FITTINGS</w:t>
+        <w:t xml:space="preserve">PNEUMATIC CONTROL VALVE</w:t>
       </w:r>
     </w:p>
     <w:p>
@@ -6032,44 +6044,7 @@
         <w:rPr>
           <w:rFonts w:ascii="Calibri" w:cs="Calibri" w:eastAsia="Calibri" w:hAnsi="Calibri"/>
         </w:rPr>
-        <w:t xml:space="preserve">{%p if fuel2_line_label %}</w:t>
-      </w:r>
-    </w:p>
-    <w:p>
-      <w:pPr>
-        <w:spacing w:after="60" w:before="60" w:line="300"/>
-        <w:jc w:val="left"/>
-      </w:pPr>
-      <w:r>
-        <w:rPr>
-          <w:rFonts w:ascii="Calibri" w:cs="Calibri" w:eastAsia="Calibri" w:hAnsi="Calibri"/>
-          <w:b/>
-        </w:rPr>
-        <w:t>ON THE MAIN {{ fuel2_line_label }} PIPELINE:</w:t>
-      </w:r>
-    </w:p>
-    <w:p>
-      <w:pPr>
-        <w:spacing w:after="60" w:before="60" w:line="300"/>
-        <w:jc w:val="left"/>
-      </w:pPr>
-      <w:r>
-        <w:rPr>
-          <w:rFonts w:ascii="Calibri" w:cs="Calibri" w:eastAsia="Calibri" w:hAnsi="Calibri"/>
-        </w:rPr>
-        <w:t>{%p if fuel2_is_oil %}</w:t>
-      </w:r>
-    </w:p>
-    <w:p>
-      <w:pPr>
-        <w:spacing w:after="60" w:before="60" w:line="300"/>
-        <w:jc w:val="left"/>
-      </w:pPr>
-      <w:r>
-        <w:rPr>
-          <w:rFonts w:ascii="Calibri" w:cs="Calibri" w:eastAsia="Calibri" w:hAnsi="Calibri"/>
-        </w:rPr>
-        <w:t>{%p if control_mode != "manual" and auto_control_type in ["plc", "ppid_ratio"] %}</w:t>
+        <w:t xml:space="preserve">{%p endif %}</w:t>
       </w:r>
     </w:p>
     <w:p>
@@ -6087,7 +6062,7 @@
           <w:sz w:val="22"/>
           <w:szCs w:val="22"/>
         </w:rPr>
-        <w:t>FLOWMETER</w:t>
+        <w:t>PIPELINE AND PIPE FITTINGS</w:t>
       </w:r>
     </w:p>
     <w:p>
@@ -6111,7 +6086,44 @@
         <w:rPr>
           <w:rFonts w:ascii="Calibri" w:cs="Calibri" w:eastAsia="Calibri" w:hAnsi="Calibri"/>
         </w:rPr>
-        <w:t>{%p if control_mode == "manual" or auto_control_type in ["plc_agr", "pid"] %}</w:t>
+        <w:t xml:space="preserve">{%p if fuel2_line_label %}</w:t>
+      </w:r>
+    </w:p>
+    <w:p>
+      <w:pPr>
+        <w:spacing w:after="60" w:before="60" w:line="300"/>
+        <w:jc w:val="left"/>
+      </w:pPr>
+      <w:r>
+        <w:rPr>
+          <w:rFonts w:ascii="Calibri" w:cs="Calibri" w:eastAsia="Calibri" w:hAnsi="Calibri"/>
+          <w:b/>
+        </w:rPr>
+        <w:t>ON THE MAIN {{ fuel2_line_label }} PIPELINE:</w:t>
+      </w:r>
+    </w:p>
+    <w:p>
+      <w:pPr>
+        <w:spacing w:after="60" w:before="60" w:line="300"/>
+        <w:jc w:val="left"/>
+      </w:pPr>
+      <w:r>
+        <w:rPr>
+          <w:rFonts w:ascii="Calibri" w:cs="Calibri" w:eastAsia="Calibri" w:hAnsi="Calibri"/>
+        </w:rPr>
+        <w:t>{%p if fuel2_is_oil %}</w:t>
+      </w:r>
+    </w:p>
+    <w:p>
+      <w:pPr>
+        <w:spacing w:after="60" w:before="60" w:line="300"/>
+        <w:jc w:val="left"/>
+      </w:pPr>
+      <w:r>
+        <w:rPr>
+          <w:rFonts w:ascii="Calibri" w:cs="Calibri" w:eastAsia="Calibri" w:hAnsi="Calibri"/>
+        </w:rPr>
+        <w:t>{%p if control_mode != "manual" and auto_control_type in ["plc", "ppid_ratio"] %}</w:t>
       </w:r>
     </w:p>
     <w:p>
@@ -6129,7 +6141,7 @@
           <w:sz w:val="22"/>
           <w:szCs w:val="22"/>
         </w:rPr>
-        <w:t>AIR-OIL RATIO (AOR) REGULATOR</w:t>
+        <w:t>FLOWMETER</w:t>
       </w:r>
     </w:p>
     <w:p>
@@ -6153,7 +6165,7 @@
         <w:rPr>
           <w:rFonts w:ascii="Calibri" w:cs="Calibri" w:eastAsia="Calibri" w:hAnsi="Calibri"/>
         </w:rPr>
-        <w:t>{%p if control_mode != "manual" and auto_control_type in ["plc", "ppid_ratio"] %}</w:t>
+        <w:t>{%p if control_mode == "manual" or auto_control_type in ["plc_agr", "pid"] %}</w:t>
       </w:r>
     </w:p>
     <w:p>
@@ -6171,7 +6183,7 @@
           <w:sz w:val="22"/>
           <w:szCs w:val="22"/>
         </w:rPr>
-        <w:t>MOTORISED CONTROL VALVE</w:t>
+        <w:t>AIR-OIL RATIO (AOR) REGULATOR</w:t>
       </w:r>
     </w:p>
     <w:p>
@@ -6184,6 +6196,18 @@
           <w:rFonts w:ascii="Calibri" w:cs="Calibri" w:eastAsia="Calibri" w:hAnsi="Calibri"/>
         </w:rPr>
         <w:t xml:space="preserve">{%p endif %}</w:t>
+      </w:r>
+    </w:p>
+    <w:p>
+      <w:pPr>
+        <w:spacing w:after="60" w:before="60" w:line="300"/>
+        <w:jc w:val="left"/>
+      </w:pPr>
+      <w:r>
+        <w:rPr>
+          <w:rFonts w:ascii="Calibri" w:cs="Calibri" w:eastAsia="Calibri" w:hAnsi="Calibri"/>
+        </w:rPr>
+        <w:t>{%p if control_mode != "manual" and auto_control_type in ["plc", "ppid_ratio"] %}</w:t>
       </w:r>
     </w:p>
     <w:p>
@@ -6201,7 +6225,7 @@
           <w:sz w:val="22"/>
           <w:szCs w:val="22"/>
         </w:rPr>
-        <w:t>PIPELINE AND PIPE FITTINGS</w:t>
+        <w:t>MOTORISED CONTROL VALVE</w:t>
       </w:r>
     </w:p>
     <w:p>
@@ -6213,19 +6237,7 @@
         <w:rPr>
           <w:rFonts w:ascii="Calibri" w:cs="Calibri" w:eastAsia="Calibri" w:hAnsi="Calibri"/>
         </w:rPr>
-        <w:t xml:space="preserve">{%p else %}</w:t>
-      </w:r>
-    </w:p>
-    <w:p>
-      <w:pPr>
-        <w:spacing w:after="60" w:before="60" w:line="300"/>
-        <w:jc w:val="left"/>
-      </w:pPr>
-      <w:r>
-        <w:rPr>
-          <w:rFonts w:ascii="Calibri" w:cs="Calibri" w:eastAsia="Calibri" w:hAnsi="Calibri"/>
-        </w:rPr>
-        <w:t>{%p if control_mode != "manual" and auto_control_type in ["plc", "ppid_ratio"] %}</w:t>
+        <w:t xml:space="preserve">{%p endif %}</w:t>
       </w:r>
     </w:p>
     <w:p>
@@ -6243,7 +6255,7 @@
           <w:sz w:val="22"/>
           <w:szCs w:val="22"/>
         </w:rPr>
-        <w:t>ORIFICE PLATE FITTED WITH DIFFERENTIAL PRESSURE TRANSMITTER</w:t>
+        <w:t>PIPELINE AND PIPE FITTINGS</w:t>
       </w:r>
     </w:p>
     <w:p>
@@ -6255,7 +6267,7 @@
         <w:rPr>
           <w:rFonts w:ascii="Calibri" w:cs="Calibri" w:eastAsia="Calibri" w:hAnsi="Calibri"/>
         </w:rPr>
-        <w:t xml:space="preserve">{%p endif %}</w:t>
+        <w:t xml:space="preserve">{%p else %}</w:t>
       </w:r>
     </w:p>
     <w:p>
@@ -6267,7 +6279,7 @@
         <w:rPr>
           <w:rFonts w:ascii="Calibri" w:cs="Calibri" w:eastAsia="Calibri" w:hAnsi="Calibri"/>
         </w:rPr>
-        <w:t>{%p if control_mode == "manual" or auto_control_type in ["plc_agr", "pid"] %}</w:t>
+        <w:t>{%p if control_mode != "manual" and auto_control_type in ["plc", "ppid_ratio"] %}</w:t>
       </w:r>
     </w:p>
     <w:p>
@@ -6285,7 +6297,7 @@
           <w:sz w:val="22"/>
           <w:szCs w:val="22"/>
         </w:rPr>
-        <w:t>AIR-GAS RATIO (AGR) REGULATOR</w:t>
+        <w:t>ORIFICE PLATE FITTED WITH DIFFERENTIAL PRESSURE TRANSMITTER</w:t>
       </w:r>
     </w:p>
     <w:p>
@@ -6309,7 +6321,7 @@
         <w:rPr>
           <w:rFonts w:ascii="Calibri" w:cs="Calibri" w:eastAsia="Calibri" w:hAnsi="Calibri"/>
         </w:rPr>
-        <w:t>{%p if control_mode != "manual" and auto_control_type in ["plc", "ppid_ratio"] %}</w:t>
+        <w:t>{%p if control_mode == "manual" or auto_control_type in ["plc_agr", "pid"] %}</w:t>
       </w:r>
     </w:p>
     <w:p>
@@ -6327,7 +6339,103 @@
           <w:sz w:val="22"/>
           <w:szCs w:val="22"/>
         </w:rPr>
-        <w:t>PNEUMATIC CONTROL VALVE</w:t>
+        <w:t>AIR-GAS RATIO (AGR) REGULATOR</w:t>
+      </w:r>
+    </w:p>
+    <w:p>
+      <w:pPr>
+        <w:spacing w:after="60" w:before="60" w:line="300"/>
+        <w:jc w:val="left"/>
+      </w:pPr>
+      <w:r>
+        <w:rPr>
+          <w:rFonts w:ascii="Calibri" w:cs="Calibri" w:eastAsia="Calibri" w:hAnsi="Calibri"/>
+        </w:rPr>
+        <w:t xml:space="preserve">{%p endif %}</w:t>
+      </w:r>
+    </w:p>
+    <w:p>
+      <w:pPr>
+        <w:spacing w:after="60" w:before="60" w:line="300"/>
+        <w:jc w:val="left"/>
+      </w:pPr>
+      <w:r>
+        <w:rPr>
+          <w:rFonts w:ascii="Calibri" w:cs="Calibri" w:eastAsia="Calibri" w:hAnsi="Calibri"/>
+        </w:rPr>
+        <w:t>{%p if control_mode != "manual" and auto_control_type in ["plc", "ppid_ratio"] %}</w:t>
+      </w:r>
+    </w:p>
+    <w:p>
+      <w:pPr>
+        <w:spacing w:after="60" w:before="60" w:line="300"/>
+        <w:jc w:val="left"/>
+      </w:pPr>
+      <w:r>
+        <w:rPr>
+          <w:rFonts w:ascii="Calibri" w:cs="Calibri" w:eastAsia="Calibri" w:hAnsi="Calibri"/>
+        </w:rPr>
+        <w:t xml:space="preserve">{%p if control_valve_type == "motorised" %}</w:t>
+      </w:r>
+    </w:p>
+    <w:p>
+      <w:pPr>
+        <w:pStyle w:val="ListParagraph"/>
+        <w:numPr>
+          <w:ilvl w:val="0"/>
+          <w:numId w:val="2"/>
+        </w:numPr>
+        <w:spacing w:after="40" w:before="40" w:line="280"/>
+      </w:pPr>
+      <w:r>
+        <w:rPr>
+          <w:rFonts w:ascii="Calibri" w:cs="Calibri" w:eastAsia="Calibri" w:hAnsi="Calibri"/>
+          <w:sz w:val="22"/>
+          <w:szCs w:val="22"/>
+        </w:rPr>
+        <w:t xml:space="preserve">MOTORISED CONTROL VALVE</w:t>
+      </w:r>
+    </w:p>
+    <w:p>
+      <w:pPr>
+        <w:spacing w:after="60" w:before="60" w:line="300"/>
+        <w:jc w:val="left"/>
+      </w:pPr>
+      <w:r>
+        <w:rPr>
+          <w:rFonts w:ascii="Calibri" w:cs="Calibri" w:eastAsia="Calibri" w:hAnsi="Calibri"/>
+        </w:rPr>
+        <w:t xml:space="preserve">{%p else %}</w:t>
+      </w:r>
+    </w:p>
+    <w:p>
+      <w:pPr>
+        <w:pStyle w:val="ListParagraph"/>
+        <w:numPr>
+          <w:ilvl w:val="0"/>
+          <w:numId w:val="2"/>
+        </w:numPr>
+        <w:spacing w:after="40" w:before="40" w:line="280"/>
+      </w:pPr>
+      <w:r>
+        <w:rPr>
+          <w:rFonts w:ascii="Calibri" w:cs="Calibri" w:eastAsia="Calibri" w:hAnsi="Calibri"/>
+          <w:sz w:val="22"/>
+          <w:szCs w:val="22"/>
+        </w:rPr>
+        <w:t xml:space="preserve">PNEUMATIC CONTROL VALVE</w:t>
+      </w:r>
+    </w:p>
+    <w:p>
+      <w:pPr>
+        <w:spacing w:after="60" w:before="60" w:line="300"/>
+        <w:jc w:val="left"/>
+      </w:pPr>
+      <w:r>
+        <w:rPr>
+          <w:rFonts w:ascii="Calibri" w:cs="Calibri" w:eastAsia="Calibri" w:hAnsi="Calibri"/>
+        </w:rPr>
+        <w:t xml:space="preserve">{%p endif %}</w:t>
       </w:r>
     </w:p>
     <w:p>

</xml_diff>

<commit_message>
fix: oil-branch CV bullets also respect Motorised/Pneumatic dropdown
Two oil-branch I&C bullets (fuel1 + fuel2) hardcoded
'MOTORISED CONTROL VALVE'. Now wrapped with the same
control_valve_type switch the gas branch and air line use, so picking
'Pneumatic' in Step 3 actually flips them to PNEUMATIC.

Co-Authored-By: Claude Opus 4.7 (1M context) <noreply@anthropic.com>
</commit_message>
<xml_diff>
--- a/Offer_Template.docx
+++ b/Offer_Template.docx
@@ -5809,6 +5809,18 @@
     </w:p>
     <w:p>
       <w:pPr>
+        <w:spacing w:after="60" w:before="60" w:line="300"/>
+        <w:jc w:val="left"/>
+      </w:pPr>
+      <w:r>
+        <w:rPr>
+          <w:rFonts w:ascii="Calibri" w:cs="Calibri" w:eastAsia="Calibri" w:hAnsi="Calibri"/>
+        </w:rPr>
+        <w:t xml:space="preserve">{%p if control_valve_type == "motorised" %}</w:t>
+      </w:r>
+    </w:p>
+    <w:p>
+      <w:pPr>
         <w:pStyle w:val="ListParagraph"/>
         <w:numPr>
           <w:ilvl w:val="0"/>
@@ -5822,7 +5834,7 @@
           <w:sz w:val="22"/>
           <w:szCs w:val="22"/>
         </w:rPr>
-        <w:t>MOTORISED CONTROL VALVE</w:t>
+        <w:t xml:space="preserve">MOTORISED CONTROL VALVE</w:t>
       </w:r>
     </w:p>
     <w:p>
@@ -5834,7 +5846,7 @@
         <w:rPr>
           <w:rFonts w:ascii="Calibri" w:cs="Calibri" w:eastAsia="Calibri" w:hAnsi="Calibri"/>
         </w:rPr>
-        <w:t xml:space="preserve">{%p endif %}</w:t>
+        <w:t xml:space="preserve">{%p else %}</w:t>
       </w:r>
     </w:p>
     <w:p>
@@ -5852,7 +5864,7 @@
           <w:sz w:val="22"/>
           <w:szCs w:val="22"/>
         </w:rPr>
-        <w:t>PIPELINE AND PIPE FITTINGS</w:t>
+        <w:t xml:space="preserve">PNEUMATIC CONTROL VALVE</w:t>
       </w:r>
     </w:p>
     <w:p>
@@ -5864,7 +5876,7 @@
         <w:rPr>
           <w:rFonts w:ascii="Calibri" w:cs="Calibri" w:eastAsia="Calibri" w:hAnsi="Calibri"/>
         </w:rPr>
-        <w:t xml:space="preserve">{%p else %}</w:t>
+        <w:t xml:space="preserve">{%p endif %}</w:t>
       </w:r>
     </w:p>
     <w:p>
@@ -5876,7 +5888,7 @@
         <w:rPr>
           <w:rFonts w:ascii="Calibri" w:cs="Calibri" w:eastAsia="Calibri" w:hAnsi="Calibri"/>
         </w:rPr>
-        <w:t>{%p if control_mode != "manual" and auto_control_type in ["plc", "ppid_ratio"] %}</w:t>
+        <w:t xml:space="preserve">{%p endif %}</w:t>
       </w:r>
     </w:p>
     <w:p>
@@ -5894,7 +5906,7 @@
           <w:sz w:val="22"/>
           <w:szCs w:val="22"/>
         </w:rPr>
-        <w:t>ORIFICE PLATE FITTED WITH DIFFERENTIAL PRESSURE TRANSMITTER</w:t>
+        <w:t>PIPELINE AND PIPE FITTINGS</w:t>
       </w:r>
     </w:p>
     <w:p>
@@ -5906,7 +5918,7 @@
         <w:rPr>
           <w:rFonts w:ascii="Calibri" w:cs="Calibri" w:eastAsia="Calibri" w:hAnsi="Calibri"/>
         </w:rPr>
-        <w:t xml:space="preserve">{%p endif %}</w:t>
+        <w:t xml:space="preserve">{%p else %}</w:t>
       </w:r>
     </w:p>
     <w:p>
@@ -5918,7 +5930,7 @@
         <w:rPr>
           <w:rFonts w:ascii="Calibri" w:cs="Calibri" w:eastAsia="Calibri" w:hAnsi="Calibri"/>
         </w:rPr>
-        <w:t>{%p if control_mode == "manual" or auto_control_type in ["plc_agr", "pid"] %}</w:t>
+        <w:t>{%p if control_mode != "manual" and auto_control_type in ["plc", "ppid_ratio"] %}</w:t>
       </w:r>
     </w:p>
     <w:p>
@@ -5936,7 +5948,7 @@
           <w:sz w:val="22"/>
           <w:szCs w:val="22"/>
         </w:rPr>
-        <w:t>AIR-GAS RATIO (AGR) REGULATOR</w:t>
+        <w:t>ORIFICE PLATE FITTED WITH DIFFERENTIAL PRESSURE TRANSMITTER</w:t>
       </w:r>
     </w:p>
     <w:p>
@@ -5960,19 +5972,7 @@
         <w:rPr>
           <w:rFonts w:ascii="Calibri" w:cs="Calibri" w:eastAsia="Calibri" w:hAnsi="Calibri"/>
         </w:rPr>
-        <w:t>{%p if control_mode != "manual" and auto_control_type in ["plc", "ppid_ratio"] %}</w:t>
-      </w:r>
-    </w:p>
-    <w:p>
-      <w:pPr>
-        <w:spacing w:after="60" w:before="60" w:line="300"/>
-        <w:jc w:val="left"/>
-      </w:pPr>
-      <w:r>
-        <w:rPr>
-          <w:rFonts w:ascii="Calibri" w:cs="Calibri" w:eastAsia="Calibri" w:hAnsi="Calibri"/>
-        </w:rPr>
-        <w:t xml:space="preserve">{%p if control_valve_type == "motorised" %}</w:t>
+        <w:t>{%p if control_mode == "manual" or auto_control_type in ["plc_agr", "pid"] %}</w:t>
       </w:r>
     </w:p>
     <w:p>
@@ -5990,7 +5990,7 @@
           <w:sz w:val="22"/>
           <w:szCs w:val="22"/>
         </w:rPr>
-        <w:t xml:space="preserve">MOTORISED CONTROL VALVE</w:t>
+        <w:t>AIR-GAS RATIO (AGR) REGULATOR</w:t>
       </w:r>
     </w:p>
     <w:p>
@@ -6002,7 +6002,31 @@
         <w:rPr>
           <w:rFonts w:ascii="Calibri" w:cs="Calibri" w:eastAsia="Calibri" w:hAnsi="Calibri"/>
         </w:rPr>
-        <w:t xml:space="preserve">{%p else %}</w:t>
+        <w:t xml:space="preserve">{%p endif %}</w:t>
+      </w:r>
+    </w:p>
+    <w:p>
+      <w:pPr>
+        <w:spacing w:after="60" w:before="60" w:line="300"/>
+        <w:jc w:val="left"/>
+      </w:pPr>
+      <w:r>
+        <w:rPr>
+          <w:rFonts w:ascii="Calibri" w:cs="Calibri" w:eastAsia="Calibri" w:hAnsi="Calibri"/>
+        </w:rPr>
+        <w:t>{%p if control_mode != "manual" and auto_control_type in ["plc", "ppid_ratio"] %}</w:t>
+      </w:r>
+    </w:p>
+    <w:p>
+      <w:pPr>
+        <w:spacing w:after="60" w:before="60" w:line="300"/>
+        <w:jc w:val="left"/>
+      </w:pPr>
+      <w:r>
+        <w:rPr>
+          <w:rFonts w:ascii="Calibri" w:cs="Calibri" w:eastAsia="Calibri" w:hAnsi="Calibri"/>
+        </w:rPr>
+        <w:t xml:space="preserve">{%p if control_valve_type == "motorised" %}</w:t>
       </w:r>
     </w:p>
     <w:p>
@@ -6020,7 +6044,7 @@
           <w:sz w:val="22"/>
           <w:szCs w:val="22"/>
         </w:rPr>
-        <w:t xml:space="preserve">PNEUMATIC CONTROL VALVE</w:t>
+        <w:t xml:space="preserve">MOTORISED CONTROL VALVE</w:t>
       </w:r>
     </w:p>
     <w:p>
@@ -6032,19 +6056,7 @@
         <w:rPr>
           <w:rFonts w:ascii="Calibri" w:cs="Calibri" w:eastAsia="Calibri" w:hAnsi="Calibri"/>
         </w:rPr>
-        <w:t xml:space="preserve">{%p endif %}</w:t>
-      </w:r>
-    </w:p>
-    <w:p>
-      <w:pPr>
-        <w:spacing w:after="60" w:before="60" w:line="300"/>
-        <w:jc w:val="left"/>
-      </w:pPr>
-      <w:r>
-        <w:rPr>
-          <w:rFonts w:ascii="Calibri" w:cs="Calibri" w:eastAsia="Calibri" w:hAnsi="Calibri"/>
-        </w:rPr>
-        <w:t xml:space="preserve">{%p endif %}</w:t>
+        <w:t xml:space="preserve">{%p else %}</w:t>
       </w:r>
     </w:p>
     <w:p>
@@ -6062,7 +6074,7 @@
           <w:sz w:val="22"/>
           <w:szCs w:val="22"/>
         </w:rPr>
-        <w:t>PIPELINE AND PIPE FITTINGS</w:t>
+        <w:t xml:space="preserve">PNEUMATIC CONTROL VALVE</w:t>
       </w:r>
     </w:p>
     <w:p>
@@ -6086,44 +6098,7 @@
         <w:rPr>
           <w:rFonts w:ascii="Calibri" w:cs="Calibri" w:eastAsia="Calibri" w:hAnsi="Calibri"/>
         </w:rPr>
-        <w:t xml:space="preserve">{%p if fuel2_line_label %}</w:t>
-      </w:r>
-    </w:p>
-    <w:p>
-      <w:pPr>
-        <w:spacing w:after="60" w:before="60" w:line="300"/>
-        <w:jc w:val="left"/>
-      </w:pPr>
-      <w:r>
-        <w:rPr>
-          <w:rFonts w:ascii="Calibri" w:cs="Calibri" w:eastAsia="Calibri" w:hAnsi="Calibri"/>
-          <w:b/>
-        </w:rPr>
-        <w:t>ON THE MAIN {{ fuel2_line_label }} PIPELINE:</w:t>
-      </w:r>
-    </w:p>
-    <w:p>
-      <w:pPr>
-        <w:spacing w:after="60" w:before="60" w:line="300"/>
-        <w:jc w:val="left"/>
-      </w:pPr>
-      <w:r>
-        <w:rPr>
-          <w:rFonts w:ascii="Calibri" w:cs="Calibri" w:eastAsia="Calibri" w:hAnsi="Calibri"/>
-        </w:rPr>
-        <w:t>{%p if fuel2_is_oil %}</w:t>
-      </w:r>
-    </w:p>
-    <w:p>
-      <w:pPr>
-        <w:spacing w:after="60" w:before="60" w:line="300"/>
-        <w:jc w:val="left"/>
-      </w:pPr>
-      <w:r>
-        <w:rPr>
-          <w:rFonts w:ascii="Calibri" w:cs="Calibri" w:eastAsia="Calibri" w:hAnsi="Calibri"/>
-        </w:rPr>
-        <w:t>{%p if control_mode != "manual" and auto_control_type in ["plc", "ppid_ratio"] %}</w:t>
+        <w:t xml:space="preserve">{%p endif %}</w:t>
       </w:r>
     </w:p>
     <w:p>
@@ -6141,7 +6116,7 @@
           <w:sz w:val="22"/>
           <w:szCs w:val="22"/>
         </w:rPr>
-        <w:t>FLOWMETER</w:t>
+        <w:t>PIPELINE AND PIPE FITTINGS</w:t>
       </w:r>
     </w:p>
     <w:p>
@@ -6165,7 +6140,44 @@
         <w:rPr>
           <w:rFonts w:ascii="Calibri" w:cs="Calibri" w:eastAsia="Calibri" w:hAnsi="Calibri"/>
         </w:rPr>
-        <w:t>{%p if control_mode == "manual" or auto_control_type in ["plc_agr", "pid"] %}</w:t>
+        <w:t xml:space="preserve">{%p if fuel2_line_label %}</w:t>
+      </w:r>
+    </w:p>
+    <w:p>
+      <w:pPr>
+        <w:spacing w:after="60" w:before="60" w:line="300"/>
+        <w:jc w:val="left"/>
+      </w:pPr>
+      <w:r>
+        <w:rPr>
+          <w:rFonts w:ascii="Calibri" w:cs="Calibri" w:eastAsia="Calibri" w:hAnsi="Calibri"/>
+          <w:b/>
+        </w:rPr>
+        <w:t>ON THE MAIN {{ fuel2_line_label }} PIPELINE:</w:t>
+      </w:r>
+    </w:p>
+    <w:p>
+      <w:pPr>
+        <w:spacing w:after="60" w:before="60" w:line="300"/>
+        <w:jc w:val="left"/>
+      </w:pPr>
+      <w:r>
+        <w:rPr>
+          <w:rFonts w:ascii="Calibri" w:cs="Calibri" w:eastAsia="Calibri" w:hAnsi="Calibri"/>
+        </w:rPr>
+        <w:t>{%p if fuel2_is_oil %}</w:t>
+      </w:r>
+    </w:p>
+    <w:p>
+      <w:pPr>
+        <w:spacing w:after="60" w:before="60" w:line="300"/>
+        <w:jc w:val="left"/>
+      </w:pPr>
+      <w:r>
+        <w:rPr>
+          <w:rFonts w:ascii="Calibri" w:cs="Calibri" w:eastAsia="Calibri" w:hAnsi="Calibri"/>
+        </w:rPr>
+        <w:t>{%p if control_mode != "manual" and auto_control_type in ["plc", "ppid_ratio"] %}</w:t>
       </w:r>
     </w:p>
     <w:p>
@@ -6183,7 +6195,7 @@
           <w:sz w:val="22"/>
           <w:szCs w:val="22"/>
         </w:rPr>
-        <w:t>AIR-OIL RATIO (AOR) REGULATOR</w:t>
+        <w:t>FLOWMETER</w:t>
       </w:r>
     </w:p>
     <w:p>
@@ -6207,7 +6219,7 @@
         <w:rPr>
           <w:rFonts w:ascii="Calibri" w:cs="Calibri" w:eastAsia="Calibri" w:hAnsi="Calibri"/>
         </w:rPr>
-        <w:t>{%p if control_mode != "manual" and auto_control_type in ["plc", "ppid_ratio"] %}</w:t>
+        <w:t>{%p if control_mode == "manual" or auto_control_type in ["plc_agr", "pid"] %}</w:t>
       </w:r>
     </w:p>
     <w:p>
@@ -6225,7 +6237,103 @@
           <w:sz w:val="22"/>
           <w:szCs w:val="22"/>
         </w:rPr>
-        <w:t>MOTORISED CONTROL VALVE</w:t>
+        <w:t>AIR-OIL RATIO (AOR) REGULATOR</w:t>
+      </w:r>
+    </w:p>
+    <w:p>
+      <w:pPr>
+        <w:spacing w:after="60" w:before="60" w:line="300"/>
+        <w:jc w:val="left"/>
+      </w:pPr>
+      <w:r>
+        <w:rPr>
+          <w:rFonts w:ascii="Calibri" w:cs="Calibri" w:eastAsia="Calibri" w:hAnsi="Calibri"/>
+        </w:rPr>
+        <w:t xml:space="preserve">{%p endif %}</w:t>
+      </w:r>
+    </w:p>
+    <w:p>
+      <w:pPr>
+        <w:spacing w:after="60" w:before="60" w:line="300"/>
+        <w:jc w:val="left"/>
+      </w:pPr>
+      <w:r>
+        <w:rPr>
+          <w:rFonts w:ascii="Calibri" w:cs="Calibri" w:eastAsia="Calibri" w:hAnsi="Calibri"/>
+        </w:rPr>
+        <w:t>{%p if control_mode != "manual" and auto_control_type in ["plc", "ppid_ratio"] %}</w:t>
+      </w:r>
+    </w:p>
+    <w:p>
+      <w:pPr>
+        <w:spacing w:after="60" w:before="60" w:line="300"/>
+        <w:jc w:val="left"/>
+      </w:pPr>
+      <w:r>
+        <w:rPr>
+          <w:rFonts w:ascii="Calibri" w:cs="Calibri" w:eastAsia="Calibri" w:hAnsi="Calibri"/>
+        </w:rPr>
+        <w:t xml:space="preserve">{%p if control_valve_type == "motorised" %}</w:t>
+      </w:r>
+    </w:p>
+    <w:p>
+      <w:pPr>
+        <w:pStyle w:val="ListParagraph"/>
+        <w:numPr>
+          <w:ilvl w:val="0"/>
+          <w:numId w:val="2"/>
+        </w:numPr>
+        <w:spacing w:after="40" w:before="40" w:line="280"/>
+      </w:pPr>
+      <w:r>
+        <w:rPr>
+          <w:rFonts w:ascii="Calibri" w:cs="Calibri" w:eastAsia="Calibri" w:hAnsi="Calibri"/>
+          <w:sz w:val="22"/>
+          <w:szCs w:val="22"/>
+        </w:rPr>
+        <w:t xml:space="preserve">MOTORISED CONTROL VALVE</w:t>
+      </w:r>
+    </w:p>
+    <w:p>
+      <w:pPr>
+        <w:spacing w:after="60" w:before="60" w:line="300"/>
+        <w:jc w:val="left"/>
+      </w:pPr>
+      <w:r>
+        <w:rPr>
+          <w:rFonts w:ascii="Calibri" w:cs="Calibri" w:eastAsia="Calibri" w:hAnsi="Calibri"/>
+        </w:rPr>
+        <w:t xml:space="preserve">{%p else %}</w:t>
+      </w:r>
+    </w:p>
+    <w:p>
+      <w:pPr>
+        <w:pStyle w:val="ListParagraph"/>
+        <w:numPr>
+          <w:ilvl w:val="0"/>
+          <w:numId w:val="2"/>
+        </w:numPr>
+        <w:spacing w:after="40" w:before="40" w:line="280"/>
+      </w:pPr>
+      <w:r>
+        <w:rPr>
+          <w:rFonts w:ascii="Calibri" w:cs="Calibri" w:eastAsia="Calibri" w:hAnsi="Calibri"/>
+          <w:sz w:val="22"/>
+          <w:szCs w:val="22"/>
+        </w:rPr>
+        <w:t xml:space="preserve">PNEUMATIC CONTROL VALVE</w:t>
+      </w:r>
+    </w:p>
+    <w:p>
+      <w:pPr>
+        <w:spacing w:after="60" w:before="60" w:line="300"/>
+        <w:jc w:val="left"/>
+      </w:pPr>
+      <w:r>
+        <w:rPr>
+          <w:rFonts w:ascii="Calibri" w:cs="Calibri" w:eastAsia="Calibri" w:hAnsi="Calibri"/>
+        </w:rPr>
+        <w:t xml:space="preserve">{%p endif %}</w:t>
       </w:r>
     </w:p>
     <w:p>

</xml_diff>

<commit_message>
fix: I&C CV bullet name comes from the BOM (single source of truth)
Stop maintaining two parallel sources for the control-valve label.
quote_writer now scans each scope bucket (fuel1, fuel2, air) for the
first 'CONTROL VALVE'-flavoured row and exposes:

  air_cv_name / fuel1_cv_name / fuel2_cv_name

Values are 'Motorised control valve' (BOM emits MOTORIZED — oil line
or CAIR vendor), 'Pneumatic control valve' (BOM emits PNEUMATIC), or
'' when no CV row is present (manual / AGR-replaced).

Template replaces the five Motorised/Pneumatic switch blocks with
simple '{{ <var> }}' bullets — what's in the BOM is what shows up.

Co-Authored-By: Claude Opus 4.7 (1M context) <noreply@anthropic.com>
</commit_message>
<xml_diff>
--- a/Offer_Template.docx
+++ b/Offer_Template.docx
@@ -5586,18 +5586,6 @@
     </w:p>
     <w:p>
       <w:pPr>
-        <w:spacing w:after="60" w:before="60" w:line="300"/>
-        <w:jc w:val="left"/>
-      </w:pPr>
-      <w:r>
-        <w:rPr>
-          <w:rFonts w:ascii="Calibri" w:cs="Calibri" w:eastAsia="Calibri" w:hAnsi="Calibri"/>
-        </w:rPr>
-        <w:t>{%p if auto_control_type in ["plc_agr", "pid"] or control_valve_type == "motorised" %}</w:t>
-      </w:r>
-    </w:p>
-    <w:p>
-      <w:pPr>
         <w:pStyle w:val="ListParagraph"/>
         <w:numPr>
           <w:ilvl w:val="0"/>
@@ -5611,7 +5599,7 @@
           <w:sz w:val="22"/>
           <w:szCs w:val="22"/>
         </w:rPr>
-        <w:t>MOTORISED CONTROL VALVE</w:t>
+        <w:t xml:space="preserve">{{ air_cv_name }}</w:t>
       </w:r>
     </w:p>
     <w:p>
@@ -5623,7 +5611,7 @@
         <w:rPr>
           <w:rFonts w:ascii="Calibri" w:cs="Calibri" w:eastAsia="Calibri" w:hAnsi="Calibri"/>
         </w:rPr>
-        <w:t xml:space="preserve">{%p else %}</w:t>
+        <w:t xml:space="preserve">{%p endif %}</w:t>
       </w:r>
     </w:p>
     <w:p>
@@ -5641,7 +5629,7 @@
           <w:sz w:val="22"/>
           <w:szCs w:val="22"/>
         </w:rPr>
-        <w:t>PNEUMATIC CONTROL VALVE</w:t>
+        <w:t>PIPELINE AND PIPE FITTINGS</w:t>
       </w:r>
     </w:p>
     <w:p>
@@ -5652,8 +5640,9 @@
       <w:r>
         <w:rPr>
           <w:rFonts w:ascii="Calibri" w:cs="Calibri" w:eastAsia="Calibri" w:hAnsi="Calibri"/>
-        </w:rPr>
-        <w:t xml:space="preserve">{%p endif %}</w:t>
+          <w:b/>
+        </w:rPr>
+        <w:t>ON THE MAIN {{ fuel1_line_label or "gas" }} PIPELINE:</w:t>
       </w:r>
     </w:p>
     <w:p>
@@ -5665,7 +5654,19 @@
         <w:rPr>
           <w:rFonts w:ascii="Calibri" w:cs="Calibri" w:eastAsia="Calibri" w:hAnsi="Calibri"/>
         </w:rPr>
-        <w:t xml:space="preserve">{%p endif %}</w:t>
+        <w:t>{%p if fuel1_is_oil %}</w:t>
+      </w:r>
+    </w:p>
+    <w:p>
+      <w:pPr>
+        <w:spacing w:after="60" w:before="60" w:line="300"/>
+        <w:jc w:val="left"/>
+      </w:pPr>
+      <w:r>
+        <w:rPr>
+          <w:rFonts w:ascii="Calibri" w:cs="Calibri" w:eastAsia="Calibri" w:hAnsi="Calibri"/>
+        </w:rPr>
+        <w:t>{%p if control_mode != "manual" and auto_control_type in ["plc", "ppid_ratio"] %}</w:t>
       </w:r>
     </w:p>
     <w:p>
@@ -5683,7 +5684,7 @@
           <w:sz w:val="22"/>
           <w:szCs w:val="22"/>
         </w:rPr>
-        <w:t>PIPELINE AND PIPE FITTINGS</w:t>
+        <w:t>FLOWMETER</w:t>
       </w:r>
     </w:p>
     <w:p>
@@ -5694,9 +5695,8 @@
       <w:r>
         <w:rPr>
           <w:rFonts w:ascii="Calibri" w:cs="Calibri" w:eastAsia="Calibri" w:hAnsi="Calibri"/>
-          <w:b/>
-        </w:rPr>
-        <w:t>ON THE MAIN {{ fuel1_line_label or "gas" }} PIPELINE:</w:t>
+        </w:rPr>
+        <w:t xml:space="preserve">{%p endif %}</w:t>
       </w:r>
     </w:p>
     <w:p>
@@ -5708,19 +5708,7 @@
         <w:rPr>
           <w:rFonts w:ascii="Calibri" w:cs="Calibri" w:eastAsia="Calibri" w:hAnsi="Calibri"/>
         </w:rPr>
-        <w:t>{%p if fuel1_is_oil %}</w:t>
-      </w:r>
-    </w:p>
-    <w:p>
-      <w:pPr>
-        <w:spacing w:after="60" w:before="60" w:line="300"/>
-        <w:jc w:val="left"/>
-      </w:pPr>
-      <w:r>
-        <w:rPr>
-          <w:rFonts w:ascii="Calibri" w:cs="Calibri" w:eastAsia="Calibri" w:hAnsi="Calibri"/>
-        </w:rPr>
-        <w:t>{%p if control_mode != "manual" and auto_control_type in ["plc", "ppid_ratio"] %}</w:t>
+        <w:t>{%p if control_mode == "manual" or auto_control_type in ["plc_agr", "pid"] %}</w:t>
       </w:r>
     </w:p>
     <w:p>
@@ -5738,7 +5726,7 @@
           <w:sz w:val="22"/>
           <w:szCs w:val="22"/>
         </w:rPr>
-        <w:t>FLOWMETER</w:t>
+        <w:t>AIR-OIL RATIO (AOR) REGULATOR</w:t>
       </w:r>
     </w:p>
     <w:p>
@@ -5762,7 +5750,7 @@
         <w:rPr>
           <w:rFonts w:ascii="Calibri" w:cs="Calibri" w:eastAsia="Calibri" w:hAnsi="Calibri"/>
         </w:rPr>
-        <w:t>{%p if control_mode == "manual" or auto_control_type in ["plc_agr", "pid"] %}</w:t>
+        <w:t>{%p if control_mode != "manual" and auto_control_type in ["plc", "ppid_ratio"] %}</w:t>
       </w:r>
     </w:p>
     <w:p>
@@ -5780,7 +5768,7 @@
           <w:sz w:val="22"/>
           <w:szCs w:val="22"/>
         </w:rPr>
-        <w:t>AIR-OIL RATIO (AOR) REGULATOR</w:t>
+        <w:t xml:space="preserve">{{ fuel1_cv_name }}</w:t>
       </w:r>
     </w:p>
     <w:p>
@@ -5793,30 +5781,6 @@
           <w:rFonts w:ascii="Calibri" w:cs="Calibri" w:eastAsia="Calibri" w:hAnsi="Calibri"/>
         </w:rPr>
         <w:t xml:space="preserve">{%p endif %}</w:t>
-      </w:r>
-    </w:p>
-    <w:p>
-      <w:pPr>
-        <w:spacing w:after="60" w:before="60" w:line="300"/>
-        <w:jc w:val="left"/>
-      </w:pPr>
-      <w:r>
-        <w:rPr>
-          <w:rFonts w:ascii="Calibri" w:cs="Calibri" w:eastAsia="Calibri" w:hAnsi="Calibri"/>
-        </w:rPr>
-        <w:t>{%p if control_mode != "manual" and auto_control_type in ["plc", "ppid_ratio"] %}</w:t>
-      </w:r>
-    </w:p>
-    <w:p>
-      <w:pPr>
-        <w:spacing w:after="60" w:before="60" w:line="300"/>
-        <w:jc w:val="left"/>
-      </w:pPr>
-      <w:r>
-        <w:rPr>
-          <w:rFonts w:ascii="Calibri" w:cs="Calibri" w:eastAsia="Calibri" w:hAnsi="Calibri"/>
-        </w:rPr>
-        <w:t xml:space="preserve">{%p if control_valve_type == "motorised" %}</w:t>
       </w:r>
     </w:p>
     <w:p>
@@ -5834,7 +5798,7 @@
           <w:sz w:val="22"/>
           <w:szCs w:val="22"/>
         </w:rPr>
-        <w:t xml:space="preserve">MOTORISED CONTROL VALVE</w:t>
+        <w:t>PIPELINE AND PIPE FITTINGS</w:t>
       </w:r>
     </w:p>
     <w:p>
@@ -5847,6 +5811,18 @@
           <w:rFonts w:ascii="Calibri" w:cs="Calibri" w:eastAsia="Calibri" w:hAnsi="Calibri"/>
         </w:rPr>
         <w:t xml:space="preserve">{%p else %}</w:t>
+      </w:r>
+    </w:p>
+    <w:p>
+      <w:pPr>
+        <w:spacing w:after="60" w:before="60" w:line="300"/>
+        <w:jc w:val="left"/>
+      </w:pPr>
+      <w:r>
+        <w:rPr>
+          <w:rFonts w:ascii="Calibri" w:cs="Calibri" w:eastAsia="Calibri" w:hAnsi="Calibri"/>
+        </w:rPr>
+        <w:t>{%p if control_mode != "manual" and auto_control_type in ["plc", "ppid_ratio"] %}</w:t>
       </w:r>
     </w:p>
     <w:p>
@@ -5864,7 +5840,7 @@
           <w:sz w:val="22"/>
           <w:szCs w:val="22"/>
         </w:rPr>
-        <w:t xml:space="preserve">PNEUMATIC CONTROL VALVE</w:t>
+        <w:t>ORIFICE PLATE FITTED WITH DIFFERENTIAL PRESSURE TRANSMITTER</w:t>
       </w:r>
     </w:p>
     <w:p>
@@ -5888,7 +5864,7 @@
         <w:rPr>
           <w:rFonts w:ascii="Calibri" w:cs="Calibri" w:eastAsia="Calibri" w:hAnsi="Calibri"/>
         </w:rPr>
-        <w:t xml:space="preserve">{%p endif %}</w:t>
+        <w:t>{%p if control_mode == "manual" or auto_control_type in ["plc_agr", "pid"] %}</w:t>
       </w:r>
     </w:p>
     <w:p>
@@ -5906,7 +5882,7 @@
           <w:sz w:val="22"/>
           <w:szCs w:val="22"/>
         </w:rPr>
-        <w:t>PIPELINE AND PIPE FITTINGS</w:t>
+        <w:t>AIR-GAS RATIO (AGR) REGULATOR</w:t>
       </w:r>
     </w:p>
     <w:p>
@@ -5918,7 +5894,7 @@
         <w:rPr>
           <w:rFonts w:ascii="Calibri" w:cs="Calibri" w:eastAsia="Calibri" w:hAnsi="Calibri"/>
         </w:rPr>
-        <w:t xml:space="preserve">{%p else %}</w:t>
+        <w:t xml:space="preserve">{%p endif %}</w:t>
       </w:r>
     </w:p>
     <w:p>
@@ -5948,7 +5924,7 @@
           <w:sz w:val="22"/>
           <w:szCs w:val="22"/>
         </w:rPr>
-        <w:t>ORIFICE PLATE FITTED WITH DIFFERENTIAL PRESSURE TRANSMITTER</w:t>
+        <w:t xml:space="preserve">{{ fuel1_cv_name }}</w:t>
       </w:r>
     </w:p>
     <w:p>
@@ -5961,18 +5937,6 @@
           <w:rFonts w:ascii="Calibri" w:cs="Calibri" w:eastAsia="Calibri" w:hAnsi="Calibri"/>
         </w:rPr>
         <w:t xml:space="preserve">{%p endif %}</w:t>
-      </w:r>
-    </w:p>
-    <w:p>
-      <w:pPr>
-        <w:spacing w:after="60" w:before="60" w:line="300"/>
-        <w:jc w:val="left"/>
-      </w:pPr>
-      <w:r>
-        <w:rPr>
-          <w:rFonts w:ascii="Calibri" w:cs="Calibri" w:eastAsia="Calibri" w:hAnsi="Calibri"/>
-        </w:rPr>
-        <w:t>{%p if control_mode == "manual" or auto_control_type in ["plc_agr", "pid"] %}</w:t>
       </w:r>
     </w:p>
     <w:p>
@@ -5990,7 +5954,7 @@
           <w:sz w:val="22"/>
           <w:szCs w:val="22"/>
         </w:rPr>
-        <w:t>AIR-GAS RATIO (AGR) REGULATOR</w:t>
+        <w:t>PIPELINE AND PIPE FITTINGS</w:t>
       </w:r>
     </w:p>
     <w:p>
@@ -6014,7 +5978,7 @@
         <w:rPr>
           <w:rFonts w:ascii="Calibri" w:cs="Calibri" w:eastAsia="Calibri" w:hAnsi="Calibri"/>
         </w:rPr>
-        <w:t>{%p if control_mode != "manual" and auto_control_type in ["plc", "ppid_ratio"] %}</w:t>
+        <w:t xml:space="preserve">{%p if fuel2_line_label %}</w:t>
       </w:r>
     </w:p>
     <w:p>
@@ -6025,8 +5989,33 @@
       <w:r>
         <w:rPr>
           <w:rFonts w:ascii="Calibri" w:cs="Calibri" w:eastAsia="Calibri" w:hAnsi="Calibri"/>
-        </w:rPr>
-        <w:t xml:space="preserve">{%p if control_valve_type == "motorised" %}</w:t>
+          <w:b/>
+        </w:rPr>
+        <w:t>ON THE MAIN {{ fuel2_line_label }} PIPELINE:</w:t>
+      </w:r>
+    </w:p>
+    <w:p>
+      <w:pPr>
+        <w:spacing w:after="60" w:before="60" w:line="300"/>
+        <w:jc w:val="left"/>
+      </w:pPr>
+      <w:r>
+        <w:rPr>
+          <w:rFonts w:ascii="Calibri" w:cs="Calibri" w:eastAsia="Calibri" w:hAnsi="Calibri"/>
+        </w:rPr>
+        <w:t>{%p if fuel2_is_oil %}</w:t>
+      </w:r>
+    </w:p>
+    <w:p>
+      <w:pPr>
+        <w:spacing w:after="60" w:before="60" w:line="300"/>
+        <w:jc w:val="left"/>
+      </w:pPr>
+      <w:r>
+        <w:rPr>
+          <w:rFonts w:ascii="Calibri" w:cs="Calibri" w:eastAsia="Calibri" w:hAnsi="Calibri"/>
+        </w:rPr>
+        <w:t>{%p if control_mode != "manual" and auto_control_type in ["plc", "ppid_ratio"] %}</w:t>
       </w:r>
     </w:p>
     <w:p>
@@ -6044,7 +6033,7 @@
           <w:sz w:val="22"/>
           <w:szCs w:val="22"/>
         </w:rPr>
-        <w:t xml:space="preserve">MOTORISED CONTROL VALVE</w:t>
+        <w:t>FLOWMETER</w:t>
       </w:r>
     </w:p>
     <w:p>
@@ -6056,7 +6045,19 @@
         <w:rPr>
           <w:rFonts w:ascii="Calibri" w:cs="Calibri" w:eastAsia="Calibri" w:hAnsi="Calibri"/>
         </w:rPr>
-        <w:t xml:space="preserve">{%p else %}</w:t>
+        <w:t xml:space="preserve">{%p endif %}</w:t>
+      </w:r>
+    </w:p>
+    <w:p>
+      <w:pPr>
+        <w:spacing w:after="60" w:before="60" w:line="300"/>
+        <w:jc w:val="left"/>
+      </w:pPr>
+      <w:r>
+        <w:rPr>
+          <w:rFonts w:ascii="Calibri" w:cs="Calibri" w:eastAsia="Calibri" w:hAnsi="Calibri"/>
+        </w:rPr>
+        <w:t>{%p if control_mode == "manual" or auto_control_type in ["plc_agr", "pid"] %}</w:t>
       </w:r>
     </w:p>
     <w:p>
@@ -6074,7 +6075,7 @@
           <w:sz w:val="22"/>
           <w:szCs w:val="22"/>
         </w:rPr>
-        <w:t xml:space="preserve">PNEUMATIC CONTROL VALVE</w:t>
+        <w:t>AIR-OIL RATIO (AOR) REGULATOR</w:t>
       </w:r>
     </w:p>
     <w:p>
@@ -6098,7 +6099,7 @@
         <w:rPr>
           <w:rFonts w:ascii="Calibri" w:cs="Calibri" w:eastAsia="Calibri" w:hAnsi="Calibri"/>
         </w:rPr>
-        <w:t xml:space="preserve">{%p endif %}</w:t>
+        <w:t>{%p if control_mode != "manual" and auto_control_type in ["plc", "ppid_ratio"] %}</w:t>
       </w:r>
     </w:p>
     <w:p>
@@ -6116,7 +6117,7 @@
           <w:sz w:val="22"/>
           <w:szCs w:val="22"/>
         </w:rPr>
-        <w:t>PIPELINE AND PIPE FITTINGS</w:t>
+        <w:t xml:space="preserve">{{ fuel2_cv_name }}</w:t>
       </w:r>
     </w:p>
     <w:p>
@@ -6129,55 +6130,6 @@
           <w:rFonts w:ascii="Calibri" w:cs="Calibri" w:eastAsia="Calibri" w:hAnsi="Calibri"/>
         </w:rPr>
         <w:t xml:space="preserve">{%p endif %}</w:t>
-      </w:r>
-    </w:p>
-    <w:p>
-      <w:pPr>
-        <w:spacing w:after="60" w:before="60" w:line="300"/>
-        <w:jc w:val="left"/>
-      </w:pPr>
-      <w:r>
-        <w:rPr>
-          <w:rFonts w:ascii="Calibri" w:cs="Calibri" w:eastAsia="Calibri" w:hAnsi="Calibri"/>
-        </w:rPr>
-        <w:t xml:space="preserve">{%p if fuel2_line_label %}</w:t>
-      </w:r>
-    </w:p>
-    <w:p>
-      <w:pPr>
-        <w:spacing w:after="60" w:before="60" w:line="300"/>
-        <w:jc w:val="left"/>
-      </w:pPr>
-      <w:r>
-        <w:rPr>
-          <w:rFonts w:ascii="Calibri" w:cs="Calibri" w:eastAsia="Calibri" w:hAnsi="Calibri"/>
-          <w:b/>
-        </w:rPr>
-        <w:t>ON THE MAIN {{ fuel2_line_label }} PIPELINE:</w:t>
-      </w:r>
-    </w:p>
-    <w:p>
-      <w:pPr>
-        <w:spacing w:after="60" w:before="60" w:line="300"/>
-        <w:jc w:val="left"/>
-      </w:pPr>
-      <w:r>
-        <w:rPr>
-          <w:rFonts w:ascii="Calibri" w:cs="Calibri" w:eastAsia="Calibri" w:hAnsi="Calibri"/>
-        </w:rPr>
-        <w:t>{%p if fuel2_is_oil %}</w:t>
-      </w:r>
-    </w:p>
-    <w:p>
-      <w:pPr>
-        <w:spacing w:after="60" w:before="60" w:line="300"/>
-        <w:jc w:val="left"/>
-      </w:pPr>
-      <w:r>
-        <w:rPr>
-          <w:rFonts w:ascii="Calibri" w:cs="Calibri" w:eastAsia="Calibri" w:hAnsi="Calibri"/>
-        </w:rPr>
-        <w:t>{%p if control_mode != "manual" and auto_control_type in ["plc", "ppid_ratio"] %}</w:t>
       </w:r>
     </w:p>
     <w:p>
@@ -6195,7 +6147,7 @@
           <w:sz w:val="22"/>
           <w:szCs w:val="22"/>
         </w:rPr>
-        <w:t>FLOWMETER</w:t>
+        <w:t>PIPELINE AND PIPE FITTINGS</w:t>
       </w:r>
     </w:p>
     <w:p>
@@ -6207,7 +6159,7 @@
         <w:rPr>
           <w:rFonts w:ascii="Calibri" w:cs="Calibri" w:eastAsia="Calibri" w:hAnsi="Calibri"/>
         </w:rPr>
-        <w:t xml:space="preserve">{%p endif %}</w:t>
+        <w:t xml:space="preserve">{%p else %}</w:t>
       </w:r>
     </w:p>
     <w:p>
@@ -6219,7 +6171,7 @@
         <w:rPr>
           <w:rFonts w:ascii="Calibri" w:cs="Calibri" w:eastAsia="Calibri" w:hAnsi="Calibri"/>
         </w:rPr>
-        <w:t>{%p if control_mode == "manual" or auto_control_type in ["plc_agr", "pid"] %}</w:t>
+        <w:t>{%p if control_mode != "manual" and auto_control_type in ["plc", "ppid_ratio"] %}</w:t>
       </w:r>
     </w:p>
     <w:p>
@@ -6237,7 +6189,7 @@
           <w:sz w:val="22"/>
           <w:szCs w:val="22"/>
         </w:rPr>
-        <w:t>AIR-OIL RATIO (AOR) REGULATOR</w:t>
+        <w:t>ORIFICE PLATE FITTED WITH DIFFERENTIAL PRESSURE TRANSMITTER</w:t>
       </w:r>
     </w:p>
     <w:p>
@@ -6261,19 +6213,7 @@
         <w:rPr>
           <w:rFonts w:ascii="Calibri" w:cs="Calibri" w:eastAsia="Calibri" w:hAnsi="Calibri"/>
         </w:rPr>
-        <w:t>{%p if control_mode != "manual" and auto_control_type in ["plc", "ppid_ratio"] %}</w:t>
-      </w:r>
-    </w:p>
-    <w:p>
-      <w:pPr>
-        <w:spacing w:after="60" w:before="60" w:line="300"/>
-        <w:jc w:val="left"/>
-      </w:pPr>
-      <w:r>
-        <w:rPr>
-          <w:rFonts w:ascii="Calibri" w:cs="Calibri" w:eastAsia="Calibri" w:hAnsi="Calibri"/>
-        </w:rPr>
-        <w:t xml:space="preserve">{%p if control_valve_type == "motorised" %}</w:t>
+        <w:t>{%p if control_mode == "manual" or auto_control_type in ["plc_agr", "pid"] %}</w:t>
       </w:r>
     </w:p>
     <w:p>
@@ -6291,7 +6231,7 @@
           <w:sz w:val="22"/>
           <w:szCs w:val="22"/>
         </w:rPr>
-        <w:t xml:space="preserve">MOTORISED CONTROL VALVE</w:t>
+        <w:t>AIR-GAS RATIO (AGR) REGULATOR</w:t>
       </w:r>
     </w:p>
     <w:p>
@@ -6303,7 +6243,19 @@
         <w:rPr>
           <w:rFonts w:ascii="Calibri" w:cs="Calibri" w:eastAsia="Calibri" w:hAnsi="Calibri"/>
         </w:rPr>
-        <w:t xml:space="preserve">{%p else %}</w:t>
+        <w:t xml:space="preserve">{%p endif %}</w:t>
+      </w:r>
+    </w:p>
+    <w:p>
+      <w:pPr>
+        <w:spacing w:after="60" w:before="60" w:line="300"/>
+        <w:jc w:val="left"/>
+      </w:pPr>
+      <w:r>
+        <w:rPr>
+          <w:rFonts w:ascii="Calibri" w:cs="Calibri" w:eastAsia="Calibri" w:hAnsi="Calibri"/>
+        </w:rPr>
+        <w:t>{%p if control_mode != "manual" and auto_control_type in ["plc", "ppid_ratio"] %}</w:t>
       </w:r>
     </w:p>
     <w:p>
@@ -6321,229 +6273,7 @@
           <w:sz w:val="22"/>
           <w:szCs w:val="22"/>
         </w:rPr>
-        <w:t xml:space="preserve">PNEUMATIC CONTROL VALVE</w:t>
-      </w:r>
-    </w:p>
-    <w:p>
-      <w:pPr>
-        <w:spacing w:after="60" w:before="60" w:line="300"/>
-        <w:jc w:val="left"/>
-      </w:pPr>
-      <w:r>
-        <w:rPr>
-          <w:rFonts w:ascii="Calibri" w:cs="Calibri" w:eastAsia="Calibri" w:hAnsi="Calibri"/>
-        </w:rPr>
-        <w:t xml:space="preserve">{%p endif %}</w:t>
-      </w:r>
-    </w:p>
-    <w:p>
-      <w:pPr>
-        <w:spacing w:after="60" w:before="60" w:line="300"/>
-        <w:jc w:val="left"/>
-      </w:pPr>
-      <w:r>
-        <w:rPr>
-          <w:rFonts w:ascii="Calibri" w:cs="Calibri" w:eastAsia="Calibri" w:hAnsi="Calibri"/>
-        </w:rPr>
-        <w:t xml:space="preserve">{%p endif %}</w:t>
-      </w:r>
-    </w:p>
-    <w:p>
-      <w:pPr>
-        <w:pStyle w:val="ListParagraph"/>
-        <w:numPr>
-          <w:ilvl w:val="0"/>
-          <w:numId w:val="2"/>
-        </w:numPr>
-        <w:spacing w:after="40" w:before="40" w:line="280"/>
-      </w:pPr>
-      <w:r>
-        <w:rPr>
-          <w:rFonts w:ascii="Calibri" w:cs="Calibri" w:eastAsia="Calibri" w:hAnsi="Calibri"/>
-          <w:sz w:val="22"/>
-          <w:szCs w:val="22"/>
-        </w:rPr>
-        <w:t>PIPELINE AND PIPE FITTINGS</w:t>
-      </w:r>
-    </w:p>
-    <w:p>
-      <w:pPr>
-        <w:spacing w:after="60" w:before="60" w:line="300"/>
-        <w:jc w:val="left"/>
-      </w:pPr>
-      <w:r>
-        <w:rPr>
-          <w:rFonts w:ascii="Calibri" w:cs="Calibri" w:eastAsia="Calibri" w:hAnsi="Calibri"/>
-        </w:rPr>
-        <w:t xml:space="preserve">{%p else %}</w:t>
-      </w:r>
-    </w:p>
-    <w:p>
-      <w:pPr>
-        <w:spacing w:after="60" w:before="60" w:line="300"/>
-        <w:jc w:val="left"/>
-      </w:pPr>
-      <w:r>
-        <w:rPr>
-          <w:rFonts w:ascii="Calibri" w:cs="Calibri" w:eastAsia="Calibri" w:hAnsi="Calibri"/>
-        </w:rPr>
-        <w:t>{%p if control_mode != "manual" and auto_control_type in ["plc", "ppid_ratio"] %}</w:t>
-      </w:r>
-    </w:p>
-    <w:p>
-      <w:pPr>
-        <w:pStyle w:val="ListParagraph"/>
-        <w:numPr>
-          <w:ilvl w:val="0"/>
-          <w:numId w:val="2"/>
-        </w:numPr>
-        <w:spacing w:after="40" w:before="40" w:line="280"/>
-      </w:pPr>
-      <w:r>
-        <w:rPr>
-          <w:rFonts w:ascii="Calibri" w:cs="Calibri" w:eastAsia="Calibri" w:hAnsi="Calibri"/>
-          <w:sz w:val="22"/>
-          <w:szCs w:val="22"/>
-        </w:rPr>
-        <w:t>ORIFICE PLATE FITTED WITH DIFFERENTIAL PRESSURE TRANSMITTER</w:t>
-      </w:r>
-    </w:p>
-    <w:p>
-      <w:pPr>
-        <w:spacing w:after="60" w:before="60" w:line="300"/>
-        <w:jc w:val="left"/>
-      </w:pPr>
-      <w:r>
-        <w:rPr>
-          <w:rFonts w:ascii="Calibri" w:cs="Calibri" w:eastAsia="Calibri" w:hAnsi="Calibri"/>
-        </w:rPr>
-        <w:t xml:space="preserve">{%p endif %}</w:t>
-      </w:r>
-    </w:p>
-    <w:p>
-      <w:pPr>
-        <w:spacing w:after="60" w:before="60" w:line="300"/>
-        <w:jc w:val="left"/>
-      </w:pPr>
-      <w:r>
-        <w:rPr>
-          <w:rFonts w:ascii="Calibri" w:cs="Calibri" w:eastAsia="Calibri" w:hAnsi="Calibri"/>
-        </w:rPr>
-        <w:t>{%p if control_mode == "manual" or auto_control_type in ["plc_agr", "pid"] %}</w:t>
-      </w:r>
-    </w:p>
-    <w:p>
-      <w:pPr>
-        <w:pStyle w:val="ListParagraph"/>
-        <w:numPr>
-          <w:ilvl w:val="0"/>
-          <w:numId w:val="2"/>
-        </w:numPr>
-        <w:spacing w:after="40" w:before="40" w:line="280"/>
-      </w:pPr>
-      <w:r>
-        <w:rPr>
-          <w:rFonts w:ascii="Calibri" w:cs="Calibri" w:eastAsia="Calibri" w:hAnsi="Calibri"/>
-          <w:sz w:val="22"/>
-          <w:szCs w:val="22"/>
-        </w:rPr>
-        <w:t>AIR-GAS RATIO (AGR) REGULATOR</w:t>
-      </w:r>
-    </w:p>
-    <w:p>
-      <w:pPr>
-        <w:spacing w:after="60" w:before="60" w:line="300"/>
-        <w:jc w:val="left"/>
-      </w:pPr>
-      <w:r>
-        <w:rPr>
-          <w:rFonts w:ascii="Calibri" w:cs="Calibri" w:eastAsia="Calibri" w:hAnsi="Calibri"/>
-        </w:rPr>
-        <w:t xml:space="preserve">{%p endif %}</w:t>
-      </w:r>
-    </w:p>
-    <w:p>
-      <w:pPr>
-        <w:spacing w:after="60" w:before="60" w:line="300"/>
-        <w:jc w:val="left"/>
-      </w:pPr>
-      <w:r>
-        <w:rPr>
-          <w:rFonts w:ascii="Calibri" w:cs="Calibri" w:eastAsia="Calibri" w:hAnsi="Calibri"/>
-        </w:rPr>
-        <w:t>{%p if control_mode != "manual" and auto_control_type in ["plc", "ppid_ratio"] %}</w:t>
-      </w:r>
-    </w:p>
-    <w:p>
-      <w:pPr>
-        <w:spacing w:after="60" w:before="60" w:line="300"/>
-        <w:jc w:val="left"/>
-      </w:pPr>
-      <w:r>
-        <w:rPr>
-          <w:rFonts w:ascii="Calibri" w:cs="Calibri" w:eastAsia="Calibri" w:hAnsi="Calibri"/>
-        </w:rPr>
-        <w:t xml:space="preserve">{%p if control_valve_type == "motorised" %}</w:t>
-      </w:r>
-    </w:p>
-    <w:p>
-      <w:pPr>
-        <w:pStyle w:val="ListParagraph"/>
-        <w:numPr>
-          <w:ilvl w:val="0"/>
-          <w:numId w:val="2"/>
-        </w:numPr>
-        <w:spacing w:after="40" w:before="40" w:line="280"/>
-      </w:pPr>
-      <w:r>
-        <w:rPr>
-          <w:rFonts w:ascii="Calibri" w:cs="Calibri" w:eastAsia="Calibri" w:hAnsi="Calibri"/>
-          <w:sz w:val="22"/>
-          <w:szCs w:val="22"/>
-        </w:rPr>
-        <w:t xml:space="preserve">MOTORISED CONTROL VALVE</w:t>
-      </w:r>
-    </w:p>
-    <w:p>
-      <w:pPr>
-        <w:spacing w:after="60" w:before="60" w:line="300"/>
-        <w:jc w:val="left"/>
-      </w:pPr>
-      <w:r>
-        <w:rPr>
-          <w:rFonts w:ascii="Calibri" w:cs="Calibri" w:eastAsia="Calibri" w:hAnsi="Calibri"/>
-        </w:rPr>
-        <w:t xml:space="preserve">{%p else %}</w:t>
-      </w:r>
-    </w:p>
-    <w:p>
-      <w:pPr>
-        <w:pStyle w:val="ListParagraph"/>
-        <w:numPr>
-          <w:ilvl w:val="0"/>
-          <w:numId w:val="2"/>
-        </w:numPr>
-        <w:spacing w:after="40" w:before="40" w:line="280"/>
-      </w:pPr>
-      <w:r>
-        <w:rPr>
-          <w:rFonts w:ascii="Calibri" w:cs="Calibri" w:eastAsia="Calibri" w:hAnsi="Calibri"/>
-          <w:sz w:val="22"/>
-          <w:szCs w:val="22"/>
-        </w:rPr>
-        <w:t xml:space="preserve">PNEUMATIC CONTROL VALVE</w:t>
-      </w:r>
-    </w:p>
-    <w:p>
-      <w:pPr>
-        <w:spacing w:after="60" w:before="60" w:line="300"/>
-        <w:jc w:val="left"/>
-      </w:pPr>
-      <w:r>
-        <w:rPr>
-          <w:rFonts w:ascii="Calibri" w:cs="Calibri" w:eastAsia="Calibri" w:hAnsi="Calibri"/>
-        </w:rPr>
-        <w:t xml:space="preserve">{%p endif %}</w:t>
+        <w:t xml:space="preserve">{{ fuel2_cv_name }}</w:t>
       </w:r>
     </w:p>
     <w:p>

</xml_diff>

<commit_message>
fix: add pilot-burner descriptive paragraph after ENCON Burner bullets
New paragraph gated by special_auto_ignition (so it only appears when
the user has Auto Ignition ticked):

  'We shall be supplying automatically fired pilot burner for ignition
   of main burner. The pilot burner will be equipped with electrode
   assembly, flame sensor, ignition transformer and burner control
   unit.'

Sits right after the BUTTERFLY VALVE bullet of the ENCON Burner
component list, before the 'ON THE MAIN <fuel> PIPELINE:' block.

Co-Authored-By: Claude Opus 4.7 (1M context) <noreply@anthropic.com>
</commit_message>
<xml_diff>
--- a/Offer_Template.docx
+++ b/Offer_Template.docx
@@ -4700,6 +4700,42 @@
           <w:szCs w:val="22"/>
         </w:rPr>
         <w:t>BUTTERFLY VALVE</w:t>
+      </w:r>
+    </w:p>
+    <w:p>
+      <w:pPr>
+        <w:spacing w:after="60" w:before="60" w:line="300"/>
+        <w:jc w:val="left"/>
+      </w:pPr>
+      <w:r>
+        <w:rPr>
+          <w:rFonts w:ascii="Calibri" w:cs="Calibri" w:eastAsia="Calibri" w:hAnsi="Calibri"/>
+        </w:rPr>
+        <w:t xml:space="preserve">{%p if special_auto_ignition %}</w:t>
+      </w:r>
+    </w:p>
+    <w:p>
+      <w:pPr>
+        <w:spacing w:after="60" w:before="60" w:line="300"/>
+        <w:jc w:val="left"/>
+      </w:pPr>
+      <w:r>
+        <w:rPr>
+          <w:rFonts w:ascii="Calibri" w:cs="Calibri" w:eastAsia="Calibri" w:hAnsi="Calibri"/>
+        </w:rPr>
+        <w:t xml:space="preserve">We shall be supplying automatically fired pilot burner for ignition of main burner. The pilot burner will be equipped with electrode assembly, flame sensor, ignition transformer and burner control unit.</w:t>
+      </w:r>
+    </w:p>
+    <w:p>
+      <w:pPr>
+        <w:spacing w:after="60" w:before="60" w:line="300"/>
+        <w:jc w:val="left"/>
+      </w:pPr>
+      <w:r>
+        <w:rPr>
+          <w:rFonts w:ascii="Calibri" w:cs="Calibri" w:eastAsia="Calibri" w:hAnsi="Calibri"/>
+        </w:rPr>
+        <w:t xml:space="preserve">{%p endif %}</w:t>
       </w:r>
     </w:p>
     <w:p>

</xml_diff>

<commit_message>
fix: add 'ENCON PILOT BURNER' Heading 3 above the pilot-burner paragraph
Heading sits inside the existing {%p if special_auto_ignition %} block
so it only renders when Auto Ignition is ticked, alongside the
descriptive paragraph.

Co-Authored-By: Claude Opus 4.7 (1M context) <noreply@anthropic.com>
</commit_message>
<xml_diff>
--- a/Offer_Template.docx
+++ b/Offer_Template.docx
@@ -4712,6 +4712,23 @@
           <w:rFonts w:ascii="Calibri" w:cs="Calibri" w:eastAsia="Calibri" w:hAnsi="Calibri"/>
         </w:rPr>
         <w:t xml:space="preserve">{%p if special_auto_ignition %}</w:t>
+      </w:r>
+    </w:p>
+    <w:p>
+      <w:pPr>
+        <w:pStyle w:val="Heading3"/>
+        <w:spacing w:after="80" w:before="200"/>
+      </w:pPr>
+      <w:r>
+        <w:rPr>
+          <w:rFonts w:ascii="Calibri" w:cs="Calibri" w:eastAsia="Calibri" w:hAnsi="Calibri"/>
+          <w:b/>
+          <w:bCs/>
+          <w:color w:val="1F2937"/>
+          <w:sz w:val="22"/>
+          <w:szCs w:val="22"/>
+        </w:rPr>
+        <w:t xml:space="preserve">ENCON PILOT BURNER</w:t>
       </w:r>
     </w:p>
     <w:p>

</xml_diff>

<commit_message>
fix: square the ENCON header logo
Was 2.86 cm wide x 2.28 cm tall (wider than tall). Both dimensions now
2.86 cm so the logo sits square.

Co-Authored-By: Claude Opus 4.7 (1M context) <noreply@anthropic.com>
</commit_message>
<xml_diff>
--- a/Offer_Template.docx
+++ b/Offer_Template.docx
@@ -18583,7 +18583,7 @@
           <w:r>
             <w:drawing>
               <wp:inline distT="0" distB="0" distL="0" distR="0">
-                <wp:extent cx="1028700" cy="822960"/>
+                <wp:extent cx="1029600" cy="1029600"/>
                 <wp:effectExtent t="0" r="0" b="0" l="0"/>
                 <wp:docPr id="1" name="ENCON" descr="ENCON logo" title="ENCON"/>
                 <wp:cNvGraphicFramePr>
@@ -18608,7 +18608,7 @@
                       <pic:spPr bwMode="auto">
                         <a:xfrm>
                           <a:off x="0" y="0"/>
-                          <a:ext cx="1028700" cy="822960"/>
+                          <a:ext cx="1029600" cy="1029600"/>
                         </a:xfrm>
                         <a:prstGeom prst="rect">
                           <a:avLst/>

</xml_diff>

<commit_message>
fix: widen logo cell + unlock aspect so the square frame actually renders square
The picture extent is 2.86x2.86 cm but the table cell was 2.82 cm wide,
which LibreOffice was honouring over the extent — collapsing the
picture to the cell width and yielding a slightly non-square render.
Widened cell to 3.17 cm and dropped picLocks noChangeAspect=1 so the
picture is rendered at its declared 2.86x2.86 cm square.

Co-Authored-By: Claude Opus 4.7 (1M context) <noreply@anthropic.com>
</commit_message>
<xml_diff>
--- a/Offer_Template.docx
+++ b/Offer_Template.docx
@@ -18567,7 +18567,7 @@
     <w:tr>
       <w:tc>
         <w:tcPr>
-          <w:tcW w:type="dxa" w:w="1600"/>
+          <w:tcW w:type="dxa" w:w="1800"/>
           <w:tcBorders>
             <w:top w:val="none"/>
             <w:left w:val="none"/>
@@ -18587,7 +18587,7 @@
                 <wp:effectExtent t="0" r="0" b="0" l="0"/>
                 <wp:docPr id="1" name="ENCON" descr="ENCON logo" title="ENCON"/>
                 <wp:cNvGraphicFramePr>
-                  <a:graphicFrameLocks xmlns:a="http://schemas.openxmlformats.org/drawingml/2006/main" noChangeAspect="1"/>
+                  <a:graphicFrameLocks xmlns:a="http://schemas.openxmlformats.org/drawingml/2006/main" noChangeAspect="0"/>
                 </wp:cNvGraphicFramePr>
                 <a:graphic xmlns:a="http://schemas.openxmlformats.org/drawingml/2006/main">
                   <a:graphicData uri="http://schemas.openxmlformats.org/drawingml/2006/picture">
@@ -18595,7 +18595,7 @@
                       <pic:nvPicPr>
                         <pic:cNvPr id="0" name="" descr=""/>
                         <pic:cNvPicPr>
-                          <a:picLocks noChangeAspect="1" noChangeArrowheads="1"/>
+                          <a:picLocks noChangeAspect="0" noChangeArrowheads="1"/>
                         </pic:cNvPicPr>
                       </pic:nvPicPr>
                       <pic:blipFill>

</xml_diff>

<commit_message>
fix: square the first-page cover ENCON logo (was 10.05x8.04 -> 10.05x10.05)
The big cover-page logo on page 1 was 10.05 cm wide x 8.04 cm tall —
wider than tall — which stretched the now-square 690x690 source PNG
horizontally and made the disc look like a horizontal oval. Set both
dimensions to 10.054 cm so the cover logo finally renders square.

Co-Authored-By: Claude Opus 4.7 (1M context) <noreply@anthropic.com>
</commit_message>
<xml_diff>
--- a/Offer_Template.docx
+++ b/Offer_Template.docx
@@ -10,7 +10,7 @@
       <w:r>
         <w:drawing>
           <wp:inline distT="0" distB="0" distL="0" distR="0">
-            <wp:extent cx="3619500" cy="2895600"/>
+            <wp:extent cx="3619500" cy="3619500"/>
             <wp:effectExtent t="0" r="0" b="0" l="0"/>
             <wp:docPr id="1001" name="ENCON" descr="ENCON logo" title="ENCON"/>
             <wp:cNvGraphicFramePr>
@@ -35,7 +35,7 @@
                   <pic:spPr bwMode="auto">
                     <a:xfrm>
                       <a:off x="0" y="0"/>
-                      <a:ext cx="3619500" cy="2895600"/>
+                      <a:ext cx="3619500" cy="3619500"/>
                     </a:xfrm>
                     <a:prstGeom prst="rect">
                       <a:avLst/>

</xml_diff>

<commit_message>
fix: make cover-page ENCON logo taller (10.05x10.05 -> 10.05x12.5 cm)
Increased height of the first-page cover logo so it reads taller on
the cover page. Width unchanged — only the height was bumped from
10.054 cm to 12.5 cm.

Co-Authored-By: Claude Opus 4.7 (1M context) <noreply@anthropic.com>
</commit_message>
<xml_diff>
--- a/Offer_Template.docx
+++ b/Offer_Template.docx
@@ -10,7 +10,7 @@
       <w:r>
         <w:drawing>
           <wp:inline distT="0" distB="0" distL="0" distR="0">
-            <wp:extent cx="3619500" cy="3619500"/>
+            <wp:extent cx="3619500" cy="4500000"/>
             <wp:effectExtent t="0" r="0" b="0" l="0"/>
             <wp:docPr id="1001" name="ENCON" descr="ENCON logo" title="ENCON"/>
             <wp:cNvGraphicFramePr>
@@ -35,7 +35,7 @@
                   <pic:spPr bwMode="auto">
                     <a:xfrm>
                       <a:off x="0" y="0"/>
-                      <a:ext cx="3619500" cy="3619500"/>
+                      <a:ext cx="3619500" cy="4500000"/>
                     </a:xfrm>
                     <a:prstGeom prst="rect">
                       <a:avLst/>

</xml_diff>

<commit_message>
fix: cover ENCON logo +0.5 cm taller (12.5 -> 13.0 cm)
Co-Authored-By: Claude Opus 4.7 (1M context) <noreply@anthropic.com>
</commit_message>
<xml_diff>
--- a/Offer_Template.docx
+++ b/Offer_Template.docx
@@ -10,7 +10,7 @@
       <w:r>
         <w:drawing>
           <wp:inline distT="0" distB="0" distL="0" distR="0">
-            <wp:extent cx="3619500" cy="4500000"/>
+            <wp:extent cx="3619500" cy="4680000"/>
             <wp:effectExtent t="0" r="0" b="0" l="0"/>
             <wp:docPr id="1001" name="ENCON" descr="ENCON logo" title="ENCON"/>
             <wp:cNvGraphicFramePr>
@@ -35,7 +35,7 @@
                   <pic:spPr bwMode="auto">
                     <a:xfrm>
                       <a:off x="0" y="0"/>
-                      <a:ext cx="3619500" cy="4500000"/>
+                      <a:ext cx="3619500" cy="4680000"/>
                     </a:xfrm>
                     <a:prstGeom prst="rect">
                       <a:avLst/>

</xml_diff>

<commit_message>
fix: tighten cover-page spacers so contact block fits on page 1
Cut the 720-twip gap before the ENCON tagline block to 240 (~-1.0 cm)
and the 600-twip gap above the logo to 200 (~-0.7 cm). Together they
free ~1.7 cm so the 'ENCON Thermal Engineers' + tagline + address +
contact block returns to page 1 alongside the (now 13 cm tall) logo.

Co-Authored-By: Claude Opus 4.7 (1M context) <noreply@anthropic.com>
</commit_message>
<xml_diff>
--- a/Offer_Template.docx
+++ b/Offer_Template.docx
@@ -4,7 +4,7 @@
   <w:body>
     <w:p>
       <w:pPr>
-        <w:spacing w:before="600" w:after="0"/>
+        <w:spacing w:before="200" w:after="0"/>
         <w:jc w:val="center"/>
       </w:pPr>
       <w:r>
@@ -348,7 +348,7 @@
     </w:tbl>
     <w:p>
       <w:pPr>
-        <w:spacing w:before="720" w:after="0"/>
+        <w:spacing w:before="240" w:after="0"/>
       </w:pPr>
       <w:r>
         <w:t xml:space="preserve"/>

</xml_diff>

<commit_message>
fix: make header ENCON logo slightly taller (2.86 -> 3.5 cm)
Header logo (top of every page) was 2.86 x 2.86 cm. Bumped only the
height to 3.5 cm so the disc + ENCON text reads more prominently in
the page header. Width unchanged.

Co-Authored-By: Claude Opus 4.7 (1M context) <noreply@anthropic.com>
</commit_message>
<xml_diff>
--- a/Offer_Template.docx
+++ b/Offer_Template.docx
@@ -18583,7 +18583,7 @@
           <w:r>
             <w:drawing>
               <wp:inline distT="0" distB="0" distL="0" distR="0">
-                <wp:extent cx="1029600" cy="1029600"/>
+                <wp:extent cx="1029600" cy="1260000"/>
                 <wp:effectExtent t="0" r="0" b="0" l="0"/>
                 <wp:docPr id="1" name="ENCON" descr="ENCON logo" title="ENCON"/>
                 <wp:cNvGraphicFramePr>
@@ -18608,7 +18608,7 @@
                       <pic:spPr bwMode="auto">
                         <a:xfrm>
                           <a:off x="0" y="0"/>
-                          <a:ext cx="1029600" cy="1029600"/>
+                          <a:ext cx="1029600" cy="1260000"/>
                         </a:xfrm>
                         <a:prstGeom prst="rect">
                           <a:avLst/>

</xml_diff>

<commit_message>
fix: shave more cover-page spacing so Tel + email land on page 1
Trimmed the 'OFFER FOR' before/after (480/120 -> 200/80) and the
equipment-name after spacer (480 -> 200). Frees ~1 cm so the last
two lines (Tel and sales@encon.co.in / www.encon.co.in) come back
to page 1.

Co-Authored-By: Claude Opus 4.7 (1M context) <noreply@anthropic.com>
</commit_message>
<xml_diff>
--- a/Offer_Template.docx
+++ b/Offer_Template.docx
@@ -50,7 +50,7 @@
     </w:p>
     <w:p>
       <w:pPr>
-        <w:spacing w:before="480" w:after="120"/>
+        <w:spacing w:before="200" w:after="80"/>
         <w:jc w:val="center"/>
       </w:pPr>
       <w:r>
@@ -68,7 +68,7 @@
     </w:p>
     <w:p>
       <w:pPr>
-        <w:spacing w:before="0" w:after="480"/>
+        <w:spacing w:before="0" w:after="200"/>
         <w:jc w:val="center"/>
       </w:pPr>
       <w:r>

</xml_diff>

<commit_message>
fix: move pilot gas-line block right after the pilot burner paragraph
The '{{pilot_gas_type}} LINE FOR PILOT BURNER:' heading and its bullets
were being rendered after the main fuel + combustion-air pipeline blocks,
far from the ENCON Pilot Burner paragraph that introduces them. Moved
the block so it now sits directly under the pilot paragraph, before
the main fuel/air pipelines.

Co-Authored-By: Claude Opus 4.7 (1M context) <noreply@anthropic.com>
</commit_message>
<xml_diff>
--- a/Offer_Template.docx
+++ b/Offer_Template.docx
@@ -4757,6 +4757,29 @@
     </w:p>
     <w:p>
       <w:pPr>
+        <w:spacing w:after="60" w:before="120"/>
+      </w:pPr>
+      <w:r>
+        <w:t xml:space="preserve">{%p if special_auto_ignition %}</w:t>
+      </w:r>
+    </w:p>
+    <w:p>
+      <w:pPr>
+        <w:spacing w:after="60" w:before="120"/>
+      </w:pPr>
+      <w:r>
+        <w:rPr>
+          <w:rFonts w:ascii="Calibri" w:cs="Calibri" w:eastAsia="Calibri" w:hAnsi="Calibri"/>
+          <w:b/>
+          <w:bCs/>
+          <w:sz w:val="22"/>
+          <w:szCs w:val="22"/>
+        </w:rPr>
+        <w:t>{{pilot_gas_type}} LINE FOR PILOT BURNER:</w:t>
+      </w:r>
+    </w:p>
+    <w:p>
+      <w:pPr>
         <w:pStyle w:val="ListParagraph"/>
         <w:numPr>
           <w:ilvl w:val="0"/>
@@ -4765,18 +4788,7 @@
         <w:spacing w:after="40" w:before="40" w:line="280"/>
       </w:pPr>
       <w:r>
-        <w:t xml:space="preserve">{%p if is_dual %}</w:t>
-      </w:r>
-    </w:p>
-    <w:p>
-      <w:pPr>
-        <w:spacing w:after="60" w:before="100"/>
-      </w:pPr>
-      <w:r>
-        <w:rPr>
-          <w:b/>
-        </w:rPr>
-        <w:t>ON THE MAIN {{ fuel1_line_label }} PIPELINE:</w:t>
+        <w:t xml:space="preserve">{%p for x in pilot_pipeline_items %}</w:t>
       </w:r>
     </w:p>
     <w:p>
@@ -4789,7 +4801,7 @@
         <w:spacing w:after="40" w:before="40" w:line="280"/>
       </w:pPr>
       <w:r>
-        <w:t xml:space="preserve">{%p for x in fuel1_line_items %}</w:t>
+        <w:t xml:space="preserve">{{ x.item }}</w:t>
       </w:r>
     </w:p>
     <w:p>
@@ -4802,7 +4814,20 @@
         <w:spacing w:after="40" w:before="40" w:line="280"/>
       </w:pPr>
       <w:r>
-        <w:t xml:space="preserve">{{ x.item }}</w:t>
+        <w:t xml:space="preserve">{%p for s in x.sub_items %}</w:t>
+      </w:r>
+    </w:p>
+    <w:p>
+      <w:pPr>
+        <w:pStyle w:val="ListParagraph"/>
+        <w:numPr>
+          <w:ilvl w:val="1"/>
+          <w:numId w:val="2"/>
+        </w:numPr>
+        <w:spacing w:after="40" w:before="40" w:line="280"/>
+      </w:pPr>
+      <w:r>
+        <w:t xml:space="preserve">{{ s.item }}</w:t>
       </w:r>
     </w:p>
     <w:p>
@@ -4815,6 +4840,90 @@
         <w:spacing w:after="40" w:before="40" w:line="280"/>
       </w:pPr>
       <w:r>
+        <w:t xml:space="preserve">{%p endfor %}</w:t>
+      </w:r>
+    </w:p>
+    <w:p>
+      <w:pPr>
+        <w:pStyle w:val="ListParagraph"/>
+        <w:numPr>
+          <w:ilvl w:val="0"/>
+          <w:numId w:val="2"/>
+        </w:numPr>
+        <w:spacing w:after="40" w:before="40" w:line="280"/>
+      </w:pPr>
+      <w:r>
+        <w:t xml:space="preserve">{%p endfor %}</w:t>
+      </w:r>
+    </w:p>
+    <w:p>
+      <w:pPr>
+        <w:spacing w:after="60" w:before="120"/>
+      </w:pPr>
+      <w:r>
+        <w:t xml:space="preserve">{%p endif %}</w:t>
+      </w:r>
+    </w:p>
+    <w:p>
+      <w:pPr>
+        <w:pStyle w:val="ListParagraph"/>
+        <w:numPr>
+          <w:ilvl w:val="0"/>
+          <w:numId w:val="2"/>
+        </w:numPr>
+        <w:spacing w:after="40" w:before="40" w:line="280"/>
+      </w:pPr>
+      <w:r>
+        <w:t xml:space="preserve">{%p if is_dual %}</w:t>
+      </w:r>
+    </w:p>
+    <w:p>
+      <w:pPr>
+        <w:spacing w:after="60" w:before="100"/>
+      </w:pPr>
+      <w:r>
+        <w:rPr>
+          <w:b/>
+        </w:rPr>
+        <w:t>ON THE MAIN {{ fuel1_line_label }} PIPELINE:</w:t>
+      </w:r>
+    </w:p>
+    <w:p>
+      <w:pPr>
+        <w:pStyle w:val="ListParagraph"/>
+        <w:numPr>
+          <w:ilvl w:val="0"/>
+          <w:numId w:val="2"/>
+        </w:numPr>
+        <w:spacing w:after="40" w:before="40" w:line="280"/>
+      </w:pPr>
+      <w:r>
+        <w:t xml:space="preserve">{%p for x in fuel1_line_items %}</w:t>
+      </w:r>
+    </w:p>
+    <w:p>
+      <w:pPr>
+        <w:pStyle w:val="ListParagraph"/>
+        <w:numPr>
+          <w:ilvl w:val="0"/>
+          <w:numId w:val="2"/>
+        </w:numPr>
+        <w:spacing w:after="40" w:before="40" w:line="280"/>
+      </w:pPr>
+      <w:r>
+        <w:t xml:space="preserve">{{ x.item }}</w:t>
+      </w:r>
+    </w:p>
+    <w:p>
+      <w:pPr>
+        <w:pStyle w:val="ListParagraph"/>
+        <w:numPr>
+          <w:ilvl w:val="0"/>
+          <w:numId w:val="2"/>
+        </w:numPr>
+        <w:spacing w:after="40" w:before="40" w:line="280"/>
+      </w:pPr>
+      <w:r>
         <w:t xml:space="preserve">{%p for s in x.sub_items %}</w:t>
       </w:r>
     </w:p>
@@ -5180,115 +5289,6 @@
       </w:pPr>
       <w:r>
         <w:t xml:space="preserve">{%p endfor %}</w:t>
-      </w:r>
-    </w:p>
-    <w:p>
-      <w:pPr>
-        <w:spacing w:after="60" w:before="120"/>
-      </w:pPr>
-      <w:r>
-        <w:t xml:space="preserve">{%p if special_auto_ignition %}</w:t>
-      </w:r>
-    </w:p>
-    <w:p>
-      <w:pPr>
-        <w:spacing w:after="60" w:before="120"/>
-      </w:pPr>
-      <w:r>
-        <w:rPr>
-          <w:rFonts w:ascii="Calibri" w:cs="Calibri" w:eastAsia="Calibri" w:hAnsi="Calibri"/>
-          <w:b/>
-          <w:bCs/>
-          <w:sz w:val="22"/>
-          <w:szCs w:val="22"/>
-        </w:rPr>
-        <w:t>{{pilot_gas_type}} LINE FOR PILOT BURNER:</w:t>
-      </w:r>
-    </w:p>
-    <w:p>
-      <w:pPr>
-        <w:pStyle w:val="ListParagraph"/>
-        <w:numPr>
-          <w:ilvl w:val="0"/>
-          <w:numId w:val="2"/>
-        </w:numPr>
-        <w:spacing w:after="40" w:before="40" w:line="280"/>
-      </w:pPr>
-      <w:r>
-        <w:t xml:space="preserve">{%p for x in pilot_pipeline_items %}</w:t>
-      </w:r>
-    </w:p>
-    <w:p>
-      <w:pPr>
-        <w:pStyle w:val="ListParagraph"/>
-        <w:numPr>
-          <w:ilvl w:val="0"/>
-          <w:numId w:val="2"/>
-        </w:numPr>
-        <w:spacing w:after="40" w:before="40" w:line="280"/>
-      </w:pPr>
-      <w:r>
-        <w:t xml:space="preserve">{{ x.item }}</w:t>
-      </w:r>
-    </w:p>
-    <w:p>
-      <w:pPr>
-        <w:pStyle w:val="ListParagraph"/>
-        <w:numPr>
-          <w:ilvl w:val="0"/>
-          <w:numId w:val="2"/>
-        </w:numPr>
-        <w:spacing w:after="40" w:before="40" w:line="280"/>
-      </w:pPr>
-      <w:r>
-        <w:t xml:space="preserve">{%p for s in x.sub_items %}</w:t>
-      </w:r>
-    </w:p>
-    <w:p>
-      <w:pPr>
-        <w:pStyle w:val="ListParagraph"/>
-        <w:numPr>
-          <w:ilvl w:val="1"/>
-          <w:numId w:val="2"/>
-        </w:numPr>
-        <w:spacing w:after="40" w:before="40" w:line="280"/>
-      </w:pPr>
-      <w:r>
-        <w:t xml:space="preserve">{{ s.item }}</w:t>
-      </w:r>
-    </w:p>
-    <w:p>
-      <w:pPr>
-        <w:pStyle w:val="ListParagraph"/>
-        <w:numPr>
-          <w:ilvl w:val="0"/>
-          <w:numId w:val="2"/>
-        </w:numPr>
-        <w:spacing w:after="40" w:before="40" w:line="280"/>
-      </w:pPr>
-      <w:r>
-        <w:t xml:space="preserve">{%p endfor %}</w:t>
-      </w:r>
-    </w:p>
-    <w:p>
-      <w:pPr>
-        <w:pStyle w:val="ListParagraph"/>
-        <w:numPr>
-          <w:ilvl w:val="0"/>
-          <w:numId w:val="2"/>
-        </w:numPr>
-        <w:spacing w:after="40" w:before="40" w:line="280"/>
-      </w:pPr>
-      <w:r>
-        <w:t xml:space="preserve">{%p endfor %}</w:t>
-      </w:r>
-    </w:p>
-    <w:p>
-      <w:pPr>
-        <w:spacing w:after="60" w:before="120"/>
-      </w:pPr>
-      <w:r>
-        <w:t xml:space="preserve">{%p endif %}</w:t>
       </w:r>
     </w:p>
     <w:p>

</xml_diff>

<commit_message>
fix: Annexure III - move Supervision Charges row below TOTAL
Reordered the Price Schedule table so the Supervision Charges row
(S.No. 2) renders AFTER the TOTAL row, giving it its own visual box
below the main pricing total.

Co-Authored-By: Claude Opus 4.7 (1M context) <noreply@anthropic.com>
</commit_message>
<xml_diff>
--- a/Offer_Template.docx
+++ b/Offer_Template.docx
@@ -8452,7 +8452,7 @@
                 <w:sz w:val="22"/>
                 <w:szCs w:val="22"/>
               </w:rPr>
-              <w:t xml:space="preserve">2</w:t>
+              <w:t xml:space="preserve"/>
             </w:r>
           </w:p>
         </w:tc>
@@ -8479,7 +8479,10 @@
               <w:jc w:val="left"/>
             </w:pPr>
             <w:r>
-              <w:t xml:space="preserve">Supervision Charges for Erection and Commissioning: INR {{ supervision_mech }} (Mechanical), INR {{ supervision_plc }} (PLC and Instrumentation). To-and-fro fare from Delhi to site, plus boarding, lodging, local conveyance, and medical assistance if required.</w:t>
+              <w:rPr>
+                <w:b/>
+              </w:rPr>
+              <w:t xml:space="preserve">TOTAL</w:t>
             </w:r>
           </w:p>
         </w:tc>
@@ -8506,7 +8509,10 @@
               <w:jc w:val="center"/>
             </w:pPr>
             <w:r>
-              <w:t xml:space="preserve">As actual</w:t>
+              <w:rPr>
+                <w:b/>
+              </w:rPr>
+              <w:t xml:space="preserve"/>
             </w:r>
           </w:p>
         </w:tc>
@@ -8533,7 +8539,10 @@
               <w:jc w:val="right"/>
             </w:pPr>
             <w:r>
-              <w:t xml:space="preserve">-</w:t>
+              <w:rPr>
+                <w:b/>
+              </w:rPr>
+              <w:t xml:space="preserve"/>
             </w:r>
           </w:p>
         </w:tc>
@@ -8560,7 +8569,10 @@
               <w:jc w:val="right"/>
             </w:pPr>
             <w:r>
-              <w:t xml:space="preserve">-</w:t>
+              <w:rPr>
+                <w:b/>
+              </w:rPr>
+              <w:t xml:space="preserve">{{ total_price_vertical }}</w:t>
             </w:r>
           </w:p>
         </w:tc>
@@ -8596,7 +8608,7 @@
                 <w:sz w:val="22"/>
                 <w:szCs w:val="22"/>
               </w:rPr>
-              <w:t xml:space="preserve"/>
+              <w:t xml:space="preserve">2</w:t>
             </w:r>
           </w:p>
         </w:tc>
@@ -8623,10 +8635,7 @@
               <w:jc w:val="left"/>
             </w:pPr>
             <w:r>
-              <w:rPr>
-                <w:b/>
-              </w:rPr>
-              <w:t xml:space="preserve">TOTAL</w:t>
+              <w:t xml:space="preserve">Supervision Charges for Erection and Commissioning: INR {{ supervision_mech }} (Mechanical), INR {{ supervision_plc }} (PLC and Instrumentation). To-and-fro fare from Delhi to site, plus boarding, lodging, local conveyance, and medical assistance if required.</w:t>
             </w:r>
           </w:p>
         </w:tc>
@@ -8653,10 +8662,7 @@
               <w:jc w:val="center"/>
             </w:pPr>
             <w:r>
-              <w:rPr>
-                <w:b/>
-              </w:rPr>
-              <w:t xml:space="preserve"/>
+              <w:t xml:space="preserve">As actual</w:t>
             </w:r>
           </w:p>
         </w:tc>
@@ -8683,10 +8689,7 @@
               <w:jc w:val="right"/>
             </w:pPr>
             <w:r>
-              <w:rPr>
-                <w:b/>
-              </w:rPr>
-              <w:t xml:space="preserve"/>
+              <w:t xml:space="preserve">-</w:t>
             </w:r>
           </w:p>
         </w:tc>
@@ -8713,10 +8716,7 @@
               <w:jc w:val="right"/>
             </w:pPr>
             <w:r>
-              <w:rPr>
-                <w:b/>
-              </w:rPr>
-              <w:t xml:space="preserve">{{ total_price_vertical }}</w:t>
+              <w:t xml:space="preserve">-</w:t>
             </w:r>
           </w:p>
         </w:tc>

</xml_diff>

<commit_message>
fix: Supervision Charges in its own table with separate rows for each fee
Annexure III is now split into two tables:
  1) Price Schedule    : header + equipment line + TOTAL
  2) Supervision table : separate 2-row table for Mechanical
                          (INR 12,500.00) and PLC + Instrumentation
                          (INR 15,000.00), plus a 'Note' row about
                          travel / boarding charges spanning both cells.

Co-Authored-By: Claude Opus 4.7 (1M context) <noreply@anthropic.com>
</commit_message>
<xml_diff>
--- a/Offer_Template.docx
+++ b/Offer_Template.docx
@@ -8577,146 +8577,90 @@
           </w:p>
         </w:tc>
       </w:tr>
+    </w:tbl>
+    <w:p>
+      <w:pPr>
+        <w:spacing w:before="240" w:after="0"/>
+      </w:pPr>
+    </w:p>
+    <w:tbl>
+      <w:tblPr>
+        <w:tblW w:type="dxa" w:w="9360"/>
+        <w:tblBorders>
+          <w:top w:val="single" w:sz="6" w:color="auto"/>
+          <w:left w:val="single" w:sz="6" w:color="auto"/>
+          <w:bottom w:val="single" w:sz="6" w:color="auto"/>
+          <w:right w:val="single" w:sz="6" w:color="auto"/>
+          <w:insideH w:val="single" w:sz="6" w:color="auto"/>
+          <w:insideV w:val="single" w:sz="6" w:color="auto"/>
+        </w:tblBorders>
+      </w:tblPr>
+      <w:tblGrid>
+        <w:gridCol w:w="6360"/>
+        <w:gridCol w:w="3000"/>
+      </w:tblGrid>
       <w:tr>
         <w:tc>
           <w:tcPr>
-            <w:tcW w:type="dxa" w:w="780"/>
-            <w:tcBorders>
-              <w:top w:val="single" w:color="BFBFBF" w:sz="4"/>
-              <w:left w:val="single" w:color="BFBFBF" w:sz="4"/>
-              <w:bottom w:val="single" w:color="BFBFBF" w:sz="4"/>
-              <w:right w:val="single" w:color="BFBFBF" w:sz="4"/>
-            </w:tcBorders>
-            <w:tcMar>
-              <w:top w:type="dxa" w:w="100"/>
-              <w:left w:type="dxa" w:w="140"/>
-              <w:bottom w:type="dxa" w:w="100"/>
-              <w:right w:type="dxa" w:w="140"/>
-            </w:tcMar>
-            <w:vAlign w:val="center"/>
-          </w:tcPr>
-          <w:p>
-            <w:pPr>
-              <w:spacing w:after="40" w:before="40"/>
-              <w:jc w:val="center"/>
-            </w:pPr>
-            <w:r>
-              <w:rPr>
-                <w:rFonts w:ascii="Calibri" w:cs="Calibri" w:eastAsia="Calibri" w:hAnsi="Calibri"/>
+            <w:tcW w:type="dxa" w:w="6360"/>
+          </w:tcPr>
+          <w:p>
+            <w:r>
+              <w:rPr>
                 <w:b/>
-                <w:bCs/>
-                <w:sz w:val="22"/>
-                <w:szCs w:val="22"/>
-              </w:rPr>
-              <w:t xml:space="preserve">2</w:t>
-            </w:r>
-          </w:p>
-        </w:tc>
-        <w:tc>
-          <w:tcPr>
-            <w:tcW w:type="dxa" w:w="4080"/>
-            <w:tcBorders>
-              <w:top w:val="single" w:color="BFBFBF" w:sz="4"/>
-              <w:left w:val="single" w:color="BFBFBF" w:sz="4"/>
-              <w:bottom w:val="single" w:color="BFBFBF" w:sz="4"/>
-              <w:right w:val="single" w:color="BFBFBF" w:sz="4"/>
-            </w:tcBorders>
-            <w:tcMar>
-              <w:top w:type="dxa" w:w="100"/>
-              <w:left w:type="dxa" w:w="140"/>
-              <w:bottom w:type="dxa" w:w="100"/>
-              <w:right w:type="dxa" w:w="140"/>
-            </w:tcMar>
-            <w:vAlign w:val="center"/>
-          </w:tcPr>
-          <w:p>
-            <w:pPr>
-              <w:spacing w:after="40" w:before="40"/>
-              <w:jc w:val="left"/>
-            </w:pPr>
-            <w:r>
-              <w:t xml:space="preserve">Supervision Charges for Erection and Commissioning: INR {{ supervision_mech }} (Mechanical), INR {{ supervision_plc }} (PLC and Instrumentation). To-and-fro fare from Delhi to site, plus boarding, lodging, local conveyance, and medical assistance if required.</w:t>
-            </w:r>
-          </w:p>
-        </w:tc>
-        <w:tc>
-          <w:tcPr>
-            <w:tcW w:type="dxa" w:w="1100"/>
-            <w:tcBorders>
-              <w:top w:val="single" w:color="BFBFBF" w:sz="4"/>
-              <w:left w:val="single" w:color="BFBFBF" w:sz="4"/>
-              <w:bottom w:val="single" w:color="BFBFBF" w:sz="4"/>
-              <w:right w:val="single" w:color="BFBFBF" w:sz="4"/>
-            </w:tcBorders>
-            <w:tcMar>
-              <w:top w:type="dxa" w:w="100"/>
-              <w:left w:type="dxa" w:w="140"/>
-              <w:bottom w:type="dxa" w:w="100"/>
-              <w:right w:type="dxa" w:w="140"/>
-            </w:tcMar>
-            <w:vAlign w:val="center"/>
-          </w:tcPr>
-          <w:p>
-            <w:pPr>
-              <w:spacing w:after="40" w:before="40"/>
-              <w:jc w:val="center"/>
-            </w:pPr>
-            <w:r>
-              <w:t xml:space="preserve">As actual</w:t>
-            </w:r>
-          </w:p>
-        </w:tc>
-        <w:tc>
-          <w:tcPr>
-            <w:tcW w:type="dxa" w:w="1700"/>
-            <w:tcBorders>
-              <w:top w:val="single" w:color="BFBFBF" w:sz="4"/>
-              <w:left w:val="single" w:color="BFBFBF" w:sz="4"/>
-              <w:bottom w:val="single" w:color="BFBFBF" w:sz="4"/>
-              <w:right w:val="single" w:color="BFBFBF" w:sz="4"/>
-            </w:tcBorders>
-            <w:tcMar>
-              <w:top w:type="dxa" w:w="100"/>
-              <w:left w:type="dxa" w:w="140"/>
-              <w:bottom w:type="dxa" w:w="100"/>
-              <w:right w:type="dxa" w:w="140"/>
-            </w:tcMar>
-            <w:vAlign w:val="center"/>
-          </w:tcPr>
-          <w:p>
-            <w:pPr>
-              <w:spacing w:after="40" w:before="40"/>
-              <w:jc w:val="right"/>
-            </w:pPr>
-            <w:r>
-              <w:t xml:space="preserve">-</w:t>
-            </w:r>
-          </w:p>
-        </w:tc>
-        <w:tc>
-          <w:tcPr>
-            <w:tcW w:type="dxa" w:w="1700"/>
-            <w:tcBorders>
-              <w:top w:val="single" w:color="BFBFBF" w:sz="4"/>
-              <w:left w:val="single" w:color="BFBFBF" w:sz="4"/>
-              <w:bottom w:val="single" w:color="BFBFBF" w:sz="4"/>
-              <w:right w:val="single" w:color="BFBFBF" w:sz="4"/>
-            </w:tcBorders>
-            <w:tcMar>
-              <w:top w:type="dxa" w:w="100"/>
-              <w:left w:type="dxa" w:w="140"/>
-              <w:bottom w:type="dxa" w:w="100"/>
-              <w:right w:type="dxa" w:w="140"/>
-            </w:tcMar>
-            <w:vAlign w:val="center"/>
-          </w:tcPr>
-          <w:p>
-            <w:pPr>
-              <w:spacing w:after="40" w:before="40"/>
-              <w:jc w:val="right"/>
-            </w:pPr>
-            <w:r>
-              <w:t xml:space="preserve">-</w:t>
+              </w:rPr>
+              <w:t>Supervision Charges for Erection and Commissioning (Mechanical)</w:t>
+            </w:r>
+          </w:p>
+        </w:tc>
+        <w:tc>
+          <w:tcPr>
+            <w:tcW w:type="dxa" w:w="3000"/>
+          </w:tcPr>
+          <w:p>
+            <w:r>
+              <w:t xml:space="preserve">INR {{ supervision_mech }}</w:t>
+            </w:r>
+          </w:p>
+        </w:tc>
+      </w:tr>
+      <w:tr>
+        <w:tc>
+          <w:tcPr>
+            <w:tcW w:type="dxa" w:w="6360"/>
+          </w:tcPr>
+          <w:p>
+            <w:r>
+              <w:rPr>
+                <w:b/>
+              </w:rPr>
+              <w:t>Supervision Charges for Erection and Commissioning (PLC and Instrumentation)</w:t>
+            </w:r>
+          </w:p>
+        </w:tc>
+        <w:tc>
+          <w:tcPr>
+            <w:tcW w:type="dxa" w:w="3000"/>
+          </w:tcPr>
+          <w:p>
+            <w:r>
+              <w:t xml:space="preserve">INR {{ supervision_plc }}</w:t>
+            </w:r>
+          </w:p>
+        </w:tc>
+      </w:tr>
+      <w:tr>
+        <w:tc>
+          <w:tcPr>
+            <w:tcW w:type="dxa" w:w="9360"/>
+            <w:gridSpan w:val="2"/>
+          </w:tcPr>
+          <w:p>
+            <w:r>
+              <w:rPr>
+                <w:i/>
+              </w:rPr>
+              <w:t>Note: To-and-fro fare from Delhi to site, plus boarding, lodging, local conveyance, and medical assistance if required.</w:t>
             </w:r>
           </w:p>
         </w:tc>

</xml_diff>

<commit_message>
fix: TCS section - drop orifice plates, dynamic CV bullets
The Temperature Control System section had its own hardcoded conditional
bullets (separate from the temp_control_items loop), which is why the
earlier orifice-plate removal + CV bullet rules weren't visible in the
generated offer.

Template changes:
- Removed the {%p if auto_control_type == "plc" %} block that emitted
  two 'ORIFICE PLATE FITTED ...' bullets in TCS.
- Replaced the MOTORISED/PNEUMATIC single-bullet block with a
  {%p for cv in cv_bullets %} loop.

Server changes (engine/quote_writer.py):
- New helper _cv_bullets_for_offer() returns the bullet list per spec:
  PID = just 'CONTROL VALVE ON AIR LINE'; everything else = air + fuel
  CV; dual oil+gas yields air + gas + oil (three bullets).
- cv_bullets passed through the template context.

Co-Authored-By: Claude Opus 4.7 (1M context) <noreply@anthropic.com>
</commit_message>
<xml_diff>
--- a/Offer_Template.docx
+++ b/Offer_Template.docx
@@ -6577,7 +6577,7 @@
         <w:rPr>
           <w:rFonts w:ascii="Calibri" w:cs="Calibri" w:eastAsia="Calibri" w:hAnsi="Calibri"/>
         </w:rPr>
-        <w:t xml:space="preserve">{%p if control_mode != "manual" and auto_control_type == "plc" %}</w:t>
+        <w:t xml:space="preserve">{%p if control_mode != "manual" and auto_control_type == "ppid_ratio" %}</w:t>
       </w:r>
     </w:p>
     <w:p>
@@ -6595,7 +6595,31 @@
           <w:sz w:val="22"/>
           <w:szCs w:val="22"/>
         </w:rPr>
-        <w:t>ORIFICE PLATE FITTED WITH DIFFERENTIAL PRESSURE TRANSMITTER ON {% if is_oil %}OIL{% else %}GAS{% endif %} LINE</w:t>
+        <w:t>RATIO CONTROLLER</w:t>
+      </w:r>
+    </w:p>
+    <w:p>
+      <w:pPr>
+        <w:spacing w:after="60" w:before="60" w:line="300"/>
+        <w:jc w:val="left"/>
+      </w:pPr>
+      <w:r>
+        <w:rPr>
+          <w:rFonts w:ascii="Calibri" w:cs="Calibri" w:eastAsia="Calibri" w:hAnsi="Calibri"/>
+        </w:rPr>
+        <w:t xml:space="preserve">{%p endif %}</w:t>
+      </w:r>
+    </w:p>
+    <w:p>
+      <w:pPr>
+        <w:spacing w:after="60" w:before="60" w:line="300"/>
+        <w:jc w:val="left"/>
+      </w:pPr>
+      <w:r>
+        <w:rPr>
+          <w:rFonts w:ascii="Calibri" w:cs="Calibri" w:eastAsia="Calibri" w:hAnsi="Calibri"/>
+        </w:rPr>
+        <w:t>{%p if control_mode == "manual" or auto_control_type in ["plc_agr", "pid"] %}</w:t>
       </w:r>
     </w:p>
     <w:p>
@@ -6613,7 +6637,7 @@
           <w:sz w:val="22"/>
           <w:szCs w:val="22"/>
         </w:rPr>
-        <w:t>ORIFICE PLATE FITTED WITH DIFFERENTIAL PRESSURE TRANSMITTER ON AIR LINE</w:t>
+        <w:t>AIR-GAS RATIO (AGR) REGULATOR</w:t>
       </w:r>
     </w:p>
     <w:p>
@@ -6637,7 +6661,7 @@
         <w:rPr>
           <w:rFonts w:ascii="Calibri" w:cs="Calibri" w:eastAsia="Calibri" w:hAnsi="Calibri"/>
         </w:rPr>
-        <w:t xml:space="preserve">{%p if control_mode != "manual" and auto_control_type == "ppid_ratio" %}</w:t>
+        <w:t xml:space="preserve">{%p for cv in cv_bullets %}</w:t>
       </w:r>
     </w:p>
     <w:p>
@@ -6655,7 +6679,7 @@
           <w:sz w:val="22"/>
           <w:szCs w:val="22"/>
         </w:rPr>
-        <w:t>RATIO CONTROLLER</w:t>
+        <w:t>{{ cv }}</w:t>
       </w:r>
     </w:p>
     <w:p>
@@ -6667,145 +6691,7 @@
         <w:rPr>
           <w:rFonts w:ascii="Calibri" w:cs="Calibri" w:eastAsia="Calibri" w:hAnsi="Calibri"/>
         </w:rPr>
-        <w:t xml:space="preserve">{%p endif %}</w:t>
-      </w:r>
-    </w:p>
-    <w:p>
-      <w:pPr>
-        <w:spacing w:after="60" w:before="60" w:line="300"/>
-        <w:jc w:val="left"/>
-      </w:pPr>
-      <w:r>
-        <w:rPr>
-          <w:rFonts w:ascii="Calibri" w:cs="Calibri" w:eastAsia="Calibri" w:hAnsi="Calibri"/>
-        </w:rPr>
-        <w:t>{%p if control_mode == "manual" or auto_control_type in ["plc_agr", "pid"] %}</w:t>
-      </w:r>
-    </w:p>
-    <w:p>
-      <w:pPr>
-        <w:pStyle w:val="ListParagraph"/>
-        <w:numPr>
-          <w:ilvl w:val="0"/>
-          <w:numId w:val="2"/>
-        </w:numPr>
-        <w:spacing w:after="40" w:before="40" w:line="280"/>
-      </w:pPr>
-      <w:r>
-        <w:rPr>
-          <w:rFonts w:ascii="Calibri" w:cs="Calibri" w:eastAsia="Calibri" w:hAnsi="Calibri"/>
-          <w:sz w:val="22"/>
-          <w:szCs w:val="22"/>
-        </w:rPr>
-        <w:t>AIR-GAS RATIO (AGR) REGULATOR</w:t>
-      </w:r>
-    </w:p>
-    <w:p>
-      <w:pPr>
-        <w:spacing w:after="60" w:before="60" w:line="300"/>
-        <w:jc w:val="left"/>
-      </w:pPr>
-      <w:r>
-        <w:rPr>
-          <w:rFonts w:ascii="Calibri" w:cs="Calibri" w:eastAsia="Calibri" w:hAnsi="Calibri"/>
-        </w:rPr>
-        <w:t xml:space="preserve">{%p endif %}</w:t>
-      </w:r>
-    </w:p>
-    <w:p>
-      <w:pPr>
-        <w:spacing w:after="60" w:before="60" w:line="300"/>
-        <w:jc w:val="left"/>
-      </w:pPr>
-      <w:r>
-        <w:rPr>
-          <w:rFonts w:ascii="Calibri" w:cs="Calibri" w:eastAsia="Calibri" w:hAnsi="Calibri"/>
-        </w:rPr>
-        <w:t>{%p if control_mode != "manual" and auto_control_type in ["plc", "ppid_ratio"] %}</w:t>
-      </w:r>
-    </w:p>
-    <w:p>
-      <w:pPr>
-        <w:spacing w:after="60" w:before="60" w:line="300"/>
-        <w:jc w:val="left"/>
-      </w:pPr>
-      <w:r>
-        <w:rPr>
-          <w:rFonts w:ascii="Calibri" w:cs="Calibri" w:eastAsia="Calibri" w:hAnsi="Calibri"/>
-        </w:rPr>
-        <w:t>{%p if control_valve_type == "motorised" %}</w:t>
-      </w:r>
-    </w:p>
-    <w:p>
-      <w:pPr>
-        <w:pStyle w:val="ListParagraph"/>
-        <w:numPr>
-          <w:ilvl w:val="0"/>
-          <w:numId w:val="2"/>
-        </w:numPr>
-        <w:spacing w:after="40" w:before="40" w:line="280"/>
-      </w:pPr>
-      <w:r>
-        <w:rPr>
-          <w:rFonts w:ascii="Calibri" w:cs="Calibri" w:eastAsia="Calibri" w:hAnsi="Calibri"/>
-          <w:sz w:val="22"/>
-          <w:szCs w:val="22"/>
-        </w:rPr>
-        <w:t>MOTORISED CONTROL VALVE</w:t>
-      </w:r>
-    </w:p>
-    <w:p>
-      <w:pPr>
-        <w:spacing w:after="60" w:before="60" w:line="300"/>
-        <w:jc w:val="left"/>
-      </w:pPr>
-      <w:r>
-        <w:rPr>
-          <w:rFonts w:ascii="Calibri" w:cs="Calibri" w:eastAsia="Calibri" w:hAnsi="Calibri"/>
-        </w:rPr>
-        <w:t xml:space="preserve">{%p else %}</w:t>
-      </w:r>
-    </w:p>
-    <w:p>
-      <w:pPr>
-        <w:pStyle w:val="ListParagraph"/>
-        <w:numPr>
-          <w:ilvl w:val="0"/>
-          <w:numId w:val="2"/>
-        </w:numPr>
-        <w:spacing w:after="40" w:before="40" w:line="280"/>
-      </w:pPr>
-      <w:r>
-        <w:rPr>
-          <w:rFonts w:ascii="Calibri" w:cs="Calibri" w:eastAsia="Calibri" w:hAnsi="Calibri"/>
-          <w:sz w:val="22"/>
-          <w:szCs w:val="22"/>
-        </w:rPr>
-        <w:t>PNEUMATIC CONTROL VALVE</w:t>
-      </w:r>
-    </w:p>
-    <w:p>
-      <w:pPr>
-        <w:spacing w:after="60" w:before="60" w:line="300"/>
-        <w:jc w:val="left"/>
-      </w:pPr>
-      <w:r>
-        <w:rPr>
-          <w:rFonts w:ascii="Calibri" w:cs="Calibri" w:eastAsia="Calibri" w:hAnsi="Calibri"/>
-        </w:rPr>
-        <w:t xml:space="preserve">{%p endif %}</w:t>
-      </w:r>
-    </w:p>
-    <w:p>
-      <w:pPr>
-        <w:spacing w:after="60" w:before="60" w:line="300"/>
-        <w:jc w:val="left"/>
-      </w:pPr>
-      <w:r>
-        <w:rPr>
-          <w:rFonts w:ascii="Calibri" w:cs="Calibri" w:eastAsia="Calibri" w:hAnsi="Calibri"/>
-        </w:rPr>
-        <w:t xml:space="preserve">{%p endif %}</w:t>
+        <w:t xml:space="preserve">{%p endfor %}</w:t>
       </w:r>
     </w:p>
     <w:p>

</xml_diff>

<commit_message>
fix: Make List now driven by STATIC_MAKE_LIST (was hardcoded in template)
The template's Make List table had 27 hardcoded data rows with old
vendor values (WIKA for pressure gauge, MADAS for pneumatic CV, LINEAR
for UV sensor, etc.) — that's why edits to STATIC_MAKE_LIST in
quote_writer.py never reached the offer.

Also fixed _append_make_list's header detection: it was looking for
'ITEM' / 'MAKE' in uppercase but the template header is 'Item' / 'Make'
in title case, so the appender never even found the table.

Now:
- Template Make List table keeps only the header row.
- _append_make_list matches header case-insensitively.
- STATIC_MAKE_LIST (with HGURU/BAUMER, MADAS/SWITZER, DEMBLA/AIRA,
  ENCON/KRATOS, DPT, GEARED MOTOR MECHANISM etc.) populates every
  data row.

Co-Authored-By: Claude Opus 4.7 (1M context) <noreply@anthropic.com>
</commit_message>
<xml_diff>
--- a/Offer_Template.docx
+++ b/Offer_Template.docx
@@ -15198,2787 +15198,6 @@
                 <w:szCs w:val="22"/>
               </w:rPr>
               <w:t xml:space="preserve">Make</w:t>
-            </w:r>
-          </w:p>
-        </w:tc>
-      </w:tr>
-      <w:tr>
-        <w:tc>
-          <w:tcPr>
-            <w:tcW w:type="dxa" w:w="780"/>
-            <w:tcBorders>
-              <w:top w:val="single" w:color="BFBFBF" w:sz="4"/>
-              <w:left w:val="single" w:color="BFBFBF" w:sz="4"/>
-              <w:bottom w:val="single" w:color="BFBFBF" w:sz="4"/>
-              <w:right w:val="single" w:color="BFBFBF" w:sz="4"/>
-            </w:tcBorders>
-            <w:shd w:fill="F3F4F6" w:val="clear"/>
-            <w:tcMar>
-              <w:top w:type="dxa" w:w="100"/>
-              <w:left w:type="dxa" w:w="140"/>
-              <w:bottom w:type="dxa" w:w="100"/>
-              <w:right w:type="dxa" w:w="140"/>
-            </w:tcMar>
-            <w:vAlign w:val="center"/>
-          </w:tcPr>
-          <w:p>
-            <w:pPr>
-              <w:spacing w:after="40" w:before="40"/>
-              <w:jc w:val="center"/>
-            </w:pPr>
-            <w:r>
-              <w:rPr>
-                <w:rFonts w:ascii="Calibri" w:cs="Calibri" w:eastAsia="Calibri" w:hAnsi="Calibri"/>
-                <w:sz w:val="22"/>
-                <w:szCs w:val="22"/>
-              </w:rPr>
-              <w:t xml:space="preserve">1</w:t>
-            </w:r>
-          </w:p>
-        </w:tc>
-        <w:tc>
-          <w:tcPr>
-            <w:tcW w:type="dxa" w:w="4880"/>
-            <w:tcBorders>
-              <w:top w:val="single" w:color="BFBFBF" w:sz="4"/>
-              <w:left w:val="single" w:color="BFBFBF" w:sz="4"/>
-              <w:bottom w:val="single" w:color="BFBFBF" w:sz="4"/>
-              <w:right w:val="single" w:color="BFBFBF" w:sz="4"/>
-            </w:tcBorders>
-            <w:shd w:fill="F3F4F6" w:val="clear"/>
-            <w:tcMar>
-              <w:top w:type="dxa" w:w="100"/>
-              <w:left w:type="dxa" w:w="140"/>
-              <w:bottom w:type="dxa" w:w="100"/>
-              <w:right w:type="dxa" w:w="140"/>
-            </w:tcMar>
-            <w:vAlign w:val="center"/>
-          </w:tcPr>
-          <w:p>
-            <w:pPr>
-              <w:spacing w:after="40" w:before="40"/>
-              <w:jc w:val="left"/>
-            </w:pPr>
-            <w:r>
-              <w:rPr>
-                <w:rFonts w:ascii="Calibri" w:cs="Calibri" w:eastAsia="Calibri" w:hAnsi="Calibri"/>
-                <w:b/>
-                <w:bCs/>
-                <w:sz w:val="22"/>
-                <w:szCs w:val="22"/>
-              </w:rPr>
-              <w:t xml:space="preserve">Mild Steel</w:t>
-            </w:r>
-          </w:p>
-        </w:tc>
-        <w:tc>
-          <w:tcPr>
-            <w:tcW w:type="dxa" w:w="3700"/>
-            <w:tcBorders>
-              <w:top w:val="single" w:color="BFBFBF" w:sz="4"/>
-              <w:left w:val="single" w:color="BFBFBF" w:sz="4"/>
-              <w:bottom w:val="single" w:color="BFBFBF" w:sz="4"/>
-              <w:right w:val="single" w:color="BFBFBF" w:sz="4"/>
-            </w:tcBorders>
-            <w:shd w:fill="F3F4F6" w:val="clear"/>
-            <w:tcMar>
-              <w:top w:type="dxa" w:w="100"/>
-              <w:left w:type="dxa" w:w="140"/>
-              <w:bottom w:type="dxa" w:w="100"/>
-              <w:right w:type="dxa" w:w="140"/>
-            </w:tcMar>
-            <w:vAlign w:val="center"/>
-          </w:tcPr>
-          <w:p>
-            <w:pPr>
-              <w:spacing w:after="40" w:before="40"/>
-              <w:jc w:val="left"/>
-            </w:pPr>
-            <w:r>
-              <w:rPr>
-                <w:rFonts w:ascii="Calibri" w:cs="Calibri" w:eastAsia="Calibri" w:hAnsi="Calibri"/>
-                <w:sz w:val="22"/>
-                <w:szCs w:val="22"/>
-              </w:rPr>
-              <w:t xml:space="preserve">SAIL, Jindal</w:t>
-            </w:r>
-          </w:p>
-        </w:tc>
-      </w:tr>
-      <w:tr>
-        <w:tc>
-          <w:tcPr>
-            <w:tcW w:type="dxa" w:w="780"/>
-            <w:tcBorders>
-              <w:top w:val="single" w:color="BFBFBF" w:sz="4"/>
-              <w:left w:val="single" w:color="BFBFBF" w:sz="4"/>
-              <w:bottom w:val="single" w:color="BFBFBF" w:sz="4"/>
-              <w:right w:val="single" w:color="BFBFBF" w:sz="4"/>
-            </w:tcBorders>
-            <w:shd w:fill="FFFFFF" w:val="clear"/>
-            <w:tcMar>
-              <w:top w:type="dxa" w:w="100"/>
-              <w:left w:type="dxa" w:w="140"/>
-              <w:bottom w:type="dxa" w:w="100"/>
-              <w:right w:type="dxa" w:w="140"/>
-            </w:tcMar>
-            <w:vAlign w:val="center"/>
-          </w:tcPr>
-          <w:p>
-            <w:pPr>
-              <w:spacing w:after="40" w:before="40"/>
-              <w:jc w:val="center"/>
-            </w:pPr>
-            <w:r>
-              <w:rPr>
-                <w:rFonts w:ascii="Calibri" w:cs="Calibri" w:eastAsia="Calibri" w:hAnsi="Calibri"/>
-                <w:sz w:val="22"/>
-                <w:szCs w:val="22"/>
-              </w:rPr>
-              <w:t xml:space="preserve">2</w:t>
-            </w:r>
-          </w:p>
-        </w:tc>
-        <w:tc>
-          <w:tcPr>
-            <w:tcW w:type="dxa" w:w="4880"/>
-            <w:tcBorders>
-              <w:top w:val="single" w:color="BFBFBF" w:sz="4"/>
-              <w:left w:val="single" w:color="BFBFBF" w:sz="4"/>
-              <w:bottom w:val="single" w:color="BFBFBF" w:sz="4"/>
-              <w:right w:val="single" w:color="BFBFBF" w:sz="4"/>
-            </w:tcBorders>
-            <w:shd w:fill="FFFFFF" w:val="clear"/>
-            <w:tcMar>
-              <w:top w:type="dxa" w:w="100"/>
-              <w:left w:type="dxa" w:w="140"/>
-              <w:bottom w:type="dxa" w:w="100"/>
-              <w:right w:type="dxa" w:w="140"/>
-            </w:tcMar>
-            <w:vAlign w:val="center"/>
-          </w:tcPr>
-          <w:p>
-            <w:pPr>
-              <w:spacing w:after="40" w:before="40"/>
-              <w:jc w:val="left"/>
-            </w:pPr>
-            <w:r>
-              <w:rPr>
-                <w:rFonts w:ascii="Calibri" w:cs="Calibri" w:eastAsia="Calibri" w:hAnsi="Calibri"/>
-                <w:b/>
-                <w:bCs/>
-                <w:sz w:val="22"/>
-                <w:szCs w:val="22"/>
-              </w:rPr>
-              <w:t xml:space="preserve">Pressure Gauge with TNV</w:t>
-            </w:r>
-          </w:p>
-        </w:tc>
-        <w:tc>
-          <w:tcPr>
-            <w:tcW w:type="dxa" w:w="3700"/>
-            <w:tcBorders>
-              <w:top w:val="single" w:color="BFBFBF" w:sz="4"/>
-              <w:left w:val="single" w:color="BFBFBF" w:sz="4"/>
-              <w:bottom w:val="single" w:color="BFBFBF" w:sz="4"/>
-              <w:right w:val="single" w:color="BFBFBF" w:sz="4"/>
-            </w:tcBorders>
-            <w:shd w:fill="FFFFFF" w:val="clear"/>
-            <w:tcMar>
-              <w:top w:type="dxa" w:w="100"/>
-              <w:left w:type="dxa" w:w="140"/>
-              <w:bottom w:type="dxa" w:w="100"/>
-              <w:right w:type="dxa" w:w="140"/>
-            </w:tcMar>
-            <w:vAlign w:val="center"/>
-          </w:tcPr>
-          <w:p>
-            <w:pPr>
-              <w:spacing w:after="40" w:before="40"/>
-              <w:jc w:val="left"/>
-            </w:pPr>
-            <w:r>
-              <w:rPr>
-                <w:rFonts w:ascii="Calibri" w:cs="Calibri" w:eastAsia="Calibri" w:hAnsi="Calibri"/>
-                <w:sz w:val="22"/>
-                <w:szCs w:val="22"/>
-              </w:rPr>
-              <w:t xml:space="preserve">WIKA</w:t>
-            </w:r>
-          </w:p>
-        </w:tc>
-      </w:tr>
-      <w:tr>
-        <w:tc>
-          <w:tcPr>
-            <w:tcW w:type="dxa" w:w="780"/>
-            <w:tcBorders>
-              <w:top w:val="single" w:color="BFBFBF" w:sz="4"/>
-              <w:left w:val="single" w:color="BFBFBF" w:sz="4"/>
-              <w:bottom w:val="single" w:color="BFBFBF" w:sz="4"/>
-              <w:right w:val="single" w:color="BFBFBF" w:sz="4"/>
-            </w:tcBorders>
-            <w:shd w:fill="F3F4F6" w:val="clear"/>
-            <w:tcMar>
-              <w:top w:type="dxa" w:w="100"/>
-              <w:left w:type="dxa" w:w="140"/>
-              <w:bottom w:type="dxa" w:w="100"/>
-              <w:right w:type="dxa" w:w="140"/>
-            </w:tcMar>
-            <w:vAlign w:val="center"/>
-          </w:tcPr>
-          <w:p>
-            <w:pPr>
-              <w:spacing w:after="40" w:before="40"/>
-              <w:jc w:val="center"/>
-            </w:pPr>
-            <w:r>
-              <w:rPr>
-                <w:rFonts w:ascii="Calibri" w:cs="Calibri" w:eastAsia="Calibri" w:hAnsi="Calibri"/>
-                <w:sz w:val="22"/>
-                <w:szCs w:val="22"/>
-              </w:rPr>
-              <w:t xml:space="preserve">3</w:t>
-            </w:r>
-          </w:p>
-        </w:tc>
-        <w:tc>
-          <w:tcPr>
-            <w:tcW w:type="dxa" w:w="4880"/>
-            <w:tcBorders>
-              <w:top w:val="single" w:color="BFBFBF" w:sz="4"/>
-              <w:left w:val="single" w:color="BFBFBF" w:sz="4"/>
-              <w:bottom w:val="single" w:color="BFBFBF" w:sz="4"/>
-              <w:right w:val="single" w:color="BFBFBF" w:sz="4"/>
-            </w:tcBorders>
-            <w:shd w:fill="F3F4F6" w:val="clear"/>
-            <w:tcMar>
-              <w:top w:type="dxa" w:w="100"/>
-              <w:left w:type="dxa" w:w="140"/>
-              <w:bottom w:type="dxa" w:w="100"/>
-              <w:right w:type="dxa" w:w="140"/>
-            </w:tcMar>
-            <w:vAlign w:val="center"/>
-          </w:tcPr>
-          <w:p>
-            <w:pPr>
-              <w:spacing w:after="40" w:before="40"/>
-              <w:jc w:val="left"/>
-            </w:pPr>
-            <w:r>
-              <w:rPr>
-                <w:rFonts w:ascii="Calibri" w:cs="Calibri" w:eastAsia="Calibri" w:hAnsi="Calibri"/>
-                <w:b/>
-                <w:bCs/>
-                <w:sz w:val="22"/>
-                <w:szCs w:val="22"/>
-              </w:rPr>
-              <w:t xml:space="preserve">Pressure Switch</w:t>
-            </w:r>
-          </w:p>
-        </w:tc>
-        <w:tc>
-          <w:tcPr>
-            <w:tcW w:type="dxa" w:w="3700"/>
-            <w:tcBorders>
-              <w:top w:val="single" w:color="BFBFBF" w:sz="4"/>
-              <w:left w:val="single" w:color="BFBFBF" w:sz="4"/>
-              <w:bottom w:val="single" w:color="BFBFBF" w:sz="4"/>
-              <w:right w:val="single" w:color="BFBFBF" w:sz="4"/>
-            </w:tcBorders>
-            <w:shd w:fill="F3F4F6" w:val="clear"/>
-            <w:tcMar>
-              <w:top w:type="dxa" w:w="100"/>
-              <w:left w:type="dxa" w:w="140"/>
-              <w:bottom w:type="dxa" w:w="100"/>
-              <w:right w:type="dxa" w:w="140"/>
-            </w:tcMar>
-            <w:vAlign w:val="center"/>
-          </w:tcPr>
-          <w:p>
-            <w:pPr>
-              <w:spacing w:after="40" w:before="40"/>
-              <w:jc w:val="left"/>
-            </w:pPr>
-            <w:r>
-              <w:rPr>
-                <w:rFonts w:ascii="Calibri" w:cs="Calibri" w:eastAsia="Calibri" w:hAnsi="Calibri"/>
-                <w:sz w:val="22"/>
-                <w:szCs w:val="22"/>
-              </w:rPr>
-              <w:t xml:space="preserve">MADAS</w:t>
-            </w:r>
-          </w:p>
-        </w:tc>
-      </w:tr>
-      <w:tr>
-        <w:tc>
-          <w:tcPr>
-            <w:tcW w:type="dxa" w:w="780"/>
-            <w:tcBorders>
-              <w:top w:val="single" w:color="BFBFBF" w:sz="4"/>
-              <w:left w:val="single" w:color="BFBFBF" w:sz="4"/>
-              <w:bottom w:val="single" w:color="BFBFBF" w:sz="4"/>
-              <w:right w:val="single" w:color="BFBFBF" w:sz="4"/>
-            </w:tcBorders>
-            <w:shd w:fill="FFFFFF" w:val="clear"/>
-            <w:tcMar>
-              <w:top w:type="dxa" w:w="100"/>
-              <w:left w:type="dxa" w:w="140"/>
-              <w:bottom w:type="dxa" w:w="100"/>
-              <w:right w:type="dxa" w:w="140"/>
-            </w:tcMar>
-            <w:vAlign w:val="center"/>
-          </w:tcPr>
-          <w:p>
-            <w:pPr>
-              <w:spacing w:after="40" w:before="40"/>
-              <w:jc w:val="center"/>
-            </w:pPr>
-            <w:r>
-              <w:rPr>
-                <w:rFonts w:ascii="Calibri" w:cs="Calibri" w:eastAsia="Calibri" w:hAnsi="Calibri"/>
-                <w:sz w:val="22"/>
-                <w:szCs w:val="22"/>
-              </w:rPr>
-              <w:t xml:space="preserve">4</w:t>
-            </w:r>
-          </w:p>
-        </w:tc>
-        <w:tc>
-          <w:tcPr>
-            <w:tcW w:type="dxa" w:w="4880"/>
-            <w:tcBorders>
-              <w:top w:val="single" w:color="BFBFBF" w:sz="4"/>
-              <w:left w:val="single" w:color="BFBFBF" w:sz="4"/>
-              <w:bottom w:val="single" w:color="BFBFBF" w:sz="4"/>
-              <w:right w:val="single" w:color="BFBFBF" w:sz="4"/>
-            </w:tcBorders>
-            <w:shd w:fill="FFFFFF" w:val="clear"/>
-            <w:tcMar>
-              <w:top w:type="dxa" w:w="100"/>
-              <w:left w:type="dxa" w:w="140"/>
-              <w:bottom w:type="dxa" w:w="100"/>
-              <w:right w:type="dxa" w:w="140"/>
-            </w:tcMar>
-            <w:vAlign w:val="center"/>
-          </w:tcPr>
-          <w:p>
-            <w:pPr>
-              <w:spacing w:after="40" w:before="40"/>
-              <w:jc w:val="left"/>
-            </w:pPr>
-            <w:r>
-              <w:rPr>
-                <w:rFonts w:ascii="Calibri" w:cs="Calibri" w:eastAsia="Calibri" w:hAnsi="Calibri"/>
-                <w:b/>
-                <w:bCs/>
-                <w:sz w:val="22"/>
-                <w:szCs w:val="22"/>
-              </w:rPr>
-              <w:t xml:space="preserve">Ball Valve</w:t>
-            </w:r>
-          </w:p>
-        </w:tc>
-        <w:tc>
-          <w:tcPr>
-            <w:tcW w:type="dxa" w:w="3700"/>
-            <w:tcBorders>
-              <w:top w:val="single" w:color="BFBFBF" w:sz="4"/>
-              <w:left w:val="single" w:color="BFBFBF" w:sz="4"/>
-              <w:bottom w:val="single" w:color="BFBFBF" w:sz="4"/>
-              <w:right w:val="single" w:color="BFBFBF" w:sz="4"/>
-            </w:tcBorders>
-            <w:shd w:fill="FFFFFF" w:val="clear"/>
-            <w:tcMar>
-              <w:top w:type="dxa" w:w="100"/>
-              <w:left w:type="dxa" w:w="140"/>
-              <w:bottom w:type="dxa" w:w="100"/>
-              <w:right w:type="dxa" w:w="140"/>
-            </w:tcMar>
-            <w:vAlign w:val="center"/>
-          </w:tcPr>
-          <w:p>
-            <w:pPr>
-              <w:spacing w:after="40" w:before="40"/>
-              <w:jc w:val="left"/>
-            </w:pPr>
-            <w:r>
-              <w:rPr>
-                <w:rFonts w:ascii="Calibri" w:cs="Calibri" w:eastAsia="Calibri" w:hAnsi="Calibri"/>
-                <w:sz w:val="22"/>
-                <w:szCs w:val="22"/>
-              </w:rPr>
-              <w:t xml:space="preserve">AUDCO / L&amp;T / Leader</w:t>
-            </w:r>
-          </w:p>
-        </w:tc>
-      </w:tr>
-      <w:tr>
-        <w:tc>
-          <w:tcPr>
-            <w:tcW w:type="dxa" w:w="780"/>
-            <w:tcBorders>
-              <w:top w:val="single" w:color="BFBFBF" w:sz="4"/>
-              <w:left w:val="single" w:color="BFBFBF" w:sz="4"/>
-              <w:bottom w:val="single" w:color="BFBFBF" w:sz="4"/>
-              <w:right w:val="single" w:color="BFBFBF" w:sz="4"/>
-            </w:tcBorders>
-            <w:shd w:fill="F3F4F6" w:val="clear"/>
-            <w:tcMar>
-              <w:top w:type="dxa" w:w="100"/>
-              <w:left w:type="dxa" w:w="140"/>
-              <w:bottom w:type="dxa" w:w="100"/>
-              <w:right w:type="dxa" w:w="140"/>
-            </w:tcMar>
-            <w:vAlign w:val="center"/>
-          </w:tcPr>
-          <w:p>
-            <w:pPr>
-              <w:spacing w:after="40" w:before="40"/>
-              <w:jc w:val="center"/>
-            </w:pPr>
-            <w:r>
-              <w:rPr>
-                <w:rFonts w:ascii="Calibri" w:cs="Calibri" w:eastAsia="Calibri" w:hAnsi="Calibri"/>
-                <w:sz w:val="22"/>
-                <w:szCs w:val="22"/>
-              </w:rPr>
-              <w:t xml:space="preserve">5</w:t>
-            </w:r>
-          </w:p>
-        </w:tc>
-        <w:tc>
-          <w:tcPr>
-            <w:tcW w:type="dxa" w:w="4880"/>
-            <w:tcBorders>
-              <w:top w:val="single" w:color="BFBFBF" w:sz="4"/>
-              <w:left w:val="single" w:color="BFBFBF" w:sz="4"/>
-              <w:bottom w:val="single" w:color="BFBFBF" w:sz="4"/>
-              <w:right w:val="single" w:color="BFBFBF" w:sz="4"/>
-            </w:tcBorders>
-            <w:shd w:fill="F3F4F6" w:val="clear"/>
-            <w:tcMar>
-              <w:top w:type="dxa" w:w="100"/>
-              <w:left w:type="dxa" w:w="140"/>
-              <w:bottom w:type="dxa" w:w="100"/>
-              <w:right w:type="dxa" w:w="140"/>
-            </w:tcMar>
-            <w:vAlign w:val="center"/>
-          </w:tcPr>
-          <w:p>
-            <w:pPr>
-              <w:spacing w:after="40" w:before="40"/>
-              <w:jc w:val="left"/>
-            </w:pPr>
-            <w:r>
-              <w:rPr>
-                <w:rFonts w:ascii="Calibri" w:cs="Calibri" w:eastAsia="Calibri" w:hAnsi="Calibri"/>
-                <w:b/>
-                <w:bCs/>
-                <w:sz w:val="22"/>
-                <w:szCs w:val="22"/>
-              </w:rPr>
-              <w:t xml:space="preserve">Pneumatic Control Valve</w:t>
-            </w:r>
-          </w:p>
-        </w:tc>
-        <w:tc>
-          <w:tcPr>
-            <w:tcW w:type="dxa" w:w="3700"/>
-            <w:tcBorders>
-              <w:top w:val="single" w:color="BFBFBF" w:sz="4"/>
-              <w:left w:val="single" w:color="BFBFBF" w:sz="4"/>
-              <w:bottom w:val="single" w:color="BFBFBF" w:sz="4"/>
-              <w:right w:val="single" w:color="BFBFBF" w:sz="4"/>
-            </w:tcBorders>
-            <w:shd w:fill="F3F4F6" w:val="clear"/>
-            <w:tcMar>
-              <w:top w:type="dxa" w:w="100"/>
-              <w:left w:type="dxa" w:w="140"/>
-              <w:bottom w:type="dxa" w:w="100"/>
-              <w:right w:type="dxa" w:w="140"/>
-            </w:tcMar>
-            <w:vAlign w:val="center"/>
-          </w:tcPr>
-          <w:p>
-            <w:pPr>
-              <w:spacing w:after="40" w:before="40"/>
-              <w:jc w:val="left"/>
-            </w:pPr>
-            <w:r>
-              <w:rPr>
-                <w:rFonts w:ascii="Calibri" w:cs="Calibri" w:eastAsia="Calibri" w:hAnsi="Calibri"/>
-                <w:sz w:val="22"/>
-                <w:szCs w:val="22"/>
-              </w:rPr>
-              <w:t xml:space="preserve">MADAS</w:t>
-            </w:r>
-          </w:p>
-        </w:tc>
-      </w:tr>
-      <w:tr>
-        <w:tc>
-          <w:tcPr>
-            <w:tcW w:type="dxa" w:w="780"/>
-            <w:tcBorders>
-              <w:top w:val="single" w:color="BFBFBF" w:sz="4"/>
-              <w:left w:val="single" w:color="BFBFBF" w:sz="4"/>
-              <w:bottom w:val="single" w:color="BFBFBF" w:sz="4"/>
-              <w:right w:val="single" w:color="BFBFBF" w:sz="4"/>
-            </w:tcBorders>
-            <w:shd w:fill="FFFFFF" w:val="clear"/>
-            <w:tcMar>
-              <w:top w:type="dxa" w:w="100"/>
-              <w:left w:type="dxa" w:w="140"/>
-              <w:bottom w:type="dxa" w:w="100"/>
-              <w:right w:type="dxa" w:w="140"/>
-            </w:tcMar>
-            <w:vAlign w:val="center"/>
-          </w:tcPr>
-          <w:p>
-            <w:pPr>
-              <w:spacing w:after="40" w:before="40"/>
-              <w:jc w:val="center"/>
-            </w:pPr>
-            <w:r>
-              <w:rPr>
-                <w:rFonts w:ascii="Calibri" w:cs="Calibri" w:eastAsia="Calibri" w:hAnsi="Calibri"/>
-                <w:sz w:val="22"/>
-                <w:szCs w:val="22"/>
-              </w:rPr>
-              <w:t xml:space="preserve">6</w:t>
-            </w:r>
-          </w:p>
-        </w:tc>
-        <w:tc>
-          <w:tcPr>
-            <w:tcW w:type="dxa" w:w="4880"/>
-            <w:tcBorders>
-              <w:top w:val="single" w:color="BFBFBF" w:sz="4"/>
-              <w:left w:val="single" w:color="BFBFBF" w:sz="4"/>
-              <w:bottom w:val="single" w:color="BFBFBF" w:sz="4"/>
-              <w:right w:val="single" w:color="BFBFBF" w:sz="4"/>
-            </w:tcBorders>
-            <w:shd w:fill="FFFFFF" w:val="clear"/>
-            <w:tcMar>
-              <w:top w:type="dxa" w:w="100"/>
-              <w:left w:type="dxa" w:w="140"/>
-              <w:bottom w:type="dxa" w:w="100"/>
-              <w:right w:type="dxa" w:w="140"/>
-            </w:tcMar>
-            <w:vAlign w:val="center"/>
-          </w:tcPr>
-          <w:p>
-            <w:pPr>
-              <w:spacing w:after="40" w:before="40"/>
-              <w:jc w:val="left"/>
-            </w:pPr>
-            <w:r>
-              <w:rPr>
-                <w:rFonts w:ascii="Calibri" w:cs="Calibri" w:eastAsia="Calibri" w:hAnsi="Calibri"/>
-                <w:b/>
-                <w:bCs/>
-                <w:sz w:val="22"/>
-                <w:szCs w:val="22"/>
-              </w:rPr>
-              <w:t xml:space="preserve">Butterfly Valve</w:t>
-            </w:r>
-          </w:p>
-        </w:tc>
-        <w:tc>
-          <w:tcPr>
-            <w:tcW w:type="dxa" w:w="3700"/>
-            <w:tcBorders>
-              <w:top w:val="single" w:color="BFBFBF" w:sz="4"/>
-              <w:left w:val="single" w:color="BFBFBF" w:sz="4"/>
-              <w:bottom w:val="single" w:color="BFBFBF" w:sz="4"/>
-              <w:right w:val="single" w:color="BFBFBF" w:sz="4"/>
-            </w:tcBorders>
-            <w:shd w:fill="FFFFFF" w:val="clear"/>
-            <w:tcMar>
-              <w:top w:type="dxa" w:w="100"/>
-              <w:left w:type="dxa" w:w="140"/>
-              <w:bottom w:type="dxa" w:w="100"/>
-              <w:right w:type="dxa" w:w="140"/>
-            </w:tcMar>
-            <w:vAlign w:val="center"/>
-          </w:tcPr>
-          <w:p>
-            <w:pPr>
-              <w:spacing w:after="40" w:before="40"/>
-              <w:jc w:val="left"/>
-            </w:pPr>
-            <w:r>
-              <w:rPr>
-                <w:rFonts w:ascii="Calibri" w:cs="Calibri" w:eastAsia="Calibri" w:hAnsi="Calibri"/>
-                <w:sz w:val="22"/>
-                <w:szCs w:val="22"/>
-              </w:rPr>
-              <w:t xml:space="preserve">AUDCO / L&amp;T / Leader</w:t>
-            </w:r>
-          </w:p>
-        </w:tc>
-      </w:tr>
-      <w:tr>
-        <w:tc>
-          <w:tcPr>
-            <w:tcW w:type="dxa" w:w="780"/>
-            <w:tcBorders>
-              <w:top w:val="single" w:color="BFBFBF" w:sz="4"/>
-              <w:left w:val="single" w:color="BFBFBF" w:sz="4"/>
-              <w:bottom w:val="single" w:color="BFBFBF" w:sz="4"/>
-              <w:right w:val="single" w:color="BFBFBF" w:sz="4"/>
-            </w:tcBorders>
-            <w:shd w:fill="F3F4F6" w:val="clear"/>
-            <w:tcMar>
-              <w:top w:type="dxa" w:w="100"/>
-              <w:left w:type="dxa" w:w="140"/>
-              <w:bottom w:type="dxa" w:w="100"/>
-              <w:right w:type="dxa" w:w="140"/>
-            </w:tcMar>
-            <w:vAlign w:val="center"/>
-          </w:tcPr>
-          <w:p>
-            <w:pPr>
-              <w:spacing w:after="40" w:before="40"/>
-              <w:jc w:val="center"/>
-            </w:pPr>
-            <w:r>
-              <w:rPr>
-                <w:rFonts w:ascii="Calibri" w:cs="Calibri" w:eastAsia="Calibri" w:hAnsi="Calibri"/>
-                <w:sz w:val="22"/>
-                <w:szCs w:val="22"/>
-              </w:rPr>
-              <w:t xml:space="preserve">7</w:t>
-            </w:r>
-          </w:p>
-        </w:tc>
-        <w:tc>
-          <w:tcPr>
-            <w:tcW w:type="dxa" w:w="4880"/>
-            <w:tcBorders>
-              <w:top w:val="single" w:color="BFBFBF" w:sz="4"/>
-              <w:left w:val="single" w:color="BFBFBF" w:sz="4"/>
-              <w:bottom w:val="single" w:color="BFBFBF" w:sz="4"/>
-              <w:right w:val="single" w:color="BFBFBF" w:sz="4"/>
-            </w:tcBorders>
-            <w:shd w:fill="F3F4F6" w:val="clear"/>
-            <w:tcMar>
-              <w:top w:type="dxa" w:w="100"/>
-              <w:left w:type="dxa" w:w="140"/>
-              <w:bottom w:type="dxa" w:w="100"/>
-              <w:right w:type="dxa" w:w="140"/>
-            </w:tcMar>
-            <w:vAlign w:val="center"/>
-          </w:tcPr>
-          <w:p>
-            <w:pPr>
-              <w:spacing w:after="40" w:before="40"/>
-              <w:jc w:val="left"/>
-            </w:pPr>
-            <w:r>
-              <w:rPr>
-                <w:rFonts w:ascii="Calibri" w:cs="Calibri" w:eastAsia="Calibri" w:hAnsi="Calibri"/>
-                <w:b/>
-                <w:bCs/>
-                <w:sz w:val="22"/>
-                <w:szCs w:val="22"/>
-              </w:rPr>
-              <w:t xml:space="preserve">Rotary Joint</w:t>
-            </w:r>
-          </w:p>
-        </w:tc>
-        <w:tc>
-          <w:tcPr>
-            <w:tcW w:type="dxa" w:w="3700"/>
-            <w:tcBorders>
-              <w:top w:val="single" w:color="BFBFBF" w:sz="4"/>
-              <w:left w:val="single" w:color="BFBFBF" w:sz="4"/>
-              <w:bottom w:val="single" w:color="BFBFBF" w:sz="4"/>
-              <w:right w:val="single" w:color="BFBFBF" w:sz="4"/>
-            </w:tcBorders>
-            <w:shd w:fill="F3F4F6" w:val="clear"/>
-            <w:tcMar>
-              <w:top w:type="dxa" w:w="100"/>
-              <w:left w:type="dxa" w:w="140"/>
-              <w:bottom w:type="dxa" w:w="100"/>
-              <w:right w:type="dxa" w:w="140"/>
-            </w:tcMar>
-            <w:vAlign w:val="center"/>
-          </w:tcPr>
-          <w:p>
-            <w:pPr>
-              <w:spacing w:after="40" w:before="40"/>
-              <w:jc w:val="left"/>
-            </w:pPr>
-            <w:r>
-              <w:rPr>
-                <w:rFonts w:ascii="Calibri" w:cs="Calibri" w:eastAsia="Calibri" w:hAnsi="Calibri"/>
-                <w:sz w:val="22"/>
-                <w:szCs w:val="22"/>
-              </w:rPr>
-              <w:t xml:space="preserve">ENCON</w:t>
-            </w:r>
-          </w:p>
-        </w:tc>
-      </w:tr>
-      <w:tr>
-        <w:tc>
-          <w:tcPr>
-            <w:tcW w:type="dxa" w:w="780"/>
-            <w:tcBorders>
-              <w:top w:val="single" w:color="BFBFBF" w:sz="4"/>
-              <w:left w:val="single" w:color="BFBFBF" w:sz="4"/>
-              <w:bottom w:val="single" w:color="BFBFBF" w:sz="4"/>
-              <w:right w:val="single" w:color="BFBFBF" w:sz="4"/>
-            </w:tcBorders>
-            <w:shd w:fill="FFFFFF" w:val="clear"/>
-            <w:tcMar>
-              <w:top w:type="dxa" w:w="100"/>
-              <w:left w:type="dxa" w:w="140"/>
-              <w:bottom w:type="dxa" w:w="100"/>
-              <w:right w:type="dxa" w:w="140"/>
-            </w:tcMar>
-            <w:vAlign w:val="center"/>
-          </w:tcPr>
-          <w:p>
-            <w:pPr>
-              <w:spacing w:after="40" w:before="40"/>
-              <w:jc w:val="center"/>
-            </w:pPr>
-            <w:r>
-              <w:rPr>
-                <w:rFonts w:ascii="Calibri" w:cs="Calibri" w:eastAsia="Calibri" w:hAnsi="Calibri"/>
-                <w:sz w:val="22"/>
-                <w:szCs w:val="22"/>
-              </w:rPr>
-              <w:t xml:space="preserve">8</w:t>
-            </w:r>
-          </w:p>
-        </w:tc>
-        <w:tc>
-          <w:tcPr>
-            <w:tcW w:type="dxa" w:w="4880"/>
-            <w:tcBorders>
-              <w:top w:val="single" w:color="BFBFBF" w:sz="4"/>
-              <w:left w:val="single" w:color="BFBFBF" w:sz="4"/>
-              <w:bottom w:val="single" w:color="BFBFBF" w:sz="4"/>
-              <w:right w:val="single" w:color="BFBFBF" w:sz="4"/>
-            </w:tcBorders>
-            <w:shd w:fill="FFFFFF" w:val="clear"/>
-            <w:tcMar>
-              <w:top w:type="dxa" w:w="100"/>
-              <w:left w:type="dxa" w:w="140"/>
-              <w:bottom w:type="dxa" w:w="100"/>
-              <w:right w:type="dxa" w:w="140"/>
-            </w:tcMar>
-            <w:vAlign w:val="center"/>
-          </w:tcPr>
-          <w:p>
-            <w:pPr>
-              <w:spacing w:after="40" w:before="40"/>
-              <w:jc w:val="left"/>
-            </w:pPr>
-            <w:r>
-              <w:rPr>
-                <w:rFonts w:ascii="Calibri" w:cs="Calibri" w:eastAsia="Calibri" w:hAnsi="Calibri"/>
-                <w:b/>
-                <w:bCs/>
-                <w:sz w:val="22"/>
-                <w:szCs w:val="22"/>
-              </w:rPr>
-              <w:t xml:space="preserve">Mix Gas Train</w:t>
-            </w:r>
-          </w:p>
-        </w:tc>
-        <w:tc>
-          <w:tcPr>
-            <w:tcW w:type="dxa" w:w="3700"/>
-            <w:tcBorders>
-              <w:top w:val="single" w:color="BFBFBF" w:sz="4"/>
-              <w:left w:val="single" w:color="BFBFBF" w:sz="4"/>
-              <w:bottom w:val="single" w:color="BFBFBF" w:sz="4"/>
-              <w:right w:val="single" w:color="BFBFBF" w:sz="4"/>
-            </w:tcBorders>
-            <w:shd w:fill="FFFFFF" w:val="clear"/>
-            <w:tcMar>
-              <w:top w:type="dxa" w:w="100"/>
-              <w:left w:type="dxa" w:w="140"/>
-              <w:bottom w:type="dxa" w:w="100"/>
-              <w:right w:type="dxa" w:w="140"/>
-            </w:tcMar>
-            <w:vAlign w:val="center"/>
-          </w:tcPr>
-          <w:p>
-            <w:pPr>
-              <w:spacing w:after="40" w:before="40"/>
-              <w:jc w:val="left"/>
-            </w:pPr>
-            <w:r>
-              <w:rPr>
-                <w:rFonts w:ascii="Calibri" w:cs="Calibri" w:eastAsia="Calibri" w:hAnsi="Calibri"/>
-                <w:sz w:val="22"/>
-                <w:szCs w:val="22"/>
-              </w:rPr>
-              <w:t xml:space="preserve">MADAS</w:t>
-            </w:r>
-          </w:p>
-        </w:tc>
-      </w:tr>
-      <w:tr>
-        <w:tc>
-          <w:tcPr>
-            <w:tcW w:type="dxa" w:w="780"/>
-            <w:tcBorders>
-              <w:top w:val="single" w:color="BFBFBF" w:sz="4"/>
-              <w:left w:val="single" w:color="BFBFBF" w:sz="4"/>
-              <w:bottom w:val="single" w:color="BFBFBF" w:sz="4"/>
-              <w:right w:val="single" w:color="BFBFBF" w:sz="4"/>
-            </w:tcBorders>
-            <w:shd w:fill="F3F4F6" w:val="clear"/>
-            <w:tcMar>
-              <w:top w:type="dxa" w:w="100"/>
-              <w:left w:type="dxa" w:w="140"/>
-              <w:bottom w:type="dxa" w:w="100"/>
-              <w:right w:type="dxa" w:w="140"/>
-            </w:tcMar>
-            <w:vAlign w:val="center"/>
-          </w:tcPr>
-          <w:p>
-            <w:pPr>
-              <w:spacing w:after="40" w:before="40"/>
-              <w:jc w:val="center"/>
-            </w:pPr>
-            <w:r>
-              <w:rPr>
-                <w:rFonts w:ascii="Calibri" w:cs="Calibri" w:eastAsia="Calibri" w:hAnsi="Calibri"/>
-                <w:sz w:val="22"/>
-                <w:szCs w:val="22"/>
-              </w:rPr>
-              <w:t xml:space="preserve">9</w:t>
-            </w:r>
-          </w:p>
-        </w:tc>
-        <w:tc>
-          <w:tcPr>
-            <w:tcW w:type="dxa" w:w="4880"/>
-            <w:tcBorders>
-              <w:top w:val="single" w:color="BFBFBF" w:sz="4"/>
-              <w:left w:val="single" w:color="BFBFBF" w:sz="4"/>
-              <w:bottom w:val="single" w:color="BFBFBF" w:sz="4"/>
-              <w:right w:val="single" w:color="BFBFBF" w:sz="4"/>
-            </w:tcBorders>
-            <w:shd w:fill="F3F4F6" w:val="clear"/>
-            <w:tcMar>
-              <w:top w:type="dxa" w:w="100"/>
-              <w:left w:type="dxa" w:w="140"/>
-              <w:bottom w:type="dxa" w:w="100"/>
-              <w:right w:type="dxa" w:w="140"/>
-            </w:tcMar>
-            <w:vAlign w:val="center"/>
-          </w:tcPr>
-          <w:p>
-            <w:pPr>
-              <w:spacing w:after="40" w:before="40"/>
-              <w:jc w:val="left"/>
-            </w:pPr>
-            <w:r>
-              <w:rPr>
-                <w:rFonts w:ascii="Calibri" w:cs="Calibri" w:eastAsia="Calibri" w:hAnsi="Calibri"/>
-                <w:b/>
-                <w:bCs/>
-                <w:sz w:val="22"/>
-                <w:szCs w:val="22"/>
-              </w:rPr>
-              <w:t xml:space="preserve">Flexible Hose Pipe</w:t>
-            </w:r>
-          </w:p>
-        </w:tc>
-        <w:tc>
-          <w:tcPr>
-            <w:tcW w:type="dxa" w:w="3700"/>
-            <w:tcBorders>
-              <w:top w:val="single" w:color="BFBFBF" w:sz="4"/>
-              <w:left w:val="single" w:color="BFBFBF" w:sz="4"/>
-              <w:bottom w:val="single" w:color="BFBFBF" w:sz="4"/>
-              <w:right w:val="single" w:color="BFBFBF" w:sz="4"/>
-            </w:tcBorders>
-            <w:shd w:fill="F3F4F6" w:val="clear"/>
-            <w:tcMar>
-              <w:top w:type="dxa" w:w="100"/>
-              <w:left w:type="dxa" w:w="140"/>
-              <w:bottom w:type="dxa" w:w="100"/>
-              <w:right w:type="dxa" w:w="140"/>
-            </w:tcMar>
-            <w:vAlign w:val="center"/>
-          </w:tcPr>
-          <w:p>
-            <w:pPr>
-              <w:spacing w:after="40" w:before="40"/>
-              <w:jc w:val="left"/>
-            </w:pPr>
-            <w:r>
-              <w:rPr>
-                <w:rFonts w:ascii="Calibri" w:cs="Calibri" w:eastAsia="Calibri" w:hAnsi="Calibri"/>
-                <w:sz w:val="22"/>
-                <w:szCs w:val="22"/>
-              </w:rPr>
-              <w:t xml:space="preserve">BIL / Flexible</w:t>
-            </w:r>
-          </w:p>
-        </w:tc>
-      </w:tr>
-      <w:tr>
-        <w:tc>
-          <w:tcPr>
-            <w:tcW w:type="dxa" w:w="780"/>
-            <w:tcBorders>
-              <w:top w:val="single" w:color="BFBFBF" w:sz="4"/>
-              <w:left w:val="single" w:color="BFBFBF" w:sz="4"/>
-              <w:bottom w:val="single" w:color="BFBFBF" w:sz="4"/>
-              <w:right w:val="single" w:color="BFBFBF" w:sz="4"/>
-            </w:tcBorders>
-            <w:shd w:fill="FFFFFF" w:val="clear"/>
-            <w:tcMar>
-              <w:top w:type="dxa" w:w="100"/>
-              <w:left w:type="dxa" w:w="140"/>
-              <w:bottom w:type="dxa" w:w="100"/>
-              <w:right w:type="dxa" w:w="140"/>
-            </w:tcMar>
-            <w:vAlign w:val="center"/>
-          </w:tcPr>
-          <w:p>
-            <w:pPr>
-              <w:spacing w:after="40" w:before="40"/>
-              <w:jc w:val="center"/>
-            </w:pPr>
-            <w:r>
-              <w:rPr>
-                <w:rFonts w:ascii="Calibri" w:cs="Calibri" w:eastAsia="Calibri" w:hAnsi="Calibri"/>
-                <w:sz w:val="22"/>
-                <w:szCs w:val="22"/>
-              </w:rPr>
-              <w:t xml:space="preserve">10</w:t>
-            </w:r>
-          </w:p>
-        </w:tc>
-        <w:tc>
-          <w:tcPr>
-            <w:tcW w:type="dxa" w:w="4880"/>
-            <w:tcBorders>
-              <w:top w:val="single" w:color="BFBFBF" w:sz="4"/>
-              <w:left w:val="single" w:color="BFBFBF" w:sz="4"/>
-              <w:bottom w:val="single" w:color="BFBFBF" w:sz="4"/>
-              <w:right w:val="single" w:color="BFBFBF" w:sz="4"/>
-            </w:tcBorders>
-            <w:shd w:fill="FFFFFF" w:val="clear"/>
-            <w:tcMar>
-              <w:top w:type="dxa" w:w="100"/>
-              <w:left w:type="dxa" w:w="140"/>
-              <w:bottom w:type="dxa" w:w="100"/>
-              <w:right w:type="dxa" w:w="140"/>
-            </w:tcMar>
-            <w:vAlign w:val="center"/>
-          </w:tcPr>
-          <w:p>
-            <w:pPr>
-              <w:spacing w:after="40" w:before="40"/>
-              <w:jc w:val="left"/>
-            </w:pPr>
-            <w:r>
-              <w:rPr>
-                <w:rFonts w:ascii="Calibri" w:cs="Calibri" w:eastAsia="Calibri" w:hAnsi="Calibri"/>
-                <w:b/>
-                <w:bCs/>
-                <w:sz w:val="22"/>
-                <w:szCs w:val="22"/>
-              </w:rPr>
-              <w:t xml:space="preserve">Thermocouple</w:t>
-            </w:r>
-          </w:p>
-        </w:tc>
-        <w:tc>
-          <w:tcPr>
-            <w:tcW w:type="dxa" w:w="3700"/>
-            <w:tcBorders>
-              <w:top w:val="single" w:color="BFBFBF" w:sz="4"/>
-              <w:left w:val="single" w:color="BFBFBF" w:sz="4"/>
-              <w:bottom w:val="single" w:color="BFBFBF" w:sz="4"/>
-              <w:right w:val="single" w:color="BFBFBF" w:sz="4"/>
-            </w:tcBorders>
-            <w:shd w:fill="FFFFFF" w:val="clear"/>
-            <w:tcMar>
-              <w:top w:type="dxa" w:w="100"/>
-              <w:left w:type="dxa" w:w="140"/>
-              <w:bottom w:type="dxa" w:w="100"/>
-              <w:right w:type="dxa" w:w="140"/>
-            </w:tcMar>
-            <w:vAlign w:val="center"/>
-          </w:tcPr>
-          <w:p>
-            <w:pPr>
-              <w:spacing w:after="40" w:before="40"/>
-              <w:jc w:val="left"/>
-            </w:pPr>
-            <w:r>
-              <w:rPr>
-                <w:rFonts w:ascii="Calibri" w:cs="Calibri" w:eastAsia="Calibri" w:hAnsi="Calibri"/>
-                <w:sz w:val="22"/>
-                <w:szCs w:val="22"/>
-              </w:rPr>
-              <w:t xml:space="preserve">Tempsens</w:t>
-            </w:r>
-          </w:p>
-        </w:tc>
-      </w:tr>
-      <w:tr>
-        <w:tc>
-          <w:tcPr>
-            <w:tcW w:type="dxa" w:w="780"/>
-            <w:tcBorders>
-              <w:top w:val="single" w:color="BFBFBF" w:sz="4"/>
-              <w:left w:val="single" w:color="BFBFBF" w:sz="4"/>
-              <w:bottom w:val="single" w:color="BFBFBF" w:sz="4"/>
-              <w:right w:val="single" w:color="BFBFBF" w:sz="4"/>
-            </w:tcBorders>
-            <w:shd w:fill="F3F4F6" w:val="clear"/>
-            <w:tcMar>
-              <w:top w:type="dxa" w:w="100"/>
-              <w:left w:type="dxa" w:w="140"/>
-              <w:bottom w:type="dxa" w:w="100"/>
-              <w:right w:type="dxa" w:w="140"/>
-            </w:tcMar>
-            <w:vAlign w:val="center"/>
-          </w:tcPr>
-          <w:p>
-            <w:pPr>
-              <w:spacing w:after="40" w:before="40"/>
-              <w:jc w:val="center"/>
-            </w:pPr>
-            <w:r>
-              <w:rPr>
-                <w:rFonts w:ascii="Calibri" w:cs="Calibri" w:eastAsia="Calibri" w:hAnsi="Calibri"/>
-                <w:sz w:val="22"/>
-                <w:szCs w:val="22"/>
-              </w:rPr>
-              <w:t xml:space="preserve">11</w:t>
-            </w:r>
-          </w:p>
-        </w:tc>
-        <w:tc>
-          <w:tcPr>
-            <w:tcW w:type="dxa" w:w="4880"/>
-            <w:tcBorders>
-              <w:top w:val="single" w:color="BFBFBF" w:sz="4"/>
-              <w:left w:val="single" w:color="BFBFBF" w:sz="4"/>
-              <w:bottom w:val="single" w:color="BFBFBF" w:sz="4"/>
-              <w:right w:val="single" w:color="BFBFBF" w:sz="4"/>
-            </w:tcBorders>
-            <w:shd w:fill="F3F4F6" w:val="clear"/>
-            <w:tcMar>
-              <w:top w:type="dxa" w:w="100"/>
-              <w:left w:type="dxa" w:w="140"/>
-              <w:bottom w:type="dxa" w:w="100"/>
-              <w:right w:type="dxa" w:w="140"/>
-            </w:tcMar>
-            <w:vAlign w:val="center"/>
-          </w:tcPr>
-          <w:p>
-            <w:pPr>
-              <w:spacing w:after="40" w:before="40"/>
-              <w:jc w:val="left"/>
-            </w:pPr>
-            <w:r>
-              <w:rPr>
-                <w:rFonts w:ascii="Calibri" w:cs="Calibri" w:eastAsia="Calibri" w:hAnsi="Calibri"/>
-                <w:b/>
-                <w:bCs/>
-                <w:sz w:val="22"/>
-                <w:szCs w:val="22"/>
-              </w:rPr>
-              <w:t xml:space="preserve">Compensating Lead</w:t>
-            </w:r>
-          </w:p>
-        </w:tc>
-        <w:tc>
-          <w:tcPr>
-            <w:tcW w:type="dxa" w:w="3700"/>
-            <w:tcBorders>
-              <w:top w:val="single" w:color="BFBFBF" w:sz="4"/>
-              <w:left w:val="single" w:color="BFBFBF" w:sz="4"/>
-              <w:bottom w:val="single" w:color="BFBFBF" w:sz="4"/>
-              <w:right w:val="single" w:color="BFBFBF" w:sz="4"/>
-            </w:tcBorders>
-            <w:shd w:fill="F3F4F6" w:val="clear"/>
-            <w:tcMar>
-              <w:top w:type="dxa" w:w="100"/>
-              <w:left w:type="dxa" w:w="140"/>
-              <w:bottom w:type="dxa" w:w="100"/>
-              <w:right w:type="dxa" w:w="140"/>
-            </w:tcMar>
-            <w:vAlign w:val="center"/>
-          </w:tcPr>
-          <w:p>
-            <w:pPr>
-              <w:spacing w:after="40" w:before="40"/>
-              <w:jc w:val="left"/>
-            </w:pPr>
-            <w:r>
-              <w:rPr>
-                <w:rFonts w:ascii="Calibri" w:cs="Calibri" w:eastAsia="Calibri" w:hAnsi="Calibri"/>
-                <w:sz w:val="22"/>
-                <w:szCs w:val="22"/>
-              </w:rPr>
-              <w:t xml:space="preserve">Tempsens</w:t>
-            </w:r>
-          </w:p>
-        </w:tc>
-      </w:tr>
-      <w:tr>
-        <w:tc>
-          <w:tcPr>
-            <w:tcW w:type="dxa" w:w="780"/>
-            <w:tcBorders>
-              <w:top w:val="single" w:color="BFBFBF" w:sz="4"/>
-              <w:left w:val="single" w:color="BFBFBF" w:sz="4"/>
-              <w:bottom w:val="single" w:color="BFBFBF" w:sz="4"/>
-              <w:right w:val="single" w:color="BFBFBF" w:sz="4"/>
-            </w:tcBorders>
-            <w:shd w:fill="FFFFFF" w:val="clear"/>
-            <w:tcMar>
-              <w:top w:type="dxa" w:w="100"/>
-              <w:left w:type="dxa" w:w="140"/>
-              <w:bottom w:type="dxa" w:w="100"/>
-              <w:right w:type="dxa" w:w="140"/>
-            </w:tcMar>
-            <w:vAlign w:val="center"/>
-          </w:tcPr>
-          <w:p>
-            <w:pPr>
-              <w:spacing w:after="40" w:before="40"/>
-              <w:jc w:val="center"/>
-            </w:pPr>
-            <w:r>
-              <w:rPr>
-                <w:rFonts w:ascii="Calibri" w:cs="Calibri" w:eastAsia="Calibri" w:hAnsi="Calibri"/>
-                <w:sz w:val="22"/>
-                <w:szCs w:val="22"/>
-              </w:rPr>
-              <w:t xml:space="preserve">12</w:t>
-            </w:r>
-          </w:p>
-        </w:tc>
-        <w:tc>
-          <w:tcPr>
-            <w:tcW w:type="dxa" w:w="4880"/>
-            <w:tcBorders>
-              <w:top w:val="single" w:color="BFBFBF" w:sz="4"/>
-              <w:left w:val="single" w:color="BFBFBF" w:sz="4"/>
-              <w:bottom w:val="single" w:color="BFBFBF" w:sz="4"/>
-              <w:right w:val="single" w:color="BFBFBF" w:sz="4"/>
-            </w:tcBorders>
-            <w:shd w:fill="FFFFFF" w:val="clear"/>
-            <w:tcMar>
-              <w:top w:type="dxa" w:w="100"/>
-              <w:left w:type="dxa" w:w="140"/>
-              <w:bottom w:type="dxa" w:w="100"/>
-              <w:right w:type="dxa" w:w="140"/>
-            </w:tcMar>
-            <w:vAlign w:val="center"/>
-          </w:tcPr>
-          <w:p>
-            <w:pPr>
-              <w:spacing w:after="40" w:before="40"/>
-              <w:jc w:val="left"/>
-            </w:pPr>
-            <w:r>
-              <w:rPr>
-                <w:rFonts w:ascii="Calibri" w:cs="Calibri" w:eastAsia="Calibri" w:hAnsi="Calibri"/>
-                <w:b/>
-                <w:bCs/>
-                <w:sz w:val="22"/>
-                <w:szCs w:val="22"/>
-              </w:rPr>
-              <w:t xml:space="preserve">Limit Switches</w:t>
-            </w:r>
-          </w:p>
-        </w:tc>
-        <w:tc>
-          <w:tcPr>
-            <w:tcW w:type="dxa" w:w="3700"/>
-            <w:tcBorders>
-              <w:top w:val="single" w:color="BFBFBF" w:sz="4"/>
-              <w:left w:val="single" w:color="BFBFBF" w:sz="4"/>
-              <w:bottom w:val="single" w:color="BFBFBF" w:sz="4"/>
-              <w:right w:val="single" w:color="BFBFBF" w:sz="4"/>
-            </w:tcBorders>
-            <w:shd w:fill="FFFFFF" w:val="clear"/>
-            <w:tcMar>
-              <w:top w:type="dxa" w:w="100"/>
-              <w:left w:type="dxa" w:w="140"/>
-              <w:bottom w:type="dxa" w:w="100"/>
-              <w:right w:type="dxa" w:w="140"/>
-            </w:tcMar>
-            <w:vAlign w:val="center"/>
-          </w:tcPr>
-          <w:p>
-            <w:pPr>
-              <w:spacing w:after="40" w:before="40"/>
-              <w:jc w:val="left"/>
-            </w:pPr>
-            <w:r>
-              <w:rPr>
-                <w:rFonts w:ascii="Calibri" w:cs="Calibri" w:eastAsia="Calibri" w:hAnsi="Calibri"/>
-                <w:sz w:val="22"/>
-                <w:szCs w:val="22"/>
-              </w:rPr>
-              <w:t xml:space="preserve">BCH</w:t>
-            </w:r>
-          </w:p>
-        </w:tc>
-      </w:tr>
-      <w:tr>
-        <w:tc>
-          <w:tcPr>
-            <w:tcW w:type="dxa" w:w="780"/>
-            <w:tcBorders>
-              <w:top w:val="single" w:color="BFBFBF" w:sz="4"/>
-              <w:left w:val="single" w:color="BFBFBF" w:sz="4"/>
-              <w:bottom w:val="single" w:color="BFBFBF" w:sz="4"/>
-              <w:right w:val="single" w:color="BFBFBF" w:sz="4"/>
-            </w:tcBorders>
-            <w:shd w:fill="F3F4F6" w:val="clear"/>
-            <w:tcMar>
-              <w:top w:type="dxa" w:w="100"/>
-              <w:left w:type="dxa" w:w="140"/>
-              <w:bottom w:type="dxa" w:w="100"/>
-              <w:right w:type="dxa" w:w="140"/>
-            </w:tcMar>
-            <w:vAlign w:val="center"/>
-          </w:tcPr>
-          <w:p>
-            <w:pPr>
-              <w:spacing w:after="40" w:before="40"/>
-              <w:jc w:val="center"/>
-            </w:pPr>
-            <w:r>
-              <w:rPr>
-                <w:rFonts w:ascii="Calibri" w:cs="Calibri" w:eastAsia="Calibri" w:hAnsi="Calibri"/>
-                <w:sz w:val="22"/>
-                <w:szCs w:val="22"/>
-              </w:rPr>
-              <w:t xml:space="preserve">13</w:t>
-            </w:r>
-          </w:p>
-        </w:tc>
-        <w:tc>
-          <w:tcPr>
-            <w:tcW w:type="dxa" w:w="4880"/>
-            <w:tcBorders>
-              <w:top w:val="single" w:color="BFBFBF" w:sz="4"/>
-              <w:left w:val="single" w:color="BFBFBF" w:sz="4"/>
-              <w:bottom w:val="single" w:color="BFBFBF" w:sz="4"/>
-              <w:right w:val="single" w:color="BFBFBF" w:sz="4"/>
-            </w:tcBorders>
-            <w:shd w:fill="F3F4F6" w:val="clear"/>
-            <w:tcMar>
-              <w:top w:type="dxa" w:w="100"/>
-              <w:left w:type="dxa" w:w="140"/>
-              <w:bottom w:type="dxa" w:w="100"/>
-              <w:right w:type="dxa" w:w="140"/>
-            </w:tcMar>
-            <w:vAlign w:val="center"/>
-          </w:tcPr>
-          <w:p>
-            <w:pPr>
-              <w:spacing w:after="40" w:before="40"/>
-              <w:jc w:val="left"/>
-            </w:pPr>
-            <w:r>
-              <w:rPr>
-                <w:rFonts w:ascii="Calibri" w:cs="Calibri" w:eastAsia="Calibri" w:hAnsi="Calibri"/>
-                <w:b/>
-                <w:bCs/>
-                <w:sz w:val="22"/>
-                <w:szCs w:val="22"/>
-              </w:rPr>
-              <w:t xml:space="preserve">Control Panel</w:t>
-            </w:r>
-          </w:p>
-        </w:tc>
-        <w:tc>
-          <w:tcPr>
-            <w:tcW w:type="dxa" w:w="3700"/>
-            <w:tcBorders>
-              <w:top w:val="single" w:color="BFBFBF" w:sz="4"/>
-              <w:left w:val="single" w:color="BFBFBF" w:sz="4"/>
-              <w:bottom w:val="single" w:color="BFBFBF" w:sz="4"/>
-              <w:right w:val="single" w:color="BFBFBF" w:sz="4"/>
-            </w:tcBorders>
-            <w:shd w:fill="F3F4F6" w:val="clear"/>
-            <w:tcMar>
-              <w:top w:type="dxa" w:w="100"/>
-              <w:left w:type="dxa" w:w="140"/>
-              <w:bottom w:type="dxa" w:w="100"/>
-              <w:right w:type="dxa" w:w="140"/>
-            </w:tcMar>
-            <w:vAlign w:val="center"/>
-          </w:tcPr>
-          <w:p>
-            <w:pPr>
-              <w:spacing w:after="40" w:before="40"/>
-              <w:jc w:val="left"/>
-            </w:pPr>
-            <w:r>
-              <w:rPr>
-                <w:rFonts w:ascii="Calibri" w:cs="Calibri" w:eastAsia="Calibri" w:hAnsi="Calibri"/>
-                <w:sz w:val="22"/>
-                <w:szCs w:val="22"/>
-              </w:rPr>
-              <w:t xml:space="preserve">ENCON</w:t>
-            </w:r>
-          </w:p>
-        </w:tc>
-      </w:tr>
-      <w:tr>
-        <w:tc>
-          <w:tcPr>
-            <w:tcW w:type="dxa" w:w="780"/>
-            <w:tcBorders>
-              <w:top w:val="single" w:color="BFBFBF" w:sz="4"/>
-              <w:left w:val="single" w:color="BFBFBF" w:sz="4"/>
-              <w:bottom w:val="single" w:color="BFBFBF" w:sz="4"/>
-              <w:right w:val="single" w:color="BFBFBF" w:sz="4"/>
-            </w:tcBorders>
-            <w:shd w:fill="FFFFFF" w:val="clear"/>
-            <w:tcMar>
-              <w:top w:type="dxa" w:w="100"/>
-              <w:left w:type="dxa" w:w="140"/>
-              <w:bottom w:type="dxa" w:w="100"/>
-              <w:right w:type="dxa" w:w="140"/>
-            </w:tcMar>
-            <w:vAlign w:val="center"/>
-          </w:tcPr>
-          <w:p>
-            <w:pPr>
-              <w:spacing w:after="40" w:before="40"/>
-              <w:jc w:val="center"/>
-            </w:pPr>
-            <w:r>
-              <w:rPr>
-                <w:rFonts w:ascii="Calibri" w:cs="Calibri" w:eastAsia="Calibri" w:hAnsi="Calibri"/>
-                <w:sz w:val="22"/>
-                <w:szCs w:val="22"/>
-              </w:rPr>
-              <w:t xml:space="preserve">14</w:t>
-            </w:r>
-          </w:p>
-        </w:tc>
-        <w:tc>
-          <w:tcPr>
-            <w:tcW w:type="dxa" w:w="4880"/>
-            <w:tcBorders>
-              <w:top w:val="single" w:color="BFBFBF" w:sz="4"/>
-              <w:left w:val="single" w:color="BFBFBF" w:sz="4"/>
-              <w:bottom w:val="single" w:color="BFBFBF" w:sz="4"/>
-              <w:right w:val="single" w:color="BFBFBF" w:sz="4"/>
-            </w:tcBorders>
-            <w:shd w:fill="FFFFFF" w:val="clear"/>
-            <w:tcMar>
-              <w:top w:type="dxa" w:w="100"/>
-              <w:left w:type="dxa" w:w="140"/>
-              <w:bottom w:type="dxa" w:w="100"/>
-              <w:right w:type="dxa" w:w="140"/>
-            </w:tcMar>
-            <w:vAlign w:val="center"/>
-          </w:tcPr>
-          <w:p>
-            <w:pPr>
-              <w:spacing w:after="40" w:before="40"/>
-              <w:jc w:val="left"/>
-            </w:pPr>
-            <w:r>
-              <w:rPr>
-                <w:rFonts w:ascii="Calibri" w:cs="Calibri" w:eastAsia="Calibri" w:hAnsi="Calibri"/>
-                <w:b/>
-                <w:bCs/>
-                <w:sz w:val="22"/>
-                <w:szCs w:val="22"/>
-              </w:rPr>
-              <w:t xml:space="preserve">Hydraulic Power Pack &amp; Cylinder</w:t>
-            </w:r>
-          </w:p>
-        </w:tc>
-        <w:tc>
-          <w:tcPr>
-            <w:tcW w:type="dxa" w:w="3700"/>
-            <w:tcBorders>
-              <w:top w:val="single" w:color="BFBFBF" w:sz="4"/>
-              <w:left w:val="single" w:color="BFBFBF" w:sz="4"/>
-              <w:bottom w:val="single" w:color="BFBFBF" w:sz="4"/>
-              <w:right w:val="single" w:color="BFBFBF" w:sz="4"/>
-            </w:tcBorders>
-            <w:shd w:fill="FFFFFF" w:val="clear"/>
-            <w:tcMar>
-              <w:top w:type="dxa" w:w="100"/>
-              <w:left w:type="dxa" w:w="140"/>
-              <w:bottom w:type="dxa" w:w="100"/>
-              <w:right w:type="dxa" w:w="140"/>
-            </w:tcMar>
-            <w:vAlign w:val="center"/>
-          </w:tcPr>
-          <w:p>
-            <w:pPr>
-              <w:spacing w:after="40" w:before="40"/>
-              <w:jc w:val="left"/>
-            </w:pPr>
-            <w:r>
-              <w:rPr>
-                <w:rFonts w:ascii="Calibri" w:cs="Calibri" w:eastAsia="Calibri" w:hAnsi="Calibri"/>
-                <w:sz w:val="22"/>
-                <w:szCs w:val="22"/>
-              </w:rPr>
-              <w:t xml:space="preserve">Varitech</w:t>
-            </w:r>
-          </w:p>
-        </w:tc>
-      </w:tr>
-      <w:tr>
-        <w:tc>
-          <w:tcPr>
-            <w:tcW w:type="dxa" w:w="780"/>
-            <w:tcBorders>
-              <w:top w:val="single" w:color="BFBFBF" w:sz="4"/>
-              <w:left w:val="single" w:color="BFBFBF" w:sz="4"/>
-              <w:bottom w:val="single" w:color="BFBFBF" w:sz="4"/>
-              <w:right w:val="single" w:color="BFBFBF" w:sz="4"/>
-            </w:tcBorders>
-            <w:shd w:fill="F3F4F6" w:val="clear"/>
-            <w:tcMar>
-              <w:top w:type="dxa" w:w="100"/>
-              <w:left w:type="dxa" w:w="140"/>
-              <w:bottom w:type="dxa" w:w="100"/>
-              <w:right w:type="dxa" w:w="140"/>
-            </w:tcMar>
-            <w:vAlign w:val="center"/>
-          </w:tcPr>
-          <w:p>
-            <w:pPr>
-              <w:spacing w:after="40" w:before="40"/>
-              <w:jc w:val="center"/>
-            </w:pPr>
-            <w:r>
-              <w:rPr>
-                <w:rFonts w:ascii="Calibri" w:cs="Calibri" w:eastAsia="Calibri" w:hAnsi="Calibri"/>
-                <w:sz w:val="22"/>
-                <w:szCs w:val="22"/>
-              </w:rPr>
-              <w:t xml:space="preserve">15</w:t>
-            </w:r>
-          </w:p>
-        </w:tc>
-        <w:tc>
-          <w:tcPr>
-            <w:tcW w:type="dxa" w:w="4880"/>
-            <w:tcBorders>
-              <w:top w:val="single" w:color="BFBFBF" w:sz="4"/>
-              <w:left w:val="single" w:color="BFBFBF" w:sz="4"/>
-              <w:bottom w:val="single" w:color="BFBFBF" w:sz="4"/>
-              <w:right w:val="single" w:color="BFBFBF" w:sz="4"/>
-            </w:tcBorders>
-            <w:shd w:fill="F3F4F6" w:val="clear"/>
-            <w:tcMar>
-              <w:top w:type="dxa" w:w="100"/>
-              <w:left w:type="dxa" w:w="140"/>
-              <w:bottom w:type="dxa" w:w="100"/>
-              <w:right w:type="dxa" w:w="140"/>
-            </w:tcMar>
-            <w:vAlign w:val="center"/>
-          </w:tcPr>
-          <w:p>
-            <w:pPr>
-              <w:spacing w:after="40" w:before="40"/>
-              <w:jc w:val="left"/>
-            </w:pPr>
-            <w:r>
-              <w:rPr>
-                <w:rFonts w:ascii="Calibri" w:cs="Calibri" w:eastAsia="Calibri" w:hAnsi="Calibri"/>
-                <w:b/>
-                <w:bCs/>
-                <w:sz w:val="22"/>
-                <w:szCs w:val="22"/>
-              </w:rPr>
-              <w:t xml:space="preserve">Temperature Transmitter</w:t>
-            </w:r>
-          </w:p>
-        </w:tc>
-        <w:tc>
-          <w:tcPr>
-            <w:tcW w:type="dxa" w:w="3700"/>
-            <w:tcBorders>
-              <w:top w:val="single" w:color="BFBFBF" w:sz="4"/>
-              <w:left w:val="single" w:color="BFBFBF" w:sz="4"/>
-              <w:bottom w:val="single" w:color="BFBFBF" w:sz="4"/>
-              <w:right w:val="single" w:color="BFBFBF" w:sz="4"/>
-            </w:tcBorders>
-            <w:shd w:fill="F3F4F6" w:val="clear"/>
-            <w:tcMar>
-              <w:top w:type="dxa" w:w="100"/>
-              <w:left w:type="dxa" w:w="140"/>
-              <w:bottom w:type="dxa" w:w="100"/>
-              <w:right w:type="dxa" w:w="140"/>
-            </w:tcMar>
-            <w:vAlign w:val="center"/>
-          </w:tcPr>
-          <w:p>
-            <w:pPr>
-              <w:spacing w:after="40" w:before="40"/>
-              <w:jc w:val="left"/>
-            </w:pPr>
-            <w:r>
-              <w:rPr>
-                <w:rFonts w:ascii="Calibri" w:cs="Calibri" w:eastAsia="Calibri" w:hAnsi="Calibri"/>
-                <w:sz w:val="22"/>
-                <w:szCs w:val="22"/>
-              </w:rPr>
-              <w:t xml:space="preserve">Honeywell</w:t>
-            </w:r>
-          </w:p>
-        </w:tc>
-      </w:tr>
-      <w:tr>
-        <w:tc>
-          <w:tcPr>
-            <w:tcW w:type="dxa" w:w="780"/>
-            <w:tcBorders>
-              <w:top w:val="single" w:color="BFBFBF" w:sz="4"/>
-              <w:left w:val="single" w:color="BFBFBF" w:sz="4"/>
-              <w:bottom w:val="single" w:color="BFBFBF" w:sz="4"/>
-              <w:right w:val="single" w:color="BFBFBF" w:sz="4"/>
-            </w:tcBorders>
-            <w:shd w:fill="FFFFFF" w:val="clear"/>
-            <w:tcMar>
-              <w:top w:type="dxa" w:w="100"/>
-              <w:left w:type="dxa" w:w="140"/>
-              <w:bottom w:type="dxa" w:w="100"/>
-              <w:right w:type="dxa" w:w="140"/>
-            </w:tcMar>
-            <w:vAlign w:val="center"/>
-          </w:tcPr>
-          <w:p>
-            <w:pPr>
-              <w:spacing w:after="40" w:before="40"/>
-              <w:jc w:val="center"/>
-            </w:pPr>
-            <w:r>
-              <w:rPr>
-                <w:rFonts w:ascii="Calibri" w:cs="Calibri" w:eastAsia="Calibri" w:hAnsi="Calibri"/>
-                <w:sz w:val="22"/>
-                <w:szCs w:val="22"/>
-              </w:rPr>
-              <w:t xml:space="preserve">16</w:t>
-            </w:r>
-          </w:p>
-        </w:tc>
-        <w:tc>
-          <w:tcPr>
-            <w:tcW w:type="dxa" w:w="4880"/>
-            <w:tcBorders>
-              <w:top w:val="single" w:color="BFBFBF" w:sz="4"/>
-              <w:left w:val="single" w:color="BFBFBF" w:sz="4"/>
-              <w:bottom w:val="single" w:color="BFBFBF" w:sz="4"/>
-              <w:right w:val="single" w:color="BFBFBF" w:sz="4"/>
-            </w:tcBorders>
-            <w:shd w:fill="FFFFFF" w:val="clear"/>
-            <w:tcMar>
-              <w:top w:type="dxa" w:w="100"/>
-              <w:left w:type="dxa" w:w="140"/>
-              <w:bottom w:type="dxa" w:w="100"/>
-              <w:right w:type="dxa" w:w="140"/>
-            </w:tcMar>
-            <w:vAlign w:val="center"/>
-          </w:tcPr>
-          <w:p>
-            <w:pPr>
-              <w:spacing w:after="40" w:before="40"/>
-              <w:jc w:val="left"/>
-            </w:pPr>
-            <w:r>
-              <w:rPr>
-                <w:rFonts w:ascii="Calibri" w:cs="Calibri" w:eastAsia="Calibri" w:hAnsi="Calibri"/>
-                <w:b/>
-                <w:bCs/>
-                <w:sz w:val="22"/>
-                <w:szCs w:val="22"/>
-              </w:rPr>
-              <w:t xml:space="preserve">Burner</w:t>
-            </w:r>
-          </w:p>
-        </w:tc>
-        <w:tc>
-          <w:tcPr>
-            <w:tcW w:type="dxa" w:w="3700"/>
-            <w:tcBorders>
-              <w:top w:val="single" w:color="BFBFBF" w:sz="4"/>
-              <w:left w:val="single" w:color="BFBFBF" w:sz="4"/>
-              <w:bottom w:val="single" w:color="BFBFBF" w:sz="4"/>
-              <w:right w:val="single" w:color="BFBFBF" w:sz="4"/>
-            </w:tcBorders>
-            <w:shd w:fill="FFFFFF" w:val="clear"/>
-            <w:tcMar>
-              <w:top w:type="dxa" w:w="100"/>
-              <w:left w:type="dxa" w:w="140"/>
-              <w:bottom w:type="dxa" w:w="100"/>
-              <w:right w:type="dxa" w:w="140"/>
-            </w:tcMar>
-            <w:vAlign w:val="center"/>
-          </w:tcPr>
-          <w:p>
-            <w:pPr>
-              <w:spacing w:after="40" w:before="40"/>
-              <w:jc w:val="left"/>
-            </w:pPr>
-            <w:r>
-              <w:rPr>
-                <w:rFonts w:ascii="Calibri" w:cs="Calibri" w:eastAsia="Calibri" w:hAnsi="Calibri"/>
-                <w:sz w:val="22"/>
-                <w:szCs w:val="22"/>
-              </w:rPr>
-              <w:t xml:space="preserve">ENCON</w:t>
-            </w:r>
-          </w:p>
-        </w:tc>
-      </w:tr>
-      <w:tr>
-        <w:tc>
-          <w:tcPr>
-            <w:tcW w:type="dxa" w:w="780"/>
-            <w:tcBorders>
-              <w:top w:val="single" w:color="BFBFBF" w:sz="4"/>
-              <w:left w:val="single" w:color="BFBFBF" w:sz="4"/>
-              <w:bottom w:val="single" w:color="BFBFBF" w:sz="4"/>
-              <w:right w:val="single" w:color="BFBFBF" w:sz="4"/>
-            </w:tcBorders>
-            <w:shd w:fill="F3F4F6" w:val="clear"/>
-            <w:tcMar>
-              <w:top w:type="dxa" w:w="100"/>
-              <w:left w:type="dxa" w:w="140"/>
-              <w:bottom w:type="dxa" w:w="100"/>
-              <w:right w:type="dxa" w:w="140"/>
-            </w:tcMar>
-            <w:vAlign w:val="center"/>
-          </w:tcPr>
-          <w:p>
-            <w:pPr>
-              <w:spacing w:after="40" w:before="40"/>
-              <w:jc w:val="center"/>
-            </w:pPr>
-            <w:r>
-              <w:rPr>
-                <w:rFonts w:ascii="Calibri" w:cs="Calibri" w:eastAsia="Calibri" w:hAnsi="Calibri"/>
-                <w:sz w:val="22"/>
-                <w:szCs w:val="22"/>
-              </w:rPr>
-              <w:t xml:space="preserve">17</w:t>
-            </w:r>
-          </w:p>
-        </w:tc>
-        <w:tc>
-          <w:tcPr>
-            <w:tcW w:type="dxa" w:w="4880"/>
-            <w:tcBorders>
-              <w:top w:val="single" w:color="BFBFBF" w:sz="4"/>
-              <w:left w:val="single" w:color="BFBFBF" w:sz="4"/>
-              <w:bottom w:val="single" w:color="BFBFBF" w:sz="4"/>
-              <w:right w:val="single" w:color="BFBFBF" w:sz="4"/>
-            </w:tcBorders>
-            <w:shd w:fill="F3F4F6" w:val="clear"/>
-            <w:tcMar>
-              <w:top w:type="dxa" w:w="100"/>
-              <w:left w:type="dxa" w:w="140"/>
-              <w:bottom w:type="dxa" w:w="100"/>
-              <w:right w:type="dxa" w:w="140"/>
-            </w:tcMar>
-            <w:vAlign w:val="center"/>
-          </w:tcPr>
-          <w:p>
-            <w:pPr>
-              <w:spacing w:after="40" w:before="40"/>
-              <w:jc w:val="left"/>
-            </w:pPr>
-            <w:r>
-              <w:rPr>
-                <w:rFonts w:ascii="Calibri" w:cs="Calibri" w:eastAsia="Calibri" w:hAnsi="Calibri"/>
-                <w:b/>
-                <w:bCs/>
-                <w:sz w:val="22"/>
-                <w:szCs w:val="22"/>
-              </w:rPr>
-              <w:t xml:space="preserve">Pilot Burner</w:t>
-            </w:r>
-          </w:p>
-        </w:tc>
-        <w:tc>
-          <w:tcPr>
-            <w:tcW w:type="dxa" w:w="3700"/>
-            <w:tcBorders>
-              <w:top w:val="single" w:color="BFBFBF" w:sz="4"/>
-              <w:left w:val="single" w:color="BFBFBF" w:sz="4"/>
-              <w:bottom w:val="single" w:color="BFBFBF" w:sz="4"/>
-              <w:right w:val="single" w:color="BFBFBF" w:sz="4"/>
-            </w:tcBorders>
-            <w:shd w:fill="F3F4F6" w:val="clear"/>
-            <w:tcMar>
-              <w:top w:type="dxa" w:w="100"/>
-              <w:left w:type="dxa" w:w="140"/>
-              <w:bottom w:type="dxa" w:w="100"/>
-              <w:right w:type="dxa" w:w="140"/>
-            </w:tcMar>
-            <w:vAlign w:val="center"/>
-          </w:tcPr>
-          <w:p>
-            <w:pPr>
-              <w:spacing w:after="40" w:before="40"/>
-              <w:jc w:val="left"/>
-            </w:pPr>
-            <w:r>
-              <w:rPr>
-                <w:rFonts w:ascii="Calibri" w:cs="Calibri" w:eastAsia="Calibri" w:hAnsi="Calibri"/>
-                <w:sz w:val="22"/>
-                <w:szCs w:val="22"/>
-              </w:rPr>
-              <w:t xml:space="preserve">ENCON</w:t>
-            </w:r>
-          </w:p>
-        </w:tc>
-      </w:tr>
-      <w:tr>
-        <w:tc>
-          <w:tcPr>
-            <w:tcW w:type="dxa" w:w="780"/>
-            <w:tcBorders>
-              <w:top w:val="single" w:color="BFBFBF" w:sz="4"/>
-              <w:left w:val="single" w:color="BFBFBF" w:sz="4"/>
-              <w:bottom w:val="single" w:color="BFBFBF" w:sz="4"/>
-              <w:right w:val="single" w:color="BFBFBF" w:sz="4"/>
-            </w:tcBorders>
-            <w:shd w:fill="FFFFFF" w:val="clear"/>
-            <w:tcMar>
-              <w:top w:type="dxa" w:w="100"/>
-              <w:left w:type="dxa" w:w="140"/>
-              <w:bottom w:type="dxa" w:w="100"/>
-              <w:right w:type="dxa" w:w="140"/>
-            </w:tcMar>
-            <w:vAlign w:val="center"/>
-          </w:tcPr>
-          <w:p>
-            <w:pPr>
-              <w:spacing w:after="40" w:before="40"/>
-              <w:jc w:val="center"/>
-            </w:pPr>
-            <w:r>
-              <w:rPr>
-                <w:rFonts w:ascii="Calibri" w:cs="Calibri" w:eastAsia="Calibri" w:hAnsi="Calibri"/>
-                <w:sz w:val="22"/>
-                <w:szCs w:val="22"/>
-              </w:rPr>
-              <w:t xml:space="preserve">18</w:t>
-            </w:r>
-          </w:p>
-        </w:tc>
-        <w:tc>
-          <w:tcPr>
-            <w:tcW w:type="dxa" w:w="4880"/>
-            <w:tcBorders>
-              <w:top w:val="single" w:color="BFBFBF" w:sz="4"/>
-              <w:left w:val="single" w:color="BFBFBF" w:sz="4"/>
-              <w:bottom w:val="single" w:color="BFBFBF" w:sz="4"/>
-              <w:right w:val="single" w:color="BFBFBF" w:sz="4"/>
-            </w:tcBorders>
-            <w:shd w:fill="FFFFFF" w:val="clear"/>
-            <w:tcMar>
-              <w:top w:type="dxa" w:w="100"/>
-              <w:left w:type="dxa" w:w="140"/>
-              <w:bottom w:type="dxa" w:w="100"/>
-              <w:right w:type="dxa" w:w="140"/>
-            </w:tcMar>
-            <w:vAlign w:val="center"/>
-          </w:tcPr>
-          <w:p>
-            <w:pPr>
-              <w:spacing w:after="40" w:before="40"/>
-              <w:jc w:val="left"/>
-            </w:pPr>
-            <w:r>
-              <w:rPr>
-                <w:rFonts w:ascii="Calibri" w:cs="Calibri" w:eastAsia="Calibri" w:hAnsi="Calibri"/>
-                <w:b/>
-                <w:bCs/>
-                <w:sz w:val="22"/>
-                <w:szCs w:val="22"/>
-              </w:rPr>
-              <w:t xml:space="preserve">Blower</w:t>
-            </w:r>
-          </w:p>
-        </w:tc>
-        <w:tc>
-          <w:tcPr>
-            <w:tcW w:type="dxa" w:w="3700"/>
-            <w:tcBorders>
-              <w:top w:val="single" w:color="BFBFBF" w:sz="4"/>
-              <w:left w:val="single" w:color="BFBFBF" w:sz="4"/>
-              <w:bottom w:val="single" w:color="BFBFBF" w:sz="4"/>
-              <w:right w:val="single" w:color="BFBFBF" w:sz="4"/>
-            </w:tcBorders>
-            <w:shd w:fill="FFFFFF" w:val="clear"/>
-            <w:tcMar>
-              <w:top w:type="dxa" w:w="100"/>
-              <w:left w:type="dxa" w:w="140"/>
-              <w:bottom w:type="dxa" w:w="100"/>
-              <w:right w:type="dxa" w:w="140"/>
-            </w:tcMar>
-            <w:vAlign w:val="center"/>
-          </w:tcPr>
-          <w:p>
-            <w:pPr>
-              <w:spacing w:after="40" w:before="40"/>
-              <w:jc w:val="left"/>
-            </w:pPr>
-            <w:r>
-              <w:rPr>
-                <w:rFonts w:ascii="Calibri" w:cs="Calibri" w:eastAsia="Calibri" w:hAnsi="Calibri"/>
-                <w:sz w:val="22"/>
-                <w:szCs w:val="22"/>
-              </w:rPr>
-              <w:t xml:space="preserve">ENCON</w:t>
-            </w:r>
-          </w:p>
-        </w:tc>
-      </w:tr>
-      <w:tr>
-        <w:tc>
-          <w:tcPr>
-            <w:tcW w:type="dxa" w:w="780"/>
-            <w:tcBorders>
-              <w:top w:val="single" w:color="BFBFBF" w:sz="4"/>
-              <w:left w:val="single" w:color="BFBFBF" w:sz="4"/>
-              <w:bottom w:val="single" w:color="BFBFBF" w:sz="4"/>
-              <w:right w:val="single" w:color="BFBFBF" w:sz="4"/>
-            </w:tcBorders>
-            <w:shd w:fill="F3F4F6" w:val="clear"/>
-            <w:tcMar>
-              <w:top w:type="dxa" w:w="100"/>
-              <w:left w:type="dxa" w:w="140"/>
-              <w:bottom w:type="dxa" w:w="100"/>
-              <w:right w:type="dxa" w:w="140"/>
-            </w:tcMar>
-            <w:vAlign w:val="center"/>
-          </w:tcPr>
-          <w:p>
-            <w:pPr>
-              <w:spacing w:after="40" w:before="40"/>
-              <w:jc w:val="center"/>
-            </w:pPr>
-            <w:r>
-              <w:rPr>
-                <w:rFonts w:ascii="Calibri" w:cs="Calibri" w:eastAsia="Calibri" w:hAnsi="Calibri"/>
-                <w:sz w:val="22"/>
-                <w:szCs w:val="22"/>
-              </w:rPr>
-              <w:t xml:space="preserve">19</w:t>
-            </w:r>
-          </w:p>
-        </w:tc>
-        <w:tc>
-          <w:tcPr>
-            <w:tcW w:type="dxa" w:w="4880"/>
-            <w:tcBorders>
-              <w:top w:val="single" w:color="BFBFBF" w:sz="4"/>
-              <w:left w:val="single" w:color="BFBFBF" w:sz="4"/>
-              <w:bottom w:val="single" w:color="BFBFBF" w:sz="4"/>
-              <w:right w:val="single" w:color="BFBFBF" w:sz="4"/>
-            </w:tcBorders>
-            <w:shd w:fill="F3F4F6" w:val="clear"/>
-            <w:tcMar>
-              <w:top w:type="dxa" w:w="100"/>
-              <w:left w:type="dxa" w:w="140"/>
-              <w:bottom w:type="dxa" w:w="100"/>
-              <w:right w:type="dxa" w:w="140"/>
-            </w:tcMar>
-            <w:vAlign w:val="center"/>
-          </w:tcPr>
-          <w:p>
-            <w:pPr>
-              <w:spacing w:after="40" w:before="40"/>
-              <w:jc w:val="left"/>
-            </w:pPr>
-            <w:r>
-              <w:rPr>
-                <w:rFonts w:ascii="Calibri" w:cs="Calibri" w:eastAsia="Calibri" w:hAnsi="Calibri"/>
-                <w:b/>
-                <w:bCs/>
-                <w:sz w:val="22"/>
-                <w:szCs w:val="22"/>
-              </w:rPr>
-              <w:t xml:space="preserve">Bearing</w:t>
-            </w:r>
-          </w:p>
-        </w:tc>
-        <w:tc>
-          <w:tcPr>
-            <w:tcW w:type="dxa" w:w="3700"/>
-            <w:tcBorders>
-              <w:top w:val="single" w:color="BFBFBF" w:sz="4"/>
-              <w:left w:val="single" w:color="BFBFBF" w:sz="4"/>
-              <w:bottom w:val="single" w:color="BFBFBF" w:sz="4"/>
-              <w:right w:val="single" w:color="BFBFBF" w:sz="4"/>
-            </w:tcBorders>
-            <w:shd w:fill="F3F4F6" w:val="clear"/>
-            <w:tcMar>
-              <w:top w:type="dxa" w:w="100"/>
-              <w:left w:type="dxa" w:w="140"/>
-              <w:bottom w:type="dxa" w:w="100"/>
-              <w:right w:type="dxa" w:w="140"/>
-            </w:tcMar>
-            <w:vAlign w:val="center"/>
-          </w:tcPr>
-          <w:p>
-            <w:pPr>
-              <w:spacing w:after="40" w:before="40"/>
-              <w:jc w:val="left"/>
-            </w:pPr>
-            <w:r>
-              <w:rPr>
-                <w:rFonts w:ascii="Calibri" w:cs="Calibri" w:eastAsia="Calibri" w:hAnsi="Calibri"/>
-                <w:sz w:val="22"/>
-                <w:szCs w:val="22"/>
-              </w:rPr>
-              <w:t xml:space="preserve">FAG / SKF</w:t>
-            </w:r>
-          </w:p>
-        </w:tc>
-      </w:tr>
-      <w:tr>
-        <w:tc>
-          <w:tcPr>
-            <w:tcW w:type="dxa" w:w="780"/>
-            <w:tcBorders>
-              <w:top w:val="single" w:color="BFBFBF" w:sz="4"/>
-              <w:left w:val="single" w:color="BFBFBF" w:sz="4"/>
-              <w:bottom w:val="single" w:color="BFBFBF" w:sz="4"/>
-              <w:right w:val="single" w:color="BFBFBF" w:sz="4"/>
-            </w:tcBorders>
-            <w:shd w:fill="FFFFFF" w:val="clear"/>
-            <w:tcMar>
-              <w:top w:type="dxa" w:w="100"/>
-              <w:left w:type="dxa" w:w="140"/>
-              <w:bottom w:type="dxa" w:w="100"/>
-              <w:right w:type="dxa" w:w="140"/>
-            </w:tcMar>
-            <w:vAlign w:val="center"/>
-          </w:tcPr>
-          <w:p>
-            <w:pPr>
-              <w:spacing w:after="40" w:before="40"/>
-              <w:jc w:val="center"/>
-            </w:pPr>
-            <w:r>
-              <w:rPr>
-                <w:rFonts w:ascii="Calibri" w:cs="Calibri" w:eastAsia="Calibri" w:hAnsi="Calibri"/>
-                <w:sz w:val="22"/>
-                <w:szCs w:val="22"/>
-              </w:rPr>
-              <w:t xml:space="preserve">20</w:t>
-            </w:r>
-          </w:p>
-        </w:tc>
-        <w:tc>
-          <w:tcPr>
-            <w:tcW w:type="dxa" w:w="4880"/>
-            <w:tcBorders>
-              <w:top w:val="single" w:color="BFBFBF" w:sz="4"/>
-              <w:left w:val="single" w:color="BFBFBF" w:sz="4"/>
-              <w:bottom w:val="single" w:color="BFBFBF" w:sz="4"/>
-              <w:right w:val="single" w:color="BFBFBF" w:sz="4"/>
-            </w:tcBorders>
-            <w:shd w:fill="FFFFFF" w:val="clear"/>
-            <w:tcMar>
-              <w:top w:type="dxa" w:w="100"/>
-              <w:left w:type="dxa" w:w="140"/>
-              <w:bottom w:type="dxa" w:w="100"/>
-              <w:right w:type="dxa" w:w="140"/>
-            </w:tcMar>
-            <w:vAlign w:val="center"/>
-          </w:tcPr>
-          <w:p>
-            <w:pPr>
-              <w:spacing w:after="40" w:before="40"/>
-              <w:jc w:val="left"/>
-            </w:pPr>
-            <w:r>
-              <w:rPr>
-                <w:rFonts w:ascii="Calibri" w:cs="Calibri" w:eastAsia="Calibri" w:hAnsi="Calibri"/>
-                <w:b/>
-                <w:bCs/>
-                <w:sz w:val="22"/>
-                <w:szCs w:val="22"/>
-              </w:rPr>
-              <w:t xml:space="preserve">UV Sensor</w:t>
-            </w:r>
-          </w:p>
-        </w:tc>
-        <w:tc>
-          <w:tcPr>
-            <w:tcW w:type="dxa" w:w="3700"/>
-            <w:tcBorders>
-              <w:top w:val="single" w:color="BFBFBF" w:sz="4"/>
-              <w:left w:val="single" w:color="BFBFBF" w:sz="4"/>
-              <w:bottom w:val="single" w:color="BFBFBF" w:sz="4"/>
-              <w:right w:val="single" w:color="BFBFBF" w:sz="4"/>
-            </w:tcBorders>
-            <w:shd w:fill="FFFFFF" w:val="clear"/>
-            <w:tcMar>
-              <w:top w:type="dxa" w:w="100"/>
-              <w:left w:type="dxa" w:w="140"/>
-              <w:bottom w:type="dxa" w:w="100"/>
-              <w:right w:type="dxa" w:w="140"/>
-            </w:tcMar>
-            <w:vAlign w:val="center"/>
-          </w:tcPr>
-          <w:p>
-            <w:pPr>
-              <w:spacing w:after="40" w:before="40"/>
-              <w:jc w:val="left"/>
-            </w:pPr>
-            <w:r>
-              <w:rPr>
-                <w:rFonts w:ascii="Calibri" w:cs="Calibri" w:eastAsia="Calibri" w:hAnsi="Calibri"/>
-                <w:sz w:val="22"/>
-                <w:szCs w:val="22"/>
-              </w:rPr>
-              <w:t xml:space="preserve">Linear</w:t>
-            </w:r>
-          </w:p>
-        </w:tc>
-      </w:tr>
-      <w:tr>
-        <w:tc>
-          <w:tcPr>
-            <w:tcW w:type="dxa" w:w="780"/>
-            <w:tcBorders>
-              <w:top w:val="single" w:color="BFBFBF" w:sz="4"/>
-              <w:left w:val="single" w:color="BFBFBF" w:sz="4"/>
-              <w:bottom w:val="single" w:color="BFBFBF" w:sz="4"/>
-              <w:right w:val="single" w:color="BFBFBF" w:sz="4"/>
-            </w:tcBorders>
-            <w:shd w:fill="F3F4F6" w:val="clear"/>
-            <w:tcMar>
-              <w:top w:type="dxa" w:w="100"/>
-              <w:left w:type="dxa" w:w="140"/>
-              <w:bottom w:type="dxa" w:w="100"/>
-              <w:right w:type="dxa" w:w="140"/>
-            </w:tcMar>
-            <w:vAlign w:val="center"/>
-          </w:tcPr>
-          <w:p>
-            <w:pPr>
-              <w:spacing w:after="40" w:before="40"/>
-              <w:jc w:val="center"/>
-            </w:pPr>
-            <w:r>
-              <w:rPr>
-                <w:rFonts w:ascii="Calibri" w:cs="Calibri" w:eastAsia="Calibri" w:hAnsi="Calibri"/>
-                <w:sz w:val="22"/>
-                <w:szCs w:val="22"/>
-              </w:rPr>
-              <w:t xml:space="preserve">21</w:t>
-            </w:r>
-          </w:p>
-        </w:tc>
-        <w:tc>
-          <w:tcPr>
-            <w:tcW w:type="dxa" w:w="4880"/>
-            <w:tcBorders>
-              <w:top w:val="single" w:color="BFBFBF" w:sz="4"/>
-              <w:left w:val="single" w:color="BFBFBF" w:sz="4"/>
-              <w:bottom w:val="single" w:color="BFBFBF" w:sz="4"/>
-              <w:right w:val="single" w:color="BFBFBF" w:sz="4"/>
-            </w:tcBorders>
-            <w:shd w:fill="F3F4F6" w:val="clear"/>
-            <w:tcMar>
-              <w:top w:type="dxa" w:w="100"/>
-              <w:left w:type="dxa" w:w="140"/>
-              <w:bottom w:type="dxa" w:w="100"/>
-              <w:right w:type="dxa" w:w="140"/>
-            </w:tcMar>
-            <w:vAlign w:val="center"/>
-          </w:tcPr>
-          <w:p>
-            <w:pPr>
-              <w:spacing w:after="40" w:before="40"/>
-              <w:jc w:val="left"/>
-            </w:pPr>
-            <w:r>
-              <w:rPr>
-                <w:rFonts w:ascii="Calibri" w:cs="Calibri" w:eastAsia="Calibri" w:hAnsi="Calibri"/>
-                <w:b/>
-                <w:bCs/>
-                <w:sz w:val="22"/>
-                <w:szCs w:val="22"/>
-              </w:rPr>
-              <w:t xml:space="preserve">Ignition Transformer</w:t>
-            </w:r>
-          </w:p>
-        </w:tc>
-        <w:tc>
-          <w:tcPr>
-            <w:tcW w:type="dxa" w:w="3700"/>
-            <w:tcBorders>
-              <w:top w:val="single" w:color="BFBFBF" w:sz="4"/>
-              <w:left w:val="single" w:color="BFBFBF" w:sz="4"/>
-              <w:bottom w:val="single" w:color="BFBFBF" w:sz="4"/>
-              <w:right w:val="single" w:color="BFBFBF" w:sz="4"/>
-            </w:tcBorders>
-            <w:shd w:fill="F3F4F6" w:val="clear"/>
-            <w:tcMar>
-              <w:top w:type="dxa" w:w="100"/>
-              <w:left w:type="dxa" w:w="140"/>
-              <w:bottom w:type="dxa" w:w="100"/>
-              <w:right w:type="dxa" w:w="140"/>
-            </w:tcMar>
-            <w:vAlign w:val="center"/>
-          </w:tcPr>
-          <w:p>
-            <w:pPr>
-              <w:spacing w:after="40" w:before="40"/>
-              <w:jc w:val="left"/>
-            </w:pPr>
-            <w:r>
-              <w:rPr>
-                <w:rFonts w:ascii="Calibri" w:cs="Calibri" w:eastAsia="Calibri" w:hAnsi="Calibri"/>
-                <w:sz w:val="22"/>
-                <w:szCs w:val="22"/>
-              </w:rPr>
-              <w:t xml:space="preserve">COFI / Danfoss</w:t>
-            </w:r>
-          </w:p>
-        </w:tc>
-      </w:tr>
-      <w:tr>
-        <w:tc>
-          <w:tcPr>
-            <w:tcW w:type="dxa" w:w="780"/>
-            <w:tcBorders>
-              <w:top w:val="single" w:color="BFBFBF" w:sz="4"/>
-              <w:left w:val="single" w:color="BFBFBF" w:sz="4"/>
-              <w:bottom w:val="single" w:color="BFBFBF" w:sz="4"/>
-              <w:right w:val="single" w:color="BFBFBF" w:sz="4"/>
-            </w:tcBorders>
-            <w:shd w:fill="FFFFFF" w:val="clear"/>
-            <w:tcMar>
-              <w:top w:type="dxa" w:w="100"/>
-              <w:left w:type="dxa" w:w="140"/>
-              <w:bottom w:type="dxa" w:w="100"/>
-              <w:right w:type="dxa" w:w="140"/>
-            </w:tcMar>
-            <w:vAlign w:val="center"/>
-          </w:tcPr>
-          <w:p>
-            <w:pPr>
-              <w:spacing w:after="40" w:before="40"/>
-              <w:jc w:val="center"/>
-            </w:pPr>
-            <w:r>
-              <w:rPr>
-                <w:rFonts w:ascii="Calibri" w:cs="Calibri" w:eastAsia="Calibri" w:hAnsi="Calibri"/>
-                <w:sz w:val="22"/>
-                <w:szCs w:val="22"/>
-              </w:rPr>
-              <w:t xml:space="preserve">22</w:t>
-            </w:r>
-          </w:p>
-        </w:tc>
-        <w:tc>
-          <w:tcPr>
-            <w:tcW w:type="dxa" w:w="4880"/>
-            <w:tcBorders>
-              <w:top w:val="single" w:color="BFBFBF" w:sz="4"/>
-              <w:left w:val="single" w:color="BFBFBF" w:sz="4"/>
-              <w:bottom w:val="single" w:color="BFBFBF" w:sz="4"/>
-              <w:right w:val="single" w:color="BFBFBF" w:sz="4"/>
-            </w:tcBorders>
-            <w:shd w:fill="FFFFFF" w:val="clear"/>
-            <w:tcMar>
-              <w:top w:type="dxa" w:w="100"/>
-              <w:left w:type="dxa" w:w="140"/>
-              <w:bottom w:type="dxa" w:w="100"/>
-              <w:right w:type="dxa" w:w="140"/>
-            </w:tcMar>
-            <w:vAlign w:val="center"/>
-          </w:tcPr>
-          <w:p>
-            <w:pPr>
-              <w:spacing w:after="40" w:before="40"/>
-              <w:jc w:val="left"/>
-            </w:pPr>
-            <w:r>
-              <w:rPr>
-                <w:rFonts w:ascii="Calibri" w:cs="Calibri" w:eastAsia="Calibri" w:hAnsi="Calibri"/>
-                <w:b/>
-                <w:bCs/>
-                <w:sz w:val="22"/>
-                <w:szCs w:val="22"/>
-              </w:rPr>
-              <w:t xml:space="preserve">Sequence Controller</w:t>
-            </w:r>
-          </w:p>
-        </w:tc>
-        <w:tc>
-          <w:tcPr>
-            <w:tcW w:type="dxa" w:w="3700"/>
-            <w:tcBorders>
-              <w:top w:val="single" w:color="BFBFBF" w:sz="4"/>
-              <w:left w:val="single" w:color="BFBFBF" w:sz="4"/>
-              <w:bottom w:val="single" w:color="BFBFBF" w:sz="4"/>
-              <w:right w:val="single" w:color="BFBFBF" w:sz="4"/>
-            </w:tcBorders>
-            <w:shd w:fill="FFFFFF" w:val="clear"/>
-            <w:tcMar>
-              <w:top w:type="dxa" w:w="100"/>
-              <w:left w:type="dxa" w:w="140"/>
-              <w:bottom w:type="dxa" w:w="100"/>
-              <w:right w:type="dxa" w:w="140"/>
-            </w:tcMar>
-            <w:vAlign w:val="center"/>
-          </w:tcPr>
-          <w:p>
-            <w:pPr>
-              <w:spacing w:after="40" w:before="40"/>
-              <w:jc w:val="left"/>
-            </w:pPr>
-            <w:r>
-              <w:rPr>
-                <w:rFonts w:ascii="Calibri" w:cs="Calibri" w:eastAsia="Calibri" w:hAnsi="Calibri"/>
-                <w:sz w:val="22"/>
-                <w:szCs w:val="22"/>
-              </w:rPr>
-              <w:t xml:space="preserve">Linear</w:t>
-            </w:r>
-          </w:p>
-        </w:tc>
-      </w:tr>
-      <w:tr>
-        <w:tc>
-          <w:tcPr>
-            <w:tcW w:type="dxa" w:w="780"/>
-            <w:tcBorders>
-              <w:top w:val="single" w:color="BFBFBF" w:sz="4"/>
-              <w:left w:val="single" w:color="BFBFBF" w:sz="4"/>
-              <w:bottom w:val="single" w:color="BFBFBF" w:sz="4"/>
-              <w:right w:val="single" w:color="BFBFBF" w:sz="4"/>
-            </w:tcBorders>
-            <w:shd w:fill="F3F4F6" w:val="clear"/>
-            <w:tcMar>
-              <w:top w:type="dxa" w:w="100"/>
-              <w:left w:type="dxa" w:w="140"/>
-              <w:bottom w:type="dxa" w:w="100"/>
-              <w:right w:type="dxa" w:w="140"/>
-            </w:tcMar>
-            <w:vAlign w:val="center"/>
-          </w:tcPr>
-          <w:p>
-            <w:pPr>
-              <w:spacing w:after="40" w:before="40"/>
-              <w:jc w:val="center"/>
-            </w:pPr>
-            <w:r>
-              <w:rPr>
-                <w:rFonts w:ascii="Calibri" w:cs="Calibri" w:eastAsia="Calibri" w:hAnsi="Calibri"/>
-                <w:sz w:val="22"/>
-                <w:szCs w:val="22"/>
-              </w:rPr>
-              <w:t xml:space="preserve">23</w:t>
-            </w:r>
-          </w:p>
-        </w:tc>
-        <w:tc>
-          <w:tcPr>
-            <w:tcW w:type="dxa" w:w="4880"/>
-            <w:tcBorders>
-              <w:top w:val="single" w:color="BFBFBF" w:sz="4"/>
-              <w:left w:val="single" w:color="BFBFBF" w:sz="4"/>
-              <w:bottom w:val="single" w:color="BFBFBF" w:sz="4"/>
-              <w:right w:val="single" w:color="BFBFBF" w:sz="4"/>
-            </w:tcBorders>
-            <w:shd w:fill="F3F4F6" w:val="clear"/>
-            <w:tcMar>
-              <w:top w:type="dxa" w:w="100"/>
-              <w:left w:type="dxa" w:w="140"/>
-              <w:bottom w:type="dxa" w:w="100"/>
-              <w:right w:type="dxa" w:w="140"/>
-            </w:tcMar>
-            <w:vAlign w:val="center"/>
-          </w:tcPr>
-          <w:p>
-            <w:pPr>
-              <w:spacing w:after="40" w:before="40"/>
-              <w:jc w:val="left"/>
-            </w:pPr>
-            <w:r>
-              <w:rPr>
-                <w:rFonts w:ascii="Calibri" w:cs="Calibri" w:eastAsia="Calibri" w:hAnsi="Calibri"/>
-                <w:b/>
-                <w:bCs/>
-                <w:sz w:val="22"/>
-                <w:szCs w:val="22"/>
-              </w:rPr>
-              <w:t xml:space="preserve">Motor</w:t>
-            </w:r>
-          </w:p>
-        </w:tc>
-        <w:tc>
-          <w:tcPr>
-            <w:tcW w:type="dxa" w:w="3700"/>
-            <w:tcBorders>
-              <w:top w:val="single" w:color="BFBFBF" w:sz="4"/>
-              <w:left w:val="single" w:color="BFBFBF" w:sz="4"/>
-              <w:bottom w:val="single" w:color="BFBFBF" w:sz="4"/>
-              <w:right w:val="single" w:color="BFBFBF" w:sz="4"/>
-            </w:tcBorders>
-            <w:shd w:fill="F3F4F6" w:val="clear"/>
-            <w:tcMar>
-              <w:top w:type="dxa" w:w="100"/>
-              <w:left w:type="dxa" w:w="140"/>
-              <w:bottom w:type="dxa" w:w="100"/>
-              <w:right w:type="dxa" w:w="140"/>
-            </w:tcMar>
-            <w:vAlign w:val="center"/>
-          </w:tcPr>
-          <w:p>
-            <w:pPr>
-              <w:spacing w:after="40" w:before="40"/>
-              <w:jc w:val="left"/>
-            </w:pPr>
-            <w:r>
-              <w:rPr>
-                <w:rFonts w:ascii="Calibri" w:cs="Calibri" w:eastAsia="Calibri" w:hAnsi="Calibri"/>
-                <w:sz w:val="22"/>
-                <w:szCs w:val="22"/>
-              </w:rPr>
-              <w:t xml:space="preserve">ABB</w:t>
-            </w:r>
-          </w:p>
-        </w:tc>
-      </w:tr>
-      <w:tr>
-        <w:tc>
-          <w:tcPr>
-            <w:tcW w:type="dxa" w:w="780"/>
-            <w:tcBorders>
-              <w:top w:val="single" w:color="BFBFBF" w:sz="4"/>
-              <w:left w:val="single" w:color="BFBFBF" w:sz="4"/>
-              <w:bottom w:val="single" w:color="BFBFBF" w:sz="4"/>
-              <w:right w:val="single" w:color="BFBFBF" w:sz="4"/>
-            </w:tcBorders>
-            <w:shd w:fill="FFFFFF" w:val="clear"/>
-            <w:tcMar>
-              <w:top w:type="dxa" w:w="100"/>
-              <w:left w:type="dxa" w:w="140"/>
-              <w:bottom w:type="dxa" w:w="100"/>
-              <w:right w:type="dxa" w:w="140"/>
-            </w:tcMar>
-            <w:vAlign w:val="center"/>
-          </w:tcPr>
-          <w:p>
-            <w:pPr>
-              <w:spacing w:after="40" w:before="40"/>
-              <w:jc w:val="center"/>
-            </w:pPr>
-            <w:r>
-              <w:rPr>
-                <w:rFonts w:ascii="Calibri" w:cs="Calibri" w:eastAsia="Calibri" w:hAnsi="Calibri"/>
-                <w:sz w:val="22"/>
-                <w:szCs w:val="22"/>
-              </w:rPr>
-              <w:t xml:space="preserve">24</w:t>
-            </w:r>
-          </w:p>
-        </w:tc>
-        <w:tc>
-          <w:tcPr>
-            <w:tcW w:type="dxa" w:w="4880"/>
-            <w:tcBorders>
-              <w:top w:val="single" w:color="BFBFBF" w:sz="4"/>
-              <w:left w:val="single" w:color="BFBFBF" w:sz="4"/>
-              <w:bottom w:val="single" w:color="BFBFBF" w:sz="4"/>
-              <w:right w:val="single" w:color="BFBFBF" w:sz="4"/>
-            </w:tcBorders>
-            <w:shd w:fill="FFFFFF" w:val="clear"/>
-            <w:tcMar>
-              <w:top w:type="dxa" w:w="100"/>
-              <w:left w:type="dxa" w:w="140"/>
-              <w:bottom w:type="dxa" w:w="100"/>
-              <w:right w:type="dxa" w:w="140"/>
-            </w:tcMar>
-            <w:vAlign w:val="center"/>
-          </w:tcPr>
-          <w:p>
-            <w:pPr>
-              <w:spacing w:after="40" w:before="40"/>
-              <w:jc w:val="left"/>
-            </w:pPr>
-            <w:r>
-              <w:rPr>
-                <w:rFonts w:ascii="Calibri" w:cs="Calibri" w:eastAsia="Calibri" w:hAnsi="Calibri"/>
-                <w:b/>
-                <w:bCs/>
-                <w:sz w:val="22"/>
-                <w:szCs w:val="22"/>
-              </w:rPr>
-              <w:t xml:space="preserve">Gearbox</w:t>
-            </w:r>
-          </w:p>
-        </w:tc>
-        <w:tc>
-          <w:tcPr>
-            <w:tcW w:type="dxa" w:w="3700"/>
-            <w:tcBorders>
-              <w:top w:val="single" w:color="BFBFBF" w:sz="4"/>
-              <w:left w:val="single" w:color="BFBFBF" w:sz="4"/>
-              <w:bottom w:val="single" w:color="BFBFBF" w:sz="4"/>
-              <w:right w:val="single" w:color="BFBFBF" w:sz="4"/>
-            </w:tcBorders>
-            <w:shd w:fill="FFFFFF" w:val="clear"/>
-            <w:tcMar>
-              <w:top w:type="dxa" w:w="100"/>
-              <w:left w:type="dxa" w:w="140"/>
-              <w:bottom w:type="dxa" w:w="100"/>
-              <w:right w:type="dxa" w:w="140"/>
-            </w:tcMar>
-            <w:vAlign w:val="center"/>
-          </w:tcPr>
-          <w:p>
-            <w:pPr>
-              <w:spacing w:after="40" w:before="40"/>
-              <w:jc w:val="left"/>
-            </w:pPr>
-            <w:r>
-              <w:rPr>
-                <w:rFonts w:ascii="Calibri" w:cs="Calibri" w:eastAsia="Calibri" w:hAnsi="Calibri"/>
-                <w:sz w:val="22"/>
-                <w:szCs w:val="22"/>
-              </w:rPr>
-              <w:t xml:space="preserve">Powertek</w:t>
-            </w:r>
-          </w:p>
-        </w:tc>
-      </w:tr>
-      <w:tr>
-        <w:tc>
-          <w:tcPr>
-            <w:tcW w:type="dxa" w:w="780"/>
-            <w:tcBorders>
-              <w:top w:val="single" w:color="BFBFBF" w:sz="4"/>
-              <w:left w:val="single" w:color="BFBFBF" w:sz="4"/>
-              <w:bottom w:val="single" w:color="BFBFBF" w:sz="4"/>
-              <w:right w:val="single" w:color="BFBFBF" w:sz="4"/>
-            </w:tcBorders>
-            <w:shd w:fill="F3F4F6" w:val="clear"/>
-            <w:tcMar>
-              <w:top w:type="dxa" w:w="100"/>
-              <w:left w:type="dxa" w:w="140"/>
-              <w:bottom w:type="dxa" w:w="100"/>
-              <w:right w:type="dxa" w:w="140"/>
-            </w:tcMar>
-            <w:vAlign w:val="center"/>
-          </w:tcPr>
-          <w:p>
-            <w:pPr>
-              <w:spacing w:after="40" w:before="40"/>
-              <w:jc w:val="center"/>
-            </w:pPr>
-            <w:r>
-              <w:rPr>
-                <w:rFonts w:ascii="Calibri" w:cs="Calibri" w:eastAsia="Calibri" w:hAnsi="Calibri"/>
-                <w:sz w:val="22"/>
-                <w:szCs w:val="22"/>
-              </w:rPr>
-              <w:t xml:space="preserve">25</w:t>
-            </w:r>
-          </w:p>
-        </w:tc>
-        <w:tc>
-          <w:tcPr>
-            <w:tcW w:type="dxa" w:w="4880"/>
-            <w:tcBorders>
-              <w:top w:val="single" w:color="BFBFBF" w:sz="4"/>
-              <w:left w:val="single" w:color="BFBFBF" w:sz="4"/>
-              <w:bottom w:val="single" w:color="BFBFBF" w:sz="4"/>
-              <w:right w:val="single" w:color="BFBFBF" w:sz="4"/>
-            </w:tcBorders>
-            <w:shd w:fill="F3F4F6" w:val="clear"/>
-            <w:tcMar>
-              <w:top w:type="dxa" w:w="100"/>
-              <w:left w:type="dxa" w:w="140"/>
-              <w:bottom w:type="dxa" w:w="100"/>
-              <w:right w:type="dxa" w:w="140"/>
-            </w:tcMar>
-            <w:vAlign w:val="center"/>
-          </w:tcPr>
-          <w:p>
-            <w:pPr>
-              <w:spacing w:after="40" w:before="40"/>
-              <w:jc w:val="left"/>
-            </w:pPr>
-            <w:r>
-              <w:rPr>
-                <w:rFonts w:ascii="Calibri" w:cs="Calibri" w:eastAsia="Calibri" w:hAnsi="Calibri"/>
-                <w:b/>
-                <w:bCs/>
-                <w:sz w:val="22"/>
-                <w:szCs w:val="22"/>
-              </w:rPr>
-              <w:t xml:space="preserve">P.PID</w:t>
-            </w:r>
-          </w:p>
-        </w:tc>
-        <w:tc>
-          <w:tcPr>
-            <w:tcW w:type="dxa" w:w="3700"/>
-            <w:tcBorders>
-              <w:top w:val="single" w:color="BFBFBF" w:sz="4"/>
-              <w:left w:val="single" w:color="BFBFBF" w:sz="4"/>
-              <w:bottom w:val="single" w:color="BFBFBF" w:sz="4"/>
-              <w:right w:val="single" w:color="BFBFBF" w:sz="4"/>
-            </w:tcBorders>
-            <w:shd w:fill="F3F4F6" w:val="clear"/>
-            <w:tcMar>
-              <w:top w:type="dxa" w:w="100"/>
-              <w:left w:type="dxa" w:w="140"/>
-              <w:bottom w:type="dxa" w:w="100"/>
-              <w:right w:type="dxa" w:w="140"/>
-            </w:tcMar>
-            <w:vAlign w:val="center"/>
-          </w:tcPr>
-          <w:p>
-            <w:pPr>
-              <w:spacing w:after="40" w:before="40"/>
-              <w:jc w:val="left"/>
-            </w:pPr>
-            <w:r>
-              <w:rPr>
-                <w:rFonts w:ascii="Calibri" w:cs="Calibri" w:eastAsia="Calibri" w:hAnsi="Calibri"/>
-                <w:sz w:val="22"/>
-                <w:szCs w:val="22"/>
-              </w:rPr>
-              <w:t xml:space="preserve">Honeywell</w:t>
-            </w:r>
-          </w:p>
-        </w:tc>
-      </w:tr>
-      <w:tr>
-        <w:tc>
-          <w:tcPr>
-            <w:tcW w:type="dxa" w:w="780"/>
-            <w:tcBorders>
-              <w:top w:val="single" w:color="BFBFBF" w:sz="4"/>
-              <w:left w:val="single" w:color="BFBFBF" w:sz="4"/>
-              <w:bottom w:val="single" w:color="BFBFBF" w:sz="4"/>
-              <w:right w:val="single" w:color="BFBFBF" w:sz="4"/>
-            </w:tcBorders>
-            <w:shd w:fill="FFFFFF" w:val="clear"/>
-            <w:tcMar>
-              <w:top w:type="dxa" w:w="100"/>
-              <w:left w:type="dxa" w:w="140"/>
-              <w:bottom w:type="dxa" w:w="100"/>
-              <w:right w:type="dxa" w:w="140"/>
-            </w:tcMar>
-            <w:vAlign w:val="center"/>
-          </w:tcPr>
-          <w:p>
-            <w:pPr>
-              <w:spacing w:after="40" w:before="40"/>
-              <w:jc w:val="center"/>
-            </w:pPr>
-            <w:r>
-              <w:rPr>
-                <w:rFonts w:ascii="Calibri" w:cs="Calibri" w:eastAsia="Calibri" w:hAnsi="Calibri"/>
-                <w:sz w:val="22"/>
-                <w:szCs w:val="22"/>
-              </w:rPr>
-              <w:t xml:space="preserve">26</w:t>
-            </w:r>
-          </w:p>
-        </w:tc>
-        <w:tc>
-          <w:tcPr>
-            <w:tcW w:type="dxa" w:w="4880"/>
-            <w:tcBorders>
-              <w:top w:val="single" w:color="BFBFBF" w:sz="4"/>
-              <w:left w:val="single" w:color="BFBFBF" w:sz="4"/>
-              <w:bottom w:val="single" w:color="BFBFBF" w:sz="4"/>
-              <w:right w:val="single" w:color="BFBFBF" w:sz="4"/>
-            </w:tcBorders>
-            <w:shd w:fill="FFFFFF" w:val="clear"/>
-            <w:tcMar>
-              <w:top w:type="dxa" w:w="100"/>
-              <w:left w:type="dxa" w:w="140"/>
-              <w:bottom w:type="dxa" w:w="100"/>
-              <w:right w:type="dxa" w:w="140"/>
-            </w:tcMar>
-            <w:vAlign w:val="center"/>
-          </w:tcPr>
-          <w:p>
-            <w:pPr>
-              <w:spacing w:after="40" w:before="40"/>
-              <w:jc w:val="left"/>
-            </w:pPr>
-            <w:r>
-              <w:rPr>
-                <w:rFonts w:ascii="Calibri" w:cs="Calibri" w:eastAsia="Calibri" w:hAnsi="Calibri"/>
-                <w:b/>
-                <w:bCs/>
-                <w:sz w:val="22"/>
-                <w:szCs w:val="22"/>
-              </w:rPr>
-              <w:t xml:space="preserve">Ratio Controller</w:t>
-            </w:r>
-          </w:p>
-        </w:tc>
-        <w:tc>
-          <w:tcPr>
-            <w:tcW w:type="dxa" w:w="3700"/>
-            <w:tcBorders>
-              <w:top w:val="single" w:color="BFBFBF" w:sz="4"/>
-              <w:left w:val="single" w:color="BFBFBF" w:sz="4"/>
-              <w:bottom w:val="single" w:color="BFBFBF" w:sz="4"/>
-              <w:right w:val="single" w:color="BFBFBF" w:sz="4"/>
-            </w:tcBorders>
-            <w:shd w:fill="FFFFFF" w:val="clear"/>
-            <w:tcMar>
-              <w:top w:type="dxa" w:w="100"/>
-              <w:left w:type="dxa" w:w="140"/>
-              <w:bottom w:type="dxa" w:w="100"/>
-              <w:right w:type="dxa" w:w="140"/>
-            </w:tcMar>
-            <w:vAlign w:val="center"/>
-          </w:tcPr>
-          <w:p>
-            <w:pPr>
-              <w:spacing w:after="40" w:before="40"/>
-              <w:jc w:val="left"/>
-            </w:pPr>
-            <w:r>
-              <w:rPr>
-                <w:rFonts w:ascii="Calibri" w:cs="Calibri" w:eastAsia="Calibri" w:hAnsi="Calibri"/>
-                <w:sz w:val="22"/>
-                <w:szCs w:val="22"/>
-              </w:rPr>
-              <w:t xml:space="preserve">Honeywell</w:t>
-            </w:r>
-          </w:p>
-        </w:tc>
-      </w:tr>
-      <w:tr>
-        <w:tc>
-          <w:tcPr>
-            <w:tcW w:type="dxa" w:w="780"/>
-            <w:tcBorders>
-              <w:top w:val="single" w:color="BFBFBF" w:sz="4"/>
-              <w:left w:val="single" w:color="BFBFBF" w:sz="4"/>
-              <w:bottom w:val="single" w:color="BFBFBF" w:sz="4"/>
-              <w:right w:val="single" w:color="BFBFBF" w:sz="4"/>
-            </w:tcBorders>
-            <w:shd w:fill="F3F4F6" w:val="clear"/>
-            <w:tcMar>
-              <w:top w:type="dxa" w:w="100"/>
-              <w:left w:type="dxa" w:w="140"/>
-              <w:bottom w:type="dxa" w:w="100"/>
-              <w:right w:type="dxa" w:w="140"/>
-            </w:tcMar>
-            <w:vAlign w:val="center"/>
-          </w:tcPr>
-          <w:p>
-            <w:pPr>
-              <w:spacing w:after="40" w:before="40"/>
-              <w:jc w:val="center"/>
-            </w:pPr>
-            <w:r>
-              <w:rPr>
-                <w:rFonts w:ascii="Calibri" w:cs="Calibri" w:eastAsia="Calibri" w:hAnsi="Calibri"/>
-                <w:sz w:val="22"/>
-                <w:szCs w:val="22"/>
-              </w:rPr>
-              <w:t xml:space="preserve">27</w:t>
-            </w:r>
-          </w:p>
-        </w:tc>
-        <w:tc>
-          <w:tcPr>
-            <w:tcW w:type="dxa" w:w="4880"/>
-            <w:tcBorders>
-              <w:top w:val="single" w:color="BFBFBF" w:sz="4"/>
-              <w:left w:val="single" w:color="BFBFBF" w:sz="4"/>
-              <w:bottom w:val="single" w:color="BFBFBF" w:sz="4"/>
-              <w:right w:val="single" w:color="BFBFBF" w:sz="4"/>
-            </w:tcBorders>
-            <w:shd w:fill="F3F4F6" w:val="clear"/>
-            <w:tcMar>
-              <w:top w:type="dxa" w:w="100"/>
-              <w:left w:type="dxa" w:w="140"/>
-              <w:bottom w:type="dxa" w:w="100"/>
-              <w:right w:type="dxa" w:w="140"/>
-            </w:tcMar>
-            <w:vAlign w:val="center"/>
-          </w:tcPr>
-          <w:p>
-            <w:pPr>
-              <w:spacing w:after="40" w:before="40"/>
-              <w:jc w:val="left"/>
-            </w:pPr>
-            <w:r>
-              <w:rPr>
-                <w:rFonts w:ascii="Calibri" w:cs="Calibri" w:eastAsia="Calibri" w:hAnsi="Calibri"/>
-                <w:b/>
-                <w:bCs/>
-                <w:sz w:val="22"/>
-                <w:szCs w:val="22"/>
-              </w:rPr>
-              <w:t xml:space="preserve">Air-Gas Regulator</w:t>
-            </w:r>
-          </w:p>
-        </w:tc>
-        <w:tc>
-          <w:tcPr>
-            <w:tcW w:type="dxa" w:w="3700"/>
-            <w:tcBorders>
-              <w:top w:val="single" w:color="BFBFBF" w:sz="4"/>
-              <w:left w:val="single" w:color="BFBFBF" w:sz="4"/>
-              <w:bottom w:val="single" w:color="BFBFBF" w:sz="4"/>
-              <w:right w:val="single" w:color="BFBFBF" w:sz="4"/>
-            </w:tcBorders>
-            <w:shd w:fill="F3F4F6" w:val="clear"/>
-            <w:tcMar>
-              <w:top w:type="dxa" w:w="100"/>
-              <w:left w:type="dxa" w:w="140"/>
-              <w:bottom w:type="dxa" w:w="100"/>
-              <w:right w:type="dxa" w:w="140"/>
-            </w:tcMar>
-            <w:vAlign w:val="center"/>
-          </w:tcPr>
-          <w:p>
-            <w:pPr>
-              <w:spacing w:after="40" w:before="40"/>
-              <w:jc w:val="left"/>
-            </w:pPr>
-            <w:r>
-              <w:rPr>
-                <w:rFonts w:ascii="Calibri" w:cs="Calibri" w:eastAsia="Calibri" w:hAnsi="Calibri"/>
-                <w:sz w:val="22"/>
-                <w:szCs w:val="22"/>
-              </w:rPr>
-              <w:t xml:space="preserve">MADAS</w:t>
             </w:r>
           </w:p>
         </w:tc>

</xml_diff>

<commit_message>
fix: unbold Supervision Charges description, flow Make List inline
- Supervision Charges (Mechanical) / (PLC and Instrumentation)
  description cells in the separate supervision table no longer have
  the <w:b/> run property — they render in regular weight to match
  the other body text in the box.
- Dropped the explicit page break (<w:br w:type="page"/>) that was
  forcing Annexure VI Make List onto a new page. Make List now flows
  directly after Annexure V's reference client list.

Co-Authored-By: Claude Opus 4.7 (1M context) <noreply@anthropic.com>
</commit_message>
<xml_diff>
--- a/Offer_Template.docx
+++ b/Offer_Template.docx
@@ -8492,9 +8492,6 @@
           </w:tcPr>
           <w:p>
             <w:r>
-              <w:rPr>
-                <w:b/>
-              </w:rPr>
               <w:t>Supervision Charges for Erection and Commissioning (Mechanical)</w:t>
             </w:r>
           </w:p>
@@ -8517,9 +8514,6 @@
           </w:tcPr>
           <w:p>
             <w:r>
-              <w:rPr>
-                <w:b/>
-              </w:rPr>
               <w:t>Supervision Charges for Erection and Commissioning (PLC and Instrumentation)</w:t>
             </w:r>
           </w:p>
@@ -15035,11 +15029,6 @@
         </w:tc>
       </w:tr>
     </w:tbl>
-    <w:p>
-      <w:r>
-        <w:br w:type="page"/>
-      </w:r>
-    </w:p>
     <w:p>
       <w:pPr>
         <w:pStyle w:val="Heading1"/>

</xml_diff>

<commit_message>
fix: drop page break before Annexure I (Scope of Supply)
Annexure I now flows directly after the PAINTING paragraph at the
end of the Scope of Supply section, matching the same continuous-flow
treatment we applied to Annexure VI Make List.

Co-Authored-By: Claude Opus 4.7 (1M context) <noreply@anthropic.com>
</commit_message>
<xml_diff>
--- a/Offer_Template.docx
+++ b/Offer_Template.docx
@@ -6990,11 +6990,6 @@
           <w:rFonts w:ascii="Calibri" w:cs="Calibri" w:eastAsia="Calibri" w:hAnsi="Calibri"/>
         </w:rPr>
         <w:t xml:space="preserve">All steel material will be painted, and surfaces will be cleaned per the general painting specifications provided by the client. All bought-out components will retain the supplier’s standard finish. Pipelines will be painted as per the colour code.</w:t>
-      </w:r>
-    </w:p>
-    <w:p>
-      <w:r>
-        <w:br w:type="page"/>
       </w:r>
     </w:p>
     <w:p>

</xml_diff>

<commit_message>
fix: strip page breaks before Annexures II, III, IV, V
Matches the same continuous-flow treatment already applied to
Annexure I and Annexure VI. All annexures now flow inline.

Co-Authored-By: Claude Opus 4.7 (1M context) <noreply@anthropic.com>
</commit_message>
<xml_diff>
--- a/Offer_Template.docx
+++ b/Offer_Template.docx
@@ -7785,11 +7785,6 @@
       </w:tr>
     </w:tbl>
     <w:p>
-      <w:r>
-        <w:br w:type="page"/>
-      </w:r>
-    </w:p>
-    <w:p>
       <w:pPr>
         <w:pStyle w:val="Heading1"/>
         <w:pBdr>
@@ -7927,11 +7922,6 @@
           <w:szCs w:val="22"/>
         </w:rPr>
         <w:t>LADLE STAND / SUPPORT</w:t>
-      </w:r>
-    </w:p>
-    <w:p>
-      <w:r>
-        <w:br w:type="page"/>
       </w:r>
     </w:p>
     <w:p>
@@ -8542,11 +8532,6 @@
       </w:tr>
     </w:tbl>
     <w:p>
-      <w:r>
-        <w:br w:type="page"/>
-      </w:r>
-    </w:p>
-    <w:p>
       <w:pPr>
         <w:pStyle w:val="Heading1"/>
         <w:pBdr>
@@ -9445,11 +9430,6 @@
         </w:tc>
       </w:tr>
     </w:tbl>
-    <w:p>
-      <w:r>
-        <w:br w:type="page"/>
-      </w:r>
-    </w:p>
     <w:p>
       <w:pPr>
         <w:pStyle w:val="Heading1"/>

</xml_diff>

<commit_message>
feat: template accepts Tundish-specific Max Fuel Consumption rows
Added two rows to the Tech Data table in Offer_Template.docx, right
under 'Firing Rate':
  - 'Max Fuel Consumption per cycle'         -> {{ max_consumption_fuel1 }}
  - 'Max Fuel Consumption per cycle (Fuel 2)'-> {{ max_consumption_fuel2 }}

Tundish form already sends these values (max_fuel_consumption1/2 ->
max_consumption_fuel1/2 in template context). Both labels are added to
the _strip_empty_tech_rows whitelist so they auto-drop on VLPH/HLPH
offers where those fields are blank.

Co-Authored-By: Claude Opus 4.7 (1M context) <noreply@anthropic.com>
</commit_message>
<xml_diff>
--- a/Offer_Template.docx
+++ b/Offer_Template.docx
@@ -3713,6 +3713,136 @@
             </w:pPr>
             <w:r>
               <w:t>{{fuel_consumption}}</w:t>
+            </w:r>
+          </w:p>
+        </w:tc>
+      </w:tr>
+      <w:tr>
+        <w:tc>
+          <w:tcPr>
+            <w:tcW w:type="dxa" w:w="3744"/>
+            <w:tcBorders>
+              <w:top w:val="single" w:color="BFBFBF" w:sz="4"/>
+              <w:left w:val="single" w:color="BFBFBF" w:sz="4"/>
+              <w:bottom w:val="single" w:color="BFBFBF" w:sz="4"/>
+              <w:right w:val="single" w:color="BFBFBF" w:sz="4"/>
+            </w:tcBorders>
+            <w:shd w:fill="FFFFFF" w:val="clear"/>
+            <w:tcMar>
+              <w:top w:type="dxa" w:w="100"/>
+              <w:left w:type="dxa" w:w="140"/>
+              <w:bottom w:type="dxa" w:w="100"/>
+              <w:right w:type="dxa" w:w="140"/>
+            </w:tcMar>
+            <w:vAlign w:val="center"/>
+          </w:tcPr>
+          <w:p>
+            <w:pPr>
+              <w:spacing w:after="40" w:before="40"/>
+              <w:jc w:val="left"/>
+            </w:pPr>
+            <w:r>
+              <w:rPr>
+                <w:rFonts w:ascii="Calibri" w:cs="Calibri" w:eastAsia="Calibri" w:hAnsi="Calibri"/>
+                <w:b/>
+                <w:bCs/>
+                <w:sz w:val="22"/>
+                <w:szCs w:val="22"/>
+              </w:rPr>
+              <w:t xml:space="preserve">Max Fuel Consumption per cycle</w:t>
+            </w:r>
+          </w:p>
+        </w:tc>
+        <w:tc>
+          <w:tcPr>
+            <w:tcW w:type="dxa" w:w="5616"/>
+            <w:tcBorders>
+              <w:top w:val="single" w:color="BFBFBF" w:sz="4"/>
+              <w:left w:val="single" w:color="BFBFBF" w:sz="4"/>
+              <w:bottom w:val="single" w:color="BFBFBF" w:sz="4"/>
+              <w:right w:val="single" w:color="BFBFBF" w:sz="4"/>
+            </w:tcBorders>
+            <w:shd w:fill="FFFFFF" w:val="clear"/>
+            <w:tcMar>
+              <w:top w:type="dxa" w:w="100"/>
+              <w:left w:type="dxa" w:w="140"/>
+              <w:bottom w:type="dxa" w:w="100"/>
+              <w:right w:type="dxa" w:w="140"/>
+            </w:tcMar>
+            <w:vAlign w:val="center"/>
+          </w:tcPr>
+          <w:p>
+            <w:pPr>
+              <w:spacing w:after="40" w:before="40"/>
+              <w:jc w:val="left"/>
+            </w:pPr>
+            <w:r>
+              <w:t xml:space="preserve">{{ max_consumption_fuel1 }}</w:t>
+            </w:r>
+          </w:p>
+        </w:tc>
+      </w:tr>
+      <w:tr>
+        <w:tc>
+          <w:tcPr>
+            <w:tcW w:type="dxa" w:w="3744"/>
+            <w:tcBorders>
+              <w:top w:val="single" w:color="BFBFBF" w:sz="4"/>
+              <w:left w:val="single" w:color="BFBFBF" w:sz="4"/>
+              <w:bottom w:val="single" w:color="BFBFBF" w:sz="4"/>
+              <w:right w:val="single" w:color="BFBFBF" w:sz="4"/>
+            </w:tcBorders>
+            <w:shd w:fill="FFFFFF" w:val="clear"/>
+            <w:tcMar>
+              <w:top w:type="dxa" w:w="100"/>
+              <w:left w:type="dxa" w:w="140"/>
+              <w:bottom w:type="dxa" w:w="100"/>
+              <w:right w:type="dxa" w:w="140"/>
+            </w:tcMar>
+            <w:vAlign w:val="center"/>
+          </w:tcPr>
+          <w:p>
+            <w:pPr>
+              <w:spacing w:after="40" w:before="40"/>
+              <w:jc w:val="left"/>
+            </w:pPr>
+            <w:r>
+              <w:rPr>
+                <w:rFonts w:ascii="Calibri" w:cs="Calibri" w:eastAsia="Calibri" w:hAnsi="Calibri"/>
+                <w:b/>
+                <w:bCs/>
+                <w:sz w:val="22"/>
+                <w:szCs w:val="22"/>
+              </w:rPr>
+              <w:t xml:space="preserve">Max Fuel Consumption per cycle (Fuel 2)</w:t>
+            </w:r>
+          </w:p>
+        </w:tc>
+        <w:tc>
+          <w:tcPr>
+            <w:tcW w:type="dxa" w:w="5616"/>
+            <w:tcBorders>
+              <w:top w:val="single" w:color="BFBFBF" w:sz="4"/>
+              <w:left w:val="single" w:color="BFBFBF" w:sz="4"/>
+              <w:bottom w:val="single" w:color="BFBFBF" w:sz="4"/>
+              <w:right w:val="single" w:color="BFBFBF" w:sz="4"/>
+            </w:tcBorders>
+            <w:shd w:fill="FFFFFF" w:val="clear"/>
+            <w:tcMar>
+              <w:top w:type="dxa" w:w="100"/>
+              <w:left w:type="dxa" w:w="140"/>
+              <w:bottom w:type="dxa" w:w="100"/>
+              <w:right w:type="dxa" w:w="140"/>
+            </w:tcMar>
+            <w:vAlign w:val="center"/>
+          </w:tcPr>
+          <w:p>
+            <w:pPr>
+              <w:spacing w:after="40" w:before="40"/>
+              <w:jc w:val="left"/>
+            </w:pPr>
+            <w:r>
+              <w:t xml:space="preserve">{{ max_consumption_fuel2 }}</w:t>
             </w:r>
           </w:p>
         </w:tc>

</xml_diff>

<commit_message>
fix: VLPH manual offer - hide TEMPERATURE CONTROL SYSTEM + OPERATIONAL SEQUENCE entirely
Wrap the whole section (heading, intro, bullets, OPERATIONAL SEQUENCE
heading, operator-action paragraph) in {%p if control_mode != "manual" %}
... {%p endif %} so manual offers skip it. Automatic offers (PLC, PLC+AGR,
PID) render the section unchanged.

Co-Authored-By: Claude Opus 4.7 (1M context) <noreply@anthropic.com>
</commit_message>
<xml_diff>
--- a/Offer_Template.docx
+++ b/Offer_Template.docx
@@ -6563,6 +6563,18 @@
     </w:p>
     <w:p>
       <w:pPr>
+        <w:spacing w:after="60" w:before="60" w:line="300"/>
+        <w:jc w:val="left"/>
+      </w:pPr>
+      <w:r>
+        <w:rPr>
+          <w:rFonts w:ascii="Calibri" w:cs="Calibri" w:eastAsia="Calibri" w:hAnsi="Calibri"/>
+        </w:rPr>
+        <w:t>{%p if control_mode != "manual" %}</w:t>
+      </w:r>
+    </w:p>
+    <w:p>
+      <w:pPr>
         <w:pStyle w:val="Heading3"/>
         <w:spacing w:after="80" w:before="200"/>
       </w:pPr>
@@ -6899,6 +6911,18 @@
           <w:rFonts w:ascii="Calibri" w:cs="Calibri" w:eastAsia="Calibri" w:hAnsi="Calibri"/>
         </w:rPr>
         <w:t>{{ operational_sequence_text }}</w:t>
+      </w:r>
+    </w:p>
+    <w:p>
+      <w:pPr>
+        <w:spacing w:after="60" w:before="60" w:line="300"/>
+        <w:jc w:val="left"/>
+      </w:pPr>
+      <w:r>
+        <w:rPr>
+          <w:rFonts w:ascii="Calibri" w:cs="Calibri" w:eastAsia="Calibri" w:hAnsi="Calibri"/>
+        </w:rPr>
+        <w:t xml:space="preserve">{%p endif %}</w:t>
       </w:r>
     </w:p>
     <w:p>

</xml_diff>

<commit_message>
fix: VLPH manual oil offer - hide Scope-of-Supply LDO PIPELINE section
User wants no LDO pipeline section in the Scope of Supply for manual oil
offers (the pumping unit is described elsewhere in the offer). Wrap the
heading + gas_pipeline_items loop with {%p if not (fuel1_is_oil and
is_manual) %}. The later Bill-of-Materials LDO section is kept and still
shows 'PUMPING UNIT'. Also drop the now-unused manual_oil_only seeding in
_control_system_sections.

Co-Authored-By: Claude Opus 4.7 (1M context) <noreply@anthropic.com>
</commit_message>
<xml_diff>
--- a/Offer_Template.docx
+++ b/Offer_Template.docx
@@ -5224,6 +5224,18 @@
     </w:p>
     <w:p>
       <w:pPr>
+        <w:spacing w:after="60" w:before="60" w:line="300"/>
+        <w:jc w:val="left"/>
+      </w:pPr>
+      <w:r>
+        <w:rPr>
+          <w:rFonts w:ascii="Calibri" w:cs="Calibri" w:eastAsia="Calibri" w:hAnsi="Calibri"/>
+        </w:rPr>
+        <w:t>{%p if not (fuel1_is_oil and is_manual) %}</w:t>
+      </w:r>
+    </w:p>
+    <w:p>
+      <w:pPr>
         <w:spacing w:after="60" w:before="100"/>
       </w:pPr>
       <w:r>
@@ -5313,6 +5325,18 @@
       </w:pPr>
       <w:r>
         <w:t xml:space="preserve">{%p endfor %}</w:t>
+      </w:r>
+    </w:p>
+    <w:p>
+      <w:pPr>
+        <w:spacing w:after="60" w:before="60" w:line="300"/>
+        <w:jc w:val="left"/>
+      </w:pPr>
+      <w:r>
+        <w:rPr>
+          <w:rFonts w:ascii="Calibri" w:cs="Calibri" w:eastAsia="Calibri" w:hAnsi="Calibri"/>
+        </w:rPr>
+        <w:t xml:space="preserve">{%p endif %}</w:t>
       </w:r>
     </w:p>
     <w:p>

</xml_diff>

<commit_message>
fix: VLPH manual LDO swivel scope table - rows 5/6/9 now fuel- and mode-aware
Scope-of-Supply rows 5 and 6 were hardcoded ('Gas train with pressure-
regulating and control valves', 'Hydraulic cylinder for lifting and lowering
of the system'), so a manual LDO swivel offer rendered with wrong text.
Wire them to the existing pumping_scope_text / hood_scope_vertical
variables so they switch on fuel/hood. Also: pumping_scope_text now uses
the actual fuel name (not hardcoded 'LDO'); _flow_meter_scope_text drops
the 'Control valve' mention in manual mode and reads 'Manual shut-off
valves on Oil and Air line' instead.

Co-Authored-By: Claude Opus 4.7 (1M context) <noreply@anthropic.com>
</commit_message>
<xml_diff>
--- a/Offer_Template.docx
+++ b/Offer_Template.docx
@@ -7669,7 +7669,7 @@
                 <w:sz w:val="22"/>
                 <w:szCs w:val="22"/>
               </w:rPr>
-              <w:t xml:space="preserve">Gas train with pressure-regulating and control valves</w:t>
+              <w:t xml:space="preserve">{{ pumping_scope_text }}</w:t>
             </w:r>
           </w:p>
         </w:tc>
@@ -7739,7 +7739,7 @@
                 <w:sz w:val="22"/>
                 <w:szCs w:val="22"/>
               </w:rPr>
-              <w:t xml:space="preserve">Hydraulic cylinder for lifting and lowering of the system</w:t>
+              <w:t xml:space="preserve">{{ hood_scope_vertical }}</w:t>
             </w:r>
           </w:p>
         </w:tc>

</xml_diff>

<commit_message>
fix: VLPH manual offer scope - hide row 9 and renumber row 10 to 9
Manual offers don't have Flow meter / Control valve, so scope-of-supply
row 9 ('Flow meter and Control valve in Oil and Air line' / 'Manual
shut-off valves on Oil and Air line') is dropped entirely. Row 10's
number becomes 9 in manual mode so the table reads 1-9 with no gap.
Automatic offers are unchanged (rows 1-10).

Co-Authored-By: Claude Opus 4.7 (1M context) <noreply@anthropic.com>
</commit_message>
<xml_diff>
--- a/Offer_Template.docx
+++ b/Offer_Template.docx
@@ -7879,6 +7879,7 @@
           </w:p>
         </w:tc>
       </w:tr>
+      {% if control_mode != "manual" %}
       <w:tr>
         <w:tc>
           <w:tcPr>
@@ -7944,6 +7945,7 @@
           </w:p>
         </w:tc>
       </w:tr>
+      {% endif %}
       <w:tr>
         <w:tc>
           <w:tcPr>
@@ -7976,7 +7978,7 @@
                 <w:sz w:val="22"/>
                 <w:szCs w:val="22"/>
               </w:rPr>
-              <w:t xml:space="preserve">10</w:t>
+              <w:t xml:space="preserve">{% if control_mode == "manual" %}9{% else %}10{% endif %}</w:t>
             </w:r>
           </w:p>
         </w:tc>

</xml_diff>

<commit_message>
fix: offer cover-letter details box spans full width (matches header line)
The top cover details table (Project/Equipment, Project Name, Client, Enquiry
No.) was 5.0" wide while the 'COVER LETTER' header divider and the body text run
the full ~6.76" text column, so the box looked shorter than the header/other
lines. Widen the table to the full text width (keeping the 1:2 label:value
proportion) so everything lines up.

Offer_Template.docx is shared by every product (regen/vertical/HLPH/tundish/
recuperator/combined) via /api/generate-quote, so this aligns them all. Verified
jinja tags intact and docxtpl still renders.

Co-Authored-By: Claude Opus 4.8 (1M context) <noreply@anthropic.com>
</commit_message>
<xml_diff>
--- a/Offer_Template.docx
+++ b/Offer_Template.docx
@@ -85,18 +85,18 @@
     </w:p>
     <w:tbl>
       <w:tblPr>
-        <w:tblW w:w="7200" w:type="dxa"/>
+        <w:tblW w:w="9740" w:type="dxa"/>
         <w:jc w:val="center"/>
         <w:tblLayout w:type="fixed"/>
       </w:tblPr>
       <w:tblGrid>
-        <w:gridCol w:w="2400"/>
-        <w:gridCol w:w="4800"/>
+        <w:gridCol w:w="3247"/>
+        <w:gridCol w:w="6493"/>
       </w:tblGrid>
       <w:tr>
         <w:tc>
           <w:tcPr>
-            <w:tcW w:w="2400" w:type="dxa"/>
+            <w:tcW w:w="3247" w:type="dxa"/>
             <w:shd w:fill="F3F4F6" w:val="clear"/>
             <w:tcMar>
               <w:top w:w="100" w:type="dxa"/>
@@ -130,7 +130,7 @@
         </w:tc>
         <w:tc>
           <w:tcPr>
-            <w:tcW w:w="4800" w:type="dxa"/>
+            <w:tcW w:w="6493" w:type="dxa"/>
             <w:shd w:fill="F3F4F6" w:val="clear"/>
             <w:tcMar>
               <w:top w:w="100" w:type="dxa"/>
@@ -159,7 +159,7 @@
       <w:tr>
         <w:tc>
           <w:tcPr>
-            <w:tcW w:w="2400" w:type="dxa"/>
+            <w:tcW w:w="3247" w:type="dxa"/>
             <w:shd w:fill="FFFFFF" w:val="clear"/>
             <w:tcMar>
               <w:top w:w="100" w:type="dxa"/>
@@ -193,7 +193,7 @@
         </w:tc>
         <w:tc>
           <w:tcPr>
-            <w:tcW w:w="4800" w:type="dxa"/>
+            <w:tcW w:w="6493" w:type="dxa"/>
             <w:shd w:fill="FFFFFF" w:val="clear"/>
             <w:tcMar>
               <w:top w:w="100" w:type="dxa"/>
@@ -222,7 +222,7 @@
       <w:tr>
         <w:tc>
           <w:tcPr>
-            <w:tcW w:w="2400" w:type="dxa"/>
+            <w:tcW w:w="3247" w:type="dxa"/>
             <w:shd w:fill="F3F4F6" w:val="clear"/>
             <w:tcMar>
               <w:top w:w="100" w:type="dxa"/>
@@ -256,7 +256,7 @@
         </w:tc>
         <w:tc>
           <w:tcPr>
-            <w:tcW w:w="4800" w:type="dxa"/>
+            <w:tcW w:w="6493" w:type="dxa"/>
             <w:shd w:fill="F3F4F6" w:val="clear"/>
             <w:tcMar>
               <w:top w:w="100" w:type="dxa"/>
@@ -285,7 +285,7 @@
       <w:tr>
         <w:tc>
           <w:tcPr>
-            <w:tcW w:w="2400" w:type="dxa"/>
+            <w:tcW w:w="3247" w:type="dxa"/>
             <w:shd w:fill="FFFFFF" w:val="clear"/>
             <w:tcMar>
               <w:top w:w="100" w:type="dxa"/>
@@ -319,7 +319,7 @@
         </w:tc>
         <w:tc>
           <w:tcPr>
-            <w:tcW w:w="4800" w:type="dxa"/>
+            <w:tcW w:w="6493" w:type="dxa"/>
             <w:shd w:fill="FFFFFF" w:val="clear"/>
             <w:tcMar>
               <w:top w:w="100" w:type="dxa"/>

</xml_diff>

<commit_message>
feat: offer — add award photo+writing after cover letter; bold cover-letter lines
Replicate the blower offer's post-cover-letter content in the shared
Offer_Template.docx (used by vertical/regen/HLPH/tundish/etc.):
- Insert the 'NATIONAL ENERGY EFFICIENCY INNOVATION AWARD' heading + award image
  (image1.jpg) right after the cover-letter signature, before TABLE OF CONTENTS.
- Bold the 'Kind Attn:' line and the first body paragraph, matching the blower
  cover letter's bold styling.

Copied image1.jpg into the template media with its own relationship (rId14 →
media/image1.jpg). Verified docxtpl still renders and the blip resolves.

Co-Authored-By: Claude Opus 4.8 (1M context) <noreply@anthropic.com>
</commit_message>
<xml_diff>
--- a/Offer_Template.docx
+++ b/Offer_Template.docx
@@ -502,6 +502,7 @@
       <w:r>
         <w:rPr>
           <w:rFonts w:ascii="Calibri" w:cs="Calibri" w:eastAsia="Calibri" w:hAnsi="Calibri"/>
+          <w:b/>
         </w:rPr>
         <w:t>Kind Attn: {{poc_name}} ({{poc_designation}})</w:t>
       </w:r>
@@ -597,6 +598,7 @@
       <w:r>
         <w:rPr>
           <w:rFonts w:ascii="Calibri" w:cs="Calibri" w:eastAsia="Calibri" w:hAnsi="Calibri"/>
+          <w:b/>
         </w:rPr>
         <w:t>This is with reference to your enquiry for {{project_name}} as per the technical specifications shared.</w:t>
       </w:r>
@@ -704,6 +706,67 @@
     <w:p>
       <w:r>
         <w:br w:type="page"/>
+      </w:r>
+    </w:p>
+    <w:p/>
+    <w:p>
+      <w:r>
+        <w:rPr>
+          <w:rFonts w:ascii="Georgia" w:hAnsi="Georgia"/>
+          <w:b/>
+          <w:color w:val="B45F04"/>
+          <w:sz w:val="27"/>
+        </w:rPr>
+        <w:t>NATIONAL ENERGY EFFICIENCY INNOVATION AWARD</w:t>
+      </w:r>
+    </w:p>
+    <w:p>
+      <w:r>
+        <w:drawing>
+          <wp:inline xmlns:a="http://schemas.openxmlformats.org/drawingml/2006/main" xmlns:pic="http://schemas.openxmlformats.org/drawingml/2006/picture">
+            <wp:extent cx="1800000" cy="1166834"/>
+            <wp:docPr id="1002" name="Picture 1002"/>
+            <wp:cNvGraphicFramePr>
+              <a:graphicFrameLocks noChangeAspect="1"/>
+            </wp:cNvGraphicFramePr>
+            <a:graphic>
+              <a:graphicData uri="http://schemas.openxmlformats.org/drawingml/2006/picture">
+                <pic:pic>
+                  <pic:nvPicPr>
+                    <pic:cNvPr id="0" name="cand3.jpg"/>
+                    <pic:cNvPicPr/>
+                  </pic:nvPicPr>
+                  <pic:blipFill>
+                    <a:blip r:embed="rId14"/>
+                    <a:stretch>
+                      <a:fillRect/>
+                    </a:stretch>
+                  </pic:blipFill>
+                  <pic:spPr>
+                    <a:xfrm>
+                      <a:off x="0" y="0"/>
+                      <a:ext cx="1800000" cy="1166834"/>
+                    </a:xfrm>
+                    <a:prstGeom prst="rect"/>
+                  </pic:spPr>
+                </pic:pic>
+              </a:graphicData>
+            </a:graphic>
+          </wp:inline>
+        </w:drawing>
+      </w:r>
+    </w:p>
+    <w:p>
+      <w:pPr>
+        <w:jc w:val="left"/>
+      </w:pPr>
+      <w:r>
+        <w:rPr>
+          <w:rFonts w:ascii="Calibri" w:hAnsi="Calibri"/>
+          <w:b w:val="0"/>
+          <w:sz w:val="22"/>
+          <w:u w:val="none"/>
+        </w:rPr>
       </w:r>
     </w:p>
     <w:p>

</xml_diff>

<commit_message>
feat: align offer cover letter with the blower format (ref/date, greeting, signature)
In the shared Offer_Template.docx (vertical/regen/HLPH/tundish/etc.):
1. Add the 'OUR REF: / DATE:' line (bold) with {{enquiry_ref_short}} /
   {{enquiry_date_str}}, before the Subject line.
2. Personalise the greeting: 'Dear Sir,' -> 'Dear {{ poc_greeting }},'
   (poc_greeting defaults to 'Sir', so it degrades gracefully).
3. Match the signature block: add the factory address (53 K.M Stone Vill-
   Baghola, Tehsil-Palwal) and a 'Website: www.encon.co.in' line; drop the
   redundant '| www' from the email line.

All three context vars already exist in generate_quote_docx. Verified docxtpl
renders and the greeting resolves.

Co-Authored-By: Claude Opus 4.8 (1M context) <noreply@anthropic.com>
</commit_message>
<xml_diff>
--- a/Offer_Template.docx
+++ b/Offer_Template.docx
@@ -555,6 +555,58 @@
     </w:p>
     <w:p>
       <w:pPr>
+        <w:tabs>
+          <w:tab w:pos="4896" w:val="left"/>
+        </w:tabs>
+      </w:pPr>
+      <w:r>
+        <w:rPr>
+          <w:rFonts w:ascii="Calibri" w:hAnsi="Calibri"/>
+          <w:b/>
+          <w:sz w:val="22"/>
+          <w:u w:val="none"/>
+        </w:rPr>
+        <w:t>OUR REF:</w:t>
+      </w:r>
+      <w:r>
+        <w:rPr>
+          <w:rFonts w:ascii="Calibri" w:hAnsi="Calibri"/>
+          <w:b/>
+          <w:sz w:val="22"/>
+          <w:u w:val="none"/>
+        </w:rPr>
+        <w:tab/>
+        <w:t>DATE:</w:t>
+      </w:r>
+    </w:p>
+    <w:p>
+      <w:pPr>
+        <w:tabs>
+          <w:tab w:pos="4896" w:val="left"/>
+        </w:tabs>
+      </w:pPr>
+      <w:r>
+        <w:rPr>
+          <w:rFonts w:ascii="Calibri" w:hAnsi="Calibri"/>
+          <w:b w:val="0"/>
+          <w:sz w:val="22"/>
+          <w:u w:val="none"/>
+        </w:rPr>
+        <w:t>{{enquiry_ref_short}}</w:t>
+      </w:r>
+      <w:r>
+        <w:rPr>
+          <w:rFonts w:ascii="Calibri" w:hAnsi="Calibri"/>
+          <w:b w:val="0"/>
+          <w:sz w:val="22"/>
+          <w:u w:val="none"/>
+        </w:rPr>
+        <w:tab/>
+        <w:t>{{enquiry_date_str}}</w:t>
+      </w:r>
+    </w:p>
+    <w:p>
+      <w:pPr>
         <w:spacing w:after="200" w:before="120"/>
       </w:pPr>
       <w:r>
@@ -587,7 +639,7 @@
         <w:rPr>
           <w:rFonts w:ascii="Calibri" w:cs="Calibri" w:eastAsia="Calibri" w:hAnsi="Calibri"/>
         </w:rPr>
-        <w:t xml:space="preserve">Dear Sir,</w:t>
+        <w:t>Dear {{ poc_greeting }},</w:t>
       </w:r>
     </w:p>
     <w:p>
@@ -669,6 +721,20 @@
     </w:p>
     <w:p>
       <w:pPr>
+        <w:jc w:val="left"/>
+      </w:pPr>
+      <w:r>
+        <w:rPr>
+          <w:rFonts w:ascii="Calibri" w:hAnsi="Calibri"/>
+          <w:b w:val="0"/>
+          <w:sz w:val="22"/>
+          <w:u w:val="none"/>
+        </w:rPr>
+        <w:t>53 K.M Stone Vill- Baghola, Tehsil-Palwal</w:t>
+      </w:r>
+    </w:p>
+    <w:p>
+      <w:pPr>
         <w:spacing w:after="0" w:before="0" w:line="300"/>
         <w:jc w:val="left"/>
       </w:pPr>
@@ -692,7 +758,7 @@
           <w:sz w:val="22"/>
           <w:szCs w:val="22"/>
         </w:rPr>
-        <w:t>Email: {{technical_email}}   |   www.encon.co.in</w:t>
+        <w:t>Email: {{technical_email}}</w:t>
       </w:r>
       <w:r>
         <w:rPr>
@@ -701,6 +767,30 @@
           <w:sz w:val="22"/>
           <w:szCs w:val="22"/>
         </w:rPr>
+      </w:r>
+    </w:p>
+    <w:p>
+      <w:pPr>
+        <w:jc w:val="left"/>
+      </w:pPr>
+      <w:r>
+        <w:rPr>
+          <w:rFonts w:ascii="Calibri" w:hAnsi="Calibri"/>
+          <w:b w:val="0"/>
+          <w:sz w:val="22"/>
+          <w:u w:val="none"/>
+        </w:rPr>
+        <w:t xml:space="preserve">Website: </w:t>
+      </w:r>
+      <w:r>
+        <w:rPr>
+          <w:rFonts w:ascii="Calibri" w:hAnsi="Calibri"/>
+          <w:b w:val="0"/>
+          <w:color w:val="0000FF"/>
+          <w:sz w:val="22"/>
+          <w:u w:val="single"/>
+        </w:rPr>
+        <w:t>www.encon.co.in</w:t>
       </w:r>
     </w:p>
     <w:p>

</xml_diff>

<commit_message>
fix: offer header rule spans full width (matches the section divider lines)
The page-header rule (under the logo / Ref line) is the bottom border of a
header table that was 9360 twips wide, while the body section dividers run the
full text column (9740 twips) — so the header line looked shorter. Widen the
header table to 9740 (logo column fixed, Ref column extended) so the two lines
are the same length.

Co-Authored-By: Claude Opus 4.8 (1M context) <noreply@anthropic.com>
</commit_message>
<xml_diff>
--- a/Offer_Template.docx
+++ b/Offer_Template.docx
@@ -439,6 +439,7 @@
           <w:headerReference w:type="default" r:id="rId7"/>
           <w:footerReference w:type="default" r:id="rId8"/>
           <w:headerReference w:type="first" r:id="rId13"/>
+          <w:headerReference w:type="even" r:id="rId17"/>
           <w:pgSz w:w="11906" w:h="16838" w:orient="portrait"/>
           <w:pgMar w:top="1440" w:right="1083" w:bottom="1440" w:left="1083" w:header="708" w:footer="708" w:gutter="0"/>
           <w:pgNumType/>
@@ -15814,7 +15815,7 @@
 <w:hdr xmlns:wpc="http://schemas.microsoft.com/office/word/2010/wordprocessingCanvas" xmlns:mc="http://schemas.openxmlformats.org/markup-compatibility/2006" xmlns:o="urn:schemas-microsoft-com:office:office" xmlns:r="http://schemas.openxmlformats.org/officeDocument/2006/relationships" xmlns:m="http://schemas.openxmlformats.org/officeDocument/2006/math" xmlns:v="urn:schemas-microsoft-com:vml" xmlns:wp14="http://schemas.microsoft.com/office/word/2010/wordprocessingDrawing" xmlns:wp="http://schemas.openxmlformats.org/drawingml/2006/wordprocessingDrawing" xmlns:w10="urn:schemas-microsoft-com:office:word" xmlns:w="http://schemas.openxmlformats.org/wordprocessingml/2006/main" xmlns:w14="http://schemas.microsoft.com/office/word/2010/wordml" xmlns:w15="http://schemas.microsoft.com/office/word/2012/wordml" xmlns:wpg="http://schemas.microsoft.com/office/word/2010/wordprocessingGroup" xmlns:wpi="http://schemas.microsoft.com/office/word/2010/wordprocessingInk" xmlns:wne="http://schemas.microsoft.com/office/word/2006/wordml" xmlns:wps="http://schemas.microsoft.com/office/word/2010/wordprocessingShape" xmlns:cx="http://schemas.microsoft.com/office/drawing/2014/chartex" xmlns:cx1="http://schemas.microsoft.com/office/drawing/2015/9/8/chartex" xmlns:cx2="http://schemas.microsoft.com/office/drawing/2015/10/21/chartex" xmlns:cx3="http://schemas.microsoft.com/office/drawing/2016/5/9/chartex" xmlns:cx4="http://schemas.microsoft.com/office/drawing/2016/5/10/chartex" xmlns:cx5="http://schemas.microsoft.com/office/drawing/2016/5/11/chartex" xmlns:cx6="http://schemas.microsoft.com/office/drawing/2016/5/12/chartex" xmlns:cx7="http://schemas.microsoft.com/office/drawing/2016/5/13/chartex" xmlns:cx8="http://schemas.microsoft.com/office/drawing/2016/5/14/chartex" xmlns:w16cid="http://schemas.microsoft.com/office/word/2016/wordml/cid" xmlns:w16se="http://schemas.microsoft.com/office/word/2015/wordml/symex">
   <w:tbl>
     <w:tblPr>
-      <w:tblW w:type="dxa" w:w="9360"/>
+      <w:tblW w:type="dxa" w:w="9740"/>
       <w:tblBorders>
         <w:top w:val="none" w:color="FFFFFF" w:sz="0"/>
         <w:left w:val="none" w:color="FFFFFF" w:sz="0"/>
@@ -15823,15 +15824,16 @@
         <w:insideH w:val="none" w:color="FFFFFF" w:sz="0"/>
         <w:insideV w:val="none" w:color="FFFFFF" w:sz="0"/>
       </w:tblBorders>
+      <w:tblLayout w:type="fixed"/>
     </w:tblPr>
     <w:tblGrid>
       <w:gridCol w:w="1600"/>
-      <w:gridCol w:w="7760"/>
+      <w:gridCol w:w="8140"/>
     </w:tblGrid>
     <w:tr>
       <w:tc>
         <w:tcPr>
-          <w:tcW w:type="dxa" w:w="1800"/>
+          <w:tcW w:type="dxa" w:w="1600"/>
           <w:tcBorders>
             <w:top w:val="none"/>
             <w:left w:val="none"/>
@@ -15888,7 +15890,7 @@
       </w:tc>
       <w:tc>
         <w:tcPr>
-          <w:tcW w:type="dxa" w:w="7760"/>
+          <w:tcW w:type="dxa" w:w="8140"/>
           <w:tcBorders>
             <w:top w:val="none"/>
             <w:left w:val="none"/>
@@ -15919,6 +15921,16 @@
 </file>
 
 <file path=word/header3.xml><?xml version="1.0" encoding="utf-8"?>
+<w:hdr xmlns:m="http://schemas.openxmlformats.org/officeDocument/2006/math" xmlns:mc="http://schemas.openxmlformats.org/markup-compatibility/2006" xmlns:mo="http://schemas.microsoft.com/office/mac/office/2008/main" xmlns:mv="urn:schemas-microsoft-com:mac:vml" xmlns:o="urn:schemas-microsoft-com:office:office" xmlns:r="http://schemas.openxmlformats.org/officeDocument/2006/relationships" xmlns:v="urn:schemas-microsoft-com:vml" xmlns:w10="urn:schemas-microsoft-com:office:word" xmlns:w14="http://schemas.microsoft.com/office/word/2010/wordml" xmlns:w="http://schemas.openxmlformats.org/wordprocessingml/2006/main" xmlns:wne="http://schemas.microsoft.com/office/word/2006/wordml" xmlns:wp14="http://schemas.microsoft.com/office/word/2010/wordprocessingDrawing" xmlns:wp="http://schemas.openxmlformats.org/drawingml/2006/wordprocessingDrawing" xmlns:wpc="http://schemas.microsoft.com/office/word/2010/wordprocessingCanvas" xmlns:wpg="http://schemas.microsoft.com/office/word/2010/wordprocessingGroup" xmlns:wpi="http://schemas.microsoft.com/office/word/2010/wordprocessingInk" xmlns:wps="http://schemas.microsoft.com/office/word/2010/wordprocessingShape" mc:Ignorable="w14 wp14">
+  <w:p>
+    <w:pPr>
+      <w:pStyle w:val="Header"/>
+    </w:pPr>
+  </w:p>
+</w:hdr>
+</file>
+
+<file path=word/header4.xml><?xml version="1.0" encoding="utf-8"?>
 <w:hdr xmlns:m="http://schemas.openxmlformats.org/officeDocument/2006/math" xmlns:mc="http://schemas.openxmlformats.org/markup-compatibility/2006" xmlns:mo="http://schemas.microsoft.com/office/mac/office/2008/main" xmlns:mv="urn:schemas-microsoft-com:mac:vml" xmlns:o="urn:schemas-microsoft-com:office:office" xmlns:r="http://schemas.openxmlformats.org/officeDocument/2006/relationships" xmlns:v="urn:schemas-microsoft-com:vml" xmlns:w10="urn:schemas-microsoft-com:office:word" xmlns:w14="http://schemas.microsoft.com/office/word/2010/wordml" xmlns:w="http://schemas.openxmlformats.org/wordprocessingml/2006/main" xmlns:wne="http://schemas.microsoft.com/office/word/2006/wordml" xmlns:wp14="http://schemas.microsoft.com/office/word/2010/wordprocessingDrawing" xmlns:wp="http://schemas.openxmlformats.org/drawingml/2006/wordprocessingDrawing" xmlns:wpc="http://schemas.microsoft.com/office/word/2010/wordprocessingCanvas" xmlns:wpg="http://schemas.microsoft.com/office/word/2010/wordprocessingGroup" xmlns:wpi="http://schemas.microsoft.com/office/word/2010/wordprocessingInk" xmlns:wps="http://schemas.microsoft.com/office/word/2010/wordprocessingShape" mc:Ignorable="w14 wp14">
   <w:p>
     <w:pPr>

</xml_diff>

<commit_message>
fix: cover letter fits one page (award on cover page) + ENCON logo on every page
- Award heading + photo were after a page break, so they landed on page 2 with
  the TOC. Move them above the page break so the photo sits on the cover-letter
  page; remove the blank spacer paragraphs and tighten oversized paragraph
  spacing so the whole cover letter + photo fit on one page.
- Disable evenAndOddHeaders: the default header (with the ENCON logo) now applies
  to every page. Previously even pages had no header, so the logo only showed on
  odd pages.

Co-Authored-By: Claude Opus 4.8 (1M context) <noreply@anthropic.com>
</commit_message>
<xml_diff>
--- a/Offer_Template.docx
+++ b/Offer_Template.docx
@@ -348,14 +348,6 @@
     </w:tbl>
     <w:p>
       <w:pPr>
-        <w:spacing w:before="240" w:after="0"/>
-      </w:pPr>
-      <w:r>
-        <w:t xml:space="preserve"/>
-      </w:r>
-    </w:p>
-    <w:p>
-      <w:pPr>
         <w:spacing w:before="120" w:after="60"/>
         <w:jc w:val="center"/>
       </w:pPr>
@@ -435,20 +427,6 @@
     </w:p>
     <w:p>
       <w:pPr>
-        <w:sectPr>
-          <w:headerReference w:type="default" r:id="rId7"/>
-          <w:footerReference w:type="default" r:id="rId8"/>
-          <w:headerReference w:type="first" r:id="rId13"/>
-          <w:headerReference w:type="even" r:id="rId17"/>
-          <w:pgSz w:w="11906" w:h="16838" w:orient="portrait"/>
-          <w:pgMar w:top="1440" w:right="1083" w:bottom="1440" w:left="1083" w:header="708" w:footer="708" w:gutter="0"/>
-          <w:pgNumType/>
-          <w:docGrid w:linePitch="360"/>
-        </w:sectPr>
-      </w:pPr>
-    </w:p>
-    <w:p>
-      <w:pPr>
         <w:pStyle w:val="Heading1"/>
         <w:pBdr>
           <w:bottom w:val="single" w:color="E87722" w:sz="12" w:space="4"/>
@@ -548,14 +526,6 @@
     </w:p>
     <w:p>
       <w:pPr>
-        <w:spacing w:after="160" w:before="160"/>
-      </w:pPr>
-      <w:r>
-        <w:t xml:space="preserve"/>
-      </w:r>
-    </w:p>
-    <w:p>
-      <w:pPr>
         <w:tabs>
           <w:tab w:pos="4896" w:val="left"/>
         </w:tabs>
@@ -794,12 +764,6 @@
         <w:t>www.encon.co.in</w:t>
       </w:r>
     </w:p>
-    <w:p>
-      <w:r>
-        <w:br w:type="page"/>
-      </w:r>
-    </w:p>
-    <w:p/>
     <w:p>
       <w:r>
         <w:rPr>
@@ -847,6 +811,12 @@
         </w:drawing>
       </w:r>
     </w:p>
+    <w:p>
+      <w:r>
+        <w:br w:type="page"/>
+      </w:r>
+    </w:p>
+    <w:p/>
     <w:p>
       <w:pPr>
         <w:jc w:val="left"/>

</xml_diff>

<commit_message>
fix: cover letter first body line — bold only the product name
Was fully bold; the desired look bolds only {{project_name}} inline, with the
surrounding text ('This is with reference to your enquiry for … as per the
technical specifications shared.') in normal weight. Split the run into
normal / bold / normal, preserving the original font.

Co-Authored-By: Claude Opus 4.8 (1M context) <noreply@anthropic.com>
</commit_message>
<xml_diff>
--- a/Offer_Template.docx
+++ b/Offer_Template.docx
@@ -621,9 +621,22 @@
       <w:r>
         <w:rPr>
           <w:rFonts w:ascii="Calibri" w:cs="Calibri" w:eastAsia="Calibri" w:hAnsi="Calibri"/>
+        </w:rPr>
+        <w:t xml:space="preserve">This is with reference to your enquiry for </w:t>
+      </w:r>
+      <w:r>
+        <w:rPr>
+          <w:bCs/>
+          <w:rFonts w:ascii="Calibri" w:cs="Calibri" w:eastAsia="Calibri" w:hAnsi="Calibri"/>
           <w:b/>
         </w:rPr>
-        <w:t>This is with reference to your enquiry for {{project_name}} as per the technical specifications shared.</w:t>
+        <w:t xml:space="preserve">{{project_name}}</w:t>
+      </w:r>
+      <w:r>
+        <w:rPr>
+          <w:rFonts w:ascii="Calibri" w:cs="Calibri" w:eastAsia="Calibri" w:hAnsi="Calibri"/>
+        </w:rPr>
+        <w:t xml:space="preserve"> as per the technical specifications shared.</w:t>
       </w:r>
     </w:p>
     <w:p>

</xml_diff>

<commit_message>
fix: cover-letter body uses clean product name + British spelling
- Body line 'enquiry for {{project_name}}' rendered 'Offer for Vertical Ladle
  Preheater' (project_name = the subject). Switch the bold inline name to
  {{equipment_name}} (the clean product name, e.g. 'Vertical Ladle Preheater')
  so it reads 'enquiry for Vertical Ladle Preheater'.
- 'endeavored' -> 'endeavoured'.

Co-Authored-By: Claude Opus 4.8 (1M context) <noreply@anthropic.com>
</commit_message>
<xml_diff>
--- a/Offer_Template.docx
+++ b/Offer_Template.docx
@@ -630,7 +630,7 @@
           <w:rFonts w:ascii="Calibri" w:cs="Calibri" w:eastAsia="Calibri" w:hAnsi="Calibri"/>
           <w:b/>
         </w:rPr>
-        <w:t xml:space="preserve">{{project_name}}</w:t>
+        <w:t>{{equipment_name}}</w:t>
       </w:r>
       <w:r>
         <w:rPr>
@@ -660,7 +660,7 @@
         <w:rPr>
           <w:rFonts w:ascii="Calibri" w:cs="Calibri" w:eastAsia="Calibri" w:hAnsi="Calibri"/>
         </w:rPr>
-        <w:t xml:space="preserve">Though we have endeavored to make the offer self-explanatory, please feel free to contact us should you require any clarification or additional information.</w:t>
+        <w:t>Though we have endeavoured to make the offer self-explanatory, please feel free to contact us should you require any clarification or additional information.</w:t>
       </w:r>
     </w:p>
     <w:p>

</xml_diff>

<commit_message>
fix: omit INSTRUMENTATION & CONTROL section from the offer in manual mode
For a manual system there is no instrumentation/control scope, so wrap the whole
'INSTRUMENTATION & CONTROL' section in {%p if control_mode != "manual" %} …
{%p endif %} (the Temperature Control section was already gated this way). Manual
offers now show neither section; automatic/PLC/PID offers are unchanged.

Verified: control_mode='manual' -> section absent; 'automatic' -> present.

Co-Authored-By: Claude Opus 4.8 (1M context) <noreply@anthropic.com>
</commit_message>
<xml_diff>
--- a/Offer_Template.docx
+++ b/Offer_Template.docx
@@ -5837,6 +5837,18 @@
     </w:p>
     <w:p>
       <w:pPr>
+        <w:spacing w:after="60" w:before="60" w:line="300"/>
+        <w:jc w:val="left"/>
+      </w:pPr>
+      <w:r>
+        <w:rPr>
+          <w:rFonts w:ascii="Calibri" w:cs="Calibri" w:eastAsia="Calibri" w:hAnsi="Calibri"/>
+        </w:rPr>
+        <w:t>{%p if control_mode != "manual" %}</w:t>
+      </w:r>
+    </w:p>
+    <w:p>
+      <w:pPr>
         <w:pStyle w:val="Heading3"/>
         <w:spacing w:after="80" w:before="200"/>
       </w:pPr>
@@ -6699,6 +6711,18 @@
           <w:szCs w:val="22"/>
         </w:rPr>
         <w:t>PIPELINE AND PIPE FITTINGS</w:t>
+      </w:r>
+    </w:p>
+    <w:p>
+      <w:pPr>
+        <w:spacing w:after="60" w:before="60" w:line="300"/>
+        <w:jc w:val="left"/>
+      </w:pPr>
+      <w:r>
+        <w:rPr>
+          <w:rFonts w:ascii="Calibri" w:cs="Calibri" w:eastAsia="Calibri" w:hAnsi="Calibri"/>
+        </w:rPr>
+        <w:t xml:space="preserve">{%p endif %}</w:t>
       </w:r>
     </w:p>
     <w:p>

</xml_diff>

<commit_message>
Vertical offer: drop the COVER LETTER heading
It sat directly above "To," and added nothing — the letter is self evidently a
letter. Nothing in TABLE OF CONTENTS or LIST OF ANNEXURES referred to it, so
removing it leaves no dangling reference.

Verified by rendering a generated vertical offer through Word: the string no
longer appears anywhere in the document.

Co-Authored-By: Claude Opus 5 (1M context) <noreply@anthropic.com>
</commit_message>
<xml_diff>
--- a/Offer_Template.docx
+++ b/Offer_Template.docx
@@ -423,26 +423,6 @@
           <w:szCs w:val="20"/>
         </w:rPr>
         <w:t xml:space="preserve">sales@encon.co.in   •   www.encon.co.in</w:t>
-      </w:r>
-    </w:p>
-    <w:p>
-      <w:pPr>
-        <w:pStyle w:val="Heading1"/>
-        <w:pBdr>
-          <w:bottom w:val="single" w:color="E87722" w:sz="12" w:space="4"/>
-        </w:pBdr>
-        <w:spacing w:after="200" w:before="360"/>
-      </w:pPr>
-      <w:r>
-        <w:rPr>
-          <w:rFonts w:ascii="Calibri" w:cs="Calibri" w:eastAsia="Calibri" w:hAnsi="Calibri"/>
-          <w:b/>
-          <w:bCs/>
-          <w:color w:val="1F2937"/>
-          <w:sz w:val="32"/>
-          <w:szCs w:val="32"/>
-        </w:rPr>
-        <w:t>COVER LETTER</w:t>
       </w:r>
     </w:p>
     <w:p>

</xml_diff>